<commit_message>
feat(guests): Sprint 03 — guest profiles, encrypted ID documents, duplicates, merge, anonymise, consent
Co-Authored-By: Claude Opus 5.5 <noreply@anthropic.com>
Claude-Session: https://claude.ai/code/session_01K9Lh4PHf4WW5osxpiZLyzk
</commit_message>
<xml_diff>
--- a/docs/handbooks/Resort-OS-Product-Overview.docx
+++ b/docs/handbooks/Resort-OS-Product-Overview.docx
@@ -182,7 +182,7 @@
                 <w:sz w:val="19"/>
                 <w:szCs w:val="19"/>
               </w:rPr>
-              <w:t xml:space="preserve">Version 1.2</w:t>
+              <w:t xml:space="preserve">Version 1.2.1</w:t>
             </w:r>
           </w:p>
         </w:tc>
@@ -322,7 +322,7 @@
                 <w:sz w:val="19"/>
                 <w:szCs w:val="19"/>
               </w:rPr>
-              <w:t xml:space="preserve">Sprints 01, 02 accepted · Sprint 03 Guests in progress</w:t>
+              <w:t xml:space="preserve">Sprints 01, 02 accepted · Sprint 03 Guests in review</w:t>
             </w:r>
           </w:p>
         </w:tc>
@@ -661,6 +661,102 @@
                 <w:sz w:val="19"/>
                 <w:szCs w:val="19"/>
               </w:rPr>
+              <w:t xml:space="preserve">1.2.1</w:t>
+            </w:r>
+          </w:p>
+        </w:tc>
+        <w:tc>
+          <w:tcPr>
+            <w:tcW w:type="dxa" w:w="1500"/>
+            <w:tcBorders>
+              <w:top w:val="single" w:color="DCE3E1" w:sz="4"/>
+              <w:left w:val="single" w:color="DCE3E1" w:sz="4"/>
+              <w:bottom w:val="single" w:color="DCE3E1" w:sz="4"/>
+              <w:right w:val="single" w:color="DCE3E1" w:sz="4"/>
+            </w:tcBorders>
+            <w:tcMar>
+              <w:top w:type="dxa" w:w="70"/>
+              <w:left w:type="dxa" w:w="110"/>
+              <w:bottom w:type="dxa" w:w="50"/>
+              <w:right w:type="dxa" w:w="110"/>
+            </w:tcMar>
+            <w:vAlign w:val="top"/>
+          </w:tcPr>
+          <w:p>
+            <w:pPr>
+              <w:spacing w:after="40" w:line="252" w:lineRule="auto"/>
+            </w:pPr>
+            <w:r>
+              <w:rPr>
+                <w:sz w:val="19"/>
+                <w:szCs w:val="19"/>
+              </w:rPr>
+              <w:t xml:space="preserve">2026-10-10</w:t>
+            </w:r>
+          </w:p>
+        </w:tc>
+        <w:tc>
+          <w:tcPr>
+            <w:tcW w:type="dxa" w:w="6714"/>
+            <w:tcBorders>
+              <w:top w:val="single" w:color="DCE3E1" w:sz="4"/>
+              <w:left w:val="single" w:color="DCE3E1" w:sz="4"/>
+              <w:bottom w:val="single" w:color="DCE3E1" w:sz="4"/>
+              <w:right w:val="single" w:color="DCE3E1" w:sz="4"/>
+            </w:tcBorders>
+            <w:tcMar>
+              <w:top w:type="dxa" w:w="70"/>
+              <w:left w:type="dxa" w:w="110"/>
+              <w:bottom w:type="dxa" w:w="50"/>
+              <w:right w:type="dxa" w:w="110"/>
+            </w:tcMar>
+            <w:vAlign w:val="top"/>
+          </w:tcPr>
+          <w:p>
+            <w:pPr>
+              <w:spacing w:after="40" w:line="252" w:lineRule="auto"/>
+            </w:pPr>
+            <w:r>
+              <w:rPr>
+                <w:sz w:val="19"/>
+                <w:szCs w:val="19"/>
+              </w:rPr>
+              <w:t xml:space="preserve">Sprint 03 (Guests) built and in review: guest profiles, encrypted ID documents, duplicates, merge, anonymise, consent.</w:t>
+            </w:r>
+          </w:p>
+        </w:tc>
+      </w:tr>
+      <w:tr>
+        <w:trPr>
+          <w:cantSplit/>
+        </w:trPr>
+        <w:tc>
+          <w:tcPr>
+            <w:tcW w:type="dxa" w:w="1100"/>
+            <w:tcBorders>
+              <w:top w:val="single" w:color="DCE3E1" w:sz="4"/>
+              <w:left w:val="single" w:color="DCE3E1" w:sz="4"/>
+              <w:bottom w:val="single" w:color="DCE3E1" w:sz="4"/>
+              <w:right w:val="single" w:color="DCE3E1" w:sz="4"/>
+            </w:tcBorders>
+            <w:shd w:fill="F5F7F6" w:color="auto" w:val="clear"/>
+            <w:tcMar>
+              <w:top w:type="dxa" w:w="70"/>
+              <w:left w:type="dxa" w:w="110"/>
+              <w:bottom w:type="dxa" w:w="50"/>
+              <w:right w:type="dxa" w:w="110"/>
+            </w:tcMar>
+            <w:vAlign w:val="top"/>
+          </w:tcPr>
+          <w:p>
+            <w:pPr>
+              <w:spacing w:after="40" w:line="252" w:lineRule="auto"/>
+            </w:pPr>
+            <w:r>
+              <w:rPr>
+                <w:sz w:val="19"/>
+                <w:szCs w:val="19"/>
+              </w:rPr>
               <w:t xml:space="preserve">1.2</w:t>
             </w:r>
           </w:p>
@@ -674,6 +770,7 @@
               <w:bottom w:val="single" w:color="DCE3E1" w:sz="4"/>
               <w:right w:val="single" w:color="DCE3E1" w:sz="4"/>
             </w:tcBorders>
+            <w:shd w:fill="F5F7F6" w:color="auto" w:val="clear"/>
             <w:tcMar>
               <w:top w:type="dxa" w:w="70"/>
               <w:left w:type="dxa" w:w="110"/>
@@ -704,6 +801,7 @@
               <w:bottom w:val="single" w:color="DCE3E1" w:sz="4"/>
               <w:right w:val="single" w:color="DCE3E1" w:sz="4"/>
             </w:tcBorders>
+            <w:shd w:fill="F5F7F6" w:color="auto" w:val="clear"/>
             <w:tcMar>
               <w:top w:type="dxa" w:w="70"/>
               <w:left w:type="dxa" w:w="110"/>
@@ -954,7 +1052,7 @@
                 <w:sz w:val="19"/>
                 <w:szCs w:val="19"/>
               </w:rPr>
-              <w:t xml:space="preserve">Living document, rebuilt at the end of every accepted sprint. This edition reflects Sprint 02 accepted and Sprint 03 in progress.</w:t>
+              <w:t xml:space="preserve">Living document, rebuilt at the end of every sprint. This edition reflects Sprint 02 accepted and Sprint 03 built and in review.</w:t>
             </w:r>
           </w:p>
         </w:tc>
@@ -1678,7 +1776,7 @@
           <w:sz w:val="19"/>
           <w:szCs w:val="19"/>
         </w:rPr>
-        <w:t xml:space="preserve">In progress: Sprint 03 — Guests</w:t>
+        <w:t xml:space="preserve">Ready for review: Sprint 03 — Guests</w:t>
       </w:r>
     </w:p>
     <w:p>
@@ -2366,7 +2464,7 @@
                 <w:sz w:val="19"/>
                 <w:szCs w:val="19"/>
               </w:rPr>
-              <w:t xml:space="preserve">Sprints 01 and 02 are delivered and accepted. Sprint 03 (Guests) is in progress.</w:t>
+              <w:t xml:space="preserve">Sprints 01 and 02 are delivered and accepted. Sprint 03 (Guests) is built and waiting for review.</w:t>
             </w:r>
           </w:p>
         </w:tc>
@@ -4257,7 +4355,7 @@
                 <w:sz w:val="19"/>
                 <w:szCs w:val="19"/>
               </w:rPr>
-              <w:t xml:space="preserve">In progress</w:t>
+              <w:t xml:space="preserve">In review</w:t>
             </w:r>
           </w:p>
         </w:tc>
@@ -12267,25 +12365,273 @@
         <w:pStyle w:val="Heading2"/>
       </w:pPr>
       <w:r>
-        <w:t xml:space="preserve">9.3   In progress: Sprint 03 — Guests</w:t>
+        <w:t xml:space="preserve">9.3   Ready for review: Sprint 03 — Guests</w:t>
       </w:r>
     </w:p>
     <w:p>
       <w:r>
-        <w:t xml:space="preserve">Reception keeps one clean record per guest, finds returning guests by phone in one search, and stores ID documents encrypted and visible only to permitted staff.</w:t>
+        <w:t xml:space="preserve">Reception keeps one clean record per guest, finds returning guests by phone in one search, and stores ID documents encrypted and visible only to permitted staff. Built and tested; it becomes part of the system once the owner accepts it.</w:t>
       </w:r>
     </w:p>
     <w:p>
       <w:pPr>
-        <w:pStyle w:val="Small"/>
+        <w:pStyle w:val="ListParagraph"/>
+        <w:numPr>
+          <w:ilvl w:val="0"/>
+          <w:numId w:val="2"/>
+        </w:numPr>
+        <w:spacing w:after="60"/>
       </w:pPr>
       <w:r>
-        <w:rPr>
-          <w:color w:val="5F6B6E"/>
-          <w:sz w:val="18"/>
-          <w:szCs w:val="18"/>
-        </w:rPr>
-        <w:t xml:space="preserve">It will be accepted when: Reception finds a returning guest by phone in one search.</w:t>
+        <w:t xml:space="preserve">One profile per guest, shared by every property; returning guests found by phone in one search</w:t>
+      </w:r>
+    </w:p>
+    <w:p>
+      <w:pPr>
+        <w:pStyle w:val="ListParagraph"/>
+        <w:numPr>
+          <w:ilvl w:val="0"/>
+          <w:numId w:val="2"/>
+        </w:numPr>
+        <w:spacing w:after="60"/>
+      </w:pPr>
+      <w:r>
+        <w:t xml:space="preserve">A warning before creating a second profile for the same person, and a merge for duplicates that slip through</w:t>
+      </w:r>
+    </w:p>
+    <w:p>
+      <w:pPr>
+        <w:pStyle w:val="ListParagraph"/>
+        <w:numPr>
+          <w:ilvl w:val="0"/>
+          <w:numId w:val="2"/>
+        </w:numPr>
+        <w:spacing w:after="60"/>
+      </w:pPr>
+      <w:r>
+        <w:t xml:space="preserve">ID documents (passport, Aadhaar, visa…) stored encrypted; only reception, managers and owners can open them, and every view is recorded</w:t>
+      </w:r>
+    </w:p>
+    <w:p>
+      <w:pPr>
+        <w:pStyle w:val="ListParagraph"/>
+        <w:numPr>
+          <w:ilvl w:val="0"/>
+          <w:numId w:val="2"/>
+        </w:numPr>
+        <w:spacing w:after="60"/>
+      </w:pPr>
+      <w:r>
+        <w:t xml:space="preserve">Aadhaar: only the last 4 digits are ever kept</w:t>
+      </w:r>
+    </w:p>
+    <w:p>
+      <w:pPr>
+        <w:pStyle w:val="ListParagraph"/>
+        <w:numPr>
+          <w:ilvl w:val="0"/>
+          <w:numId w:val="2"/>
+        </w:numPr>
+        <w:spacing w:after="60"/>
+      </w:pPr>
+      <w:r>
+        <w:t xml:space="preserve">Consent for WhatsApp and email offers recorded with time and staff member</w:t>
+      </w:r>
+    </w:p>
+    <w:p>
+      <w:pPr>
+        <w:pStyle w:val="ListParagraph"/>
+        <w:numPr>
+          <w:ilvl w:val="0"/>
+          <w:numId w:val="2"/>
+        </w:numPr>
+        <w:spacing w:after="60"/>
+      </w:pPr>
+      <w:r>
+        <w:t xml:space="preserve">Anonymise on request: personal data and documents removed, accounts still add up</w:t>
+      </w:r>
+    </w:p>
+    <w:p>
+      <w:pPr>
+        <w:keepNext/>
+        <w:pBdr>
+          <w:top w:val="single" w:color="DCE3E1" w:sz="4"/>
+          <w:bottom w:val="single" w:color="DCE3E1" w:sz="4"/>
+          <w:left w:val="single" w:color="DCE3E1" w:sz="4"/>
+          <w:right w:val="single" w:color="DCE3E1" w:sz="4"/>
+        </w:pBdr>
+        <w:spacing w:before="120" w:after="0" w:line="240" w:lineRule="auto"/>
+        <w:jc w:val="center"/>
+      </w:pPr>
+      <w:r>
+        <w:drawing>
+          <wp:inline distT="0" distB="0" distL="0" distR="0">
+            <wp:extent cx="5124450" cy="3438525"/>
+            <wp:effectExtent t="0" r="0" b="0" l="0"/>
+            <wp:docPr id="1" name="A returning guest found by phone in one search" descr="A returning guest found by phone in one search" title="A returning guest found by phone in one search"/>
+            <wp:cNvGraphicFramePr>
+              <a:graphicFrameLocks xmlns:a="http://schemas.openxmlformats.org/drawingml/2006/main" noChangeAspect="1"/>
+            </wp:cNvGraphicFramePr>
+            <a:graphic xmlns:a="http://schemas.openxmlformats.org/drawingml/2006/main">
+              <a:graphicData uri="http://schemas.openxmlformats.org/drawingml/2006/picture">
+                <pic:pic xmlns:pic="http://schemas.openxmlformats.org/drawingml/2006/picture">
+                  <pic:nvPicPr>
+                    <pic:cNvPr id="0" name="" descr=""/>
+                    <pic:cNvPicPr>
+                      <a:picLocks noChangeAspect="1" noChangeArrowheads="1"/>
+                    </pic:cNvPicPr>
+                  </pic:nvPicPr>
+                  <pic:blipFill>
+                    <a:blip r:embed="rId17" cstate="none"/>
+                    <a:srcRect/>
+                    <a:stretch>
+                      <a:fillRect/>
+                    </a:stretch>
+                  </pic:blipFill>
+                  <pic:spPr bwMode="auto">
+                    <a:xfrm>
+                      <a:off x="0" y="0"/>
+                      <a:ext cx="5124450" cy="3438525"/>
+                    </a:xfrm>
+                    <a:prstGeom prst="rect">
+                      <a:avLst/>
+                    </a:prstGeom>
+                  </pic:spPr>
+                </pic:pic>
+              </a:graphicData>
+            </a:graphic>
+          </wp:inline>
+        </w:drawing>
+      </w:r>
+    </w:p>
+    <w:p>
+      <w:pPr>
+        <w:pStyle w:val="Caption"/>
+      </w:pPr>
+      <w:r>
+        <w:t xml:space="preserve">A returning guest found by phone in one search</w:t>
+      </w:r>
+    </w:p>
+    <w:p>
+      <w:pPr>
+        <w:keepNext/>
+        <w:pBdr>
+          <w:top w:val="single" w:color="DCE3E1" w:sz="4"/>
+          <w:bottom w:val="single" w:color="DCE3E1" w:sz="4"/>
+          <w:left w:val="single" w:color="DCE3E1" w:sz="4"/>
+          <w:right w:val="single" w:color="DCE3E1" w:sz="4"/>
+        </w:pBdr>
+        <w:spacing w:before="120" w:after="0" w:line="240" w:lineRule="auto"/>
+        <w:jc w:val="center"/>
+      </w:pPr>
+      <w:r>
+        <w:drawing>
+          <wp:inline distT="0" distB="0" distL="0" distR="0">
+            <wp:extent cx="5124450" cy="3438525"/>
+            <wp:effectExtent t="0" r="0" b="0" l="0"/>
+            <wp:docPr id="1" name="Warning before creating a second profile for the same person" descr="Warning before creating a second profile for the same person" title="Warning before creating a second profile for the same person"/>
+            <wp:cNvGraphicFramePr>
+              <a:graphicFrameLocks xmlns:a="http://schemas.openxmlformats.org/drawingml/2006/main" noChangeAspect="1"/>
+            </wp:cNvGraphicFramePr>
+            <a:graphic xmlns:a="http://schemas.openxmlformats.org/drawingml/2006/main">
+              <a:graphicData uri="http://schemas.openxmlformats.org/drawingml/2006/picture">
+                <pic:pic xmlns:pic="http://schemas.openxmlformats.org/drawingml/2006/picture">
+                  <pic:nvPicPr>
+                    <pic:cNvPr id="0" name="" descr=""/>
+                    <pic:cNvPicPr>
+                      <a:picLocks noChangeAspect="1" noChangeArrowheads="1"/>
+                    </pic:cNvPicPr>
+                  </pic:nvPicPr>
+                  <pic:blipFill>
+                    <a:blip r:embed="rId18" cstate="none"/>
+                    <a:srcRect/>
+                    <a:stretch>
+                      <a:fillRect/>
+                    </a:stretch>
+                  </pic:blipFill>
+                  <pic:spPr bwMode="auto">
+                    <a:xfrm>
+                      <a:off x="0" y="0"/>
+                      <a:ext cx="5124450" cy="3438525"/>
+                    </a:xfrm>
+                    <a:prstGeom prst="rect">
+                      <a:avLst/>
+                    </a:prstGeom>
+                  </pic:spPr>
+                </pic:pic>
+              </a:graphicData>
+            </a:graphic>
+          </wp:inline>
+        </w:drawing>
+      </w:r>
+    </w:p>
+    <w:p>
+      <w:pPr>
+        <w:pStyle w:val="Caption"/>
+      </w:pPr>
+      <w:r>
+        <w:t xml:space="preserve">Warning before creating a second profile for the same person</w:t>
+      </w:r>
+    </w:p>
+    <w:p>
+      <w:pPr>
+        <w:keepNext/>
+        <w:pBdr>
+          <w:top w:val="single" w:color="DCE3E1" w:sz="4"/>
+          <w:bottom w:val="single" w:color="DCE3E1" w:sz="4"/>
+          <w:left w:val="single" w:color="DCE3E1" w:sz="4"/>
+          <w:right w:val="single" w:color="DCE3E1" w:sz="4"/>
+        </w:pBdr>
+        <w:spacing w:before="120" w:after="0" w:line="240" w:lineRule="auto"/>
+        <w:jc w:val="center"/>
+      </w:pPr>
+      <w:r>
+        <w:drawing>
+          <wp:inline distT="0" distB="0" distL="0" distR="0">
+            <wp:extent cx="5124450" cy="3438525"/>
+            <wp:effectExtent t="0" r="0" b="0" l="0"/>
+            <wp:docPr id="1" name="Guest profile: contact, address, preferences and consent" descr="Guest profile: contact, address, preferences and consent" title="Guest profile: contact, address, preferences and consent"/>
+            <wp:cNvGraphicFramePr>
+              <a:graphicFrameLocks xmlns:a="http://schemas.openxmlformats.org/drawingml/2006/main" noChangeAspect="1"/>
+            </wp:cNvGraphicFramePr>
+            <a:graphic xmlns:a="http://schemas.openxmlformats.org/drawingml/2006/main">
+              <a:graphicData uri="http://schemas.openxmlformats.org/drawingml/2006/picture">
+                <pic:pic xmlns:pic="http://schemas.openxmlformats.org/drawingml/2006/picture">
+                  <pic:nvPicPr>
+                    <pic:cNvPr id="0" name="" descr=""/>
+                    <pic:cNvPicPr>
+                      <a:picLocks noChangeAspect="1" noChangeArrowheads="1"/>
+                    </pic:cNvPicPr>
+                  </pic:nvPicPr>
+                  <pic:blipFill>
+                    <a:blip r:embed="rId19" cstate="none"/>
+                    <a:srcRect/>
+                    <a:stretch>
+                      <a:fillRect/>
+                    </a:stretch>
+                  </pic:blipFill>
+                  <pic:spPr bwMode="auto">
+                    <a:xfrm>
+                      <a:off x="0" y="0"/>
+                      <a:ext cx="5124450" cy="3438525"/>
+                    </a:xfrm>
+                    <a:prstGeom prst="rect">
+                      <a:avLst/>
+                    </a:prstGeom>
+                  </pic:spPr>
+                </pic:pic>
+              </a:graphicData>
+            </a:graphic>
+          </wp:inline>
+        </w:drawing>
+      </w:r>
+    </w:p>
+    <w:p>
+      <w:pPr>
+        <w:pStyle w:val="Caption"/>
+      </w:pPr>
+      <w:r>
+        <w:t xml:space="preserve">Guest profile: contact, address, preferences and consent</w:t>
       </w:r>
     </w:p>
     <w:p>
@@ -14510,7 +14856,7 @@
                 <w:sz w:val="17"/>
                 <w:szCs w:val="17"/>
               </w:rPr>
-              <w:t xml:space="preserve">In progress</w:t>
+              <w:t xml:space="preserve">In review</w:t>
             </w:r>
           </w:p>
         </w:tc>
@@ -17813,7 +18159,7 @@
                     </pic:cNvPicPr>
                   </pic:nvPicPr>
                   <pic:blipFill>
-                    <a:blip r:embed="rId17" cstate="none"/>
+                    <a:blip r:embed="rId20" cstate="none"/>
                     <a:srcRect/>
                     <a:stretch>
                       <a:fillRect/>
@@ -17920,7 +18266,7 @@
         <w:t xml:space="preserve">Tests that grow with the system.</w:t>
       </w:r>
       <w:r>
-        <w:t xml:space="preserve"> As of Sprint 02: 50 server test methods, 14 screen tests and 26 end-to-end browser steps, all passing.</w:t>
+        <w:t xml:space="preserve"> As of Sprint 02: 75 server test methods, 20 screen tests and 39 end-to-end browser steps, all passing.</w:t>
       </w:r>
     </w:p>
     <w:p>
@@ -19807,7 +20153,7 @@
         <w:sz w:val="16"/>
         <w:szCs w:val="16"/>
       </w:rPr>
-      <w:t xml:space="preserve">Version 1.2 · 10 October 2026</w:t>
+      <w:t xml:space="preserve">Version 1.2.1 · 10 October 2026</w:t>
     </w:r>
     <w:r>
       <w:rPr>

</xml_diff>

<commit_message>
feat(guests): Sprint 03 — guests, encrypted ID documents, duplicates, merge, anonymise (#100)
* wip(guests): backend

* wip(guests): frontend

* wip(guests): screenshots, e2e, audit labels

* feat(guests): Sprint 03 — guest profiles, encrypted ID documents, duplicates, merge, anonymise, consent

Co-Authored-By: Claude Opus 5.5 <noreply@anthropic.com>
Claude-Session: https://claude.ai/code/session_01K9Lh4PHf4WW5osxpiZLyzk

---------

Co-authored-by: Claude <noreply@anthropic.com>
</commit_message>
<xml_diff>
--- a/docs/handbooks/Resort-OS-Product-Overview.docx
+++ b/docs/handbooks/Resort-OS-Product-Overview.docx
@@ -182,7 +182,7 @@
                 <w:sz w:val="19"/>
                 <w:szCs w:val="19"/>
               </w:rPr>
-              <w:t xml:space="preserve">Version 1.2</w:t>
+              <w:t xml:space="preserve">Version 1.2.1</w:t>
             </w:r>
           </w:p>
         </w:tc>
@@ -322,7 +322,7 @@
                 <w:sz w:val="19"/>
                 <w:szCs w:val="19"/>
               </w:rPr>
-              <w:t xml:space="preserve">Sprints 01, 02 accepted · Sprint 03 Guests in progress</w:t>
+              <w:t xml:space="preserve">Sprints 01, 02 accepted · Sprint 03 Guests in review</w:t>
             </w:r>
           </w:p>
         </w:tc>
@@ -661,6 +661,102 @@
                 <w:sz w:val="19"/>
                 <w:szCs w:val="19"/>
               </w:rPr>
+              <w:t xml:space="preserve">1.2.1</w:t>
+            </w:r>
+          </w:p>
+        </w:tc>
+        <w:tc>
+          <w:tcPr>
+            <w:tcW w:type="dxa" w:w="1500"/>
+            <w:tcBorders>
+              <w:top w:val="single" w:color="DCE3E1" w:sz="4"/>
+              <w:left w:val="single" w:color="DCE3E1" w:sz="4"/>
+              <w:bottom w:val="single" w:color="DCE3E1" w:sz="4"/>
+              <w:right w:val="single" w:color="DCE3E1" w:sz="4"/>
+            </w:tcBorders>
+            <w:tcMar>
+              <w:top w:type="dxa" w:w="70"/>
+              <w:left w:type="dxa" w:w="110"/>
+              <w:bottom w:type="dxa" w:w="50"/>
+              <w:right w:type="dxa" w:w="110"/>
+            </w:tcMar>
+            <w:vAlign w:val="top"/>
+          </w:tcPr>
+          <w:p>
+            <w:pPr>
+              <w:spacing w:after="40" w:line="252" w:lineRule="auto"/>
+            </w:pPr>
+            <w:r>
+              <w:rPr>
+                <w:sz w:val="19"/>
+                <w:szCs w:val="19"/>
+              </w:rPr>
+              <w:t xml:space="preserve">2026-10-10</w:t>
+            </w:r>
+          </w:p>
+        </w:tc>
+        <w:tc>
+          <w:tcPr>
+            <w:tcW w:type="dxa" w:w="6714"/>
+            <w:tcBorders>
+              <w:top w:val="single" w:color="DCE3E1" w:sz="4"/>
+              <w:left w:val="single" w:color="DCE3E1" w:sz="4"/>
+              <w:bottom w:val="single" w:color="DCE3E1" w:sz="4"/>
+              <w:right w:val="single" w:color="DCE3E1" w:sz="4"/>
+            </w:tcBorders>
+            <w:tcMar>
+              <w:top w:type="dxa" w:w="70"/>
+              <w:left w:type="dxa" w:w="110"/>
+              <w:bottom w:type="dxa" w:w="50"/>
+              <w:right w:type="dxa" w:w="110"/>
+            </w:tcMar>
+            <w:vAlign w:val="top"/>
+          </w:tcPr>
+          <w:p>
+            <w:pPr>
+              <w:spacing w:after="40" w:line="252" w:lineRule="auto"/>
+            </w:pPr>
+            <w:r>
+              <w:rPr>
+                <w:sz w:val="19"/>
+                <w:szCs w:val="19"/>
+              </w:rPr>
+              <w:t xml:space="preserve">Sprint 03 (Guests) built and in review: guest profiles, encrypted ID documents, duplicates, merge, anonymise, consent.</w:t>
+            </w:r>
+          </w:p>
+        </w:tc>
+      </w:tr>
+      <w:tr>
+        <w:trPr>
+          <w:cantSplit/>
+        </w:trPr>
+        <w:tc>
+          <w:tcPr>
+            <w:tcW w:type="dxa" w:w="1100"/>
+            <w:tcBorders>
+              <w:top w:val="single" w:color="DCE3E1" w:sz="4"/>
+              <w:left w:val="single" w:color="DCE3E1" w:sz="4"/>
+              <w:bottom w:val="single" w:color="DCE3E1" w:sz="4"/>
+              <w:right w:val="single" w:color="DCE3E1" w:sz="4"/>
+            </w:tcBorders>
+            <w:shd w:fill="F5F7F6" w:color="auto" w:val="clear"/>
+            <w:tcMar>
+              <w:top w:type="dxa" w:w="70"/>
+              <w:left w:type="dxa" w:w="110"/>
+              <w:bottom w:type="dxa" w:w="50"/>
+              <w:right w:type="dxa" w:w="110"/>
+            </w:tcMar>
+            <w:vAlign w:val="top"/>
+          </w:tcPr>
+          <w:p>
+            <w:pPr>
+              <w:spacing w:after="40" w:line="252" w:lineRule="auto"/>
+            </w:pPr>
+            <w:r>
+              <w:rPr>
+                <w:sz w:val="19"/>
+                <w:szCs w:val="19"/>
+              </w:rPr>
               <w:t xml:space="preserve">1.2</w:t>
             </w:r>
           </w:p>
@@ -674,6 +770,7 @@
               <w:bottom w:val="single" w:color="DCE3E1" w:sz="4"/>
               <w:right w:val="single" w:color="DCE3E1" w:sz="4"/>
             </w:tcBorders>
+            <w:shd w:fill="F5F7F6" w:color="auto" w:val="clear"/>
             <w:tcMar>
               <w:top w:type="dxa" w:w="70"/>
               <w:left w:type="dxa" w:w="110"/>
@@ -704,6 +801,7 @@
               <w:bottom w:val="single" w:color="DCE3E1" w:sz="4"/>
               <w:right w:val="single" w:color="DCE3E1" w:sz="4"/>
             </w:tcBorders>
+            <w:shd w:fill="F5F7F6" w:color="auto" w:val="clear"/>
             <w:tcMar>
               <w:top w:type="dxa" w:w="70"/>
               <w:left w:type="dxa" w:w="110"/>
@@ -954,7 +1052,7 @@
                 <w:sz w:val="19"/>
                 <w:szCs w:val="19"/>
               </w:rPr>
-              <w:t xml:space="preserve">Living document, rebuilt at the end of every accepted sprint. This edition reflects Sprint 02 accepted and Sprint 03 in progress.</w:t>
+              <w:t xml:space="preserve">Living document, rebuilt at the end of every sprint. This edition reflects Sprint 02 accepted and Sprint 03 built and in review.</w:t>
             </w:r>
           </w:p>
         </w:tc>
@@ -1678,7 +1776,7 @@
           <w:sz w:val="19"/>
           <w:szCs w:val="19"/>
         </w:rPr>
-        <w:t xml:space="preserve">In progress: Sprint 03 — Guests</w:t>
+        <w:t xml:space="preserve">Ready for review: Sprint 03 — Guests</w:t>
       </w:r>
     </w:p>
     <w:p>
@@ -2366,7 +2464,7 @@
                 <w:sz w:val="19"/>
                 <w:szCs w:val="19"/>
               </w:rPr>
-              <w:t xml:space="preserve">Sprints 01 and 02 are delivered and accepted. Sprint 03 (Guests) is in progress.</w:t>
+              <w:t xml:space="preserve">Sprints 01 and 02 are delivered and accepted. Sprint 03 (Guests) is built and waiting for review.</w:t>
             </w:r>
           </w:p>
         </w:tc>
@@ -4257,7 +4355,7 @@
                 <w:sz w:val="19"/>
                 <w:szCs w:val="19"/>
               </w:rPr>
-              <w:t xml:space="preserve">In progress</w:t>
+              <w:t xml:space="preserve">In review</w:t>
             </w:r>
           </w:p>
         </w:tc>
@@ -12267,25 +12365,273 @@
         <w:pStyle w:val="Heading2"/>
       </w:pPr>
       <w:r>
-        <w:t xml:space="preserve">9.3   In progress: Sprint 03 — Guests</w:t>
+        <w:t xml:space="preserve">9.3   Ready for review: Sprint 03 — Guests</w:t>
       </w:r>
     </w:p>
     <w:p>
       <w:r>
-        <w:t xml:space="preserve">Reception keeps one clean record per guest, finds returning guests by phone in one search, and stores ID documents encrypted and visible only to permitted staff.</w:t>
+        <w:t xml:space="preserve">Reception keeps one clean record per guest, finds returning guests by phone in one search, and stores ID documents encrypted and visible only to permitted staff. Built and tested; it becomes part of the system once the owner accepts it.</w:t>
       </w:r>
     </w:p>
     <w:p>
       <w:pPr>
-        <w:pStyle w:val="Small"/>
+        <w:pStyle w:val="ListParagraph"/>
+        <w:numPr>
+          <w:ilvl w:val="0"/>
+          <w:numId w:val="2"/>
+        </w:numPr>
+        <w:spacing w:after="60"/>
       </w:pPr>
       <w:r>
-        <w:rPr>
-          <w:color w:val="5F6B6E"/>
-          <w:sz w:val="18"/>
-          <w:szCs w:val="18"/>
-        </w:rPr>
-        <w:t xml:space="preserve">It will be accepted when: Reception finds a returning guest by phone in one search.</w:t>
+        <w:t xml:space="preserve">One profile per guest, shared by every property; returning guests found by phone in one search</w:t>
+      </w:r>
+    </w:p>
+    <w:p>
+      <w:pPr>
+        <w:pStyle w:val="ListParagraph"/>
+        <w:numPr>
+          <w:ilvl w:val="0"/>
+          <w:numId w:val="2"/>
+        </w:numPr>
+        <w:spacing w:after="60"/>
+      </w:pPr>
+      <w:r>
+        <w:t xml:space="preserve">A warning before creating a second profile for the same person, and a merge for duplicates that slip through</w:t>
+      </w:r>
+    </w:p>
+    <w:p>
+      <w:pPr>
+        <w:pStyle w:val="ListParagraph"/>
+        <w:numPr>
+          <w:ilvl w:val="0"/>
+          <w:numId w:val="2"/>
+        </w:numPr>
+        <w:spacing w:after="60"/>
+      </w:pPr>
+      <w:r>
+        <w:t xml:space="preserve">ID documents (passport, Aadhaar, visa…) stored encrypted; only reception, managers and owners can open them, and every view is recorded</w:t>
+      </w:r>
+    </w:p>
+    <w:p>
+      <w:pPr>
+        <w:pStyle w:val="ListParagraph"/>
+        <w:numPr>
+          <w:ilvl w:val="0"/>
+          <w:numId w:val="2"/>
+        </w:numPr>
+        <w:spacing w:after="60"/>
+      </w:pPr>
+      <w:r>
+        <w:t xml:space="preserve">Aadhaar: only the last 4 digits are ever kept</w:t>
+      </w:r>
+    </w:p>
+    <w:p>
+      <w:pPr>
+        <w:pStyle w:val="ListParagraph"/>
+        <w:numPr>
+          <w:ilvl w:val="0"/>
+          <w:numId w:val="2"/>
+        </w:numPr>
+        <w:spacing w:after="60"/>
+      </w:pPr>
+      <w:r>
+        <w:t xml:space="preserve">Consent for WhatsApp and email offers recorded with time and staff member</w:t>
+      </w:r>
+    </w:p>
+    <w:p>
+      <w:pPr>
+        <w:pStyle w:val="ListParagraph"/>
+        <w:numPr>
+          <w:ilvl w:val="0"/>
+          <w:numId w:val="2"/>
+        </w:numPr>
+        <w:spacing w:after="60"/>
+      </w:pPr>
+      <w:r>
+        <w:t xml:space="preserve">Anonymise on request: personal data and documents removed, accounts still add up</w:t>
+      </w:r>
+    </w:p>
+    <w:p>
+      <w:pPr>
+        <w:keepNext/>
+        <w:pBdr>
+          <w:top w:val="single" w:color="DCE3E1" w:sz="4"/>
+          <w:bottom w:val="single" w:color="DCE3E1" w:sz="4"/>
+          <w:left w:val="single" w:color="DCE3E1" w:sz="4"/>
+          <w:right w:val="single" w:color="DCE3E1" w:sz="4"/>
+        </w:pBdr>
+        <w:spacing w:before="120" w:after="0" w:line="240" w:lineRule="auto"/>
+        <w:jc w:val="center"/>
+      </w:pPr>
+      <w:r>
+        <w:drawing>
+          <wp:inline distT="0" distB="0" distL="0" distR="0">
+            <wp:extent cx="5124450" cy="3438525"/>
+            <wp:effectExtent t="0" r="0" b="0" l="0"/>
+            <wp:docPr id="1" name="A returning guest found by phone in one search" descr="A returning guest found by phone in one search" title="A returning guest found by phone in one search"/>
+            <wp:cNvGraphicFramePr>
+              <a:graphicFrameLocks xmlns:a="http://schemas.openxmlformats.org/drawingml/2006/main" noChangeAspect="1"/>
+            </wp:cNvGraphicFramePr>
+            <a:graphic xmlns:a="http://schemas.openxmlformats.org/drawingml/2006/main">
+              <a:graphicData uri="http://schemas.openxmlformats.org/drawingml/2006/picture">
+                <pic:pic xmlns:pic="http://schemas.openxmlformats.org/drawingml/2006/picture">
+                  <pic:nvPicPr>
+                    <pic:cNvPr id="0" name="" descr=""/>
+                    <pic:cNvPicPr>
+                      <a:picLocks noChangeAspect="1" noChangeArrowheads="1"/>
+                    </pic:cNvPicPr>
+                  </pic:nvPicPr>
+                  <pic:blipFill>
+                    <a:blip r:embed="rId17" cstate="none"/>
+                    <a:srcRect/>
+                    <a:stretch>
+                      <a:fillRect/>
+                    </a:stretch>
+                  </pic:blipFill>
+                  <pic:spPr bwMode="auto">
+                    <a:xfrm>
+                      <a:off x="0" y="0"/>
+                      <a:ext cx="5124450" cy="3438525"/>
+                    </a:xfrm>
+                    <a:prstGeom prst="rect">
+                      <a:avLst/>
+                    </a:prstGeom>
+                  </pic:spPr>
+                </pic:pic>
+              </a:graphicData>
+            </a:graphic>
+          </wp:inline>
+        </w:drawing>
+      </w:r>
+    </w:p>
+    <w:p>
+      <w:pPr>
+        <w:pStyle w:val="Caption"/>
+      </w:pPr>
+      <w:r>
+        <w:t xml:space="preserve">A returning guest found by phone in one search</w:t>
+      </w:r>
+    </w:p>
+    <w:p>
+      <w:pPr>
+        <w:keepNext/>
+        <w:pBdr>
+          <w:top w:val="single" w:color="DCE3E1" w:sz="4"/>
+          <w:bottom w:val="single" w:color="DCE3E1" w:sz="4"/>
+          <w:left w:val="single" w:color="DCE3E1" w:sz="4"/>
+          <w:right w:val="single" w:color="DCE3E1" w:sz="4"/>
+        </w:pBdr>
+        <w:spacing w:before="120" w:after="0" w:line="240" w:lineRule="auto"/>
+        <w:jc w:val="center"/>
+      </w:pPr>
+      <w:r>
+        <w:drawing>
+          <wp:inline distT="0" distB="0" distL="0" distR="0">
+            <wp:extent cx="5124450" cy="3438525"/>
+            <wp:effectExtent t="0" r="0" b="0" l="0"/>
+            <wp:docPr id="1" name="Warning before creating a second profile for the same person" descr="Warning before creating a second profile for the same person" title="Warning before creating a second profile for the same person"/>
+            <wp:cNvGraphicFramePr>
+              <a:graphicFrameLocks xmlns:a="http://schemas.openxmlformats.org/drawingml/2006/main" noChangeAspect="1"/>
+            </wp:cNvGraphicFramePr>
+            <a:graphic xmlns:a="http://schemas.openxmlformats.org/drawingml/2006/main">
+              <a:graphicData uri="http://schemas.openxmlformats.org/drawingml/2006/picture">
+                <pic:pic xmlns:pic="http://schemas.openxmlformats.org/drawingml/2006/picture">
+                  <pic:nvPicPr>
+                    <pic:cNvPr id="0" name="" descr=""/>
+                    <pic:cNvPicPr>
+                      <a:picLocks noChangeAspect="1" noChangeArrowheads="1"/>
+                    </pic:cNvPicPr>
+                  </pic:nvPicPr>
+                  <pic:blipFill>
+                    <a:blip r:embed="rId18" cstate="none"/>
+                    <a:srcRect/>
+                    <a:stretch>
+                      <a:fillRect/>
+                    </a:stretch>
+                  </pic:blipFill>
+                  <pic:spPr bwMode="auto">
+                    <a:xfrm>
+                      <a:off x="0" y="0"/>
+                      <a:ext cx="5124450" cy="3438525"/>
+                    </a:xfrm>
+                    <a:prstGeom prst="rect">
+                      <a:avLst/>
+                    </a:prstGeom>
+                  </pic:spPr>
+                </pic:pic>
+              </a:graphicData>
+            </a:graphic>
+          </wp:inline>
+        </w:drawing>
+      </w:r>
+    </w:p>
+    <w:p>
+      <w:pPr>
+        <w:pStyle w:val="Caption"/>
+      </w:pPr>
+      <w:r>
+        <w:t xml:space="preserve">Warning before creating a second profile for the same person</w:t>
+      </w:r>
+    </w:p>
+    <w:p>
+      <w:pPr>
+        <w:keepNext/>
+        <w:pBdr>
+          <w:top w:val="single" w:color="DCE3E1" w:sz="4"/>
+          <w:bottom w:val="single" w:color="DCE3E1" w:sz="4"/>
+          <w:left w:val="single" w:color="DCE3E1" w:sz="4"/>
+          <w:right w:val="single" w:color="DCE3E1" w:sz="4"/>
+        </w:pBdr>
+        <w:spacing w:before="120" w:after="0" w:line="240" w:lineRule="auto"/>
+        <w:jc w:val="center"/>
+      </w:pPr>
+      <w:r>
+        <w:drawing>
+          <wp:inline distT="0" distB="0" distL="0" distR="0">
+            <wp:extent cx="5124450" cy="3438525"/>
+            <wp:effectExtent t="0" r="0" b="0" l="0"/>
+            <wp:docPr id="1" name="Guest profile: contact, address, preferences and consent" descr="Guest profile: contact, address, preferences and consent" title="Guest profile: contact, address, preferences and consent"/>
+            <wp:cNvGraphicFramePr>
+              <a:graphicFrameLocks xmlns:a="http://schemas.openxmlformats.org/drawingml/2006/main" noChangeAspect="1"/>
+            </wp:cNvGraphicFramePr>
+            <a:graphic xmlns:a="http://schemas.openxmlformats.org/drawingml/2006/main">
+              <a:graphicData uri="http://schemas.openxmlformats.org/drawingml/2006/picture">
+                <pic:pic xmlns:pic="http://schemas.openxmlformats.org/drawingml/2006/picture">
+                  <pic:nvPicPr>
+                    <pic:cNvPr id="0" name="" descr=""/>
+                    <pic:cNvPicPr>
+                      <a:picLocks noChangeAspect="1" noChangeArrowheads="1"/>
+                    </pic:cNvPicPr>
+                  </pic:nvPicPr>
+                  <pic:blipFill>
+                    <a:blip r:embed="rId19" cstate="none"/>
+                    <a:srcRect/>
+                    <a:stretch>
+                      <a:fillRect/>
+                    </a:stretch>
+                  </pic:blipFill>
+                  <pic:spPr bwMode="auto">
+                    <a:xfrm>
+                      <a:off x="0" y="0"/>
+                      <a:ext cx="5124450" cy="3438525"/>
+                    </a:xfrm>
+                    <a:prstGeom prst="rect">
+                      <a:avLst/>
+                    </a:prstGeom>
+                  </pic:spPr>
+                </pic:pic>
+              </a:graphicData>
+            </a:graphic>
+          </wp:inline>
+        </w:drawing>
+      </w:r>
+    </w:p>
+    <w:p>
+      <w:pPr>
+        <w:pStyle w:val="Caption"/>
+      </w:pPr>
+      <w:r>
+        <w:t xml:space="preserve">Guest profile: contact, address, preferences and consent</w:t>
       </w:r>
     </w:p>
     <w:p>
@@ -14510,7 +14856,7 @@
                 <w:sz w:val="17"/>
                 <w:szCs w:val="17"/>
               </w:rPr>
-              <w:t xml:space="preserve">In progress</w:t>
+              <w:t xml:space="preserve">In review</w:t>
             </w:r>
           </w:p>
         </w:tc>
@@ -17813,7 +18159,7 @@
                     </pic:cNvPicPr>
                   </pic:nvPicPr>
                   <pic:blipFill>
-                    <a:blip r:embed="rId17" cstate="none"/>
+                    <a:blip r:embed="rId20" cstate="none"/>
                     <a:srcRect/>
                     <a:stretch>
                       <a:fillRect/>
@@ -17920,7 +18266,7 @@
         <w:t xml:space="preserve">Tests that grow with the system.</w:t>
       </w:r>
       <w:r>
-        <w:t xml:space="preserve"> As of Sprint 02: 50 server test methods, 14 screen tests and 26 end-to-end browser steps, all passing.</w:t>
+        <w:t xml:space="preserve"> As of Sprint 02: 75 server test methods, 20 screen tests and 39 end-to-end browser steps, all passing.</w:t>
       </w:r>
     </w:p>
     <w:p>
@@ -19807,7 +20153,7 @@
         <w:sz w:val="16"/>
         <w:szCs w:val="16"/>
       </w:rPr>
-      <w:t xml:space="preserve">Version 1.2 · 10 October 2026</w:t>
+      <w:t xml:space="preserve">Version 1.2.1 · 10 October 2026</w:t>
     </w:r>
     <w:r>
       <w:rPr>

</xml_diff>

<commit_message>
chore(sprints): accept Sprint 03
Sprint 03 (Guests) accepted by the owner on 11 Oct 2026 after the review
fixes in #105. sprints.yml: Sprint 03 done, Sprint 04 in progress;
guides regenerated; changelog dated; handbooks 1.3 rebuilt; layers
diagram shows the Guests services.

Co-Authored-By: Claude Opus 5.5 (1M context) <noreply@anthropic.com>
Claude-Session: https://claude.ai/code/session_01Wcyd1DGBFYnHAJywDtyL3t
</commit_message>
<xml_diff>
--- a/docs/handbooks/Resort-OS-Product-Overview.docx
+++ b/docs/handbooks/Resort-OS-Product-Overview.docx
@@ -182,7 +182,7 @@
                 <w:sz w:val="19"/>
                 <w:szCs w:val="19"/>
               </w:rPr>
-              <w:t xml:space="preserve">Version 1.2.1</w:t>
+              <w:t xml:space="preserve">Version 1.3</w:t>
             </w:r>
           </w:p>
         </w:tc>
@@ -252,7 +252,7 @@
                 <w:sz w:val="19"/>
                 <w:szCs w:val="19"/>
               </w:rPr>
-              <w:t xml:space="preserve">10 October 2026</w:t>
+              <w:t xml:space="preserve">11 October 2026</w:t>
             </w:r>
           </w:p>
         </w:tc>
@@ -322,7 +322,7 @@
                 <w:sz w:val="19"/>
                 <w:szCs w:val="19"/>
               </w:rPr>
-              <w:t xml:space="preserve">Sprints 01, 02 accepted · Sprint 03 Guests in review</w:t>
+              <w:t xml:space="preserve">Sprints 01, 02, 03 accepted · Sprint 04 Rate plans and packages in progress</w:t>
             </w:r>
           </w:p>
         </w:tc>
@@ -661,7 +661,7 @@
                 <w:sz w:val="19"/>
                 <w:szCs w:val="19"/>
               </w:rPr>
-              <w:t xml:space="preserve">1.2.1</w:t>
+              <w:t xml:space="preserve">1.3</w:t>
             </w:r>
           </w:p>
         </w:tc>
@@ -691,7 +691,7 @@
                 <w:sz w:val="19"/>
                 <w:szCs w:val="19"/>
               </w:rPr>
-              <w:t xml:space="preserve">2026-10-10</w:t>
+              <w:t xml:space="preserve">2026-10-11</w:t>
             </w:r>
           </w:p>
         </w:tc>
@@ -721,7 +721,7 @@
                 <w:sz w:val="19"/>
                 <w:szCs w:val="19"/>
               </w:rPr>
-              <w:t xml:space="preserve">Sprint 03 (Guests) built and in review: guest profiles, encrypted ID documents, duplicates, merge, anonymise, consent.</w:t>
+              <w:t xml:space="preserve">Sprint 03 (Guests) accepted, with review fixes: Aadhaar number check and error messages that say why. Sprint 04 (Rate plans and packages) started.</w:t>
             </w:r>
           </w:p>
         </w:tc>
@@ -757,6 +757,103 @@
                 <w:sz w:val="19"/>
                 <w:szCs w:val="19"/>
               </w:rPr>
+              <w:t xml:space="preserve">1.2.1</w:t>
+            </w:r>
+          </w:p>
+        </w:tc>
+        <w:tc>
+          <w:tcPr>
+            <w:tcW w:type="dxa" w:w="1500"/>
+            <w:tcBorders>
+              <w:top w:val="single" w:color="DCE3E1" w:sz="4"/>
+              <w:left w:val="single" w:color="DCE3E1" w:sz="4"/>
+              <w:bottom w:val="single" w:color="DCE3E1" w:sz="4"/>
+              <w:right w:val="single" w:color="DCE3E1" w:sz="4"/>
+            </w:tcBorders>
+            <w:shd w:fill="F5F7F6" w:color="auto" w:val="clear"/>
+            <w:tcMar>
+              <w:top w:type="dxa" w:w="70"/>
+              <w:left w:type="dxa" w:w="110"/>
+              <w:bottom w:type="dxa" w:w="50"/>
+              <w:right w:type="dxa" w:w="110"/>
+            </w:tcMar>
+            <w:vAlign w:val="top"/>
+          </w:tcPr>
+          <w:p>
+            <w:pPr>
+              <w:spacing w:after="40" w:line="252" w:lineRule="auto"/>
+            </w:pPr>
+            <w:r>
+              <w:rPr>
+                <w:sz w:val="19"/>
+                <w:szCs w:val="19"/>
+              </w:rPr>
+              <w:t xml:space="preserve">2026-10-10</w:t>
+            </w:r>
+          </w:p>
+        </w:tc>
+        <w:tc>
+          <w:tcPr>
+            <w:tcW w:type="dxa" w:w="6714"/>
+            <w:tcBorders>
+              <w:top w:val="single" w:color="DCE3E1" w:sz="4"/>
+              <w:left w:val="single" w:color="DCE3E1" w:sz="4"/>
+              <w:bottom w:val="single" w:color="DCE3E1" w:sz="4"/>
+              <w:right w:val="single" w:color="DCE3E1" w:sz="4"/>
+            </w:tcBorders>
+            <w:shd w:fill="F5F7F6" w:color="auto" w:val="clear"/>
+            <w:tcMar>
+              <w:top w:type="dxa" w:w="70"/>
+              <w:left w:type="dxa" w:w="110"/>
+              <w:bottom w:type="dxa" w:w="50"/>
+              <w:right w:type="dxa" w:w="110"/>
+            </w:tcMar>
+            <w:vAlign w:val="top"/>
+          </w:tcPr>
+          <w:p>
+            <w:pPr>
+              <w:spacing w:after="40" w:line="252" w:lineRule="auto"/>
+            </w:pPr>
+            <w:r>
+              <w:rPr>
+                <w:sz w:val="19"/>
+                <w:szCs w:val="19"/>
+              </w:rPr>
+              <w:t xml:space="preserve">Sprint 03 (Guests) built and in review: guest profiles, encrypted ID documents, duplicates, merge, anonymise, consent.</w:t>
+            </w:r>
+          </w:p>
+        </w:tc>
+      </w:tr>
+      <w:tr>
+        <w:trPr>
+          <w:cantSplit/>
+        </w:trPr>
+        <w:tc>
+          <w:tcPr>
+            <w:tcW w:type="dxa" w:w="1100"/>
+            <w:tcBorders>
+              <w:top w:val="single" w:color="DCE3E1" w:sz="4"/>
+              <w:left w:val="single" w:color="DCE3E1" w:sz="4"/>
+              <w:bottom w:val="single" w:color="DCE3E1" w:sz="4"/>
+              <w:right w:val="single" w:color="DCE3E1" w:sz="4"/>
+            </w:tcBorders>
+            <w:tcMar>
+              <w:top w:type="dxa" w:w="70"/>
+              <w:left w:type="dxa" w:w="110"/>
+              <w:bottom w:type="dxa" w:w="50"/>
+              <w:right w:type="dxa" w:w="110"/>
+            </w:tcMar>
+            <w:vAlign w:val="top"/>
+          </w:tcPr>
+          <w:p>
+            <w:pPr>
+              <w:spacing w:after="40" w:line="252" w:lineRule="auto"/>
+            </w:pPr>
+            <w:r>
+              <w:rPr>
+                <w:sz w:val="19"/>
+                <w:szCs w:val="19"/>
+              </w:rPr>
               <w:t xml:space="preserve">1.2</w:t>
             </w:r>
           </w:p>
@@ -770,7 +867,6 @@
               <w:bottom w:val="single" w:color="DCE3E1" w:sz="4"/>
               <w:right w:val="single" w:color="DCE3E1" w:sz="4"/>
             </w:tcBorders>
-            <w:shd w:fill="F5F7F6" w:color="auto" w:val="clear"/>
             <w:tcMar>
               <w:top w:type="dxa" w:w="70"/>
               <w:left w:type="dxa" w:w="110"/>
@@ -801,7 +897,6 @@
               <w:bottom w:val="single" w:color="DCE3E1" w:sz="4"/>
               <w:right w:val="single" w:color="DCE3E1" w:sz="4"/>
             </w:tcBorders>
-            <w:shd w:fill="F5F7F6" w:color="auto" w:val="clear"/>
             <w:tcMar>
               <w:top w:type="dxa" w:w="70"/>
               <w:left w:type="dxa" w:w="110"/>
@@ -1052,7 +1147,7 @@
                 <w:sz w:val="19"/>
                 <w:szCs w:val="19"/>
               </w:rPr>
-              <w:t xml:space="preserve">Living document, rebuilt at the end of every sprint. This edition reflects Sprint 02 accepted and Sprint 03 built and in review.</w:t>
+              <w:t xml:space="preserve">Living document, rebuilt at the end of every sprint. This edition reflects Sprint 03 accepted and Sprint 04 in progress.</w:t>
             </w:r>
           </w:p>
         </w:tc>
@@ -1776,7 +1871,33 @@
           <w:sz w:val="19"/>
           <w:szCs w:val="19"/>
         </w:rPr>
-        <w:t xml:space="preserve">Ready for review: Sprint 03 — Guests</w:t>
+        <w:t xml:space="preserve">Sprint 03 — Guests</w:t>
+      </w:r>
+    </w:p>
+    <w:p>
+      <w:pPr>
+        <w:spacing w:after="30" w:before="0"/>
+        <w:ind w:left="420"/>
+      </w:pPr>
+      <w:r>
+        <w:rPr>
+          <w:b w:val="false"/>
+          <w:bCs w:val="false"/>
+          <w:color w:val="8A2449"/>
+          <w:sz w:val="19"/>
+          <w:szCs w:val="19"/>
+        </w:rPr>
+        <w:t xml:space="preserve">9.4  </w:t>
+      </w:r>
+      <w:r>
+        <w:rPr>
+          <w:b w:val="false"/>
+          <w:bCs w:val="false"/>
+          <w:color w:val="1B2A2E"/>
+          <w:sz w:val="19"/>
+          <w:szCs w:val="19"/>
+        </w:rPr>
+        <w:t xml:space="preserve">In progress: Sprint 04 — Rate plans and packages</w:t>
       </w:r>
     </w:p>
     <w:p>
@@ -2099,7 +2220,7 @@
                 <w:sz w:val="40"/>
                 <w:szCs w:val="40"/>
               </w:rPr>
-              <w:t xml:space="preserve">2 of 29</w:t>
+              <w:t xml:space="preserve">3 of 29</w:t>
             </w:r>
           </w:p>
           <w:p>
@@ -2464,7 +2585,7 @@
                 <w:sz w:val="19"/>
                 <w:szCs w:val="19"/>
               </w:rPr>
-              <w:t xml:space="preserve">Sprints 01 and 02 are delivered and accepted. Sprint 03 (Guests) is built and waiting for review.</w:t>
+              <w:t xml:space="preserve">Sprints 01 and 02 and 03 are delivered and accepted. Sprint 04 (Rate plans and packages) is in progress.</w:t>
             </w:r>
           </w:p>
         </w:tc>
@@ -3912,24 +4033,25 @@
               <w:bottom w:val="single" w:color="DCE3E1" w:sz="4"/>
               <w:right w:val="single" w:color="DCE3E1" w:sz="4"/>
             </w:tcBorders>
-            <w:tcMar>
-              <w:top w:type="dxa" w:w="70"/>
-              <w:left w:type="dxa" w:w="110"/>
-              <w:bottom w:type="dxa" w:w="50"/>
-              <w:right w:type="dxa" w:w="110"/>
-            </w:tcMar>
-            <w:vAlign w:val="top"/>
-          </w:tcPr>
-          <w:p>
-            <w:pPr>
-              <w:spacing w:after="40" w:line="252" w:lineRule="auto"/>
-            </w:pPr>
-            <w:r>
-              <w:rPr>
-                <w:sz w:val="19"/>
-                <w:szCs w:val="19"/>
-              </w:rPr>
-              <w:t xml:space="preserve">Planned</w:t>
+            <w:shd w:fill="FBEFD8" w:color="auto" w:val="clear"/>
+            <w:tcMar>
+              <w:top w:type="dxa" w:w="70"/>
+              <w:left w:type="dxa" w:w="110"/>
+              <w:bottom w:type="dxa" w:w="50"/>
+              <w:right w:type="dxa" w:w="110"/>
+            </w:tcMar>
+            <w:vAlign w:val="top"/>
+          </w:tcPr>
+          <w:p>
+            <w:pPr>
+              <w:spacing w:after="40" w:line="252" w:lineRule="auto"/>
+            </w:pPr>
+            <w:r>
+              <w:rPr>
+                <w:sz w:val="19"/>
+                <w:szCs w:val="19"/>
+              </w:rPr>
+              <w:t xml:space="preserve">In progress</w:t>
             </w:r>
           </w:p>
         </w:tc>
@@ -4337,25 +4459,25 @@
               <w:bottom w:val="single" w:color="DCE3E1" w:sz="4"/>
               <w:right w:val="single" w:color="DCE3E1" w:sz="4"/>
             </w:tcBorders>
-            <w:shd w:fill="FBEFD8" w:color="auto" w:val="clear"/>
-            <w:tcMar>
-              <w:top w:type="dxa" w:w="70"/>
-              <w:left w:type="dxa" w:w="110"/>
-              <w:bottom w:type="dxa" w:w="50"/>
-              <w:right w:type="dxa" w:w="110"/>
-            </w:tcMar>
-            <w:vAlign w:val="top"/>
-          </w:tcPr>
-          <w:p>
-            <w:pPr>
-              <w:spacing w:after="40" w:line="252" w:lineRule="auto"/>
-            </w:pPr>
-            <w:r>
-              <w:rPr>
-                <w:sz w:val="19"/>
-                <w:szCs w:val="19"/>
-              </w:rPr>
-              <w:t xml:space="preserve">In review</w:t>
+            <w:shd w:fill="E3F0E6" w:color="auto" w:val="clear"/>
+            <w:tcMar>
+              <w:top w:type="dxa" w:w="70"/>
+              <w:left w:type="dxa" w:w="110"/>
+              <w:bottom w:type="dxa" w:w="50"/>
+              <w:right w:type="dxa" w:w="110"/>
+            </w:tcMar>
+            <w:vAlign w:val="top"/>
+          </w:tcPr>
+          <w:p>
+            <w:pPr>
+              <w:spacing w:after="40" w:line="252" w:lineRule="auto"/>
+            </w:pPr>
+            <w:r>
+              <w:rPr>
+                <w:sz w:val="19"/>
+                <w:szCs w:val="19"/>
+              </w:rPr>
+              <w:t xml:space="preserve">Done</w:t>
             </w:r>
           </w:p>
         </w:tc>
@@ -11822,7 +11944,7 @@
     </w:p>
     <w:p>
       <w:r>
-        <w:t xml:space="preserve">Work is delivered in short sprints, and each one ends with the owner trying the new screens and accepting them. These are the parts that are built, tested and accepted as of Sprint 02.</w:t>
+        <w:t xml:space="preserve">Work is delivered in short sprints, and each one ends with the owner trying the new screens and accepting them. These are the parts that are built, tested and accepted as of Sprint 03.</w:t>
       </w:r>
     </w:p>
     <w:p>
@@ -12365,12 +12487,12 @@
         <w:pStyle w:val="Heading2"/>
       </w:pPr>
       <w:r>
-        <w:t xml:space="preserve">9.3   Ready for review: Sprint 03 — Guests</w:t>
+        <w:t xml:space="preserve">9.3   Sprint 03 — Guests</w:t>
       </w:r>
     </w:p>
     <w:p>
       <w:r>
-        <w:t xml:space="preserve">Reception keeps one clean record per guest, finds returning guests by phone in one search, and stores ID documents encrypted and visible only to permitted staff. Built and tested; it becomes part of the system once the owner accepts it.</w:t>
+        <w:t xml:space="preserve">Reception keeps one clean record per guest, finds returning guests by phone in one search, and stores ID documents encrypted and visible only to permitted staff.</w:t>
       </w:r>
     </w:p>
     <w:p>
@@ -12636,6 +12758,32 @@
     </w:p>
     <w:p>
       <w:pPr>
+        <w:pStyle w:val="Heading2"/>
+      </w:pPr>
+      <w:r>
+        <w:t xml:space="preserve">9.4   In progress: Sprint 04 — Rate plans and packages</w:t>
+      </w:r>
+    </w:p>
+    <w:p>
+      <w:r>
+        <w:t xml:space="preserve">Managers set room and bed prices by date, weekend rates and packages (for example room + breakfast), and get an instant price quote for any stay.</w:t>
+      </w:r>
+    </w:p>
+    <w:p>
+      <w:pPr>
+        <w:pStyle w:val="Small"/>
+      </w:pPr>
+      <w:r>
+        <w:rPr>
+          <w:color w:val="5F6B6E"/>
+          <w:sz w:val="18"/>
+          <w:szCs w:val="18"/>
+        </w:rPr>
+        <w:t xml:space="preserve">It will be accepted when: A quote for Room 103, 2 adults, 3 nights returns a nightly breakdown matching the rate grid.</w:t>
+      </w:r>
+    </w:p>
+    <w:p>
+      <w:pPr>
         <w:pStyle w:val="Heading1"/>
         <w:pageBreakBefore/>
       </w:pPr>
@@ -14838,7 +14986,7 @@
               <w:bottom w:val="single" w:color="DCE3E1" w:sz="4"/>
               <w:right w:val="single" w:color="DCE3E1" w:sz="4"/>
             </w:tcBorders>
-            <w:shd w:fill="FBEFD8" w:color="auto" w:val="clear"/>
+            <w:shd w:fill="E3F0E6" w:color="auto" w:val="clear"/>
             <w:tcMar>
               <w:top w:type="dxa" w:w="70"/>
               <w:left w:type="dxa" w:w="110"/>
@@ -14856,7 +15004,7 @@
                 <w:sz w:val="17"/>
                 <w:szCs w:val="17"/>
               </w:rPr>
-              <w:t xml:space="preserve">In review</w:t>
+              <w:t xml:space="preserve">Done</w:t>
             </w:r>
           </w:p>
         </w:tc>
@@ -14964,6 +15112,7 @@
               <w:bottom w:val="single" w:color="DCE3E1" w:sz="4"/>
               <w:right w:val="single" w:color="DCE3E1" w:sz="4"/>
             </w:tcBorders>
+            <w:shd w:fill="FBEFD8" w:color="auto" w:val="clear"/>
             <w:tcMar>
               <w:top w:type="dxa" w:w="70"/>
               <w:left w:type="dxa" w:w="110"/>
@@ -14981,7 +15130,7 @@
                 <w:sz w:val="17"/>
                 <w:szCs w:val="17"/>
               </w:rPr>
-              <w:t xml:space="preserve">Planned</w:t>
+              <w:t xml:space="preserve">In progress</w:t>
             </w:r>
           </w:p>
         </w:tc>
@@ -18266,7 +18415,7 @@
         <w:t xml:space="preserve">Tests that grow with the system.</w:t>
       </w:r>
       <w:r>
-        <w:t xml:space="preserve"> As of Sprint 02: 75 server test methods, 20 screen tests and 39 end-to-end browser steps, all passing.</w:t>
+        <w:t xml:space="preserve"> As of Sprint 03: 77 server test methods, 23 screen tests and 39 end-to-end browser steps, all passing.</w:t>
       </w:r>
     </w:p>
     <w:p>
@@ -20153,7 +20302,7 @@
         <w:sz w:val="16"/>
         <w:szCs w:val="16"/>
       </w:rPr>
-      <w:t xml:space="preserve">Version 1.2.1 · 10 October 2026</w:t>
+      <w:t xml:space="preserve">Version 1.3 · 11 October 2026</w:t>
     </w:r>
     <w:r>
       <w:rPr>

</xml_diff>

<commit_message>
chore(sprints): accept Sprint 03 (#106)
Sprint 03 (Guests) accepted by the owner on 11 Oct 2026 after the review
fixes in #105. sprints.yml: Sprint 03 done, Sprint 04 in progress;
guides regenerated; changelog dated; handbooks 1.3 rebuilt; layers
diagram shows the Guests services.


Claude-Session: https://claude.ai/code/session_01Wcyd1DGBFYnHAJywDtyL3t

Co-authored-by: Claude <noreply@anthropic.com>
</commit_message>
<xml_diff>
--- a/docs/handbooks/Resort-OS-Product-Overview.docx
+++ b/docs/handbooks/Resort-OS-Product-Overview.docx
@@ -182,7 +182,7 @@
                 <w:sz w:val="19"/>
                 <w:szCs w:val="19"/>
               </w:rPr>
-              <w:t xml:space="preserve">Version 1.2.1</w:t>
+              <w:t xml:space="preserve">Version 1.3</w:t>
             </w:r>
           </w:p>
         </w:tc>
@@ -252,7 +252,7 @@
                 <w:sz w:val="19"/>
                 <w:szCs w:val="19"/>
               </w:rPr>
-              <w:t xml:space="preserve">10 October 2026</w:t>
+              <w:t xml:space="preserve">11 October 2026</w:t>
             </w:r>
           </w:p>
         </w:tc>
@@ -322,7 +322,7 @@
                 <w:sz w:val="19"/>
                 <w:szCs w:val="19"/>
               </w:rPr>
-              <w:t xml:space="preserve">Sprints 01, 02 accepted · Sprint 03 Guests in review</w:t>
+              <w:t xml:space="preserve">Sprints 01, 02, 03 accepted · Sprint 04 Rate plans and packages in progress</w:t>
             </w:r>
           </w:p>
         </w:tc>
@@ -661,7 +661,7 @@
                 <w:sz w:val="19"/>
                 <w:szCs w:val="19"/>
               </w:rPr>
-              <w:t xml:space="preserve">1.2.1</w:t>
+              <w:t xml:space="preserve">1.3</w:t>
             </w:r>
           </w:p>
         </w:tc>
@@ -691,7 +691,7 @@
                 <w:sz w:val="19"/>
                 <w:szCs w:val="19"/>
               </w:rPr>
-              <w:t xml:space="preserve">2026-10-10</w:t>
+              <w:t xml:space="preserve">2026-10-11</w:t>
             </w:r>
           </w:p>
         </w:tc>
@@ -721,7 +721,7 @@
                 <w:sz w:val="19"/>
                 <w:szCs w:val="19"/>
               </w:rPr>
-              <w:t xml:space="preserve">Sprint 03 (Guests) built and in review: guest profiles, encrypted ID documents, duplicates, merge, anonymise, consent.</w:t>
+              <w:t xml:space="preserve">Sprint 03 (Guests) accepted, with review fixes: Aadhaar number check and error messages that say why. Sprint 04 (Rate plans and packages) started.</w:t>
             </w:r>
           </w:p>
         </w:tc>
@@ -757,6 +757,103 @@
                 <w:sz w:val="19"/>
                 <w:szCs w:val="19"/>
               </w:rPr>
+              <w:t xml:space="preserve">1.2.1</w:t>
+            </w:r>
+          </w:p>
+        </w:tc>
+        <w:tc>
+          <w:tcPr>
+            <w:tcW w:type="dxa" w:w="1500"/>
+            <w:tcBorders>
+              <w:top w:val="single" w:color="DCE3E1" w:sz="4"/>
+              <w:left w:val="single" w:color="DCE3E1" w:sz="4"/>
+              <w:bottom w:val="single" w:color="DCE3E1" w:sz="4"/>
+              <w:right w:val="single" w:color="DCE3E1" w:sz="4"/>
+            </w:tcBorders>
+            <w:shd w:fill="F5F7F6" w:color="auto" w:val="clear"/>
+            <w:tcMar>
+              <w:top w:type="dxa" w:w="70"/>
+              <w:left w:type="dxa" w:w="110"/>
+              <w:bottom w:type="dxa" w:w="50"/>
+              <w:right w:type="dxa" w:w="110"/>
+            </w:tcMar>
+            <w:vAlign w:val="top"/>
+          </w:tcPr>
+          <w:p>
+            <w:pPr>
+              <w:spacing w:after="40" w:line="252" w:lineRule="auto"/>
+            </w:pPr>
+            <w:r>
+              <w:rPr>
+                <w:sz w:val="19"/>
+                <w:szCs w:val="19"/>
+              </w:rPr>
+              <w:t xml:space="preserve">2026-10-10</w:t>
+            </w:r>
+          </w:p>
+        </w:tc>
+        <w:tc>
+          <w:tcPr>
+            <w:tcW w:type="dxa" w:w="6714"/>
+            <w:tcBorders>
+              <w:top w:val="single" w:color="DCE3E1" w:sz="4"/>
+              <w:left w:val="single" w:color="DCE3E1" w:sz="4"/>
+              <w:bottom w:val="single" w:color="DCE3E1" w:sz="4"/>
+              <w:right w:val="single" w:color="DCE3E1" w:sz="4"/>
+            </w:tcBorders>
+            <w:shd w:fill="F5F7F6" w:color="auto" w:val="clear"/>
+            <w:tcMar>
+              <w:top w:type="dxa" w:w="70"/>
+              <w:left w:type="dxa" w:w="110"/>
+              <w:bottom w:type="dxa" w:w="50"/>
+              <w:right w:type="dxa" w:w="110"/>
+            </w:tcMar>
+            <w:vAlign w:val="top"/>
+          </w:tcPr>
+          <w:p>
+            <w:pPr>
+              <w:spacing w:after="40" w:line="252" w:lineRule="auto"/>
+            </w:pPr>
+            <w:r>
+              <w:rPr>
+                <w:sz w:val="19"/>
+                <w:szCs w:val="19"/>
+              </w:rPr>
+              <w:t xml:space="preserve">Sprint 03 (Guests) built and in review: guest profiles, encrypted ID documents, duplicates, merge, anonymise, consent.</w:t>
+            </w:r>
+          </w:p>
+        </w:tc>
+      </w:tr>
+      <w:tr>
+        <w:trPr>
+          <w:cantSplit/>
+        </w:trPr>
+        <w:tc>
+          <w:tcPr>
+            <w:tcW w:type="dxa" w:w="1100"/>
+            <w:tcBorders>
+              <w:top w:val="single" w:color="DCE3E1" w:sz="4"/>
+              <w:left w:val="single" w:color="DCE3E1" w:sz="4"/>
+              <w:bottom w:val="single" w:color="DCE3E1" w:sz="4"/>
+              <w:right w:val="single" w:color="DCE3E1" w:sz="4"/>
+            </w:tcBorders>
+            <w:tcMar>
+              <w:top w:type="dxa" w:w="70"/>
+              <w:left w:type="dxa" w:w="110"/>
+              <w:bottom w:type="dxa" w:w="50"/>
+              <w:right w:type="dxa" w:w="110"/>
+            </w:tcMar>
+            <w:vAlign w:val="top"/>
+          </w:tcPr>
+          <w:p>
+            <w:pPr>
+              <w:spacing w:after="40" w:line="252" w:lineRule="auto"/>
+            </w:pPr>
+            <w:r>
+              <w:rPr>
+                <w:sz w:val="19"/>
+                <w:szCs w:val="19"/>
+              </w:rPr>
               <w:t xml:space="preserve">1.2</w:t>
             </w:r>
           </w:p>
@@ -770,7 +867,6 @@
               <w:bottom w:val="single" w:color="DCE3E1" w:sz="4"/>
               <w:right w:val="single" w:color="DCE3E1" w:sz="4"/>
             </w:tcBorders>
-            <w:shd w:fill="F5F7F6" w:color="auto" w:val="clear"/>
             <w:tcMar>
               <w:top w:type="dxa" w:w="70"/>
               <w:left w:type="dxa" w:w="110"/>
@@ -801,7 +897,6 @@
               <w:bottom w:val="single" w:color="DCE3E1" w:sz="4"/>
               <w:right w:val="single" w:color="DCE3E1" w:sz="4"/>
             </w:tcBorders>
-            <w:shd w:fill="F5F7F6" w:color="auto" w:val="clear"/>
             <w:tcMar>
               <w:top w:type="dxa" w:w="70"/>
               <w:left w:type="dxa" w:w="110"/>
@@ -1052,7 +1147,7 @@
                 <w:sz w:val="19"/>
                 <w:szCs w:val="19"/>
               </w:rPr>
-              <w:t xml:space="preserve">Living document, rebuilt at the end of every sprint. This edition reflects Sprint 02 accepted and Sprint 03 built and in review.</w:t>
+              <w:t xml:space="preserve">Living document, rebuilt at the end of every sprint. This edition reflects Sprint 03 accepted and Sprint 04 in progress.</w:t>
             </w:r>
           </w:p>
         </w:tc>
@@ -1776,7 +1871,33 @@
           <w:sz w:val="19"/>
           <w:szCs w:val="19"/>
         </w:rPr>
-        <w:t xml:space="preserve">Ready for review: Sprint 03 — Guests</w:t>
+        <w:t xml:space="preserve">Sprint 03 — Guests</w:t>
+      </w:r>
+    </w:p>
+    <w:p>
+      <w:pPr>
+        <w:spacing w:after="30" w:before="0"/>
+        <w:ind w:left="420"/>
+      </w:pPr>
+      <w:r>
+        <w:rPr>
+          <w:b w:val="false"/>
+          <w:bCs w:val="false"/>
+          <w:color w:val="8A2449"/>
+          <w:sz w:val="19"/>
+          <w:szCs w:val="19"/>
+        </w:rPr>
+        <w:t xml:space="preserve">9.4  </w:t>
+      </w:r>
+      <w:r>
+        <w:rPr>
+          <w:b w:val="false"/>
+          <w:bCs w:val="false"/>
+          <w:color w:val="1B2A2E"/>
+          <w:sz w:val="19"/>
+          <w:szCs w:val="19"/>
+        </w:rPr>
+        <w:t xml:space="preserve">In progress: Sprint 04 — Rate plans and packages</w:t>
       </w:r>
     </w:p>
     <w:p>
@@ -2099,7 +2220,7 @@
                 <w:sz w:val="40"/>
                 <w:szCs w:val="40"/>
               </w:rPr>
-              <w:t xml:space="preserve">2 of 29</w:t>
+              <w:t xml:space="preserve">3 of 29</w:t>
             </w:r>
           </w:p>
           <w:p>
@@ -2464,7 +2585,7 @@
                 <w:sz w:val="19"/>
                 <w:szCs w:val="19"/>
               </w:rPr>
-              <w:t xml:space="preserve">Sprints 01 and 02 are delivered and accepted. Sprint 03 (Guests) is built and waiting for review.</w:t>
+              <w:t xml:space="preserve">Sprints 01 and 02 and 03 are delivered and accepted. Sprint 04 (Rate plans and packages) is in progress.</w:t>
             </w:r>
           </w:p>
         </w:tc>
@@ -3912,24 +4033,25 @@
               <w:bottom w:val="single" w:color="DCE3E1" w:sz="4"/>
               <w:right w:val="single" w:color="DCE3E1" w:sz="4"/>
             </w:tcBorders>
-            <w:tcMar>
-              <w:top w:type="dxa" w:w="70"/>
-              <w:left w:type="dxa" w:w="110"/>
-              <w:bottom w:type="dxa" w:w="50"/>
-              <w:right w:type="dxa" w:w="110"/>
-            </w:tcMar>
-            <w:vAlign w:val="top"/>
-          </w:tcPr>
-          <w:p>
-            <w:pPr>
-              <w:spacing w:after="40" w:line="252" w:lineRule="auto"/>
-            </w:pPr>
-            <w:r>
-              <w:rPr>
-                <w:sz w:val="19"/>
-                <w:szCs w:val="19"/>
-              </w:rPr>
-              <w:t xml:space="preserve">Planned</w:t>
+            <w:shd w:fill="FBEFD8" w:color="auto" w:val="clear"/>
+            <w:tcMar>
+              <w:top w:type="dxa" w:w="70"/>
+              <w:left w:type="dxa" w:w="110"/>
+              <w:bottom w:type="dxa" w:w="50"/>
+              <w:right w:type="dxa" w:w="110"/>
+            </w:tcMar>
+            <w:vAlign w:val="top"/>
+          </w:tcPr>
+          <w:p>
+            <w:pPr>
+              <w:spacing w:after="40" w:line="252" w:lineRule="auto"/>
+            </w:pPr>
+            <w:r>
+              <w:rPr>
+                <w:sz w:val="19"/>
+                <w:szCs w:val="19"/>
+              </w:rPr>
+              <w:t xml:space="preserve">In progress</w:t>
             </w:r>
           </w:p>
         </w:tc>
@@ -4337,25 +4459,25 @@
               <w:bottom w:val="single" w:color="DCE3E1" w:sz="4"/>
               <w:right w:val="single" w:color="DCE3E1" w:sz="4"/>
             </w:tcBorders>
-            <w:shd w:fill="FBEFD8" w:color="auto" w:val="clear"/>
-            <w:tcMar>
-              <w:top w:type="dxa" w:w="70"/>
-              <w:left w:type="dxa" w:w="110"/>
-              <w:bottom w:type="dxa" w:w="50"/>
-              <w:right w:type="dxa" w:w="110"/>
-            </w:tcMar>
-            <w:vAlign w:val="top"/>
-          </w:tcPr>
-          <w:p>
-            <w:pPr>
-              <w:spacing w:after="40" w:line="252" w:lineRule="auto"/>
-            </w:pPr>
-            <w:r>
-              <w:rPr>
-                <w:sz w:val="19"/>
-                <w:szCs w:val="19"/>
-              </w:rPr>
-              <w:t xml:space="preserve">In review</w:t>
+            <w:shd w:fill="E3F0E6" w:color="auto" w:val="clear"/>
+            <w:tcMar>
+              <w:top w:type="dxa" w:w="70"/>
+              <w:left w:type="dxa" w:w="110"/>
+              <w:bottom w:type="dxa" w:w="50"/>
+              <w:right w:type="dxa" w:w="110"/>
+            </w:tcMar>
+            <w:vAlign w:val="top"/>
+          </w:tcPr>
+          <w:p>
+            <w:pPr>
+              <w:spacing w:after="40" w:line="252" w:lineRule="auto"/>
+            </w:pPr>
+            <w:r>
+              <w:rPr>
+                <w:sz w:val="19"/>
+                <w:szCs w:val="19"/>
+              </w:rPr>
+              <w:t xml:space="preserve">Done</w:t>
             </w:r>
           </w:p>
         </w:tc>
@@ -11822,7 +11944,7 @@
     </w:p>
     <w:p>
       <w:r>
-        <w:t xml:space="preserve">Work is delivered in short sprints, and each one ends with the owner trying the new screens and accepting them. These are the parts that are built, tested and accepted as of Sprint 02.</w:t>
+        <w:t xml:space="preserve">Work is delivered in short sprints, and each one ends with the owner trying the new screens and accepting them. These are the parts that are built, tested and accepted as of Sprint 03.</w:t>
       </w:r>
     </w:p>
     <w:p>
@@ -12365,12 +12487,12 @@
         <w:pStyle w:val="Heading2"/>
       </w:pPr>
       <w:r>
-        <w:t xml:space="preserve">9.3   Ready for review: Sprint 03 — Guests</w:t>
+        <w:t xml:space="preserve">9.3   Sprint 03 — Guests</w:t>
       </w:r>
     </w:p>
     <w:p>
       <w:r>
-        <w:t xml:space="preserve">Reception keeps one clean record per guest, finds returning guests by phone in one search, and stores ID documents encrypted and visible only to permitted staff. Built and tested; it becomes part of the system once the owner accepts it.</w:t>
+        <w:t xml:space="preserve">Reception keeps one clean record per guest, finds returning guests by phone in one search, and stores ID documents encrypted and visible only to permitted staff.</w:t>
       </w:r>
     </w:p>
     <w:p>
@@ -12636,6 +12758,32 @@
     </w:p>
     <w:p>
       <w:pPr>
+        <w:pStyle w:val="Heading2"/>
+      </w:pPr>
+      <w:r>
+        <w:t xml:space="preserve">9.4   In progress: Sprint 04 — Rate plans and packages</w:t>
+      </w:r>
+    </w:p>
+    <w:p>
+      <w:r>
+        <w:t xml:space="preserve">Managers set room and bed prices by date, weekend rates and packages (for example room + breakfast), and get an instant price quote for any stay.</w:t>
+      </w:r>
+    </w:p>
+    <w:p>
+      <w:pPr>
+        <w:pStyle w:val="Small"/>
+      </w:pPr>
+      <w:r>
+        <w:rPr>
+          <w:color w:val="5F6B6E"/>
+          <w:sz w:val="18"/>
+          <w:szCs w:val="18"/>
+        </w:rPr>
+        <w:t xml:space="preserve">It will be accepted when: A quote for Room 103, 2 adults, 3 nights returns a nightly breakdown matching the rate grid.</w:t>
+      </w:r>
+    </w:p>
+    <w:p>
+      <w:pPr>
         <w:pStyle w:val="Heading1"/>
         <w:pageBreakBefore/>
       </w:pPr>
@@ -14838,7 +14986,7 @@
               <w:bottom w:val="single" w:color="DCE3E1" w:sz="4"/>
               <w:right w:val="single" w:color="DCE3E1" w:sz="4"/>
             </w:tcBorders>
-            <w:shd w:fill="FBEFD8" w:color="auto" w:val="clear"/>
+            <w:shd w:fill="E3F0E6" w:color="auto" w:val="clear"/>
             <w:tcMar>
               <w:top w:type="dxa" w:w="70"/>
               <w:left w:type="dxa" w:w="110"/>
@@ -14856,7 +15004,7 @@
                 <w:sz w:val="17"/>
                 <w:szCs w:val="17"/>
               </w:rPr>
-              <w:t xml:space="preserve">In review</w:t>
+              <w:t xml:space="preserve">Done</w:t>
             </w:r>
           </w:p>
         </w:tc>
@@ -14964,6 +15112,7 @@
               <w:bottom w:val="single" w:color="DCE3E1" w:sz="4"/>
               <w:right w:val="single" w:color="DCE3E1" w:sz="4"/>
             </w:tcBorders>
+            <w:shd w:fill="FBEFD8" w:color="auto" w:val="clear"/>
             <w:tcMar>
               <w:top w:type="dxa" w:w="70"/>
               <w:left w:type="dxa" w:w="110"/>
@@ -14981,7 +15130,7 @@
                 <w:sz w:val="17"/>
                 <w:szCs w:val="17"/>
               </w:rPr>
-              <w:t xml:space="preserve">Planned</w:t>
+              <w:t xml:space="preserve">In progress</w:t>
             </w:r>
           </w:p>
         </w:tc>
@@ -18266,7 +18415,7 @@
         <w:t xml:space="preserve">Tests that grow with the system.</w:t>
       </w:r>
       <w:r>
-        <w:t xml:space="preserve"> As of Sprint 02: 75 server test methods, 20 screen tests and 39 end-to-end browser steps, all passing.</w:t>
+        <w:t xml:space="preserve"> As of Sprint 03: 77 server test methods, 23 screen tests and 39 end-to-end browser steps, all passing.</w:t>
       </w:r>
     </w:p>
     <w:p>
@@ -20153,7 +20302,7 @@
         <w:sz w:val="16"/>
         <w:szCs w:val="16"/>
       </w:rPr>
-      <w:t xml:space="preserve">Version 1.2.1 · 10 October 2026</w:t>
+      <w:t xml:space="preserve">Version 1.3 · 11 October 2026</w:t>
     </w:r>
     <w:r>
       <w:rPr>

</xml_diff>

<commit_message>
chore(sprints): accept Sprint 04
Sprint 04 (Rate plans and packages) accepted by the owner on 14 Oct 2026
after the review and the browser tests for Sprints 01-04. sprints.yml:
Sprint 04 done with its handbook block, Sprint 05 in progress; guides
regenerated; changelog dated with the grid alignment fix; handbooks 1.4
rebuilt with a rate tables diagram; layers and capabilities diagrams
updated; run-and-test handbook shows Sprint 04 on develop and main.

Co-Authored-By: Claude Opus 5.5 (1M context) <noreply@anthropic.com>
Claude-Session: https://claude.ai/code/session_01C6KXuXDZ49bn17rX2sgdX3
</commit_message>
<xml_diff>
--- a/docs/handbooks/Resort-OS-Product-Overview.docx
+++ b/docs/handbooks/Resort-OS-Product-Overview.docx
@@ -182,7 +182,7 @@
                 <w:sz w:val="19"/>
                 <w:szCs w:val="19"/>
               </w:rPr>
-              <w:t xml:space="preserve">Version 1.3</w:t>
+              <w:t xml:space="preserve">Version 1.4</w:t>
             </w:r>
           </w:p>
         </w:tc>
@@ -252,7 +252,7 @@
                 <w:sz w:val="19"/>
                 <w:szCs w:val="19"/>
               </w:rPr>
-              <w:t xml:space="preserve">11 October 2026</w:t>
+              <w:t xml:space="preserve">14 October 2026</w:t>
             </w:r>
           </w:p>
         </w:tc>
@@ -322,7 +322,7 @@
                 <w:sz w:val="19"/>
                 <w:szCs w:val="19"/>
               </w:rPr>
-              <w:t xml:space="preserve">Sprints 01, 02, 03 accepted · Sprint 04 Rate plans and packages in progress</w:t>
+              <w:t xml:space="preserve">Sprints 01, 02, 03, 04 accepted · Sprint 05 Availability engine and reservations core in progress</w:t>
             </w:r>
           </w:p>
         </w:tc>
@@ -661,7 +661,7 @@
                 <w:sz w:val="19"/>
                 <w:szCs w:val="19"/>
               </w:rPr>
-              <w:t xml:space="preserve">1.3</w:t>
+              <w:t xml:space="preserve">1.4</w:t>
             </w:r>
           </w:p>
         </w:tc>
@@ -691,7 +691,7 @@
                 <w:sz w:val="19"/>
                 <w:szCs w:val="19"/>
               </w:rPr>
-              <w:t xml:space="preserve">2026-10-11</w:t>
+              <w:t xml:space="preserve">2026-10-14</w:t>
             </w:r>
           </w:p>
         </w:tc>
@@ -721,7 +721,7 @@
                 <w:sz w:val="19"/>
                 <w:szCs w:val="19"/>
               </w:rPr>
-              <w:t xml:space="preserve">Sprint 03 (Guests) accepted, with review fixes: Aadhaar number check and error messages that say why. Sprint 04 (Rate plans and packages) started.</w:t>
+              <w:t xml:space="preserve">Sprint 04 (Rate plans and packages) accepted: nightly price grid, quotes, packages with revenue split. Sprint 05 (Availability engine and reservations) started.</w:t>
             </w:r>
           </w:p>
         </w:tc>
@@ -757,7 +757,7 @@
                 <w:sz w:val="19"/>
                 <w:szCs w:val="19"/>
               </w:rPr>
-              <w:t xml:space="preserve">1.2.1</w:t>
+              <w:t xml:space="preserve">1.3</w:t>
             </w:r>
           </w:p>
         </w:tc>
@@ -788,7 +788,7 @@
                 <w:sz w:val="19"/>
                 <w:szCs w:val="19"/>
               </w:rPr>
-              <w:t xml:space="preserve">2026-10-10</w:t>
+              <w:t xml:space="preserve">2026-10-11</w:t>
             </w:r>
           </w:p>
         </w:tc>
@@ -819,7 +819,7 @@
                 <w:sz w:val="19"/>
                 <w:szCs w:val="19"/>
               </w:rPr>
-              <w:t xml:space="preserve">Sprint 03 (Guests) built and in review: guest profiles, encrypted ID documents, duplicates, merge, anonymise, consent.</w:t>
+              <w:t xml:space="preserve">Sprint 03 (Guests) accepted, with review fixes: Aadhaar number check and error messages that say why. Sprint 04 (Rate plans and packages) started.</w:t>
             </w:r>
           </w:p>
         </w:tc>
@@ -854,6 +854,102 @@
                 <w:sz w:val="19"/>
                 <w:szCs w:val="19"/>
               </w:rPr>
+              <w:t xml:space="preserve">1.2.1</w:t>
+            </w:r>
+          </w:p>
+        </w:tc>
+        <w:tc>
+          <w:tcPr>
+            <w:tcW w:type="dxa" w:w="1500"/>
+            <w:tcBorders>
+              <w:top w:val="single" w:color="DCE3E1" w:sz="4"/>
+              <w:left w:val="single" w:color="DCE3E1" w:sz="4"/>
+              <w:bottom w:val="single" w:color="DCE3E1" w:sz="4"/>
+              <w:right w:val="single" w:color="DCE3E1" w:sz="4"/>
+            </w:tcBorders>
+            <w:tcMar>
+              <w:top w:type="dxa" w:w="70"/>
+              <w:left w:type="dxa" w:w="110"/>
+              <w:bottom w:type="dxa" w:w="50"/>
+              <w:right w:type="dxa" w:w="110"/>
+            </w:tcMar>
+            <w:vAlign w:val="top"/>
+          </w:tcPr>
+          <w:p>
+            <w:pPr>
+              <w:spacing w:after="40" w:line="252" w:lineRule="auto"/>
+            </w:pPr>
+            <w:r>
+              <w:rPr>
+                <w:sz w:val="19"/>
+                <w:szCs w:val="19"/>
+              </w:rPr>
+              <w:t xml:space="preserve">2026-10-10</w:t>
+            </w:r>
+          </w:p>
+        </w:tc>
+        <w:tc>
+          <w:tcPr>
+            <w:tcW w:type="dxa" w:w="6714"/>
+            <w:tcBorders>
+              <w:top w:val="single" w:color="DCE3E1" w:sz="4"/>
+              <w:left w:val="single" w:color="DCE3E1" w:sz="4"/>
+              <w:bottom w:val="single" w:color="DCE3E1" w:sz="4"/>
+              <w:right w:val="single" w:color="DCE3E1" w:sz="4"/>
+            </w:tcBorders>
+            <w:tcMar>
+              <w:top w:type="dxa" w:w="70"/>
+              <w:left w:type="dxa" w:w="110"/>
+              <w:bottom w:type="dxa" w:w="50"/>
+              <w:right w:type="dxa" w:w="110"/>
+            </w:tcMar>
+            <w:vAlign w:val="top"/>
+          </w:tcPr>
+          <w:p>
+            <w:pPr>
+              <w:spacing w:after="40" w:line="252" w:lineRule="auto"/>
+            </w:pPr>
+            <w:r>
+              <w:rPr>
+                <w:sz w:val="19"/>
+                <w:szCs w:val="19"/>
+              </w:rPr>
+              <w:t xml:space="preserve">Sprint 03 (Guests) built and in review: guest profiles, encrypted ID documents, duplicates, merge, anonymise, consent.</w:t>
+            </w:r>
+          </w:p>
+        </w:tc>
+      </w:tr>
+      <w:tr>
+        <w:trPr>
+          <w:cantSplit/>
+        </w:trPr>
+        <w:tc>
+          <w:tcPr>
+            <w:tcW w:type="dxa" w:w="1100"/>
+            <w:tcBorders>
+              <w:top w:val="single" w:color="DCE3E1" w:sz="4"/>
+              <w:left w:val="single" w:color="DCE3E1" w:sz="4"/>
+              <w:bottom w:val="single" w:color="DCE3E1" w:sz="4"/>
+              <w:right w:val="single" w:color="DCE3E1" w:sz="4"/>
+            </w:tcBorders>
+            <w:shd w:fill="F5F7F6" w:color="auto" w:val="clear"/>
+            <w:tcMar>
+              <w:top w:type="dxa" w:w="70"/>
+              <w:left w:type="dxa" w:w="110"/>
+              <w:bottom w:type="dxa" w:w="50"/>
+              <w:right w:type="dxa" w:w="110"/>
+            </w:tcMar>
+            <w:vAlign w:val="top"/>
+          </w:tcPr>
+          <w:p>
+            <w:pPr>
+              <w:spacing w:after="40" w:line="252" w:lineRule="auto"/>
+            </w:pPr>
+            <w:r>
+              <w:rPr>
+                <w:sz w:val="19"/>
+                <w:szCs w:val="19"/>
+              </w:rPr>
               <w:t xml:space="preserve">1.2</w:t>
             </w:r>
           </w:p>
@@ -867,6 +963,7 @@
               <w:bottom w:val="single" w:color="DCE3E1" w:sz="4"/>
               <w:right w:val="single" w:color="DCE3E1" w:sz="4"/>
             </w:tcBorders>
+            <w:shd w:fill="F5F7F6" w:color="auto" w:val="clear"/>
             <w:tcMar>
               <w:top w:type="dxa" w:w="70"/>
               <w:left w:type="dxa" w:w="110"/>
@@ -897,6 +994,7 @@
               <w:bottom w:val="single" w:color="DCE3E1" w:sz="4"/>
               <w:right w:val="single" w:color="DCE3E1" w:sz="4"/>
             </w:tcBorders>
+            <w:shd w:fill="F5F7F6" w:color="auto" w:val="clear"/>
             <w:tcMar>
               <w:top w:type="dxa" w:w="70"/>
               <w:left w:type="dxa" w:w="110"/>
@@ -1147,7 +1245,7 @@
                 <w:sz w:val="19"/>
                 <w:szCs w:val="19"/>
               </w:rPr>
-              <w:t xml:space="preserve">Living document, rebuilt at the end of every sprint. This edition reflects Sprint 03 accepted and Sprint 04 in progress.</w:t>
+              <w:t xml:space="preserve">Living document, rebuilt at the end of every sprint. This edition reflects Sprint 04 accepted and Sprint 05 in progress.</w:t>
             </w:r>
           </w:p>
         </w:tc>
@@ -1897,7 +1995,33 @@
           <w:sz w:val="19"/>
           <w:szCs w:val="19"/>
         </w:rPr>
-        <w:t xml:space="preserve">In progress: Sprint 04 — Rate plans and packages</w:t>
+        <w:t xml:space="preserve">Sprint 04 — Rate plans and packages</w:t>
+      </w:r>
+    </w:p>
+    <w:p>
+      <w:pPr>
+        <w:spacing w:after="30" w:before="0"/>
+        <w:ind w:left="420"/>
+      </w:pPr>
+      <w:r>
+        <w:rPr>
+          <w:b w:val="false"/>
+          <w:bCs w:val="false"/>
+          <w:color w:val="8A2449"/>
+          <w:sz w:val="19"/>
+          <w:szCs w:val="19"/>
+        </w:rPr>
+        <w:t xml:space="preserve">9.5  </w:t>
+      </w:r>
+      <w:r>
+        <w:rPr>
+          <w:b w:val="false"/>
+          <w:bCs w:val="false"/>
+          <w:color w:val="1B2A2E"/>
+          <w:sz w:val="19"/>
+          <w:szCs w:val="19"/>
+        </w:rPr>
+        <w:t xml:space="preserve">In progress: Sprint 05 — Availability engine and reservations core</w:t>
       </w:r>
     </w:p>
     <w:p>
@@ -2220,7 +2344,7 @@
                 <w:sz w:val="40"/>
                 <w:szCs w:val="40"/>
               </w:rPr>
-              <w:t xml:space="preserve">3 of 29</w:t>
+              <w:t xml:space="preserve">4 of 29</w:t>
             </w:r>
           </w:p>
           <w:p>
@@ -2585,7 +2709,7 @@
                 <w:sz w:val="19"/>
                 <w:szCs w:val="19"/>
               </w:rPr>
-              <w:t xml:space="preserve">Sprints 01 and 02 and 03 are delivered and accepted. Sprint 04 (Rate plans and packages) is in progress.</w:t>
+              <w:t xml:space="preserve">Sprints 01 and 02 and 03 and 04 are delivered and accepted. Sprint 05 (Availability engine and reservations core) is in progress.</w:t>
             </w:r>
           </w:p>
         </w:tc>
@@ -4033,25 +4157,25 @@
               <w:bottom w:val="single" w:color="DCE3E1" w:sz="4"/>
               <w:right w:val="single" w:color="DCE3E1" w:sz="4"/>
             </w:tcBorders>
-            <w:shd w:fill="FBEFD8" w:color="auto" w:val="clear"/>
-            <w:tcMar>
-              <w:top w:type="dxa" w:w="70"/>
-              <w:left w:type="dxa" w:w="110"/>
-              <w:bottom w:type="dxa" w:w="50"/>
-              <w:right w:type="dxa" w:w="110"/>
-            </w:tcMar>
-            <w:vAlign w:val="top"/>
-          </w:tcPr>
-          <w:p>
-            <w:pPr>
-              <w:spacing w:after="40" w:line="252" w:lineRule="auto"/>
-            </w:pPr>
-            <w:r>
-              <w:rPr>
-                <w:sz w:val="19"/>
-                <w:szCs w:val="19"/>
-              </w:rPr>
-              <w:t xml:space="preserve">In progress</w:t>
+            <w:shd w:fill="E3F0E6" w:color="auto" w:val="clear"/>
+            <w:tcMar>
+              <w:top w:type="dxa" w:w="70"/>
+              <w:left w:type="dxa" w:w="110"/>
+              <w:bottom w:type="dxa" w:w="50"/>
+              <w:right w:type="dxa" w:w="110"/>
+            </w:tcMar>
+            <w:vAlign w:val="top"/>
+          </w:tcPr>
+          <w:p>
+            <w:pPr>
+              <w:spacing w:after="40" w:line="252" w:lineRule="auto"/>
+            </w:pPr>
+            <w:r>
+              <w:rPr>
+                <w:sz w:val="19"/>
+                <w:szCs w:val="19"/>
+              </w:rPr>
+              <w:t xml:space="preserve">Done</w:t>
             </w:r>
           </w:p>
         </w:tc>
@@ -4129,24 +4253,25 @@
               <w:bottom w:val="single" w:color="DCE3E1" w:sz="4"/>
               <w:right w:val="single" w:color="DCE3E1" w:sz="4"/>
             </w:tcBorders>
-            <w:tcMar>
-              <w:top w:type="dxa" w:w="70"/>
-              <w:left w:type="dxa" w:w="110"/>
-              <w:bottom w:type="dxa" w:w="50"/>
-              <w:right w:type="dxa" w:w="110"/>
-            </w:tcMar>
-            <w:vAlign w:val="top"/>
-          </w:tcPr>
-          <w:p>
-            <w:pPr>
-              <w:spacing w:after="40" w:line="252" w:lineRule="auto"/>
-            </w:pPr>
-            <w:r>
-              <w:rPr>
-                <w:sz w:val="19"/>
-                <w:szCs w:val="19"/>
-              </w:rPr>
-              <w:t xml:space="preserve">Planned</w:t>
+            <w:shd w:fill="FBEFD8" w:color="auto" w:val="clear"/>
+            <w:tcMar>
+              <w:top w:type="dxa" w:w="70"/>
+              <w:left w:type="dxa" w:w="110"/>
+              <w:bottom w:type="dxa" w:w="50"/>
+              <w:right w:type="dxa" w:w="110"/>
+            </w:tcMar>
+            <w:vAlign w:val="top"/>
+          </w:tcPr>
+          <w:p>
+            <w:pPr>
+              <w:spacing w:after="40" w:line="252" w:lineRule="auto"/>
+            </w:pPr>
+            <w:r>
+              <w:rPr>
+                <w:sz w:val="19"/>
+                <w:szCs w:val="19"/>
+              </w:rPr>
+              <w:t xml:space="preserve">In progress</w:t>
             </w:r>
           </w:p>
         </w:tc>
@@ -11944,7 +12069,7 @@
     </w:p>
     <w:p>
       <w:r>
-        <w:t xml:space="preserve">Work is delivered in short sprints, and each one ends with the owner trying the new screens and accepting them. These are the parts that are built, tested and accepted as of Sprint 03.</w:t>
+        <w:t xml:space="preserve">Work is delivered in short sprints, and each one ends with the owner trying the new screens and accepting them. These are the parts that are built, tested and accepted as of Sprint 04.</w:t>
       </w:r>
     </w:p>
     <w:p>
@@ -12761,12 +12886,286 @@
         <w:pStyle w:val="Heading2"/>
       </w:pPr>
       <w:r>
-        <w:t xml:space="preserve">9.4   In progress: Sprint 04 — Rate plans and packages</w:t>
+        <w:t xml:space="preserve">9.4   Sprint 04 — Rate plans and packages</w:t>
       </w:r>
     </w:p>
     <w:p>
       <w:r>
         <w:t xml:space="preserve">Managers set room and bed prices by date, weekend rates and packages (for example room + breakfast), and get an instant price quote for any stay.</w:t>
+      </w:r>
+    </w:p>
+    <w:p>
+      <w:pPr>
+        <w:pStyle w:val="ListParagraph"/>
+        <w:numPr>
+          <w:ilvl w:val="0"/>
+          <w:numId w:val="2"/>
+        </w:numPr>
+        <w:spacing w:after="60"/>
+      </w:pPr>
+      <w:r>
+        <w:t xml:space="preserve">Prices for every room type and every night, set by date range in a few clicks, with weekend rates</w:t>
+      </w:r>
+    </w:p>
+    <w:p>
+      <w:pPr>
+        <w:pStyle w:val="ListParagraph"/>
+        <w:numPr>
+          <w:ilvl w:val="0"/>
+          <w:numId w:val="2"/>
+        </w:numPr>
+        <w:spacing w:after="60"/>
+      </w:pPr>
+      <w:r>
+        <w:t xml:space="preserve">Rate plans such as Best available rate, room only or with meals; one is the default</w:t>
+      </w:r>
+    </w:p>
+    <w:p>
+      <w:pPr>
+        <w:pStyle w:val="ListParagraph"/>
+        <w:numPr>
+          <w:ilvl w:val="0"/>
+          <w:numId w:val="2"/>
+        </w:numPr>
+        <w:spacing w:after="60"/>
+      </w:pPr>
+      <w:r>
+        <w:t xml:space="preserve">Dormitories priced per bed; extra adults and children priced above the room's standard occupancy</w:t>
+      </w:r>
+    </w:p>
+    <w:p>
+      <w:pPr>
+        <w:pStyle w:val="ListParagraph"/>
+        <w:numPr>
+          <w:ilvl w:val="0"/>
+          <w:numId w:val="2"/>
+        </w:numPr>
+        <w:spacing w:after="60"/>
+      </w:pPr>
+      <w:r>
+        <w:t xml:space="preserve">An instant quote for any room or room type, night by night, matching the price grid</w:t>
+      </w:r>
+    </w:p>
+    <w:p>
+      <w:pPr>
+        <w:pStyle w:val="ListParagraph"/>
+        <w:numPr>
+          <w:ilvl w:val="0"/>
+          <w:numId w:val="2"/>
+        </w:numPr>
+        <w:spacing w:after="60"/>
+      </w:pPr>
+      <w:r>
+        <w:t xml:space="preserve">Packages such as a Couple getaway at one price, split into room, food, transport and activity to the paisa, ready for accounting</w:t>
+      </w:r>
+    </w:p>
+    <w:p>
+      <w:pPr>
+        <w:pStyle w:val="ListParagraph"/>
+        <w:numPr>
+          <w:ilvl w:val="0"/>
+          <w:numId w:val="2"/>
+        </w:numPr>
+        <w:spacing w:after="60"/>
+      </w:pPr>
+      <w:r>
+        <w:t xml:space="preserve">Every price change recorded with the old and new price, and every error explains exactly what to fix</w:t>
+      </w:r>
+    </w:p>
+    <w:p>
+      <w:pPr>
+        <w:keepNext/>
+        <w:pBdr>
+          <w:top w:val="single" w:color="DCE3E1" w:sz="4"/>
+          <w:bottom w:val="single" w:color="DCE3E1" w:sz="4"/>
+          <w:left w:val="single" w:color="DCE3E1" w:sz="4"/>
+          <w:right w:val="single" w:color="DCE3E1" w:sz="4"/>
+        </w:pBdr>
+        <w:spacing w:before="120" w:after="0" w:line="240" w:lineRule="auto"/>
+        <w:jc w:val="center"/>
+      </w:pPr>
+      <w:r>
+        <w:drawing>
+          <wp:inline distT="0" distB="0" distL="0" distR="0">
+            <wp:extent cx="5124450" cy="3438525"/>
+            <wp:effectExtent t="0" r="0" b="0" l="0"/>
+            <wp:docPr id="1" name="The rate grid: room types × nights, weekends shaded" descr="The rate grid: room types × nights, weekends shaded" title="The rate grid: room types × nights, weekends shaded"/>
+            <wp:cNvGraphicFramePr>
+              <a:graphicFrameLocks xmlns:a="http://schemas.openxmlformats.org/drawingml/2006/main" noChangeAspect="1"/>
+            </wp:cNvGraphicFramePr>
+            <a:graphic xmlns:a="http://schemas.openxmlformats.org/drawingml/2006/main">
+              <a:graphicData uri="http://schemas.openxmlformats.org/drawingml/2006/picture">
+                <pic:pic xmlns:pic="http://schemas.openxmlformats.org/drawingml/2006/picture">
+                  <pic:nvPicPr>
+                    <pic:cNvPr id="0" name="" descr=""/>
+                    <pic:cNvPicPr>
+                      <a:picLocks noChangeAspect="1" noChangeArrowheads="1"/>
+                    </pic:cNvPicPr>
+                  </pic:nvPicPr>
+                  <pic:blipFill>
+                    <a:blip r:embed="rId20" cstate="none"/>
+                    <a:srcRect/>
+                    <a:stretch>
+                      <a:fillRect/>
+                    </a:stretch>
+                  </pic:blipFill>
+                  <pic:spPr bwMode="auto">
+                    <a:xfrm>
+                      <a:off x="0" y="0"/>
+                      <a:ext cx="5124450" cy="3438525"/>
+                    </a:xfrm>
+                    <a:prstGeom prst="rect">
+                      <a:avLst/>
+                    </a:prstGeom>
+                  </pic:spPr>
+                </pic:pic>
+              </a:graphicData>
+            </a:graphic>
+          </wp:inline>
+        </w:drawing>
+      </w:r>
+    </w:p>
+    <w:p>
+      <w:pPr>
+        <w:pStyle w:val="Caption"/>
+      </w:pPr>
+      <w:r>
+        <w:t xml:space="preserve">The rate grid: room types × nights, weekends shaded</w:t>
+      </w:r>
+    </w:p>
+    <w:p>
+      <w:pPr>
+        <w:keepNext/>
+        <w:pBdr>
+          <w:top w:val="single" w:color="DCE3E1" w:sz="4"/>
+          <w:bottom w:val="single" w:color="DCE3E1" w:sz="4"/>
+          <w:left w:val="single" w:color="DCE3E1" w:sz="4"/>
+          <w:right w:val="single" w:color="DCE3E1" w:sz="4"/>
+        </w:pBdr>
+        <w:spacing w:before="120" w:after="0" w:line="240" w:lineRule="auto"/>
+        <w:jc w:val="center"/>
+      </w:pPr>
+      <w:r>
+        <w:drawing>
+          <wp:inline distT="0" distB="0" distL="0" distR="0">
+            <wp:extent cx="5124450" cy="3438525"/>
+            <wp:effectExtent t="0" r="0" b="0" l="0"/>
+            <wp:docPr id="1" name="Setting weekend prices for a date range" descr="Setting weekend prices for a date range" title="Setting weekend prices for a date range"/>
+            <wp:cNvGraphicFramePr>
+              <a:graphicFrameLocks xmlns:a="http://schemas.openxmlformats.org/drawingml/2006/main" noChangeAspect="1"/>
+            </wp:cNvGraphicFramePr>
+            <a:graphic xmlns:a="http://schemas.openxmlformats.org/drawingml/2006/main">
+              <a:graphicData uri="http://schemas.openxmlformats.org/drawingml/2006/picture">
+                <pic:pic xmlns:pic="http://schemas.openxmlformats.org/drawingml/2006/picture">
+                  <pic:nvPicPr>
+                    <pic:cNvPr id="0" name="" descr=""/>
+                    <pic:cNvPicPr>
+                      <a:picLocks noChangeAspect="1" noChangeArrowheads="1"/>
+                    </pic:cNvPicPr>
+                  </pic:nvPicPr>
+                  <pic:blipFill>
+                    <a:blip r:embed="rId21" cstate="none"/>
+                    <a:srcRect/>
+                    <a:stretch>
+                      <a:fillRect/>
+                    </a:stretch>
+                  </pic:blipFill>
+                  <pic:spPr bwMode="auto">
+                    <a:xfrm>
+                      <a:off x="0" y="0"/>
+                      <a:ext cx="5124450" cy="3438525"/>
+                    </a:xfrm>
+                    <a:prstGeom prst="rect">
+                      <a:avLst/>
+                    </a:prstGeom>
+                  </pic:spPr>
+                </pic:pic>
+              </a:graphicData>
+            </a:graphic>
+          </wp:inline>
+        </w:drawing>
+      </w:r>
+    </w:p>
+    <w:p>
+      <w:pPr>
+        <w:pStyle w:val="Caption"/>
+      </w:pPr>
+      <w:r>
+        <w:t xml:space="preserve">Setting weekend prices for a date range</w:t>
+      </w:r>
+    </w:p>
+    <w:p>
+      <w:pPr>
+        <w:keepNext/>
+        <w:pBdr>
+          <w:top w:val="single" w:color="DCE3E1" w:sz="4"/>
+          <w:bottom w:val="single" w:color="DCE3E1" w:sz="4"/>
+          <w:left w:val="single" w:color="DCE3E1" w:sz="4"/>
+          <w:right w:val="single" w:color="DCE3E1" w:sz="4"/>
+        </w:pBdr>
+        <w:spacing w:before="120" w:after="0" w:line="240" w:lineRule="auto"/>
+        <w:jc w:val="center"/>
+      </w:pPr>
+      <w:r>
+        <w:drawing>
+          <wp:inline distT="0" distB="0" distL="0" distR="0">
+            <wp:extent cx="5124450" cy="3438525"/>
+            <wp:effectExtent t="0" r="0" b="0" l="0"/>
+            <wp:docPr id="1" name="A quote for Room 103, night by night, matching the grid" descr="A quote for Room 103, night by night, matching the grid" title="A quote for Room 103, night by night, matching the grid"/>
+            <wp:cNvGraphicFramePr>
+              <a:graphicFrameLocks xmlns:a="http://schemas.openxmlformats.org/drawingml/2006/main" noChangeAspect="1"/>
+            </wp:cNvGraphicFramePr>
+            <a:graphic xmlns:a="http://schemas.openxmlformats.org/drawingml/2006/main">
+              <a:graphicData uri="http://schemas.openxmlformats.org/drawingml/2006/picture">
+                <pic:pic xmlns:pic="http://schemas.openxmlformats.org/drawingml/2006/picture">
+                  <pic:nvPicPr>
+                    <pic:cNvPr id="0" name="" descr=""/>
+                    <pic:cNvPicPr>
+                      <a:picLocks noChangeAspect="1" noChangeArrowheads="1"/>
+                    </pic:cNvPicPr>
+                  </pic:nvPicPr>
+                  <pic:blipFill>
+                    <a:blip r:embed="rId22" cstate="none"/>
+                    <a:srcRect/>
+                    <a:stretch>
+                      <a:fillRect/>
+                    </a:stretch>
+                  </pic:blipFill>
+                  <pic:spPr bwMode="auto">
+                    <a:xfrm>
+                      <a:off x="0" y="0"/>
+                      <a:ext cx="5124450" cy="3438525"/>
+                    </a:xfrm>
+                    <a:prstGeom prst="rect">
+                      <a:avLst/>
+                    </a:prstGeom>
+                  </pic:spPr>
+                </pic:pic>
+              </a:graphicData>
+            </a:graphic>
+          </wp:inline>
+        </w:drawing>
+      </w:r>
+    </w:p>
+    <w:p>
+      <w:pPr>
+        <w:pStyle w:val="Caption"/>
+      </w:pPr>
+      <w:r>
+        <w:t xml:space="preserve">A quote for Room 103, night by night, matching the grid</w:t>
+      </w:r>
+    </w:p>
+    <w:p>
+      <w:pPr>
+        <w:pStyle w:val="Heading2"/>
+      </w:pPr>
+      <w:r>
+        <w:t xml:space="preserve">9.5   In progress: Sprint 05 — Availability engine and reservations core</w:t>
+      </w:r>
+    </w:p>
+    <w:p>
+      <w:r>
+        <w:t xml:space="preserve">Bookings for rooms and dorm beds are taken without double-booking, even when two people book the last room at the same moment.</w:t>
       </w:r>
     </w:p>
     <w:p>
@@ -12779,7 +13178,7 @@
           <w:sz w:val="18"/>
           <w:szCs w:val="18"/>
         </w:rPr>
-        <w:t xml:space="preserve">It will be accepted when: A quote for Room 103, 2 adults, 3 nights returns a nightly breakdown matching the rate grid.</w:t>
+        <w:t xml:space="preserve">It will be accepted when: Brief §16 scenario passes reliably in CI.</w:t>
       </w:r>
     </w:p>
     <w:p>
@@ -15112,7 +15511,7 @@
               <w:bottom w:val="single" w:color="DCE3E1" w:sz="4"/>
               <w:right w:val="single" w:color="DCE3E1" w:sz="4"/>
             </w:tcBorders>
-            <w:shd w:fill="FBEFD8" w:color="auto" w:val="clear"/>
+            <w:shd w:fill="E3F0E6" w:color="auto" w:val="clear"/>
             <w:tcMar>
               <w:top w:type="dxa" w:w="70"/>
               <w:left w:type="dxa" w:w="110"/>
@@ -15130,7 +15529,7 @@
                 <w:sz w:val="17"/>
                 <w:szCs w:val="17"/>
               </w:rPr>
-              <w:t xml:space="preserve">In progress</w:t>
+              <w:t xml:space="preserve">Done</w:t>
             </w:r>
           </w:p>
         </w:tc>
@@ -15238,6 +15637,7 @@
               <w:bottom w:val="single" w:color="DCE3E1" w:sz="4"/>
               <w:right w:val="single" w:color="DCE3E1" w:sz="4"/>
             </w:tcBorders>
+            <w:shd w:fill="FBEFD8" w:color="auto" w:val="clear"/>
             <w:tcMar>
               <w:top w:type="dxa" w:w="70"/>
               <w:left w:type="dxa" w:w="110"/>
@@ -15255,7 +15655,7 @@
                 <w:sz w:val="17"/>
                 <w:szCs w:val="17"/>
               </w:rPr>
-              <w:t xml:space="preserve">Planned</w:t>
+              <w:t xml:space="preserve">In progress</w:t>
             </w:r>
           </w:p>
         </w:tc>
@@ -18308,7 +18708,7 @@
                     </pic:cNvPicPr>
                   </pic:nvPicPr>
                   <pic:blipFill>
-                    <a:blip r:embed="rId20" cstate="none"/>
+                    <a:blip r:embed="rId23" cstate="none"/>
                     <a:srcRect/>
                     <a:stretch>
                       <a:fillRect/>
@@ -18415,7 +18815,7 @@
         <w:t xml:space="preserve">Tests that grow with the system.</w:t>
       </w:r>
       <w:r>
-        <w:t xml:space="preserve"> As of Sprint 03: 77 server test methods, 23 screen tests and 39 end-to-end browser steps, all passing.</w:t>
+        <w:t xml:space="preserve"> As of Sprint 04: 101 server test methods, 31 screen tests and 45 end-to-end browser steps, all passing.</w:t>
       </w:r>
     </w:p>
     <w:p>
@@ -20302,7 +20702,7 @@
         <w:sz w:val="16"/>
         <w:szCs w:val="16"/>
       </w:rPr>
-      <w:t xml:space="preserve">Version 1.3 · 11 October 2026</w:t>
+      <w:t xml:space="preserve">Version 1.4 · 14 October 2026</w:t>
     </w:r>
     <w:r>
       <w:rPr>

</xml_diff>

<commit_message>
chore(sprints): accept Sprint 04 (#111)
Sprint 04 (Rate plans and packages) accepted by the owner on 14 Oct 2026. sprints.yml: Sprint 04 done with its handbook block, Sprint 05 in progress; guides regenerated; changelog dated; handbooks 1.4 rebuilt with a rate tables diagram.

Co-Authored-By: Claude Opus 5.5 (1M context) <noreply@anthropic.com>
Claude-Session: https://claude.ai/code/session_01C6KXuXDZ49bn17rX2sgdX3
</commit_message>
<xml_diff>
--- a/docs/handbooks/Resort-OS-Product-Overview.docx
+++ b/docs/handbooks/Resort-OS-Product-Overview.docx
@@ -182,7 +182,7 @@
                 <w:sz w:val="19"/>
                 <w:szCs w:val="19"/>
               </w:rPr>
-              <w:t xml:space="preserve">Version 1.3</w:t>
+              <w:t xml:space="preserve">Version 1.4</w:t>
             </w:r>
           </w:p>
         </w:tc>
@@ -252,7 +252,7 @@
                 <w:sz w:val="19"/>
                 <w:szCs w:val="19"/>
               </w:rPr>
-              <w:t xml:space="preserve">11 October 2026</w:t>
+              <w:t xml:space="preserve">14 October 2026</w:t>
             </w:r>
           </w:p>
         </w:tc>
@@ -322,7 +322,7 @@
                 <w:sz w:val="19"/>
                 <w:szCs w:val="19"/>
               </w:rPr>
-              <w:t xml:space="preserve">Sprints 01, 02, 03 accepted · Sprint 04 Rate plans and packages in progress</w:t>
+              <w:t xml:space="preserve">Sprints 01, 02, 03, 04 accepted · Sprint 05 Availability engine and reservations core in progress</w:t>
             </w:r>
           </w:p>
         </w:tc>
@@ -661,7 +661,7 @@
                 <w:sz w:val="19"/>
                 <w:szCs w:val="19"/>
               </w:rPr>
-              <w:t xml:space="preserve">1.3</w:t>
+              <w:t xml:space="preserve">1.4</w:t>
             </w:r>
           </w:p>
         </w:tc>
@@ -691,7 +691,7 @@
                 <w:sz w:val="19"/>
                 <w:szCs w:val="19"/>
               </w:rPr>
-              <w:t xml:space="preserve">2026-10-11</w:t>
+              <w:t xml:space="preserve">2026-10-14</w:t>
             </w:r>
           </w:p>
         </w:tc>
@@ -721,7 +721,7 @@
                 <w:sz w:val="19"/>
                 <w:szCs w:val="19"/>
               </w:rPr>
-              <w:t xml:space="preserve">Sprint 03 (Guests) accepted, with review fixes: Aadhaar number check and error messages that say why. Sprint 04 (Rate plans and packages) started.</w:t>
+              <w:t xml:space="preserve">Sprint 04 (Rate plans and packages) accepted: nightly price grid, quotes, packages with revenue split. Sprint 05 (Availability engine and reservations) started.</w:t>
             </w:r>
           </w:p>
         </w:tc>
@@ -757,7 +757,7 @@
                 <w:sz w:val="19"/>
                 <w:szCs w:val="19"/>
               </w:rPr>
-              <w:t xml:space="preserve">1.2.1</w:t>
+              <w:t xml:space="preserve">1.3</w:t>
             </w:r>
           </w:p>
         </w:tc>
@@ -788,7 +788,7 @@
                 <w:sz w:val="19"/>
                 <w:szCs w:val="19"/>
               </w:rPr>
-              <w:t xml:space="preserve">2026-10-10</w:t>
+              <w:t xml:space="preserve">2026-10-11</w:t>
             </w:r>
           </w:p>
         </w:tc>
@@ -819,7 +819,7 @@
                 <w:sz w:val="19"/>
                 <w:szCs w:val="19"/>
               </w:rPr>
-              <w:t xml:space="preserve">Sprint 03 (Guests) built and in review: guest profiles, encrypted ID documents, duplicates, merge, anonymise, consent.</w:t>
+              <w:t xml:space="preserve">Sprint 03 (Guests) accepted, with review fixes: Aadhaar number check and error messages that say why. Sprint 04 (Rate plans and packages) started.</w:t>
             </w:r>
           </w:p>
         </w:tc>
@@ -854,6 +854,102 @@
                 <w:sz w:val="19"/>
                 <w:szCs w:val="19"/>
               </w:rPr>
+              <w:t xml:space="preserve">1.2.1</w:t>
+            </w:r>
+          </w:p>
+        </w:tc>
+        <w:tc>
+          <w:tcPr>
+            <w:tcW w:type="dxa" w:w="1500"/>
+            <w:tcBorders>
+              <w:top w:val="single" w:color="DCE3E1" w:sz="4"/>
+              <w:left w:val="single" w:color="DCE3E1" w:sz="4"/>
+              <w:bottom w:val="single" w:color="DCE3E1" w:sz="4"/>
+              <w:right w:val="single" w:color="DCE3E1" w:sz="4"/>
+            </w:tcBorders>
+            <w:tcMar>
+              <w:top w:type="dxa" w:w="70"/>
+              <w:left w:type="dxa" w:w="110"/>
+              <w:bottom w:type="dxa" w:w="50"/>
+              <w:right w:type="dxa" w:w="110"/>
+            </w:tcMar>
+            <w:vAlign w:val="top"/>
+          </w:tcPr>
+          <w:p>
+            <w:pPr>
+              <w:spacing w:after="40" w:line="252" w:lineRule="auto"/>
+            </w:pPr>
+            <w:r>
+              <w:rPr>
+                <w:sz w:val="19"/>
+                <w:szCs w:val="19"/>
+              </w:rPr>
+              <w:t xml:space="preserve">2026-10-10</w:t>
+            </w:r>
+          </w:p>
+        </w:tc>
+        <w:tc>
+          <w:tcPr>
+            <w:tcW w:type="dxa" w:w="6714"/>
+            <w:tcBorders>
+              <w:top w:val="single" w:color="DCE3E1" w:sz="4"/>
+              <w:left w:val="single" w:color="DCE3E1" w:sz="4"/>
+              <w:bottom w:val="single" w:color="DCE3E1" w:sz="4"/>
+              <w:right w:val="single" w:color="DCE3E1" w:sz="4"/>
+            </w:tcBorders>
+            <w:tcMar>
+              <w:top w:type="dxa" w:w="70"/>
+              <w:left w:type="dxa" w:w="110"/>
+              <w:bottom w:type="dxa" w:w="50"/>
+              <w:right w:type="dxa" w:w="110"/>
+            </w:tcMar>
+            <w:vAlign w:val="top"/>
+          </w:tcPr>
+          <w:p>
+            <w:pPr>
+              <w:spacing w:after="40" w:line="252" w:lineRule="auto"/>
+            </w:pPr>
+            <w:r>
+              <w:rPr>
+                <w:sz w:val="19"/>
+                <w:szCs w:val="19"/>
+              </w:rPr>
+              <w:t xml:space="preserve">Sprint 03 (Guests) built and in review: guest profiles, encrypted ID documents, duplicates, merge, anonymise, consent.</w:t>
+            </w:r>
+          </w:p>
+        </w:tc>
+      </w:tr>
+      <w:tr>
+        <w:trPr>
+          <w:cantSplit/>
+        </w:trPr>
+        <w:tc>
+          <w:tcPr>
+            <w:tcW w:type="dxa" w:w="1100"/>
+            <w:tcBorders>
+              <w:top w:val="single" w:color="DCE3E1" w:sz="4"/>
+              <w:left w:val="single" w:color="DCE3E1" w:sz="4"/>
+              <w:bottom w:val="single" w:color="DCE3E1" w:sz="4"/>
+              <w:right w:val="single" w:color="DCE3E1" w:sz="4"/>
+            </w:tcBorders>
+            <w:shd w:fill="F5F7F6" w:color="auto" w:val="clear"/>
+            <w:tcMar>
+              <w:top w:type="dxa" w:w="70"/>
+              <w:left w:type="dxa" w:w="110"/>
+              <w:bottom w:type="dxa" w:w="50"/>
+              <w:right w:type="dxa" w:w="110"/>
+            </w:tcMar>
+            <w:vAlign w:val="top"/>
+          </w:tcPr>
+          <w:p>
+            <w:pPr>
+              <w:spacing w:after="40" w:line="252" w:lineRule="auto"/>
+            </w:pPr>
+            <w:r>
+              <w:rPr>
+                <w:sz w:val="19"/>
+                <w:szCs w:val="19"/>
+              </w:rPr>
               <w:t xml:space="preserve">1.2</w:t>
             </w:r>
           </w:p>
@@ -867,6 +963,7 @@
               <w:bottom w:val="single" w:color="DCE3E1" w:sz="4"/>
               <w:right w:val="single" w:color="DCE3E1" w:sz="4"/>
             </w:tcBorders>
+            <w:shd w:fill="F5F7F6" w:color="auto" w:val="clear"/>
             <w:tcMar>
               <w:top w:type="dxa" w:w="70"/>
               <w:left w:type="dxa" w:w="110"/>
@@ -897,6 +994,7 @@
               <w:bottom w:val="single" w:color="DCE3E1" w:sz="4"/>
               <w:right w:val="single" w:color="DCE3E1" w:sz="4"/>
             </w:tcBorders>
+            <w:shd w:fill="F5F7F6" w:color="auto" w:val="clear"/>
             <w:tcMar>
               <w:top w:type="dxa" w:w="70"/>
               <w:left w:type="dxa" w:w="110"/>
@@ -1147,7 +1245,7 @@
                 <w:sz w:val="19"/>
                 <w:szCs w:val="19"/>
               </w:rPr>
-              <w:t xml:space="preserve">Living document, rebuilt at the end of every sprint. This edition reflects Sprint 03 accepted and Sprint 04 in progress.</w:t>
+              <w:t xml:space="preserve">Living document, rebuilt at the end of every sprint. This edition reflects Sprint 04 accepted and Sprint 05 in progress.</w:t>
             </w:r>
           </w:p>
         </w:tc>
@@ -1897,7 +1995,33 @@
           <w:sz w:val="19"/>
           <w:szCs w:val="19"/>
         </w:rPr>
-        <w:t xml:space="preserve">In progress: Sprint 04 — Rate plans and packages</w:t>
+        <w:t xml:space="preserve">Sprint 04 — Rate plans and packages</w:t>
+      </w:r>
+    </w:p>
+    <w:p>
+      <w:pPr>
+        <w:spacing w:after="30" w:before="0"/>
+        <w:ind w:left="420"/>
+      </w:pPr>
+      <w:r>
+        <w:rPr>
+          <w:b w:val="false"/>
+          <w:bCs w:val="false"/>
+          <w:color w:val="8A2449"/>
+          <w:sz w:val="19"/>
+          <w:szCs w:val="19"/>
+        </w:rPr>
+        <w:t xml:space="preserve">9.5  </w:t>
+      </w:r>
+      <w:r>
+        <w:rPr>
+          <w:b w:val="false"/>
+          <w:bCs w:val="false"/>
+          <w:color w:val="1B2A2E"/>
+          <w:sz w:val="19"/>
+          <w:szCs w:val="19"/>
+        </w:rPr>
+        <w:t xml:space="preserve">In progress: Sprint 05 — Availability engine and reservations core</w:t>
       </w:r>
     </w:p>
     <w:p>
@@ -2220,7 +2344,7 @@
                 <w:sz w:val="40"/>
                 <w:szCs w:val="40"/>
               </w:rPr>
-              <w:t xml:space="preserve">3 of 29</w:t>
+              <w:t xml:space="preserve">4 of 29</w:t>
             </w:r>
           </w:p>
           <w:p>
@@ -2585,7 +2709,7 @@
                 <w:sz w:val="19"/>
                 <w:szCs w:val="19"/>
               </w:rPr>
-              <w:t xml:space="preserve">Sprints 01 and 02 and 03 are delivered and accepted. Sprint 04 (Rate plans and packages) is in progress.</w:t>
+              <w:t xml:space="preserve">Sprints 01 and 02 and 03 and 04 are delivered and accepted. Sprint 05 (Availability engine and reservations core) is in progress.</w:t>
             </w:r>
           </w:p>
         </w:tc>
@@ -4033,25 +4157,25 @@
               <w:bottom w:val="single" w:color="DCE3E1" w:sz="4"/>
               <w:right w:val="single" w:color="DCE3E1" w:sz="4"/>
             </w:tcBorders>
-            <w:shd w:fill="FBEFD8" w:color="auto" w:val="clear"/>
-            <w:tcMar>
-              <w:top w:type="dxa" w:w="70"/>
-              <w:left w:type="dxa" w:w="110"/>
-              <w:bottom w:type="dxa" w:w="50"/>
-              <w:right w:type="dxa" w:w="110"/>
-            </w:tcMar>
-            <w:vAlign w:val="top"/>
-          </w:tcPr>
-          <w:p>
-            <w:pPr>
-              <w:spacing w:after="40" w:line="252" w:lineRule="auto"/>
-            </w:pPr>
-            <w:r>
-              <w:rPr>
-                <w:sz w:val="19"/>
-                <w:szCs w:val="19"/>
-              </w:rPr>
-              <w:t xml:space="preserve">In progress</w:t>
+            <w:shd w:fill="E3F0E6" w:color="auto" w:val="clear"/>
+            <w:tcMar>
+              <w:top w:type="dxa" w:w="70"/>
+              <w:left w:type="dxa" w:w="110"/>
+              <w:bottom w:type="dxa" w:w="50"/>
+              <w:right w:type="dxa" w:w="110"/>
+            </w:tcMar>
+            <w:vAlign w:val="top"/>
+          </w:tcPr>
+          <w:p>
+            <w:pPr>
+              <w:spacing w:after="40" w:line="252" w:lineRule="auto"/>
+            </w:pPr>
+            <w:r>
+              <w:rPr>
+                <w:sz w:val="19"/>
+                <w:szCs w:val="19"/>
+              </w:rPr>
+              <w:t xml:space="preserve">Done</w:t>
             </w:r>
           </w:p>
         </w:tc>
@@ -4129,24 +4253,25 @@
               <w:bottom w:val="single" w:color="DCE3E1" w:sz="4"/>
               <w:right w:val="single" w:color="DCE3E1" w:sz="4"/>
             </w:tcBorders>
-            <w:tcMar>
-              <w:top w:type="dxa" w:w="70"/>
-              <w:left w:type="dxa" w:w="110"/>
-              <w:bottom w:type="dxa" w:w="50"/>
-              <w:right w:type="dxa" w:w="110"/>
-            </w:tcMar>
-            <w:vAlign w:val="top"/>
-          </w:tcPr>
-          <w:p>
-            <w:pPr>
-              <w:spacing w:after="40" w:line="252" w:lineRule="auto"/>
-            </w:pPr>
-            <w:r>
-              <w:rPr>
-                <w:sz w:val="19"/>
-                <w:szCs w:val="19"/>
-              </w:rPr>
-              <w:t xml:space="preserve">Planned</w:t>
+            <w:shd w:fill="FBEFD8" w:color="auto" w:val="clear"/>
+            <w:tcMar>
+              <w:top w:type="dxa" w:w="70"/>
+              <w:left w:type="dxa" w:w="110"/>
+              <w:bottom w:type="dxa" w:w="50"/>
+              <w:right w:type="dxa" w:w="110"/>
+            </w:tcMar>
+            <w:vAlign w:val="top"/>
+          </w:tcPr>
+          <w:p>
+            <w:pPr>
+              <w:spacing w:after="40" w:line="252" w:lineRule="auto"/>
+            </w:pPr>
+            <w:r>
+              <w:rPr>
+                <w:sz w:val="19"/>
+                <w:szCs w:val="19"/>
+              </w:rPr>
+              <w:t xml:space="preserve">In progress</w:t>
             </w:r>
           </w:p>
         </w:tc>
@@ -11944,7 +12069,7 @@
     </w:p>
     <w:p>
       <w:r>
-        <w:t xml:space="preserve">Work is delivered in short sprints, and each one ends with the owner trying the new screens and accepting them. These are the parts that are built, tested and accepted as of Sprint 03.</w:t>
+        <w:t xml:space="preserve">Work is delivered in short sprints, and each one ends with the owner trying the new screens and accepting them. These are the parts that are built, tested and accepted as of Sprint 04.</w:t>
       </w:r>
     </w:p>
     <w:p>
@@ -12761,12 +12886,286 @@
         <w:pStyle w:val="Heading2"/>
       </w:pPr>
       <w:r>
-        <w:t xml:space="preserve">9.4   In progress: Sprint 04 — Rate plans and packages</w:t>
+        <w:t xml:space="preserve">9.4   Sprint 04 — Rate plans and packages</w:t>
       </w:r>
     </w:p>
     <w:p>
       <w:r>
         <w:t xml:space="preserve">Managers set room and bed prices by date, weekend rates and packages (for example room + breakfast), and get an instant price quote for any stay.</w:t>
+      </w:r>
+    </w:p>
+    <w:p>
+      <w:pPr>
+        <w:pStyle w:val="ListParagraph"/>
+        <w:numPr>
+          <w:ilvl w:val="0"/>
+          <w:numId w:val="2"/>
+        </w:numPr>
+        <w:spacing w:after="60"/>
+      </w:pPr>
+      <w:r>
+        <w:t xml:space="preserve">Prices for every room type and every night, set by date range in a few clicks, with weekend rates</w:t>
+      </w:r>
+    </w:p>
+    <w:p>
+      <w:pPr>
+        <w:pStyle w:val="ListParagraph"/>
+        <w:numPr>
+          <w:ilvl w:val="0"/>
+          <w:numId w:val="2"/>
+        </w:numPr>
+        <w:spacing w:after="60"/>
+      </w:pPr>
+      <w:r>
+        <w:t xml:space="preserve">Rate plans such as Best available rate, room only or with meals; one is the default</w:t>
+      </w:r>
+    </w:p>
+    <w:p>
+      <w:pPr>
+        <w:pStyle w:val="ListParagraph"/>
+        <w:numPr>
+          <w:ilvl w:val="0"/>
+          <w:numId w:val="2"/>
+        </w:numPr>
+        <w:spacing w:after="60"/>
+      </w:pPr>
+      <w:r>
+        <w:t xml:space="preserve">Dormitories priced per bed; extra adults and children priced above the room's standard occupancy</w:t>
+      </w:r>
+    </w:p>
+    <w:p>
+      <w:pPr>
+        <w:pStyle w:val="ListParagraph"/>
+        <w:numPr>
+          <w:ilvl w:val="0"/>
+          <w:numId w:val="2"/>
+        </w:numPr>
+        <w:spacing w:after="60"/>
+      </w:pPr>
+      <w:r>
+        <w:t xml:space="preserve">An instant quote for any room or room type, night by night, matching the price grid</w:t>
+      </w:r>
+    </w:p>
+    <w:p>
+      <w:pPr>
+        <w:pStyle w:val="ListParagraph"/>
+        <w:numPr>
+          <w:ilvl w:val="0"/>
+          <w:numId w:val="2"/>
+        </w:numPr>
+        <w:spacing w:after="60"/>
+      </w:pPr>
+      <w:r>
+        <w:t xml:space="preserve">Packages such as a Couple getaway at one price, split into room, food, transport and activity to the paisa, ready for accounting</w:t>
+      </w:r>
+    </w:p>
+    <w:p>
+      <w:pPr>
+        <w:pStyle w:val="ListParagraph"/>
+        <w:numPr>
+          <w:ilvl w:val="0"/>
+          <w:numId w:val="2"/>
+        </w:numPr>
+        <w:spacing w:after="60"/>
+      </w:pPr>
+      <w:r>
+        <w:t xml:space="preserve">Every price change recorded with the old and new price, and every error explains exactly what to fix</w:t>
+      </w:r>
+    </w:p>
+    <w:p>
+      <w:pPr>
+        <w:keepNext/>
+        <w:pBdr>
+          <w:top w:val="single" w:color="DCE3E1" w:sz="4"/>
+          <w:bottom w:val="single" w:color="DCE3E1" w:sz="4"/>
+          <w:left w:val="single" w:color="DCE3E1" w:sz="4"/>
+          <w:right w:val="single" w:color="DCE3E1" w:sz="4"/>
+        </w:pBdr>
+        <w:spacing w:before="120" w:after="0" w:line="240" w:lineRule="auto"/>
+        <w:jc w:val="center"/>
+      </w:pPr>
+      <w:r>
+        <w:drawing>
+          <wp:inline distT="0" distB="0" distL="0" distR="0">
+            <wp:extent cx="5124450" cy="3438525"/>
+            <wp:effectExtent t="0" r="0" b="0" l="0"/>
+            <wp:docPr id="1" name="The rate grid: room types × nights, weekends shaded" descr="The rate grid: room types × nights, weekends shaded" title="The rate grid: room types × nights, weekends shaded"/>
+            <wp:cNvGraphicFramePr>
+              <a:graphicFrameLocks xmlns:a="http://schemas.openxmlformats.org/drawingml/2006/main" noChangeAspect="1"/>
+            </wp:cNvGraphicFramePr>
+            <a:graphic xmlns:a="http://schemas.openxmlformats.org/drawingml/2006/main">
+              <a:graphicData uri="http://schemas.openxmlformats.org/drawingml/2006/picture">
+                <pic:pic xmlns:pic="http://schemas.openxmlformats.org/drawingml/2006/picture">
+                  <pic:nvPicPr>
+                    <pic:cNvPr id="0" name="" descr=""/>
+                    <pic:cNvPicPr>
+                      <a:picLocks noChangeAspect="1" noChangeArrowheads="1"/>
+                    </pic:cNvPicPr>
+                  </pic:nvPicPr>
+                  <pic:blipFill>
+                    <a:blip r:embed="rId20" cstate="none"/>
+                    <a:srcRect/>
+                    <a:stretch>
+                      <a:fillRect/>
+                    </a:stretch>
+                  </pic:blipFill>
+                  <pic:spPr bwMode="auto">
+                    <a:xfrm>
+                      <a:off x="0" y="0"/>
+                      <a:ext cx="5124450" cy="3438525"/>
+                    </a:xfrm>
+                    <a:prstGeom prst="rect">
+                      <a:avLst/>
+                    </a:prstGeom>
+                  </pic:spPr>
+                </pic:pic>
+              </a:graphicData>
+            </a:graphic>
+          </wp:inline>
+        </w:drawing>
+      </w:r>
+    </w:p>
+    <w:p>
+      <w:pPr>
+        <w:pStyle w:val="Caption"/>
+      </w:pPr>
+      <w:r>
+        <w:t xml:space="preserve">The rate grid: room types × nights, weekends shaded</w:t>
+      </w:r>
+    </w:p>
+    <w:p>
+      <w:pPr>
+        <w:keepNext/>
+        <w:pBdr>
+          <w:top w:val="single" w:color="DCE3E1" w:sz="4"/>
+          <w:bottom w:val="single" w:color="DCE3E1" w:sz="4"/>
+          <w:left w:val="single" w:color="DCE3E1" w:sz="4"/>
+          <w:right w:val="single" w:color="DCE3E1" w:sz="4"/>
+        </w:pBdr>
+        <w:spacing w:before="120" w:after="0" w:line="240" w:lineRule="auto"/>
+        <w:jc w:val="center"/>
+      </w:pPr>
+      <w:r>
+        <w:drawing>
+          <wp:inline distT="0" distB="0" distL="0" distR="0">
+            <wp:extent cx="5124450" cy="3438525"/>
+            <wp:effectExtent t="0" r="0" b="0" l="0"/>
+            <wp:docPr id="1" name="Setting weekend prices for a date range" descr="Setting weekend prices for a date range" title="Setting weekend prices for a date range"/>
+            <wp:cNvGraphicFramePr>
+              <a:graphicFrameLocks xmlns:a="http://schemas.openxmlformats.org/drawingml/2006/main" noChangeAspect="1"/>
+            </wp:cNvGraphicFramePr>
+            <a:graphic xmlns:a="http://schemas.openxmlformats.org/drawingml/2006/main">
+              <a:graphicData uri="http://schemas.openxmlformats.org/drawingml/2006/picture">
+                <pic:pic xmlns:pic="http://schemas.openxmlformats.org/drawingml/2006/picture">
+                  <pic:nvPicPr>
+                    <pic:cNvPr id="0" name="" descr=""/>
+                    <pic:cNvPicPr>
+                      <a:picLocks noChangeAspect="1" noChangeArrowheads="1"/>
+                    </pic:cNvPicPr>
+                  </pic:nvPicPr>
+                  <pic:blipFill>
+                    <a:blip r:embed="rId21" cstate="none"/>
+                    <a:srcRect/>
+                    <a:stretch>
+                      <a:fillRect/>
+                    </a:stretch>
+                  </pic:blipFill>
+                  <pic:spPr bwMode="auto">
+                    <a:xfrm>
+                      <a:off x="0" y="0"/>
+                      <a:ext cx="5124450" cy="3438525"/>
+                    </a:xfrm>
+                    <a:prstGeom prst="rect">
+                      <a:avLst/>
+                    </a:prstGeom>
+                  </pic:spPr>
+                </pic:pic>
+              </a:graphicData>
+            </a:graphic>
+          </wp:inline>
+        </w:drawing>
+      </w:r>
+    </w:p>
+    <w:p>
+      <w:pPr>
+        <w:pStyle w:val="Caption"/>
+      </w:pPr>
+      <w:r>
+        <w:t xml:space="preserve">Setting weekend prices for a date range</w:t>
+      </w:r>
+    </w:p>
+    <w:p>
+      <w:pPr>
+        <w:keepNext/>
+        <w:pBdr>
+          <w:top w:val="single" w:color="DCE3E1" w:sz="4"/>
+          <w:bottom w:val="single" w:color="DCE3E1" w:sz="4"/>
+          <w:left w:val="single" w:color="DCE3E1" w:sz="4"/>
+          <w:right w:val="single" w:color="DCE3E1" w:sz="4"/>
+        </w:pBdr>
+        <w:spacing w:before="120" w:after="0" w:line="240" w:lineRule="auto"/>
+        <w:jc w:val="center"/>
+      </w:pPr>
+      <w:r>
+        <w:drawing>
+          <wp:inline distT="0" distB="0" distL="0" distR="0">
+            <wp:extent cx="5124450" cy="3438525"/>
+            <wp:effectExtent t="0" r="0" b="0" l="0"/>
+            <wp:docPr id="1" name="A quote for Room 103, night by night, matching the grid" descr="A quote for Room 103, night by night, matching the grid" title="A quote for Room 103, night by night, matching the grid"/>
+            <wp:cNvGraphicFramePr>
+              <a:graphicFrameLocks xmlns:a="http://schemas.openxmlformats.org/drawingml/2006/main" noChangeAspect="1"/>
+            </wp:cNvGraphicFramePr>
+            <a:graphic xmlns:a="http://schemas.openxmlformats.org/drawingml/2006/main">
+              <a:graphicData uri="http://schemas.openxmlformats.org/drawingml/2006/picture">
+                <pic:pic xmlns:pic="http://schemas.openxmlformats.org/drawingml/2006/picture">
+                  <pic:nvPicPr>
+                    <pic:cNvPr id="0" name="" descr=""/>
+                    <pic:cNvPicPr>
+                      <a:picLocks noChangeAspect="1" noChangeArrowheads="1"/>
+                    </pic:cNvPicPr>
+                  </pic:nvPicPr>
+                  <pic:blipFill>
+                    <a:blip r:embed="rId22" cstate="none"/>
+                    <a:srcRect/>
+                    <a:stretch>
+                      <a:fillRect/>
+                    </a:stretch>
+                  </pic:blipFill>
+                  <pic:spPr bwMode="auto">
+                    <a:xfrm>
+                      <a:off x="0" y="0"/>
+                      <a:ext cx="5124450" cy="3438525"/>
+                    </a:xfrm>
+                    <a:prstGeom prst="rect">
+                      <a:avLst/>
+                    </a:prstGeom>
+                  </pic:spPr>
+                </pic:pic>
+              </a:graphicData>
+            </a:graphic>
+          </wp:inline>
+        </w:drawing>
+      </w:r>
+    </w:p>
+    <w:p>
+      <w:pPr>
+        <w:pStyle w:val="Caption"/>
+      </w:pPr>
+      <w:r>
+        <w:t xml:space="preserve">A quote for Room 103, night by night, matching the grid</w:t>
+      </w:r>
+    </w:p>
+    <w:p>
+      <w:pPr>
+        <w:pStyle w:val="Heading2"/>
+      </w:pPr>
+      <w:r>
+        <w:t xml:space="preserve">9.5   In progress: Sprint 05 — Availability engine and reservations core</w:t>
+      </w:r>
+    </w:p>
+    <w:p>
+      <w:r>
+        <w:t xml:space="preserve">Bookings for rooms and dorm beds are taken without double-booking, even when two people book the last room at the same moment.</w:t>
       </w:r>
     </w:p>
     <w:p>
@@ -12779,7 +13178,7 @@
           <w:sz w:val="18"/>
           <w:szCs w:val="18"/>
         </w:rPr>
-        <w:t xml:space="preserve">It will be accepted when: A quote for Room 103, 2 adults, 3 nights returns a nightly breakdown matching the rate grid.</w:t>
+        <w:t xml:space="preserve">It will be accepted when: Brief §16 scenario passes reliably in CI.</w:t>
       </w:r>
     </w:p>
     <w:p>
@@ -15112,7 +15511,7 @@
               <w:bottom w:val="single" w:color="DCE3E1" w:sz="4"/>
               <w:right w:val="single" w:color="DCE3E1" w:sz="4"/>
             </w:tcBorders>
-            <w:shd w:fill="FBEFD8" w:color="auto" w:val="clear"/>
+            <w:shd w:fill="E3F0E6" w:color="auto" w:val="clear"/>
             <w:tcMar>
               <w:top w:type="dxa" w:w="70"/>
               <w:left w:type="dxa" w:w="110"/>
@@ -15130,7 +15529,7 @@
                 <w:sz w:val="17"/>
                 <w:szCs w:val="17"/>
               </w:rPr>
-              <w:t xml:space="preserve">In progress</w:t>
+              <w:t xml:space="preserve">Done</w:t>
             </w:r>
           </w:p>
         </w:tc>
@@ -15238,6 +15637,7 @@
               <w:bottom w:val="single" w:color="DCE3E1" w:sz="4"/>
               <w:right w:val="single" w:color="DCE3E1" w:sz="4"/>
             </w:tcBorders>
+            <w:shd w:fill="FBEFD8" w:color="auto" w:val="clear"/>
             <w:tcMar>
               <w:top w:type="dxa" w:w="70"/>
               <w:left w:type="dxa" w:w="110"/>
@@ -15255,7 +15655,7 @@
                 <w:sz w:val="17"/>
                 <w:szCs w:val="17"/>
               </w:rPr>
-              <w:t xml:space="preserve">Planned</w:t>
+              <w:t xml:space="preserve">In progress</w:t>
             </w:r>
           </w:p>
         </w:tc>
@@ -18308,7 +18708,7 @@
                     </pic:cNvPicPr>
                   </pic:nvPicPr>
                   <pic:blipFill>
-                    <a:blip r:embed="rId20" cstate="none"/>
+                    <a:blip r:embed="rId23" cstate="none"/>
                     <a:srcRect/>
                     <a:stretch>
                       <a:fillRect/>
@@ -18415,7 +18815,7 @@
         <w:t xml:space="preserve">Tests that grow with the system.</w:t>
       </w:r>
       <w:r>
-        <w:t xml:space="preserve"> As of Sprint 03: 77 server test methods, 23 screen tests and 39 end-to-end browser steps, all passing.</w:t>
+        <w:t xml:space="preserve"> As of Sprint 04: 101 server test methods, 31 screen tests and 45 end-to-end browser steps, all passing.</w:t>
       </w:r>
     </w:p>
     <w:p>
@@ -20302,7 +20702,7 @@
         <w:sz w:val="16"/>
         <w:szCs w:val="16"/>
       </w:rPr>
-      <w:t xml:space="preserve">Version 1.3 · 11 October 2026</w:t>
+      <w:t xml:space="preserve">Version 1.4 · 14 October 2026</w:t>
     </w:r>
     <w:r>
       <w:rPr>

</xml_diff>

<commit_message>
chore(sprints): accept Sprint 05; architecture and system design guide
Sprint 05 (Availability engine and reservations) accepted by the owner on 15 Oct 2026. sprints.yml: Sprint 05 done
with its handbook diagrams, Sprint 06 in progress; guides regenerated; changelog dated; handbooks 1.5 rebuilt with
the reservation tables and booking-flow diagrams.

New docs/architecture/system-design.md for new joiners: how the code base works sprint by sprint with diagrams, and
the system design of passwords, sign-in, permissions, tenants, audit, encryption, no double booking, idempotency,
money, time and errors. PROCESS.md: closing a sprint now updates it.

Co-Authored-By: Claude Opus 5.5 (1M context) <noreply@anthropic.com>
Claude-Session: https://claude.ai/code/session_012XMVkmZQNjkF7rDANWkAMm
</commit_message>
<xml_diff>
--- a/docs/handbooks/Resort-OS-Product-Overview.docx
+++ b/docs/handbooks/Resort-OS-Product-Overview.docx
@@ -182,7 +182,7 @@
                 <w:sz w:val="19"/>
                 <w:szCs w:val="19"/>
               </w:rPr>
-              <w:t xml:space="preserve">Version 1.4</w:t>
+              <w:t xml:space="preserve">Version 1.5</w:t>
             </w:r>
           </w:p>
         </w:tc>
@@ -252,7 +252,7 @@
                 <w:sz w:val="19"/>
                 <w:szCs w:val="19"/>
               </w:rPr>
-              <w:t xml:space="preserve">14 October 2026</w:t>
+              <w:t xml:space="preserve">15 October 2026</w:t>
             </w:r>
           </w:p>
         </w:tc>
@@ -322,7 +322,7 @@
                 <w:sz w:val="19"/>
                 <w:szCs w:val="19"/>
               </w:rPr>
-              <w:t xml:space="preserve">Sprints 01, 02, 03, 04 accepted · Sprint 05 Availability engine and reservations core in progress</w:t>
+              <w:t xml:space="preserve">Sprints 01, 02, 03, 04, 05 accepted · Sprint 06 Reservation calendar in progress</w:t>
             </w:r>
           </w:p>
         </w:tc>
@@ -661,7 +661,7 @@
                 <w:sz w:val="19"/>
                 <w:szCs w:val="19"/>
               </w:rPr>
-              <w:t xml:space="preserve">1.4</w:t>
+              <w:t xml:space="preserve">1.5</w:t>
             </w:r>
           </w:p>
         </w:tc>
@@ -691,7 +691,7 @@
                 <w:sz w:val="19"/>
                 <w:szCs w:val="19"/>
               </w:rPr>
-              <w:t xml:space="preserve">2026-10-14</w:t>
+              <w:t xml:space="preserve">2026-10-15</w:t>
             </w:r>
           </w:p>
         </w:tc>
@@ -721,7 +721,7 @@
                 <w:sz w:val="19"/>
                 <w:szCs w:val="19"/>
               </w:rPr>
-              <w:t xml:space="preserve">Sprint 04 (Rate plans and packages) accepted: nightly price grid, quotes, packages with revenue split. Sprint 05 (Availability engine and reservations) started.</w:t>
+              <w:t xml:space="preserve">Sprint 05 (Availability engine and reservations) accepted: race-free booking, booking wizard, booking history, date pickers. Diagrams of the reservation tables and the booking flow. Sprint 06 (Reservation calendar) started.</w:t>
             </w:r>
           </w:p>
         </w:tc>
@@ -757,7 +757,7 @@
                 <w:sz w:val="19"/>
                 <w:szCs w:val="19"/>
               </w:rPr>
-              <w:t xml:space="preserve">1.3</w:t>
+              <w:t xml:space="preserve">1.4</w:t>
             </w:r>
           </w:p>
         </w:tc>
@@ -788,7 +788,7 @@
                 <w:sz w:val="19"/>
                 <w:szCs w:val="19"/>
               </w:rPr>
-              <w:t xml:space="preserve">2026-10-11</w:t>
+              <w:t xml:space="preserve">2026-10-14</w:t>
             </w:r>
           </w:p>
         </w:tc>
@@ -819,7 +819,7 @@
                 <w:sz w:val="19"/>
                 <w:szCs w:val="19"/>
               </w:rPr>
-              <w:t xml:space="preserve">Sprint 03 (Guests) accepted, with review fixes: Aadhaar number check and error messages that say why. Sprint 04 (Rate plans and packages) started.</w:t>
+              <w:t xml:space="preserve">Sprint 04 (Rate plans and packages) accepted: nightly price grid, quotes, packages with revenue split. Sprint 05 (Availability engine and reservations) started.</w:t>
             </w:r>
           </w:p>
         </w:tc>
@@ -854,7 +854,7 @@
                 <w:sz w:val="19"/>
                 <w:szCs w:val="19"/>
               </w:rPr>
-              <w:t xml:space="preserve">1.2.1</w:t>
+              <w:t xml:space="preserve">1.3</w:t>
             </w:r>
           </w:p>
         </w:tc>
@@ -884,7 +884,7 @@
                 <w:sz w:val="19"/>
                 <w:szCs w:val="19"/>
               </w:rPr>
-              <w:t xml:space="preserve">2026-10-10</w:t>
+              <w:t xml:space="preserve">2026-10-11</w:t>
             </w:r>
           </w:p>
         </w:tc>
@@ -914,7 +914,7 @@
                 <w:sz w:val="19"/>
                 <w:szCs w:val="19"/>
               </w:rPr>
-              <w:t xml:space="preserve">Sprint 03 (Guests) built and in review: guest profiles, encrypted ID documents, duplicates, merge, anonymise, consent.</w:t>
+              <w:t xml:space="preserve">Sprint 03 (Guests) accepted, with review fixes: Aadhaar number check and error messages that say why. Sprint 04 (Rate plans and packages) started.</w:t>
             </w:r>
           </w:p>
         </w:tc>
@@ -950,6 +950,103 @@
                 <w:sz w:val="19"/>
                 <w:szCs w:val="19"/>
               </w:rPr>
+              <w:t xml:space="preserve">1.2.1</w:t>
+            </w:r>
+          </w:p>
+        </w:tc>
+        <w:tc>
+          <w:tcPr>
+            <w:tcW w:type="dxa" w:w="1500"/>
+            <w:tcBorders>
+              <w:top w:val="single" w:color="DCE3E1" w:sz="4"/>
+              <w:left w:val="single" w:color="DCE3E1" w:sz="4"/>
+              <w:bottom w:val="single" w:color="DCE3E1" w:sz="4"/>
+              <w:right w:val="single" w:color="DCE3E1" w:sz="4"/>
+            </w:tcBorders>
+            <w:shd w:fill="F5F7F6" w:color="auto" w:val="clear"/>
+            <w:tcMar>
+              <w:top w:type="dxa" w:w="70"/>
+              <w:left w:type="dxa" w:w="110"/>
+              <w:bottom w:type="dxa" w:w="50"/>
+              <w:right w:type="dxa" w:w="110"/>
+            </w:tcMar>
+            <w:vAlign w:val="top"/>
+          </w:tcPr>
+          <w:p>
+            <w:pPr>
+              <w:spacing w:after="40" w:line="252" w:lineRule="auto"/>
+            </w:pPr>
+            <w:r>
+              <w:rPr>
+                <w:sz w:val="19"/>
+                <w:szCs w:val="19"/>
+              </w:rPr>
+              <w:t xml:space="preserve">2026-10-10</w:t>
+            </w:r>
+          </w:p>
+        </w:tc>
+        <w:tc>
+          <w:tcPr>
+            <w:tcW w:type="dxa" w:w="6714"/>
+            <w:tcBorders>
+              <w:top w:val="single" w:color="DCE3E1" w:sz="4"/>
+              <w:left w:val="single" w:color="DCE3E1" w:sz="4"/>
+              <w:bottom w:val="single" w:color="DCE3E1" w:sz="4"/>
+              <w:right w:val="single" w:color="DCE3E1" w:sz="4"/>
+            </w:tcBorders>
+            <w:shd w:fill="F5F7F6" w:color="auto" w:val="clear"/>
+            <w:tcMar>
+              <w:top w:type="dxa" w:w="70"/>
+              <w:left w:type="dxa" w:w="110"/>
+              <w:bottom w:type="dxa" w:w="50"/>
+              <w:right w:type="dxa" w:w="110"/>
+            </w:tcMar>
+            <w:vAlign w:val="top"/>
+          </w:tcPr>
+          <w:p>
+            <w:pPr>
+              <w:spacing w:after="40" w:line="252" w:lineRule="auto"/>
+            </w:pPr>
+            <w:r>
+              <w:rPr>
+                <w:sz w:val="19"/>
+                <w:szCs w:val="19"/>
+              </w:rPr>
+              <w:t xml:space="preserve">Sprint 03 (Guests) built and in review: guest profiles, encrypted ID documents, duplicates, merge, anonymise, consent.</w:t>
+            </w:r>
+          </w:p>
+        </w:tc>
+      </w:tr>
+      <w:tr>
+        <w:trPr>
+          <w:cantSplit/>
+        </w:trPr>
+        <w:tc>
+          <w:tcPr>
+            <w:tcW w:type="dxa" w:w="1100"/>
+            <w:tcBorders>
+              <w:top w:val="single" w:color="DCE3E1" w:sz="4"/>
+              <w:left w:val="single" w:color="DCE3E1" w:sz="4"/>
+              <w:bottom w:val="single" w:color="DCE3E1" w:sz="4"/>
+              <w:right w:val="single" w:color="DCE3E1" w:sz="4"/>
+            </w:tcBorders>
+            <w:tcMar>
+              <w:top w:type="dxa" w:w="70"/>
+              <w:left w:type="dxa" w:w="110"/>
+              <w:bottom w:type="dxa" w:w="50"/>
+              <w:right w:type="dxa" w:w="110"/>
+            </w:tcMar>
+            <w:vAlign w:val="top"/>
+          </w:tcPr>
+          <w:p>
+            <w:pPr>
+              <w:spacing w:after="40" w:line="252" w:lineRule="auto"/>
+            </w:pPr>
+            <w:r>
+              <w:rPr>
+                <w:sz w:val="19"/>
+                <w:szCs w:val="19"/>
+              </w:rPr>
               <w:t xml:space="preserve">1.2</w:t>
             </w:r>
           </w:p>
@@ -963,7 +1060,6 @@
               <w:bottom w:val="single" w:color="DCE3E1" w:sz="4"/>
               <w:right w:val="single" w:color="DCE3E1" w:sz="4"/>
             </w:tcBorders>
-            <w:shd w:fill="F5F7F6" w:color="auto" w:val="clear"/>
             <w:tcMar>
               <w:top w:type="dxa" w:w="70"/>
               <w:left w:type="dxa" w:w="110"/>
@@ -994,7 +1090,6 @@
               <w:bottom w:val="single" w:color="DCE3E1" w:sz="4"/>
               <w:right w:val="single" w:color="DCE3E1" w:sz="4"/>
             </w:tcBorders>
-            <w:shd w:fill="F5F7F6" w:color="auto" w:val="clear"/>
             <w:tcMar>
               <w:top w:type="dxa" w:w="70"/>
               <w:left w:type="dxa" w:w="110"/>
@@ -1245,7 +1340,7 @@
                 <w:sz w:val="19"/>
                 <w:szCs w:val="19"/>
               </w:rPr>
-              <w:t xml:space="preserve">Living document, rebuilt at the end of every sprint. This edition reflects Sprint 04 accepted and Sprint 05 in progress.</w:t>
+              <w:t xml:space="preserve">Living document, rebuilt at the end of every sprint. This edition reflects Sprint 05 accepted and Sprint 06 in progress.</w:t>
             </w:r>
           </w:p>
         </w:tc>
@@ -2021,7 +2116,33 @@
           <w:sz w:val="19"/>
           <w:szCs w:val="19"/>
         </w:rPr>
-        <w:t xml:space="preserve">In progress: Sprint 05 — Availability engine and reservations core</w:t>
+        <w:t xml:space="preserve">Sprint 05 — Availability engine and reservations core</w:t>
+      </w:r>
+    </w:p>
+    <w:p>
+      <w:pPr>
+        <w:spacing w:after="30" w:before="0"/>
+        <w:ind w:left="420"/>
+      </w:pPr>
+      <w:r>
+        <w:rPr>
+          <w:b w:val="false"/>
+          <w:bCs w:val="false"/>
+          <w:color w:val="8A2449"/>
+          <w:sz w:val="19"/>
+          <w:szCs w:val="19"/>
+        </w:rPr>
+        <w:t xml:space="preserve">9.6  </w:t>
+      </w:r>
+      <w:r>
+        <w:rPr>
+          <w:b w:val="false"/>
+          <w:bCs w:val="false"/>
+          <w:color w:val="1B2A2E"/>
+          <w:sz w:val="19"/>
+          <w:szCs w:val="19"/>
+        </w:rPr>
+        <w:t xml:space="preserve">In progress: Sprint 06 — Reservation calendar</w:t>
       </w:r>
     </w:p>
     <w:p>
@@ -2344,7 +2465,7 @@
                 <w:sz w:val="40"/>
                 <w:szCs w:val="40"/>
               </w:rPr>
-              <w:t xml:space="preserve">4 of 29</w:t>
+              <w:t xml:space="preserve">5 of 29</w:t>
             </w:r>
           </w:p>
           <w:p>
@@ -2709,7 +2830,7 @@
                 <w:sz w:val="19"/>
                 <w:szCs w:val="19"/>
               </w:rPr>
-              <w:t xml:space="preserve">Sprints 01 and 02 and 03 and 04 are delivered and accepted. Sprint 05 (Availability engine and reservations core) is in progress.</w:t>
+              <w:t xml:space="preserve">Sprints 01 and 02 and 03 and 04 and 05 are delivered and accepted. Sprint 06 (Reservation calendar) is in progress.</w:t>
             </w:r>
           </w:p>
         </w:tc>
@@ -4253,25 +4374,25 @@
               <w:bottom w:val="single" w:color="DCE3E1" w:sz="4"/>
               <w:right w:val="single" w:color="DCE3E1" w:sz="4"/>
             </w:tcBorders>
-            <w:shd w:fill="FBEFD8" w:color="auto" w:val="clear"/>
-            <w:tcMar>
-              <w:top w:type="dxa" w:w="70"/>
-              <w:left w:type="dxa" w:w="110"/>
-              <w:bottom w:type="dxa" w:w="50"/>
-              <w:right w:type="dxa" w:w="110"/>
-            </w:tcMar>
-            <w:vAlign w:val="top"/>
-          </w:tcPr>
-          <w:p>
-            <w:pPr>
-              <w:spacing w:after="40" w:line="252" w:lineRule="auto"/>
-            </w:pPr>
-            <w:r>
-              <w:rPr>
-                <w:sz w:val="19"/>
-                <w:szCs w:val="19"/>
-              </w:rPr>
-              <w:t xml:space="preserve">In progress</w:t>
+            <w:shd w:fill="E3F0E6" w:color="auto" w:val="clear"/>
+            <w:tcMar>
+              <w:top w:type="dxa" w:w="70"/>
+              <w:left w:type="dxa" w:w="110"/>
+              <w:bottom w:type="dxa" w:w="50"/>
+              <w:right w:type="dxa" w:w="110"/>
+            </w:tcMar>
+            <w:vAlign w:val="top"/>
+          </w:tcPr>
+          <w:p>
+            <w:pPr>
+              <w:spacing w:after="40" w:line="252" w:lineRule="auto"/>
+            </w:pPr>
+            <w:r>
+              <w:rPr>
+                <w:sz w:val="19"/>
+                <w:szCs w:val="19"/>
+              </w:rPr>
+              <w:t xml:space="preserve">Done</w:t>
             </w:r>
           </w:p>
         </w:tc>
@@ -4349,24 +4470,25 @@
               <w:bottom w:val="single" w:color="DCE3E1" w:sz="4"/>
               <w:right w:val="single" w:color="DCE3E1" w:sz="4"/>
             </w:tcBorders>
-            <w:tcMar>
-              <w:top w:type="dxa" w:w="70"/>
-              <w:left w:type="dxa" w:w="110"/>
-              <w:bottom w:type="dxa" w:w="50"/>
-              <w:right w:type="dxa" w:w="110"/>
-            </w:tcMar>
-            <w:vAlign w:val="top"/>
-          </w:tcPr>
-          <w:p>
-            <w:pPr>
-              <w:spacing w:after="40" w:line="252" w:lineRule="auto"/>
-            </w:pPr>
-            <w:r>
-              <w:rPr>
-                <w:sz w:val="19"/>
-                <w:szCs w:val="19"/>
-              </w:rPr>
-              <w:t xml:space="preserve">Planned</w:t>
+            <w:shd w:fill="FBEFD8" w:color="auto" w:val="clear"/>
+            <w:tcMar>
+              <w:top w:type="dxa" w:w="70"/>
+              <w:left w:type="dxa" w:w="110"/>
+              <w:bottom w:type="dxa" w:w="50"/>
+              <w:right w:type="dxa" w:w="110"/>
+            </w:tcMar>
+            <w:vAlign w:val="top"/>
+          </w:tcPr>
+          <w:p>
+            <w:pPr>
+              <w:spacing w:after="40" w:line="252" w:lineRule="auto"/>
+            </w:pPr>
+            <w:r>
+              <w:rPr>
+                <w:sz w:val="19"/>
+                <w:szCs w:val="19"/>
+              </w:rPr>
+              <w:t xml:space="preserve">In progress</w:t>
             </w:r>
           </w:p>
         </w:tc>
@@ -12069,7 +12191,7 @@
     </w:p>
     <w:p>
       <w:r>
-        <w:t xml:space="preserve">Work is delivered in short sprints, and each one ends with the owner trying the new screens and accepting them. These are the parts that are built, tested and accepted as of Sprint 04.</w:t>
+        <w:t xml:space="preserve">Work is delivered in short sprints, and each one ends with the owner trying the new screens and accepting them. These are the parts that are built, tested and accepted as of Sprint 05.</w:t>
       </w:r>
     </w:p>
     <w:p>
@@ -13160,12 +13282,273 @@
         <w:pStyle w:val="Heading2"/>
       </w:pPr>
       <w:r>
-        <w:t xml:space="preserve">9.5   In progress: Sprint 05 — Availability engine and reservations core</w:t>
+        <w:t xml:space="preserve">9.5   Sprint 05 — Availability engine and reservations core</w:t>
       </w:r>
     </w:p>
     <w:p>
       <w:r>
         <w:t xml:space="preserve">Bookings for rooms and dorm beds are taken without double-booking, even when two people book the last room at the same moment.</w:t>
+      </w:r>
+    </w:p>
+    <w:p>
+      <w:pPr>
+        <w:pStyle w:val="ListParagraph"/>
+        <w:numPr>
+          <w:ilvl w:val="0"/>
+          <w:numId w:val="2"/>
+        </w:numPr>
+        <w:spacing w:after="60"/>
+      </w:pPr>
+      <w:r>
+        <w:t xml:space="preserve">See which rooms and dorm beds are free for any dates, with the price, before booking</w:t>
+      </w:r>
+    </w:p>
+    <w:p>
+      <w:pPr>
+        <w:pStyle w:val="ListParagraph"/>
+        <w:numPr>
+          <w:ilvl w:val="0"/>
+          <w:numId w:val="2"/>
+        </w:numPr>
+        <w:spacing w:after="60"/>
+      </w:pPr>
+      <w:r>
+        <w:t xml:space="preserve">Book a walk-in in five steps: dates, room, guest (find or add), rate, confirm</w:t>
+      </w:r>
+    </w:p>
+    <w:p>
+      <w:pPr>
+        <w:pStyle w:val="ListParagraph"/>
+        <w:numPr>
+          <w:ilvl w:val="0"/>
+          <w:numId w:val="2"/>
+        </w:numPr>
+        <w:spacing w:after="60"/>
+      </w:pPr>
+      <w:r>
+        <w:t xml:space="preserve">No double booking: when two people book the last room at the same moment, one gets it and the other is told why</w:t>
+      </w:r>
+    </w:p>
+    <w:p>
+      <w:pPr>
+        <w:pStyle w:val="ListParagraph"/>
+        <w:numPr>
+          <w:ilvl w:val="0"/>
+          <w:numId w:val="2"/>
+        </w:numPr>
+        <w:spacing w:after="60"/>
+      </w:pPr>
+      <w:r>
+        <w:t xml:space="preserve">Every booking keeps its nightly prices, notes and a full history of who confirmed, changed or cancelled it and why</w:t>
+      </w:r>
+    </w:p>
+    <w:p>
+      <w:pPr>
+        <w:pStyle w:val="ListParagraph"/>
+        <w:numPr>
+          <w:ilvl w:val="0"/>
+          <w:numId w:val="2"/>
+        </w:numPr>
+        <w:spacing w:after="60"/>
+      </w:pPr>
+      <w:r>
+        <w:t xml:space="preserve">Enquiries are saved without holding a room; cancelling frees the room at once</w:t>
+      </w:r>
+    </w:p>
+    <w:p>
+      <w:pPr>
+        <w:keepNext/>
+        <w:pBdr>
+          <w:top w:val="single" w:color="DCE3E1" w:sz="4"/>
+          <w:bottom w:val="single" w:color="DCE3E1" w:sz="4"/>
+          <w:left w:val="single" w:color="DCE3E1" w:sz="4"/>
+          <w:right w:val="single" w:color="DCE3E1" w:sz="4"/>
+        </w:pBdr>
+        <w:spacing w:before="120" w:after="0" w:line="240" w:lineRule="auto"/>
+        <w:jc w:val="center"/>
+      </w:pPr>
+      <w:r>
+        <w:drawing>
+          <wp:inline distT="0" distB="0" distL="0" distR="0">
+            <wp:extent cx="5124450" cy="3438525"/>
+            <wp:effectExtent t="0" r="0" b="0" l="0"/>
+            <wp:docPr id="1" name="Reservations: stays that haven't ended, soonest first" descr="Reservations: stays that haven't ended, soonest first" title="Reservations: stays that haven't ended, soonest first"/>
+            <wp:cNvGraphicFramePr>
+              <a:graphicFrameLocks xmlns:a="http://schemas.openxmlformats.org/drawingml/2006/main" noChangeAspect="1"/>
+            </wp:cNvGraphicFramePr>
+            <a:graphic xmlns:a="http://schemas.openxmlformats.org/drawingml/2006/main">
+              <a:graphicData uri="http://schemas.openxmlformats.org/drawingml/2006/picture">
+                <pic:pic xmlns:pic="http://schemas.openxmlformats.org/drawingml/2006/picture">
+                  <pic:nvPicPr>
+                    <pic:cNvPr id="0" name="" descr=""/>
+                    <pic:cNvPicPr>
+                      <a:picLocks noChangeAspect="1" noChangeArrowheads="1"/>
+                    </pic:cNvPicPr>
+                  </pic:nvPicPr>
+                  <pic:blipFill>
+                    <a:blip r:embed="rId23" cstate="none"/>
+                    <a:srcRect/>
+                    <a:stretch>
+                      <a:fillRect/>
+                    </a:stretch>
+                  </pic:blipFill>
+                  <pic:spPr bwMode="auto">
+                    <a:xfrm>
+                      <a:off x="0" y="0"/>
+                      <a:ext cx="5124450" cy="3438525"/>
+                    </a:xfrm>
+                    <a:prstGeom prst="rect">
+                      <a:avLst/>
+                    </a:prstGeom>
+                  </pic:spPr>
+                </pic:pic>
+              </a:graphicData>
+            </a:graphic>
+          </wp:inline>
+        </w:drawing>
+      </w:r>
+    </w:p>
+    <w:p>
+      <w:pPr>
+        <w:pStyle w:val="Caption"/>
+      </w:pPr>
+      <w:r>
+        <w:t xml:space="preserve">Reservations: stays that haven't ended, soonest first</w:t>
+      </w:r>
+    </w:p>
+    <w:p>
+      <w:pPr>
+        <w:keepNext/>
+        <w:pBdr>
+          <w:top w:val="single" w:color="DCE3E1" w:sz="4"/>
+          <w:bottom w:val="single" w:color="DCE3E1" w:sz="4"/>
+          <w:left w:val="single" w:color="DCE3E1" w:sz="4"/>
+          <w:right w:val="single" w:color="DCE3E1" w:sz="4"/>
+        </w:pBdr>
+        <w:spacing w:before="120" w:after="0" w:line="240" w:lineRule="auto"/>
+        <w:jc w:val="center"/>
+      </w:pPr>
+      <w:r>
+        <w:drawing>
+          <wp:inline distT="0" distB="0" distL="0" distR="0">
+            <wp:extent cx="5124450" cy="3438525"/>
+            <wp:effectExtent t="0" r="0" b="0" l="0"/>
+            <wp:docPr id="1" name="Availability: free rooms and beds per type, with the price" descr="Availability: free rooms and beds per type, with the price" title="Availability: free rooms and beds per type, with the price"/>
+            <wp:cNvGraphicFramePr>
+              <a:graphicFrameLocks xmlns:a="http://schemas.openxmlformats.org/drawingml/2006/main" noChangeAspect="1"/>
+            </wp:cNvGraphicFramePr>
+            <a:graphic xmlns:a="http://schemas.openxmlformats.org/drawingml/2006/main">
+              <a:graphicData uri="http://schemas.openxmlformats.org/drawingml/2006/picture">
+                <pic:pic xmlns:pic="http://schemas.openxmlformats.org/drawingml/2006/picture">
+                  <pic:nvPicPr>
+                    <pic:cNvPr id="0" name="" descr=""/>
+                    <pic:cNvPicPr>
+                      <a:picLocks noChangeAspect="1" noChangeArrowheads="1"/>
+                    </pic:cNvPicPr>
+                  </pic:nvPicPr>
+                  <pic:blipFill>
+                    <a:blip r:embed="rId24" cstate="none"/>
+                    <a:srcRect/>
+                    <a:stretch>
+                      <a:fillRect/>
+                    </a:stretch>
+                  </pic:blipFill>
+                  <pic:spPr bwMode="auto">
+                    <a:xfrm>
+                      <a:off x="0" y="0"/>
+                      <a:ext cx="5124450" cy="3438525"/>
+                    </a:xfrm>
+                    <a:prstGeom prst="rect">
+                      <a:avLst/>
+                    </a:prstGeom>
+                  </pic:spPr>
+                </pic:pic>
+              </a:graphicData>
+            </a:graphic>
+          </wp:inline>
+        </w:drawing>
+      </w:r>
+    </w:p>
+    <w:p>
+      <w:pPr>
+        <w:pStyle w:val="Caption"/>
+      </w:pPr>
+      <w:r>
+        <w:t xml:space="preserve">Availability: free rooms and beds per type, with the price</w:t>
+      </w:r>
+    </w:p>
+    <w:p>
+      <w:pPr>
+        <w:keepNext/>
+        <w:pBdr>
+          <w:top w:val="single" w:color="DCE3E1" w:sz="4"/>
+          <w:bottom w:val="single" w:color="DCE3E1" w:sz="4"/>
+          <w:left w:val="single" w:color="DCE3E1" w:sz="4"/>
+          <w:right w:val="single" w:color="DCE3E1" w:sz="4"/>
+        </w:pBdr>
+        <w:spacing w:before="120" w:after="0" w:line="240" w:lineRule="auto"/>
+        <w:jc w:val="center"/>
+      </w:pPr>
+      <w:r>
+        <w:drawing>
+          <wp:inline distT="0" distB="0" distL="0" distR="0">
+            <wp:extent cx="5124450" cy="3438525"/>
+            <wp:effectExtent t="0" r="0" b="0" l="0"/>
+            <wp:docPr id="1" name="The last step of a new booking" descr="The last step of a new booking" title="The last step of a new booking"/>
+            <wp:cNvGraphicFramePr>
+              <a:graphicFrameLocks xmlns:a="http://schemas.openxmlformats.org/drawingml/2006/main" noChangeAspect="1"/>
+            </wp:cNvGraphicFramePr>
+            <a:graphic xmlns:a="http://schemas.openxmlformats.org/drawingml/2006/main">
+              <a:graphicData uri="http://schemas.openxmlformats.org/drawingml/2006/picture">
+                <pic:pic xmlns:pic="http://schemas.openxmlformats.org/drawingml/2006/picture">
+                  <pic:nvPicPr>
+                    <pic:cNvPr id="0" name="" descr=""/>
+                    <pic:cNvPicPr>
+                      <a:picLocks noChangeAspect="1" noChangeArrowheads="1"/>
+                    </pic:cNvPicPr>
+                  </pic:nvPicPr>
+                  <pic:blipFill>
+                    <a:blip r:embed="rId25" cstate="none"/>
+                    <a:srcRect/>
+                    <a:stretch>
+                      <a:fillRect/>
+                    </a:stretch>
+                  </pic:blipFill>
+                  <pic:spPr bwMode="auto">
+                    <a:xfrm>
+                      <a:off x="0" y="0"/>
+                      <a:ext cx="5124450" cy="3438525"/>
+                    </a:xfrm>
+                    <a:prstGeom prst="rect">
+                      <a:avLst/>
+                    </a:prstGeom>
+                  </pic:spPr>
+                </pic:pic>
+              </a:graphicData>
+            </a:graphic>
+          </wp:inline>
+        </w:drawing>
+      </w:r>
+    </w:p>
+    <w:p>
+      <w:pPr>
+        <w:pStyle w:val="Caption"/>
+      </w:pPr>
+      <w:r>
+        <w:t xml:space="preserve">The last step of a new booking</w:t>
+      </w:r>
+    </w:p>
+    <w:p>
+      <w:pPr>
+        <w:pStyle w:val="Heading2"/>
+      </w:pPr>
+      <w:r>
+        <w:t xml:space="preserve">9.6   In progress: Sprint 06 — Reservation calendar</w:t>
+      </w:r>
+    </w:p>
+    <w:p>
+      <w:r>
+        <w:t xml:space="preserve">A calendar shows every room and bed with its bookings by day, week or month; bookings can be moved by drag-and-drop with safety checks.</w:t>
       </w:r>
     </w:p>
     <w:p>
@@ -13178,7 +13561,7 @@
           <w:sz w:val="18"/>
           <w:szCs w:val="18"/>
         </w:rPr>
-        <w:t xml:space="preserve">It will be accepted when: Brief §16 scenario passes reliably in CI.</w:t>
+        <w:t xml:space="preserve">It will be accepted when: Reception moves a guest from 102 to 103 in two actions; the audit trail shows who/why.</w:t>
       </w:r>
     </w:p>
     <w:p>
@@ -15637,7 +16020,7 @@
               <w:bottom w:val="single" w:color="DCE3E1" w:sz="4"/>
               <w:right w:val="single" w:color="DCE3E1" w:sz="4"/>
             </w:tcBorders>
-            <w:shd w:fill="FBEFD8" w:color="auto" w:val="clear"/>
+            <w:shd w:fill="E3F0E6" w:color="auto" w:val="clear"/>
             <w:tcMar>
               <w:top w:type="dxa" w:w="70"/>
               <w:left w:type="dxa" w:w="110"/>
@@ -15655,7 +16038,7 @@
                 <w:sz w:val="17"/>
                 <w:szCs w:val="17"/>
               </w:rPr>
-              <w:t xml:space="preserve">In progress</w:t>
+              <w:t xml:space="preserve">Done</w:t>
             </w:r>
           </w:p>
         </w:tc>
@@ -15763,6 +16146,7 @@
               <w:bottom w:val="single" w:color="DCE3E1" w:sz="4"/>
               <w:right w:val="single" w:color="DCE3E1" w:sz="4"/>
             </w:tcBorders>
+            <w:shd w:fill="FBEFD8" w:color="auto" w:val="clear"/>
             <w:tcMar>
               <w:top w:type="dxa" w:w="70"/>
               <w:left w:type="dxa" w:w="110"/>
@@ -15780,7 +16164,7 @@
                 <w:sz w:val="17"/>
                 <w:szCs w:val="17"/>
               </w:rPr>
-              <w:t xml:space="preserve">Planned</w:t>
+              <w:t xml:space="preserve">In progress</w:t>
             </w:r>
           </w:p>
         </w:tc>
@@ -18708,7 +19092,7 @@
                     </pic:cNvPicPr>
                   </pic:nvPicPr>
                   <pic:blipFill>
-                    <a:blip r:embed="rId23" cstate="none"/>
+                    <a:blip r:embed="rId26" cstate="none"/>
                     <a:srcRect/>
                     <a:stretch>
                       <a:fillRect/>
@@ -18815,7 +19199,7 @@
         <w:t xml:space="preserve">Tests that grow with the system.</w:t>
       </w:r>
       <w:r>
-        <w:t xml:space="preserve"> As of Sprint 04: 101 server test methods, 31 screen tests and 45 end-to-end browser steps, all passing.</w:t>
+        <w:t xml:space="preserve"> As of Sprint 05: 129 server test methods, 44 screen tests and 52 end-to-end browser steps, all passing.</w:t>
       </w:r>
     </w:p>
     <w:p>
@@ -20702,7 +21086,7 @@
         <w:sz w:val="16"/>
         <w:szCs w:val="16"/>
       </w:rPr>
-      <w:t xml:space="preserve">Version 1.4 · 14 October 2026</w:t>
+      <w:t xml:space="preserve">Version 1.5 · 15 October 2026</w:t>
     </w:r>
     <w:r>
       <w:rPr>

</xml_diff>

<commit_message>
chore(sprints): accept Sprint 05; architecture and system design guide (#114)
Sprint 05 accepted by the owner on 15 Oct 2026; Sprint 06 in progress; handbooks 1.5. New docs/architecture/system-design.md for new joiners; closing a sprint now updates it.

Co-Authored-By: Claude Opus 5.5 (1M context) <noreply@anthropic.com>
Claude-Session: https://claude.ai/code/session_012XMVkmZQNjkF7rDANWkAMm
</commit_message>
<xml_diff>
--- a/docs/handbooks/Resort-OS-Product-Overview.docx
+++ b/docs/handbooks/Resort-OS-Product-Overview.docx
@@ -182,7 +182,7 @@
                 <w:sz w:val="19"/>
                 <w:szCs w:val="19"/>
               </w:rPr>
-              <w:t xml:space="preserve">Version 1.4</w:t>
+              <w:t xml:space="preserve">Version 1.5</w:t>
             </w:r>
           </w:p>
         </w:tc>
@@ -252,7 +252,7 @@
                 <w:sz w:val="19"/>
                 <w:szCs w:val="19"/>
               </w:rPr>
-              <w:t xml:space="preserve">14 October 2026</w:t>
+              <w:t xml:space="preserve">15 October 2026</w:t>
             </w:r>
           </w:p>
         </w:tc>
@@ -322,7 +322,7 @@
                 <w:sz w:val="19"/>
                 <w:szCs w:val="19"/>
               </w:rPr>
-              <w:t xml:space="preserve">Sprints 01, 02, 03, 04 accepted · Sprint 05 Availability engine and reservations core in progress</w:t>
+              <w:t xml:space="preserve">Sprints 01, 02, 03, 04, 05 accepted · Sprint 06 Reservation calendar in progress</w:t>
             </w:r>
           </w:p>
         </w:tc>
@@ -661,7 +661,7 @@
                 <w:sz w:val="19"/>
                 <w:szCs w:val="19"/>
               </w:rPr>
-              <w:t xml:space="preserve">1.4</w:t>
+              <w:t xml:space="preserve">1.5</w:t>
             </w:r>
           </w:p>
         </w:tc>
@@ -691,7 +691,7 @@
                 <w:sz w:val="19"/>
                 <w:szCs w:val="19"/>
               </w:rPr>
-              <w:t xml:space="preserve">2026-10-14</w:t>
+              <w:t xml:space="preserve">2026-10-15</w:t>
             </w:r>
           </w:p>
         </w:tc>
@@ -721,7 +721,7 @@
                 <w:sz w:val="19"/>
                 <w:szCs w:val="19"/>
               </w:rPr>
-              <w:t xml:space="preserve">Sprint 04 (Rate plans and packages) accepted: nightly price grid, quotes, packages with revenue split. Sprint 05 (Availability engine and reservations) started.</w:t>
+              <w:t xml:space="preserve">Sprint 05 (Availability engine and reservations) accepted: race-free booking, booking wizard, booking history, date pickers. Diagrams of the reservation tables and the booking flow. Sprint 06 (Reservation calendar) started.</w:t>
             </w:r>
           </w:p>
         </w:tc>
@@ -757,7 +757,7 @@
                 <w:sz w:val="19"/>
                 <w:szCs w:val="19"/>
               </w:rPr>
-              <w:t xml:space="preserve">1.3</w:t>
+              <w:t xml:space="preserve">1.4</w:t>
             </w:r>
           </w:p>
         </w:tc>
@@ -788,7 +788,7 @@
                 <w:sz w:val="19"/>
                 <w:szCs w:val="19"/>
               </w:rPr>
-              <w:t xml:space="preserve">2026-10-11</w:t>
+              <w:t xml:space="preserve">2026-10-14</w:t>
             </w:r>
           </w:p>
         </w:tc>
@@ -819,7 +819,7 @@
                 <w:sz w:val="19"/>
                 <w:szCs w:val="19"/>
               </w:rPr>
-              <w:t xml:space="preserve">Sprint 03 (Guests) accepted, with review fixes: Aadhaar number check and error messages that say why. Sprint 04 (Rate plans and packages) started.</w:t>
+              <w:t xml:space="preserve">Sprint 04 (Rate plans and packages) accepted: nightly price grid, quotes, packages with revenue split. Sprint 05 (Availability engine and reservations) started.</w:t>
             </w:r>
           </w:p>
         </w:tc>
@@ -854,7 +854,7 @@
                 <w:sz w:val="19"/>
                 <w:szCs w:val="19"/>
               </w:rPr>
-              <w:t xml:space="preserve">1.2.1</w:t>
+              <w:t xml:space="preserve">1.3</w:t>
             </w:r>
           </w:p>
         </w:tc>
@@ -884,7 +884,7 @@
                 <w:sz w:val="19"/>
                 <w:szCs w:val="19"/>
               </w:rPr>
-              <w:t xml:space="preserve">2026-10-10</w:t>
+              <w:t xml:space="preserve">2026-10-11</w:t>
             </w:r>
           </w:p>
         </w:tc>
@@ -914,7 +914,7 @@
                 <w:sz w:val="19"/>
                 <w:szCs w:val="19"/>
               </w:rPr>
-              <w:t xml:space="preserve">Sprint 03 (Guests) built and in review: guest profiles, encrypted ID documents, duplicates, merge, anonymise, consent.</w:t>
+              <w:t xml:space="preserve">Sprint 03 (Guests) accepted, with review fixes: Aadhaar number check and error messages that say why. Sprint 04 (Rate plans and packages) started.</w:t>
             </w:r>
           </w:p>
         </w:tc>
@@ -950,6 +950,103 @@
                 <w:sz w:val="19"/>
                 <w:szCs w:val="19"/>
               </w:rPr>
+              <w:t xml:space="preserve">1.2.1</w:t>
+            </w:r>
+          </w:p>
+        </w:tc>
+        <w:tc>
+          <w:tcPr>
+            <w:tcW w:type="dxa" w:w="1500"/>
+            <w:tcBorders>
+              <w:top w:val="single" w:color="DCE3E1" w:sz="4"/>
+              <w:left w:val="single" w:color="DCE3E1" w:sz="4"/>
+              <w:bottom w:val="single" w:color="DCE3E1" w:sz="4"/>
+              <w:right w:val="single" w:color="DCE3E1" w:sz="4"/>
+            </w:tcBorders>
+            <w:shd w:fill="F5F7F6" w:color="auto" w:val="clear"/>
+            <w:tcMar>
+              <w:top w:type="dxa" w:w="70"/>
+              <w:left w:type="dxa" w:w="110"/>
+              <w:bottom w:type="dxa" w:w="50"/>
+              <w:right w:type="dxa" w:w="110"/>
+            </w:tcMar>
+            <w:vAlign w:val="top"/>
+          </w:tcPr>
+          <w:p>
+            <w:pPr>
+              <w:spacing w:after="40" w:line="252" w:lineRule="auto"/>
+            </w:pPr>
+            <w:r>
+              <w:rPr>
+                <w:sz w:val="19"/>
+                <w:szCs w:val="19"/>
+              </w:rPr>
+              <w:t xml:space="preserve">2026-10-10</w:t>
+            </w:r>
+          </w:p>
+        </w:tc>
+        <w:tc>
+          <w:tcPr>
+            <w:tcW w:type="dxa" w:w="6714"/>
+            <w:tcBorders>
+              <w:top w:val="single" w:color="DCE3E1" w:sz="4"/>
+              <w:left w:val="single" w:color="DCE3E1" w:sz="4"/>
+              <w:bottom w:val="single" w:color="DCE3E1" w:sz="4"/>
+              <w:right w:val="single" w:color="DCE3E1" w:sz="4"/>
+            </w:tcBorders>
+            <w:shd w:fill="F5F7F6" w:color="auto" w:val="clear"/>
+            <w:tcMar>
+              <w:top w:type="dxa" w:w="70"/>
+              <w:left w:type="dxa" w:w="110"/>
+              <w:bottom w:type="dxa" w:w="50"/>
+              <w:right w:type="dxa" w:w="110"/>
+            </w:tcMar>
+            <w:vAlign w:val="top"/>
+          </w:tcPr>
+          <w:p>
+            <w:pPr>
+              <w:spacing w:after="40" w:line="252" w:lineRule="auto"/>
+            </w:pPr>
+            <w:r>
+              <w:rPr>
+                <w:sz w:val="19"/>
+                <w:szCs w:val="19"/>
+              </w:rPr>
+              <w:t xml:space="preserve">Sprint 03 (Guests) built and in review: guest profiles, encrypted ID documents, duplicates, merge, anonymise, consent.</w:t>
+            </w:r>
+          </w:p>
+        </w:tc>
+      </w:tr>
+      <w:tr>
+        <w:trPr>
+          <w:cantSplit/>
+        </w:trPr>
+        <w:tc>
+          <w:tcPr>
+            <w:tcW w:type="dxa" w:w="1100"/>
+            <w:tcBorders>
+              <w:top w:val="single" w:color="DCE3E1" w:sz="4"/>
+              <w:left w:val="single" w:color="DCE3E1" w:sz="4"/>
+              <w:bottom w:val="single" w:color="DCE3E1" w:sz="4"/>
+              <w:right w:val="single" w:color="DCE3E1" w:sz="4"/>
+            </w:tcBorders>
+            <w:tcMar>
+              <w:top w:type="dxa" w:w="70"/>
+              <w:left w:type="dxa" w:w="110"/>
+              <w:bottom w:type="dxa" w:w="50"/>
+              <w:right w:type="dxa" w:w="110"/>
+            </w:tcMar>
+            <w:vAlign w:val="top"/>
+          </w:tcPr>
+          <w:p>
+            <w:pPr>
+              <w:spacing w:after="40" w:line="252" w:lineRule="auto"/>
+            </w:pPr>
+            <w:r>
+              <w:rPr>
+                <w:sz w:val="19"/>
+                <w:szCs w:val="19"/>
+              </w:rPr>
               <w:t xml:space="preserve">1.2</w:t>
             </w:r>
           </w:p>
@@ -963,7 +1060,6 @@
               <w:bottom w:val="single" w:color="DCE3E1" w:sz="4"/>
               <w:right w:val="single" w:color="DCE3E1" w:sz="4"/>
             </w:tcBorders>
-            <w:shd w:fill="F5F7F6" w:color="auto" w:val="clear"/>
             <w:tcMar>
               <w:top w:type="dxa" w:w="70"/>
               <w:left w:type="dxa" w:w="110"/>
@@ -994,7 +1090,6 @@
               <w:bottom w:val="single" w:color="DCE3E1" w:sz="4"/>
               <w:right w:val="single" w:color="DCE3E1" w:sz="4"/>
             </w:tcBorders>
-            <w:shd w:fill="F5F7F6" w:color="auto" w:val="clear"/>
             <w:tcMar>
               <w:top w:type="dxa" w:w="70"/>
               <w:left w:type="dxa" w:w="110"/>
@@ -1245,7 +1340,7 @@
                 <w:sz w:val="19"/>
                 <w:szCs w:val="19"/>
               </w:rPr>
-              <w:t xml:space="preserve">Living document, rebuilt at the end of every sprint. This edition reflects Sprint 04 accepted and Sprint 05 in progress.</w:t>
+              <w:t xml:space="preserve">Living document, rebuilt at the end of every sprint. This edition reflects Sprint 05 accepted and Sprint 06 in progress.</w:t>
             </w:r>
           </w:p>
         </w:tc>
@@ -2021,7 +2116,33 @@
           <w:sz w:val="19"/>
           <w:szCs w:val="19"/>
         </w:rPr>
-        <w:t xml:space="preserve">In progress: Sprint 05 — Availability engine and reservations core</w:t>
+        <w:t xml:space="preserve">Sprint 05 — Availability engine and reservations core</w:t>
+      </w:r>
+    </w:p>
+    <w:p>
+      <w:pPr>
+        <w:spacing w:after="30" w:before="0"/>
+        <w:ind w:left="420"/>
+      </w:pPr>
+      <w:r>
+        <w:rPr>
+          <w:b w:val="false"/>
+          <w:bCs w:val="false"/>
+          <w:color w:val="8A2449"/>
+          <w:sz w:val="19"/>
+          <w:szCs w:val="19"/>
+        </w:rPr>
+        <w:t xml:space="preserve">9.6  </w:t>
+      </w:r>
+      <w:r>
+        <w:rPr>
+          <w:b w:val="false"/>
+          <w:bCs w:val="false"/>
+          <w:color w:val="1B2A2E"/>
+          <w:sz w:val="19"/>
+          <w:szCs w:val="19"/>
+        </w:rPr>
+        <w:t xml:space="preserve">In progress: Sprint 06 — Reservation calendar</w:t>
       </w:r>
     </w:p>
     <w:p>
@@ -2344,7 +2465,7 @@
                 <w:sz w:val="40"/>
                 <w:szCs w:val="40"/>
               </w:rPr>
-              <w:t xml:space="preserve">4 of 29</w:t>
+              <w:t xml:space="preserve">5 of 29</w:t>
             </w:r>
           </w:p>
           <w:p>
@@ -2709,7 +2830,7 @@
                 <w:sz w:val="19"/>
                 <w:szCs w:val="19"/>
               </w:rPr>
-              <w:t xml:space="preserve">Sprints 01 and 02 and 03 and 04 are delivered and accepted. Sprint 05 (Availability engine and reservations core) is in progress.</w:t>
+              <w:t xml:space="preserve">Sprints 01 and 02 and 03 and 04 and 05 are delivered and accepted. Sprint 06 (Reservation calendar) is in progress.</w:t>
             </w:r>
           </w:p>
         </w:tc>
@@ -4253,25 +4374,25 @@
               <w:bottom w:val="single" w:color="DCE3E1" w:sz="4"/>
               <w:right w:val="single" w:color="DCE3E1" w:sz="4"/>
             </w:tcBorders>
-            <w:shd w:fill="FBEFD8" w:color="auto" w:val="clear"/>
-            <w:tcMar>
-              <w:top w:type="dxa" w:w="70"/>
-              <w:left w:type="dxa" w:w="110"/>
-              <w:bottom w:type="dxa" w:w="50"/>
-              <w:right w:type="dxa" w:w="110"/>
-            </w:tcMar>
-            <w:vAlign w:val="top"/>
-          </w:tcPr>
-          <w:p>
-            <w:pPr>
-              <w:spacing w:after="40" w:line="252" w:lineRule="auto"/>
-            </w:pPr>
-            <w:r>
-              <w:rPr>
-                <w:sz w:val="19"/>
-                <w:szCs w:val="19"/>
-              </w:rPr>
-              <w:t xml:space="preserve">In progress</w:t>
+            <w:shd w:fill="E3F0E6" w:color="auto" w:val="clear"/>
+            <w:tcMar>
+              <w:top w:type="dxa" w:w="70"/>
+              <w:left w:type="dxa" w:w="110"/>
+              <w:bottom w:type="dxa" w:w="50"/>
+              <w:right w:type="dxa" w:w="110"/>
+            </w:tcMar>
+            <w:vAlign w:val="top"/>
+          </w:tcPr>
+          <w:p>
+            <w:pPr>
+              <w:spacing w:after="40" w:line="252" w:lineRule="auto"/>
+            </w:pPr>
+            <w:r>
+              <w:rPr>
+                <w:sz w:val="19"/>
+                <w:szCs w:val="19"/>
+              </w:rPr>
+              <w:t xml:space="preserve">Done</w:t>
             </w:r>
           </w:p>
         </w:tc>
@@ -4349,24 +4470,25 @@
               <w:bottom w:val="single" w:color="DCE3E1" w:sz="4"/>
               <w:right w:val="single" w:color="DCE3E1" w:sz="4"/>
             </w:tcBorders>
-            <w:tcMar>
-              <w:top w:type="dxa" w:w="70"/>
-              <w:left w:type="dxa" w:w="110"/>
-              <w:bottom w:type="dxa" w:w="50"/>
-              <w:right w:type="dxa" w:w="110"/>
-            </w:tcMar>
-            <w:vAlign w:val="top"/>
-          </w:tcPr>
-          <w:p>
-            <w:pPr>
-              <w:spacing w:after="40" w:line="252" w:lineRule="auto"/>
-            </w:pPr>
-            <w:r>
-              <w:rPr>
-                <w:sz w:val="19"/>
-                <w:szCs w:val="19"/>
-              </w:rPr>
-              <w:t xml:space="preserve">Planned</w:t>
+            <w:shd w:fill="FBEFD8" w:color="auto" w:val="clear"/>
+            <w:tcMar>
+              <w:top w:type="dxa" w:w="70"/>
+              <w:left w:type="dxa" w:w="110"/>
+              <w:bottom w:type="dxa" w:w="50"/>
+              <w:right w:type="dxa" w:w="110"/>
+            </w:tcMar>
+            <w:vAlign w:val="top"/>
+          </w:tcPr>
+          <w:p>
+            <w:pPr>
+              <w:spacing w:after="40" w:line="252" w:lineRule="auto"/>
+            </w:pPr>
+            <w:r>
+              <w:rPr>
+                <w:sz w:val="19"/>
+                <w:szCs w:val="19"/>
+              </w:rPr>
+              <w:t xml:space="preserve">In progress</w:t>
             </w:r>
           </w:p>
         </w:tc>
@@ -12069,7 +12191,7 @@
     </w:p>
     <w:p>
       <w:r>
-        <w:t xml:space="preserve">Work is delivered in short sprints, and each one ends with the owner trying the new screens and accepting them. These are the parts that are built, tested and accepted as of Sprint 04.</w:t>
+        <w:t xml:space="preserve">Work is delivered in short sprints, and each one ends with the owner trying the new screens and accepting them. These are the parts that are built, tested and accepted as of Sprint 05.</w:t>
       </w:r>
     </w:p>
     <w:p>
@@ -13160,12 +13282,273 @@
         <w:pStyle w:val="Heading2"/>
       </w:pPr>
       <w:r>
-        <w:t xml:space="preserve">9.5   In progress: Sprint 05 — Availability engine and reservations core</w:t>
+        <w:t xml:space="preserve">9.5   Sprint 05 — Availability engine and reservations core</w:t>
       </w:r>
     </w:p>
     <w:p>
       <w:r>
         <w:t xml:space="preserve">Bookings for rooms and dorm beds are taken without double-booking, even when two people book the last room at the same moment.</w:t>
+      </w:r>
+    </w:p>
+    <w:p>
+      <w:pPr>
+        <w:pStyle w:val="ListParagraph"/>
+        <w:numPr>
+          <w:ilvl w:val="0"/>
+          <w:numId w:val="2"/>
+        </w:numPr>
+        <w:spacing w:after="60"/>
+      </w:pPr>
+      <w:r>
+        <w:t xml:space="preserve">See which rooms and dorm beds are free for any dates, with the price, before booking</w:t>
+      </w:r>
+    </w:p>
+    <w:p>
+      <w:pPr>
+        <w:pStyle w:val="ListParagraph"/>
+        <w:numPr>
+          <w:ilvl w:val="0"/>
+          <w:numId w:val="2"/>
+        </w:numPr>
+        <w:spacing w:after="60"/>
+      </w:pPr>
+      <w:r>
+        <w:t xml:space="preserve">Book a walk-in in five steps: dates, room, guest (find or add), rate, confirm</w:t>
+      </w:r>
+    </w:p>
+    <w:p>
+      <w:pPr>
+        <w:pStyle w:val="ListParagraph"/>
+        <w:numPr>
+          <w:ilvl w:val="0"/>
+          <w:numId w:val="2"/>
+        </w:numPr>
+        <w:spacing w:after="60"/>
+      </w:pPr>
+      <w:r>
+        <w:t xml:space="preserve">No double booking: when two people book the last room at the same moment, one gets it and the other is told why</w:t>
+      </w:r>
+    </w:p>
+    <w:p>
+      <w:pPr>
+        <w:pStyle w:val="ListParagraph"/>
+        <w:numPr>
+          <w:ilvl w:val="0"/>
+          <w:numId w:val="2"/>
+        </w:numPr>
+        <w:spacing w:after="60"/>
+      </w:pPr>
+      <w:r>
+        <w:t xml:space="preserve">Every booking keeps its nightly prices, notes and a full history of who confirmed, changed or cancelled it and why</w:t>
+      </w:r>
+    </w:p>
+    <w:p>
+      <w:pPr>
+        <w:pStyle w:val="ListParagraph"/>
+        <w:numPr>
+          <w:ilvl w:val="0"/>
+          <w:numId w:val="2"/>
+        </w:numPr>
+        <w:spacing w:after="60"/>
+      </w:pPr>
+      <w:r>
+        <w:t xml:space="preserve">Enquiries are saved without holding a room; cancelling frees the room at once</w:t>
+      </w:r>
+    </w:p>
+    <w:p>
+      <w:pPr>
+        <w:keepNext/>
+        <w:pBdr>
+          <w:top w:val="single" w:color="DCE3E1" w:sz="4"/>
+          <w:bottom w:val="single" w:color="DCE3E1" w:sz="4"/>
+          <w:left w:val="single" w:color="DCE3E1" w:sz="4"/>
+          <w:right w:val="single" w:color="DCE3E1" w:sz="4"/>
+        </w:pBdr>
+        <w:spacing w:before="120" w:after="0" w:line="240" w:lineRule="auto"/>
+        <w:jc w:val="center"/>
+      </w:pPr>
+      <w:r>
+        <w:drawing>
+          <wp:inline distT="0" distB="0" distL="0" distR="0">
+            <wp:extent cx="5124450" cy="3438525"/>
+            <wp:effectExtent t="0" r="0" b="0" l="0"/>
+            <wp:docPr id="1" name="Reservations: stays that haven't ended, soonest first" descr="Reservations: stays that haven't ended, soonest first" title="Reservations: stays that haven't ended, soonest first"/>
+            <wp:cNvGraphicFramePr>
+              <a:graphicFrameLocks xmlns:a="http://schemas.openxmlformats.org/drawingml/2006/main" noChangeAspect="1"/>
+            </wp:cNvGraphicFramePr>
+            <a:graphic xmlns:a="http://schemas.openxmlformats.org/drawingml/2006/main">
+              <a:graphicData uri="http://schemas.openxmlformats.org/drawingml/2006/picture">
+                <pic:pic xmlns:pic="http://schemas.openxmlformats.org/drawingml/2006/picture">
+                  <pic:nvPicPr>
+                    <pic:cNvPr id="0" name="" descr=""/>
+                    <pic:cNvPicPr>
+                      <a:picLocks noChangeAspect="1" noChangeArrowheads="1"/>
+                    </pic:cNvPicPr>
+                  </pic:nvPicPr>
+                  <pic:blipFill>
+                    <a:blip r:embed="rId23" cstate="none"/>
+                    <a:srcRect/>
+                    <a:stretch>
+                      <a:fillRect/>
+                    </a:stretch>
+                  </pic:blipFill>
+                  <pic:spPr bwMode="auto">
+                    <a:xfrm>
+                      <a:off x="0" y="0"/>
+                      <a:ext cx="5124450" cy="3438525"/>
+                    </a:xfrm>
+                    <a:prstGeom prst="rect">
+                      <a:avLst/>
+                    </a:prstGeom>
+                  </pic:spPr>
+                </pic:pic>
+              </a:graphicData>
+            </a:graphic>
+          </wp:inline>
+        </w:drawing>
+      </w:r>
+    </w:p>
+    <w:p>
+      <w:pPr>
+        <w:pStyle w:val="Caption"/>
+      </w:pPr>
+      <w:r>
+        <w:t xml:space="preserve">Reservations: stays that haven't ended, soonest first</w:t>
+      </w:r>
+    </w:p>
+    <w:p>
+      <w:pPr>
+        <w:keepNext/>
+        <w:pBdr>
+          <w:top w:val="single" w:color="DCE3E1" w:sz="4"/>
+          <w:bottom w:val="single" w:color="DCE3E1" w:sz="4"/>
+          <w:left w:val="single" w:color="DCE3E1" w:sz="4"/>
+          <w:right w:val="single" w:color="DCE3E1" w:sz="4"/>
+        </w:pBdr>
+        <w:spacing w:before="120" w:after="0" w:line="240" w:lineRule="auto"/>
+        <w:jc w:val="center"/>
+      </w:pPr>
+      <w:r>
+        <w:drawing>
+          <wp:inline distT="0" distB="0" distL="0" distR="0">
+            <wp:extent cx="5124450" cy="3438525"/>
+            <wp:effectExtent t="0" r="0" b="0" l="0"/>
+            <wp:docPr id="1" name="Availability: free rooms and beds per type, with the price" descr="Availability: free rooms and beds per type, with the price" title="Availability: free rooms and beds per type, with the price"/>
+            <wp:cNvGraphicFramePr>
+              <a:graphicFrameLocks xmlns:a="http://schemas.openxmlformats.org/drawingml/2006/main" noChangeAspect="1"/>
+            </wp:cNvGraphicFramePr>
+            <a:graphic xmlns:a="http://schemas.openxmlformats.org/drawingml/2006/main">
+              <a:graphicData uri="http://schemas.openxmlformats.org/drawingml/2006/picture">
+                <pic:pic xmlns:pic="http://schemas.openxmlformats.org/drawingml/2006/picture">
+                  <pic:nvPicPr>
+                    <pic:cNvPr id="0" name="" descr=""/>
+                    <pic:cNvPicPr>
+                      <a:picLocks noChangeAspect="1" noChangeArrowheads="1"/>
+                    </pic:cNvPicPr>
+                  </pic:nvPicPr>
+                  <pic:blipFill>
+                    <a:blip r:embed="rId24" cstate="none"/>
+                    <a:srcRect/>
+                    <a:stretch>
+                      <a:fillRect/>
+                    </a:stretch>
+                  </pic:blipFill>
+                  <pic:spPr bwMode="auto">
+                    <a:xfrm>
+                      <a:off x="0" y="0"/>
+                      <a:ext cx="5124450" cy="3438525"/>
+                    </a:xfrm>
+                    <a:prstGeom prst="rect">
+                      <a:avLst/>
+                    </a:prstGeom>
+                  </pic:spPr>
+                </pic:pic>
+              </a:graphicData>
+            </a:graphic>
+          </wp:inline>
+        </w:drawing>
+      </w:r>
+    </w:p>
+    <w:p>
+      <w:pPr>
+        <w:pStyle w:val="Caption"/>
+      </w:pPr>
+      <w:r>
+        <w:t xml:space="preserve">Availability: free rooms and beds per type, with the price</w:t>
+      </w:r>
+    </w:p>
+    <w:p>
+      <w:pPr>
+        <w:keepNext/>
+        <w:pBdr>
+          <w:top w:val="single" w:color="DCE3E1" w:sz="4"/>
+          <w:bottom w:val="single" w:color="DCE3E1" w:sz="4"/>
+          <w:left w:val="single" w:color="DCE3E1" w:sz="4"/>
+          <w:right w:val="single" w:color="DCE3E1" w:sz="4"/>
+        </w:pBdr>
+        <w:spacing w:before="120" w:after="0" w:line="240" w:lineRule="auto"/>
+        <w:jc w:val="center"/>
+      </w:pPr>
+      <w:r>
+        <w:drawing>
+          <wp:inline distT="0" distB="0" distL="0" distR="0">
+            <wp:extent cx="5124450" cy="3438525"/>
+            <wp:effectExtent t="0" r="0" b="0" l="0"/>
+            <wp:docPr id="1" name="The last step of a new booking" descr="The last step of a new booking" title="The last step of a new booking"/>
+            <wp:cNvGraphicFramePr>
+              <a:graphicFrameLocks xmlns:a="http://schemas.openxmlformats.org/drawingml/2006/main" noChangeAspect="1"/>
+            </wp:cNvGraphicFramePr>
+            <a:graphic xmlns:a="http://schemas.openxmlformats.org/drawingml/2006/main">
+              <a:graphicData uri="http://schemas.openxmlformats.org/drawingml/2006/picture">
+                <pic:pic xmlns:pic="http://schemas.openxmlformats.org/drawingml/2006/picture">
+                  <pic:nvPicPr>
+                    <pic:cNvPr id="0" name="" descr=""/>
+                    <pic:cNvPicPr>
+                      <a:picLocks noChangeAspect="1" noChangeArrowheads="1"/>
+                    </pic:cNvPicPr>
+                  </pic:nvPicPr>
+                  <pic:blipFill>
+                    <a:blip r:embed="rId25" cstate="none"/>
+                    <a:srcRect/>
+                    <a:stretch>
+                      <a:fillRect/>
+                    </a:stretch>
+                  </pic:blipFill>
+                  <pic:spPr bwMode="auto">
+                    <a:xfrm>
+                      <a:off x="0" y="0"/>
+                      <a:ext cx="5124450" cy="3438525"/>
+                    </a:xfrm>
+                    <a:prstGeom prst="rect">
+                      <a:avLst/>
+                    </a:prstGeom>
+                  </pic:spPr>
+                </pic:pic>
+              </a:graphicData>
+            </a:graphic>
+          </wp:inline>
+        </w:drawing>
+      </w:r>
+    </w:p>
+    <w:p>
+      <w:pPr>
+        <w:pStyle w:val="Caption"/>
+      </w:pPr>
+      <w:r>
+        <w:t xml:space="preserve">The last step of a new booking</w:t>
+      </w:r>
+    </w:p>
+    <w:p>
+      <w:pPr>
+        <w:pStyle w:val="Heading2"/>
+      </w:pPr>
+      <w:r>
+        <w:t xml:space="preserve">9.6   In progress: Sprint 06 — Reservation calendar</w:t>
+      </w:r>
+    </w:p>
+    <w:p>
+      <w:r>
+        <w:t xml:space="preserve">A calendar shows every room and bed with its bookings by day, week or month; bookings can be moved by drag-and-drop with safety checks.</w:t>
       </w:r>
     </w:p>
     <w:p>
@@ -13178,7 +13561,7 @@
           <w:sz w:val="18"/>
           <w:szCs w:val="18"/>
         </w:rPr>
-        <w:t xml:space="preserve">It will be accepted when: Brief §16 scenario passes reliably in CI.</w:t>
+        <w:t xml:space="preserve">It will be accepted when: Reception moves a guest from 102 to 103 in two actions; the audit trail shows who/why.</w:t>
       </w:r>
     </w:p>
     <w:p>
@@ -15637,7 +16020,7 @@
               <w:bottom w:val="single" w:color="DCE3E1" w:sz="4"/>
               <w:right w:val="single" w:color="DCE3E1" w:sz="4"/>
             </w:tcBorders>
-            <w:shd w:fill="FBEFD8" w:color="auto" w:val="clear"/>
+            <w:shd w:fill="E3F0E6" w:color="auto" w:val="clear"/>
             <w:tcMar>
               <w:top w:type="dxa" w:w="70"/>
               <w:left w:type="dxa" w:w="110"/>
@@ -15655,7 +16038,7 @@
                 <w:sz w:val="17"/>
                 <w:szCs w:val="17"/>
               </w:rPr>
-              <w:t xml:space="preserve">In progress</w:t>
+              <w:t xml:space="preserve">Done</w:t>
             </w:r>
           </w:p>
         </w:tc>
@@ -15763,6 +16146,7 @@
               <w:bottom w:val="single" w:color="DCE3E1" w:sz="4"/>
               <w:right w:val="single" w:color="DCE3E1" w:sz="4"/>
             </w:tcBorders>
+            <w:shd w:fill="FBEFD8" w:color="auto" w:val="clear"/>
             <w:tcMar>
               <w:top w:type="dxa" w:w="70"/>
               <w:left w:type="dxa" w:w="110"/>
@@ -15780,7 +16164,7 @@
                 <w:sz w:val="17"/>
                 <w:szCs w:val="17"/>
               </w:rPr>
-              <w:t xml:space="preserve">Planned</w:t>
+              <w:t xml:space="preserve">In progress</w:t>
             </w:r>
           </w:p>
         </w:tc>
@@ -18708,7 +19092,7 @@
                     </pic:cNvPicPr>
                   </pic:nvPicPr>
                   <pic:blipFill>
-                    <a:blip r:embed="rId23" cstate="none"/>
+                    <a:blip r:embed="rId26" cstate="none"/>
                     <a:srcRect/>
                     <a:stretch>
                       <a:fillRect/>
@@ -18815,7 +19199,7 @@
         <w:t xml:space="preserve">Tests that grow with the system.</w:t>
       </w:r>
       <w:r>
-        <w:t xml:space="preserve"> As of Sprint 04: 101 server test methods, 31 screen tests and 45 end-to-end browser steps, all passing.</w:t>
+        <w:t xml:space="preserve"> As of Sprint 05: 129 server test methods, 44 screen tests and 52 end-to-end browser steps, all passing.</w:t>
       </w:r>
     </w:p>
     <w:p>
@@ -20702,7 +21086,7 @@
         <w:sz w:val="16"/>
         <w:szCs w:val="16"/>
       </w:rPr>
-      <w:t xml:space="preserve">Version 1.4 · 14 October 2026</w:t>
+      <w:t xml:space="preserve">Version 1.5 · 15 October 2026</w:t>
     </w:r>
     <w:r>
       <w:rPr>

</xml_diff>

<commit_message>
chore(sprints): accept Sprint 06
Sprint 06 accepted by the owner on 17 Oct 2026; Sprint 07 (front desk) in progress; handbooks 1.6.

Co-Authored-By: Claude Opus 5.5 (1M context) <noreply@anthropic.com>
Claude-Session: https://claude.ai/code/session_014EUynCikxKHCSsbHNGZmpJ
</commit_message>
<xml_diff>
--- a/docs/handbooks/Resort-OS-Product-Overview.docx
+++ b/docs/handbooks/Resort-OS-Product-Overview.docx
@@ -182,7 +182,7 @@
                 <w:sz w:val="19"/>
                 <w:szCs w:val="19"/>
               </w:rPr>
-              <w:t xml:space="preserve">Version 1.5</w:t>
+              <w:t xml:space="preserve">Version 1.6</w:t>
             </w:r>
           </w:p>
         </w:tc>
@@ -252,7 +252,7 @@
                 <w:sz w:val="19"/>
                 <w:szCs w:val="19"/>
               </w:rPr>
-              <w:t xml:space="preserve">15 October 2026</w:t>
+              <w:t xml:space="preserve">17 October 2026</w:t>
             </w:r>
           </w:p>
         </w:tc>
@@ -322,7 +322,7 @@
                 <w:sz w:val="19"/>
                 <w:szCs w:val="19"/>
               </w:rPr>
-              <w:t xml:space="preserve">Sprints 01, 02, 03, 04, 05 accepted · Sprint 06 Reservation calendar in progress</w:t>
+              <w:t xml:space="preserve">Sprints 01, 02, 03, 04, 05, 06 accepted · Sprint 07 Front desk — arrivals, departures, in-house, check-in/out in progress</w:t>
             </w:r>
           </w:p>
         </w:tc>
@@ -661,7 +661,7 @@
                 <w:sz w:val="19"/>
                 <w:szCs w:val="19"/>
               </w:rPr>
-              <w:t xml:space="preserve">1.5</w:t>
+              <w:t xml:space="preserve">1.6</w:t>
             </w:r>
           </w:p>
         </w:tc>
@@ -691,7 +691,7 @@
                 <w:sz w:val="19"/>
                 <w:szCs w:val="19"/>
               </w:rPr>
-              <w:t xml:space="preserve">2026-10-15</w:t>
+              <w:t xml:space="preserve">2026-10-17</w:t>
             </w:r>
           </w:p>
         </w:tc>
@@ -721,7 +721,7 @@
                 <w:sz w:val="19"/>
                 <w:szCs w:val="19"/>
               </w:rPr>
-              <w:t xml:space="preserve">Sprint 05 (Availability engine and reservations) accepted: race-free booking, booking wizard, booking history, date pickers. Diagrams of the reservation tables and the booking flow. Sprint 06 (Reservation calendar) started.</w:t>
+              <w:t xml:space="preserve">Sprint 06 (Reservation calendar) accepted: day, week and month calendar of rooms and dorm beds, moving a guest by drag-and-drop with a reason, list by day on phones. Room-move flow diagram. Sprint 07 (Front desk) started.</w:t>
             </w:r>
           </w:p>
         </w:tc>
@@ -757,7 +757,7 @@
                 <w:sz w:val="19"/>
                 <w:szCs w:val="19"/>
               </w:rPr>
-              <w:t xml:space="preserve">1.4</w:t>
+              <w:t xml:space="preserve">1.5</w:t>
             </w:r>
           </w:p>
         </w:tc>
@@ -788,7 +788,7 @@
                 <w:sz w:val="19"/>
                 <w:szCs w:val="19"/>
               </w:rPr>
-              <w:t xml:space="preserve">2026-10-14</w:t>
+              <w:t xml:space="preserve">2026-10-15</w:t>
             </w:r>
           </w:p>
         </w:tc>
@@ -819,7 +819,7 @@
                 <w:sz w:val="19"/>
                 <w:szCs w:val="19"/>
               </w:rPr>
-              <w:t xml:space="preserve">Sprint 04 (Rate plans and packages) accepted: nightly price grid, quotes, packages with revenue split. Sprint 05 (Availability engine and reservations) started.</w:t>
+              <w:t xml:space="preserve">Sprint 05 (Availability engine and reservations) accepted: race-free booking, booking wizard, booking history, date pickers. Diagrams of the reservation tables and the booking flow. Sprint 06 (Reservation calendar) started.</w:t>
             </w:r>
           </w:p>
         </w:tc>
@@ -854,7 +854,7 @@
                 <w:sz w:val="19"/>
                 <w:szCs w:val="19"/>
               </w:rPr>
-              <w:t xml:space="preserve">1.3</w:t>
+              <w:t xml:space="preserve">1.4</w:t>
             </w:r>
           </w:p>
         </w:tc>
@@ -884,7 +884,7 @@
                 <w:sz w:val="19"/>
                 <w:szCs w:val="19"/>
               </w:rPr>
-              <w:t xml:space="preserve">2026-10-11</w:t>
+              <w:t xml:space="preserve">2026-10-14</w:t>
             </w:r>
           </w:p>
         </w:tc>
@@ -914,7 +914,7 @@
                 <w:sz w:val="19"/>
                 <w:szCs w:val="19"/>
               </w:rPr>
-              <w:t xml:space="preserve">Sprint 03 (Guests) accepted, with review fixes: Aadhaar number check and error messages that say why. Sprint 04 (Rate plans and packages) started.</w:t>
+              <w:t xml:space="preserve">Sprint 04 (Rate plans and packages) accepted: nightly price grid, quotes, packages with revenue split. Sprint 05 (Availability engine and reservations) started.</w:t>
             </w:r>
           </w:p>
         </w:tc>
@@ -950,7 +950,7 @@
                 <w:sz w:val="19"/>
                 <w:szCs w:val="19"/>
               </w:rPr>
-              <w:t xml:space="preserve">1.2.1</w:t>
+              <w:t xml:space="preserve">1.3</w:t>
             </w:r>
           </w:p>
         </w:tc>
@@ -981,7 +981,7 @@
                 <w:sz w:val="19"/>
                 <w:szCs w:val="19"/>
               </w:rPr>
-              <w:t xml:space="preserve">2026-10-10</w:t>
+              <w:t xml:space="preserve">2026-10-11</w:t>
             </w:r>
           </w:p>
         </w:tc>
@@ -1012,7 +1012,7 @@
                 <w:sz w:val="19"/>
                 <w:szCs w:val="19"/>
               </w:rPr>
-              <w:t xml:space="preserve">Sprint 03 (Guests) built and in review: guest profiles, encrypted ID documents, duplicates, merge, anonymise, consent.</w:t>
+              <w:t xml:space="preserve">Sprint 03 (Guests) accepted, with review fixes: Aadhaar number check and error messages that say why. Sprint 04 (Rate plans and packages) started.</w:t>
             </w:r>
           </w:p>
         </w:tc>
@@ -1047,6 +1047,102 @@
                 <w:sz w:val="19"/>
                 <w:szCs w:val="19"/>
               </w:rPr>
+              <w:t xml:space="preserve">1.2.1</w:t>
+            </w:r>
+          </w:p>
+        </w:tc>
+        <w:tc>
+          <w:tcPr>
+            <w:tcW w:type="dxa" w:w="1500"/>
+            <w:tcBorders>
+              <w:top w:val="single" w:color="DCE3E1" w:sz="4"/>
+              <w:left w:val="single" w:color="DCE3E1" w:sz="4"/>
+              <w:bottom w:val="single" w:color="DCE3E1" w:sz="4"/>
+              <w:right w:val="single" w:color="DCE3E1" w:sz="4"/>
+            </w:tcBorders>
+            <w:tcMar>
+              <w:top w:type="dxa" w:w="70"/>
+              <w:left w:type="dxa" w:w="110"/>
+              <w:bottom w:type="dxa" w:w="50"/>
+              <w:right w:type="dxa" w:w="110"/>
+            </w:tcMar>
+            <w:vAlign w:val="top"/>
+          </w:tcPr>
+          <w:p>
+            <w:pPr>
+              <w:spacing w:after="40" w:line="252" w:lineRule="auto"/>
+            </w:pPr>
+            <w:r>
+              <w:rPr>
+                <w:sz w:val="19"/>
+                <w:szCs w:val="19"/>
+              </w:rPr>
+              <w:t xml:space="preserve">2026-10-10</w:t>
+            </w:r>
+          </w:p>
+        </w:tc>
+        <w:tc>
+          <w:tcPr>
+            <w:tcW w:type="dxa" w:w="6714"/>
+            <w:tcBorders>
+              <w:top w:val="single" w:color="DCE3E1" w:sz="4"/>
+              <w:left w:val="single" w:color="DCE3E1" w:sz="4"/>
+              <w:bottom w:val="single" w:color="DCE3E1" w:sz="4"/>
+              <w:right w:val="single" w:color="DCE3E1" w:sz="4"/>
+            </w:tcBorders>
+            <w:tcMar>
+              <w:top w:type="dxa" w:w="70"/>
+              <w:left w:type="dxa" w:w="110"/>
+              <w:bottom w:type="dxa" w:w="50"/>
+              <w:right w:type="dxa" w:w="110"/>
+            </w:tcMar>
+            <w:vAlign w:val="top"/>
+          </w:tcPr>
+          <w:p>
+            <w:pPr>
+              <w:spacing w:after="40" w:line="252" w:lineRule="auto"/>
+            </w:pPr>
+            <w:r>
+              <w:rPr>
+                <w:sz w:val="19"/>
+                <w:szCs w:val="19"/>
+              </w:rPr>
+              <w:t xml:space="preserve">Sprint 03 (Guests) built and in review: guest profiles, encrypted ID documents, duplicates, merge, anonymise, consent.</w:t>
+            </w:r>
+          </w:p>
+        </w:tc>
+      </w:tr>
+      <w:tr>
+        <w:trPr>
+          <w:cantSplit/>
+        </w:trPr>
+        <w:tc>
+          <w:tcPr>
+            <w:tcW w:type="dxa" w:w="1100"/>
+            <w:tcBorders>
+              <w:top w:val="single" w:color="DCE3E1" w:sz="4"/>
+              <w:left w:val="single" w:color="DCE3E1" w:sz="4"/>
+              <w:bottom w:val="single" w:color="DCE3E1" w:sz="4"/>
+              <w:right w:val="single" w:color="DCE3E1" w:sz="4"/>
+            </w:tcBorders>
+            <w:shd w:fill="F5F7F6" w:color="auto" w:val="clear"/>
+            <w:tcMar>
+              <w:top w:type="dxa" w:w="70"/>
+              <w:left w:type="dxa" w:w="110"/>
+              <w:bottom w:type="dxa" w:w="50"/>
+              <w:right w:type="dxa" w:w="110"/>
+            </w:tcMar>
+            <w:vAlign w:val="top"/>
+          </w:tcPr>
+          <w:p>
+            <w:pPr>
+              <w:spacing w:after="40" w:line="252" w:lineRule="auto"/>
+            </w:pPr>
+            <w:r>
+              <w:rPr>
+                <w:sz w:val="19"/>
+                <w:szCs w:val="19"/>
+              </w:rPr>
               <w:t xml:space="preserve">1.2</w:t>
             </w:r>
           </w:p>
@@ -1060,6 +1156,7 @@
               <w:bottom w:val="single" w:color="DCE3E1" w:sz="4"/>
               <w:right w:val="single" w:color="DCE3E1" w:sz="4"/>
             </w:tcBorders>
+            <w:shd w:fill="F5F7F6" w:color="auto" w:val="clear"/>
             <w:tcMar>
               <w:top w:type="dxa" w:w="70"/>
               <w:left w:type="dxa" w:w="110"/>
@@ -1090,6 +1187,7 @@
               <w:bottom w:val="single" w:color="DCE3E1" w:sz="4"/>
               <w:right w:val="single" w:color="DCE3E1" w:sz="4"/>
             </w:tcBorders>
+            <w:shd w:fill="F5F7F6" w:color="auto" w:val="clear"/>
             <w:tcMar>
               <w:top w:type="dxa" w:w="70"/>
               <w:left w:type="dxa" w:w="110"/>
@@ -1340,7 +1438,7 @@
                 <w:sz w:val="19"/>
                 <w:szCs w:val="19"/>
               </w:rPr>
-              <w:t xml:space="preserve">Living document, rebuilt at the end of every sprint. This edition reflects Sprint 05 accepted and Sprint 06 in progress.</w:t>
+              <w:t xml:space="preserve">Living document, rebuilt at the end of every sprint. This edition reflects Sprint 06 accepted and Sprint 07 in progress.</w:t>
             </w:r>
           </w:p>
         </w:tc>
@@ -2142,7 +2240,33 @@
           <w:sz w:val="19"/>
           <w:szCs w:val="19"/>
         </w:rPr>
-        <w:t xml:space="preserve">In progress: Sprint 06 — Reservation calendar</w:t>
+        <w:t xml:space="preserve">Sprint 06 — Reservation calendar</w:t>
+      </w:r>
+    </w:p>
+    <w:p>
+      <w:pPr>
+        <w:spacing w:after="30" w:before="0"/>
+        <w:ind w:left="420"/>
+      </w:pPr>
+      <w:r>
+        <w:rPr>
+          <w:b w:val="false"/>
+          <w:bCs w:val="false"/>
+          <w:color w:val="8A2449"/>
+          <w:sz w:val="19"/>
+          <w:szCs w:val="19"/>
+        </w:rPr>
+        <w:t xml:space="preserve">9.7  </w:t>
+      </w:r>
+      <w:r>
+        <w:rPr>
+          <w:b w:val="false"/>
+          <w:bCs w:val="false"/>
+          <w:color w:val="1B2A2E"/>
+          <w:sz w:val="19"/>
+          <w:szCs w:val="19"/>
+        </w:rPr>
+        <w:t xml:space="preserve">In progress: Sprint 07 — Front desk — arrivals, departures, in-house, check-in/out</w:t>
       </w:r>
     </w:p>
     <w:p>
@@ -2465,7 +2589,7 @@
                 <w:sz w:val="40"/>
                 <w:szCs w:val="40"/>
               </w:rPr>
-              <w:t xml:space="preserve">5 of 29</w:t>
+              <w:t xml:space="preserve">6 of 29</w:t>
             </w:r>
           </w:p>
           <w:p>
@@ -2830,7 +2954,7 @@
                 <w:sz w:val="19"/>
                 <w:szCs w:val="19"/>
               </w:rPr>
-              <w:t xml:space="preserve">Sprints 01 and 02 and 03 and 04 and 05 are delivered and accepted. Sprint 06 (Reservation calendar) is in progress.</w:t>
+              <w:t xml:space="preserve">Sprints 01 and 02 and 03 and 04 and 05 and 06 are delivered and accepted. Sprint 07 (Front desk — arrivals, departures, in-house, check-in/out) is in progress.</w:t>
             </w:r>
           </w:p>
         </w:tc>
@@ -4470,25 +4594,25 @@
               <w:bottom w:val="single" w:color="DCE3E1" w:sz="4"/>
               <w:right w:val="single" w:color="DCE3E1" w:sz="4"/>
             </w:tcBorders>
-            <w:shd w:fill="FBEFD8" w:color="auto" w:val="clear"/>
-            <w:tcMar>
-              <w:top w:type="dxa" w:w="70"/>
-              <w:left w:type="dxa" w:w="110"/>
-              <w:bottom w:type="dxa" w:w="50"/>
-              <w:right w:type="dxa" w:w="110"/>
-            </w:tcMar>
-            <w:vAlign w:val="top"/>
-          </w:tcPr>
-          <w:p>
-            <w:pPr>
-              <w:spacing w:after="40" w:line="252" w:lineRule="auto"/>
-            </w:pPr>
-            <w:r>
-              <w:rPr>
-                <w:sz w:val="19"/>
-                <w:szCs w:val="19"/>
-              </w:rPr>
-              <w:t xml:space="preserve">In progress</w:t>
+            <w:shd w:fill="E3F0E6" w:color="auto" w:val="clear"/>
+            <w:tcMar>
+              <w:top w:type="dxa" w:w="70"/>
+              <w:left w:type="dxa" w:w="110"/>
+              <w:bottom w:type="dxa" w:w="50"/>
+              <w:right w:type="dxa" w:w="110"/>
+            </w:tcMar>
+            <w:vAlign w:val="top"/>
+          </w:tcPr>
+          <w:p>
+            <w:pPr>
+              <w:spacing w:after="40" w:line="252" w:lineRule="auto"/>
+            </w:pPr>
+            <w:r>
+              <w:rPr>
+                <w:sz w:val="19"/>
+                <w:szCs w:val="19"/>
+              </w:rPr>
+              <w:t xml:space="preserve">Done</w:t>
             </w:r>
           </w:p>
         </w:tc>
@@ -4802,24 +4926,25 @@
               <w:bottom w:val="single" w:color="DCE3E1" w:sz="4"/>
               <w:right w:val="single" w:color="DCE3E1" w:sz="4"/>
             </w:tcBorders>
-            <w:tcMar>
-              <w:top w:type="dxa" w:w="70"/>
-              <w:left w:type="dxa" w:w="110"/>
-              <w:bottom w:type="dxa" w:w="50"/>
-              <w:right w:type="dxa" w:w="110"/>
-            </w:tcMar>
-            <w:vAlign w:val="top"/>
-          </w:tcPr>
-          <w:p>
-            <w:pPr>
-              <w:spacing w:after="40" w:line="252" w:lineRule="auto"/>
-            </w:pPr>
-            <w:r>
-              <w:rPr>
-                <w:sz w:val="19"/>
-                <w:szCs w:val="19"/>
-              </w:rPr>
-              <w:t xml:space="preserve">Planned</w:t>
+            <w:shd w:fill="FBEFD8" w:color="auto" w:val="clear"/>
+            <w:tcMar>
+              <w:top w:type="dxa" w:w="70"/>
+              <w:left w:type="dxa" w:w="110"/>
+              <w:bottom w:type="dxa" w:w="50"/>
+              <w:right w:type="dxa" w:w="110"/>
+            </w:tcMar>
+            <w:vAlign w:val="top"/>
+          </w:tcPr>
+          <w:p>
+            <w:pPr>
+              <w:spacing w:after="40" w:line="252" w:lineRule="auto"/>
+            </w:pPr>
+            <w:r>
+              <w:rPr>
+                <w:sz w:val="19"/>
+                <w:szCs w:val="19"/>
+              </w:rPr>
+              <w:t xml:space="preserve">In progress</w:t>
             </w:r>
           </w:p>
         </w:tc>
@@ -12191,7 +12316,7 @@
     </w:p>
     <w:p>
       <w:r>
-        <w:t xml:space="preserve">Work is delivered in short sprints, and each one ends with the owner trying the new screens and accepting them. These are the parts that are built, tested and accepted as of Sprint 05.</w:t>
+        <w:t xml:space="preserve">Work is delivered in short sprints, and each one ends with the owner trying the new screens and accepting them. These are the parts that are built, tested and accepted as of Sprint 06.</w:t>
       </w:r>
     </w:p>
     <w:p>
@@ -13543,12 +13668,273 @@
         <w:pStyle w:val="Heading2"/>
       </w:pPr>
       <w:r>
-        <w:t xml:space="preserve">9.6   In progress: Sprint 06 — Reservation calendar</w:t>
+        <w:t xml:space="preserve">9.6   Sprint 06 — Reservation calendar</w:t>
       </w:r>
     </w:p>
     <w:p>
       <w:r>
         <w:t xml:space="preserve">A calendar shows every room and bed with its bookings by day, week or month; bookings can be moved by drag-and-drop with safety checks.</w:t>
+      </w:r>
+    </w:p>
+    <w:p>
+      <w:pPr>
+        <w:pStyle w:val="ListParagraph"/>
+        <w:numPr>
+          <w:ilvl w:val="0"/>
+          <w:numId w:val="2"/>
+        </w:numPr>
+        <w:spacing w:after="60"/>
+      </w:pPr>
+      <w:r>
+        <w:t xml:space="preserve">See every room and dorm bed with its bookings and blocks by day, week or month on one calendar</w:t>
+      </w:r>
+    </w:p>
+    <w:p>
+      <w:pPr>
+        <w:pStyle w:val="ListParagraph"/>
+        <w:numPr>
+          <w:ilvl w:val="0"/>
+          <w:numId w:val="2"/>
+        </w:numPr>
+        <w:spacing w:after="60"/>
+      </w:pPr>
+      <w:r>
+        <w:t xml:space="preserve">Move a guest to another room by dragging the booking and giving a reason: two actions</w:t>
+      </w:r>
+    </w:p>
+    <w:p>
+      <w:pPr>
+        <w:pStyle w:val="ListParagraph"/>
+        <w:numPr>
+          <w:ilvl w:val="0"/>
+          <w:numId w:val="2"/>
+        </w:numPr>
+        <w:spacing w:after="60"/>
+      </w:pPr>
+      <w:r>
+        <w:t xml:space="preserve">A move onto a blocked or booked room is refused at once, with the reason</w:t>
+      </w:r>
+    </w:p>
+    <w:p>
+      <w:pPr>
+        <w:pStyle w:val="ListParagraph"/>
+        <w:numPr>
+          <w:ilvl w:val="0"/>
+          <w:numId w:val="2"/>
+        </w:numPr>
+        <w:spacing w:after="60"/>
+      </w:pPr>
+      <w:r>
+        <w:t xml:space="preserve">The price stays the same after a move, and the booking and audit trail show who moved it and why</w:t>
+      </w:r>
+    </w:p>
+    <w:p>
+      <w:pPr>
+        <w:pStyle w:val="ListParagraph"/>
+        <w:numPr>
+          <w:ilvl w:val="0"/>
+          <w:numId w:val="2"/>
+        </w:numPr>
+        <w:spacing w:after="60"/>
+      </w:pPr>
+      <w:r>
+        <w:t xml:space="preserve">On a phone the calendar becomes a list by day: arrivals, in house, departures and blocked rooms</w:t>
+      </w:r>
+    </w:p>
+    <w:p>
+      <w:pPr>
+        <w:keepNext/>
+        <w:pBdr>
+          <w:top w:val="single" w:color="DCE3E1" w:sz="4"/>
+          <w:bottom w:val="single" w:color="DCE3E1" w:sz="4"/>
+          <w:left w:val="single" w:color="DCE3E1" w:sz="4"/>
+          <w:right w:val="single" w:color="DCE3E1" w:sz="4"/>
+        </w:pBdr>
+        <w:spacing w:before="120" w:after="0" w:line="240" w:lineRule="auto"/>
+        <w:jc w:val="center"/>
+      </w:pPr>
+      <w:r>
+        <w:drawing>
+          <wp:inline distT="0" distB="0" distL="0" distR="0">
+            <wp:extent cx="5124450" cy="3438525"/>
+            <wp:effectExtent t="0" r="0" b="0" l="0"/>
+            <wp:docPr id="1" name="Calendar, week view: bookings by room and a maintenance block" descr="Calendar, week view: bookings by room and a maintenance block" title="Calendar, week view: bookings by room and a maintenance block"/>
+            <wp:cNvGraphicFramePr>
+              <a:graphicFrameLocks xmlns:a="http://schemas.openxmlformats.org/drawingml/2006/main" noChangeAspect="1"/>
+            </wp:cNvGraphicFramePr>
+            <a:graphic xmlns:a="http://schemas.openxmlformats.org/drawingml/2006/main">
+              <a:graphicData uri="http://schemas.openxmlformats.org/drawingml/2006/picture">
+                <pic:pic xmlns:pic="http://schemas.openxmlformats.org/drawingml/2006/picture">
+                  <pic:nvPicPr>
+                    <pic:cNvPr id="0" name="" descr=""/>
+                    <pic:cNvPicPr>
+                      <a:picLocks noChangeAspect="1" noChangeArrowheads="1"/>
+                    </pic:cNvPicPr>
+                  </pic:nvPicPr>
+                  <pic:blipFill>
+                    <a:blip r:embed="rId26" cstate="none"/>
+                    <a:srcRect/>
+                    <a:stretch>
+                      <a:fillRect/>
+                    </a:stretch>
+                  </pic:blipFill>
+                  <pic:spPr bwMode="auto">
+                    <a:xfrm>
+                      <a:off x="0" y="0"/>
+                      <a:ext cx="5124450" cy="3438525"/>
+                    </a:xfrm>
+                    <a:prstGeom prst="rect">
+                      <a:avLst/>
+                    </a:prstGeom>
+                  </pic:spPr>
+                </pic:pic>
+              </a:graphicData>
+            </a:graphic>
+          </wp:inline>
+        </w:drawing>
+      </w:r>
+    </w:p>
+    <w:p>
+      <w:pPr>
+        <w:pStyle w:val="Caption"/>
+      </w:pPr>
+      <w:r>
+        <w:t xml:space="preserve">Calendar, week view: bookings by room and a maintenance block</w:t>
+      </w:r>
+    </w:p>
+    <w:p>
+      <w:pPr>
+        <w:keepNext/>
+        <w:pBdr>
+          <w:top w:val="single" w:color="DCE3E1" w:sz="4"/>
+          <w:bottom w:val="single" w:color="DCE3E1" w:sz="4"/>
+          <w:left w:val="single" w:color="DCE3E1" w:sz="4"/>
+          <w:right w:val="single" w:color="DCE3E1" w:sz="4"/>
+        </w:pBdr>
+        <w:spacing w:before="120" w:after="0" w:line="240" w:lineRule="auto"/>
+        <w:jc w:val="center"/>
+      </w:pPr>
+      <w:r>
+        <w:drawing>
+          <wp:inline distT="0" distB="0" distL="0" distR="0">
+            <wp:extent cx="5124450" cy="3438525"/>
+            <wp:effectExtent t="0" r="0" b="0" l="0"/>
+            <wp:docPr id="1" name="Calendar, month view" descr="Calendar, month view" title="Calendar, month view"/>
+            <wp:cNvGraphicFramePr>
+              <a:graphicFrameLocks xmlns:a="http://schemas.openxmlformats.org/drawingml/2006/main" noChangeAspect="1"/>
+            </wp:cNvGraphicFramePr>
+            <a:graphic xmlns:a="http://schemas.openxmlformats.org/drawingml/2006/main">
+              <a:graphicData uri="http://schemas.openxmlformats.org/drawingml/2006/picture">
+                <pic:pic xmlns:pic="http://schemas.openxmlformats.org/drawingml/2006/picture">
+                  <pic:nvPicPr>
+                    <pic:cNvPr id="0" name="" descr=""/>
+                    <pic:cNvPicPr>
+                      <a:picLocks noChangeAspect="1" noChangeArrowheads="1"/>
+                    </pic:cNvPicPr>
+                  </pic:nvPicPr>
+                  <pic:blipFill>
+                    <a:blip r:embed="rId27" cstate="none"/>
+                    <a:srcRect/>
+                    <a:stretch>
+                      <a:fillRect/>
+                    </a:stretch>
+                  </pic:blipFill>
+                  <pic:spPr bwMode="auto">
+                    <a:xfrm>
+                      <a:off x="0" y="0"/>
+                      <a:ext cx="5124450" cy="3438525"/>
+                    </a:xfrm>
+                    <a:prstGeom prst="rect">
+                      <a:avLst/>
+                    </a:prstGeom>
+                  </pic:spPr>
+                </pic:pic>
+              </a:graphicData>
+            </a:graphic>
+          </wp:inline>
+        </w:drawing>
+      </w:r>
+    </w:p>
+    <w:p>
+      <w:pPr>
+        <w:pStyle w:val="Caption"/>
+      </w:pPr>
+      <w:r>
+        <w:t xml:space="preserve">Calendar, month view</w:t>
+      </w:r>
+    </w:p>
+    <w:p>
+      <w:pPr>
+        <w:keepNext/>
+        <w:pBdr>
+          <w:top w:val="single" w:color="DCE3E1" w:sz="4"/>
+          <w:bottom w:val="single" w:color="DCE3E1" w:sz="4"/>
+          <w:left w:val="single" w:color="DCE3E1" w:sz="4"/>
+          <w:right w:val="single" w:color="DCE3E1" w:sz="4"/>
+        </w:pBdr>
+        <w:spacing w:before="120" w:after="0" w:line="240" w:lineRule="auto"/>
+        <w:jc w:val="center"/>
+      </w:pPr>
+      <w:r>
+        <w:drawing>
+          <wp:inline distT="0" distB="0" distL="0" distR="0">
+            <wp:extent cx="5124450" cy="3438525"/>
+            <wp:effectExtent t="0" r="0" b="0" l="0"/>
+            <wp:docPr id="1" name="A drop onto a blocked room is refused with the reason" descr="A drop onto a blocked room is refused with the reason" title="A drop onto a blocked room is refused with the reason"/>
+            <wp:cNvGraphicFramePr>
+              <a:graphicFrameLocks xmlns:a="http://schemas.openxmlformats.org/drawingml/2006/main" noChangeAspect="1"/>
+            </wp:cNvGraphicFramePr>
+            <a:graphic xmlns:a="http://schemas.openxmlformats.org/drawingml/2006/main">
+              <a:graphicData uri="http://schemas.openxmlformats.org/drawingml/2006/picture">
+                <pic:pic xmlns:pic="http://schemas.openxmlformats.org/drawingml/2006/picture">
+                  <pic:nvPicPr>
+                    <pic:cNvPr id="0" name="" descr=""/>
+                    <pic:cNvPicPr>
+                      <a:picLocks noChangeAspect="1" noChangeArrowheads="1"/>
+                    </pic:cNvPicPr>
+                  </pic:nvPicPr>
+                  <pic:blipFill>
+                    <a:blip r:embed="rId28" cstate="none"/>
+                    <a:srcRect/>
+                    <a:stretch>
+                      <a:fillRect/>
+                    </a:stretch>
+                  </pic:blipFill>
+                  <pic:spPr bwMode="auto">
+                    <a:xfrm>
+                      <a:off x="0" y="0"/>
+                      <a:ext cx="5124450" cy="3438525"/>
+                    </a:xfrm>
+                    <a:prstGeom prst="rect">
+                      <a:avLst/>
+                    </a:prstGeom>
+                  </pic:spPr>
+                </pic:pic>
+              </a:graphicData>
+            </a:graphic>
+          </wp:inline>
+        </w:drawing>
+      </w:r>
+    </w:p>
+    <w:p>
+      <w:pPr>
+        <w:pStyle w:val="Caption"/>
+      </w:pPr>
+      <w:r>
+        <w:t xml:space="preserve">A drop onto a blocked room is refused with the reason</w:t>
+      </w:r>
+    </w:p>
+    <w:p>
+      <w:pPr>
+        <w:pStyle w:val="Heading2"/>
+      </w:pPr>
+      <w:r>
+        <w:t xml:space="preserve">9.7   In progress: Sprint 07 — Front desk — arrivals, departures, in-house, check-in/out</w:t>
+      </w:r>
+    </w:p>
+    <w:p>
+      <w:r>
+        <w:t xml:space="preserve">Reception checks guests in and out in a few clicks, with today's arrivals, departures and in-house guests on one screen.</w:t>
       </w:r>
     </w:p>
     <w:p>
@@ -13561,7 +13947,7 @@
           <w:sz w:val="18"/>
           <w:szCs w:val="18"/>
         </w:rPr>
-        <w:t xml:space="preserve">It will be accepted when: Reception moves a guest from 102 to 103 in two actions; the audit trail shows who/why.</w:t>
+        <w:t xml:space="preserve">It will be accepted when: Walk-in to checked-in in ≤ 3 screens.</w:t>
       </w:r>
     </w:p>
     <w:p>
@@ -16146,7 +16532,7 @@
               <w:bottom w:val="single" w:color="DCE3E1" w:sz="4"/>
               <w:right w:val="single" w:color="DCE3E1" w:sz="4"/>
             </w:tcBorders>
-            <w:shd w:fill="FBEFD8" w:color="auto" w:val="clear"/>
+            <w:shd w:fill="E3F0E6" w:color="auto" w:val="clear"/>
             <w:tcMar>
               <w:top w:type="dxa" w:w="70"/>
               <w:left w:type="dxa" w:w="110"/>
@@ -16164,7 +16550,7 @@
                 <w:sz w:val="17"/>
                 <w:szCs w:val="17"/>
               </w:rPr>
-              <w:t xml:space="preserve">In progress</w:t>
+              <w:t xml:space="preserve">Done</w:t>
             </w:r>
           </w:p>
         </w:tc>
@@ -16272,6 +16658,7 @@
               <w:bottom w:val="single" w:color="DCE3E1" w:sz="4"/>
               <w:right w:val="single" w:color="DCE3E1" w:sz="4"/>
             </w:tcBorders>
+            <w:shd w:fill="FBEFD8" w:color="auto" w:val="clear"/>
             <w:tcMar>
               <w:top w:type="dxa" w:w="70"/>
               <w:left w:type="dxa" w:w="110"/>
@@ -16289,7 +16676,7 @@
                 <w:sz w:val="17"/>
                 <w:szCs w:val="17"/>
               </w:rPr>
-              <w:t xml:space="preserve">Planned</w:t>
+              <w:t xml:space="preserve">In progress</w:t>
             </w:r>
           </w:p>
         </w:tc>
@@ -19092,7 +19479,7 @@
                     </pic:cNvPicPr>
                   </pic:nvPicPr>
                   <pic:blipFill>
-                    <a:blip r:embed="rId26" cstate="none"/>
+                    <a:blip r:embed="rId29" cstate="none"/>
                     <a:srcRect/>
                     <a:stretch>
                       <a:fillRect/>
@@ -19199,7 +19586,7 @@
         <w:t xml:space="preserve">Tests that grow with the system.</w:t>
       </w:r>
       <w:r>
-        <w:t xml:space="preserve"> As of Sprint 05: 129 server test methods, 44 screen tests and 52 end-to-end browser steps, all passing.</w:t>
+        <w:t xml:space="preserve"> As of Sprint 06: 137 server test methods, 54 screen tests and 60 end-to-end browser steps, all passing.</w:t>
       </w:r>
     </w:p>
     <w:p>
@@ -21086,7 +21473,7 @@
         <w:sz w:val="16"/>
         <w:szCs w:val="16"/>
       </w:rPr>
-      <w:t xml:space="preserve">Version 1.5 · 15 October 2026</w:t>
+      <w:t xml:space="preserve">Version 1.6 · 17 October 2026</w:t>
     </w:r>
     <w:r>
       <w:rPr>

</xml_diff>

<commit_message>
chore(sprints): accept Sprint 06 (#117)
Sprint 06 accepted by the owner on 17 Oct 2026; Sprint 07 (front desk) in progress; handbooks 1.6.


Claude-Session: https://claude.ai/code/session_014EUynCikxKHCSsbHNGZmpJ

Co-authored-by: Claude <noreply@anthropic.com>
</commit_message>
<xml_diff>
--- a/docs/handbooks/Resort-OS-Product-Overview.docx
+++ b/docs/handbooks/Resort-OS-Product-Overview.docx
@@ -182,7 +182,7 @@
                 <w:sz w:val="19"/>
                 <w:szCs w:val="19"/>
               </w:rPr>
-              <w:t xml:space="preserve">Version 1.5</w:t>
+              <w:t xml:space="preserve">Version 1.6</w:t>
             </w:r>
           </w:p>
         </w:tc>
@@ -252,7 +252,7 @@
                 <w:sz w:val="19"/>
                 <w:szCs w:val="19"/>
               </w:rPr>
-              <w:t xml:space="preserve">15 October 2026</w:t>
+              <w:t xml:space="preserve">17 October 2026</w:t>
             </w:r>
           </w:p>
         </w:tc>
@@ -322,7 +322,7 @@
                 <w:sz w:val="19"/>
                 <w:szCs w:val="19"/>
               </w:rPr>
-              <w:t xml:space="preserve">Sprints 01, 02, 03, 04, 05 accepted · Sprint 06 Reservation calendar in progress</w:t>
+              <w:t xml:space="preserve">Sprints 01, 02, 03, 04, 05, 06 accepted · Sprint 07 Front desk — arrivals, departures, in-house, check-in/out in progress</w:t>
             </w:r>
           </w:p>
         </w:tc>
@@ -661,7 +661,7 @@
                 <w:sz w:val="19"/>
                 <w:szCs w:val="19"/>
               </w:rPr>
-              <w:t xml:space="preserve">1.5</w:t>
+              <w:t xml:space="preserve">1.6</w:t>
             </w:r>
           </w:p>
         </w:tc>
@@ -691,7 +691,7 @@
                 <w:sz w:val="19"/>
                 <w:szCs w:val="19"/>
               </w:rPr>
-              <w:t xml:space="preserve">2026-10-15</w:t>
+              <w:t xml:space="preserve">2026-10-17</w:t>
             </w:r>
           </w:p>
         </w:tc>
@@ -721,7 +721,7 @@
                 <w:sz w:val="19"/>
                 <w:szCs w:val="19"/>
               </w:rPr>
-              <w:t xml:space="preserve">Sprint 05 (Availability engine and reservations) accepted: race-free booking, booking wizard, booking history, date pickers. Diagrams of the reservation tables and the booking flow. Sprint 06 (Reservation calendar) started.</w:t>
+              <w:t xml:space="preserve">Sprint 06 (Reservation calendar) accepted: day, week and month calendar of rooms and dorm beds, moving a guest by drag-and-drop with a reason, list by day on phones. Room-move flow diagram. Sprint 07 (Front desk) started.</w:t>
             </w:r>
           </w:p>
         </w:tc>
@@ -757,7 +757,7 @@
                 <w:sz w:val="19"/>
                 <w:szCs w:val="19"/>
               </w:rPr>
-              <w:t xml:space="preserve">1.4</w:t>
+              <w:t xml:space="preserve">1.5</w:t>
             </w:r>
           </w:p>
         </w:tc>
@@ -788,7 +788,7 @@
                 <w:sz w:val="19"/>
                 <w:szCs w:val="19"/>
               </w:rPr>
-              <w:t xml:space="preserve">2026-10-14</w:t>
+              <w:t xml:space="preserve">2026-10-15</w:t>
             </w:r>
           </w:p>
         </w:tc>
@@ -819,7 +819,7 @@
                 <w:sz w:val="19"/>
                 <w:szCs w:val="19"/>
               </w:rPr>
-              <w:t xml:space="preserve">Sprint 04 (Rate plans and packages) accepted: nightly price grid, quotes, packages with revenue split. Sprint 05 (Availability engine and reservations) started.</w:t>
+              <w:t xml:space="preserve">Sprint 05 (Availability engine and reservations) accepted: race-free booking, booking wizard, booking history, date pickers. Diagrams of the reservation tables and the booking flow. Sprint 06 (Reservation calendar) started.</w:t>
             </w:r>
           </w:p>
         </w:tc>
@@ -854,7 +854,7 @@
                 <w:sz w:val="19"/>
                 <w:szCs w:val="19"/>
               </w:rPr>
-              <w:t xml:space="preserve">1.3</w:t>
+              <w:t xml:space="preserve">1.4</w:t>
             </w:r>
           </w:p>
         </w:tc>
@@ -884,7 +884,7 @@
                 <w:sz w:val="19"/>
                 <w:szCs w:val="19"/>
               </w:rPr>
-              <w:t xml:space="preserve">2026-10-11</w:t>
+              <w:t xml:space="preserve">2026-10-14</w:t>
             </w:r>
           </w:p>
         </w:tc>
@@ -914,7 +914,7 @@
                 <w:sz w:val="19"/>
                 <w:szCs w:val="19"/>
               </w:rPr>
-              <w:t xml:space="preserve">Sprint 03 (Guests) accepted, with review fixes: Aadhaar number check and error messages that say why. Sprint 04 (Rate plans and packages) started.</w:t>
+              <w:t xml:space="preserve">Sprint 04 (Rate plans and packages) accepted: nightly price grid, quotes, packages with revenue split. Sprint 05 (Availability engine and reservations) started.</w:t>
             </w:r>
           </w:p>
         </w:tc>
@@ -950,7 +950,7 @@
                 <w:sz w:val="19"/>
                 <w:szCs w:val="19"/>
               </w:rPr>
-              <w:t xml:space="preserve">1.2.1</w:t>
+              <w:t xml:space="preserve">1.3</w:t>
             </w:r>
           </w:p>
         </w:tc>
@@ -981,7 +981,7 @@
                 <w:sz w:val="19"/>
                 <w:szCs w:val="19"/>
               </w:rPr>
-              <w:t xml:space="preserve">2026-10-10</w:t>
+              <w:t xml:space="preserve">2026-10-11</w:t>
             </w:r>
           </w:p>
         </w:tc>
@@ -1012,7 +1012,7 @@
                 <w:sz w:val="19"/>
                 <w:szCs w:val="19"/>
               </w:rPr>
-              <w:t xml:space="preserve">Sprint 03 (Guests) built and in review: guest profiles, encrypted ID documents, duplicates, merge, anonymise, consent.</w:t>
+              <w:t xml:space="preserve">Sprint 03 (Guests) accepted, with review fixes: Aadhaar number check and error messages that say why. Sprint 04 (Rate plans and packages) started.</w:t>
             </w:r>
           </w:p>
         </w:tc>
@@ -1047,6 +1047,102 @@
                 <w:sz w:val="19"/>
                 <w:szCs w:val="19"/>
               </w:rPr>
+              <w:t xml:space="preserve">1.2.1</w:t>
+            </w:r>
+          </w:p>
+        </w:tc>
+        <w:tc>
+          <w:tcPr>
+            <w:tcW w:type="dxa" w:w="1500"/>
+            <w:tcBorders>
+              <w:top w:val="single" w:color="DCE3E1" w:sz="4"/>
+              <w:left w:val="single" w:color="DCE3E1" w:sz="4"/>
+              <w:bottom w:val="single" w:color="DCE3E1" w:sz="4"/>
+              <w:right w:val="single" w:color="DCE3E1" w:sz="4"/>
+            </w:tcBorders>
+            <w:tcMar>
+              <w:top w:type="dxa" w:w="70"/>
+              <w:left w:type="dxa" w:w="110"/>
+              <w:bottom w:type="dxa" w:w="50"/>
+              <w:right w:type="dxa" w:w="110"/>
+            </w:tcMar>
+            <w:vAlign w:val="top"/>
+          </w:tcPr>
+          <w:p>
+            <w:pPr>
+              <w:spacing w:after="40" w:line="252" w:lineRule="auto"/>
+            </w:pPr>
+            <w:r>
+              <w:rPr>
+                <w:sz w:val="19"/>
+                <w:szCs w:val="19"/>
+              </w:rPr>
+              <w:t xml:space="preserve">2026-10-10</w:t>
+            </w:r>
+          </w:p>
+        </w:tc>
+        <w:tc>
+          <w:tcPr>
+            <w:tcW w:type="dxa" w:w="6714"/>
+            <w:tcBorders>
+              <w:top w:val="single" w:color="DCE3E1" w:sz="4"/>
+              <w:left w:val="single" w:color="DCE3E1" w:sz="4"/>
+              <w:bottom w:val="single" w:color="DCE3E1" w:sz="4"/>
+              <w:right w:val="single" w:color="DCE3E1" w:sz="4"/>
+            </w:tcBorders>
+            <w:tcMar>
+              <w:top w:type="dxa" w:w="70"/>
+              <w:left w:type="dxa" w:w="110"/>
+              <w:bottom w:type="dxa" w:w="50"/>
+              <w:right w:type="dxa" w:w="110"/>
+            </w:tcMar>
+            <w:vAlign w:val="top"/>
+          </w:tcPr>
+          <w:p>
+            <w:pPr>
+              <w:spacing w:after="40" w:line="252" w:lineRule="auto"/>
+            </w:pPr>
+            <w:r>
+              <w:rPr>
+                <w:sz w:val="19"/>
+                <w:szCs w:val="19"/>
+              </w:rPr>
+              <w:t xml:space="preserve">Sprint 03 (Guests) built and in review: guest profiles, encrypted ID documents, duplicates, merge, anonymise, consent.</w:t>
+            </w:r>
+          </w:p>
+        </w:tc>
+      </w:tr>
+      <w:tr>
+        <w:trPr>
+          <w:cantSplit/>
+        </w:trPr>
+        <w:tc>
+          <w:tcPr>
+            <w:tcW w:type="dxa" w:w="1100"/>
+            <w:tcBorders>
+              <w:top w:val="single" w:color="DCE3E1" w:sz="4"/>
+              <w:left w:val="single" w:color="DCE3E1" w:sz="4"/>
+              <w:bottom w:val="single" w:color="DCE3E1" w:sz="4"/>
+              <w:right w:val="single" w:color="DCE3E1" w:sz="4"/>
+            </w:tcBorders>
+            <w:shd w:fill="F5F7F6" w:color="auto" w:val="clear"/>
+            <w:tcMar>
+              <w:top w:type="dxa" w:w="70"/>
+              <w:left w:type="dxa" w:w="110"/>
+              <w:bottom w:type="dxa" w:w="50"/>
+              <w:right w:type="dxa" w:w="110"/>
+            </w:tcMar>
+            <w:vAlign w:val="top"/>
+          </w:tcPr>
+          <w:p>
+            <w:pPr>
+              <w:spacing w:after="40" w:line="252" w:lineRule="auto"/>
+            </w:pPr>
+            <w:r>
+              <w:rPr>
+                <w:sz w:val="19"/>
+                <w:szCs w:val="19"/>
+              </w:rPr>
               <w:t xml:space="preserve">1.2</w:t>
             </w:r>
           </w:p>
@@ -1060,6 +1156,7 @@
               <w:bottom w:val="single" w:color="DCE3E1" w:sz="4"/>
               <w:right w:val="single" w:color="DCE3E1" w:sz="4"/>
             </w:tcBorders>
+            <w:shd w:fill="F5F7F6" w:color="auto" w:val="clear"/>
             <w:tcMar>
               <w:top w:type="dxa" w:w="70"/>
               <w:left w:type="dxa" w:w="110"/>
@@ -1090,6 +1187,7 @@
               <w:bottom w:val="single" w:color="DCE3E1" w:sz="4"/>
               <w:right w:val="single" w:color="DCE3E1" w:sz="4"/>
             </w:tcBorders>
+            <w:shd w:fill="F5F7F6" w:color="auto" w:val="clear"/>
             <w:tcMar>
               <w:top w:type="dxa" w:w="70"/>
               <w:left w:type="dxa" w:w="110"/>
@@ -1340,7 +1438,7 @@
                 <w:sz w:val="19"/>
                 <w:szCs w:val="19"/>
               </w:rPr>
-              <w:t xml:space="preserve">Living document, rebuilt at the end of every sprint. This edition reflects Sprint 05 accepted and Sprint 06 in progress.</w:t>
+              <w:t xml:space="preserve">Living document, rebuilt at the end of every sprint. This edition reflects Sprint 06 accepted and Sprint 07 in progress.</w:t>
             </w:r>
           </w:p>
         </w:tc>
@@ -2142,7 +2240,33 @@
           <w:sz w:val="19"/>
           <w:szCs w:val="19"/>
         </w:rPr>
-        <w:t xml:space="preserve">In progress: Sprint 06 — Reservation calendar</w:t>
+        <w:t xml:space="preserve">Sprint 06 — Reservation calendar</w:t>
+      </w:r>
+    </w:p>
+    <w:p>
+      <w:pPr>
+        <w:spacing w:after="30" w:before="0"/>
+        <w:ind w:left="420"/>
+      </w:pPr>
+      <w:r>
+        <w:rPr>
+          <w:b w:val="false"/>
+          <w:bCs w:val="false"/>
+          <w:color w:val="8A2449"/>
+          <w:sz w:val="19"/>
+          <w:szCs w:val="19"/>
+        </w:rPr>
+        <w:t xml:space="preserve">9.7  </w:t>
+      </w:r>
+      <w:r>
+        <w:rPr>
+          <w:b w:val="false"/>
+          <w:bCs w:val="false"/>
+          <w:color w:val="1B2A2E"/>
+          <w:sz w:val="19"/>
+          <w:szCs w:val="19"/>
+        </w:rPr>
+        <w:t xml:space="preserve">In progress: Sprint 07 — Front desk — arrivals, departures, in-house, check-in/out</w:t>
       </w:r>
     </w:p>
     <w:p>
@@ -2465,7 +2589,7 @@
                 <w:sz w:val="40"/>
                 <w:szCs w:val="40"/>
               </w:rPr>
-              <w:t xml:space="preserve">5 of 29</w:t>
+              <w:t xml:space="preserve">6 of 29</w:t>
             </w:r>
           </w:p>
           <w:p>
@@ -2830,7 +2954,7 @@
                 <w:sz w:val="19"/>
                 <w:szCs w:val="19"/>
               </w:rPr>
-              <w:t xml:space="preserve">Sprints 01 and 02 and 03 and 04 and 05 are delivered and accepted. Sprint 06 (Reservation calendar) is in progress.</w:t>
+              <w:t xml:space="preserve">Sprints 01 and 02 and 03 and 04 and 05 and 06 are delivered and accepted. Sprint 07 (Front desk — arrivals, departures, in-house, check-in/out) is in progress.</w:t>
             </w:r>
           </w:p>
         </w:tc>
@@ -4470,25 +4594,25 @@
               <w:bottom w:val="single" w:color="DCE3E1" w:sz="4"/>
               <w:right w:val="single" w:color="DCE3E1" w:sz="4"/>
             </w:tcBorders>
-            <w:shd w:fill="FBEFD8" w:color="auto" w:val="clear"/>
-            <w:tcMar>
-              <w:top w:type="dxa" w:w="70"/>
-              <w:left w:type="dxa" w:w="110"/>
-              <w:bottom w:type="dxa" w:w="50"/>
-              <w:right w:type="dxa" w:w="110"/>
-            </w:tcMar>
-            <w:vAlign w:val="top"/>
-          </w:tcPr>
-          <w:p>
-            <w:pPr>
-              <w:spacing w:after="40" w:line="252" w:lineRule="auto"/>
-            </w:pPr>
-            <w:r>
-              <w:rPr>
-                <w:sz w:val="19"/>
-                <w:szCs w:val="19"/>
-              </w:rPr>
-              <w:t xml:space="preserve">In progress</w:t>
+            <w:shd w:fill="E3F0E6" w:color="auto" w:val="clear"/>
+            <w:tcMar>
+              <w:top w:type="dxa" w:w="70"/>
+              <w:left w:type="dxa" w:w="110"/>
+              <w:bottom w:type="dxa" w:w="50"/>
+              <w:right w:type="dxa" w:w="110"/>
+            </w:tcMar>
+            <w:vAlign w:val="top"/>
+          </w:tcPr>
+          <w:p>
+            <w:pPr>
+              <w:spacing w:after="40" w:line="252" w:lineRule="auto"/>
+            </w:pPr>
+            <w:r>
+              <w:rPr>
+                <w:sz w:val="19"/>
+                <w:szCs w:val="19"/>
+              </w:rPr>
+              <w:t xml:space="preserve">Done</w:t>
             </w:r>
           </w:p>
         </w:tc>
@@ -4802,24 +4926,25 @@
               <w:bottom w:val="single" w:color="DCE3E1" w:sz="4"/>
               <w:right w:val="single" w:color="DCE3E1" w:sz="4"/>
             </w:tcBorders>
-            <w:tcMar>
-              <w:top w:type="dxa" w:w="70"/>
-              <w:left w:type="dxa" w:w="110"/>
-              <w:bottom w:type="dxa" w:w="50"/>
-              <w:right w:type="dxa" w:w="110"/>
-            </w:tcMar>
-            <w:vAlign w:val="top"/>
-          </w:tcPr>
-          <w:p>
-            <w:pPr>
-              <w:spacing w:after="40" w:line="252" w:lineRule="auto"/>
-            </w:pPr>
-            <w:r>
-              <w:rPr>
-                <w:sz w:val="19"/>
-                <w:szCs w:val="19"/>
-              </w:rPr>
-              <w:t xml:space="preserve">Planned</w:t>
+            <w:shd w:fill="FBEFD8" w:color="auto" w:val="clear"/>
+            <w:tcMar>
+              <w:top w:type="dxa" w:w="70"/>
+              <w:left w:type="dxa" w:w="110"/>
+              <w:bottom w:type="dxa" w:w="50"/>
+              <w:right w:type="dxa" w:w="110"/>
+            </w:tcMar>
+            <w:vAlign w:val="top"/>
+          </w:tcPr>
+          <w:p>
+            <w:pPr>
+              <w:spacing w:after="40" w:line="252" w:lineRule="auto"/>
+            </w:pPr>
+            <w:r>
+              <w:rPr>
+                <w:sz w:val="19"/>
+                <w:szCs w:val="19"/>
+              </w:rPr>
+              <w:t xml:space="preserve">In progress</w:t>
             </w:r>
           </w:p>
         </w:tc>
@@ -12191,7 +12316,7 @@
     </w:p>
     <w:p>
       <w:r>
-        <w:t xml:space="preserve">Work is delivered in short sprints, and each one ends with the owner trying the new screens and accepting them. These are the parts that are built, tested and accepted as of Sprint 05.</w:t>
+        <w:t xml:space="preserve">Work is delivered in short sprints, and each one ends with the owner trying the new screens and accepting them. These are the parts that are built, tested and accepted as of Sprint 06.</w:t>
       </w:r>
     </w:p>
     <w:p>
@@ -13543,12 +13668,273 @@
         <w:pStyle w:val="Heading2"/>
       </w:pPr>
       <w:r>
-        <w:t xml:space="preserve">9.6   In progress: Sprint 06 — Reservation calendar</w:t>
+        <w:t xml:space="preserve">9.6   Sprint 06 — Reservation calendar</w:t>
       </w:r>
     </w:p>
     <w:p>
       <w:r>
         <w:t xml:space="preserve">A calendar shows every room and bed with its bookings by day, week or month; bookings can be moved by drag-and-drop with safety checks.</w:t>
+      </w:r>
+    </w:p>
+    <w:p>
+      <w:pPr>
+        <w:pStyle w:val="ListParagraph"/>
+        <w:numPr>
+          <w:ilvl w:val="0"/>
+          <w:numId w:val="2"/>
+        </w:numPr>
+        <w:spacing w:after="60"/>
+      </w:pPr>
+      <w:r>
+        <w:t xml:space="preserve">See every room and dorm bed with its bookings and blocks by day, week or month on one calendar</w:t>
+      </w:r>
+    </w:p>
+    <w:p>
+      <w:pPr>
+        <w:pStyle w:val="ListParagraph"/>
+        <w:numPr>
+          <w:ilvl w:val="0"/>
+          <w:numId w:val="2"/>
+        </w:numPr>
+        <w:spacing w:after="60"/>
+      </w:pPr>
+      <w:r>
+        <w:t xml:space="preserve">Move a guest to another room by dragging the booking and giving a reason: two actions</w:t>
+      </w:r>
+    </w:p>
+    <w:p>
+      <w:pPr>
+        <w:pStyle w:val="ListParagraph"/>
+        <w:numPr>
+          <w:ilvl w:val="0"/>
+          <w:numId w:val="2"/>
+        </w:numPr>
+        <w:spacing w:after="60"/>
+      </w:pPr>
+      <w:r>
+        <w:t xml:space="preserve">A move onto a blocked or booked room is refused at once, with the reason</w:t>
+      </w:r>
+    </w:p>
+    <w:p>
+      <w:pPr>
+        <w:pStyle w:val="ListParagraph"/>
+        <w:numPr>
+          <w:ilvl w:val="0"/>
+          <w:numId w:val="2"/>
+        </w:numPr>
+        <w:spacing w:after="60"/>
+      </w:pPr>
+      <w:r>
+        <w:t xml:space="preserve">The price stays the same after a move, and the booking and audit trail show who moved it and why</w:t>
+      </w:r>
+    </w:p>
+    <w:p>
+      <w:pPr>
+        <w:pStyle w:val="ListParagraph"/>
+        <w:numPr>
+          <w:ilvl w:val="0"/>
+          <w:numId w:val="2"/>
+        </w:numPr>
+        <w:spacing w:after="60"/>
+      </w:pPr>
+      <w:r>
+        <w:t xml:space="preserve">On a phone the calendar becomes a list by day: arrivals, in house, departures and blocked rooms</w:t>
+      </w:r>
+    </w:p>
+    <w:p>
+      <w:pPr>
+        <w:keepNext/>
+        <w:pBdr>
+          <w:top w:val="single" w:color="DCE3E1" w:sz="4"/>
+          <w:bottom w:val="single" w:color="DCE3E1" w:sz="4"/>
+          <w:left w:val="single" w:color="DCE3E1" w:sz="4"/>
+          <w:right w:val="single" w:color="DCE3E1" w:sz="4"/>
+        </w:pBdr>
+        <w:spacing w:before="120" w:after="0" w:line="240" w:lineRule="auto"/>
+        <w:jc w:val="center"/>
+      </w:pPr>
+      <w:r>
+        <w:drawing>
+          <wp:inline distT="0" distB="0" distL="0" distR="0">
+            <wp:extent cx="5124450" cy="3438525"/>
+            <wp:effectExtent t="0" r="0" b="0" l="0"/>
+            <wp:docPr id="1" name="Calendar, week view: bookings by room and a maintenance block" descr="Calendar, week view: bookings by room and a maintenance block" title="Calendar, week view: bookings by room and a maintenance block"/>
+            <wp:cNvGraphicFramePr>
+              <a:graphicFrameLocks xmlns:a="http://schemas.openxmlformats.org/drawingml/2006/main" noChangeAspect="1"/>
+            </wp:cNvGraphicFramePr>
+            <a:graphic xmlns:a="http://schemas.openxmlformats.org/drawingml/2006/main">
+              <a:graphicData uri="http://schemas.openxmlformats.org/drawingml/2006/picture">
+                <pic:pic xmlns:pic="http://schemas.openxmlformats.org/drawingml/2006/picture">
+                  <pic:nvPicPr>
+                    <pic:cNvPr id="0" name="" descr=""/>
+                    <pic:cNvPicPr>
+                      <a:picLocks noChangeAspect="1" noChangeArrowheads="1"/>
+                    </pic:cNvPicPr>
+                  </pic:nvPicPr>
+                  <pic:blipFill>
+                    <a:blip r:embed="rId26" cstate="none"/>
+                    <a:srcRect/>
+                    <a:stretch>
+                      <a:fillRect/>
+                    </a:stretch>
+                  </pic:blipFill>
+                  <pic:spPr bwMode="auto">
+                    <a:xfrm>
+                      <a:off x="0" y="0"/>
+                      <a:ext cx="5124450" cy="3438525"/>
+                    </a:xfrm>
+                    <a:prstGeom prst="rect">
+                      <a:avLst/>
+                    </a:prstGeom>
+                  </pic:spPr>
+                </pic:pic>
+              </a:graphicData>
+            </a:graphic>
+          </wp:inline>
+        </w:drawing>
+      </w:r>
+    </w:p>
+    <w:p>
+      <w:pPr>
+        <w:pStyle w:val="Caption"/>
+      </w:pPr>
+      <w:r>
+        <w:t xml:space="preserve">Calendar, week view: bookings by room and a maintenance block</w:t>
+      </w:r>
+    </w:p>
+    <w:p>
+      <w:pPr>
+        <w:keepNext/>
+        <w:pBdr>
+          <w:top w:val="single" w:color="DCE3E1" w:sz="4"/>
+          <w:bottom w:val="single" w:color="DCE3E1" w:sz="4"/>
+          <w:left w:val="single" w:color="DCE3E1" w:sz="4"/>
+          <w:right w:val="single" w:color="DCE3E1" w:sz="4"/>
+        </w:pBdr>
+        <w:spacing w:before="120" w:after="0" w:line="240" w:lineRule="auto"/>
+        <w:jc w:val="center"/>
+      </w:pPr>
+      <w:r>
+        <w:drawing>
+          <wp:inline distT="0" distB="0" distL="0" distR="0">
+            <wp:extent cx="5124450" cy="3438525"/>
+            <wp:effectExtent t="0" r="0" b="0" l="0"/>
+            <wp:docPr id="1" name="Calendar, month view" descr="Calendar, month view" title="Calendar, month view"/>
+            <wp:cNvGraphicFramePr>
+              <a:graphicFrameLocks xmlns:a="http://schemas.openxmlformats.org/drawingml/2006/main" noChangeAspect="1"/>
+            </wp:cNvGraphicFramePr>
+            <a:graphic xmlns:a="http://schemas.openxmlformats.org/drawingml/2006/main">
+              <a:graphicData uri="http://schemas.openxmlformats.org/drawingml/2006/picture">
+                <pic:pic xmlns:pic="http://schemas.openxmlformats.org/drawingml/2006/picture">
+                  <pic:nvPicPr>
+                    <pic:cNvPr id="0" name="" descr=""/>
+                    <pic:cNvPicPr>
+                      <a:picLocks noChangeAspect="1" noChangeArrowheads="1"/>
+                    </pic:cNvPicPr>
+                  </pic:nvPicPr>
+                  <pic:blipFill>
+                    <a:blip r:embed="rId27" cstate="none"/>
+                    <a:srcRect/>
+                    <a:stretch>
+                      <a:fillRect/>
+                    </a:stretch>
+                  </pic:blipFill>
+                  <pic:spPr bwMode="auto">
+                    <a:xfrm>
+                      <a:off x="0" y="0"/>
+                      <a:ext cx="5124450" cy="3438525"/>
+                    </a:xfrm>
+                    <a:prstGeom prst="rect">
+                      <a:avLst/>
+                    </a:prstGeom>
+                  </pic:spPr>
+                </pic:pic>
+              </a:graphicData>
+            </a:graphic>
+          </wp:inline>
+        </w:drawing>
+      </w:r>
+    </w:p>
+    <w:p>
+      <w:pPr>
+        <w:pStyle w:val="Caption"/>
+      </w:pPr>
+      <w:r>
+        <w:t xml:space="preserve">Calendar, month view</w:t>
+      </w:r>
+    </w:p>
+    <w:p>
+      <w:pPr>
+        <w:keepNext/>
+        <w:pBdr>
+          <w:top w:val="single" w:color="DCE3E1" w:sz="4"/>
+          <w:bottom w:val="single" w:color="DCE3E1" w:sz="4"/>
+          <w:left w:val="single" w:color="DCE3E1" w:sz="4"/>
+          <w:right w:val="single" w:color="DCE3E1" w:sz="4"/>
+        </w:pBdr>
+        <w:spacing w:before="120" w:after="0" w:line="240" w:lineRule="auto"/>
+        <w:jc w:val="center"/>
+      </w:pPr>
+      <w:r>
+        <w:drawing>
+          <wp:inline distT="0" distB="0" distL="0" distR="0">
+            <wp:extent cx="5124450" cy="3438525"/>
+            <wp:effectExtent t="0" r="0" b="0" l="0"/>
+            <wp:docPr id="1" name="A drop onto a blocked room is refused with the reason" descr="A drop onto a blocked room is refused with the reason" title="A drop onto a blocked room is refused with the reason"/>
+            <wp:cNvGraphicFramePr>
+              <a:graphicFrameLocks xmlns:a="http://schemas.openxmlformats.org/drawingml/2006/main" noChangeAspect="1"/>
+            </wp:cNvGraphicFramePr>
+            <a:graphic xmlns:a="http://schemas.openxmlformats.org/drawingml/2006/main">
+              <a:graphicData uri="http://schemas.openxmlformats.org/drawingml/2006/picture">
+                <pic:pic xmlns:pic="http://schemas.openxmlformats.org/drawingml/2006/picture">
+                  <pic:nvPicPr>
+                    <pic:cNvPr id="0" name="" descr=""/>
+                    <pic:cNvPicPr>
+                      <a:picLocks noChangeAspect="1" noChangeArrowheads="1"/>
+                    </pic:cNvPicPr>
+                  </pic:nvPicPr>
+                  <pic:blipFill>
+                    <a:blip r:embed="rId28" cstate="none"/>
+                    <a:srcRect/>
+                    <a:stretch>
+                      <a:fillRect/>
+                    </a:stretch>
+                  </pic:blipFill>
+                  <pic:spPr bwMode="auto">
+                    <a:xfrm>
+                      <a:off x="0" y="0"/>
+                      <a:ext cx="5124450" cy="3438525"/>
+                    </a:xfrm>
+                    <a:prstGeom prst="rect">
+                      <a:avLst/>
+                    </a:prstGeom>
+                  </pic:spPr>
+                </pic:pic>
+              </a:graphicData>
+            </a:graphic>
+          </wp:inline>
+        </w:drawing>
+      </w:r>
+    </w:p>
+    <w:p>
+      <w:pPr>
+        <w:pStyle w:val="Caption"/>
+      </w:pPr>
+      <w:r>
+        <w:t xml:space="preserve">A drop onto a blocked room is refused with the reason</w:t>
+      </w:r>
+    </w:p>
+    <w:p>
+      <w:pPr>
+        <w:pStyle w:val="Heading2"/>
+      </w:pPr>
+      <w:r>
+        <w:t xml:space="preserve">9.7   In progress: Sprint 07 — Front desk — arrivals, departures, in-house, check-in/out</w:t>
+      </w:r>
+    </w:p>
+    <w:p>
+      <w:r>
+        <w:t xml:space="preserve">Reception checks guests in and out in a few clicks, with today's arrivals, departures and in-house guests on one screen.</w:t>
       </w:r>
     </w:p>
     <w:p>
@@ -13561,7 +13947,7 @@
           <w:sz w:val="18"/>
           <w:szCs w:val="18"/>
         </w:rPr>
-        <w:t xml:space="preserve">It will be accepted when: Reception moves a guest from 102 to 103 in two actions; the audit trail shows who/why.</w:t>
+        <w:t xml:space="preserve">It will be accepted when: Walk-in to checked-in in ≤ 3 screens.</w:t>
       </w:r>
     </w:p>
     <w:p>
@@ -16146,7 +16532,7 @@
               <w:bottom w:val="single" w:color="DCE3E1" w:sz="4"/>
               <w:right w:val="single" w:color="DCE3E1" w:sz="4"/>
             </w:tcBorders>
-            <w:shd w:fill="FBEFD8" w:color="auto" w:val="clear"/>
+            <w:shd w:fill="E3F0E6" w:color="auto" w:val="clear"/>
             <w:tcMar>
               <w:top w:type="dxa" w:w="70"/>
               <w:left w:type="dxa" w:w="110"/>
@@ -16164,7 +16550,7 @@
                 <w:sz w:val="17"/>
                 <w:szCs w:val="17"/>
               </w:rPr>
-              <w:t xml:space="preserve">In progress</w:t>
+              <w:t xml:space="preserve">Done</w:t>
             </w:r>
           </w:p>
         </w:tc>
@@ -16272,6 +16658,7 @@
               <w:bottom w:val="single" w:color="DCE3E1" w:sz="4"/>
               <w:right w:val="single" w:color="DCE3E1" w:sz="4"/>
             </w:tcBorders>
+            <w:shd w:fill="FBEFD8" w:color="auto" w:val="clear"/>
             <w:tcMar>
               <w:top w:type="dxa" w:w="70"/>
               <w:left w:type="dxa" w:w="110"/>
@@ -16289,7 +16676,7 @@
                 <w:sz w:val="17"/>
                 <w:szCs w:val="17"/>
               </w:rPr>
-              <w:t xml:space="preserve">Planned</w:t>
+              <w:t xml:space="preserve">In progress</w:t>
             </w:r>
           </w:p>
         </w:tc>
@@ -19092,7 +19479,7 @@
                     </pic:cNvPicPr>
                   </pic:nvPicPr>
                   <pic:blipFill>
-                    <a:blip r:embed="rId26" cstate="none"/>
+                    <a:blip r:embed="rId29" cstate="none"/>
                     <a:srcRect/>
                     <a:stretch>
                       <a:fillRect/>
@@ -19199,7 +19586,7 @@
         <w:t xml:space="preserve">Tests that grow with the system.</w:t>
       </w:r>
       <w:r>
-        <w:t xml:space="preserve"> As of Sprint 05: 129 server test methods, 44 screen tests and 52 end-to-end browser steps, all passing.</w:t>
+        <w:t xml:space="preserve"> As of Sprint 06: 137 server test methods, 54 screen tests and 60 end-to-end browser steps, all passing.</w:t>
       </w:r>
     </w:p>
     <w:p>
@@ -21086,7 +21473,7 @@
         <w:sz w:val="16"/>
         <w:szCs w:val="16"/>
       </w:rPr>
-      <w:t xml:space="preserve">Version 1.5 · 15 October 2026</w:t>
+      <w:t xml:space="preserve">Version 1.6 · 17 October 2026</w:t>
     </w:r>
     <w:r>
       <w:rPr>

</xml_diff>

<commit_message>
chore(sprints): accept Sprint 07
Sprint 07 (front desk) accepted by the owner on 18 Oct 2026; Sprint 08 (folio) in progress; handbooks 1.7.

Co-Authored-By: Claude Opus 5.5 (1M context) <noreply@anthropic.com>
Claude-Session: https://claude.ai/code/session_01VmVJNB9ZeJS5YSh2h1qDUf
</commit_message>
<xml_diff>
--- a/docs/handbooks/Resort-OS-Product-Overview.docx
+++ b/docs/handbooks/Resort-OS-Product-Overview.docx
@@ -182,7 +182,7 @@
                 <w:sz w:val="19"/>
                 <w:szCs w:val="19"/>
               </w:rPr>
-              <w:t xml:space="preserve">Version 1.6</w:t>
+              <w:t xml:space="preserve">Version 1.7</w:t>
             </w:r>
           </w:p>
         </w:tc>
@@ -252,7 +252,7 @@
                 <w:sz w:val="19"/>
                 <w:szCs w:val="19"/>
               </w:rPr>
-              <w:t xml:space="preserve">17 October 2026</w:t>
+              <w:t xml:space="preserve">18 October 2026</w:t>
             </w:r>
           </w:p>
         </w:tc>
@@ -322,7 +322,7 @@
                 <w:sz w:val="19"/>
                 <w:szCs w:val="19"/>
               </w:rPr>
-              <w:t xml:space="preserve">Sprints 01, 02, 03, 04, 05, 06 accepted · Sprint 07 Front desk — arrivals, departures, in-house, check-in/out in progress</w:t>
+              <w:t xml:space="preserve">Sprints 01, 02, 03, 04, 05, 06, 07 accepted · Sprint 08 Folio in progress</w:t>
             </w:r>
           </w:p>
         </w:tc>
@@ -661,7 +661,7 @@
                 <w:sz w:val="19"/>
                 <w:szCs w:val="19"/>
               </w:rPr>
-              <w:t xml:space="preserve">1.6</w:t>
+              <w:t xml:space="preserve">1.7</w:t>
             </w:r>
           </w:p>
         </w:tc>
@@ -691,7 +691,7 @@
                 <w:sz w:val="19"/>
                 <w:szCs w:val="19"/>
               </w:rPr>
-              <w:t xml:space="preserve">2026-10-17</w:t>
+              <w:t xml:space="preserve">2026-10-18</w:t>
             </w:r>
           </w:p>
         </w:tc>
@@ -721,7 +721,7 @@
                 <w:sz w:val="19"/>
                 <w:szCs w:val="19"/>
               </w:rPr>
-              <w:t xml:space="preserve">Sprint 06 (Reservation calendar) accepted: day, week and month calendar of rooms and dorm beds, moving a guest by drag-and-drop with a reason, list by day on phones. Room-move flow diagram. Sprint 07 (Front desk) started.</w:t>
+              <w:t xml:space="preserve">Sprint 07 (Front desk) accepted: arrivals, departures and in-house lists, check-in and check-out in a few clicks, walk-ins on one screen, early departures with a reason, rooms marked dirty and ready. Check-in flow diagram. Sprint 08 (Folio) started.</w:t>
             </w:r>
           </w:p>
         </w:tc>
@@ -757,7 +757,7 @@
                 <w:sz w:val="19"/>
                 <w:szCs w:val="19"/>
               </w:rPr>
-              <w:t xml:space="preserve">1.5</w:t>
+              <w:t xml:space="preserve">1.6</w:t>
             </w:r>
           </w:p>
         </w:tc>
@@ -788,7 +788,7 @@
                 <w:sz w:val="19"/>
                 <w:szCs w:val="19"/>
               </w:rPr>
-              <w:t xml:space="preserve">2026-10-15</w:t>
+              <w:t xml:space="preserve">2026-10-17</w:t>
             </w:r>
           </w:p>
         </w:tc>
@@ -819,7 +819,7 @@
                 <w:sz w:val="19"/>
                 <w:szCs w:val="19"/>
               </w:rPr>
-              <w:t xml:space="preserve">Sprint 05 (Availability engine and reservations) accepted: race-free booking, booking wizard, booking history, date pickers. Diagrams of the reservation tables and the booking flow. Sprint 06 (Reservation calendar) started.</w:t>
+              <w:t xml:space="preserve">Sprint 06 (Reservation calendar) accepted: day, week and month calendar of rooms and dorm beds, moving a guest by drag-and-drop with a reason, list by day on phones. Room-move flow diagram. Sprint 07 (Front desk) started.</w:t>
             </w:r>
           </w:p>
         </w:tc>
@@ -854,7 +854,7 @@
                 <w:sz w:val="19"/>
                 <w:szCs w:val="19"/>
               </w:rPr>
-              <w:t xml:space="preserve">1.4</w:t>
+              <w:t xml:space="preserve">1.5</w:t>
             </w:r>
           </w:p>
         </w:tc>
@@ -884,7 +884,7 @@
                 <w:sz w:val="19"/>
                 <w:szCs w:val="19"/>
               </w:rPr>
-              <w:t xml:space="preserve">2026-10-14</w:t>
+              <w:t xml:space="preserve">2026-10-15</w:t>
             </w:r>
           </w:p>
         </w:tc>
@@ -914,7 +914,7 @@
                 <w:sz w:val="19"/>
                 <w:szCs w:val="19"/>
               </w:rPr>
-              <w:t xml:space="preserve">Sprint 04 (Rate plans and packages) accepted: nightly price grid, quotes, packages with revenue split. Sprint 05 (Availability engine and reservations) started.</w:t>
+              <w:t xml:space="preserve">Sprint 05 (Availability engine and reservations) accepted: race-free booking, booking wizard, booking history, date pickers. Diagrams of the reservation tables and the booking flow. Sprint 06 (Reservation calendar) started.</w:t>
             </w:r>
           </w:p>
         </w:tc>
@@ -950,7 +950,7 @@
                 <w:sz w:val="19"/>
                 <w:szCs w:val="19"/>
               </w:rPr>
-              <w:t xml:space="preserve">1.3</w:t>
+              <w:t xml:space="preserve">1.4</w:t>
             </w:r>
           </w:p>
         </w:tc>
@@ -981,7 +981,7 @@
                 <w:sz w:val="19"/>
                 <w:szCs w:val="19"/>
               </w:rPr>
-              <w:t xml:space="preserve">2026-10-11</w:t>
+              <w:t xml:space="preserve">2026-10-14</w:t>
             </w:r>
           </w:p>
         </w:tc>
@@ -1012,7 +1012,7 @@
                 <w:sz w:val="19"/>
                 <w:szCs w:val="19"/>
               </w:rPr>
-              <w:t xml:space="preserve">Sprint 03 (Guests) accepted, with review fixes: Aadhaar number check and error messages that say why. Sprint 04 (Rate plans and packages) started.</w:t>
+              <w:t xml:space="preserve">Sprint 04 (Rate plans and packages) accepted: nightly price grid, quotes, packages with revenue split. Sprint 05 (Availability engine and reservations) started.</w:t>
             </w:r>
           </w:p>
         </w:tc>
@@ -1047,7 +1047,7 @@
                 <w:sz w:val="19"/>
                 <w:szCs w:val="19"/>
               </w:rPr>
-              <w:t xml:space="preserve">1.2.1</w:t>
+              <w:t xml:space="preserve">1.3</w:t>
             </w:r>
           </w:p>
         </w:tc>
@@ -1077,7 +1077,7 @@
                 <w:sz w:val="19"/>
                 <w:szCs w:val="19"/>
               </w:rPr>
-              <w:t xml:space="preserve">2026-10-10</w:t>
+              <w:t xml:space="preserve">2026-10-11</w:t>
             </w:r>
           </w:p>
         </w:tc>
@@ -1107,7 +1107,7 @@
                 <w:sz w:val="19"/>
                 <w:szCs w:val="19"/>
               </w:rPr>
-              <w:t xml:space="preserve">Sprint 03 (Guests) built and in review: guest profiles, encrypted ID documents, duplicates, merge, anonymise, consent.</w:t>
+              <w:t xml:space="preserve">Sprint 03 (Guests) accepted, with review fixes: Aadhaar number check and error messages that say why. Sprint 04 (Rate plans and packages) started.</w:t>
             </w:r>
           </w:p>
         </w:tc>
@@ -1143,6 +1143,103 @@
                 <w:sz w:val="19"/>
                 <w:szCs w:val="19"/>
               </w:rPr>
+              <w:t xml:space="preserve">1.2.1</w:t>
+            </w:r>
+          </w:p>
+        </w:tc>
+        <w:tc>
+          <w:tcPr>
+            <w:tcW w:type="dxa" w:w="1500"/>
+            <w:tcBorders>
+              <w:top w:val="single" w:color="DCE3E1" w:sz="4"/>
+              <w:left w:val="single" w:color="DCE3E1" w:sz="4"/>
+              <w:bottom w:val="single" w:color="DCE3E1" w:sz="4"/>
+              <w:right w:val="single" w:color="DCE3E1" w:sz="4"/>
+            </w:tcBorders>
+            <w:shd w:fill="F5F7F6" w:color="auto" w:val="clear"/>
+            <w:tcMar>
+              <w:top w:type="dxa" w:w="70"/>
+              <w:left w:type="dxa" w:w="110"/>
+              <w:bottom w:type="dxa" w:w="50"/>
+              <w:right w:type="dxa" w:w="110"/>
+            </w:tcMar>
+            <w:vAlign w:val="top"/>
+          </w:tcPr>
+          <w:p>
+            <w:pPr>
+              <w:spacing w:after="40" w:line="252" w:lineRule="auto"/>
+            </w:pPr>
+            <w:r>
+              <w:rPr>
+                <w:sz w:val="19"/>
+                <w:szCs w:val="19"/>
+              </w:rPr>
+              <w:t xml:space="preserve">2026-10-10</w:t>
+            </w:r>
+          </w:p>
+        </w:tc>
+        <w:tc>
+          <w:tcPr>
+            <w:tcW w:type="dxa" w:w="6714"/>
+            <w:tcBorders>
+              <w:top w:val="single" w:color="DCE3E1" w:sz="4"/>
+              <w:left w:val="single" w:color="DCE3E1" w:sz="4"/>
+              <w:bottom w:val="single" w:color="DCE3E1" w:sz="4"/>
+              <w:right w:val="single" w:color="DCE3E1" w:sz="4"/>
+            </w:tcBorders>
+            <w:shd w:fill="F5F7F6" w:color="auto" w:val="clear"/>
+            <w:tcMar>
+              <w:top w:type="dxa" w:w="70"/>
+              <w:left w:type="dxa" w:w="110"/>
+              <w:bottom w:type="dxa" w:w="50"/>
+              <w:right w:type="dxa" w:w="110"/>
+            </w:tcMar>
+            <w:vAlign w:val="top"/>
+          </w:tcPr>
+          <w:p>
+            <w:pPr>
+              <w:spacing w:after="40" w:line="252" w:lineRule="auto"/>
+            </w:pPr>
+            <w:r>
+              <w:rPr>
+                <w:sz w:val="19"/>
+                <w:szCs w:val="19"/>
+              </w:rPr>
+              <w:t xml:space="preserve">Sprint 03 (Guests) built and in review: guest profiles, encrypted ID documents, duplicates, merge, anonymise, consent.</w:t>
+            </w:r>
+          </w:p>
+        </w:tc>
+      </w:tr>
+      <w:tr>
+        <w:trPr>
+          <w:cantSplit/>
+        </w:trPr>
+        <w:tc>
+          <w:tcPr>
+            <w:tcW w:type="dxa" w:w="1100"/>
+            <w:tcBorders>
+              <w:top w:val="single" w:color="DCE3E1" w:sz="4"/>
+              <w:left w:val="single" w:color="DCE3E1" w:sz="4"/>
+              <w:bottom w:val="single" w:color="DCE3E1" w:sz="4"/>
+              <w:right w:val="single" w:color="DCE3E1" w:sz="4"/>
+            </w:tcBorders>
+            <w:tcMar>
+              <w:top w:type="dxa" w:w="70"/>
+              <w:left w:type="dxa" w:w="110"/>
+              <w:bottom w:type="dxa" w:w="50"/>
+              <w:right w:type="dxa" w:w="110"/>
+            </w:tcMar>
+            <w:vAlign w:val="top"/>
+          </w:tcPr>
+          <w:p>
+            <w:pPr>
+              <w:spacing w:after="40" w:line="252" w:lineRule="auto"/>
+            </w:pPr>
+            <w:r>
+              <w:rPr>
+                <w:sz w:val="19"/>
+                <w:szCs w:val="19"/>
+              </w:rPr>
               <w:t xml:space="preserve">1.2</w:t>
             </w:r>
           </w:p>
@@ -1156,7 +1253,6 @@
               <w:bottom w:val="single" w:color="DCE3E1" w:sz="4"/>
               <w:right w:val="single" w:color="DCE3E1" w:sz="4"/>
             </w:tcBorders>
-            <w:shd w:fill="F5F7F6" w:color="auto" w:val="clear"/>
             <w:tcMar>
               <w:top w:type="dxa" w:w="70"/>
               <w:left w:type="dxa" w:w="110"/>
@@ -1187,7 +1283,6 @@
               <w:bottom w:val="single" w:color="DCE3E1" w:sz="4"/>
               <w:right w:val="single" w:color="DCE3E1" w:sz="4"/>
             </w:tcBorders>
-            <w:shd w:fill="F5F7F6" w:color="auto" w:val="clear"/>
             <w:tcMar>
               <w:top w:type="dxa" w:w="70"/>
               <w:left w:type="dxa" w:w="110"/>
@@ -1438,7 +1533,7 @@
                 <w:sz w:val="19"/>
                 <w:szCs w:val="19"/>
               </w:rPr>
-              <w:t xml:space="preserve">Living document, rebuilt at the end of every sprint. This edition reflects Sprint 06 accepted and Sprint 07 in progress.</w:t>
+              <w:t xml:space="preserve">Living document, rebuilt at the end of every sprint. This edition reflects Sprint 07 accepted and Sprint 08 in progress.</w:t>
             </w:r>
           </w:p>
         </w:tc>
@@ -2266,7 +2361,33 @@
           <w:sz w:val="19"/>
           <w:szCs w:val="19"/>
         </w:rPr>
-        <w:t xml:space="preserve">In progress: Sprint 07 — Front desk — arrivals, departures, in-house, check-in/out</w:t>
+        <w:t xml:space="preserve">Sprint 07 — Front desk</w:t>
+      </w:r>
+    </w:p>
+    <w:p>
+      <w:pPr>
+        <w:spacing w:after="30" w:before="0"/>
+        <w:ind w:left="420"/>
+      </w:pPr>
+      <w:r>
+        <w:rPr>
+          <w:b w:val="false"/>
+          <w:bCs w:val="false"/>
+          <w:color w:val="8A2449"/>
+          <w:sz w:val="19"/>
+          <w:szCs w:val="19"/>
+        </w:rPr>
+        <w:t xml:space="preserve">9.8  </w:t>
+      </w:r>
+      <w:r>
+        <w:rPr>
+          <w:b w:val="false"/>
+          <w:bCs w:val="false"/>
+          <w:color w:val="1B2A2E"/>
+          <w:sz w:val="19"/>
+          <w:szCs w:val="19"/>
+        </w:rPr>
+        <w:t xml:space="preserve">In progress: Sprint 08 — Folio</w:t>
       </w:r>
     </w:p>
     <w:p>
@@ -2589,7 +2710,7 @@
                 <w:sz w:val="40"/>
                 <w:szCs w:val="40"/>
               </w:rPr>
-              <w:t xml:space="preserve">6 of 29</w:t>
+              <w:t xml:space="preserve">7 of 29</w:t>
             </w:r>
           </w:p>
           <w:p>
@@ -2954,7 +3075,7 @@
                 <w:sz w:val="19"/>
                 <w:szCs w:val="19"/>
               </w:rPr>
-              <w:t xml:space="preserve">Sprints 01 and 02 and 03 and 04 and 05 and 06 are delivered and accepted. Sprint 07 (Front desk — arrivals, departures, in-house, check-in/out) is in progress.</w:t>
+              <w:t xml:space="preserve">Sprints 01 and 02 and 03 and 04 and 05 and 06 and 07 are delivered and accepted. Sprint 08 (Folio) is in progress.</w:t>
             </w:r>
           </w:p>
         </w:tc>
@@ -4926,25 +5047,25 @@
               <w:bottom w:val="single" w:color="DCE3E1" w:sz="4"/>
               <w:right w:val="single" w:color="DCE3E1" w:sz="4"/>
             </w:tcBorders>
-            <w:shd w:fill="FBEFD8" w:color="auto" w:val="clear"/>
-            <w:tcMar>
-              <w:top w:type="dxa" w:w="70"/>
-              <w:left w:type="dxa" w:w="110"/>
-              <w:bottom w:type="dxa" w:w="50"/>
-              <w:right w:type="dxa" w:w="110"/>
-            </w:tcMar>
-            <w:vAlign w:val="top"/>
-          </w:tcPr>
-          <w:p>
-            <w:pPr>
-              <w:spacing w:after="40" w:line="252" w:lineRule="auto"/>
-            </w:pPr>
-            <w:r>
-              <w:rPr>
-                <w:sz w:val="19"/>
-                <w:szCs w:val="19"/>
-              </w:rPr>
-              <w:t xml:space="preserve">In progress</w:t>
+            <w:shd w:fill="E3F0E6" w:color="auto" w:val="clear"/>
+            <w:tcMar>
+              <w:top w:type="dxa" w:w="70"/>
+              <w:left w:type="dxa" w:w="110"/>
+              <w:bottom w:type="dxa" w:w="50"/>
+              <w:right w:type="dxa" w:w="110"/>
+            </w:tcMar>
+            <w:vAlign w:val="top"/>
+          </w:tcPr>
+          <w:p>
+            <w:pPr>
+              <w:spacing w:after="40" w:line="252" w:lineRule="auto"/>
+            </w:pPr>
+            <w:r>
+              <w:rPr>
+                <w:sz w:val="19"/>
+                <w:szCs w:val="19"/>
+              </w:rPr>
+              <w:t xml:space="preserve">Done</w:t>
             </w:r>
           </w:p>
         </w:tc>
@@ -5162,24 +5283,25 @@
               <w:bottom w:val="single" w:color="DCE3E1" w:sz="4"/>
               <w:right w:val="single" w:color="DCE3E1" w:sz="4"/>
             </w:tcBorders>
-            <w:tcMar>
-              <w:top w:type="dxa" w:w="70"/>
-              <w:left w:type="dxa" w:w="110"/>
-              <w:bottom w:type="dxa" w:w="50"/>
-              <w:right w:type="dxa" w:w="110"/>
-            </w:tcMar>
-            <w:vAlign w:val="top"/>
-          </w:tcPr>
-          <w:p>
-            <w:pPr>
-              <w:spacing w:after="40" w:line="252" w:lineRule="auto"/>
-            </w:pPr>
-            <w:r>
-              <w:rPr>
-                <w:sz w:val="19"/>
-                <w:szCs w:val="19"/>
-              </w:rPr>
-              <w:t xml:space="preserve">Planned</w:t>
+            <w:shd w:fill="FBEFD8" w:color="auto" w:val="clear"/>
+            <w:tcMar>
+              <w:top w:type="dxa" w:w="70"/>
+              <w:left w:type="dxa" w:w="110"/>
+              <w:bottom w:type="dxa" w:w="50"/>
+              <w:right w:type="dxa" w:w="110"/>
+            </w:tcMar>
+            <w:vAlign w:val="top"/>
+          </w:tcPr>
+          <w:p>
+            <w:pPr>
+              <w:spacing w:after="40" w:line="252" w:lineRule="auto"/>
+            </w:pPr>
+            <w:r>
+              <w:rPr>
+                <w:sz w:val="19"/>
+                <w:szCs w:val="19"/>
+              </w:rPr>
+              <w:t xml:space="preserve">In progress</w:t>
             </w:r>
           </w:p>
         </w:tc>
@@ -12316,7 +12438,7 @@
     </w:p>
     <w:p>
       <w:r>
-        <w:t xml:space="preserve">Work is delivered in short sprints, and each one ends with the owner trying the new screens and accepting them. These are the parts that are built, tested and accepted as of Sprint 06.</w:t>
+        <w:t xml:space="preserve">Work is delivered in short sprints, and each one ends with the owner trying the new screens and accepting them. These are the parts that are built, tested and accepted as of Sprint 07.</w:t>
       </w:r>
     </w:p>
     <w:p>
@@ -13929,12 +14051,286 @@
         <w:pStyle w:val="Heading2"/>
       </w:pPr>
       <w:r>
-        <w:t xml:space="preserve">9.7   In progress: Sprint 07 — Front desk — arrivals, departures, in-house, check-in/out</w:t>
+        <w:t xml:space="preserve">9.7   Sprint 07 — Front desk</w:t>
       </w:r>
     </w:p>
     <w:p>
       <w:r>
         <w:t xml:space="preserve">Reception checks guests in and out in a few clicks, with today's arrivals, departures and in-house guests on one screen.</w:t>
+      </w:r>
+    </w:p>
+    <w:p>
+      <w:pPr>
+        <w:pStyle w:val="ListParagraph"/>
+        <w:numPr>
+          <w:ilvl w:val="0"/>
+          <w:numId w:val="2"/>
+        </w:numPr>
+        <w:spacing w:after="60"/>
+      </w:pPr>
+      <w:r>
+        <w:t xml:space="preserve">Today's arrivals, departures and in-house guests on one Front desk screen, with each room's cleaning state</w:t>
+      </w:r>
+    </w:p>
+    <w:p>
+      <w:pPr>
+        <w:pStyle w:val="ListParagraph"/>
+        <w:numPr>
+          <w:ilvl w:val="0"/>
+          <w:numId w:val="2"/>
+        </w:numPr>
+        <w:spacing w:after="60"/>
+      </w:pPr>
+      <w:r>
+        <w:t xml:space="preserve">Check a guest in or out in a few clicks; a room that isn't ready can still be used with a reason</w:t>
+      </w:r>
+    </w:p>
+    <w:p>
+      <w:pPr>
+        <w:pStyle w:val="ListParagraph"/>
+        <w:numPr>
+          <w:ilvl w:val="0"/>
+          <w:numId w:val="2"/>
+        </w:numPr>
+        <w:spacing w:after="60"/>
+      </w:pPr>
+      <w:r>
+        <w:t xml:space="preserve">A walk-in guest is booked and checked in from one screen</w:t>
+      </w:r>
+    </w:p>
+    <w:p>
+      <w:pPr>
+        <w:pStyle w:val="ListParagraph"/>
+        <w:numPr>
+          <w:ilvl w:val="0"/>
+          <w:numId w:val="2"/>
+        </w:numPr>
+        <w:spacing w:after="60"/>
+      </w:pPr>
+      <w:r>
+        <w:t xml:space="preserve">A guest leaving early gives a reason and the nights left are released for sale</w:t>
+      </w:r>
+    </w:p>
+    <w:p>
+      <w:pPr>
+        <w:pStyle w:val="ListParagraph"/>
+        <w:numPr>
+          <w:ilvl w:val="0"/>
+          <w:numId w:val="2"/>
+        </w:numPr>
+        <w:spacing w:after="60"/>
+      </w:pPr>
+      <w:r>
+        <w:t xml:space="preserve">Rooms become dirty at check-out and are marked ready again from the rooms board</w:t>
+      </w:r>
+    </w:p>
+    <w:p>
+      <w:pPr>
+        <w:pStyle w:val="ListParagraph"/>
+        <w:numPr>
+          <w:ilvl w:val="0"/>
+          <w:numId w:val="2"/>
+        </w:numPr>
+        <w:spacing w:after="60"/>
+      </w:pPr>
+      <w:r>
+        <w:t xml:space="preserve">'Today' is always the resort's own date (India time), never the server's</w:t>
+      </w:r>
+    </w:p>
+    <w:p>
+      <w:pPr>
+        <w:keepNext/>
+        <w:pBdr>
+          <w:top w:val="single" w:color="DCE3E1" w:sz="4"/>
+          <w:bottom w:val="single" w:color="DCE3E1" w:sz="4"/>
+          <w:left w:val="single" w:color="DCE3E1" w:sz="4"/>
+          <w:right w:val="single" w:color="DCE3E1" w:sz="4"/>
+        </w:pBdr>
+        <w:spacing w:before="120" w:after="0" w:line="240" w:lineRule="auto"/>
+        <w:jc w:val="center"/>
+      </w:pPr>
+      <w:r>
+        <w:drawing>
+          <wp:inline distT="0" distB="0" distL="0" distR="0">
+            <wp:extent cx="5124450" cy="3438525"/>
+            <wp:effectExtent t="0" r="0" b="0" l="0"/>
+            <wp:docPr id="1" name="Front desk: today's arrivals with room and cleaning state" descr="Front desk: today's arrivals with room and cleaning state" title="Front desk: today's arrivals with room and cleaning state"/>
+            <wp:cNvGraphicFramePr>
+              <a:graphicFrameLocks xmlns:a="http://schemas.openxmlformats.org/drawingml/2006/main" noChangeAspect="1"/>
+            </wp:cNvGraphicFramePr>
+            <a:graphic xmlns:a="http://schemas.openxmlformats.org/drawingml/2006/main">
+              <a:graphicData uri="http://schemas.openxmlformats.org/drawingml/2006/picture">
+                <pic:pic xmlns:pic="http://schemas.openxmlformats.org/drawingml/2006/picture">
+                  <pic:nvPicPr>
+                    <pic:cNvPr id="0" name="" descr=""/>
+                    <pic:cNvPicPr>
+                      <a:picLocks noChangeAspect="1" noChangeArrowheads="1"/>
+                    </pic:cNvPicPr>
+                  </pic:nvPicPr>
+                  <pic:blipFill>
+                    <a:blip r:embed="rId29" cstate="none"/>
+                    <a:srcRect/>
+                    <a:stretch>
+                      <a:fillRect/>
+                    </a:stretch>
+                  </pic:blipFill>
+                  <pic:spPr bwMode="auto">
+                    <a:xfrm>
+                      <a:off x="0" y="0"/>
+                      <a:ext cx="5124450" cy="3438525"/>
+                    </a:xfrm>
+                    <a:prstGeom prst="rect">
+                      <a:avLst/>
+                    </a:prstGeom>
+                  </pic:spPr>
+                </pic:pic>
+              </a:graphicData>
+            </a:graphic>
+          </wp:inline>
+        </w:drawing>
+      </w:r>
+    </w:p>
+    <w:p>
+      <w:pPr>
+        <w:pStyle w:val="Caption"/>
+      </w:pPr>
+      <w:r>
+        <w:t xml:space="preserve">Front desk: today's arrivals with room and cleaning state</w:t>
+      </w:r>
+    </w:p>
+    <w:p>
+      <w:pPr>
+        <w:keepNext/>
+        <w:pBdr>
+          <w:top w:val="single" w:color="DCE3E1" w:sz="4"/>
+          <w:bottom w:val="single" w:color="DCE3E1" w:sz="4"/>
+          <w:left w:val="single" w:color="DCE3E1" w:sz="4"/>
+          <w:right w:val="single" w:color="DCE3E1" w:sz="4"/>
+        </w:pBdr>
+        <w:spacing w:before="120" w:after="0" w:line="240" w:lineRule="auto"/>
+        <w:jc w:val="center"/>
+      </w:pPr>
+      <w:r>
+        <w:drawing>
+          <wp:inline distT="0" distB="0" distL="0" distR="0">
+            <wp:extent cx="5124450" cy="3438525"/>
+            <wp:effectExtent t="0" r="0" b="0" l="0"/>
+            <wp:docPr id="1" name="A room that isn't ready needs a reason to check in" descr="A room that isn't ready needs a reason to check in" title="A room that isn't ready needs a reason to check in"/>
+            <wp:cNvGraphicFramePr>
+              <a:graphicFrameLocks xmlns:a="http://schemas.openxmlformats.org/drawingml/2006/main" noChangeAspect="1"/>
+            </wp:cNvGraphicFramePr>
+            <a:graphic xmlns:a="http://schemas.openxmlformats.org/drawingml/2006/main">
+              <a:graphicData uri="http://schemas.openxmlformats.org/drawingml/2006/picture">
+                <pic:pic xmlns:pic="http://schemas.openxmlformats.org/drawingml/2006/picture">
+                  <pic:nvPicPr>
+                    <pic:cNvPr id="0" name="" descr=""/>
+                    <pic:cNvPicPr>
+                      <a:picLocks noChangeAspect="1" noChangeArrowheads="1"/>
+                    </pic:cNvPicPr>
+                  </pic:nvPicPr>
+                  <pic:blipFill>
+                    <a:blip r:embed="rId30" cstate="none"/>
+                    <a:srcRect/>
+                    <a:stretch>
+                      <a:fillRect/>
+                    </a:stretch>
+                  </pic:blipFill>
+                  <pic:spPr bwMode="auto">
+                    <a:xfrm>
+                      <a:off x="0" y="0"/>
+                      <a:ext cx="5124450" cy="3438525"/>
+                    </a:xfrm>
+                    <a:prstGeom prst="rect">
+                      <a:avLst/>
+                    </a:prstGeom>
+                  </pic:spPr>
+                </pic:pic>
+              </a:graphicData>
+            </a:graphic>
+          </wp:inline>
+        </w:drawing>
+      </w:r>
+    </w:p>
+    <w:p>
+      <w:pPr>
+        <w:pStyle w:val="Caption"/>
+      </w:pPr>
+      <w:r>
+        <w:t xml:space="preserve">A room that isn't ready needs a reason to check in</w:t>
+      </w:r>
+    </w:p>
+    <w:p>
+      <w:pPr>
+        <w:keepNext/>
+        <w:pBdr>
+          <w:top w:val="single" w:color="DCE3E1" w:sz="4"/>
+          <w:bottom w:val="single" w:color="DCE3E1" w:sz="4"/>
+          <w:left w:val="single" w:color="DCE3E1" w:sz="4"/>
+          <w:right w:val="single" w:color="DCE3E1" w:sz="4"/>
+        </w:pBdr>
+        <w:spacing w:before="120" w:after="0" w:line="240" w:lineRule="auto"/>
+        <w:jc w:val="center"/>
+      </w:pPr>
+      <w:r>
+        <w:drawing>
+          <wp:inline distT="0" distB="0" distL="0" distR="0">
+            <wp:extent cx="5124450" cy="3438525"/>
+            <wp:effectExtent t="0" r="0" b="0" l="0"/>
+            <wp:docPr id="1" name="Checking a guest out" descr="Checking a guest out" title="Checking a guest out"/>
+            <wp:cNvGraphicFramePr>
+              <a:graphicFrameLocks xmlns:a="http://schemas.openxmlformats.org/drawingml/2006/main" noChangeAspect="1"/>
+            </wp:cNvGraphicFramePr>
+            <a:graphic xmlns:a="http://schemas.openxmlformats.org/drawingml/2006/main">
+              <a:graphicData uri="http://schemas.openxmlformats.org/drawingml/2006/picture">
+                <pic:pic xmlns:pic="http://schemas.openxmlformats.org/drawingml/2006/picture">
+                  <pic:nvPicPr>
+                    <pic:cNvPr id="0" name="" descr=""/>
+                    <pic:cNvPicPr>
+                      <a:picLocks noChangeAspect="1" noChangeArrowheads="1"/>
+                    </pic:cNvPicPr>
+                  </pic:nvPicPr>
+                  <pic:blipFill>
+                    <a:blip r:embed="rId31" cstate="none"/>
+                    <a:srcRect/>
+                    <a:stretch>
+                      <a:fillRect/>
+                    </a:stretch>
+                  </pic:blipFill>
+                  <pic:spPr bwMode="auto">
+                    <a:xfrm>
+                      <a:off x="0" y="0"/>
+                      <a:ext cx="5124450" cy="3438525"/>
+                    </a:xfrm>
+                    <a:prstGeom prst="rect">
+                      <a:avLst/>
+                    </a:prstGeom>
+                  </pic:spPr>
+                </pic:pic>
+              </a:graphicData>
+            </a:graphic>
+          </wp:inline>
+        </w:drawing>
+      </w:r>
+    </w:p>
+    <w:p>
+      <w:pPr>
+        <w:pStyle w:val="Caption"/>
+      </w:pPr>
+      <w:r>
+        <w:t xml:space="preserve">Checking a guest out</w:t>
+      </w:r>
+    </w:p>
+    <w:p>
+      <w:pPr>
+        <w:pStyle w:val="Heading2"/>
+      </w:pPr>
+      <w:r>
+        <w:t xml:space="preserve">9.8   In progress: Sprint 08 — Folio</w:t>
+      </w:r>
+    </w:p>
+    <w:p>
+      <w:r>
+        <w:t xml:space="preserve">Every stay has one running bill (folio) that collects room charges, meals, activities and transport.</w:t>
       </w:r>
     </w:p>
     <w:p>
@@ -13947,7 +14343,7 @@
           <w:sz w:val="18"/>
           <w:szCs w:val="18"/>
         </w:rPr>
-        <w:t xml:space="preserve">It will be accepted when: Walk-in to checked-in in ≤ 3 screens.</w:t>
+        <w:t xml:space="preserve">It will be accepted when: Folio shows charges, reversals and balance; nothing can be deleted.</w:t>
       </w:r>
     </w:p>
     <w:p>
@@ -14480,25 +14876,25 @@
               <w:bottom w:val="single" w:color="DCE3E1" w:sz="4"/>
               <w:right w:val="single" w:color="DCE3E1" w:sz="4"/>
             </w:tcBorders>
-            <w:shd w:fill="FBEFD8" w:color="auto" w:val="clear"/>
-            <w:tcMar>
-              <w:top w:type="dxa" w:w="70"/>
-              <w:left w:type="dxa" w:w="110"/>
-              <w:bottom w:type="dxa" w:w="50"/>
-              <w:right w:type="dxa" w:w="110"/>
-            </w:tcMar>
-            <w:vAlign w:val="top"/>
-          </w:tcPr>
-          <w:p>
-            <w:pPr>
-              <w:spacing w:after="40" w:line="252" w:lineRule="auto"/>
-            </w:pPr>
-            <w:r>
-              <w:rPr>
-                <w:sz w:val="19"/>
-                <w:szCs w:val="19"/>
-              </w:rPr>
-              <w:t xml:space="preserve">In progress</w:t>
+            <w:shd w:fill="E3F0E6" w:color="auto" w:val="clear"/>
+            <w:tcMar>
+              <w:top w:type="dxa" w:w="70"/>
+              <w:left w:type="dxa" w:w="110"/>
+              <w:bottom w:type="dxa" w:w="50"/>
+              <w:right w:type="dxa" w:w="110"/>
+            </w:tcMar>
+            <w:vAlign w:val="top"/>
+          </w:tcPr>
+          <w:p>
+            <w:pPr>
+              <w:spacing w:after="40" w:line="252" w:lineRule="auto"/>
+            </w:pPr>
+            <w:r>
+              <w:rPr>
+                <w:sz w:val="19"/>
+                <w:szCs w:val="19"/>
+              </w:rPr>
+              <w:t xml:space="preserve">Done</w:t>
             </w:r>
           </w:p>
         </w:tc>
@@ -14606,24 +15002,25 @@
               <w:bottom w:val="single" w:color="DCE3E1" w:sz="4"/>
               <w:right w:val="single" w:color="DCE3E1" w:sz="4"/>
             </w:tcBorders>
-            <w:tcMar>
-              <w:top w:type="dxa" w:w="70"/>
-              <w:left w:type="dxa" w:w="110"/>
-              <w:bottom w:type="dxa" w:w="50"/>
-              <w:right w:type="dxa" w:w="110"/>
-            </w:tcMar>
-            <w:vAlign w:val="top"/>
-          </w:tcPr>
-          <w:p>
-            <w:pPr>
-              <w:spacing w:after="40" w:line="252" w:lineRule="auto"/>
-            </w:pPr>
-            <w:r>
-              <w:rPr>
-                <w:sz w:val="19"/>
-                <w:szCs w:val="19"/>
-              </w:rPr>
-              <w:t xml:space="preserve">Planned</w:t>
+            <w:shd w:fill="FBEFD8" w:color="auto" w:val="clear"/>
+            <w:tcMar>
+              <w:top w:type="dxa" w:w="70"/>
+              <w:left w:type="dxa" w:w="110"/>
+              <w:bottom w:type="dxa" w:w="50"/>
+              <w:right w:type="dxa" w:w="110"/>
+            </w:tcMar>
+            <w:vAlign w:val="top"/>
+          </w:tcPr>
+          <w:p>
+            <w:pPr>
+              <w:spacing w:after="40" w:line="252" w:lineRule="auto"/>
+            </w:pPr>
+            <w:r>
+              <w:rPr>
+                <w:sz w:val="19"/>
+                <w:szCs w:val="19"/>
+              </w:rPr>
+              <w:t xml:space="preserve">In progress</w:t>
             </w:r>
           </w:p>
         </w:tc>
@@ -16658,7 +17055,7 @@
               <w:bottom w:val="single" w:color="DCE3E1" w:sz="4"/>
               <w:right w:val="single" w:color="DCE3E1" w:sz="4"/>
             </w:tcBorders>
-            <w:shd w:fill="FBEFD8" w:color="auto" w:val="clear"/>
+            <w:shd w:fill="E3F0E6" w:color="auto" w:val="clear"/>
             <w:tcMar>
               <w:top w:type="dxa" w:w="70"/>
               <w:left w:type="dxa" w:w="110"/>
@@ -16676,7 +17073,7 @@
                 <w:sz w:val="17"/>
                 <w:szCs w:val="17"/>
               </w:rPr>
-              <w:t xml:space="preserve">In progress</w:t>
+              <w:t xml:space="preserve">Done</w:t>
             </w:r>
           </w:p>
         </w:tc>
@@ -16784,6 +17181,7 @@
               <w:bottom w:val="single" w:color="DCE3E1" w:sz="4"/>
               <w:right w:val="single" w:color="DCE3E1" w:sz="4"/>
             </w:tcBorders>
+            <w:shd w:fill="FBEFD8" w:color="auto" w:val="clear"/>
             <w:tcMar>
               <w:top w:type="dxa" w:w="70"/>
               <w:left w:type="dxa" w:w="110"/>
@@ -16801,7 +17199,7 @@
                 <w:sz w:val="17"/>
                 <w:szCs w:val="17"/>
               </w:rPr>
-              <w:t xml:space="preserve">Planned</w:t>
+              <w:t xml:space="preserve">In progress</w:t>
             </w:r>
           </w:p>
         </w:tc>
@@ -19479,7 +19877,7 @@
                     </pic:cNvPicPr>
                   </pic:nvPicPr>
                   <pic:blipFill>
-                    <a:blip r:embed="rId29" cstate="none"/>
+                    <a:blip r:embed="rId32" cstate="none"/>
                     <a:srcRect/>
                     <a:stretch>
                       <a:fillRect/>
@@ -19586,7 +19984,7 @@
         <w:t xml:space="preserve">Tests that grow with the system.</w:t>
       </w:r>
       <w:r>
-        <w:t xml:space="preserve"> As of Sprint 06: 137 server test methods, 54 screen tests and 60 end-to-end browser steps, all passing.</w:t>
+        <w:t xml:space="preserve"> As of Sprint 07: 157 server test methods, 59 screen tests and 69 end-to-end browser steps, all passing.</w:t>
       </w:r>
     </w:p>
     <w:p>
@@ -21473,7 +21871,7 @@
         <w:sz w:val="16"/>
         <w:szCs w:val="16"/>
       </w:rPr>
-      <w:t xml:space="preserve">Version 1.6 · 17 October 2026</w:t>
+      <w:t xml:space="preserve">Version 1.7 · 18 October 2026</w:t>
     </w:r>
     <w:r>
       <w:rPr>

</xml_diff>

<commit_message>
chore(sprints): accept Sprint 07 (#120)
Sprint 07 (front desk) accepted by the owner on 18 Oct 2026; Sprint 08 (folio) in progress; handbooks 1.7.

Co-Authored-By: Claude Opus 5.5 (1M context) <noreply@anthropic.com>
Claude-Session: https://claude.ai/code/session_01VmVJNB9ZeJS5YSh2h1qDUf
</commit_message>
<xml_diff>
--- a/docs/handbooks/Resort-OS-Product-Overview.docx
+++ b/docs/handbooks/Resort-OS-Product-Overview.docx
@@ -182,7 +182,7 @@
                 <w:sz w:val="19"/>
                 <w:szCs w:val="19"/>
               </w:rPr>
-              <w:t xml:space="preserve">Version 1.6</w:t>
+              <w:t xml:space="preserve">Version 1.7</w:t>
             </w:r>
           </w:p>
         </w:tc>
@@ -252,7 +252,7 @@
                 <w:sz w:val="19"/>
                 <w:szCs w:val="19"/>
               </w:rPr>
-              <w:t xml:space="preserve">17 October 2026</w:t>
+              <w:t xml:space="preserve">18 October 2026</w:t>
             </w:r>
           </w:p>
         </w:tc>
@@ -322,7 +322,7 @@
                 <w:sz w:val="19"/>
                 <w:szCs w:val="19"/>
               </w:rPr>
-              <w:t xml:space="preserve">Sprints 01, 02, 03, 04, 05, 06 accepted · Sprint 07 Front desk — arrivals, departures, in-house, check-in/out in progress</w:t>
+              <w:t xml:space="preserve">Sprints 01, 02, 03, 04, 05, 06, 07 accepted · Sprint 08 Folio in progress</w:t>
             </w:r>
           </w:p>
         </w:tc>
@@ -661,7 +661,7 @@
                 <w:sz w:val="19"/>
                 <w:szCs w:val="19"/>
               </w:rPr>
-              <w:t xml:space="preserve">1.6</w:t>
+              <w:t xml:space="preserve">1.7</w:t>
             </w:r>
           </w:p>
         </w:tc>
@@ -691,7 +691,7 @@
                 <w:sz w:val="19"/>
                 <w:szCs w:val="19"/>
               </w:rPr>
-              <w:t xml:space="preserve">2026-10-17</w:t>
+              <w:t xml:space="preserve">2026-10-18</w:t>
             </w:r>
           </w:p>
         </w:tc>
@@ -721,7 +721,7 @@
                 <w:sz w:val="19"/>
                 <w:szCs w:val="19"/>
               </w:rPr>
-              <w:t xml:space="preserve">Sprint 06 (Reservation calendar) accepted: day, week and month calendar of rooms and dorm beds, moving a guest by drag-and-drop with a reason, list by day on phones. Room-move flow diagram. Sprint 07 (Front desk) started.</w:t>
+              <w:t xml:space="preserve">Sprint 07 (Front desk) accepted: arrivals, departures and in-house lists, check-in and check-out in a few clicks, walk-ins on one screen, early departures with a reason, rooms marked dirty and ready. Check-in flow diagram. Sprint 08 (Folio) started.</w:t>
             </w:r>
           </w:p>
         </w:tc>
@@ -757,7 +757,7 @@
                 <w:sz w:val="19"/>
                 <w:szCs w:val="19"/>
               </w:rPr>
-              <w:t xml:space="preserve">1.5</w:t>
+              <w:t xml:space="preserve">1.6</w:t>
             </w:r>
           </w:p>
         </w:tc>
@@ -788,7 +788,7 @@
                 <w:sz w:val="19"/>
                 <w:szCs w:val="19"/>
               </w:rPr>
-              <w:t xml:space="preserve">2026-10-15</w:t>
+              <w:t xml:space="preserve">2026-10-17</w:t>
             </w:r>
           </w:p>
         </w:tc>
@@ -819,7 +819,7 @@
                 <w:sz w:val="19"/>
                 <w:szCs w:val="19"/>
               </w:rPr>
-              <w:t xml:space="preserve">Sprint 05 (Availability engine and reservations) accepted: race-free booking, booking wizard, booking history, date pickers. Diagrams of the reservation tables and the booking flow. Sprint 06 (Reservation calendar) started.</w:t>
+              <w:t xml:space="preserve">Sprint 06 (Reservation calendar) accepted: day, week and month calendar of rooms and dorm beds, moving a guest by drag-and-drop with a reason, list by day on phones. Room-move flow diagram. Sprint 07 (Front desk) started.</w:t>
             </w:r>
           </w:p>
         </w:tc>
@@ -854,7 +854,7 @@
                 <w:sz w:val="19"/>
                 <w:szCs w:val="19"/>
               </w:rPr>
-              <w:t xml:space="preserve">1.4</w:t>
+              <w:t xml:space="preserve">1.5</w:t>
             </w:r>
           </w:p>
         </w:tc>
@@ -884,7 +884,7 @@
                 <w:sz w:val="19"/>
                 <w:szCs w:val="19"/>
               </w:rPr>
-              <w:t xml:space="preserve">2026-10-14</w:t>
+              <w:t xml:space="preserve">2026-10-15</w:t>
             </w:r>
           </w:p>
         </w:tc>
@@ -914,7 +914,7 @@
                 <w:sz w:val="19"/>
                 <w:szCs w:val="19"/>
               </w:rPr>
-              <w:t xml:space="preserve">Sprint 04 (Rate plans and packages) accepted: nightly price grid, quotes, packages with revenue split. Sprint 05 (Availability engine and reservations) started.</w:t>
+              <w:t xml:space="preserve">Sprint 05 (Availability engine and reservations) accepted: race-free booking, booking wizard, booking history, date pickers. Diagrams of the reservation tables and the booking flow. Sprint 06 (Reservation calendar) started.</w:t>
             </w:r>
           </w:p>
         </w:tc>
@@ -950,7 +950,7 @@
                 <w:sz w:val="19"/>
                 <w:szCs w:val="19"/>
               </w:rPr>
-              <w:t xml:space="preserve">1.3</w:t>
+              <w:t xml:space="preserve">1.4</w:t>
             </w:r>
           </w:p>
         </w:tc>
@@ -981,7 +981,7 @@
                 <w:sz w:val="19"/>
                 <w:szCs w:val="19"/>
               </w:rPr>
-              <w:t xml:space="preserve">2026-10-11</w:t>
+              <w:t xml:space="preserve">2026-10-14</w:t>
             </w:r>
           </w:p>
         </w:tc>
@@ -1012,7 +1012,7 @@
                 <w:sz w:val="19"/>
                 <w:szCs w:val="19"/>
               </w:rPr>
-              <w:t xml:space="preserve">Sprint 03 (Guests) accepted, with review fixes: Aadhaar number check and error messages that say why. Sprint 04 (Rate plans and packages) started.</w:t>
+              <w:t xml:space="preserve">Sprint 04 (Rate plans and packages) accepted: nightly price grid, quotes, packages with revenue split. Sprint 05 (Availability engine and reservations) started.</w:t>
             </w:r>
           </w:p>
         </w:tc>
@@ -1047,7 +1047,7 @@
                 <w:sz w:val="19"/>
                 <w:szCs w:val="19"/>
               </w:rPr>
-              <w:t xml:space="preserve">1.2.1</w:t>
+              <w:t xml:space="preserve">1.3</w:t>
             </w:r>
           </w:p>
         </w:tc>
@@ -1077,7 +1077,7 @@
                 <w:sz w:val="19"/>
                 <w:szCs w:val="19"/>
               </w:rPr>
-              <w:t xml:space="preserve">2026-10-10</w:t>
+              <w:t xml:space="preserve">2026-10-11</w:t>
             </w:r>
           </w:p>
         </w:tc>
@@ -1107,7 +1107,7 @@
                 <w:sz w:val="19"/>
                 <w:szCs w:val="19"/>
               </w:rPr>
-              <w:t xml:space="preserve">Sprint 03 (Guests) built and in review: guest profiles, encrypted ID documents, duplicates, merge, anonymise, consent.</w:t>
+              <w:t xml:space="preserve">Sprint 03 (Guests) accepted, with review fixes: Aadhaar number check and error messages that say why. Sprint 04 (Rate plans and packages) started.</w:t>
             </w:r>
           </w:p>
         </w:tc>
@@ -1143,6 +1143,103 @@
                 <w:sz w:val="19"/>
                 <w:szCs w:val="19"/>
               </w:rPr>
+              <w:t xml:space="preserve">1.2.1</w:t>
+            </w:r>
+          </w:p>
+        </w:tc>
+        <w:tc>
+          <w:tcPr>
+            <w:tcW w:type="dxa" w:w="1500"/>
+            <w:tcBorders>
+              <w:top w:val="single" w:color="DCE3E1" w:sz="4"/>
+              <w:left w:val="single" w:color="DCE3E1" w:sz="4"/>
+              <w:bottom w:val="single" w:color="DCE3E1" w:sz="4"/>
+              <w:right w:val="single" w:color="DCE3E1" w:sz="4"/>
+            </w:tcBorders>
+            <w:shd w:fill="F5F7F6" w:color="auto" w:val="clear"/>
+            <w:tcMar>
+              <w:top w:type="dxa" w:w="70"/>
+              <w:left w:type="dxa" w:w="110"/>
+              <w:bottom w:type="dxa" w:w="50"/>
+              <w:right w:type="dxa" w:w="110"/>
+            </w:tcMar>
+            <w:vAlign w:val="top"/>
+          </w:tcPr>
+          <w:p>
+            <w:pPr>
+              <w:spacing w:after="40" w:line="252" w:lineRule="auto"/>
+            </w:pPr>
+            <w:r>
+              <w:rPr>
+                <w:sz w:val="19"/>
+                <w:szCs w:val="19"/>
+              </w:rPr>
+              <w:t xml:space="preserve">2026-10-10</w:t>
+            </w:r>
+          </w:p>
+        </w:tc>
+        <w:tc>
+          <w:tcPr>
+            <w:tcW w:type="dxa" w:w="6714"/>
+            <w:tcBorders>
+              <w:top w:val="single" w:color="DCE3E1" w:sz="4"/>
+              <w:left w:val="single" w:color="DCE3E1" w:sz="4"/>
+              <w:bottom w:val="single" w:color="DCE3E1" w:sz="4"/>
+              <w:right w:val="single" w:color="DCE3E1" w:sz="4"/>
+            </w:tcBorders>
+            <w:shd w:fill="F5F7F6" w:color="auto" w:val="clear"/>
+            <w:tcMar>
+              <w:top w:type="dxa" w:w="70"/>
+              <w:left w:type="dxa" w:w="110"/>
+              <w:bottom w:type="dxa" w:w="50"/>
+              <w:right w:type="dxa" w:w="110"/>
+            </w:tcMar>
+            <w:vAlign w:val="top"/>
+          </w:tcPr>
+          <w:p>
+            <w:pPr>
+              <w:spacing w:after="40" w:line="252" w:lineRule="auto"/>
+            </w:pPr>
+            <w:r>
+              <w:rPr>
+                <w:sz w:val="19"/>
+                <w:szCs w:val="19"/>
+              </w:rPr>
+              <w:t xml:space="preserve">Sprint 03 (Guests) built and in review: guest profiles, encrypted ID documents, duplicates, merge, anonymise, consent.</w:t>
+            </w:r>
+          </w:p>
+        </w:tc>
+      </w:tr>
+      <w:tr>
+        <w:trPr>
+          <w:cantSplit/>
+        </w:trPr>
+        <w:tc>
+          <w:tcPr>
+            <w:tcW w:type="dxa" w:w="1100"/>
+            <w:tcBorders>
+              <w:top w:val="single" w:color="DCE3E1" w:sz="4"/>
+              <w:left w:val="single" w:color="DCE3E1" w:sz="4"/>
+              <w:bottom w:val="single" w:color="DCE3E1" w:sz="4"/>
+              <w:right w:val="single" w:color="DCE3E1" w:sz="4"/>
+            </w:tcBorders>
+            <w:tcMar>
+              <w:top w:type="dxa" w:w="70"/>
+              <w:left w:type="dxa" w:w="110"/>
+              <w:bottom w:type="dxa" w:w="50"/>
+              <w:right w:type="dxa" w:w="110"/>
+            </w:tcMar>
+            <w:vAlign w:val="top"/>
+          </w:tcPr>
+          <w:p>
+            <w:pPr>
+              <w:spacing w:after="40" w:line="252" w:lineRule="auto"/>
+            </w:pPr>
+            <w:r>
+              <w:rPr>
+                <w:sz w:val="19"/>
+                <w:szCs w:val="19"/>
+              </w:rPr>
               <w:t xml:space="preserve">1.2</w:t>
             </w:r>
           </w:p>
@@ -1156,7 +1253,6 @@
               <w:bottom w:val="single" w:color="DCE3E1" w:sz="4"/>
               <w:right w:val="single" w:color="DCE3E1" w:sz="4"/>
             </w:tcBorders>
-            <w:shd w:fill="F5F7F6" w:color="auto" w:val="clear"/>
             <w:tcMar>
               <w:top w:type="dxa" w:w="70"/>
               <w:left w:type="dxa" w:w="110"/>
@@ -1187,7 +1283,6 @@
               <w:bottom w:val="single" w:color="DCE3E1" w:sz="4"/>
               <w:right w:val="single" w:color="DCE3E1" w:sz="4"/>
             </w:tcBorders>
-            <w:shd w:fill="F5F7F6" w:color="auto" w:val="clear"/>
             <w:tcMar>
               <w:top w:type="dxa" w:w="70"/>
               <w:left w:type="dxa" w:w="110"/>
@@ -1438,7 +1533,7 @@
                 <w:sz w:val="19"/>
                 <w:szCs w:val="19"/>
               </w:rPr>
-              <w:t xml:space="preserve">Living document, rebuilt at the end of every sprint. This edition reflects Sprint 06 accepted and Sprint 07 in progress.</w:t>
+              <w:t xml:space="preserve">Living document, rebuilt at the end of every sprint. This edition reflects Sprint 07 accepted and Sprint 08 in progress.</w:t>
             </w:r>
           </w:p>
         </w:tc>
@@ -2266,7 +2361,33 @@
           <w:sz w:val="19"/>
           <w:szCs w:val="19"/>
         </w:rPr>
-        <w:t xml:space="preserve">In progress: Sprint 07 — Front desk — arrivals, departures, in-house, check-in/out</w:t>
+        <w:t xml:space="preserve">Sprint 07 — Front desk</w:t>
+      </w:r>
+    </w:p>
+    <w:p>
+      <w:pPr>
+        <w:spacing w:after="30" w:before="0"/>
+        <w:ind w:left="420"/>
+      </w:pPr>
+      <w:r>
+        <w:rPr>
+          <w:b w:val="false"/>
+          <w:bCs w:val="false"/>
+          <w:color w:val="8A2449"/>
+          <w:sz w:val="19"/>
+          <w:szCs w:val="19"/>
+        </w:rPr>
+        <w:t xml:space="preserve">9.8  </w:t>
+      </w:r>
+      <w:r>
+        <w:rPr>
+          <w:b w:val="false"/>
+          <w:bCs w:val="false"/>
+          <w:color w:val="1B2A2E"/>
+          <w:sz w:val="19"/>
+          <w:szCs w:val="19"/>
+        </w:rPr>
+        <w:t xml:space="preserve">In progress: Sprint 08 — Folio</w:t>
       </w:r>
     </w:p>
     <w:p>
@@ -2589,7 +2710,7 @@
                 <w:sz w:val="40"/>
                 <w:szCs w:val="40"/>
               </w:rPr>
-              <w:t xml:space="preserve">6 of 29</w:t>
+              <w:t xml:space="preserve">7 of 29</w:t>
             </w:r>
           </w:p>
           <w:p>
@@ -2954,7 +3075,7 @@
                 <w:sz w:val="19"/>
                 <w:szCs w:val="19"/>
               </w:rPr>
-              <w:t xml:space="preserve">Sprints 01 and 02 and 03 and 04 and 05 and 06 are delivered and accepted. Sprint 07 (Front desk — arrivals, departures, in-house, check-in/out) is in progress.</w:t>
+              <w:t xml:space="preserve">Sprints 01 and 02 and 03 and 04 and 05 and 06 and 07 are delivered and accepted. Sprint 08 (Folio) is in progress.</w:t>
             </w:r>
           </w:p>
         </w:tc>
@@ -4926,25 +5047,25 @@
               <w:bottom w:val="single" w:color="DCE3E1" w:sz="4"/>
               <w:right w:val="single" w:color="DCE3E1" w:sz="4"/>
             </w:tcBorders>
-            <w:shd w:fill="FBEFD8" w:color="auto" w:val="clear"/>
-            <w:tcMar>
-              <w:top w:type="dxa" w:w="70"/>
-              <w:left w:type="dxa" w:w="110"/>
-              <w:bottom w:type="dxa" w:w="50"/>
-              <w:right w:type="dxa" w:w="110"/>
-            </w:tcMar>
-            <w:vAlign w:val="top"/>
-          </w:tcPr>
-          <w:p>
-            <w:pPr>
-              <w:spacing w:after="40" w:line="252" w:lineRule="auto"/>
-            </w:pPr>
-            <w:r>
-              <w:rPr>
-                <w:sz w:val="19"/>
-                <w:szCs w:val="19"/>
-              </w:rPr>
-              <w:t xml:space="preserve">In progress</w:t>
+            <w:shd w:fill="E3F0E6" w:color="auto" w:val="clear"/>
+            <w:tcMar>
+              <w:top w:type="dxa" w:w="70"/>
+              <w:left w:type="dxa" w:w="110"/>
+              <w:bottom w:type="dxa" w:w="50"/>
+              <w:right w:type="dxa" w:w="110"/>
+            </w:tcMar>
+            <w:vAlign w:val="top"/>
+          </w:tcPr>
+          <w:p>
+            <w:pPr>
+              <w:spacing w:after="40" w:line="252" w:lineRule="auto"/>
+            </w:pPr>
+            <w:r>
+              <w:rPr>
+                <w:sz w:val="19"/>
+                <w:szCs w:val="19"/>
+              </w:rPr>
+              <w:t xml:space="preserve">Done</w:t>
             </w:r>
           </w:p>
         </w:tc>
@@ -5162,24 +5283,25 @@
               <w:bottom w:val="single" w:color="DCE3E1" w:sz="4"/>
               <w:right w:val="single" w:color="DCE3E1" w:sz="4"/>
             </w:tcBorders>
-            <w:tcMar>
-              <w:top w:type="dxa" w:w="70"/>
-              <w:left w:type="dxa" w:w="110"/>
-              <w:bottom w:type="dxa" w:w="50"/>
-              <w:right w:type="dxa" w:w="110"/>
-            </w:tcMar>
-            <w:vAlign w:val="top"/>
-          </w:tcPr>
-          <w:p>
-            <w:pPr>
-              <w:spacing w:after="40" w:line="252" w:lineRule="auto"/>
-            </w:pPr>
-            <w:r>
-              <w:rPr>
-                <w:sz w:val="19"/>
-                <w:szCs w:val="19"/>
-              </w:rPr>
-              <w:t xml:space="preserve">Planned</w:t>
+            <w:shd w:fill="FBEFD8" w:color="auto" w:val="clear"/>
+            <w:tcMar>
+              <w:top w:type="dxa" w:w="70"/>
+              <w:left w:type="dxa" w:w="110"/>
+              <w:bottom w:type="dxa" w:w="50"/>
+              <w:right w:type="dxa" w:w="110"/>
+            </w:tcMar>
+            <w:vAlign w:val="top"/>
+          </w:tcPr>
+          <w:p>
+            <w:pPr>
+              <w:spacing w:after="40" w:line="252" w:lineRule="auto"/>
+            </w:pPr>
+            <w:r>
+              <w:rPr>
+                <w:sz w:val="19"/>
+                <w:szCs w:val="19"/>
+              </w:rPr>
+              <w:t xml:space="preserve">In progress</w:t>
             </w:r>
           </w:p>
         </w:tc>
@@ -12316,7 +12438,7 @@
     </w:p>
     <w:p>
       <w:r>
-        <w:t xml:space="preserve">Work is delivered in short sprints, and each one ends with the owner trying the new screens and accepting them. These are the parts that are built, tested and accepted as of Sprint 06.</w:t>
+        <w:t xml:space="preserve">Work is delivered in short sprints, and each one ends with the owner trying the new screens and accepting them. These are the parts that are built, tested and accepted as of Sprint 07.</w:t>
       </w:r>
     </w:p>
     <w:p>
@@ -13929,12 +14051,286 @@
         <w:pStyle w:val="Heading2"/>
       </w:pPr>
       <w:r>
-        <w:t xml:space="preserve">9.7   In progress: Sprint 07 — Front desk — arrivals, departures, in-house, check-in/out</w:t>
+        <w:t xml:space="preserve">9.7   Sprint 07 — Front desk</w:t>
       </w:r>
     </w:p>
     <w:p>
       <w:r>
         <w:t xml:space="preserve">Reception checks guests in and out in a few clicks, with today's arrivals, departures and in-house guests on one screen.</w:t>
+      </w:r>
+    </w:p>
+    <w:p>
+      <w:pPr>
+        <w:pStyle w:val="ListParagraph"/>
+        <w:numPr>
+          <w:ilvl w:val="0"/>
+          <w:numId w:val="2"/>
+        </w:numPr>
+        <w:spacing w:after="60"/>
+      </w:pPr>
+      <w:r>
+        <w:t xml:space="preserve">Today's arrivals, departures and in-house guests on one Front desk screen, with each room's cleaning state</w:t>
+      </w:r>
+    </w:p>
+    <w:p>
+      <w:pPr>
+        <w:pStyle w:val="ListParagraph"/>
+        <w:numPr>
+          <w:ilvl w:val="0"/>
+          <w:numId w:val="2"/>
+        </w:numPr>
+        <w:spacing w:after="60"/>
+      </w:pPr>
+      <w:r>
+        <w:t xml:space="preserve">Check a guest in or out in a few clicks; a room that isn't ready can still be used with a reason</w:t>
+      </w:r>
+    </w:p>
+    <w:p>
+      <w:pPr>
+        <w:pStyle w:val="ListParagraph"/>
+        <w:numPr>
+          <w:ilvl w:val="0"/>
+          <w:numId w:val="2"/>
+        </w:numPr>
+        <w:spacing w:after="60"/>
+      </w:pPr>
+      <w:r>
+        <w:t xml:space="preserve">A walk-in guest is booked and checked in from one screen</w:t>
+      </w:r>
+    </w:p>
+    <w:p>
+      <w:pPr>
+        <w:pStyle w:val="ListParagraph"/>
+        <w:numPr>
+          <w:ilvl w:val="0"/>
+          <w:numId w:val="2"/>
+        </w:numPr>
+        <w:spacing w:after="60"/>
+      </w:pPr>
+      <w:r>
+        <w:t xml:space="preserve">A guest leaving early gives a reason and the nights left are released for sale</w:t>
+      </w:r>
+    </w:p>
+    <w:p>
+      <w:pPr>
+        <w:pStyle w:val="ListParagraph"/>
+        <w:numPr>
+          <w:ilvl w:val="0"/>
+          <w:numId w:val="2"/>
+        </w:numPr>
+        <w:spacing w:after="60"/>
+      </w:pPr>
+      <w:r>
+        <w:t xml:space="preserve">Rooms become dirty at check-out and are marked ready again from the rooms board</w:t>
+      </w:r>
+    </w:p>
+    <w:p>
+      <w:pPr>
+        <w:pStyle w:val="ListParagraph"/>
+        <w:numPr>
+          <w:ilvl w:val="0"/>
+          <w:numId w:val="2"/>
+        </w:numPr>
+        <w:spacing w:after="60"/>
+      </w:pPr>
+      <w:r>
+        <w:t xml:space="preserve">'Today' is always the resort's own date (India time), never the server's</w:t>
+      </w:r>
+    </w:p>
+    <w:p>
+      <w:pPr>
+        <w:keepNext/>
+        <w:pBdr>
+          <w:top w:val="single" w:color="DCE3E1" w:sz="4"/>
+          <w:bottom w:val="single" w:color="DCE3E1" w:sz="4"/>
+          <w:left w:val="single" w:color="DCE3E1" w:sz="4"/>
+          <w:right w:val="single" w:color="DCE3E1" w:sz="4"/>
+        </w:pBdr>
+        <w:spacing w:before="120" w:after="0" w:line="240" w:lineRule="auto"/>
+        <w:jc w:val="center"/>
+      </w:pPr>
+      <w:r>
+        <w:drawing>
+          <wp:inline distT="0" distB="0" distL="0" distR="0">
+            <wp:extent cx="5124450" cy="3438525"/>
+            <wp:effectExtent t="0" r="0" b="0" l="0"/>
+            <wp:docPr id="1" name="Front desk: today's arrivals with room and cleaning state" descr="Front desk: today's arrivals with room and cleaning state" title="Front desk: today's arrivals with room and cleaning state"/>
+            <wp:cNvGraphicFramePr>
+              <a:graphicFrameLocks xmlns:a="http://schemas.openxmlformats.org/drawingml/2006/main" noChangeAspect="1"/>
+            </wp:cNvGraphicFramePr>
+            <a:graphic xmlns:a="http://schemas.openxmlformats.org/drawingml/2006/main">
+              <a:graphicData uri="http://schemas.openxmlformats.org/drawingml/2006/picture">
+                <pic:pic xmlns:pic="http://schemas.openxmlformats.org/drawingml/2006/picture">
+                  <pic:nvPicPr>
+                    <pic:cNvPr id="0" name="" descr=""/>
+                    <pic:cNvPicPr>
+                      <a:picLocks noChangeAspect="1" noChangeArrowheads="1"/>
+                    </pic:cNvPicPr>
+                  </pic:nvPicPr>
+                  <pic:blipFill>
+                    <a:blip r:embed="rId29" cstate="none"/>
+                    <a:srcRect/>
+                    <a:stretch>
+                      <a:fillRect/>
+                    </a:stretch>
+                  </pic:blipFill>
+                  <pic:spPr bwMode="auto">
+                    <a:xfrm>
+                      <a:off x="0" y="0"/>
+                      <a:ext cx="5124450" cy="3438525"/>
+                    </a:xfrm>
+                    <a:prstGeom prst="rect">
+                      <a:avLst/>
+                    </a:prstGeom>
+                  </pic:spPr>
+                </pic:pic>
+              </a:graphicData>
+            </a:graphic>
+          </wp:inline>
+        </w:drawing>
+      </w:r>
+    </w:p>
+    <w:p>
+      <w:pPr>
+        <w:pStyle w:val="Caption"/>
+      </w:pPr>
+      <w:r>
+        <w:t xml:space="preserve">Front desk: today's arrivals with room and cleaning state</w:t>
+      </w:r>
+    </w:p>
+    <w:p>
+      <w:pPr>
+        <w:keepNext/>
+        <w:pBdr>
+          <w:top w:val="single" w:color="DCE3E1" w:sz="4"/>
+          <w:bottom w:val="single" w:color="DCE3E1" w:sz="4"/>
+          <w:left w:val="single" w:color="DCE3E1" w:sz="4"/>
+          <w:right w:val="single" w:color="DCE3E1" w:sz="4"/>
+        </w:pBdr>
+        <w:spacing w:before="120" w:after="0" w:line="240" w:lineRule="auto"/>
+        <w:jc w:val="center"/>
+      </w:pPr>
+      <w:r>
+        <w:drawing>
+          <wp:inline distT="0" distB="0" distL="0" distR="0">
+            <wp:extent cx="5124450" cy="3438525"/>
+            <wp:effectExtent t="0" r="0" b="0" l="0"/>
+            <wp:docPr id="1" name="A room that isn't ready needs a reason to check in" descr="A room that isn't ready needs a reason to check in" title="A room that isn't ready needs a reason to check in"/>
+            <wp:cNvGraphicFramePr>
+              <a:graphicFrameLocks xmlns:a="http://schemas.openxmlformats.org/drawingml/2006/main" noChangeAspect="1"/>
+            </wp:cNvGraphicFramePr>
+            <a:graphic xmlns:a="http://schemas.openxmlformats.org/drawingml/2006/main">
+              <a:graphicData uri="http://schemas.openxmlformats.org/drawingml/2006/picture">
+                <pic:pic xmlns:pic="http://schemas.openxmlformats.org/drawingml/2006/picture">
+                  <pic:nvPicPr>
+                    <pic:cNvPr id="0" name="" descr=""/>
+                    <pic:cNvPicPr>
+                      <a:picLocks noChangeAspect="1" noChangeArrowheads="1"/>
+                    </pic:cNvPicPr>
+                  </pic:nvPicPr>
+                  <pic:blipFill>
+                    <a:blip r:embed="rId30" cstate="none"/>
+                    <a:srcRect/>
+                    <a:stretch>
+                      <a:fillRect/>
+                    </a:stretch>
+                  </pic:blipFill>
+                  <pic:spPr bwMode="auto">
+                    <a:xfrm>
+                      <a:off x="0" y="0"/>
+                      <a:ext cx="5124450" cy="3438525"/>
+                    </a:xfrm>
+                    <a:prstGeom prst="rect">
+                      <a:avLst/>
+                    </a:prstGeom>
+                  </pic:spPr>
+                </pic:pic>
+              </a:graphicData>
+            </a:graphic>
+          </wp:inline>
+        </w:drawing>
+      </w:r>
+    </w:p>
+    <w:p>
+      <w:pPr>
+        <w:pStyle w:val="Caption"/>
+      </w:pPr>
+      <w:r>
+        <w:t xml:space="preserve">A room that isn't ready needs a reason to check in</w:t>
+      </w:r>
+    </w:p>
+    <w:p>
+      <w:pPr>
+        <w:keepNext/>
+        <w:pBdr>
+          <w:top w:val="single" w:color="DCE3E1" w:sz="4"/>
+          <w:bottom w:val="single" w:color="DCE3E1" w:sz="4"/>
+          <w:left w:val="single" w:color="DCE3E1" w:sz="4"/>
+          <w:right w:val="single" w:color="DCE3E1" w:sz="4"/>
+        </w:pBdr>
+        <w:spacing w:before="120" w:after="0" w:line="240" w:lineRule="auto"/>
+        <w:jc w:val="center"/>
+      </w:pPr>
+      <w:r>
+        <w:drawing>
+          <wp:inline distT="0" distB="0" distL="0" distR="0">
+            <wp:extent cx="5124450" cy="3438525"/>
+            <wp:effectExtent t="0" r="0" b="0" l="0"/>
+            <wp:docPr id="1" name="Checking a guest out" descr="Checking a guest out" title="Checking a guest out"/>
+            <wp:cNvGraphicFramePr>
+              <a:graphicFrameLocks xmlns:a="http://schemas.openxmlformats.org/drawingml/2006/main" noChangeAspect="1"/>
+            </wp:cNvGraphicFramePr>
+            <a:graphic xmlns:a="http://schemas.openxmlformats.org/drawingml/2006/main">
+              <a:graphicData uri="http://schemas.openxmlformats.org/drawingml/2006/picture">
+                <pic:pic xmlns:pic="http://schemas.openxmlformats.org/drawingml/2006/picture">
+                  <pic:nvPicPr>
+                    <pic:cNvPr id="0" name="" descr=""/>
+                    <pic:cNvPicPr>
+                      <a:picLocks noChangeAspect="1" noChangeArrowheads="1"/>
+                    </pic:cNvPicPr>
+                  </pic:nvPicPr>
+                  <pic:blipFill>
+                    <a:blip r:embed="rId31" cstate="none"/>
+                    <a:srcRect/>
+                    <a:stretch>
+                      <a:fillRect/>
+                    </a:stretch>
+                  </pic:blipFill>
+                  <pic:spPr bwMode="auto">
+                    <a:xfrm>
+                      <a:off x="0" y="0"/>
+                      <a:ext cx="5124450" cy="3438525"/>
+                    </a:xfrm>
+                    <a:prstGeom prst="rect">
+                      <a:avLst/>
+                    </a:prstGeom>
+                  </pic:spPr>
+                </pic:pic>
+              </a:graphicData>
+            </a:graphic>
+          </wp:inline>
+        </w:drawing>
+      </w:r>
+    </w:p>
+    <w:p>
+      <w:pPr>
+        <w:pStyle w:val="Caption"/>
+      </w:pPr>
+      <w:r>
+        <w:t xml:space="preserve">Checking a guest out</w:t>
+      </w:r>
+    </w:p>
+    <w:p>
+      <w:pPr>
+        <w:pStyle w:val="Heading2"/>
+      </w:pPr>
+      <w:r>
+        <w:t xml:space="preserve">9.8   In progress: Sprint 08 — Folio</w:t>
+      </w:r>
+    </w:p>
+    <w:p>
+      <w:r>
+        <w:t xml:space="preserve">Every stay has one running bill (folio) that collects room charges, meals, activities and transport.</w:t>
       </w:r>
     </w:p>
     <w:p>
@@ -13947,7 +14343,7 @@
           <w:sz w:val="18"/>
           <w:szCs w:val="18"/>
         </w:rPr>
-        <w:t xml:space="preserve">It will be accepted when: Walk-in to checked-in in ≤ 3 screens.</w:t>
+        <w:t xml:space="preserve">It will be accepted when: Folio shows charges, reversals and balance; nothing can be deleted.</w:t>
       </w:r>
     </w:p>
     <w:p>
@@ -14480,25 +14876,25 @@
               <w:bottom w:val="single" w:color="DCE3E1" w:sz="4"/>
               <w:right w:val="single" w:color="DCE3E1" w:sz="4"/>
             </w:tcBorders>
-            <w:shd w:fill="FBEFD8" w:color="auto" w:val="clear"/>
-            <w:tcMar>
-              <w:top w:type="dxa" w:w="70"/>
-              <w:left w:type="dxa" w:w="110"/>
-              <w:bottom w:type="dxa" w:w="50"/>
-              <w:right w:type="dxa" w:w="110"/>
-            </w:tcMar>
-            <w:vAlign w:val="top"/>
-          </w:tcPr>
-          <w:p>
-            <w:pPr>
-              <w:spacing w:after="40" w:line="252" w:lineRule="auto"/>
-            </w:pPr>
-            <w:r>
-              <w:rPr>
-                <w:sz w:val="19"/>
-                <w:szCs w:val="19"/>
-              </w:rPr>
-              <w:t xml:space="preserve">In progress</w:t>
+            <w:shd w:fill="E3F0E6" w:color="auto" w:val="clear"/>
+            <w:tcMar>
+              <w:top w:type="dxa" w:w="70"/>
+              <w:left w:type="dxa" w:w="110"/>
+              <w:bottom w:type="dxa" w:w="50"/>
+              <w:right w:type="dxa" w:w="110"/>
+            </w:tcMar>
+            <w:vAlign w:val="top"/>
+          </w:tcPr>
+          <w:p>
+            <w:pPr>
+              <w:spacing w:after="40" w:line="252" w:lineRule="auto"/>
+            </w:pPr>
+            <w:r>
+              <w:rPr>
+                <w:sz w:val="19"/>
+                <w:szCs w:val="19"/>
+              </w:rPr>
+              <w:t xml:space="preserve">Done</w:t>
             </w:r>
           </w:p>
         </w:tc>
@@ -14606,24 +15002,25 @@
               <w:bottom w:val="single" w:color="DCE3E1" w:sz="4"/>
               <w:right w:val="single" w:color="DCE3E1" w:sz="4"/>
             </w:tcBorders>
-            <w:tcMar>
-              <w:top w:type="dxa" w:w="70"/>
-              <w:left w:type="dxa" w:w="110"/>
-              <w:bottom w:type="dxa" w:w="50"/>
-              <w:right w:type="dxa" w:w="110"/>
-            </w:tcMar>
-            <w:vAlign w:val="top"/>
-          </w:tcPr>
-          <w:p>
-            <w:pPr>
-              <w:spacing w:after="40" w:line="252" w:lineRule="auto"/>
-            </w:pPr>
-            <w:r>
-              <w:rPr>
-                <w:sz w:val="19"/>
-                <w:szCs w:val="19"/>
-              </w:rPr>
-              <w:t xml:space="preserve">Planned</w:t>
+            <w:shd w:fill="FBEFD8" w:color="auto" w:val="clear"/>
+            <w:tcMar>
+              <w:top w:type="dxa" w:w="70"/>
+              <w:left w:type="dxa" w:w="110"/>
+              <w:bottom w:type="dxa" w:w="50"/>
+              <w:right w:type="dxa" w:w="110"/>
+            </w:tcMar>
+            <w:vAlign w:val="top"/>
+          </w:tcPr>
+          <w:p>
+            <w:pPr>
+              <w:spacing w:after="40" w:line="252" w:lineRule="auto"/>
+            </w:pPr>
+            <w:r>
+              <w:rPr>
+                <w:sz w:val="19"/>
+                <w:szCs w:val="19"/>
+              </w:rPr>
+              <w:t xml:space="preserve">In progress</w:t>
             </w:r>
           </w:p>
         </w:tc>
@@ -16658,7 +17055,7 @@
               <w:bottom w:val="single" w:color="DCE3E1" w:sz="4"/>
               <w:right w:val="single" w:color="DCE3E1" w:sz="4"/>
             </w:tcBorders>
-            <w:shd w:fill="FBEFD8" w:color="auto" w:val="clear"/>
+            <w:shd w:fill="E3F0E6" w:color="auto" w:val="clear"/>
             <w:tcMar>
               <w:top w:type="dxa" w:w="70"/>
               <w:left w:type="dxa" w:w="110"/>
@@ -16676,7 +17073,7 @@
                 <w:sz w:val="17"/>
                 <w:szCs w:val="17"/>
               </w:rPr>
-              <w:t xml:space="preserve">In progress</w:t>
+              <w:t xml:space="preserve">Done</w:t>
             </w:r>
           </w:p>
         </w:tc>
@@ -16784,6 +17181,7 @@
               <w:bottom w:val="single" w:color="DCE3E1" w:sz="4"/>
               <w:right w:val="single" w:color="DCE3E1" w:sz="4"/>
             </w:tcBorders>
+            <w:shd w:fill="FBEFD8" w:color="auto" w:val="clear"/>
             <w:tcMar>
               <w:top w:type="dxa" w:w="70"/>
               <w:left w:type="dxa" w:w="110"/>
@@ -16801,7 +17199,7 @@
                 <w:sz w:val="17"/>
                 <w:szCs w:val="17"/>
               </w:rPr>
-              <w:t xml:space="preserve">Planned</w:t>
+              <w:t xml:space="preserve">In progress</w:t>
             </w:r>
           </w:p>
         </w:tc>
@@ -19479,7 +19877,7 @@
                     </pic:cNvPicPr>
                   </pic:nvPicPr>
                   <pic:blipFill>
-                    <a:blip r:embed="rId29" cstate="none"/>
+                    <a:blip r:embed="rId32" cstate="none"/>
                     <a:srcRect/>
                     <a:stretch>
                       <a:fillRect/>
@@ -19586,7 +19984,7 @@
         <w:t xml:space="preserve">Tests that grow with the system.</w:t>
       </w:r>
       <w:r>
-        <w:t xml:space="preserve"> As of Sprint 06: 137 server test methods, 54 screen tests and 60 end-to-end browser steps, all passing.</w:t>
+        <w:t xml:space="preserve"> As of Sprint 07: 157 server test methods, 59 screen tests and 69 end-to-end browser steps, all passing.</w:t>
       </w:r>
     </w:p>
     <w:p>
@@ -21473,7 +21871,7 @@
         <w:sz w:val="16"/>
         <w:szCs w:val="16"/>
       </w:rPr>
-      <w:t xml:space="preserve">Version 1.6 · 17 October 2026</w:t>
+      <w:t xml:space="preserve">Version 1.7 · 18 October 2026</w:t>
     </w:r>
     <w:r>
       <w:rPr>

</xml_diff>

<commit_message>
chore(sprints): accept Sprint 08
Sprint 08 (Folio) done, Sprint 09 current; changelog dated; handbooks 1.8
rebuilt; guides, catalogues, README and run/test table updated.

Co-Authored-By: Claude Opus 5.5 (1M context) <noreply@anthropic.com>
Claude-Session: https://claude.ai/code/session_01AgFF7nxGrK3Qcw6cm4B43X
</commit_message>
<xml_diff>
--- a/docs/handbooks/Resort-OS-Product-Overview.docx
+++ b/docs/handbooks/Resort-OS-Product-Overview.docx
@@ -182,7 +182,7 @@
                 <w:sz w:val="19"/>
                 <w:szCs w:val="19"/>
               </w:rPr>
-              <w:t xml:space="preserve">Version 1.7</w:t>
+              <w:t xml:space="preserve">Version 1.8</w:t>
             </w:r>
           </w:p>
         </w:tc>
@@ -322,7 +322,7 @@
                 <w:sz w:val="19"/>
                 <w:szCs w:val="19"/>
               </w:rPr>
-              <w:t xml:space="preserve">Sprints 01, 02, 03, 04, 05, 06, 07 accepted · Sprint 08 Folio in progress</w:t>
+              <w:t xml:space="preserve">Sprints 01, 02, 03, 04, 05, 06, 07, 08 accepted · Sprint 09 GST configuration and tax engine in progress</w:t>
             </w:r>
           </w:p>
         </w:tc>
@@ -661,7 +661,7 @@
                 <w:sz w:val="19"/>
                 <w:szCs w:val="19"/>
               </w:rPr>
-              <w:t xml:space="preserve">1.7</w:t>
+              <w:t xml:space="preserve">1.8</w:t>
             </w:r>
           </w:p>
         </w:tc>
@@ -721,7 +721,7 @@
                 <w:sz w:val="19"/>
                 <w:szCs w:val="19"/>
               </w:rPr>
-              <w:t xml:space="preserve">Sprint 07 (Front desk) accepted: arrivals, departures and in-house lists, check-in and check-out in a few clicks, walk-ins on one screen, early departures with a reason, rooms marked dirty and ready. Check-in flow diagram. Sprint 08 (Folio) started.</w:t>
+              <w:t xml:space="preserve">Sprint 08 (Folio) accepted: a running bill for every stay with room nights, meals, transport, activities and packages; nothing can be edited or deleted, a manager reverses a line with a reason; bills can be split; the front desk shows the real balance. Folio flow diagram. Sprint 09 (GST configuration and tax engine) started.</w:t>
             </w:r>
           </w:p>
         </w:tc>
@@ -757,7 +757,7 @@
                 <w:sz w:val="19"/>
                 <w:szCs w:val="19"/>
               </w:rPr>
-              <w:t xml:space="preserve">1.6</w:t>
+              <w:t xml:space="preserve">1.7</w:t>
             </w:r>
           </w:p>
         </w:tc>
@@ -788,7 +788,7 @@
                 <w:sz w:val="19"/>
                 <w:szCs w:val="19"/>
               </w:rPr>
-              <w:t xml:space="preserve">2026-10-17</w:t>
+              <w:t xml:space="preserve">2026-10-18</w:t>
             </w:r>
           </w:p>
         </w:tc>
@@ -819,7 +819,7 @@
                 <w:sz w:val="19"/>
                 <w:szCs w:val="19"/>
               </w:rPr>
-              <w:t xml:space="preserve">Sprint 06 (Reservation calendar) accepted: day, week and month calendar of rooms and dorm beds, moving a guest by drag-and-drop with a reason, list by day on phones. Room-move flow diagram. Sprint 07 (Front desk) started.</w:t>
+              <w:t xml:space="preserve">Sprint 07 (Front desk) accepted: arrivals, departures and in-house lists, check-in and check-out in a few clicks, walk-ins on one screen, early departures with a reason, rooms marked dirty and ready. Check-in flow diagram. Sprint 08 (Folio) started.</w:t>
             </w:r>
           </w:p>
         </w:tc>
@@ -854,7 +854,7 @@
                 <w:sz w:val="19"/>
                 <w:szCs w:val="19"/>
               </w:rPr>
-              <w:t xml:space="preserve">1.5</w:t>
+              <w:t xml:space="preserve">1.6</w:t>
             </w:r>
           </w:p>
         </w:tc>
@@ -884,7 +884,7 @@
                 <w:sz w:val="19"/>
                 <w:szCs w:val="19"/>
               </w:rPr>
-              <w:t xml:space="preserve">2026-10-15</w:t>
+              <w:t xml:space="preserve">2026-10-17</w:t>
             </w:r>
           </w:p>
         </w:tc>
@@ -914,7 +914,7 @@
                 <w:sz w:val="19"/>
                 <w:szCs w:val="19"/>
               </w:rPr>
-              <w:t xml:space="preserve">Sprint 05 (Availability engine and reservations) accepted: race-free booking, booking wizard, booking history, date pickers. Diagrams of the reservation tables and the booking flow. Sprint 06 (Reservation calendar) started.</w:t>
+              <w:t xml:space="preserve">Sprint 06 (Reservation calendar) accepted: day, week and month calendar of rooms and dorm beds, moving a guest by drag-and-drop with a reason, list by day on phones. Room-move flow diagram. Sprint 07 (Front desk) started.</w:t>
             </w:r>
           </w:p>
         </w:tc>
@@ -950,7 +950,7 @@
                 <w:sz w:val="19"/>
                 <w:szCs w:val="19"/>
               </w:rPr>
-              <w:t xml:space="preserve">1.4</w:t>
+              <w:t xml:space="preserve">1.5</w:t>
             </w:r>
           </w:p>
         </w:tc>
@@ -981,7 +981,7 @@
                 <w:sz w:val="19"/>
                 <w:szCs w:val="19"/>
               </w:rPr>
-              <w:t xml:space="preserve">2026-10-14</w:t>
+              <w:t xml:space="preserve">2026-10-15</w:t>
             </w:r>
           </w:p>
         </w:tc>
@@ -1012,7 +1012,7 @@
                 <w:sz w:val="19"/>
                 <w:szCs w:val="19"/>
               </w:rPr>
-              <w:t xml:space="preserve">Sprint 04 (Rate plans and packages) accepted: nightly price grid, quotes, packages with revenue split. Sprint 05 (Availability engine and reservations) started.</w:t>
+              <w:t xml:space="preserve">Sprint 05 (Availability engine and reservations) accepted: race-free booking, booking wizard, booking history, date pickers. Diagrams of the reservation tables and the booking flow. Sprint 06 (Reservation calendar) started.</w:t>
             </w:r>
           </w:p>
         </w:tc>
@@ -1047,7 +1047,7 @@
                 <w:sz w:val="19"/>
                 <w:szCs w:val="19"/>
               </w:rPr>
-              <w:t xml:space="preserve">1.3</w:t>
+              <w:t xml:space="preserve">1.4</w:t>
             </w:r>
           </w:p>
         </w:tc>
@@ -1077,7 +1077,7 @@
                 <w:sz w:val="19"/>
                 <w:szCs w:val="19"/>
               </w:rPr>
-              <w:t xml:space="preserve">2026-10-11</w:t>
+              <w:t xml:space="preserve">2026-10-14</w:t>
             </w:r>
           </w:p>
         </w:tc>
@@ -1107,7 +1107,7 @@
                 <w:sz w:val="19"/>
                 <w:szCs w:val="19"/>
               </w:rPr>
-              <w:t xml:space="preserve">Sprint 03 (Guests) accepted, with review fixes: Aadhaar number check and error messages that say why. Sprint 04 (Rate plans and packages) started.</w:t>
+              <w:t xml:space="preserve">Sprint 04 (Rate plans and packages) accepted: nightly price grid, quotes, packages with revenue split. Sprint 05 (Availability engine and reservations) started.</w:t>
             </w:r>
           </w:p>
         </w:tc>
@@ -1143,7 +1143,7 @@
                 <w:sz w:val="19"/>
                 <w:szCs w:val="19"/>
               </w:rPr>
-              <w:t xml:space="preserve">1.2.1</w:t>
+              <w:t xml:space="preserve">1.3</w:t>
             </w:r>
           </w:p>
         </w:tc>
@@ -1174,7 +1174,7 @@
                 <w:sz w:val="19"/>
                 <w:szCs w:val="19"/>
               </w:rPr>
-              <w:t xml:space="preserve">2026-10-10</w:t>
+              <w:t xml:space="preserve">2026-10-11</w:t>
             </w:r>
           </w:p>
         </w:tc>
@@ -1205,7 +1205,7 @@
                 <w:sz w:val="19"/>
                 <w:szCs w:val="19"/>
               </w:rPr>
-              <w:t xml:space="preserve">Sprint 03 (Guests) built and in review: guest profiles, encrypted ID documents, duplicates, merge, anonymise, consent.</w:t>
+              <w:t xml:space="preserve">Sprint 03 (Guests) accepted, with review fixes: Aadhaar number check and error messages that say why. Sprint 04 (Rate plans and packages) started.</w:t>
             </w:r>
           </w:p>
         </w:tc>
@@ -1240,6 +1240,102 @@
                 <w:sz w:val="19"/>
                 <w:szCs w:val="19"/>
               </w:rPr>
+              <w:t xml:space="preserve">1.2.1</w:t>
+            </w:r>
+          </w:p>
+        </w:tc>
+        <w:tc>
+          <w:tcPr>
+            <w:tcW w:type="dxa" w:w="1500"/>
+            <w:tcBorders>
+              <w:top w:val="single" w:color="DCE3E1" w:sz="4"/>
+              <w:left w:val="single" w:color="DCE3E1" w:sz="4"/>
+              <w:bottom w:val="single" w:color="DCE3E1" w:sz="4"/>
+              <w:right w:val="single" w:color="DCE3E1" w:sz="4"/>
+            </w:tcBorders>
+            <w:tcMar>
+              <w:top w:type="dxa" w:w="70"/>
+              <w:left w:type="dxa" w:w="110"/>
+              <w:bottom w:type="dxa" w:w="50"/>
+              <w:right w:type="dxa" w:w="110"/>
+            </w:tcMar>
+            <w:vAlign w:val="top"/>
+          </w:tcPr>
+          <w:p>
+            <w:pPr>
+              <w:spacing w:after="40" w:line="252" w:lineRule="auto"/>
+            </w:pPr>
+            <w:r>
+              <w:rPr>
+                <w:sz w:val="19"/>
+                <w:szCs w:val="19"/>
+              </w:rPr>
+              <w:t xml:space="preserve">2026-10-10</w:t>
+            </w:r>
+          </w:p>
+        </w:tc>
+        <w:tc>
+          <w:tcPr>
+            <w:tcW w:type="dxa" w:w="6714"/>
+            <w:tcBorders>
+              <w:top w:val="single" w:color="DCE3E1" w:sz="4"/>
+              <w:left w:val="single" w:color="DCE3E1" w:sz="4"/>
+              <w:bottom w:val="single" w:color="DCE3E1" w:sz="4"/>
+              <w:right w:val="single" w:color="DCE3E1" w:sz="4"/>
+            </w:tcBorders>
+            <w:tcMar>
+              <w:top w:type="dxa" w:w="70"/>
+              <w:left w:type="dxa" w:w="110"/>
+              <w:bottom w:type="dxa" w:w="50"/>
+              <w:right w:type="dxa" w:w="110"/>
+            </w:tcMar>
+            <w:vAlign w:val="top"/>
+          </w:tcPr>
+          <w:p>
+            <w:pPr>
+              <w:spacing w:after="40" w:line="252" w:lineRule="auto"/>
+            </w:pPr>
+            <w:r>
+              <w:rPr>
+                <w:sz w:val="19"/>
+                <w:szCs w:val="19"/>
+              </w:rPr>
+              <w:t xml:space="preserve">Sprint 03 (Guests) built and in review: guest profiles, encrypted ID documents, duplicates, merge, anonymise, consent.</w:t>
+            </w:r>
+          </w:p>
+        </w:tc>
+      </w:tr>
+      <w:tr>
+        <w:trPr>
+          <w:cantSplit/>
+        </w:trPr>
+        <w:tc>
+          <w:tcPr>
+            <w:tcW w:type="dxa" w:w="1100"/>
+            <w:tcBorders>
+              <w:top w:val="single" w:color="DCE3E1" w:sz="4"/>
+              <w:left w:val="single" w:color="DCE3E1" w:sz="4"/>
+              <w:bottom w:val="single" w:color="DCE3E1" w:sz="4"/>
+              <w:right w:val="single" w:color="DCE3E1" w:sz="4"/>
+            </w:tcBorders>
+            <w:shd w:fill="F5F7F6" w:color="auto" w:val="clear"/>
+            <w:tcMar>
+              <w:top w:type="dxa" w:w="70"/>
+              <w:left w:type="dxa" w:w="110"/>
+              <w:bottom w:type="dxa" w:w="50"/>
+              <w:right w:type="dxa" w:w="110"/>
+            </w:tcMar>
+            <w:vAlign w:val="top"/>
+          </w:tcPr>
+          <w:p>
+            <w:pPr>
+              <w:spacing w:after="40" w:line="252" w:lineRule="auto"/>
+            </w:pPr>
+            <w:r>
+              <w:rPr>
+                <w:sz w:val="19"/>
+                <w:szCs w:val="19"/>
+              </w:rPr>
               <w:t xml:space="preserve">1.2</w:t>
             </w:r>
           </w:p>
@@ -1253,6 +1349,7 @@
               <w:bottom w:val="single" w:color="DCE3E1" w:sz="4"/>
               <w:right w:val="single" w:color="DCE3E1" w:sz="4"/>
             </w:tcBorders>
+            <w:shd w:fill="F5F7F6" w:color="auto" w:val="clear"/>
             <w:tcMar>
               <w:top w:type="dxa" w:w="70"/>
               <w:left w:type="dxa" w:w="110"/>
@@ -1283,6 +1380,7 @@
               <w:bottom w:val="single" w:color="DCE3E1" w:sz="4"/>
               <w:right w:val="single" w:color="DCE3E1" w:sz="4"/>
             </w:tcBorders>
+            <w:shd w:fill="F5F7F6" w:color="auto" w:val="clear"/>
             <w:tcMar>
               <w:top w:type="dxa" w:w="70"/>
               <w:left w:type="dxa" w:w="110"/>
@@ -1533,7 +1631,7 @@
                 <w:sz w:val="19"/>
                 <w:szCs w:val="19"/>
               </w:rPr>
-              <w:t xml:space="preserve">Living document, rebuilt at the end of every sprint. This edition reflects Sprint 07 accepted and Sprint 08 in progress.</w:t>
+              <w:t xml:space="preserve">Living document, rebuilt at the end of every sprint. This edition reflects Sprint 08 accepted and Sprint 09 in progress.</w:t>
             </w:r>
           </w:p>
         </w:tc>
@@ -2387,7 +2485,33 @@
           <w:sz w:val="19"/>
           <w:szCs w:val="19"/>
         </w:rPr>
-        <w:t xml:space="preserve">In progress: Sprint 08 — Folio</w:t>
+        <w:t xml:space="preserve">Sprint 08 — Folio</w:t>
+      </w:r>
+    </w:p>
+    <w:p>
+      <w:pPr>
+        <w:spacing w:after="30" w:before="0"/>
+        <w:ind w:left="420"/>
+      </w:pPr>
+      <w:r>
+        <w:rPr>
+          <w:b w:val="false"/>
+          <w:bCs w:val="false"/>
+          <w:color w:val="8A2449"/>
+          <w:sz w:val="19"/>
+          <w:szCs w:val="19"/>
+        </w:rPr>
+        <w:t xml:space="preserve">9.9  </w:t>
+      </w:r>
+      <w:r>
+        <w:rPr>
+          <w:b w:val="false"/>
+          <w:bCs w:val="false"/>
+          <w:color w:val="1B2A2E"/>
+          <w:sz w:val="19"/>
+          <w:szCs w:val="19"/>
+        </w:rPr>
+        <w:t xml:space="preserve">In progress: Sprint 09 — GST configuration and tax engine</w:t>
       </w:r>
     </w:p>
     <w:p>
@@ -2710,7 +2834,7 @@
                 <w:sz w:val="40"/>
                 <w:szCs w:val="40"/>
               </w:rPr>
-              <w:t xml:space="preserve">7 of 29</w:t>
+              <w:t xml:space="preserve">8 of 29</w:t>
             </w:r>
           </w:p>
           <w:p>
@@ -3075,7 +3199,7 @@
                 <w:sz w:val="19"/>
                 <w:szCs w:val="19"/>
               </w:rPr>
-              <w:t xml:space="preserve">Sprints 01 and 02 and 03 and 04 and 05 and 06 and 07 are delivered and accepted. Sprint 08 (Folio) is in progress.</w:t>
+              <w:t xml:space="preserve">Sprints 01 and 02 and 03 and 04 and 05 and 06 and 07 and 08 are delivered and accepted. Sprint 09 (GST configuration and tax engine) is in progress.</w:t>
             </w:r>
           </w:p>
         </w:tc>
@@ -5283,25 +5407,25 @@
               <w:bottom w:val="single" w:color="DCE3E1" w:sz="4"/>
               <w:right w:val="single" w:color="DCE3E1" w:sz="4"/>
             </w:tcBorders>
-            <w:shd w:fill="FBEFD8" w:color="auto" w:val="clear"/>
-            <w:tcMar>
-              <w:top w:type="dxa" w:w="70"/>
-              <w:left w:type="dxa" w:w="110"/>
-              <w:bottom w:type="dxa" w:w="50"/>
-              <w:right w:type="dxa" w:w="110"/>
-            </w:tcMar>
-            <w:vAlign w:val="top"/>
-          </w:tcPr>
-          <w:p>
-            <w:pPr>
-              <w:spacing w:after="40" w:line="252" w:lineRule="auto"/>
-            </w:pPr>
-            <w:r>
-              <w:rPr>
-                <w:sz w:val="19"/>
-                <w:szCs w:val="19"/>
-              </w:rPr>
-              <w:t xml:space="preserve">In progress</w:t>
+            <w:shd w:fill="E3F0E6" w:color="auto" w:val="clear"/>
+            <w:tcMar>
+              <w:top w:type="dxa" w:w="70"/>
+              <w:left w:type="dxa" w:w="110"/>
+              <w:bottom w:type="dxa" w:w="50"/>
+              <w:right w:type="dxa" w:w="110"/>
+            </w:tcMar>
+            <w:vAlign w:val="top"/>
+          </w:tcPr>
+          <w:p>
+            <w:pPr>
+              <w:spacing w:after="40" w:line="252" w:lineRule="auto"/>
+            </w:pPr>
+            <w:r>
+              <w:rPr>
+                <w:sz w:val="19"/>
+                <w:szCs w:val="19"/>
+              </w:rPr>
+              <w:t xml:space="preserve">Done</w:t>
             </w:r>
           </w:p>
         </w:tc>
@@ -5379,24 +5503,25 @@
               <w:bottom w:val="single" w:color="DCE3E1" w:sz="4"/>
               <w:right w:val="single" w:color="DCE3E1" w:sz="4"/>
             </w:tcBorders>
-            <w:tcMar>
-              <w:top w:type="dxa" w:w="70"/>
-              <w:left w:type="dxa" w:w="110"/>
-              <w:bottom w:type="dxa" w:w="50"/>
-              <w:right w:type="dxa" w:w="110"/>
-            </w:tcMar>
-            <w:vAlign w:val="top"/>
-          </w:tcPr>
-          <w:p>
-            <w:pPr>
-              <w:spacing w:after="40" w:line="252" w:lineRule="auto"/>
-            </w:pPr>
-            <w:r>
-              <w:rPr>
-                <w:sz w:val="19"/>
-                <w:szCs w:val="19"/>
-              </w:rPr>
-              <w:t xml:space="preserve">Planned</w:t>
+            <w:shd w:fill="FBEFD8" w:color="auto" w:val="clear"/>
+            <w:tcMar>
+              <w:top w:type="dxa" w:w="70"/>
+              <w:left w:type="dxa" w:w="110"/>
+              <w:bottom w:type="dxa" w:w="50"/>
+              <w:right w:type="dxa" w:w="110"/>
+            </w:tcMar>
+            <w:vAlign w:val="top"/>
+          </w:tcPr>
+          <w:p>
+            <w:pPr>
+              <w:spacing w:after="40" w:line="252" w:lineRule="auto"/>
+            </w:pPr>
+            <w:r>
+              <w:rPr>
+                <w:sz w:val="19"/>
+                <w:szCs w:val="19"/>
+              </w:rPr>
+              <w:t xml:space="preserve">In progress</w:t>
             </w:r>
           </w:p>
         </w:tc>
@@ -12438,7 +12563,7 @@
     </w:p>
     <w:p>
       <w:r>
-        <w:t xml:space="preserve">Work is delivered in short sprints, and each one ends with the owner trying the new screens and accepting them. These are the parts that are built, tested and accepted as of Sprint 07.</w:t>
+        <w:t xml:space="preserve">Work is delivered in short sprints, and each one ends with the owner trying the new screens and accepting them. These are the parts that are built, tested and accepted as of Sprint 08.</w:t>
       </w:r>
     </w:p>
     <w:p>
@@ -14325,12 +14450,286 @@
         <w:pStyle w:val="Heading2"/>
       </w:pPr>
       <w:r>
-        <w:t xml:space="preserve">9.8   In progress: Sprint 08 — Folio</w:t>
+        <w:t xml:space="preserve">9.8   Sprint 08 — Folio</w:t>
       </w:r>
     </w:p>
     <w:p>
       <w:r>
         <w:t xml:space="preserve">Every stay has one running bill (folio) that collects room charges, meals, activities and transport.</w:t>
+      </w:r>
+    </w:p>
+    <w:p>
+      <w:pPr>
+        <w:pStyle w:val="ListParagraph"/>
+        <w:numPr>
+          <w:ilvl w:val="0"/>
+          <w:numId w:val="2"/>
+        </w:numPr>
+        <w:spacing w:after="60"/>
+      </w:pPr>
+      <w:r>
+        <w:t xml:space="preserve">Every stay has a running bill (folio) with room nights, meals, transport and activities</w:t>
+      </w:r>
+    </w:p>
+    <w:p>
+      <w:pPr>
+        <w:pStyle w:val="ListParagraph"/>
+        <w:numPr>
+          <w:ilvl w:val="0"/>
+          <w:numId w:val="2"/>
+        </w:numPr>
+        <w:spacing w:after="60"/>
+      </w:pPr>
+      <w:r>
+        <w:t xml:space="preserve">Staff post charges in a few clicks; a package becomes one line per part</w:t>
+      </w:r>
+    </w:p>
+    <w:p>
+      <w:pPr>
+        <w:pStyle w:val="ListParagraph"/>
+        <w:numPr>
+          <w:ilvl w:val="0"/>
+          <w:numId w:val="2"/>
+        </w:numPr>
+        <w:spacing w:after="60"/>
+      </w:pPr>
+      <w:r>
+        <w:t xml:space="preserve">Nothing on a bill can be edited or deleted: a manager reverses a line with a reason and both stay visible</w:t>
+      </w:r>
+    </w:p>
+    <w:p>
+      <w:pPr>
+        <w:pStyle w:val="ListParagraph"/>
+        <w:numPr>
+          <w:ilvl w:val="0"/>
+          <w:numId w:val="2"/>
+        </w:numPr>
+        <w:spacing w:after="60"/>
+      </w:pPr>
+      <w:r>
+        <w:t xml:space="preserve">Room nights go on the bill by themselves, and a guest leaving early isn't charged for the nights given back</w:t>
+      </w:r>
+    </w:p>
+    <w:p>
+      <w:pPr>
+        <w:pStyle w:val="ListParagraph"/>
+        <w:numPr>
+          <w:ilvl w:val="0"/>
+          <w:numId w:val="2"/>
+        </w:numPr>
+        <w:spacing w:after="60"/>
+      </w:pPr>
+      <w:r>
+        <w:t xml:space="preserve">A bill can be split, e.g. a friend or the company pays part of it</w:t>
+      </w:r>
+    </w:p>
+    <w:p>
+      <w:pPr>
+        <w:pStyle w:val="ListParagraph"/>
+        <w:numPr>
+          <w:ilvl w:val="0"/>
+          <w:numId w:val="2"/>
+        </w:numPr>
+        <w:spacing w:after="60"/>
+      </w:pPr>
+      <w:r>
+        <w:t xml:space="preserve">The front desk shows what each guest owes</w:t>
+      </w:r>
+    </w:p>
+    <w:p>
+      <w:pPr>
+        <w:keepNext/>
+        <w:pBdr>
+          <w:top w:val="single" w:color="DCE3E1" w:sz="4"/>
+          <w:bottom w:val="single" w:color="DCE3E1" w:sz="4"/>
+          <w:left w:val="single" w:color="DCE3E1" w:sz="4"/>
+          <w:right w:val="single" w:color="DCE3E1" w:sz="4"/>
+        </w:pBdr>
+        <w:spacing w:before="120" w:after="0" w:line="240" w:lineRule="auto"/>
+        <w:jc w:val="center"/>
+      </w:pPr>
+      <w:r>
+        <w:drawing>
+          <wp:inline distT="0" distB="0" distL="0" distR="0">
+            <wp:extent cx="5124450" cy="3438525"/>
+            <wp:effectExtent t="0" r="0" b="0" l="0"/>
+            <wp:docPr id="1" name="Folios: the bills of the stays" descr="Folios: the bills of the stays" title="Folios: the bills of the stays"/>
+            <wp:cNvGraphicFramePr>
+              <a:graphicFrameLocks xmlns:a="http://schemas.openxmlformats.org/drawingml/2006/main" noChangeAspect="1"/>
+            </wp:cNvGraphicFramePr>
+            <a:graphic xmlns:a="http://schemas.openxmlformats.org/drawingml/2006/main">
+              <a:graphicData uri="http://schemas.openxmlformats.org/drawingml/2006/picture">
+                <pic:pic xmlns:pic="http://schemas.openxmlformats.org/drawingml/2006/picture">
+                  <pic:nvPicPr>
+                    <pic:cNvPr id="0" name="" descr=""/>
+                    <pic:cNvPicPr>
+                      <a:picLocks noChangeAspect="1" noChangeArrowheads="1"/>
+                    </pic:cNvPicPr>
+                  </pic:nvPicPr>
+                  <pic:blipFill>
+                    <a:blip r:embed="rId32" cstate="none"/>
+                    <a:srcRect/>
+                    <a:stretch>
+                      <a:fillRect/>
+                    </a:stretch>
+                  </pic:blipFill>
+                  <pic:spPr bwMode="auto">
+                    <a:xfrm>
+                      <a:off x="0" y="0"/>
+                      <a:ext cx="5124450" cy="3438525"/>
+                    </a:xfrm>
+                    <a:prstGeom prst="rect">
+                      <a:avLst/>
+                    </a:prstGeom>
+                  </pic:spPr>
+                </pic:pic>
+              </a:graphicData>
+            </a:graphic>
+          </wp:inline>
+        </w:drawing>
+      </w:r>
+    </w:p>
+    <w:p>
+      <w:pPr>
+        <w:pStyle w:val="Caption"/>
+      </w:pPr>
+      <w:r>
+        <w:t xml:space="preserve">Folios: the bills of the stays</w:t>
+      </w:r>
+    </w:p>
+    <w:p>
+      <w:pPr>
+        <w:keepNext/>
+        <w:pBdr>
+          <w:top w:val="single" w:color="DCE3E1" w:sz="4"/>
+          <w:bottom w:val="single" w:color="DCE3E1" w:sz="4"/>
+          <w:left w:val="single" w:color="DCE3E1" w:sz="4"/>
+          <w:right w:val="single" w:color="DCE3E1" w:sz="4"/>
+        </w:pBdr>
+        <w:spacing w:before="120" w:after="0" w:line="240" w:lineRule="auto"/>
+        <w:jc w:val="center"/>
+      </w:pPr>
+      <w:r>
+        <w:drawing>
+          <wp:inline distT="0" distB="0" distL="0" distR="0">
+            <wp:extent cx="5124450" cy="3438525"/>
+            <wp:effectExtent t="0" r="0" b="0" l="0"/>
+            <wp:docPr id="1" name="A bill: balance, sums by category and every line" descr="A bill: balance, sums by category and every line" title="A bill: balance, sums by category and every line"/>
+            <wp:cNvGraphicFramePr>
+              <a:graphicFrameLocks xmlns:a="http://schemas.openxmlformats.org/drawingml/2006/main" noChangeAspect="1"/>
+            </wp:cNvGraphicFramePr>
+            <a:graphic xmlns:a="http://schemas.openxmlformats.org/drawingml/2006/main">
+              <a:graphicData uri="http://schemas.openxmlformats.org/drawingml/2006/picture">
+                <pic:pic xmlns:pic="http://schemas.openxmlformats.org/drawingml/2006/picture">
+                  <pic:nvPicPr>
+                    <pic:cNvPr id="0" name="" descr=""/>
+                    <pic:cNvPicPr>
+                      <a:picLocks noChangeAspect="1" noChangeArrowheads="1"/>
+                    </pic:cNvPicPr>
+                  </pic:nvPicPr>
+                  <pic:blipFill>
+                    <a:blip r:embed="rId33" cstate="none"/>
+                    <a:srcRect/>
+                    <a:stretch>
+                      <a:fillRect/>
+                    </a:stretch>
+                  </pic:blipFill>
+                  <pic:spPr bwMode="auto">
+                    <a:xfrm>
+                      <a:off x="0" y="0"/>
+                      <a:ext cx="5124450" cy="3438525"/>
+                    </a:xfrm>
+                    <a:prstGeom prst="rect">
+                      <a:avLst/>
+                    </a:prstGeom>
+                  </pic:spPr>
+                </pic:pic>
+              </a:graphicData>
+            </a:graphic>
+          </wp:inline>
+        </w:drawing>
+      </w:r>
+    </w:p>
+    <w:p>
+      <w:pPr>
+        <w:pStyle w:val="Caption"/>
+      </w:pPr>
+      <w:r>
+        <w:t xml:space="preserve">A bill: balance, sums by category and every line</w:t>
+      </w:r>
+    </w:p>
+    <w:p>
+      <w:pPr>
+        <w:keepNext/>
+        <w:pBdr>
+          <w:top w:val="single" w:color="DCE3E1" w:sz="4"/>
+          <w:bottom w:val="single" w:color="DCE3E1" w:sz="4"/>
+          <w:left w:val="single" w:color="DCE3E1" w:sz="4"/>
+          <w:right w:val="single" w:color="DCE3E1" w:sz="4"/>
+        </w:pBdr>
+        <w:spacing w:before="120" w:after="0" w:line="240" w:lineRule="auto"/>
+        <w:jc w:val="center"/>
+      </w:pPr>
+      <w:r>
+        <w:drawing>
+          <wp:inline distT="0" distB="0" distL="0" distR="0">
+            <wp:extent cx="5124450" cy="3438525"/>
+            <wp:effectExtent t="0" r="0" b="0" l="0"/>
+            <wp:docPr id="1" name="Posting a charge" descr="Posting a charge" title="Posting a charge"/>
+            <wp:cNvGraphicFramePr>
+              <a:graphicFrameLocks xmlns:a="http://schemas.openxmlformats.org/drawingml/2006/main" noChangeAspect="1"/>
+            </wp:cNvGraphicFramePr>
+            <a:graphic xmlns:a="http://schemas.openxmlformats.org/drawingml/2006/main">
+              <a:graphicData uri="http://schemas.openxmlformats.org/drawingml/2006/picture">
+                <pic:pic xmlns:pic="http://schemas.openxmlformats.org/drawingml/2006/picture">
+                  <pic:nvPicPr>
+                    <pic:cNvPr id="0" name="" descr=""/>
+                    <pic:cNvPicPr>
+                      <a:picLocks noChangeAspect="1" noChangeArrowheads="1"/>
+                    </pic:cNvPicPr>
+                  </pic:nvPicPr>
+                  <pic:blipFill>
+                    <a:blip r:embed="rId34" cstate="none"/>
+                    <a:srcRect/>
+                    <a:stretch>
+                      <a:fillRect/>
+                    </a:stretch>
+                  </pic:blipFill>
+                  <pic:spPr bwMode="auto">
+                    <a:xfrm>
+                      <a:off x="0" y="0"/>
+                      <a:ext cx="5124450" cy="3438525"/>
+                    </a:xfrm>
+                    <a:prstGeom prst="rect">
+                      <a:avLst/>
+                    </a:prstGeom>
+                  </pic:spPr>
+                </pic:pic>
+              </a:graphicData>
+            </a:graphic>
+          </wp:inline>
+        </w:drawing>
+      </w:r>
+    </w:p>
+    <w:p>
+      <w:pPr>
+        <w:pStyle w:val="Caption"/>
+      </w:pPr>
+      <w:r>
+        <w:t xml:space="preserve">Posting a charge</w:t>
+      </w:r>
+    </w:p>
+    <w:p>
+      <w:pPr>
+        <w:pStyle w:val="Heading2"/>
+      </w:pPr>
+      <w:r>
+        <w:t xml:space="preserve">9.9   In progress: Sprint 09 — GST configuration and tax engine</w:t>
+      </w:r>
+    </w:p>
+    <w:p>
+      <w:r>
+        <w:t xml:space="preserve">GST is calculated automatically and correctly for each item (CGST/SGST or IGST), with rates kept up to date by configuration, not code.</w:t>
       </w:r>
     </w:p>
     <w:p>
@@ -14343,7 +14742,7 @@
           <w:sz w:val="18"/>
           <w:szCs w:val="18"/>
         </w:rPr>
-        <w:t xml:space="preserve">It will be accepted when: Folio shows charges, reversals and balance; nothing can be deleted.</w:t>
+        <w:t xml:space="preserve">It will be accepted when: Accountant can add a new rule effective next month without a deployment.</w:t>
       </w:r>
     </w:p>
     <w:p>
@@ -17181,7 +17580,7 @@
               <w:bottom w:val="single" w:color="DCE3E1" w:sz="4"/>
               <w:right w:val="single" w:color="DCE3E1" w:sz="4"/>
             </w:tcBorders>
-            <w:shd w:fill="FBEFD8" w:color="auto" w:val="clear"/>
+            <w:shd w:fill="E3F0E6" w:color="auto" w:val="clear"/>
             <w:tcMar>
               <w:top w:type="dxa" w:w="70"/>
               <w:left w:type="dxa" w:w="110"/>
@@ -17199,7 +17598,7 @@
                 <w:sz w:val="17"/>
                 <w:szCs w:val="17"/>
               </w:rPr>
-              <w:t xml:space="preserve">In progress</w:t>
+              <w:t xml:space="preserve">Done</w:t>
             </w:r>
           </w:p>
         </w:tc>
@@ -17307,6 +17706,7 @@
               <w:bottom w:val="single" w:color="DCE3E1" w:sz="4"/>
               <w:right w:val="single" w:color="DCE3E1" w:sz="4"/>
             </w:tcBorders>
+            <w:shd w:fill="FBEFD8" w:color="auto" w:val="clear"/>
             <w:tcMar>
               <w:top w:type="dxa" w:w="70"/>
               <w:left w:type="dxa" w:w="110"/>
@@ -17324,7 +17724,7 @@
                 <w:sz w:val="17"/>
                 <w:szCs w:val="17"/>
               </w:rPr>
-              <w:t xml:space="preserve">Planned</w:t>
+              <w:t xml:space="preserve">In progress</w:t>
             </w:r>
           </w:p>
         </w:tc>
@@ -19877,7 +20277,7 @@
                     </pic:cNvPicPr>
                   </pic:nvPicPr>
                   <pic:blipFill>
-                    <a:blip r:embed="rId32" cstate="none"/>
+                    <a:blip r:embed="rId35" cstate="none"/>
                     <a:srcRect/>
                     <a:stretch>
                       <a:fillRect/>
@@ -19984,7 +20384,7 @@
         <w:t xml:space="preserve">Tests that grow with the system.</w:t>
       </w:r>
       <w:r>
-        <w:t xml:space="preserve"> As of Sprint 07: 157 server test methods, 59 screen tests and 69 end-to-end browser steps, all passing.</w:t>
+        <w:t xml:space="preserve"> As of Sprint 08: 174 server test methods, 63 screen tests and 76 end-to-end browser steps, all passing.</w:t>
       </w:r>
     </w:p>
     <w:p>
@@ -21871,7 +22271,7 @@
         <w:sz w:val="16"/>
         <w:szCs w:val="16"/>
       </w:rPr>
-      <w:t xml:space="preserve">Version 1.7 · 18 October 2026</w:t>
+      <w:t xml:space="preserve">Version 1.8 · 18 October 2026</w:t>
     </w:r>
     <w:r>
       <w:rPr>

</xml_diff>

<commit_message>
chore(sprints): accept Sprint 08 (#123)
Sprint 08 (Folio) done, Sprint 09 current; changelog dated; handbooks 1.8
rebuilt; guides, catalogues, README and run/test table updated.


Claude-Session: https://claude.ai/code/session_01AgFF7nxGrK3Qcw6cm4B43X

Co-authored-by: Claude <noreply@anthropic.com>
</commit_message>
<xml_diff>
--- a/docs/handbooks/Resort-OS-Product-Overview.docx
+++ b/docs/handbooks/Resort-OS-Product-Overview.docx
@@ -182,7 +182,7 @@
                 <w:sz w:val="19"/>
                 <w:szCs w:val="19"/>
               </w:rPr>
-              <w:t xml:space="preserve">Version 1.7</w:t>
+              <w:t xml:space="preserve">Version 1.8</w:t>
             </w:r>
           </w:p>
         </w:tc>
@@ -322,7 +322,7 @@
                 <w:sz w:val="19"/>
                 <w:szCs w:val="19"/>
               </w:rPr>
-              <w:t xml:space="preserve">Sprints 01, 02, 03, 04, 05, 06, 07 accepted · Sprint 08 Folio in progress</w:t>
+              <w:t xml:space="preserve">Sprints 01, 02, 03, 04, 05, 06, 07, 08 accepted · Sprint 09 GST configuration and tax engine in progress</w:t>
             </w:r>
           </w:p>
         </w:tc>
@@ -661,7 +661,7 @@
                 <w:sz w:val="19"/>
                 <w:szCs w:val="19"/>
               </w:rPr>
-              <w:t xml:space="preserve">1.7</w:t>
+              <w:t xml:space="preserve">1.8</w:t>
             </w:r>
           </w:p>
         </w:tc>
@@ -721,7 +721,7 @@
                 <w:sz w:val="19"/>
                 <w:szCs w:val="19"/>
               </w:rPr>
-              <w:t xml:space="preserve">Sprint 07 (Front desk) accepted: arrivals, departures and in-house lists, check-in and check-out in a few clicks, walk-ins on one screen, early departures with a reason, rooms marked dirty and ready. Check-in flow diagram. Sprint 08 (Folio) started.</w:t>
+              <w:t xml:space="preserve">Sprint 08 (Folio) accepted: a running bill for every stay with room nights, meals, transport, activities and packages; nothing can be edited or deleted, a manager reverses a line with a reason; bills can be split; the front desk shows the real balance. Folio flow diagram. Sprint 09 (GST configuration and tax engine) started.</w:t>
             </w:r>
           </w:p>
         </w:tc>
@@ -757,7 +757,7 @@
                 <w:sz w:val="19"/>
                 <w:szCs w:val="19"/>
               </w:rPr>
-              <w:t xml:space="preserve">1.6</w:t>
+              <w:t xml:space="preserve">1.7</w:t>
             </w:r>
           </w:p>
         </w:tc>
@@ -788,7 +788,7 @@
                 <w:sz w:val="19"/>
                 <w:szCs w:val="19"/>
               </w:rPr>
-              <w:t xml:space="preserve">2026-10-17</w:t>
+              <w:t xml:space="preserve">2026-10-18</w:t>
             </w:r>
           </w:p>
         </w:tc>
@@ -819,7 +819,7 @@
                 <w:sz w:val="19"/>
                 <w:szCs w:val="19"/>
               </w:rPr>
-              <w:t xml:space="preserve">Sprint 06 (Reservation calendar) accepted: day, week and month calendar of rooms and dorm beds, moving a guest by drag-and-drop with a reason, list by day on phones. Room-move flow diagram. Sprint 07 (Front desk) started.</w:t>
+              <w:t xml:space="preserve">Sprint 07 (Front desk) accepted: arrivals, departures and in-house lists, check-in and check-out in a few clicks, walk-ins on one screen, early departures with a reason, rooms marked dirty and ready. Check-in flow diagram. Sprint 08 (Folio) started.</w:t>
             </w:r>
           </w:p>
         </w:tc>
@@ -854,7 +854,7 @@
                 <w:sz w:val="19"/>
                 <w:szCs w:val="19"/>
               </w:rPr>
-              <w:t xml:space="preserve">1.5</w:t>
+              <w:t xml:space="preserve">1.6</w:t>
             </w:r>
           </w:p>
         </w:tc>
@@ -884,7 +884,7 @@
                 <w:sz w:val="19"/>
                 <w:szCs w:val="19"/>
               </w:rPr>
-              <w:t xml:space="preserve">2026-10-15</w:t>
+              <w:t xml:space="preserve">2026-10-17</w:t>
             </w:r>
           </w:p>
         </w:tc>
@@ -914,7 +914,7 @@
                 <w:sz w:val="19"/>
                 <w:szCs w:val="19"/>
               </w:rPr>
-              <w:t xml:space="preserve">Sprint 05 (Availability engine and reservations) accepted: race-free booking, booking wizard, booking history, date pickers. Diagrams of the reservation tables and the booking flow. Sprint 06 (Reservation calendar) started.</w:t>
+              <w:t xml:space="preserve">Sprint 06 (Reservation calendar) accepted: day, week and month calendar of rooms and dorm beds, moving a guest by drag-and-drop with a reason, list by day on phones. Room-move flow diagram. Sprint 07 (Front desk) started.</w:t>
             </w:r>
           </w:p>
         </w:tc>
@@ -950,7 +950,7 @@
                 <w:sz w:val="19"/>
                 <w:szCs w:val="19"/>
               </w:rPr>
-              <w:t xml:space="preserve">1.4</w:t>
+              <w:t xml:space="preserve">1.5</w:t>
             </w:r>
           </w:p>
         </w:tc>
@@ -981,7 +981,7 @@
                 <w:sz w:val="19"/>
                 <w:szCs w:val="19"/>
               </w:rPr>
-              <w:t xml:space="preserve">2026-10-14</w:t>
+              <w:t xml:space="preserve">2026-10-15</w:t>
             </w:r>
           </w:p>
         </w:tc>
@@ -1012,7 +1012,7 @@
                 <w:sz w:val="19"/>
                 <w:szCs w:val="19"/>
               </w:rPr>
-              <w:t xml:space="preserve">Sprint 04 (Rate plans and packages) accepted: nightly price grid, quotes, packages with revenue split. Sprint 05 (Availability engine and reservations) started.</w:t>
+              <w:t xml:space="preserve">Sprint 05 (Availability engine and reservations) accepted: race-free booking, booking wizard, booking history, date pickers. Diagrams of the reservation tables and the booking flow. Sprint 06 (Reservation calendar) started.</w:t>
             </w:r>
           </w:p>
         </w:tc>
@@ -1047,7 +1047,7 @@
                 <w:sz w:val="19"/>
                 <w:szCs w:val="19"/>
               </w:rPr>
-              <w:t xml:space="preserve">1.3</w:t>
+              <w:t xml:space="preserve">1.4</w:t>
             </w:r>
           </w:p>
         </w:tc>
@@ -1077,7 +1077,7 @@
                 <w:sz w:val="19"/>
                 <w:szCs w:val="19"/>
               </w:rPr>
-              <w:t xml:space="preserve">2026-10-11</w:t>
+              <w:t xml:space="preserve">2026-10-14</w:t>
             </w:r>
           </w:p>
         </w:tc>
@@ -1107,7 +1107,7 @@
                 <w:sz w:val="19"/>
                 <w:szCs w:val="19"/>
               </w:rPr>
-              <w:t xml:space="preserve">Sprint 03 (Guests) accepted, with review fixes: Aadhaar number check and error messages that say why. Sprint 04 (Rate plans and packages) started.</w:t>
+              <w:t xml:space="preserve">Sprint 04 (Rate plans and packages) accepted: nightly price grid, quotes, packages with revenue split. Sprint 05 (Availability engine and reservations) started.</w:t>
             </w:r>
           </w:p>
         </w:tc>
@@ -1143,7 +1143,7 @@
                 <w:sz w:val="19"/>
                 <w:szCs w:val="19"/>
               </w:rPr>
-              <w:t xml:space="preserve">1.2.1</w:t>
+              <w:t xml:space="preserve">1.3</w:t>
             </w:r>
           </w:p>
         </w:tc>
@@ -1174,7 +1174,7 @@
                 <w:sz w:val="19"/>
                 <w:szCs w:val="19"/>
               </w:rPr>
-              <w:t xml:space="preserve">2026-10-10</w:t>
+              <w:t xml:space="preserve">2026-10-11</w:t>
             </w:r>
           </w:p>
         </w:tc>
@@ -1205,7 +1205,7 @@
                 <w:sz w:val="19"/>
                 <w:szCs w:val="19"/>
               </w:rPr>
-              <w:t xml:space="preserve">Sprint 03 (Guests) built and in review: guest profiles, encrypted ID documents, duplicates, merge, anonymise, consent.</w:t>
+              <w:t xml:space="preserve">Sprint 03 (Guests) accepted, with review fixes: Aadhaar number check and error messages that say why. Sprint 04 (Rate plans and packages) started.</w:t>
             </w:r>
           </w:p>
         </w:tc>
@@ -1240,6 +1240,102 @@
                 <w:sz w:val="19"/>
                 <w:szCs w:val="19"/>
               </w:rPr>
+              <w:t xml:space="preserve">1.2.1</w:t>
+            </w:r>
+          </w:p>
+        </w:tc>
+        <w:tc>
+          <w:tcPr>
+            <w:tcW w:type="dxa" w:w="1500"/>
+            <w:tcBorders>
+              <w:top w:val="single" w:color="DCE3E1" w:sz="4"/>
+              <w:left w:val="single" w:color="DCE3E1" w:sz="4"/>
+              <w:bottom w:val="single" w:color="DCE3E1" w:sz="4"/>
+              <w:right w:val="single" w:color="DCE3E1" w:sz="4"/>
+            </w:tcBorders>
+            <w:tcMar>
+              <w:top w:type="dxa" w:w="70"/>
+              <w:left w:type="dxa" w:w="110"/>
+              <w:bottom w:type="dxa" w:w="50"/>
+              <w:right w:type="dxa" w:w="110"/>
+            </w:tcMar>
+            <w:vAlign w:val="top"/>
+          </w:tcPr>
+          <w:p>
+            <w:pPr>
+              <w:spacing w:after="40" w:line="252" w:lineRule="auto"/>
+            </w:pPr>
+            <w:r>
+              <w:rPr>
+                <w:sz w:val="19"/>
+                <w:szCs w:val="19"/>
+              </w:rPr>
+              <w:t xml:space="preserve">2026-10-10</w:t>
+            </w:r>
+          </w:p>
+        </w:tc>
+        <w:tc>
+          <w:tcPr>
+            <w:tcW w:type="dxa" w:w="6714"/>
+            <w:tcBorders>
+              <w:top w:val="single" w:color="DCE3E1" w:sz="4"/>
+              <w:left w:val="single" w:color="DCE3E1" w:sz="4"/>
+              <w:bottom w:val="single" w:color="DCE3E1" w:sz="4"/>
+              <w:right w:val="single" w:color="DCE3E1" w:sz="4"/>
+            </w:tcBorders>
+            <w:tcMar>
+              <w:top w:type="dxa" w:w="70"/>
+              <w:left w:type="dxa" w:w="110"/>
+              <w:bottom w:type="dxa" w:w="50"/>
+              <w:right w:type="dxa" w:w="110"/>
+            </w:tcMar>
+            <w:vAlign w:val="top"/>
+          </w:tcPr>
+          <w:p>
+            <w:pPr>
+              <w:spacing w:after="40" w:line="252" w:lineRule="auto"/>
+            </w:pPr>
+            <w:r>
+              <w:rPr>
+                <w:sz w:val="19"/>
+                <w:szCs w:val="19"/>
+              </w:rPr>
+              <w:t xml:space="preserve">Sprint 03 (Guests) built and in review: guest profiles, encrypted ID documents, duplicates, merge, anonymise, consent.</w:t>
+            </w:r>
+          </w:p>
+        </w:tc>
+      </w:tr>
+      <w:tr>
+        <w:trPr>
+          <w:cantSplit/>
+        </w:trPr>
+        <w:tc>
+          <w:tcPr>
+            <w:tcW w:type="dxa" w:w="1100"/>
+            <w:tcBorders>
+              <w:top w:val="single" w:color="DCE3E1" w:sz="4"/>
+              <w:left w:val="single" w:color="DCE3E1" w:sz="4"/>
+              <w:bottom w:val="single" w:color="DCE3E1" w:sz="4"/>
+              <w:right w:val="single" w:color="DCE3E1" w:sz="4"/>
+            </w:tcBorders>
+            <w:shd w:fill="F5F7F6" w:color="auto" w:val="clear"/>
+            <w:tcMar>
+              <w:top w:type="dxa" w:w="70"/>
+              <w:left w:type="dxa" w:w="110"/>
+              <w:bottom w:type="dxa" w:w="50"/>
+              <w:right w:type="dxa" w:w="110"/>
+            </w:tcMar>
+            <w:vAlign w:val="top"/>
+          </w:tcPr>
+          <w:p>
+            <w:pPr>
+              <w:spacing w:after="40" w:line="252" w:lineRule="auto"/>
+            </w:pPr>
+            <w:r>
+              <w:rPr>
+                <w:sz w:val="19"/>
+                <w:szCs w:val="19"/>
+              </w:rPr>
               <w:t xml:space="preserve">1.2</w:t>
             </w:r>
           </w:p>
@@ -1253,6 +1349,7 @@
               <w:bottom w:val="single" w:color="DCE3E1" w:sz="4"/>
               <w:right w:val="single" w:color="DCE3E1" w:sz="4"/>
             </w:tcBorders>
+            <w:shd w:fill="F5F7F6" w:color="auto" w:val="clear"/>
             <w:tcMar>
               <w:top w:type="dxa" w:w="70"/>
               <w:left w:type="dxa" w:w="110"/>
@@ -1283,6 +1380,7 @@
               <w:bottom w:val="single" w:color="DCE3E1" w:sz="4"/>
               <w:right w:val="single" w:color="DCE3E1" w:sz="4"/>
             </w:tcBorders>
+            <w:shd w:fill="F5F7F6" w:color="auto" w:val="clear"/>
             <w:tcMar>
               <w:top w:type="dxa" w:w="70"/>
               <w:left w:type="dxa" w:w="110"/>
@@ -1533,7 +1631,7 @@
                 <w:sz w:val="19"/>
                 <w:szCs w:val="19"/>
               </w:rPr>
-              <w:t xml:space="preserve">Living document, rebuilt at the end of every sprint. This edition reflects Sprint 07 accepted and Sprint 08 in progress.</w:t>
+              <w:t xml:space="preserve">Living document, rebuilt at the end of every sprint. This edition reflects Sprint 08 accepted and Sprint 09 in progress.</w:t>
             </w:r>
           </w:p>
         </w:tc>
@@ -2387,7 +2485,33 @@
           <w:sz w:val="19"/>
           <w:szCs w:val="19"/>
         </w:rPr>
-        <w:t xml:space="preserve">In progress: Sprint 08 — Folio</w:t>
+        <w:t xml:space="preserve">Sprint 08 — Folio</w:t>
+      </w:r>
+    </w:p>
+    <w:p>
+      <w:pPr>
+        <w:spacing w:after="30" w:before="0"/>
+        <w:ind w:left="420"/>
+      </w:pPr>
+      <w:r>
+        <w:rPr>
+          <w:b w:val="false"/>
+          <w:bCs w:val="false"/>
+          <w:color w:val="8A2449"/>
+          <w:sz w:val="19"/>
+          <w:szCs w:val="19"/>
+        </w:rPr>
+        <w:t xml:space="preserve">9.9  </w:t>
+      </w:r>
+      <w:r>
+        <w:rPr>
+          <w:b w:val="false"/>
+          <w:bCs w:val="false"/>
+          <w:color w:val="1B2A2E"/>
+          <w:sz w:val="19"/>
+          <w:szCs w:val="19"/>
+        </w:rPr>
+        <w:t xml:space="preserve">In progress: Sprint 09 — GST configuration and tax engine</w:t>
       </w:r>
     </w:p>
     <w:p>
@@ -2710,7 +2834,7 @@
                 <w:sz w:val="40"/>
                 <w:szCs w:val="40"/>
               </w:rPr>
-              <w:t xml:space="preserve">7 of 29</w:t>
+              <w:t xml:space="preserve">8 of 29</w:t>
             </w:r>
           </w:p>
           <w:p>
@@ -3075,7 +3199,7 @@
                 <w:sz w:val="19"/>
                 <w:szCs w:val="19"/>
               </w:rPr>
-              <w:t xml:space="preserve">Sprints 01 and 02 and 03 and 04 and 05 and 06 and 07 are delivered and accepted. Sprint 08 (Folio) is in progress.</w:t>
+              <w:t xml:space="preserve">Sprints 01 and 02 and 03 and 04 and 05 and 06 and 07 and 08 are delivered and accepted. Sprint 09 (GST configuration and tax engine) is in progress.</w:t>
             </w:r>
           </w:p>
         </w:tc>
@@ -5283,25 +5407,25 @@
               <w:bottom w:val="single" w:color="DCE3E1" w:sz="4"/>
               <w:right w:val="single" w:color="DCE3E1" w:sz="4"/>
             </w:tcBorders>
-            <w:shd w:fill="FBEFD8" w:color="auto" w:val="clear"/>
-            <w:tcMar>
-              <w:top w:type="dxa" w:w="70"/>
-              <w:left w:type="dxa" w:w="110"/>
-              <w:bottom w:type="dxa" w:w="50"/>
-              <w:right w:type="dxa" w:w="110"/>
-            </w:tcMar>
-            <w:vAlign w:val="top"/>
-          </w:tcPr>
-          <w:p>
-            <w:pPr>
-              <w:spacing w:after="40" w:line="252" w:lineRule="auto"/>
-            </w:pPr>
-            <w:r>
-              <w:rPr>
-                <w:sz w:val="19"/>
-                <w:szCs w:val="19"/>
-              </w:rPr>
-              <w:t xml:space="preserve">In progress</w:t>
+            <w:shd w:fill="E3F0E6" w:color="auto" w:val="clear"/>
+            <w:tcMar>
+              <w:top w:type="dxa" w:w="70"/>
+              <w:left w:type="dxa" w:w="110"/>
+              <w:bottom w:type="dxa" w:w="50"/>
+              <w:right w:type="dxa" w:w="110"/>
+            </w:tcMar>
+            <w:vAlign w:val="top"/>
+          </w:tcPr>
+          <w:p>
+            <w:pPr>
+              <w:spacing w:after="40" w:line="252" w:lineRule="auto"/>
+            </w:pPr>
+            <w:r>
+              <w:rPr>
+                <w:sz w:val="19"/>
+                <w:szCs w:val="19"/>
+              </w:rPr>
+              <w:t xml:space="preserve">Done</w:t>
             </w:r>
           </w:p>
         </w:tc>
@@ -5379,24 +5503,25 @@
               <w:bottom w:val="single" w:color="DCE3E1" w:sz="4"/>
               <w:right w:val="single" w:color="DCE3E1" w:sz="4"/>
             </w:tcBorders>
-            <w:tcMar>
-              <w:top w:type="dxa" w:w="70"/>
-              <w:left w:type="dxa" w:w="110"/>
-              <w:bottom w:type="dxa" w:w="50"/>
-              <w:right w:type="dxa" w:w="110"/>
-            </w:tcMar>
-            <w:vAlign w:val="top"/>
-          </w:tcPr>
-          <w:p>
-            <w:pPr>
-              <w:spacing w:after="40" w:line="252" w:lineRule="auto"/>
-            </w:pPr>
-            <w:r>
-              <w:rPr>
-                <w:sz w:val="19"/>
-                <w:szCs w:val="19"/>
-              </w:rPr>
-              <w:t xml:space="preserve">Planned</w:t>
+            <w:shd w:fill="FBEFD8" w:color="auto" w:val="clear"/>
+            <w:tcMar>
+              <w:top w:type="dxa" w:w="70"/>
+              <w:left w:type="dxa" w:w="110"/>
+              <w:bottom w:type="dxa" w:w="50"/>
+              <w:right w:type="dxa" w:w="110"/>
+            </w:tcMar>
+            <w:vAlign w:val="top"/>
+          </w:tcPr>
+          <w:p>
+            <w:pPr>
+              <w:spacing w:after="40" w:line="252" w:lineRule="auto"/>
+            </w:pPr>
+            <w:r>
+              <w:rPr>
+                <w:sz w:val="19"/>
+                <w:szCs w:val="19"/>
+              </w:rPr>
+              <w:t xml:space="preserve">In progress</w:t>
             </w:r>
           </w:p>
         </w:tc>
@@ -12438,7 +12563,7 @@
     </w:p>
     <w:p>
       <w:r>
-        <w:t xml:space="preserve">Work is delivered in short sprints, and each one ends with the owner trying the new screens and accepting them. These are the parts that are built, tested and accepted as of Sprint 07.</w:t>
+        <w:t xml:space="preserve">Work is delivered in short sprints, and each one ends with the owner trying the new screens and accepting them. These are the parts that are built, tested and accepted as of Sprint 08.</w:t>
       </w:r>
     </w:p>
     <w:p>
@@ -14325,12 +14450,286 @@
         <w:pStyle w:val="Heading2"/>
       </w:pPr>
       <w:r>
-        <w:t xml:space="preserve">9.8   In progress: Sprint 08 — Folio</w:t>
+        <w:t xml:space="preserve">9.8   Sprint 08 — Folio</w:t>
       </w:r>
     </w:p>
     <w:p>
       <w:r>
         <w:t xml:space="preserve">Every stay has one running bill (folio) that collects room charges, meals, activities and transport.</w:t>
+      </w:r>
+    </w:p>
+    <w:p>
+      <w:pPr>
+        <w:pStyle w:val="ListParagraph"/>
+        <w:numPr>
+          <w:ilvl w:val="0"/>
+          <w:numId w:val="2"/>
+        </w:numPr>
+        <w:spacing w:after="60"/>
+      </w:pPr>
+      <w:r>
+        <w:t xml:space="preserve">Every stay has a running bill (folio) with room nights, meals, transport and activities</w:t>
+      </w:r>
+    </w:p>
+    <w:p>
+      <w:pPr>
+        <w:pStyle w:val="ListParagraph"/>
+        <w:numPr>
+          <w:ilvl w:val="0"/>
+          <w:numId w:val="2"/>
+        </w:numPr>
+        <w:spacing w:after="60"/>
+      </w:pPr>
+      <w:r>
+        <w:t xml:space="preserve">Staff post charges in a few clicks; a package becomes one line per part</w:t>
+      </w:r>
+    </w:p>
+    <w:p>
+      <w:pPr>
+        <w:pStyle w:val="ListParagraph"/>
+        <w:numPr>
+          <w:ilvl w:val="0"/>
+          <w:numId w:val="2"/>
+        </w:numPr>
+        <w:spacing w:after="60"/>
+      </w:pPr>
+      <w:r>
+        <w:t xml:space="preserve">Nothing on a bill can be edited or deleted: a manager reverses a line with a reason and both stay visible</w:t>
+      </w:r>
+    </w:p>
+    <w:p>
+      <w:pPr>
+        <w:pStyle w:val="ListParagraph"/>
+        <w:numPr>
+          <w:ilvl w:val="0"/>
+          <w:numId w:val="2"/>
+        </w:numPr>
+        <w:spacing w:after="60"/>
+      </w:pPr>
+      <w:r>
+        <w:t xml:space="preserve">Room nights go on the bill by themselves, and a guest leaving early isn't charged for the nights given back</w:t>
+      </w:r>
+    </w:p>
+    <w:p>
+      <w:pPr>
+        <w:pStyle w:val="ListParagraph"/>
+        <w:numPr>
+          <w:ilvl w:val="0"/>
+          <w:numId w:val="2"/>
+        </w:numPr>
+        <w:spacing w:after="60"/>
+      </w:pPr>
+      <w:r>
+        <w:t xml:space="preserve">A bill can be split, e.g. a friend or the company pays part of it</w:t>
+      </w:r>
+    </w:p>
+    <w:p>
+      <w:pPr>
+        <w:pStyle w:val="ListParagraph"/>
+        <w:numPr>
+          <w:ilvl w:val="0"/>
+          <w:numId w:val="2"/>
+        </w:numPr>
+        <w:spacing w:after="60"/>
+      </w:pPr>
+      <w:r>
+        <w:t xml:space="preserve">The front desk shows what each guest owes</w:t>
+      </w:r>
+    </w:p>
+    <w:p>
+      <w:pPr>
+        <w:keepNext/>
+        <w:pBdr>
+          <w:top w:val="single" w:color="DCE3E1" w:sz="4"/>
+          <w:bottom w:val="single" w:color="DCE3E1" w:sz="4"/>
+          <w:left w:val="single" w:color="DCE3E1" w:sz="4"/>
+          <w:right w:val="single" w:color="DCE3E1" w:sz="4"/>
+        </w:pBdr>
+        <w:spacing w:before="120" w:after="0" w:line="240" w:lineRule="auto"/>
+        <w:jc w:val="center"/>
+      </w:pPr>
+      <w:r>
+        <w:drawing>
+          <wp:inline distT="0" distB="0" distL="0" distR="0">
+            <wp:extent cx="5124450" cy="3438525"/>
+            <wp:effectExtent t="0" r="0" b="0" l="0"/>
+            <wp:docPr id="1" name="Folios: the bills of the stays" descr="Folios: the bills of the stays" title="Folios: the bills of the stays"/>
+            <wp:cNvGraphicFramePr>
+              <a:graphicFrameLocks xmlns:a="http://schemas.openxmlformats.org/drawingml/2006/main" noChangeAspect="1"/>
+            </wp:cNvGraphicFramePr>
+            <a:graphic xmlns:a="http://schemas.openxmlformats.org/drawingml/2006/main">
+              <a:graphicData uri="http://schemas.openxmlformats.org/drawingml/2006/picture">
+                <pic:pic xmlns:pic="http://schemas.openxmlformats.org/drawingml/2006/picture">
+                  <pic:nvPicPr>
+                    <pic:cNvPr id="0" name="" descr=""/>
+                    <pic:cNvPicPr>
+                      <a:picLocks noChangeAspect="1" noChangeArrowheads="1"/>
+                    </pic:cNvPicPr>
+                  </pic:nvPicPr>
+                  <pic:blipFill>
+                    <a:blip r:embed="rId32" cstate="none"/>
+                    <a:srcRect/>
+                    <a:stretch>
+                      <a:fillRect/>
+                    </a:stretch>
+                  </pic:blipFill>
+                  <pic:spPr bwMode="auto">
+                    <a:xfrm>
+                      <a:off x="0" y="0"/>
+                      <a:ext cx="5124450" cy="3438525"/>
+                    </a:xfrm>
+                    <a:prstGeom prst="rect">
+                      <a:avLst/>
+                    </a:prstGeom>
+                  </pic:spPr>
+                </pic:pic>
+              </a:graphicData>
+            </a:graphic>
+          </wp:inline>
+        </w:drawing>
+      </w:r>
+    </w:p>
+    <w:p>
+      <w:pPr>
+        <w:pStyle w:val="Caption"/>
+      </w:pPr>
+      <w:r>
+        <w:t xml:space="preserve">Folios: the bills of the stays</w:t>
+      </w:r>
+    </w:p>
+    <w:p>
+      <w:pPr>
+        <w:keepNext/>
+        <w:pBdr>
+          <w:top w:val="single" w:color="DCE3E1" w:sz="4"/>
+          <w:bottom w:val="single" w:color="DCE3E1" w:sz="4"/>
+          <w:left w:val="single" w:color="DCE3E1" w:sz="4"/>
+          <w:right w:val="single" w:color="DCE3E1" w:sz="4"/>
+        </w:pBdr>
+        <w:spacing w:before="120" w:after="0" w:line="240" w:lineRule="auto"/>
+        <w:jc w:val="center"/>
+      </w:pPr>
+      <w:r>
+        <w:drawing>
+          <wp:inline distT="0" distB="0" distL="0" distR="0">
+            <wp:extent cx="5124450" cy="3438525"/>
+            <wp:effectExtent t="0" r="0" b="0" l="0"/>
+            <wp:docPr id="1" name="A bill: balance, sums by category and every line" descr="A bill: balance, sums by category and every line" title="A bill: balance, sums by category and every line"/>
+            <wp:cNvGraphicFramePr>
+              <a:graphicFrameLocks xmlns:a="http://schemas.openxmlformats.org/drawingml/2006/main" noChangeAspect="1"/>
+            </wp:cNvGraphicFramePr>
+            <a:graphic xmlns:a="http://schemas.openxmlformats.org/drawingml/2006/main">
+              <a:graphicData uri="http://schemas.openxmlformats.org/drawingml/2006/picture">
+                <pic:pic xmlns:pic="http://schemas.openxmlformats.org/drawingml/2006/picture">
+                  <pic:nvPicPr>
+                    <pic:cNvPr id="0" name="" descr=""/>
+                    <pic:cNvPicPr>
+                      <a:picLocks noChangeAspect="1" noChangeArrowheads="1"/>
+                    </pic:cNvPicPr>
+                  </pic:nvPicPr>
+                  <pic:blipFill>
+                    <a:blip r:embed="rId33" cstate="none"/>
+                    <a:srcRect/>
+                    <a:stretch>
+                      <a:fillRect/>
+                    </a:stretch>
+                  </pic:blipFill>
+                  <pic:spPr bwMode="auto">
+                    <a:xfrm>
+                      <a:off x="0" y="0"/>
+                      <a:ext cx="5124450" cy="3438525"/>
+                    </a:xfrm>
+                    <a:prstGeom prst="rect">
+                      <a:avLst/>
+                    </a:prstGeom>
+                  </pic:spPr>
+                </pic:pic>
+              </a:graphicData>
+            </a:graphic>
+          </wp:inline>
+        </w:drawing>
+      </w:r>
+    </w:p>
+    <w:p>
+      <w:pPr>
+        <w:pStyle w:val="Caption"/>
+      </w:pPr>
+      <w:r>
+        <w:t xml:space="preserve">A bill: balance, sums by category and every line</w:t>
+      </w:r>
+    </w:p>
+    <w:p>
+      <w:pPr>
+        <w:keepNext/>
+        <w:pBdr>
+          <w:top w:val="single" w:color="DCE3E1" w:sz="4"/>
+          <w:bottom w:val="single" w:color="DCE3E1" w:sz="4"/>
+          <w:left w:val="single" w:color="DCE3E1" w:sz="4"/>
+          <w:right w:val="single" w:color="DCE3E1" w:sz="4"/>
+        </w:pBdr>
+        <w:spacing w:before="120" w:after="0" w:line="240" w:lineRule="auto"/>
+        <w:jc w:val="center"/>
+      </w:pPr>
+      <w:r>
+        <w:drawing>
+          <wp:inline distT="0" distB="0" distL="0" distR="0">
+            <wp:extent cx="5124450" cy="3438525"/>
+            <wp:effectExtent t="0" r="0" b="0" l="0"/>
+            <wp:docPr id="1" name="Posting a charge" descr="Posting a charge" title="Posting a charge"/>
+            <wp:cNvGraphicFramePr>
+              <a:graphicFrameLocks xmlns:a="http://schemas.openxmlformats.org/drawingml/2006/main" noChangeAspect="1"/>
+            </wp:cNvGraphicFramePr>
+            <a:graphic xmlns:a="http://schemas.openxmlformats.org/drawingml/2006/main">
+              <a:graphicData uri="http://schemas.openxmlformats.org/drawingml/2006/picture">
+                <pic:pic xmlns:pic="http://schemas.openxmlformats.org/drawingml/2006/picture">
+                  <pic:nvPicPr>
+                    <pic:cNvPr id="0" name="" descr=""/>
+                    <pic:cNvPicPr>
+                      <a:picLocks noChangeAspect="1" noChangeArrowheads="1"/>
+                    </pic:cNvPicPr>
+                  </pic:nvPicPr>
+                  <pic:blipFill>
+                    <a:blip r:embed="rId34" cstate="none"/>
+                    <a:srcRect/>
+                    <a:stretch>
+                      <a:fillRect/>
+                    </a:stretch>
+                  </pic:blipFill>
+                  <pic:spPr bwMode="auto">
+                    <a:xfrm>
+                      <a:off x="0" y="0"/>
+                      <a:ext cx="5124450" cy="3438525"/>
+                    </a:xfrm>
+                    <a:prstGeom prst="rect">
+                      <a:avLst/>
+                    </a:prstGeom>
+                  </pic:spPr>
+                </pic:pic>
+              </a:graphicData>
+            </a:graphic>
+          </wp:inline>
+        </w:drawing>
+      </w:r>
+    </w:p>
+    <w:p>
+      <w:pPr>
+        <w:pStyle w:val="Caption"/>
+      </w:pPr>
+      <w:r>
+        <w:t xml:space="preserve">Posting a charge</w:t>
+      </w:r>
+    </w:p>
+    <w:p>
+      <w:pPr>
+        <w:pStyle w:val="Heading2"/>
+      </w:pPr>
+      <w:r>
+        <w:t xml:space="preserve">9.9   In progress: Sprint 09 — GST configuration and tax engine</w:t>
+      </w:r>
+    </w:p>
+    <w:p>
+      <w:r>
+        <w:t xml:space="preserve">GST is calculated automatically and correctly for each item (CGST/SGST or IGST), with rates kept up to date by configuration, not code.</w:t>
       </w:r>
     </w:p>
     <w:p>
@@ -14343,7 +14742,7 @@
           <w:sz w:val="18"/>
           <w:szCs w:val="18"/>
         </w:rPr>
-        <w:t xml:space="preserve">It will be accepted when: Folio shows charges, reversals and balance; nothing can be deleted.</w:t>
+        <w:t xml:space="preserve">It will be accepted when: Accountant can add a new rule effective next month without a deployment.</w:t>
       </w:r>
     </w:p>
     <w:p>
@@ -17181,7 +17580,7 @@
               <w:bottom w:val="single" w:color="DCE3E1" w:sz="4"/>
               <w:right w:val="single" w:color="DCE3E1" w:sz="4"/>
             </w:tcBorders>
-            <w:shd w:fill="FBEFD8" w:color="auto" w:val="clear"/>
+            <w:shd w:fill="E3F0E6" w:color="auto" w:val="clear"/>
             <w:tcMar>
               <w:top w:type="dxa" w:w="70"/>
               <w:left w:type="dxa" w:w="110"/>
@@ -17199,7 +17598,7 @@
                 <w:sz w:val="17"/>
                 <w:szCs w:val="17"/>
               </w:rPr>
-              <w:t xml:space="preserve">In progress</w:t>
+              <w:t xml:space="preserve">Done</w:t>
             </w:r>
           </w:p>
         </w:tc>
@@ -17307,6 +17706,7 @@
               <w:bottom w:val="single" w:color="DCE3E1" w:sz="4"/>
               <w:right w:val="single" w:color="DCE3E1" w:sz="4"/>
             </w:tcBorders>
+            <w:shd w:fill="FBEFD8" w:color="auto" w:val="clear"/>
             <w:tcMar>
               <w:top w:type="dxa" w:w="70"/>
               <w:left w:type="dxa" w:w="110"/>
@@ -17324,7 +17724,7 @@
                 <w:sz w:val="17"/>
                 <w:szCs w:val="17"/>
               </w:rPr>
-              <w:t xml:space="preserve">Planned</w:t>
+              <w:t xml:space="preserve">In progress</w:t>
             </w:r>
           </w:p>
         </w:tc>
@@ -19877,7 +20277,7 @@
                     </pic:cNvPicPr>
                   </pic:nvPicPr>
                   <pic:blipFill>
-                    <a:blip r:embed="rId32" cstate="none"/>
+                    <a:blip r:embed="rId35" cstate="none"/>
                     <a:srcRect/>
                     <a:stretch>
                       <a:fillRect/>
@@ -19984,7 +20384,7 @@
         <w:t xml:space="preserve">Tests that grow with the system.</w:t>
       </w:r>
       <w:r>
-        <w:t xml:space="preserve"> As of Sprint 07: 157 server test methods, 59 screen tests and 69 end-to-end browser steps, all passing.</w:t>
+        <w:t xml:space="preserve"> As of Sprint 08: 174 server test methods, 63 screen tests and 76 end-to-end browser steps, all passing.</w:t>
       </w:r>
     </w:p>
     <w:p>
@@ -21871,7 +22271,7 @@
         <w:sz w:val="16"/>
         <w:szCs w:val="16"/>
       </w:rPr>
-      <w:t xml:space="preserve">Version 1.7 · 18 October 2026</w:t>
+      <w:t xml:space="preserve">Version 1.8 · 18 October 2026</w:t>
     </w:r>
     <w:r>
       <w:rPr>

</xml_diff>

<commit_message>
chore(sprints): accept Sprint 09
Sprint 09 (GST configuration and tax engine) done, Sprint 10 current;
changelog dated; handbooks 1.9 rebuilt; guides, catalogues, README and
run/test table updated.

Co-Authored-By: Claude Opus 5.5 (1M context) <noreply@anthropic.com>
Claude-Session: https://claude.ai/code/session_01Fzqu9rFeMySXazi5mrL4bE
</commit_message>
<xml_diff>
--- a/docs/handbooks/Resort-OS-Product-Overview.docx
+++ b/docs/handbooks/Resort-OS-Product-Overview.docx
@@ -182,7 +182,7 @@
                 <w:sz w:val="19"/>
                 <w:szCs w:val="19"/>
               </w:rPr>
-              <w:t xml:space="preserve">Version 1.8</w:t>
+              <w:t xml:space="preserve">Version 1.9</w:t>
             </w:r>
           </w:p>
         </w:tc>
@@ -252,7 +252,7 @@
                 <w:sz w:val="19"/>
                 <w:szCs w:val="19"/>
               </w:rPr>
-              <w:t xml:space="preserve">18 October 2026</w:t>
+              <w:t xml:space="preserve">20 October 2026</w:t>
             </w:r>
           </w:p>
         </w:tc>
@@ -322,7 +322,7 @@
                 <w:sz w:val="19"/>
                 <w:szCs w:val="19"/>
               </w:rPr>
-              <w:t xml:space="preserve">Sprints 01, 02, 03, 04, 05, 06, 07, 08 accepted · Sprint 09 GST configuration and tax engine in progress</w:t>
+              <w:t xml:space="preserve">Sprints 01, 02, 03, 04, 05, 06, 07, 08, 09 accepted · Sprint 10 Payments, refunds, cash drawer in progress</w:t>
             </w:r>
           </w:p>
         </w:tc>
@@ -661,7 +661,7 @@
                 <w:sz w:val="19"/>
                 <w:szCs w:val="19"/>
               </w:rPr>
-              <w:t xml:space="preserve">1.8</w:t>
+              <w:t xml:space="preserve">1.9</w:t>
             </w:r>
           </w:p>
         </w:tc>
@@ -691,7 +691,7 @@
                 <w:sz w:val="19"/>
                 <w:szCs w:val="19"/>
               </w:rPr>
-              <w:t xml:space="preserve">2026-10-18</w:t>
+              <w:t xml:space="preserve">2026-10-20</w:t>
             </w:r>
           </w:p>
         </w:tc>
@@ -721,7 +721,7 @@
                 <w:sz w:val="19"/>
                 <w:szCs w:val="19"/>
               </w:rPr>
-              <w:t xml:space="preserve">Sprint 08 (Folio) accepted: a running bill for every stay with room nights, meals, transport, activities and packages; nothing can be edited or deleted, a manager reverses a line with a reason; bills can be split; the front desk shows the real balance. Folio flow diagram. Sprint 09 (GST configuration and tax engine) started.</w:t>
+              <w:t xml:space="preserve">Sprint 09 (GST configuration and tax engine) accepted: GST worked out on every charge (CGST + SGST or IGST), rates kept as rules with dates that an accountant changes from next month without a software update, room GST by the price per room per night, posted charges keep their GST. Tax flow diagram. Sprint 10 (Payments, refunds, cash drawer) started.</w:t>
             </w:r>
           </w:p>
         </w:tc>
@@ -757,7 +757,7 @@
                 <w:sz w:val="19"/>
                 <w:szCs w:val="19"/>
               </w:rPr>
-              <w:t xml:space="preserve">1.7</w:t>
+              <w:t xml:space="preserve">1.8</w:t>
             </w:r>
           </w:p>
         </w:tc>
@@ -819,7 +819,7 @@
                 <w:sz w:val="19"/>
                 <w:szCs w:val="19"/>
               </w:rPr>
-              <w:t xml:space="preserve">Sprint 07 (Front desk) accepted: arrivals, departures and in-house lists, check-in and check-out in a few clicks, walk-ins on one screen, early departures with a reason, rooms marked dirty and ready. Check-in flow diagram. Sprint 08 (Folio) started.</w:t>
+              <w:t xml:space="preserve">Sprint 08 (Folio) accepted: a running bill for every stay with room nights, meals, transport, activities and packages; nothing can be edited or deleted, a manager reverses a line with a reason; bills can be split; the front desk shows the real balance. Folio flow diagram. Sprint 09 (GST configuration and tax engine) started.</w:t>
             </w:r>
           </w:p>
         </w:tc>
@@ -854,7 +854,7 @@
                 <w:sz w:val="19"/>
                 <w:szCs w:val="19"/>
               </w:rPr>
-              <w:t xml:space="preserve">1.6</w:t>
+              <w:t xml:space="preserve">1.7</w:t>
             </w:r>
           </w:p>
         </w:tc>
@@ -884,7 +884,7 @@
                 <w:sz w:val="19"/>
                 <w:szCs w:val="19"/>
               </w:rPr>
-              <w:t xml:space="preserve">2026-10-17</w:t>
+              <w:t xml:space="preserve">2026-10-18</w:t>
             </w:r>
           </w:p>
         </w:tc>
@@ -914,7 +914,7 @@
                 <w:sz w:val="19"/>
                 <w:szCs w:val="19"/>
               </w:rPr>
-              <w:t xml:space="preserve">Sprint 06 (Reservation calendar) accepted: day, week and month calendar of rooms and dorm beds, moving a guest by drag-and-drop with a reason, list by day on phones. Room-move flow diagram. Sprint 07 (Front desk) started.</w:t>
+              <w:t xml:space="preserve">Sprint 07 (Front desk) accepted: arrivals, departures and in-house lists, check-in and check-out in a few clicks, walk-ins on one screen, early departures with a reason, rooms marked dirty and ready. Check-in flow diagram. Sprint 08 (Folio) started.</w:t>
             </w:r>
           </w:p>
         </w:tc>
@@ -950,7 +950,7 @@
                 <w:sz w:val="19"/>
                 <w:szCs w:val="19"/>
               </w:rPr>
-              <w:t xml:space="preserve">1.5</w:t>
+              <w:t xml:space="preserve">1.6</w:t>
             </w:r>
           </w:p>
         </w:tc>
@@ -981,7 +981,7 @@
                 <w:sz w:val="19"/>
                 <w:szCs w:val="19"/>
               </w:rPr>
-              <w:t xml:space="preserve">2026-10-15</w:t>
+              <w:t xml:space="preserve">2026-10-17</w:t>
             </w:r>
           </w:p>
         </w:tc>
@@ -1012,7 +1012,7 @@
                 <w:sz w:val="19"/>
                 <w:szCs w:val="19"/>
               </w:rPr>
-              <w:t xml:space="preserve">Sprint 05 (Availability engine and reservations) accepted: race-free booking, booking wizard, booking history, date pickers. Diagrams of the reservation tables and the booking flow. Sprint 06 (Reservation calendar) started.</w:t>
+              <w:t xml:space="preserve">Sprint 06 (Reservation calendar) accepted: day, week and month calendar of rooms and dorm beds, moving a guest by drag-and-drop with a reason, list by day on phones. Room-move flow diagram. Sprint 07 (Front desk) started.</w:t>
             </w:r>
           </w:p>
         </w:tc>
@@ -1047,7 +1047,7 @@
                 <w:sz w:val="19"/>
                 <w:szCs w:val="19"/>
               </w:rPr>
-              <w:t xml:space="preserve">1.4</w:t>
+              <w:t xml:space="preserve">1.5</w:t>
             </w:r>
           </w:p>
         </w:tc>
@@ -1077,7 +1077,7 @@
                 <w:sz w:val="19"/>
                 <w:szCs w:val="19"/>
               </w:rPr>
-              <w:t xml:space="preserve">2026-10-14</w:t>
+              <w:t xml:space="preserve">2026-10-15</w:t>
             </w:r>
           </w:p>
         </w:tc>
@@ -1107,7 +1107,7 @@
                 <w:sz w:val="19"/>
                 <w:szCs w:val="19"/>
               </w:rPr>
-              <w:t xml:space="preserve">Sprint 04 (Rate plans and packages) accepted: nightly price grid, quotes, packages with revenue split. Sprint 05 (Availability engine and reservations) started.</w:t>
+              <w:t xml:space="preserve">Sprint 05 (Availability engine and reservations) accepted: race-free booking, booking wizard, booking history, date pickers. Diagrams of the reservation tables and the booking flow. Sprint 06 (Reservation calendar) started.</w:t>
             </w:r>
           </w:p>
         </w:tc>
@@ -1143,7 +1143,7 @@
                 <w:sz w:val="19"/>
                 <w:szCs w:val="19"/>
               </w:rPr>
-              <w:t xml:space="preserve">1.3</w:t>
+              <w:t xml:space="preserve">1.4</w:t>
             </w:r>
           </w:p>
         </w:tc>
@@ -1174,7 +1174,7 @@
                 <w:sz w:val="19"/>
                 <w:szCs w:val="19"/>
               </w:rPr>
-              <w:t xml:space="preserve">2026-10-11</w:t>
+              <w:t xml:space="preserve">2026-10-14</w:t>
             </w:r>
           </w:p>
         </w:tc>
@@ -1205,7 +1205,7 @@
                 <w:sz w:val="19"/>
                 <w:szCs w:val="19"/>
               </w:rPr>
-              <w:t xml:space="preserve">Sprint 03 (Guests) accepted, with review fixes: Aadhaar number check and error messages that say why. Sprint 04 (Rate plans and packages) started.</w:t>
+              <w:t xml:space="preserve">Sprint 04 (Rate plans and packages) accepted: nightly price grid, quotes, packages with revenue split. Sprint 05 (Availability engine and reservations) started.</w:t>
             </w:r>
           </w:p>
         </w:tc>
@@ -1240,7 +1240,7 @@
                 <w:sz w:val="19"/>
                 <w:szCs w:val="19"/>
               </w:rPr>
-              <w:t xml:space="preserve">1.2.1</w:t>
+              <w:t xml:space="preserve">1.3</w:t>
             </w:r>
           </w:p>
         </w:tc>
@@ -1270,7 +1270,7 @@
                 <w:sz w:val="19"/>
                 <w:szCs w:val="19"/>
               </w:rPr>
-              <w:t xml:space="preserve">2026-10-10</w:t>
+              <w:t xml:space="preserve">2026-10-11</w:t>
             </w:r>
           </w:p>
         </w:tc>
@@ -1300,7 +1300,7 @@
                 <w:sz w:val="19"/>
                 <w:szCs w:val="19"/>
               </w:rPr>
-              <w:t xml:space="preserve">Sprint 03 (Guests) built and in review: guest profiles, encrypted ID documents, duplicates, merge, anonymise, consent.</w:t>
+              <w:t xml:space="preserve">Sprint 03 (Guests) accepted, with review fixes: Aadhaar number check and error messages that say why. Sprint 04 (Rate plans and packages) started.</w:t>
             </w:r>
           </w:p>
         </w:tc>
@@ -1336,6 +1336,103 @@
                 <w:sz w:val="19"/>
                 <w:szCs w:val="19"/>
               </w:rPr>
+              <w:t xml:space="preserve">1.2.1</w:t>
+            </w:r>
+          </w:p>
+        </w:tc>
+        <w:tc>
+          <w:tcPr>
+            <w:tcW w:type="dxa" w:w="1500"/>
+            <w:tcBorders>
+              <w:top w:val="single" w:color="DCE3E1" w:sz="4"/>
+              <w:left w:val="single" w:color="DCE3E1" w:sz="4"/>
+              <w:bottom w:val="single" w:color="DCE3E1" w:sz="4"/>
+              <w:right w:val="single" w:color="DCE3E1" w:sz="4"/>
+            </w:tcBorders>
+            <w:shd w:fill="F5F7F6" w:color="auto" w:val="clear"/>
+            <w:tcMar>
+              <w:top w:type="dxa" w:w="70"/>
+              <w:left w:type="dxa" w:w="110"/>
+              <w:bottom w:type="dxa" w:w="50"/>
+              <w:right w:type="dxa" w:w="110"/>
+            </w:tcMar>
+            <w:vAlign w:val="top"/>
+          </w:tcPr>
+          <w:p>
+            <w:pPr>
+              <w:spacing w:after="40" w:line="252" w:lineRule="auto"/>
+            </w:pPr>
+            <w:r>
+              <w:rPr>
+                <w:sz w:val="19"/>
+                <w:szCs w:val="19"/>
+              </w:rPr>
+              <w:t xml:space="preserve">2026-10-10</w:t>
+            </w:r>
+          </w:p>
+        </w:tc>
+        <w:tc>
+          <w:tcPr>
+            <w:tcW w:type="dxa" w:w="6714"/>
+            <w:tcBorders>
+              <w:top w:val="single" w:color="DCE3E1" w:sz="4"/>
+              <w:left w:val="single" w:color="DCE3E1" w:sz="4"/>
+              <w:bottom w:val="single" w:color="DCE3E1" w:sz="4"/>
+              <w:right w:val="single" w:color="DCE3E1" w:sz="4"/>
+            </w:tcBorders>
+            <w:shd w:fill="F5F7F6" w:color="auto" w:val="clear"/>
+            <w:tcMar>
+              <w:top w:type="dxa" w:w="70"/>
+              <w:left w:type="dxa" w:w="110"/>
+              <w:bottom w:type="dxa" w:w="50"/>
+              <w:right w:type="dxa" w:w="110"/>
+            </w:tcMar>
+            <w:vAlign w:val="top"/>
+          </w:tcPr>
+          <w:p>
+            <w:pPr>
+              <w:spacing w:after="40" w:line="252" w:lineRule="auto"/>
+            </w:pPr>
+            <w:r>
+              <w:rPr>
+                <w:sz w:val="19"/>
+                <w:szCs w:val="19"/>
+              </w:rPr>
+              <w:t xml:space="preserve">Sprint 03 (Guests) built and in review: guest profiles, encrypted ID documents, duplicates, merge, anonymise, consent.</w:t>
+            </w:r>
+          </w:p>
+        </w:tc>
+      </w:tr>
+      <w:tr>
+        <w:trPr>
+          <w:cantSplit/>
+        </w:trPr>
+        <w:tc>
+          <w:tcPr>
+            <w:tcW w:type="dxa" w:w="1100"/>
+            <w:tcBorders>
+              <w:top w:val="single" w:color="DCE3E1" w:sz="4"/>
+              <w:left w:val="single" w:color="DCE3E1" w:sz="4"/>
+              <w:bottom w:val="single" w:color="DCE3E1" w:sz="4"/>
+              <w:right w:val="single" w:color="DCE3E1" w:sz="4"/>
+            </w:tcBorders>
+            <w:tcMar>
+              <w:top w:type="dxa" w:w="70"/>
+              <w:left w:type="dxa" w:w="110"/>
+              <w:bottom w:type="dxa" w:w="50"/>
+              <w:right w:type="dxa" w:w="110"/>
+            </w:tcMar>
+            <w:vAlign w:val="top"/>
+          </w:tcPr>
+          <w:p>
+            <w:pPr>
+              <w:spacing w:after="40" w:line="252" w:lineRule="auto"/>
+            </w:pPr>
+            <w:r>
+              <w:rPr>
+                <w:sz w:val="19"/>
+                <w:szCs w:val="19"/>
+              </w:rPr>
               <w:t xml:space="preserve">1.2</w:t>
             </w:r>
           </w:p>
@@ -1349,7 +1446,6 @@
               <w:bottom w:val="single" w:color="DCE3E1" w:sz="4"/>
               <w:right w:val="single" w:color="DCE3E1" w:sz="4"/>
             </w:tcBorders>
-            <w:shd w:fill="F5F7F6" w:color="auto" w:val="clear"/>
             <w:tcMar>
               <w:top w:type="dxa" w:w="70"/>
               <w:left w:type="dxa" w:w="110"/>
@@ -1380,7 +1476,6 @@
               <w:bottom w:val="single" w:color="DCE3E1" w:sz="4"/>
               <w:right w:val="single" w:color="DCE3E1" w:sz="4"/>
             </w:tcBorders>
-            <w:shd w:fill="F5F7F6" w:color="auto" w:val="clear"/>
             <w:tcMar>
               <w:top w:type="dxa" w:w="70"/>
               <w:left w:type="dxa" w:w="110"/>
@@ -1631,7 +1726,7 @@
                 <w:sz w:val="19"/>
                 <w:szCs w:val="19"/>
               </w:rPr>
-              <w:t xml:space="preserve">Living document, rebuilt at the end of every sprint. This edition reflects Sprint 08 accepted and Sprint 09 in progress.</w:t>
+              <w:t xml:space="preserve">Living document, rebuilt at the end of every sprint. This edition reflects Sprint 09 accepted and Sprint 10 in progress.</w:t>
             </w:r>
           </w:p>
         </w:tc>
@@ -2511,7 +2606,33 @@
           <w:sz w:val="19"/>
           <w:szCs w:val="19"/>
         </w:rPr>
-        <w:t xml:space="preserve">In progress: Sprint 09 — GST configuration and tax engine</w:t>
+        <w:t xml:space="preserve">Sprint 09 — GST configuration and tax engine</w:t>
+      </w:r>
+    </w:p>
+    <w:p>
+      <w:pPr>
+        <w:spacing w:after="30" w:before="0"/>
+        <w:ind w:left="420"/>
+      </w:pPr>
+      <w:r>
+        <w:rPr>
+          <w:b w:val="false"/>
+          <w:bCs w:val="false"/>
+          <w:color w:val="8A2449"/>
+          <w:sz w:val="19"/>
+          <w:szCs w:val="19"/>
+        </w:rPr>
+        <w:t xml:space="preserve">9.10  </w:t>
+      </w:r>
+      <w:r>
+        <w:rPr>
+          <w:b w:val="false"/>
+          <w:bCs w:val="false"/>
+          <w:color w:val="1B2A2E"/>
+          <w:sz w:val="19"/>
+          <w:szCs w:val="19"/>
+        </w:rPr>
+        <w:t xml:space="preserve">In progress: Sprint 10 — Payments, refunds, cash drawer</w:t>
       </w:r>
     </w:p>
     <w:p>
@@ -2834,7 +2955,7 @@
                 <w:sz w:val="40"/>
                 <w:szCs w:val="40"/>
               </w:rPr>
-              <w:t xml:space="preserve">8 of 29</w:t>
+              <w:t xml:space="preserve">9 of 29</w:t>
             </w:r>
           </w:p>
           <w:p>
@@ -3199,7 +3320,7 @@
                 <w:sz w:val="19"/>
                 <w:szCs w:val="19"/>
               </w:rPr>
-              <w:t xml:space="preserve">Sprints 01 and 02 and 03 and 04 and 05 and 06 and 07 and 08 are delivered and accepted. Sprint 09 (GST configuration and tax engine) is in progress.</w:t>
+              <w:t xml:space="preserve">Sprints 01 and 02 and 03 and 04 and 05 and 06 and 07 and 08 and 09 are delivered and accepted. Sprint 10 (Payments, refunds, cash drawer) is in progress.</w:t>
             </w:r>
           </w:p>
         </w:tc>
@@ -5503,25 +5624,25 @@
               <w:bottom w:val="single" w:color="DCE3E1" w:sz="4"/>
               <w:right w:val="single" w:color="DCE3E1" w:sz="4"/>
             </w:tcBorders>
-            <w:shd w:fill="FBEFD8" w:color="auto" w:val="clear"/>
-            <w:tcMar>
-              <w:top w:type="dxa" w:w="70"/>
-              <w:left w:type="dxa" w:w="110"/>
-              <w:bottom w:type="dxa" w:w="50"/>
-              <w:right w:type="dxa" w:w="110"/>
-            </w:tcMar>
-            <w:vAlign w:val="top"/>
-          </w:tcPr>
-          <w:p>
-            <w:pPr>
-              <w:spacing w:after="40" w:line="252" w:lineRule="auto"/>
-            </w:pPr>
-            <w:r>
-              <w:rPr>
-                <w:sz w:val="19"/>
-                <w:szCs w:val="19"/>
-              </w:rPr>
-              <w:t xml:space="preserve">In progress</w:t>
+            <w:shd w:fill="E3F0E6" w:color="auto" w:val="clear"/>
+            <w:tcMar>
+              <w:top w:type="dxa" w:w="70"/>
+              <w:left w:type="dxa" w:w="110"/>
+              <w:bottom w:type="dxa" w:w="50"/>
+              <w:right w:type="dxa" w:w="110"/>
+            </w:tcMar>
+            <w:vAlign w:val="top"/>
+          </w:tcPr>
+          <w:p>
+            <w:pPr>
+              <w:spacing w:after="40" w:line="252" w:lineRule="auto"/>
+            </w:pPr>
+            <w:r>
+              <w:rPr>
+                <w:sz w:val="19"/>
+                <w:szCs w:val="19"/>
+              </w:rPr>
+              <w:t xml:space="preserve">Done</w:t>
             </w:r>
           </w:p>
         </w:tc>
@@ -5599,24 +5720,25 @@
               <w:bottom w:val="single" w:color="DCE3E1" w:sz="4"/>
               <w:right w:val="single" w:color="DCE3E1" w:sz="4"/>
             </w:tcBorders>
-            <w:tcMar>
-              <w:top w:type="dxa" w:w="70"/>
-              <w:left w:type="dxa" w:w="110"/>
-              <w:bottom w:type="dxa" w:w="50"/>
-              <w:right w:type="dxa" w:w="110"/>
-            </w:tcMar>
-            <w:vAlign w:val="top"/>
-          </w:tcPr>
-          <w:p>
-            <w:pPr>
-              <w:spacing w:after="40" w:line="252" w:lineRule="auto"/>
-            </w:pPr>
-            <w:r>
-              <w:rPr>
-                <w:sz w:val="19"/>
-                <w:szCs w:val="19"/>
-              </w:rPr>
-              <w:t xml:space="preserve">Planned</w:t>
+            <w:shd w:fill="FBEFD8" w:color="auto" w:val="clear"/>
+            <w:tcMar>
+              <w:top w:type="dxa" w:w="70"/>
+              <w:left w:type="dxa" w:w="110"/>
+              <w:bottom w:type="dxa" w:w="50"/>
+              <w:right w:type="dxa" w:w="110"/>
+            </w:tcMar>
+            <w:vAlign w:val="top"/>
+          </w:tcPr>
+          <w:p>
+            <w:pPr>
+              <w:spacing w:after="40" w:line="252" w:lineRule="auto"/>
+            </w:pPr>
+            <w:r>
+              <w:rPr>
+                <w:sz w:val="19"/>
+                <w:szCs w:val="19"/>
+              </w:rPr>
+              <w:t xml:space="preserve">In progress</w:t>
             </w:r>
           </w:p>
         </w:tc>
@@ -12563,7 +12685,7 @@
     </w:p>
     <w:p>
       <w:r>
-        <w:t xml:space="preserve">Work is delivered in short sprints, and each one ends with the owner trying the new screens and accepting them. These are the parts that are built, tested and accepted as of Sprint 08.</w:t>
+        <w:t xml:space="preserve">Work is delivered in short sprints, and each one ends with the owner trying the new screens and accepting them. These are the parts that are built, tested and accepted as of Sprint 09.</w:t>
       </w:r>
     </w:p>
     <w:p>
@@ -14724,12 +14846,286 @@
         <w:pStyle w:val="Heading2"/>
       </w:pPr>
       <w:r>
-        <w:t xml:space="preserve">9.9   In progress: Sprint 09 — GST configuration and tax engine</w:t>
+        <w:t xml:space="preserve">9.9   Sprint 09 — GST configuration and tax engine</w:t>
       </w:r>
     </w:p>
     <w:p>
       <w:r>
         <w:t xml:space="preserve">GST is calculated automatically and correctly for each item (CGST/SGST or IGST), with rates kept up to date by configuration, not code.</w:t>
+      </w:r>
+    </w:p>
+    <w:p>
+      <w:pPr>
+        <w:pStyle w:val="ListParagraph"/>
+        <w:numPr>
+          <w:ilvl w:val="0"/>
+          <w:numId w:val="2"/>
+        </w:numPr>
+        <w:spacing w:after="60"/>
+      </w:pPr>
+      <w:r>
+        <w:t xml:space="preserve">GST is worked out automatically on every charge: CGST + SGST inside the state, IGST across states</w:t>
+      </w:r>
+    </w:p>
+    <w:p>
+      <w:pPr>
+        <w:pStyle w:val="ListParagraph"/>
+        <w:numPr>
+          <w:ilvl w:val="0"/>
+          <w:numId w:val="2"/>
+        </w:numPr>
+        <w:spacing w:after="60"/>
+      </w:pPr>
+      <w:r>
+        <w:t xml:space="preserve">No GST rate is built into the software: rates are rules with dates, kept up to date by your accountant</w:t>
+      </w:r>
+    </w:p>
+    <w:p>
+      <w:pPr>
+        <w:pStyle w:val="ListParagraph"/>
+        <w:numPr>
+          <w:ilvl w:val="0"/>
+          <w:numId w:val="2"/>
+        </w:numPr>
+        <w:spacing w:after="60"/>
+      </w:pPr>
+      <w:r>
+        <w:t xml:space="preserve">Your accountant adds next month's rate on the GST page, with no software update; the old rate ends the day before</w:t>
+      </w:r>
+    </w:p>
+    <w:p>
+      <w:pPr>
+        <w:pStyle w:val="ListParagraph"/>
+        <w:numPr>
+          <w:ilvl w:val="0"/>
+          <w:numId w:val="2"/>
+        </w:numPr>
+        <w:spacing w:after="60"/>
+      </w:pPr>
+      <w:r>
+        <w:t xml:space="preserve">Room GST follows the price of each room per night (₹7,500 limit), as the law requires</w:t>
+      </w:r>
+    </w:p>
+    <w:p>
+      <w:pPr>
+        <w:pStyle w:val="ListParagraph"/>
+        <w:numPr>
+          <w:ilvl w:val="0"/>
+          <w:numId w:val="2"/>
+        </w:numPr>
+        <w:spacing w:after="60"/>
+      </w:pPr>
+      <w:r>
+        <w:t xml:space="preserve">A posted charge keeps the GST it was charged with, even if the rate changes later</w:t>
+      </w:r>
+    </w:p>
+    <w:p>
+      <w:pPr>
+        <w:pStyle w:val="ListParagraph"/>
+        <w:numPr>
+          <w:ilvl w:val="0"/>
+          <w:numId w:val="2"/>
+        </w:numPr>
+        <w:spacing w:after="60"/>
+      </w:pPr>
+      <w:r>
+        <w:t xml:space="preserve">The rules shipped with Resort OS are marked unverified until your accountant checks them</w:t>
+      </w:r>
+    </w:p>
+    <w:p>
+      <w:pPr>
+        <w:keepNext/>
+        <w:pBdr>
+          <w:top w:val="single" w:color="DCE3E1" w:sz="4"/>
+          <w:bottom w:val="single" w:color="DCE3E1" w:sz="4"/>
+          <w:left w:val="single" w:color="DCE3E1" w:sz="4"/>
+          <w:right w:val="single" w:color="DCE3E1" w:sz="4"/>
+        </w:pBdr>
+        <w:spacing w:before="120" w:after="0" w:line="240" w:lineRule="auto"/>
+        <w:jc w:val="center"/>
+      </w:pPr>
+      <w:r>
+        <w:drawing>
+          <wp:inline distT="0" distB="0" distL="0" distR="0">
+            <wp:extent cx="5124450" cy="3438525"/>
+            <wp:effectExtent t="0" r="0" b="0" l="0"/>
+            <wp:docPr id="1" name="GST: the registration and the rules with their sources" descr="GST: the registration and the rules with their sources" title="GST: the registration and the rules with their sources"/>
+            <wp:cNvGraphicFramePr>
+              <a:graphicFrameLocks xmlns:a="http://schemas.openxmlformats.org/drawingml/2006/main" noChangeAspect="1"/>
+            </wp:cNvGraphicFramePr>
+            <a:graphic xmlns:a="http://schemas.openxmlformats.org/drawingml/2006/main">
+              <a:graphicData uri="http://schemas.openxmlformats.org/drawingml/2006/picture">
+                <pic:pic xmlns:pic="http://schemas.openxmlformats.org/drawingml/2006/picture">
+                  <pic:nvPicPr>
+                    <pic:cNvPr id="0" name="" descr=""/>
+                    <pic:cNvPicPr>
+                      <a:picLocks noChangeAspect="1" noChangeArrowheads="1"/>
+                    </pic:cNvPicPr>
+                  </pic:nvPicPr>
+                  <pic:blipFill>
+                    <a:blip r:embed="rId35" cstate="none"/>
+                    <a:srcRect/>
+                    <a:stretch>
+                      <a:fillRect/>
+                    </a:stretch>
+                  </pic:blipFill>
+                  <pic:spPr bwMode="auto">
+                    <a:xfrm>
+                      <a:off x="0" y="0"/>
+                      <a:ext cx="5124450" cy="3438525"/>
+                    </a:xfrm>
+                    <a:prstGeom prst="rect">
+                      <a:avLst/>
+                    </a:prstGeom>
+                  </pic:spPr>
+                </pic:pic>
+              </a:graphicData>
+            </a:graphic>
+          </wp:inline>
+        </w:drawing>
+      </w:r>
+    </w:p>
+    <w:p>
+      <w:pPr>
+        <w:pStyle w:val="Caption"/>
+      </w:pPr>
+      <w:r>
+        <w:t xml:space="preserve">GST: the registration and the rules with their sources</w:t>
+      </w:r>
+    </w:p>
+    <w:p>
+      <w:pPr>
+        <w:keepNext/>
+        <w:pBdr>
+          <w:top w:val="single" w:color="DCE3E1" w:sz="4"/>
+          <w:bottom w:val="single" w:color="DCE3E1" w:sz="4"/>
+          <w:left w:val="single" w:color="DCE3E1" w:sz="4"/>
+          <w:right w:val="single" w:color="DCE3E1" w:sz="4"/>
+        </w:pBdr>
+        <w:spacing w:before="120" w:after="0" w:line="240" w:lineRule="auto"/>
+        <w:jc w:val="center"/>
+      </w:pPr>
+      <w:r>
+        <w:drawing>
+          <wp:inline distT="0" distB="0" distL="0" distR="0">
+            <wp:extent cx="5124450" cy="3438525"/>
+            <wp:effectExtent t="0" r="0" b="0" l="0"/>
+            <wp:docPr id="1" name="A room night on 21 Sep 2025: 12% GST" descr="A room night on 21 Sep 2025: 12% GST" title="A room night on 21 Sep 2025: 12% GST"/>
+            <wp:cNvGraphicFramePr>
+              <a:graphicFrameLocks xmlns:a="http://schemas.openxmlformats.org/drawingml/2006/main" noChangeAspect="1"/>
+            </wp:cNvGraphicFramePr>
+            <a:graphic xmlns:a="http://schemas.openxmlformats.org/drawingml/2006/main">
+              <a:graphicData uri="http://schemas.openxmlformats.org/drawingml/2006/picture">
+                <pic:pic xmlns:pic="http://schemas.openxmlformats.org/drawingml/2006/picture">
+                  <pic:nvPicPr>
+                    <pic:cNvPr id="0" name="" descr=""/>
+                    <pic:cNvPicPr>
+                      <a:picLocks noChangeAspect="1" noChangeArrowheads="1"/>
+                    </pic:cNvPicPr>
+                  </pic:nvPicPr>
+                  <pic:blipFill>
+                    <a:blip r:embed="rId36" cstate="none"/>
+                    <a:srcRect/>
+                    <a:stretch>
+                      <a:fillRect/>
+                    </a:stretch>
+                  </pic:blipFill>
+                  <pic:spPr bwMode="auto">
+                    <a:xfrm>
+                      <a:off x="0" y="0"/>
+                      <a:ext cx="5124450" cy="3438525"/>
+                    </a:xfrm>
+                    <a:prstGeom prst="rect">
+                      <a:avLst/>
+                    </a:prstGeom>
+                  </pic:spPr>
+                </pic:pic>
+              </a:graphicData>
+            </a:graphic>
+          </wp:inline>
+        </w:drawing>
+      </w:r>
+    </w:p>
+    <w:p>
+      <w:pPr>
+        <w:pStyle w:val="Caption"/>
+      </w:pPr>
+      <w:r>
+        <w:t xml:space="preserve">A room night on 21 Sep 2025: 12% GST</w:t>
+      </w:r>
+    </w:p>
+    <w:p>
+      <w:pPr>
+        <w:keepNext/>
+        <w:pBdr>
+          <w:top w:val="single" w:color="DCE3E1" w:sz="4"/>
+          <w:bottom w:val="single" w:color="DCE3E1" w:sz="4"/>
+          <w:left w:val="single" w:color="DCE3E1" w:sz="4"/>
+          <w:right w:val="single" w:color="DCE3E1" w:sz="4"/>
+        </w:pBdr>
+        <w:spacing w:before="120" w:after="0" w:line="240" w:lineRule="auto"/>
+        <w:jc w:val="center"/>
+      </w:pPr>
+      <w:r>
+        <w:drawing>
+          <wp:inline distT="0" distB="0" distL="0" distR="0">
+            <wp:extent cx="5124450" cy="3438525"/>
+            <wp:effectExtent t="0" r="0" b="0" l="0"/>
+            <wp:docPr id="1" name="The same room night on 22 Sep 2025: 5% GST" descr="The same room night on 22 Sep 2025: 5% GST" title="The same room night on 22 Sep 2025: 5% GST"/>
+            <wp:cNvGraphicFramePr>
+              <a:graphicFrameLocks xmlns:a="http://schemas.openxmlformats.org/drawingml/2006/main" noChangeAspect="1"/>
+            </wp:cNvGraphicFramePr>
+            <a:graphic xmlns:a="http://schemas.openxmlformats.org/drawingml/2006/main">
+              <a:graphicData uri="http://schemas.openxmlformats.org/drawingml/2006/picture">
+                <pic:pic xmlns:pic="http://schemas.openxmlformats.org/drawingml/2006/picture">
+                  <pic:nvPicPr>
+                    <pic:cNvPr id="0" name="" descr=""/>
+                    <pic:cNvPicPr>
+                      <a:picLocks noChangeAspect="1" noChangeArrowheads="1"/>
+                    </pic:cNvPicPr>
+                  </pic:nvPicPr>
+                  <pic:blipFill>
+                    <a:blip r:embed="rId37" cstate="none"/>
+                    <a:srcRect/>
+                    <a:stretch>
+                      <a:fillRect/>
+                    </a:stretch>
+                  </pic:blipFill>
+                  <pic:spPr bwMode="auto">
+                    <a:xfrm>
+                      <a:off x="0" y="0"/>
+                      <a:ext cx="5124450" cy="3438525"/>
+                    </a:xfrm>
+                    <a:prstGeom prst="rect">
+                      <a:avLst/>
+                    </a:prstGeom>
+                  </pic:spPr>
+                </pic:pic>
+              </a:graphicData>
+            </a:graphic>
+          </wp:inline>
+        </w:drawing>
+      </w:r>
+    </w:p>
+    <w:p>
+      <w:pPr>
+        <w:pStyle w:val="Caption"/>
+      </w:pPr>
+      <w:r>
+        <w:t xml:space="preserve">The same room night on 22 Sep 2025: 5% GST</w:t>
+      </w:r>
+    </w:p>
+    <w:p>
+      <w:pPr>
+        <w:pStyle w:val="Heading2"/>
+      </w:pPr>
+      <w:r>
+        <w:t xml:space="preserve">9.10   In progress: Sprint 10 — Payments, refunds, cash drawer</w:t>
+      </w:r>
+    </w:p>
+    <w:p>
+      <w:r>
+        <w:t xml:space="preserve">Cash, UPI, card and bank payments are recorded against the bill, refunds are controlled, and the cash drawer balances at shift end.</w:t>
       </w:r>
     </w:p>
     <w:p>
@@ -14742,7 +15138,7 @@
           <w:sz w:val="18"/>
           <w:szCs w:val="18"/>
         </w:rPr>
-        <w:t xml:space="preserve">It will be accepted when: Accountant can add a new rule effective next month without a deployment.</w:t>
+        <w:t xml:space="preserve">It will be accepted when: [object Object].</w:t>
       </w:r>
     </w:p>
     <w:p>
@@ -17706,7 +18102,7 @@
               <w:bottom w:val="single" w:color="DCE3E1" w:sz="4"/>
               <w:right w:val="single" w:color="DCE3E1" w:sz="4"/>
             </w:tcBorders>
-            <w:shd w:fill="FBEFD8" w:color="auto" w:val="clear"/>
+            <w:shd w:fill="E3F0E6" w:color="auto" w:val="clear"/>
             <w:tcMar>
               <w:top w:type="dxa" w:w="70"/>
               <w:left w:type="dxa" w:w="110"/>
@@ -17724,7 +18120,7 @@
                 <w:sz w:val="17"/>
                 <w:szCs w:val="17"/>
               </w:rPr>
-              <w:t xml:space="preserve">In progress</w:t>
+              <w:t xml:space="preserve">Done</w:t>
             </w:r>
           </w:p>
         </w:tc>
@@ -17832,6 +18228,7 @@
               <w:bottom w:val="single" w:color="DCE3E1" w:sz="4"/>
               <w:right w:val="single" w:color="DCE3E1" w:sz="4"/>
             </w:tcBorders>
+            <w:shd w:fill="FBEFD8" w:color="auto" w:val="clear"/>
             <w:tcMar>
               <w:top w:type="dxa" w:w="70"/>
               <w:left w:type="dxa" w:w="110"/>
@@ -17849,7 +18246,7 @@
                 <w:sz w:val="17"/>
                 <w:szCs w:val="17"/>
               </w:rPr>
-              <w:t xml:space="preserve">Planned</w:t>
+              <w:t xml:space="preserve">In progress</w:t>
             </w:r>
           </w:p>
         </w:tc>
@@ -20277,7 +20674,7 @@
                     </pic:cNvPicPr>
                   </pic:nvPicPr>
                   <pic:blipFill>
-                    <a:blip r:embed="rId35" cstate="none"/>
+                    <a:blip r:embed="rId38" cstate="none"/>
                     <a:srcRect/>
                     <a:stretch>
                       <a:fillRect/>
@@ -20384,7 +20781,7 @@
         <w:t xml:space="preserve">Tests that grow with the system.</w:t>
       </w:r>
       <w:r>
-        <w:t xml:space="preserve"> As of Sprint 08: 174 server test methods, 63 screen tests and 76 end-to-end browser steps, all passing.</w:t>
+        <w:t xml:space="preserve"> As of Sprint 09: 198 server test methods, 67 screen tests and 83 end-to-end browser steps, all passing.</w:t>
       </w:r>
     </w:p>
     <w:p>
@@ -22271,7 +22668,7 @@
         <w:sz w:val="16"/>
         <w:szCs w:val="16"/>
       </w:rPr>
-      <w:t xml:space="preserve">Version 1.8 · 18 October 2026</w:t>
+      <w:t xml:space="preserve">Version 1.9 · 20 October 2026</w:t>
     </w:r>
     <w:r>
       <w:rPr>

</xml_diff>

<commit_message>
chore(sprints): accept Sprint 09 (#127)
Sprint 09 (GST configuration and tax engine) done, Sprint 10 current;
changelog dated; handbooks 1.9 rebuilt; guides, catalogues, README and
run/test table updated.

Co-Authored-By: Claude Opus 5.5 (1M context) <noreply@anthropic.com>
Claude-Session: https://claude.ai/code/session_01Fzqu9rFeMySXazi5mrL4bE
</commit_message>
<xml_diff>
--- a/docs/handbooks/Resort-OS-Product-Overview.docx
+++ b/docs/handbooks/Resort-OS-Product-Overview.docx
@@ -182,7 +182,7 @@
                 <w:sz w:val="19"/>
                 <w:szCs w:val="19"/>
               </w:rPr>
-              <w:t xml:space="preserve">Version 1.8</w:t>
+              <w:t xml:space="preserve">Version 1.9</w:t>
             </w:r>
           </w:p>
         </w:tc>
@@ -252,7 +252,7 @@
                 <w:sz w:val="19"/>
                 <w:szCs w:val="19"/>
               </w:rPr>
-              <w:t xml:space="preserve">18 October 2026</w:t>
+              <w:t xml:space="preserve">20 October 2026</w:t>
             </w:r>
           </w:p>
         </w:tc>
@@ -322,7 +322,7 @@
                 <w:sz w:val="19"/>
                 <w:szCs w:val="19"/>
               </w:rPr>
-              <w:t xml:space="preserve">Sprints 01, 02, 03, 04, 05, 06, 07, 08 accepted · Sprint 09 GST configuration and tax engine in progress</w:t>
+              <w:t xml:space="preserve">Sprints 01, 02, 03, 04, 05, 06, 07, 08, 09 accepted · Sprint 10 Payments, refunds, cash drawer in progress</w:t>
             </w:r>
           </w:p>
         </w:tc>
@@ -661,7 +661,7 @@
                 <w:sz w:val="19"/>
                 <w:szCs w:val="19"/>
               </w:rPr>
-              <w:t xml:space="preserve">1.8</w:t>
+              <w:t xml:space="preserve">1.9</w:t>
             </w:r>
           </w:p>
         </w:tc>
@@ -691,7 +691,7 @@
                 <w:sz w:val="19"/>
                 <w:szCs w:val="19"/>
               </w:rPr>
-              <w:t xml:space="preserve">2026-10-18</w:t>
+              <w:t xml:space="preserve">2026-10-20</w:t>
             </w:r>
           </w:p>
         </w:tc>
@@ -721,7 +721,7 @@
                 <w:sz w:val="19"/>
                 <w:szCs w:val="19"/>
               </w:rPr>
-              <w:t xml:space="preserve">Sprint 08 (Folio) accepted: a running bill for every stay with room nights, meals, transport, activities and packages; nothing can be edited or deleted, a manager reverses a line with a reason; bills can be split; the front desk shows the real balance. Folio flow diagram. Sprint 09 (GST configuration and tax engine) started.</w:t>
+              <w:t xml:space="preserve">Sprint 09 (GST configuration and tax engine) accepted: GST worked out on every charge (CGST + SGST or IGST), rates kept as rules with dates that an accountant changes from next month without a software update, room GST by the price per room per night, posted charges keep their GST. Tax flow diagram. Sprint 10 (Payments, refunds, cash drawer) started.</w:t>
             </w:r>
           </w:p>
         </w:tc>
@@ -757,7 +757,7 @@
                 <w:sz w:val="19"/>
                 <w:szCs w:val="19"/>
               </w:rPr>
-              <w:t xml:space="preserve">1.7</w:t>
+              <w:t xml:space="preserve">1.8</w:t>
             </w:r>
           </w:p>
         </w:tc>
@@ -819,7 +819,7 @@
                 <w:sz w:val="19"/>
                 <w:szCs w:val="19"/>
               </w:rPr>
-              <w:t xml:space="preserve">Sprint 07 (Front desk) accepted: arrivals, departures and in-house lists, check-in and check-out in a few clicks, walk-ins on one screen, early departures with a reason, rooms marked dirty and ready. Check-in flow diagram. Sprint 08 (Folio) started.</w:t>
+              <w:t xml:space="preserve">Sprint 08 (Folio) accepted: a running bill for every stay with room nights, meals, transport, activities and packages; nothing can be edited or deleted, a manager reverses a line with a reason; bills can be split; the front desk shows the real balance. Folio flow diagram. Sprint 09 (GST configuration and tax engine) started.</w:t>
             </w:r>
           </w:p>
         </w:tc>
@@ -854,7 +854,7 @@
                 <w:sz w:val="19"/>
                 <w:szCs w:val="19"/>
               </w:rPr>
-              <w:t xml:space="preserve">1.6</w:t>
+              <w:t xml:space="preserve">1.7</w:t>
             </w:r>
           </w:p>
         </w:tc>
@@ -884,7 +884,7 @@
                 <w:sz w:val="19"/>
                 <w:szCs w:val="19"/>
               </w:rPr>
-              <w:t xml:space="preserve">2026-10-17</w:t>
+              <w:t xml:space="preserve">2026-10-18</w:t>
             </w:r>
           </w:p>
         </w:tc>
@@ -914,7 +914,7 @@
                 <w:sz w:val="19"/>
                 <w:szCs w:val="19"/>
               </w:rPr>
-              <w:t xml:space="preserve">Sprint 06 (Reservation calendar) accepted: day, week and month calendar of rooms and dorm beds, moving a guest by drag-and-drop with a reason, list by day on phones. Room-move flow diagram. Sprint 07 (Front desk) started.</w:t>
+              <w:t xml:space="preserve">Sprint 07 (Front desk) accepted: arrivals, departures and in-house lists, check-in and check-out in a few clicks, walk-ins on one screen, early departures with a reason, rooms marked dirty and ready. Check-in flow diagram. Sprint 08 (Folio) started.</w:t>
             </w:r>
           </w:p>
         </w:tc>
@@ -950,7 +950,7 @@
                 <w:sz w:val="19"/>
                 <w:szCs w:val="19"/>
               </w:rPr>
-              <w:t xml:space="preserve">1.5</w:t>
+              <w:t xml:space="preserve">1.6</w:t>
             </w:r>
           </w:p>
         </w:tc>
@@ -981,7 +981,7 @@
                 <w:sz w:val="19"/>
                 <w:szCs w:val="19"/>
               </w:rPr>
-              <w:t xml:space="preserve">2026-10-15</w:t>
+              <w:t xml:space="preserve">2026-10-17</w:t>
             </w:r>
           </w:p>
         </w:tc>
@@ -1012,7 +1012,7 @@
                 <w:sz w:val="19"/>
                 <w:szCs w:val="19"/>
               </w:rPr>
-              <w:t xml:space="preserve">Sprint 05 (Availability engine and reservations) accepted: race-free booking, booking wizard, booking history, date pickers. Diagrams of the reservation tables and the booking flow. Sprint 06 (Reservation calendar) started.</w:t>
+              <w:t xml:space="preserve">Sprint 06 (Reservation calendar) accepted: day, week and month calendar of rooms and dorm beds, moving a guest by drag-and-drop with a reason, list by day on phones. Room-move flow diagram. Sprint 07 (Front desk) started.</w:t>
             </w:r>
           </w:p>
         </w:tc>
@@ -1047,7 +1047,7 @@
                 <w:sz w:val="19"/>
                 <w:szCs w:val="19"/>
               </w:rPr>
-              <w:t xml:space="preserve">1.4</w:t>
+              <w:t xml:space="preserve">1.5</w:t>
             </w:r>
           </w:p>
         </w:tc>
@@ -1077,7 +1077,7 @@
                 <w:sz w:val="19"/>
                 <w:szCs w:val="19"/>
               </w:rPr>
-              <w:t xml:space="preserve">2026-10-14</w:t>
+              <w:t xml:space="preserve">2026-10-15</w:t>
             </w:r>
           </w:p>
         </w:tc>
@@ -1107,7 +1107,7 @@
                 <w:sz w:val="19"/>
                 <w:szCs w:val="19"/>
               </w:rPr>
-              <w:t xml:space="preserve">Sprint 04 (Rate plans and packages) accepted: nightly price grid, quotes, packages with revenue split. Sprint 05 (Availability engine and reservations) started.</w:t>
+              <w:t xml:space="preserve">Sprint 05 (Availability engine and reservations) accepted: race-free booking, booking wizard, booking history, date pickers. Diagrams of the reservation tables and the booking flow. Sprint 06 (Reservation calendar) started.</w:t>
             </w:r>
           </w:p>
         </w:tc>
@@ -1143,7 +1143,7 @@
                 <w:sz w:val="19"/>
                 <w:szCs w:val="19"/>
               </w:rPr>
-              <w:t xml:space="preserve">1.3</w:t>
+              <w:t xml:space="preserve">1.4</w:t>
             </w:r>
           </w:p>
         </w:tc>
@@ -1174,7 +1174,7 @@
                 <w:sz w:val="19"/>
                 <w:szCs w:val="19"/>
               </w:rPr>
-              <w:t xml:space="preserve">2026-10-11</w:t>
+              <w:t xml:space="preserve">2026-10-14</w:t>
             </w:r>
           </w:p>
         </w:tc>
@@ -1205,7 +1205,7 @@
                 <w:sz w:val="19"/>
                 <w:szCs w:val="19"/>
               </w:rPr>
-              <w:t xml:space="preserve">Sprint 03 (Guests) accepted, with review fixes: Aadhaar number check and error messages that say why. Sprint 04 (Rate plans and packages) started.</w:t>
+              <w:t xml:space="preserve">Sprint 04 (Rate plans and packages) accepted: nightly price grid, quotes, packages with revenue split. Sprint 05 (Availability engine and reservations) started.</w:t>
             </w:r>
           </w:p>
         </w:tc>
@@ -1240,7 +1240,7 @@
                 <w:sz w:val="19"/>
                 <w:szCs w:val="19"/>
               </w:rPr>
-              <w:t xml:space="preserve">1.2.1</w:t>
+              <w:t xml:space="preserve">1.3</w:t>
             </w:r>
           </w:p>
         </w:tc>
@@ -1270,7 +1270,7 @@
                 <w:sz w:val="19"/>
                 <w:szCs w:val="19"/>
               </w:rPr>
-              <w:t xml:space="preserve">2026-10-10</w:t>
+              <w:t xml:space="preserve">2026-10-11</w:t>
             </w:r>
           </w:p>
         </w:tc>
@@ -1300,7 +1300,7 @@
                 <w:sz w:val="19"/>
                 <w:szCs w:val="19"/>
               </w:rPr>
-              <w:t xml:space="preserve">Sprint 03 (Guests) built and in review: guest profiles, encrypted ID documents, duplicates, merge, anonymise, consent.</w:t>
+              <w:t xml:space="preserve">Sprint 03 (Guests) accepted, with review fixes: Aadhaar number check and error messages that say why. Sprint 04 (Rate plans and packages) started.</w:t>
             </w:r>
           </w:p>
         </w:tc>
@@ -1336,6 +1336,103 @@
                 <w:sz w:val="19"/>
                 <w:szCs w:val="19"/>
               </w:rPr>
+              <w:t xml:space="preserve">1.2.1</w:t>
+            </w:r>
+          </w:p>
+        </w:tc>
+        <w:tc>
+          <w:tcPr>
+            <w:tcW w:type="dxa" w:w="1500"/>
+            <w:tcBorders>
+              <w:top w:val="single" w:color="DCE3E1" w:sz="4"/>
+              <w:left w:val="single" w:color="DCE3E1" w:sz="4"/>
+              <w:bottom w:val="single" w:color="DCE3E1" w:sz="4"/>
+              <w:right w:val="single" w:color="DCE3E1" w:sz="4"/>
+            </w:tcBorders>
+            <w:shd w:fill="F5F7F6" w:color="auto" w:val="clear"/>
+            <w:tcMar>
+              <w:top w:type="dxa" w:w="70"/>
+              <w:left w:type="dxa" w:w="110"/>
+              <w:bottom w:type="dxa" w:w="50"/>
+              <w:right w:type="dxa" w:w="110"/>
+            </w:tcMar>
+            <w:vAlign w:val="top"/>
+          </w:tcPr>
+          <w:p>
+            <w:pPr>
+              <w:spacing w:after="40" w:line="252" w:lineRule="auto"/>
+            </w:pPr>
+            <w:r>
+              <w:rPr>
+                <w:sz w:val="19"/>
+                <w:szCs w:val="19"/>
+              </w:rPr>
+              <w:t xml:space="preserve">2026-10-10</w:t>
+            </w:r>
+          </w:p>
+        </w:tc>
+        <w:tc>
+          <w:tcPr>
+            <w:tcW w:type="dxa" w:w="6714"/>
+            <w:tcBorders>
+              <w:top w:val="single" w:color="DCE3E1" w:sz="4"/>
+              <w:left w:val="single" w:color="DCE3E1" w:sz="4"/>
+              <w:bottom w:val="single" w:color="DCE3E1" w:sz="4"/>
+              <w:right w:val="single" w:color="DCE3E1" w:sz="4"/>
+            </w:tcBorders>
+            <w:shd w:fill="F5F7F6" w:color="auto" w:val="clear"/>
+            <w:tcMar>
+              <w:top w:type="dxa" w:w="70"/>
+              <w:left w:type="dxa" w:w="110"/>
+              <w:bottom w:type="dxa" w:w="50"/>
+              <w:right w:type="dxa" w:w="110"/>
+            </w:tcMar>
+            <w:vAlign w:val="top"/>
+          </w:tcPr>
+          <w:p>
+            <w:pPr>
+              <w:spacing w:after="40" w:line="252" w:lineRule="auto"/>
+            </w:pPr>
+            <w:r>
+              <w:rPr>
+                <w:sz w:val="19"/>
+                <w:szCs w:val="19"/>
+              </w:rPr>
+              <w:t xml:space="preserve">Sprint 03 (Guests) built and in review: guest profiles, encrypted ID documents, duplicates, merge, anonymise, consent.</w:t>
+            </w:r>
+          </w:p>
+        </w:tc>
+      </w:tr>
+      <w:tr>
+        <w:trPr>
+          <w:cantSplit/>
+        </w:trPr>
+        <w:tc>
+          <w:tcPr>
+            <w:tcW w:type="dxa" w:w="1100"/>
+            <w:tcBorders>
+              <w:top w:val="single" w:color="DCE3E1" w:sz="4"/>
+              <w:left w:val="single" w:color="DCE3E1" w:sz="4"/>
+              <w:bottom w:val="single" w:color="DCE3E1" w:sz="4"/>
+              <w:right w:val="single" w:color="DCE3E1" w:sz="4"/>
+            </w:tcBorders>
+            <w:tcMar>
+              <w:top w:type="dxa" w:w="70"/>
+              <w:left w:type="dxa" w:w="110"/>
+              <w:bottom w:type="dxa" w:w="50"/>
+              <w:right w:type="dxa" w:w="110"/>
+            </w:tcMar>
+            <w:vAlign w:val="top"/>
+          </w:tcPr>
+          <w:p>
+            <w:pPr>
+              <w:spacing w:after="40" w:line="252" w:lineRule="auto"/>
+            </w:pPr>
+            <w:r>
+              <w:rPr>
+                <w:sz w:val="19"/>
+                <w:szCs w:val="19"/>
+              </w:rPr>
               <w:t xml:space="preserve">1.2</w:t>
             </w:r>
           </w:p>
@@ -1349,7 +1446,6 @@
               <w:bottom w:val="single" w:color="DCE3E1" w:sz="4"/>
               <w:right w:val="single" w:color="DCE3E1" w:sz="4"/>
             </w:tcBorders>
-            <w:shd w:fill="F5F7F6" w:color="auto" w:val="clear"/>
             <w:tcMar>
               <w:top w:type="dxa" w:w="70"/>
               <w:left w:type="dxa" w:w="110"/>
@@ -1380,7 +1476,6 @@
               <w:bottom w:val="single" w:color="DCE3E1" w:sz="4"/>
               <w:right w:val="single" w:color="DCE3E1" w:sz="4"/>
             </w:tcBorders>
-            <w:shd w:fill="F5F7F6" w:color="auto" w:val="clear"/>
             <w:tcMar>
               <w:top w:type="dxa" w:w="70"/>
               <w:left w:type="dxa" w:w="110"/>
@@ -1631,7 +1726,7 @@
                 <w:sz w:val="19"/>
                 <w:szCs w:val="19"/>
               </w:rPr>
-              <w:t xml:space="preserve">Living document, rebuilt at the end of every sprint. This edition reflects Sprint 08 accepted and Sprint 09 in progress.</w:t>
+              <w:t xml:space="preserve">Living document, rebuilt at the end of every sprint. This edition reflects Sprint 09 accepted and Sprint 10 in progress.</w:t>
             </w:r>
           </w:p>
         </w:tc>
@@ -2511,7 +2606,33 @@
           <w:sz w:val="19"/>
           <w:szCs w:val="19"/>
         </w:rPr>
-        <w:t xml:space="preserve">In progress: Sprint 09 — GST configuration and tax engine</w:t>
+        <w:t xml:space="preserve">Sprint 09 — GST configuration and tax engine</w:t>
+      </w:r>
+    </w:p>
+    <w:p>
+      <w:pPr>
+        <w:spacing w:after="30" w:before="0"/>
+        <w:ind w:left="420"/>
+      </w:pPr>
+      <w:r>
+        <w:rPr>
+          <w:b w:val="false"/>
+          <w:bCs w:val="false"/>
+          <w:color w:val="8A2449"/>
+          <w:sz w:val="19"/>
+          <w:szCs w:val="19"/>
+        </w:rPr>
+        <w:t xml:space="preserve">9.10  </w:t>
+      </w:r>
+      <w:r>
+        <w:rPr>
+          <w:b w:val="false"/>
+          <w:bCs w:val="false"/>
+          <w:color w:val="1B2A2E"/>
+          <w:sz w:val="19"/>
+          <w:szCs w:val="19"/>
+        </w:rPr>
+        <w:t xml:space="preserve">In progress: Sprint 10 — Payments, refunds, cash drawer</w:t>
       </w:r>
     </w:p>
     <w:p>
@@ -2834,7 +2955,7 @@
                 <w:sz w:val="40"/>
                 <w:szCs w:val="40"/>
               </w:rPr>
-              <w:t xml:space="preserve">8 of 29</w:t>
+              <w:t xml:space="preserve">9 of 29</w:t>
             </w:r>
           </w:p>
           <w:p>
@@ -3199,7 +3320,7 @@
                 <w:sz w:val="19"/>
                 <w:szCs w:val="19"/>
               </w:rPr>
-              <w:t xml:space="preserve">Sprints 01 and 02 and 03 and 04 and 05 and 06 and 07 and 08 are delivered and accepted. Sprint 09 (GST configuration and tax engine) is in progress.</w:t>
+              <w:t xml:space="preserve">Sprints 01 and 02 and 03 and 04 and 05 and 06 and 07 and 08 and 09 are delivered and accepted. Sprint 10 (Payments, refunds, cash drawer) is in progress.</w:t>
             </w:r>
           </w:p>
         </w:tc>
@@ -5503,25 +5624,25 @@
               <w:bottom w:val="single" w:color="DCE3E1" w:sz="4"/>
               <w:right w:val="single" w:color="DCE3E1" w:sz="4"/>
             </w:tcBorders>
-            <w:shd w:fill="FBEFD8" w:color="auto" w:val="clear"/>
-            <w:tcMar>
-              <w:top w:type="dxa" w:w="70"/>
-              <w:left w:type="dxa" w:w="110"/>
-              <w:bottom w:type="dxa" w:w="50"/>
-              <w:right w:type="dxa" w:w="110"/>
-            </w:tcMar>
-            <w:vAlign w:val="top"/>
-          </w:tcPr>
-          <w:p>
-            <w:pPr>
-              <w:spacing w:after="40" w:line="252" w:lineRule="auto"/>
-            </w:pPr>
-            <w:r>
-              <w:rPr>
-                <w:sz w:val="19"/>
-                <w:szCs w:val="19"/>
-              </w:rPr>
-              <w:t xml:space="preserve">In progress</w:t>
+            <w:shd w:fill="E3F0E6" w:color="auto" w:val="clear"/>
+            <w:tcMar>
+              <w:top w:type="dxa" w:w="70"/>
+              <w:left w:type="dxa" w:w="110"/>
+              <w:bottom w:type="dxa" w:w="50"/>
+              <w:right w:type="dxa" w:w="110"/>
+            </w:tcMar>
+            <w:vAlign w:val="top"/>
+          </w:tcPr>
+          <w:p>
+            <w:pPr>
+              <w:spacing w:after="40" w:line="252" w:lineRule="auto"/>
+            </w:pPr>
+            <w:r>
+              <w:rPr>
+                <w:sz w:val="19"/>
+                <w:szCs w:val="19"/>
+              </w:rPr>
+              <w:t xml:space="preserve">Done</w:t>
             </w:r>
           </w:p>
         </w:tc>
@@ -5599,24 +5720,25 @@
               <w:bottom w:val="single" w:color="DCE3E1" w:sz="4"/>
               <w:right w:val="single" w:color="DCE3E1" w:sz="4"/>
             </w:tcBorders>
-            <w:tcMar>
-              <w:top w:type="dxa" w:w="70"/>
-              <w:left w:type="dxa" w:w="110"/>
-              <w:bottom w:type="dxa" w:w="50"/>
-              <w:right w:type="dxa" w:w="110"/>
-            </w:tcMar>
-            <w:vAlign w:val="top"/>
-          </w:tcPr>
-          <w:p>
-            <w:pPr>
-              <w:spacing w:after="40" w:line="252" w:lineRule="auto"/>
-            </w:pPr>
-            <w:r>
-              <w:rPr>
-                <w:sz w:val="19"/>
-                <w:szCs w:val="19"/>
-              </w:rPr>
-              <w:t xml:space="preserve">Planned</w:t>
+            <w:shd w:fill="FBEFD8" w:color="auto" w:val="clear"/>
+            <w:tcMar>
+              <w:top w:type="dxa" w:w="70"/>
+              <w:left w:type="dxa" w:w="110"/>
+              <w:bottom w:type="dxa" w:w="50"/>
+              <w:right w:type="dxa" w:w="110"/>
+            </w:tcMar>
+            <w:vAlign w:val="top"/>
+          </w:tcPr>
+          <w:p>
+            <w:pPr>
+              <w:spacing w:after="40" w:line="252" w:lineRule="auto"/>
+            </w:pPr>
+            <w:r>
+              <w:rPr>
+                <w:sz w:val="19"/>
+                <w:szCs w:val="19"/>
+              </w:rPr>
+              <w:t xml:space="preserve">In progress</w:t>
             </w:r>
           </w:p>
         </w:tc>
@@ -12563,7 +12685,7 @@
     </w:p>
     <w:p>
       <w:r>
-        <w:t xml:space="preserve">Work is delivered in short sprints, and each one ends with the owner trying the new screens and accepting them. These are the parts that are built, tested and accepted as of Sprint 08.</w:t>
+        <w:t xml:space="preserve">Work is delivered in short sprints, and each one ends with the owner trying the new screens and accepting them. These are the parts that are built, tested and accepted as of Sprint 09.</w:t>
       </w:r>
     </w:p>
     <w:p>
@@ -14724,12 +14846,286 @@
         <w:pStyle w:val="Heading2"/>
       </w:pPr>
       <w:r>
-        <w:t xml:space="preserve">9.9   In progress: Sprint 09 — GST configuration and tax engine</w:t>
+        <w:t xml:space="preserve">9.9   Sprint 09 — GST configuration and tax engine</w:t>
       </w:r>
     </w:p>
     <w:p>
       <w:r>
         <w:t xml:space="preserve">GST is calculated automatically and correctly for each item (CGST/SGST or IGST), with rates kept up to date by configuration, not code.</w:t>
+      </w:r>
+    </w:p>
+    <w:p>
+      <w:pPr>
+        <w:pStyle w:val="ListParagraph"/>
+        <w:numPr>
+          <w:ilvl w:val="0"/>
+          <w:numId w:val="2"/>
+        </w:numPr>
+        <w:spacing w:after="60"/>
+      </w:pPr>
+      <w:r>
+        <w:t xml:space="preserve">GST is worked out automatically on every charge: CGST + SGST inside the state, IGST across states</w:t>
+      </w:r>
+    </w:p>
+    <w:p>
+      <w:pPr>
+        <w:pStyle w:val="ListParagraph"/>
+        <w:numPr>
+          <w:ilvl w:val="0"/>
+          <w:numId w:val="2"/>
+        </w:numPr>
+        <w:spacing w:after="60"/>
+      </w:pPr>
+      <w:r>
+        <w:t xml:space="preserve">No GST rate is built into the software: rates are rules with dates, kept up to date by your accountant</w:t>
+      </w:r>
+    </w:p>
+    <w:p>
+      <w:pPr>
+        <w:pStyle w:val="ListParagraph"/>
+        <w:numPr>
+          <w:ilvl w:val="0"/>
+          <w:numId w:val="2"/>
+        </w:numPr>
+        <w:spacing w:after="60"/>
+      </w:pPr>
+      <w:r>
+        <w:t xml:space="preserve">Your accountant adds next month's rate on the GST page, with no software update; the old rate ends the day before</w:t>
+      </w:r>
+    </w:p>
+    <w:p>
+      <w:pPr>
+        <w:pStyle w:val="ListParagraph"/>
+        <w:numPr>
+          <w:ilvl w:val="0"/>
+          <w:numId w:val="2"/>
+        </w:numPr>
+        <w:spacing w:after="60"/>
+      </w:pPr>
+      <w:r>
+        <w:t xml:space="preserve">Room GST follows the price of each room per night (₹7,500 limit), as the law requires</w:t>
+      </w:r>
+    </w:p>
+    <w:p>
+      <w:pPr>
+        <w:pStyle w:val="ListParagraph"/>
+        <w:numPr>
+          <w:ilvl w:val="0"/>
+          <w:numId w:val="2"/>
+        </w:numPr>
+        <w:spacing w:after="60"/>
+      </w:pPr>
+      <w:r>
+        <w:t xml:space="preserve">A posted charge keeps the GST it was charged with, even if the rate changes later</w:t>
+      </w:r>
+    </w:p>
+    <w:p>
+      <w:pPr>
+        <w:pStyle w:val="ListParagraph"/>
+        <w:numPr>
+          <w:ilvl w:val="0"/>
+          <w:numId w:val="2"/>
+        </w:numPr>
+        <w:spacing w:after="60"/>
+      </w:pPr>
+      <w:r>
+        <w:t xml:space="preserve">The rules shipped with Resort OS are marked unverified until your accountant checks them</w:t>
+      </w:r>
+    </w:p>
+    <w:p>
+      <w:pPr>
+        <w:keepNext/>
+        <w:pBdr>
+          <w:top w:val="single" w:color="DCE3E1" w:sz="4"/>
+          <w:bottom w:val="single" w:color="DCE3E1" w:sz="4"/>
+          <w:left w:val="single" w:color="DCE3E1" w:sz="4"/>
+          <w:right w:val="single" w:color="DCE3E1" w:sz="4"/>
+        </w:pBdr>
+        <w:spacing w:before="120" w:after="0" w:line="240" w:lineRule="auto"/>
+        <w:jc w:val="center"/>
+      </w:pPr>
+      <w:r>
+        <w:drawing>
+          <wp:inline distT="0" distB="0" distL="0" distR="0">
+            <wp:extent cx="5124450" cy="3438525"/>
+            <wp:effectExtent t="0" r="0" b="0" l="0"/>
+            <wp:docPr id="1" name="GST: the registration and the rules with their sources" descr="GST: the registration and the rules with their sources" title="GST: the registration and the rules with their sources"/>
+            <wp:cNvGraphicFramePr>
+              <a:graphicFrameLocks xmlns:a="http://schemas.openxmlformats.org/drawingml/2006/main" noChangeAspect="1"/>
+            </wp:cNvGraphicFramePr>
+            <a:graphic xmlns:a="http://schemas.openxmlformats.org/drawingml/2006/main">
+              <a:graphicData uri="http://schemas.openxmlformats.org/drawingml/2006/picture">
+                <pic:pic xmlns:pic="http://schemas.openxmlformats.org/drawingml/2006/picture">
+                  <pic:nvPicPr>
+                    <pic:cNvPr id="0" name="" descr=""/>
+                    <pic:cNvPicPr>
+                      <a:picLocks noChangeAspect="1" noChangeArrowheads="1"/>
+                    </pic:cNvPicPr>
+                  </pic:nvPicPr>
+                  <pic:blipFill>
+                    <a:blip r:embed="rId35" cstate="none"/>
+                    <a:srcRect/>
+                    <a:stretch>
+                      <a:fillRect/>
+                    </a:stretch>
+                  </pic:blipFill>
+                  <pic:spPr bwMode="auto">
+                    <a:xfrm>
+                      <a:off x="0" y="0"/>
+                      <a:ext cx="5124450" cy="3438525"/>
+                    </a:xfrm>
+                    <a:prstGeom prst="rect">
+                      <a:avLst/>
+                    </a:prstGeom>
+                  </pic:spPr>
+                </pic:pic>
+              </a:graphicData>
+            </a:graphic>
+          </wp:inline>
+        </w:drawing>
+      </w:r>
+    </w:p>
+    <w:p>
+      <w:pPr>
+        <w:pStyle w:val="Caption"/>
+      </w:pPr>
+      <w:r>
+        <w:t xml:space="preserve">GST: the registration and the rules with their sources</w:t>
+      </w:r>
+    </w:p>
+    <w:p>
+      <w:pPr>
+        <w:keepNext/>
+        <w:pBdr>
+          <w:top w:val="single" w:color="DCE3E1" w:sz="4"/>
+          <w:bottom w:val="single" w:color="DCE3E1" w:sz="4"/>
+          <w:left w:val="single" w:color="DCE3E1" w:sz="4"/>
+          <w:right w:val="single" w:color="DCE3E1" w:sz="4"/>
+        </w:pBdr>
+        <w:spacing w:before="120" w:after="0" w:line="240" w:lineRule="auto"/>
+        <w:jc w:val="center"/>
+      </w:pPr>
+      <w:r>
+        <w:drawing>
+          <wp:inline distT="0" distB="0" distL="0" distR="0">
+            <wp:extent cx="5124450" cy="3438525"/>
+            <wp:effectExtent t="0" r="0" b="0" l="0"/>
+            <wp:docPr id="1" name="A room night on 21 Sep 2025: 12% GST" descr="A room night on 21 Sep 2025: 12% GST" title="A room night on 21 Sep 2025: 12% GST"/>
+            <wp:cNvGraphicFramePr>
+              <a:graphicFrameLocks xmlns:a="http://schemas.openxmlformats.org/drawingml/2006/main" noChangeAspect="1"/>
+            </wp:cNvGraphicFramePr>
+            <a:graphic xmlns:a="http://schemas.openxmlformats.org/drawingml/2006/main">
+              <a:graphicData uri="http://schemas.openxmlformats.org/drawingml/2006/picture">
+                <pic:pic xmlns:pic="http://schemas.openxmlformats.org/drawingml/2006/picture">
+                  <pic:nvPicPr>
+                    <pic:cNvPr id="0" name="" descr=""/>
+                    <pic:cNvPicPr>
+                      <a:picLocks noChangeAspect="1" noChangeArrowheads="1"/>
+                    </pic:cNvPicPr>
+                  </pic:nvPicPr>
+                  <pic:blipFill>
+                    <a:blip r:embed="rId36" cstate="none"/>
+                    <a:srcRect/>
+                    <a:stretch>
+                      <a:fillRect/>
+                    </a:stretch>
+                  </pic:blipFill>
+                  <pic:spPr bwMode="auto">
+                    <a:xfrm>
+                      <a:off x="0" y="0"/>
+                      <a:ext cx="5124450" cy="3438525"/>
+                    </a:xfrm>
+                    <a:prstGeom prst="rect">
+                      <a:avLst/>
+                    </a:prstGeom>
+                  </pic:spPr>
+                </pic:pic>
+              </a:graphicData>
+            </a:graphic>
+          </wp:inline>
+        </w:drawing>
+      </w:r>
+    </w:p>
+    <w:p>
+      <w:pPr>
+        <w:pStyle w:val="Caption"/>
+      </w:pPr>
+      <w:r>
+        <w:t xml:space="preserve">A room night on 21 Sep 2025: 12% GST</w:t>
+      </w:r>
+    </w:p>
+    <w:p>
+      <w:pPr>
+        <w:keepNext/>
+        <w:pBdr>
+          <w:top w:val="single" w:color="DCE3E1" w:sz="4"/>
+          <w:bottom w:val="single" w:color="DCE3E1" w:sz="4"/>
+          <w:left w:val="single" w:color="DCE3E1" w:sz="4"/>
+          <w:right w:val="single" w:color="DCE3E1" w:sz="4"/>
+        </w:pBdr>
+        <w:spacing w:before="120" w:after="0" w:line="240" w:lineRule="auto"/>
+        <w:jc w:val="center"/>
+      </w:pPr>
+      <w:r>
+        <w:drawing>
+          <wp:inline distT="0" distB="0" distL="0" distR="0">
+            <wp:extent cx="5124450" cy="3438525"/>
+            <wp:effectExtent t="0" r="0" b="0" l="0"/>
+            <wp:docPr id="1" name="The same room night on 22 Sep 2025: 5% GST" descr="The same room night on 22 Sep 2025: 5% GST" title="The same room night on 22 Sep 2025: 5% GST"/>
+            <wp:cNvGraphicFramePr>
+              <a:graphicFrameLocks xmlns:a="http://schemas.openxmlformats.org/drawingml/2006/main" noChangeAspect="1"/>
+            </wp:cNvGraphicFramePr>
+            <a:graphic xmlns:a="http://schemas.openxmlformats.org/drawingml/2006/main">
+              <a:graphicData uri="http://schemas.openxmlformats.org/drawingml/2006/picture">
+                <pic:pic xmlns:pic="http://schemas.openxmlformats.org/drawingml/2006/picture">
+                  <pic:nvPicPr>
+                    <pic:cNvPr id="0" name="" descr=""/>
+                    <pic:cNvPicPr>
+                      <a:picLocks noChangeAspect="1" noChangeArrowheads="1"/>
+                    </pic:cNvPicPr>
+                  </pic:nvPicPr>
+                  <pic:blipFill>
+                    <a:blip r:embed="rId37" cstate="none"/>
+                    <a:srcRect/>
+                    <a:stretch>
+                      <a:fillRect/>
+                    </a:stretch>
+                  </pic:blipFill>
+                  <pic:spPr bwMode="auto">
+                    <a:xfrm>
+                      <a:off x="0" y="0"/>
+                      <a:ext cx="5124450" cy="3438525"/>
+                    </a:xfrm>
+                    <a:prstGeom prst="rect">
+                      <a:avLst/>
+                    </a:prstGeom>
+                  </pic:spPr>
+                </pic:pic>
+              </a:graphicData>
+            </a:graphic>
+          </wp:inline>
+        </w:drawing>
+      </w:r>
+    </w:p>
+    <w:p>
+      <w:pPr>
+        <w:pStyle w:val="Caption"/>
+      </w:pPr>
+      <w:r>
+        <w:t xml:space="preserve">The same room night on 22 Sep 2025: 5% GST</w:t>
+      </w:r>
+    </w:p>
+    <w:p>
+      <w:pPr>
+        <w:pStyle w:val="Heading2"/>
+      </w:pPr>
+      <w:r>
+        <w:t xml:space="preserve">9.10   In progress: Sprint 10 — Payments, refunds, cash drawer</w:t>
+      </w:r>
+    </w:p>
+    <w:p>
+      <w:r>
+        <w:t xml:space="preserve">Cash, UPI, card and bank payments are recorded against the bill, refunds are controlled, and the cash drawer balances at shift end.</w:t>
       </w:r>
     </w:p>
     <w:p>
@@ -14742,7 +15138,7 @@
           <w:sz w:val="18"/>
           <w:szCs w:val="18"/>
         </w:rPr>
-        <w:t xml:space="preserve">It will be accepted when: Accountant can add a new rule effective next month without a deployment.</w:t>
+        <w:t xml:space="preserve">It will be accepted when: [object Object].</w:t>
       </w:r>
     </w:p>
     <w:p>
@@ -17706,7 +18102,7 @@
               <w:bottom w:val="single" w:color="DCE3E1" w:sz="4"/>
               <w:right w:val="single" w:color="DCE3E1" w:sz="4"/>
             </w:tcBorders>
-            <w:shd w:fill="FBEFD8" w:color="auto" w:val="clear"/>
+            <w:shd w:fill="E3F0E6" w:color="auto" w:val="clear"/>
             <w:tcMar>
               <w:top w:type="dxa" w:w="70"/>
               <w:left w:type="dxa" w:w="110"/>
@@ -17724,7 +18120,7 @@
                 <w:sz w:val="17"/>
                 <w:szCs w:val="17"/>
               </w:rPr>
-              <w:t xml:space="preserve">In progress</w:t>
+              <w:t xml:space="preserve">Done</w:t>
             </w:r>
           </w:p>
         </w:tc>
@@ -17832,6 +18228,7 @@
               <w:bottom w:val="single" w:color="DCE3E1" w:sz="4"/>
               <w:right w:val="single" w:color="DCE3E1" w:sz="4"/>
             </w:tcBorders>
+            <w:shd w:fill="FBEFD8" w:color="auto" w:val="clear"/>
             <w:tcMar>
               <w:top w:type="dxa" w:w="70"/>
               <w:left w:type="dxa" w:w="110"/>
@@ -17849,7 +18246,7 @@
                 <w:sz w:val="17"/>
                 <w:szCs w:val="17"/>
               </w:rPr>
-              <w:t xml:space="preserve">Planned</w:t>
+              <w:t xml:space="preserve">In progress</w:t>
             </w:r>
           </w:p>
         </w:tc>
@@ -20277,7 +20674,7 @@
                     </pic:cNvPicPr>
                   </pic:nvPicPr>
                   <pic:blipFill>
-                    <a:blip r:embed="rId35" cstate="none"/>
+                    <a:blip r:embed="rId38" cstate="none"/>
                     <a:srcRect/>
                     <a:stretch>
                       <a:fillRect/>
@@ -20384,7 +20781,7 @@
         <w:t xml:space="preserve">Tests that grow with the system.</w:t>
       </w:r>
       <w:r>
-        <w:t xml:space="preserve"> As of Sprint 08: 174 server test methods, 63 screen tests and 76 end-to-end browser steps, all passing.</w:t>
+        <w:t xml:space="preserve"> As of Sprint 09: 198 server test methods, 67 screen tests and 83 end-to-end browser steps, all passing.</w:t>
       </w:r>
     </w:p>
     <w:p>
@@ -22271,7 +22668,7 @@
         <w:sz w:val="16"/>
         <w:szCs w:val="16"/>
       </w:rPr>
-      <w:t xml:space="preserve">Version 1.8 · 18 October 2026</w:t>
+      <w:t xml:space="preserve">Version 1.9 · 20 October 2026</w:t>
     </w:r>
     <w:r>
       <w:rPr>

</xml_diff>

<commit_message>
chore(sprints): accept Sprint 10
Sprint 10 (Payments, refunds, cash drawer) done, Sprint 11 current;
changelog dated; handbooks 1.10 rebuilt; capabilities diagram updated;
guides, catalogues, README and run/test table updated.

Co-Authored-By: Claude Opus 5.5 (1M context) <noreply@anthropic.com>
Claude-Session: https://claude.ai/code/session_01HpC8iHNQR4sq1x9pXzSWYL
</commit_message>
<xml_diff>
--- a/docs/handbooks/Resort-OS-Product-Overview.docx
+++ b/docs/handbooks/Resort-OS-Product-Overview.docx
@@ -182,7 +182,7 @@
                 <w:sz w:val="19"/>
                 <w:szCs w:val="19"/>
               </w:rPr>
-              <w:t xml:space="preserve">Version 1.9</w:t>
+              <w:t xml:space="preserve">Version 1.10</w:t>
             </w:r>
           </w:p>
         </w:tc>
@@ -322,7 +322,7 @@
                 <w:sz w:val="19"/>
                 <w:szCs w:val="19"/>
               </w:rPr>
-              <w:t xml:space="preserve">Sprints 01, 02, 03, 04, 05, 06, 07, 08, 09 accepted · Sprint 10 Payments, refunds, cash drawer in progress</w:t>
+              <w:t xml:space="preserve">Sprints 01, 02, 03, 04, 05, 06, 07, 08, 09, 10 accepted · Sprint 11 Razorpay in progress</w:t>
             </w:r>
           </w:p>
         </w:tc>
@@ -661,7 +661,7 @@
                 <w:sz w:val="19"/>
                 <w:szCs w:val="19"/>
               </w:rPr>
-              <w:t xml:space="preserve">1.9</w:t>
+              <w:t xml:space="preserve">1.10</w:t>
             </w:r>
           </w:p>
         </w:tc>
@@ -721,7 +721,7 @@
                 <w:sz w:val="19"/>
                 <w:szCs w:val="19"/>
               </w:rPr>
-              <w:t xml:space="preserve">Sprint 09 (GST configuration and tax engine) accepted: GST worked out on every charge (CGST + SGST or IGST), rates kept as rules with dates that an accountant changes from next month without a software update, room GST by the price per room per night, posted charges keep their GST. Tax flow diagram. Sprint 10 (Payments, refunds, cash drawer) started.</w:t>
+              <w:t xml:space="preserve">Sprint 10 (Payments, refunds, cash drawer) accepted: cash, UPI, card and bank payments on the bill or on account, refunds with a reason that can never exceed the payment, voids, the cash drawer opened and closed against a count with manager approval of a shortfall, no card data stored, real balances at check-out. Payment flow diagram. Sprint 11 (Razorpay) started.</w:t>
             </w:r>
           </w:p>
         </w:tc>
@@ -757,7 +757,7 @@
                 <w:sz w:val="19"/>
                 <w:szCs w:val="19"/>
               </w:rPr>
-              <w:t xml:space="preserve">1.8</w:t>
+              <w:t xml:space="preserve">1.9</w:t>
             </w:r>
           </w:p>
         </w:tc>
@@ -788,7 +788,7 @@
                 <w:sz w:val="19"/>
                 <w:szCs w:val="19"/>
               </w:rPr>
-              <w:t xml:space="preserve">2026-10-18</w:t>
+              <w:t xml:space="preserve">2026-10-20</w:t>
             </w:r>
           </w:p>
         </w:tc>
@@ -819,7 +819,7 @@
                 <w:sz w:val="19"/>
                 <w:szCs w:val="19"/>
               </w:rPr>
-              <w:t xml:space="preserve">Sprint 08 (Folio) accepted: a running bill for every stay with room nights, meals, transport, activities and packages; nothing can be edited or deleted, a manager reverses a line with a reason; bills can be split; the front desk shows the real balance. Folio flow diagram. Sprint 09 (GST configuration and tax engine) started.</w:t>
+              <w:t xml:space="preserve">Sprint 09 (GST configuration and tax engine) accepted: GST worked out on every charge (CGST + SGST or IGST), rates kept as rules with dates that an accountant changes from next month without a software update, room GST by the price per room per night, posted charges keep their GST. Tax flow diagram. Sprint 10 (Payments, refunds, cash drawer) started.</w:t>
             </w:r>
           </w:p>
         </w:tc>
@@ -854,7 +854,7 @@
                 <w:sz w:val="19"/>
                 <w:szCs w:val="19"/>
               </w:rPr>
-              <w:t xml:space="preserve">1.7</w:t>
+              <w:t xml:space="preserve">1.8</w:t>
             </w:r>
           </w:p>
         </w:tc>
@@ -914,7 +914,7 @@
                 <w:sz w:val="19"/>
                 <w:szCs w:val="19"/>
               </w:rPr>
-              <w:t xml:space="preserve">Sprint 07 (Front desk) accepted: arrivals, departures and in-house lists, check-in and check-out in a few clicks, walk-ins on one screen, early departures with a reason, rooms marked dirty and ready. Check-in flow diagram. Sprint 08 (Folio) started.</w:t>
+              <w:t xml:space="preserve">Sprint 08 (Folio) accepted: a running bill for every stay with room nights, meals, transport, activities and packages; nothing can be edited or deleted, a manager reverses a line with a reason; bills can be split; the front desk shows the real balance. Folio flow diagram. Sprint 09 (GST configuration and tax engine) started.</w:t>
             </w:r>
           </w:p>
         </w:tc>
@@ -950,7 +950,7 @@
                 <w:sz w:val="19"/>
                 <w:szCs w:val="19"/>
               </w:rPr>
-              <w:t xml:space="preserve">1.6</w:t>
+              <w:t xml:space="preserve">1.7</w:t>
             </w:r>
           </w:p>
         </w:tc>
@@ -981,7 +981,7 @@
                 <w:sz w:val="19"/>
                 <w:szCs w:val="19"/>
               </w:rPr>
-              <w:t xml:space="preserve">2026-10-17</w:t>
+              <w:t xml:space="preserve">2026-10-18</w:t>
             </w:r>
           </w:p>
         </w:tc>
@@ -1012,7 +1012,7 @@
                 <w:sz w:val="19"/>
                 <w:szCs w:val="19"/>
               </w:rPr>
-              <w:t xml:space="preserve">Sprint 06 (Reservation calendar) accepted: day, week and month calendar of rooms and dorm beds, moving a guest by drag-and-drop with a reason, list by day on phones. Room-move flow diagram. Sprint 07 (Front desk) started.</w:t>
+              <w:t xml:space="preserve">Sprint 07 (Front desk) accepted: arrivals, departures and in-house lists, check-in and check-out in a few clicks, walk-ins on one screen, early departures with a reason, rooms marked dirty and ready. Check-in flow diagram. Sprint 08 (Folio) started.</w:t>
             </w:r>
           </w:p>
         </w:tc>
@@ -1047,7 +1047,7 @@
                 <w:sz w:val="19"/>
                 <w:szCs w:val="19"/>
               </w:rPr>
-              <w:t xml:space="preserve">1.5</w:t>
+              <w:t xml:space="preserve">1.6</w:t>
             </w:r>
           </w:p>
         </w:tc>
@@ -1077,7 +1077,7 @@
                 <w:sz w:val="19"/>
                 <w:szCs w:val="19"/>
               </w:rPr>
-              <w:t xml:space="preserve">2026-10-15</w:t>
+              <w:t xml:space="preserve">2026-10-17</w:t>
             </w:r>
           </w:p>
         </w:tc>
@@ -1107,7 +1107,7 @@
                 <w:sz w:val="19"/>
                 <w:szCs w:val="19"/>
               </w:rPr>
-              <w:t xml:space="preserve">Sprint 05 (Availability engine and reservations) accepted: race-free booking, booking wizard, booking history, date pickers. Diagrams of the reservation tables and the booking flow. Sprint 06 (Reservation calendar) started.</w:t>
+              <w:t xml:space="preserve">Sprint 06 (Reservation calendar) accepted: day, week and month calendar of rooms and dorm beds, moving a guest by drag-and-drop with a reason, list by day on phones. Room-move flow diagram. Sprint 07 (Front desk) started.</w:t>
             </w:r>
           </w:p>
         </w:tc>
@@ -1143,7 +1143,7 @@
                 <w:sz w:val="19"/>
                 <w:szCs w:val="19"/>
               </w:rPr>
-              <w:t xml:space="preserve">1.4</w:t>
+              <w:t xml:space="preserve">1.5</w:t>
             </w:r>
           </w:p>
         </w:tc>
@@ -1174,7 +1174,7 @@
                 <w:sz w:val="19"/>
                 <w:szCs w:val="19"/>
               </w:rPr>
-              <w:t xml:space="preserve">2026-10-14</w:t>
+              <w:t xml:space="preserve">2026-10-15</w:t>
             </w:r>
           </w:p>
         </w:tc>
@@ -1205,7 +1205,7 @@
                 <w:sz w:val="19"/>
                 <w:szCs w:val="19"/>
               </w:rPr>
-              <w:t xml:space="preserve">Sprint 04 (Rate plans and packages) accepted: nightly price grid, quotes, packages with revenue split. Sprint 05 (Availability engine and reservations) started.</w:t>
+              <w:t xml:space="preserve">Sprint 05 (Availability engine and reservations) accepted: race-free booking, booking wizard, booking history, date pickers. Diagrams of the reservation tables and the booking flow. Sprint 06 (Reservation calendar) started.</w:t>
             </w:r>
           </w:p>
         </w:tc>
@@ -1240,7 +1240,7 @@
                 <w:sz w:val="19"/>
                 <w:szCs w:val="19"/>
               </w:rPr>
-              <w:t xml:space="preserve">1.3</w:t>
+              <w:t xml:space="preserve">1.4</w:t>
             </w:r>
           </w:p>
         </w:tc>
@@ -1270,7 +1270,7 @@
                 <w:sz w:val="19"/>
                 <w:szCs w:val="19"/>
               </w:rPr>
-              <w:t xml:space="preserve">2026-10-11</w:t>
+              <w:t xml:space="preserve">2026-10-14</w:t>
             </w:r>
           </w:p>
         </w:tc>
@@ -1300,7 +1300,7 @@
                 <w:sz w:val="19"/>
                 <w:szCs w:val="19"/>
               </w:rPr>
-              <w:t xml:space="preserve">Sprint 03 (Guests) accepted, with review fixes: Aadhaar number check and error messages that say why. Sprint 04 (Rate plans and packages) started.</w:t>
+              <w:t xml:space="preserve">Sprint 04 (Rate plans and packages) accepted: nightly price grid, quotes, packages with revenue split. Sprint 05 (Availability engine and reservations) started.</w:t>
             </w:r>
           </w:p>
         </w:tc>
@@ -1336,7 +1336,7 @@
                 <w:sz w:val="19"/>
                 <w:szCs w:val="19"/>
               </w:rPr>
-              <w:t xml:space="preserve">1.2.1</w:t>
+              <w:t xml:space="preserve">1.3</w:t>
             </w:r>
           </w:p>
         </w:tc>
@@ -1367,7 +1367,7 @@
                 <w:sz w:val="19"/>
                 <w:szCs w:val="19"/>
               </w:rPr>
-              <w:t xml:space="preserve">2026-10-10</w:t>
+              <w:t xml:space="preserve">2026-10-11</w:t>
             </w:r>
           </w:p>
         </w:tc>
@@ -1398,7 +1398,7 @@
                 <w:sz w:val="19"/>
                 <w:szCs w:val="19"/>
               </w:rPr>
-              <w:t xml:space="preserve">Sprint 03 (Guests) built and in review: guest profiles, encrypted ID documents, duplicates, merge, anonymise, consent.</w:t>
+              <w:t xml:space="preserve">Sprint 03 (Guests) accepted, with review fixes: Aadhaar number check and error messages that say why. Sprint 04 (Rate plans and packages) started.</w:t>
             </w:r>
           </w:p>
         </w:tc>
@@ -1433,6 +1433,102 @@
                 <w:sz w:val="19"/>
                 <w:szCs w:val="19"/>
               </w:rPr>
+              <w:t xml:space="preserve">1.2.1</w:t>
+            </w:r>
+          </w:p>
+        </w:tc>
+        <w:tc>
+          <w:tcPr>
+            <w:tcW w:type="dxa" w:w="1500"/>
+            <w:tcBorders>
+              <w:top w:val="single" w:color="DCE3E1" w:sz="4"/>
+              <w:left w:val="single" w:color="DCE3E1" w:sz="4"/>
+              <w:bottom w:val="single" w:color="DCE3E1" w:sz="4"/>
+              <w:right w:val="single" w:color="DCE3E1" w:sz="4"/>
+            </w:tcBorders>
+            <w:tcMar>
+              <w:top w:type="dxa" w:w="70"/>
+              <w:left w:type="dxa" w:w="110"/>
+              <w:bottom w:type="dxa" w:w="50"/>
+              <w:right w:type="dxa" w:w="110"/>
+            </w:tcMar>
+            <w:vAlign w:val="top"/>
+          </w:tcPr>
+          <w:p>
+            <w:pPr>
+              <w:spacing w:after="40" w:line="252" w:lineRule="auto"/>
+            </w:pPr>
+            <w:r>
+              <w:rPr>
+                <w:sz w:val="19"/>
+                <w:szCs w:val="19"/>
+              </w:rPr>
+              <w:t xml:space="preserve">2026-10-10</w:t>
+            </w:r>
+          </w:p>
+        </w:tc>
+        <w:tc>
+          <w:tcPr>
+            <w:tcW w:type="dxa" w:w="6714"/>
+            <w:tcBorders>
+              <w:top w:val="single" w:color="DCE3E1" w:sz="4"/>
+              <w:left w:val="single" w:color="DCE3E1" w:sz="4"/>
+              <w:bottom w:val="single" w:color="DCE3E1" w:sz="4"/>
+              <w:right w:val="single" w:color="DCE3E1" w:sz="4"/>
+            </w:tcBorders>
+            <w:tcMar>
+              <w:top w:type="dxa" w:w="70"/>
+              <w:left w:type="dxa" w:w="110"/>
+              <w:bottom w:type="dxa" w:w="50"/>
+              <w:right w:type="dxa" w:w="110"/>
+            </w:tcMar>
+            <w:vAlign w:val="top"/>
+          </w:tcPr>
+          <w:p>
+            <w:pPr>
+              <w:spacing w:after="40" w:line="252" w:lineRule="auto"/>
+            </w:pPr>
+            <w:r>
+              <w:rPr>
+                <w:sz w:val="19"/>
+                <w:szCs w:val="19"/>
+              </w:rPr>
+              <w:t xml:space="preserve">Sprint 03 (Guests) built and in review: guest profiles, encrypted ID documents, duplicates, merge, anonymise, consent.</w:t>
+            </w:r>
+          </w:p>
+        </w:tc>
+      </w:tr>
+      <w:tr>
+        <w:trPr>
+          <w:cantSplit/>
+        </w:trPr>
+        <w:tc>
+          <w:tcPr>
+            <w:tcW w:type="dxa" w:w="1100"/>
+            <w:tcBorders>
+              <w:top w:val="single" w:color="DCE3E1" w:sz="4"/>
+              <w:left w:val="single" w:color="DCE3E1" w:sz="4"/>
+              <w:bottom w:val="single" w:color="DCE3E1" w:sz="4"/>
+              <w:right w:val="single" w:color="DCE3E1" w:sz="4"/>
+            </w:tcBorders>
+            <w:shd w:fill="F5F7F6" w:color="auto" w:val="clear"/>
+            <w:tcMar>
+              <w:top w:type="dxa" w:w="70"/>
+              <w:left w:type="dxa" w:w="110"/>
+              <w:bottom w:type="dxa" w:w="50"/>
+              <w:right w:type="dxa" w:w="110"/>
+            </w:tcMar>
+            <w:vAlign w:val="top"/>
+          </w:tcPr>
+          <w:p>
+            <w:pPr>
+              <w:spacing w:after="40" w:line="252" w:lineRule="auto"/>
+            </w:pPr>
+            <w:r>
+              <w:rPr>
+                <w:sz w:val="19"/>
+                <w:szCs w:val="19"/>
+              </w:rPr>
               <w:t xml:space="preserve">1.2</w:t>
             </w:r>
           </w:p>
@@ -1446,6 +1542,7 @@
               <w:bottom w:val="single" w:color="DCE3E1" w:sz="4"/>
               <w:right w:val="single" w:color="DCE3E1" w:sz="4"/>
             </w:tcBorders>
+            <w:shd w:fill="F5F7F6" w:color="auto" w:val="clear"/>
             <w:tcMar>
               <w:top w:type="dxa" w:w="70"/>
               <w:left w:type="dxa" w:w="110"/>
@@ -1476,6 +1573,7 @@
               <w:bottom w:val="single" w:color="DCE3E1" w:sz="4"/>
               <w:right w:val="single" w:color="DCE3E1" w:sz="4"/>
             </w:tcBorders>
+            <w:shd w:fill="F5F7F6" w:color="auto" w:val="clear"/>
             <w:tcMar>
               <w:top w:type="dxa" w:w="70"/>
               <w:left w:type="dxa" w:w="110"/>
@@ -1726,7 +1824,7 @@
                 <w:sz w:val="19"/>
                 <w:szCs w:val="19"/>
               </w:rPr>
-              <w:t xml:space="preserve">Living document, rebuilt at the end of every sprint. This edition reflects Sprint 09 accepted and Sprint 10 in progress.</w:t>
+              <w:t xml:space="preserve">Living document, rebuilt at the end of every sprint. This edition reflects Sprint 10 accepted and Sprint 11 in progress.</w:t>
             </w:r>
           </w:p>
         </w:tc>
@@ -2632,7 +2730,33 @@
           <w:sz w:val="19"/>
           <w:szCs w:val="19"/>
         </w:rPr>
-        <w:t xml:space="preserve">In progress: Sprint 10 — Payments, refunds, cash drawer</w:t>
+        <w:t xml:space="preserve">Sprint 10 — Payments, refunds, cash drawer</w:t>
+      </w:r>
+    </w:p>
+    <w:p>
+      <w:pPr>
+        <w:spacing w:after="30" w:before="0"/>
+        <w:ind w:left="420"/>
+      </w:pPr>
+      <w:r>
+        <w:rPr>
+          <w:b w:val="false"/>
+          <w:bCs w:val="false"/>
+          <w:color w:val="8A2449"/>
+          <w:sz w:val="19"/>
+          <w:szCs w:val="19"/>
+        </w:rPr>
+        <w:t xml:space="preserve">9.11  </w:t>
+      </w:r>
+      <w:r>
+        <w:rPr>
+          <w:b w:val="false"/>
+          <w:bCs w:val="false"/>
+          <w:color w:val="1B2A2E"/>
+          <w:sz w:val="19"/>
+          <w:szCs w:val="19"/>
+        </w:rPr>
+        <w:t xml:space="preserve">In progress: Sprint 11 — Razorpay</w:t>
       </w:r>
     </w:p>
     <w:p>
@@ -2955,7 +3079,7 @@
                 <w:sz w:val="40"/>
                 <w:szCs w:val="40"/>
               </w:rPr>
-              <w:t xml:space="preserve">9 of 29</w:t>
+              <w:t xml:space="preserve">10 of 29</w:t>
             </w:r>
           </w:p>
           <w:p>
@@ -3320,7 +3444,7 @@
                 <w:sz w:val="19"/>
                 <w:szCs w:val="19"/>
               </w:rPr>
-              <w:t xml:space="preserve">Sprints 01 and 02 and 03 and 04 and 05 and 06 and 07 and 08 and 09 are delivered and accepted. Sprint 10 (Payments, refunds, cash drawer) is in progress.</w:t>
+              <w:t xml:space="preserve">Sprints 01 and 02 and 03 and 04 and 05 and 06 and 07 and 08 and 09 and 10 are delivered and accepted. Sprint 11 (Razorpay) is in progress.</w:t>
             </w:r>
           </w:p>
         </w:tc>
@@ -5720,25 +5844,25 @@
               <w:bottom w:val="single" w:color="DCE3E1" w:sz="4"/>
               <w:right w:val="single" w:color="DCE3E1" w:sz="4"/>
             </w:tcBorders>
-            <w:shd w:fill="FBEFD8" w:color="auto" w:val="clear"/>
-            <w:tcMar>
-              <w:top w:type="dxa" w:w="70"/>
-              <w:left w:type="dxa" w:w="110"/>
-              <w:bottom w:type="dxa" w:w="50"/>
-              <w:right w:type="dxa" w:w="110"/>
-            </w:tcMar>
-            <w:vAlign w:val="top"/>
-          </w:tcPr>
-          <w:p>
-            <w:pPr>
-              <w:spacing w:after="40" w:line="252" w:lineRule="auto"/>
-            </w:pPr>
-            <w:r>
-              <w:rPr>
-                <w:sz w:val="19"/>
-                <w:szCs w:val="19"/>
-              </w:rPr>
-              <w:t xml:space="preserve">In progress</w:t>
+            <w:shd w:fill="E3F0E6" w:color="auto" w:val="clear"/>
+            <w:tcMar>
+              <w:top w:type="dxa" w:w="70"/>
+              <w:left w:type="dxa" w:w="110"/>
+              <w:bottom w:type="dxa" w:w="50"/>
+              <w:right w:type="dxa" w:w="110"/>
+            </w:tcMar>
+            <w:vAlign w:val="top"/>
+          </w:tcPr>
+          <w:p>
+            <w:pPr>
+              <w:spacing w:after="40" w:line="252" w:lineRule="auto"/>
+            </w:pPr>
+            <w:r>
+              <w:rPr>
+                <w:sz w:val="19"/>
+                <w:szCs w:val="19"/>
+              </w:rPr>
+              <w:t xml:space="preserve">Done</w:t>
             </w:r>
           </w:p>
         </w:tc>
@@ -5816,24 +5940,25 @@
               <w:bottom w:val="single" w:color="DCE3E1" w:sz="4"/>
               <w:right w:val="single" w:color="DCE3E1" w:sz="4"/>
             </w:tcBorders>
-            <w:tcMar>
-              <w:top w:type="dxa" w:w="70"/>
-              <w:left w:type="dxa" w:w="110"/>
-              <w:bottom w:type="dxa" w:w="50"/>
-              <w:right w:type="dxa" w:w="110"/>
-            </w:tcMar>
-            <w:vAlign w:val="top"/>
-          </w:tcPr>
-          <w:p>
-            <w:pPr>
-              <w:spacing w:after="40" w:line="252" w:lineRule="auto"/>
-            </w:pPr>
-            <w:r>
-              <w:rPr>
-                <w:sz w:val="19"/>
-                <w:szCs w:val="19"/>
-              </w:rPr>
-              <w:t xml:space="preserve">Planned</w:t>
+            <w:shd w:fill="FBEFD8" w:color="auto" w:val="clear"/>
+            <w:tcMar>
+              <w:top w:type="dxa" w:w="70"/>
+              <w:left w:type="dxa" w:w="110"/>
+              <w:bottom w:type="dxa" w:w="50"/>
+              <w:right w:type="dxa" w:w="110"/>
+            </w:tcMar>
+            <w:vAlign w:val="top"/>
+          </w:tcPr>
+          <w:p>
+            <w:pPr>
+              <w:spacing w:after="40" w:line="252" w:lineRule="auto"/>
+            </w:pPr>
+            <w:r>
+              <w:rPr>
+                <w:sz w:val="19"/>
+                <w:szCs w:val="19"/>
+              </w:rPr>
+              <w:t xml:space="preserve">In progress</w:t>
             </w:r>
           </w:p>
         </w:tc>
@@ -12685,7 +12810,7 @@
     </w:p>
     <w:p>
       <w:r>
-        <w:t xml:space="preserve">Work is delivered in short sprints, and each one ends with the owner trying the new screens and accepting them. These are the parts that are built, tested and accepted as of Sprint 09.</w:t>
+        <w:t xml:space="preserve">Work is delivered in short sprints, and each one ends with the owner trying the new screens and accepting them. These are the parts that are built, tested and accepted as of Sprint 10.</w:t>
       </w:r>
     </w:p>
     <w:p>
@@ -15120,12 +15245,286 @@
         <w:pStyle w:val="Heading2"/>
       </w:pPr>
       <w:r>
-        <w:t xml:space="preserve">9.10   In progress: Sprint 10 — Payments, refunds, cash drawer</w:t>
+        <w:t xml:space="preserve">9.10   Sprint 10 — Payments, refunds, cash drawer</w:t>
       </w:r>
     </w:p>
     <w:p>
       <w:r>
         <w:t xml:space="preserve">Cash, UPI, card and bank payments are recorded against the bill, refunds are controlled, and the cash drawer balances at shift end.</w:t>
+      </w:r>
+    </w:p>
+    <w:p>
+      <w:pPr>
+        <w:pStyle w:val="ListParagraph"/>
+        <w:numPr>
+          <w:ilvl w:val="0"/>
+          <w:numId w:val="2"/>
+        </w:numPr>
+        <w:spacing w:after="60"/>
+      </w:pPr>
+      <w:r>
+        <w:t xml:space="preserve">Cash, UPI, card and bank transfer payments are recorded on the guest's bill, or taken in advance on account</w:t>
+      </w:r>
+    </w:p>
+    <w:p>
+      <w:pPr>
+        <w:pStyle w:val="ListParagraph"/>
+        <w:numPr>
+          <w:ilvl w:val="0"/>
+          <w:numId w:val="2"/>
+        </w:numPr>
+        <w:spacing w:after="60"/>
+      </w:pPr>
+      <w:r>
+        <w:t xml:space="preserve">Refunds need a reason and a manager or accountant, and can never give back more than was paid</w:t>
+      </w:r>
+    </w:p>
+    <w:p>
+      <w:pPr>
+        <w:pStyle w:val="ListParagraph"/>
+        <w:numPr>
+          <w:ilvl w:val="0"/>
+          <w:numId w:val="2"/>
+        </w:numPr>
+        <w:spacing w:after="60"/>
+      </w:pPr>
+      <w:r>
+        <w:t xml:space="preserve">The cash drawer is opened with the cash counted in it and closed against a count; a shortfall needs a reason and a manager's approval</w:t>
+      </w:r>
+    </w:p>
+    <w:p>
+      <w:pPr>
+        <w:pStyle w:val="ListParagraph"/>
+        <w:numPr>
+          <w:ilvl w:val="0"/>
+          <w:numId w:val="2"/>
+        </w:numPr>
+        <w:spacing w:after="60"/>
+      </w:pPr>
+      <w:r>
+        <w:t xml:space="preserve">Card numbers are never stored: anything that looks like one is refused</w:t>
+      </w:r>
+    </w:p>
+    <w:p>
+      <w:pPr>
+        <w:pStyle w:val="ListParagraph"/>
+        <w:numPr>
+          <w:ilvl w:val="0"/>
+          <w:numId w:val="2"/>
+        </w:numPr>
+        <w:spacing w:after="60"/>
+      </w:pPr>
+      <w:r>
+        <w:t xml:space="preserve">Payments, refunds and drawer shifts are never deleted; every change is in the audit trail</w:t>
+      </w:r>
+    </w:p>
+    <w:p>
+      <w:pPr>
+        <w:pStyle w:val="ListParagraph"/>
+        <w:numPr>
+          <w:ilvl w:val="0"/>
+          <w:numId w:val="2"/>
+        </w:numPr>
+        <w:spacing w:after="60"/>
+      </w:pPr>
+      <w:r>
+        <w:t xml:space="preserve">Bill balances, check-out and the calendar now show what has really been paid</w:t>
+      </w:r>
+    </w:p>
+    <w:p>
+      <w:pPr>
+        <w:keepNext/>
+        <w:pBdr>
+          <w:top w:val="single" w:color="DCE3E1" w:sz="4"/>
+          <w:bottom w:val="single" w:color="DCE3E1" w:sz="4"/>
+          <w:left w:val="single" w:color="DCE3E1" w:sz="4"/>
+          <w:right w:val="single" w:color="DCE3E1" w:sz="4"/>
+        </w:pBdr>
+        <w:spacing w:before="120" w:after="0" w:line="240" w:lineRule="auto"/>
+        <w:jc w:val="center"/>
+      </w:pPr>
+      <w:r>
+        <w:drawing>
+          <wp:inline distT="0" distB="0" distL="0" distR="0">
+            <wp:extent cx="5124450" cy="3438525"/>
+            <wp:effectExtent t="0" r="0" b="0" l="0"/>
+            <wp:docPr id="1" name="The cash drawer on the front desk, opened with ₹5,000" descr="The cash drawer on the front desk, opened with ₹5,000" title="The cash drawer on the front desk, opened with ₹5,000"/>
+            <wp:cNvGraphicFramePr>
+              <a:graphicFrameLocks xmlns:a="http://schemas.openxmlformats.org/drawingml/2006/main" noChangeAspect="1"/>
+            </wp:cNvGraphicFramePr>
+            <a:graphic xmlns:a="http://schemas.openxmlformats.org/drawingml/2006/main">
+              <a:graphicData uri="http://schemas.openxmlformats.org/drawingml/2006/picture">
+                <pic:pic xmlns:pic="http://schemas.openxmlformats.org/drawingml/2006/picture">
+                  <pic:nvPicPr>
+                    <pic:cNvPr id="0" name="" descr=""/>
+                    <pic:cNvPicPr>
+                      <a:picLocks noChangeAspect="1" noChangeArrowheads="1"/>
+                    </pic:cNvPicPr>
+                  </pic:nvPicPr>
+                  <pic:blipFill>
+                    <a:blip r:embed="rId38" cstate="none"/>
+                    <a:srcRect/>
+                    <a:stretch>
+                      <a:fillRect/>
+                    </a:stretch>
+                  </pic:blipFill>
+                  <pic:spPr bwMode="auto">
+                    <a:xfrm>
+                      <a:off x="0" y="0"/>
+                      <a:ext cx="5124450" cy="3438525"/>
+                    </a:xfrm>
+                    <a:prstGeom prst="rect">
+                      <a:avLst/>
+                    </a:prstGeom>
+                  </pic:spPr>
+                </pic:pic>
+              </a:graphicData>
+            </a:graphic>
+          </wp:inline>
+        </w:drawing>
+      </w:r>
+    </w:p>
+    <w:p>
+      <w:pPr>
+        <w:pStyle w:val="Caption"/>
+      </w:pPr>
+      <w:r>
+        <w:t xml:space="preserve">The cash drawer on the front desk, opened with ₹5,000</w:t>
+      </w:r>
+    </w:p>
+    <w:p>
+      <w:pPr>
+        <w:keepNext/>
+        <w:pBdr>
+          <w:top w:val="single" w:color="DCE3E1" w:sz="4"/>
+          <w:bottom w:val="single" w:color="DCE3E1" w:sz="4"/>
+          <w:left w:val="single" w:color="DCE3E1" w:sz="4"/>
+          <w:right w:val="single" w:color="DCE3E1" w:sz="4"/>
+        </w:pBdr>
+        <w:spacing w:before="120" w:after="0" w:line="240" w:lineRule="auto"/>
+        <w:jc w:val="center"/>
+      </w:pPr>
+      <w:r>
+        <w:drawing>
+          <wp:inline distT="0" distB="0" distL="0" distR="0">
+            <wp:extent cx="5124450" cy="3438525"/>
+            <wp:effectExtent t="0" r="0" b="0" l="0"/>
+            <wp:docPr id="1" name="A bill paid in cash and UPI: the balance is nil" descr="A bill paid in cash and UPI: the balance is nil" title="A bill paid in cash and UPI: the balance is nil"/>
+            <wp:cNvGraphicFramePr>
+              <a:graphicFrameLocks xmlns:a="http://schemas.openxmlformats.org/drawingml/2006/main" noChangeAspect="1"/>
+            </wp:cNvGraphicFramePr>
+            <a:graphic xmlns:a="http://schemas.openxmlformats.org/drawingml/2006/main">
+              <a:graphicData uri="http://schemas.openxmlformats.org/drawingml/2006/picture">
+                <pic:pic xmlns:pic="http://schemas.openxmlformats.org/drawingml/2006/picture">
+                  <pic:nvPicPr>
+                    <pic:cNvPr id="0" name="" descr=""/>
+                    <pic:cNvPicPr>
+                      <a:picLocks noChangeAspect="1" noChangeArrowheads="1"/>
+                    </pic:cNvPicPr>
+                  </pic:nvPicPr>
+                  <pic:blipFill>
+                    <a:blip r:embed="rId39" cstate="none"/>
+                    <a:srcRect/>
+                    <a:stretch>
+                      <a:fillRect/>
+                    </a:stretch>
+                  </pic:blipFill>
+                  <pic:spPr bwMode="auto">
+                    <a:xfrm>
+                      <a:off x="0" y="0"/>
+                      <a:ext cx="5124450" cy="3438525"/>
+                    </a:xfrm>
+                    <a:prstGeom prst="rect">
+                      <a:avLst/>
+                    </a:prstGeom>
+                  </pic:spPr>
+                </pic:pic>
+              </a:graphicData>
+            </a:graphic>
+          </wp:inline>
+        </w:drawing>
+      </w:r>
+    </w:p>
+    <w:p>
+      <w:pPr>
+        <w:pStyle w:val="Caption"/>
+      </w:pPr>
+      <w:r>
+        <w:t xml:space="preserve">A bill paid in cash and UPI: the balance is nil</w:t>
+      </w:r>
+    </w:p>
+    <w:p>
+      <w:pPr>
+        <w:keepNext/>
+        <w:pBdr>
+          <w:top w:val="single" w:color="DCE3E1" w:sz="4"/>
+          <w:bottom w:val="single" w:color="DCE3E1" w:sz="4"/>
+          <w:left w:val="single" w:color="DCE3E1" w:sz="4"/>
+          <w:right w:val="single" w:color="DCE3E1" w:sz="4"/>
+        </w:pBdr>
+        <w:spacing w:before="120" w:after="0" w:line="240" w:lineRule="auto"/>
+        <w:jc w:val="center"/>
+      </w:pPr>
+      <w:r>
+        <w:drawing>
+          <wp:inline distT="0" distB="0" distL="0" distR="0">
+            <wp:extent cx="5124450" cy="3438525"/>
+            <wp:effectExtent t="0" r="0" b="0" l="0"/>
+            <wp:docPr id="1" name="A card number is refused: card details are never stored" descr="A card number is refused: card details are never stored" title="A card number is refused: card details are never stored"/>
+            <wp:cNvGraphicFramePr>
+              <a:graphicFrameLocks xmlns:a="http://schemas.openxmlformats.org/drawingml/2006/main" noChangeAspect="1"/>
+            </wp:cNvGraphicFramePr>
+            <a:graphic xmlns:a="http://schemas.openxmlformats.org/drawingml/2006/main">
+              <a:graphicData uri="http://schemas.openxmlformats.org/drawingml/2006/picture">
+                <pic:pic xmlns:pic="http://schemas.openxmlformats.org/drawingml/2006/picture">
+                  <pic:nvPicPr>
+                    <pic:cNvPr id="0" name="" descr=""/>
+                    <pic:cNvPicPr>
+                      <a:picLocks noChangeAspect="1" noChangeArrowheads="1"/>
+                    </pic:cNvPicPr>
+                  </pic:nvPicPr>
+                  <pic:blipFill>
+                    <a:blip r:embed="rId40" cstate="none"/>
+                    <a:srcRect/>
+                    <a:stretch>
+                      <a:fillRect/>
+                    </a:stretch>
+                  </pic:blipFill>
+                  <pic:spPr bwMode="auto">
+                    <a:xfrm>
+                      <a:off x="0" y="0"/>
+                      <a:ext cx="5124450" cy="3438525"/>
+                    </a:xfrm>
+                    <a:prstGeom prst="rect">
+                      <a:avLst/>
+                    </a:prstGeom>
+                  </pic:spPr>
+                </pic:pic>
+              </a:graphicData>
+            </a:graphic>
+          </wp:inline>
+        </w:drawing>
+      </w:r>
+    </w:p>
+    <w:p>
+      <w:pPr>
+        <w:pStyle w:val="Caption"/>
+      </w:pPr>
+      <w:r>
+        <w:t xml:space="preserve">A card number is refused: card details are never stored</w:t>
+      </w:r>
+    </w:p>
+    <w:p>
+      <w:pPr>
+        <w:pStyle w:val="Heading2"/>
+      </w:pPr>
+      <w:r>
+        <w:t xml:space="preserve">9.11   In progress: Sprint 11 — Razorpay</w:t>
+      </w:r>
+    </w:p>
+    <w:p>
+      <w:r>
+        <w:t xml:space="preserve">Guests pay online with UPI and cards through Razorpay; payment links can be sent before arrival.</w:t>
       </w:r>
     </w:p>
     <w:p>
@@ -15138,7 +15537,7 @@
           <w:sz w:val="18"/>
           <w:szCs w:val="18"/>
         </w:rPr>
-        <w:t xml:space="preserve">It will be accepted when: [object Object].</w:t>
+        <w:t xml:space="preserve">It will be accepted when: Test-mode payment in Razorpay dashboard confirms the reservation via webhook.</w:t>
       </w:r>
     </w:p>
     <w:p>
@@ -18228,7 +18627,7 @@
               <w:bottom w:val="single" w:color="DCE3E1" w:sz="4"/>
               <w:right w:val="single" w:color="DCE3E1" w:sz="4"/>
             </w:tcBorders>
-            <w:shd w:fill="FBEFD8" w:color="auto" w:val="clear"/>
+            <w:shd w:fill="E3F0E6" w:color="auto" w:val="clear"/>
             <w:tcMar>
               <w:top w:type="dxa" w:w="70"/>
               <w:left w:type="dxa" w:w="110"/>
@@ -18246,7 +18645,7 @@
                 <w:sz w:val="17"/>
                 <w:szCs w:val="17"/>
               </w:rPr>
-              <w:t xml:space="preserve">In progress</w:t>
+              <w:t xml:space="preserve">Done</w:t>
             </w:r>
           </w:p>
         </w:tc>
@@ -18354,6 +18753,7 @@
               <w:bottom w:val="single" w:color="DCE3E1" w:sz="4"/>
               <w:right w:val="single" w:color="DCE3E1" w:sz="4"/>
             </w:tcBorders>
+            <w:shd w:fill="FBEFD8" w:color="auto" w:val="clear"/>
             <w:tcMar>
               <w:top w:type="dxa" w:w="70"/>
               <w:left w:type="dxa" w:w="110"/>
@@ -18371,7 +18771,7 @@
                 <w:sz w:val="17"/>
                 <w:szCs w:val="17"/>
               </w:rPr>
-              <w:t xml:space="preserve">Planned</w:t>
+              <w:t xml:space="preserve">In progress</w:t>
             </w:r>
           </w:p>
         </w:tc>
@@ -20674,7 +21074,7 @@
                     </pic:cNvPicPr>
                   </pic:nvPicPr>
                   <pic:blipFill>
-                    <a:blip r:embed="rId38" cstate="none"/>
+                    <a:blip r:embed="rId41" cstate="none"/>
                     <a:srcRect/>
                     <a:stretch>
                       <a:fillRect/>
@@ -20781,7 +21181,7 @@
         <w:t xml:space="preserve">Tests that grow with the system.</w:t>
       </w:r>
       <w:r>
-        <w:t xml:space="preserve"> As of Sprint 09: 198 server test methods, 67 screen tests and 83 end-to-end browser steps, all passing.</w:t>
+        <w:t xml:space="preserve"> As of Sprint 10: 216 server test methods, 72 screen tests and 90 end-to-end browser steps, all passing.</w:t>
       </w:r>
     </w:p>
     <w:p>
@@ -22668,7 +23068,7 @@
         <w:sz w:val="16"/>
         <w:szCs w:val="16"/>
       </w:rPr>
-      <w:t xml:space="preserve">Version 1.9 · 20 October 2026</w:t>
+      <w:t xml:space="preserve">Version 1.10 · 20 October 2026</w:t>
     </w:r>
     <w:r>
       <w:rPr>

</xml_diff>

<commit_message>
chore(sprints): accept Sprint 10 (#130)
Sprint 10 (Payments, refunds, cash drawer) done, Sprint 11 current;
changelog dated; handbooks 1.10 rebuilt; guides, catalogues, README and
run/test table updated.

Co-Authored-By: Claude Opus 5.5 (1M context) <noreply@anthropic.com>
Claude-Session: https://claude.ai/code/session_01HpC8iHNQR4sq1x9pXzSWYL
</commit_message>
<xml_diff>
--- a/docs/handbooks/Resort-OS-Product-Overview.docx
+++ b/docs/handbooks/Resort-OS-Product-Overview.docx
@@ -182,7 +182,7 @@
                 <w:sz w:val="19"/>
                 <w:szCs w:val="19"/>
               </w:rPr>
-              <w:t xml:space="preserve">Version 1.9</w:t>
+              <w:t xml:space="preserve">Version 1.10</w:t>
             </w:r>
           </w:p>
         </w:tc>
@@ -322,7 +322,7 @@
                 <w:sz w:val="19"/>
                 <w:szCs w:val="19"/>
               </w:rPr>
-              <w:t xml:space="preserve">Sprints 01, 02, 03, 04, 05, 06, 07, 08, 09 accepted · Sprint 10 Payments, refunds, cash drawer in progress</w:t>
+              <w:t xml:space="preserve">Sprints 01, 02, 03, 04, 05, 06, 07, 08, 09, 10 accepted · Sprint 11 Razorpay in progress</w:t>
             </w:r>
           </w:p>
         </w:tc>
@@ -661,7 +661,7 @@
                 <w:sz w:val="19"/>
                 <w:szCs w:val="19"/>
               </w:rPr>
-              <w:t xml:space="preserve">1.9</w:t>
+              <w:t xml:space="preserve">1.10</w:t>
             </w:r>
           </w:p>
         </w:tc>
@@ -721,7 +721,7 @@
                 <w:sz w:val="19"/>
                 <w:szCs w:val="19"/>
               </w:rPr>
-              <w:t xml:space="preserve">Sprint 09 (GST configuration and tax engine) accepted: GST worked out on every charge (CGST + SGST or IGST), rates kept as rules with dates that an accountant changes from next month without a software update, room GST by the price per room per night, posted charges keep their GST. Tax flow diagram. Sprint 10 (Payments, refunds, cash drawer) started.</w:t>
+              <w:t xml:space="preserve">Sprint 10 (Payments, refunds, cash drawer) accepted: cash, UPI, card and bank payments on the bill or on account, refunds with a reason that can never exceed the payment, voids, the cash drawer opened and closed against a count with manager approval of a shortfall, no card data stored, real balances at check-out. Payment flow diagram. Sprint 11 (Razorpay) started.</w:t>
             </w:r>
           </w:p>
         </w:tc>
@@ -757,7 +757,7 @@
                 <w:sz w:val="19"/>
                 <w:szCs w:val="19"/>
               </w:rPr>
-              <w:t xml:space="preserve">1.8</w:t>
+              <w:t xml:space="preserve">1.9</w:t>
             </w:r>
           </w:p>
         </w:tc>
@@ -788,7 +788,7 @@
                 <w:sz w:val="19"/>
                 <w:szCs w:val="19"/>
               </w:rPr>
-              <w:t xml:space="preserve">2026-10-18</w:t>
+              <w:t xml:space="preserve">2026-10-20</w:t>
             </w:r>
           </w:p>
         </w:tc>
@@ -819,7 +819,7 @@
                 <w:sz w:val="19"/>
                 <w:szCs w:val="19"/>
               </w:rPr>
-              <w:t xml:space="preserve">Sprint 08 (Folio) accepted: a running bill for every stay with room nights, meals, transport, activities and packages; nothing can be edited or deleted, a manager reverses a line with a reason; bills can be split; the front desk shows the real balance. Folio flow diagram. Sprint 09 (GST configuration and tax engine) started.</w:t>
+              <w:t xml:space="preserve">Sprint 09 (GST configuration and tax engine) accepted: GST worked out on every charge (CGST + SGST or IGST), rates kept as rules with dates that an accountant changes from next month without a software update, room GST by the price per room per night, posted charges keep their GST. Tax flow diagram. Sprint 10 (Payments, refunds, cash drawer) started.</w:t>
             </w:r>
           </w:p>
         </w:tc>
@@ -854,7 +854,7 @@
                 <w:sz w:val="19"/>
                 <w:szCs w:val="19"/>
               </w:rPr>
-              <w:t xml:space="preserve">1.7</w:t>
+              <w:t xml:space="preserve">1.8</w:t>
             </w:r>
           </w:p>
         </w:tc>
@@ -914,7 +914,7 @@
                 <w:sz w:val="19"/>
                 <w:szCs w:val="19"/>
               </w:rPr>
-              <w:t xml:space="preserve">Sprint 07 (Front desk) accepted: arrivals, departures and in-house lists, check-in and check-out in a few clicks, walk-ins on one screen, early departures with a reason, rooms marked dirty and ready. Check-in flow diagram. Sprint 08 (Folio) started.</w:t>
+              <w:t xml:space="preserve">Sprint 08 (Folio) accepted: a running bill for every stay with room nights, meals, transport, activities and packages; nothing can be edited or deleted, a manager reverses a line with a reason; bills can be split; the front desk shows the real balance. Folio flow diagram. Sprint 09 (GST configuration and tax engine) started.</w:t>
             </w:r>
           </w:p>
         </w:tc>
@@ -950,7 +950,7 @@
                 <w:sz w:val="19"/>
                 <w:szCs w:val="19"/>
               </w:rPr>
-              <w:t xml:space="preserve">1.6</w:t>
+              <w:t xml:space="preserve">1.7</w:t>
             </w:r>
           </w:p>
         </w:tc>
@@ -981,7 +981,7 @@
                 <w:sz w:val="19"/>
                 <w:szCs w:val="19"/>
               </w:rPr>
-              <w:t xml:space="preserve">2026-10-17</w:t>
+              <w:t xml:space="preserve">2026-10-18</w:t>
             </w:r>
           </w:p>
         </w:tc>
@@ -1012,7 +1012,7 @@
                 <w:sz w:val="19"/>
                 <w:szCs w:val="19"/>
               </w:rPr>
-              <w:t xml:space="preserve">Sprint 06 (Reservation calendar) accepted: day, week and month calendar of rooms and dorm beds, moving a guest by drag-and-drop with a reason, list by day on phones. Room-move flow diagram. Sprint 07 (Front desk) started.</w:t>
+              <w:t xml:space="preserve">Sprint 07 (Front desk) accepted: arrivals, departures and in-house lists, check-in and check-out in a few clicks, walk-ins on one screen, early departures with a reason, rooms marked dirty and ready. Check-in flow diagram. Sprint 08 (Folio) started.</w:t>
             </w:r>
           </w:p>
         </w:tc>
@@ -1047,7 +1047,7 @@
                 <w:sz w:val="19"/>
                 <w:szCs w:val="19"/>
               </w:rPr>
-              <w:t xml:space="preserve">1.5</w:t>
+              <w:t xml:space="preserve">1.6</w:t>
             </w:r>
           </w:p>
         </w:tc>
@@ -1077,7 +1077,7 @@
                 <w:sz w:val="19"/>
                 <w:szCs w:val="19"/>
               </w:rPr>
-              <w:t xml:space="preserve">2026-10-15</w:t>
+              <w:t xml:space="preserve">2026-10-17</w:t>
             </w:r>
           </w:p>
         </w:tc>
@@ -1107,7 +1107,7 @@
                 <w:sz w:val="19"/>
                 <w:szCs w:val="19"/>
               </w:rPr>
-              <w:t xml:space="preserve">Sprint 05 (Availability engine and reservations) accepted: race-free booking, booking wizard, booking history, date pickers. Diagrams of the reservation tables and the booking flow. Sprint 06 (Reservation calendar) started.</w:t>
+              <w:t xml:space="preserve">Sprint 06 (Reservation calendar) accepted: day, week and month calendar of rooms and dorm beds, moving a guest by drag-and-drop with a reason, list by day on phones. Room-move flow diagram. Sprint 07 (Front desk) started.</w:t>
             </w:r>
           </w:p>
         </w:tc>
@@ -1143,7 +1143,7 @@
                 <w:sz w:val="19"/>
                 <w:szCs w:val="19"/>
               </w:rPr>
-              <w:t xml:space="preserve">1.4</w:t>
+              <w:t xml:space="preserve">1.5</w:t>
             </w:r>
           </w:p>
         </w:tc>
@@ -1174,7 +1174,7 @@
                 <w:sz w:val="19"/>
                 <w:szCs w:val="19"/>
               </w:rPr>
-              <w:t xml:space="preserve">2026-10-14</w:t>
+              <w:t xml:space="preserve">2026-10-15</w:t>
             </w:r>
           </w:p>
         </w:tc>
@@ -1205,7 +1205,7 @@
                 <w:sz w:val="19"/>
                 <w:szCs w:val="19"/>
               </w:rPr>
-              <w:t xml:space="preserve">Sprint 04 (Rate plans and packages) accepted: nightly price grid, quotes, packages with revenue split. Sprint 05 (Availability engine and reservations) started.</w:t>
+              <w:t xml:space="preserve">Sprint 05 (Availability engine and reservations) accepted: race-free booking, booking wizard, booking history, date pickers. Diagrams of the reservation tables and the booking flow. Sprint 06 (Reservation calendar) started.</w:t>
             </w:r>
           </w:p>
         </w:tc>
@@ -1240,7 +1240,7 @@
                 <w:sz w:val="19"/>
                 <w:szCs w:val="19"/>
               </w:rPr>
-              <w:t xml:space="preserve">1.3</w:t>
+              <w:t xml:space="preserve">1.4</w:t>
             </w:r>
           </w:p>
         </w:tc>
@@ -1270,7 +1270,7 @@
                 <w:sz w:val="19"/>
                 <w:szCs w:val="19"/>
               </w:rPr>
-              <w:t xml:space="preserve">2026-10-11</w:t>
+              <w:t xml:space="preserve">2026-10-14</w:t>
             </w:r>
           </w:p>
         </w:tc>
@@ -1300,7 +1300,7 @@
                 <w:sz w:val="19"/>
                 <w:szCs w:val="19"/>
               </w:rPr>
-              <w:t xml:space="preserve">Sprint 03 (Guests) accepted, with review fixes: Aadhaar number check and error messages that say why. Sprint 04 (Rate plans and packages) started.</w:t>
+              <w:t xml:space="preserve">Sprint 04 (Rate plans and packages) accepted: nightly price grid, quotes, packages with revenue split. Sprint 05 (Availability engine and reservations) started.</w:t>
             </w:r>
           </w:p>
         </w:tc>
@@ -1336,7 +1336,7 @@
                 <w:sz w:val="19"/>
                 <w:szCs w:val="19"/>
               </w:rPr>
-              <w:t xml:space="preserve">1.2.1</w:t>
+              <w:t xml:space="preserve">1.3</w:t>
             </w:r>
           </w:p>
         </w:tc>
@@ -1367,7 +1367,7 @@
                 <w:sz w:val="19"/>
                 <w:szCs w:val="19"/>
               </w:rPr>
-              <w:t xml:space="preserve">2026-10-10</w:t>
+              <w:t xml:space="preserve">2026-10-11</w:t>
             </w:r>
           </w:p>
         </w:tc>
@@ -1398,7 +1398,7 @@
                 <w:sz w:val="19"/>
                 <w:szCs w:val="19"/>
               </w:rPr>
-              <w:t xml:space="preserve">Sprint 03 (Guests) built and in review: guest profiles, encrypted ID documents, duplicates, merge, anonymise, consent.</w:t>
+              <w:t xml:space="preserve">Sprint 03 (Guests) accepted, with review fixes: Aadhaar number check and error messages that say why. Sprint 04 (Rate plans and packages) started.</w:t>
             </w:r>
           </w:p>
         </w:tc>
@@ -1433,6 +1433,102 @@
                 <w:sz w:val="19"/>
                 <w:szCs w:val="19"/>
               </w:rPr>
+              <w:t xml:space="preserve">1.2.1</w:t>
+            </w:r>
+          </w:p>
+        </w:tc>
+        <w:tc>
+          <w:tcPr>
+            <w:tcW w:type="dxa" w:w="1500"/>
+            <w:tcBorders>
+              <w:top w:val="single" w:color="DCE3E1" w:sz="4"/>
+              <w:left w:val="single" w:color="DCE3E1" w:sz="4"/>
+              <w:bottom w:val="single" w:color="DCE3E1" w:sz="4"/>
+              <w:right w:val="single" w:color="DCE3E1" w:sz="4"/>
+            </w:tcBorders>
+            <w:tcMar>
+              <w:top w:type="dxa" w:w="70"/>
+              <w:left w:type="dxa" w:w="110"/>
+              <w:bottom w:type="dxa" w:w="50"/>
+              <w:right w:type="dxa" w:w="110"/>
+            </w:tcMar>
+            <w:vAlign w:val="top"/>
+          </w:tcPr>
+          <w:p>
+            <w:pPr>
+              <w:spacing w:after="40" w:line="252" w:lineRule="auto"/>
+            </w:pPr>
+            <w:r>
+              <w:rPr>
+                <w:sz w:val="19"/>
+                <w:szCs w:val="19"/>
+              </w:rPr>
+              <w:t xml:space="preserve">2026-10-10</w:t>
+            </w:r>
+          </w:p>
+        </w:tc>
+        <w:tc>
+          <w:tcPr>
+            <w:tcW w:type="dxa" w:w="6714"/>
+            <w:tcBorders>
+              <w:top w:val="single" w:color="DCE3E1" w:sz="4"/>
+              <w:left w:val="single" w:color="DCE3E1" w:sz="4"/>
+              <w:bottom w:val="single" w:color="DCE3E1" w:sz="4"/>
+              <w:right w:val="single" w:color="DCE3E1" w:sz="4"/>
+            </w:tcBorders>
+            <w:tcMar>
+              <w:top w:type="dxa" w:w="70"/>
+              <w:left w:type="dxa" w:w="110"/>
+              <w:bottom w:type="dxa" w:w="50"/>
+              <w:right w:type="dxa" w:w="110"/>
+            </w:tcMar>
+            <w:vAlign w:val="top"/>
+          </w:tcPr>
+          <w:p>
+            <w:pPr>
+              <w:spacing w:after="40" w:line="252" w:lineRule="auto"/>
+            </w:pPr>
+            <w:r>
+              <w:rPr>
+                <w:sz w:val="19"/>
+                <w:szCs w:val="19"/>
+              </w:rPr>
+              <w:t xml:space="preserve">Sprint 03 (Guests) built and in review: guest profiles, encrypted ID documents, duplicates, merge, anonymise, consent.</w:t>
+            </w:r>
+          </w:p>
+        </w:tc>
+      </w:tr>
+      <w:tr>
+        <w:trPr>
+          <w:cantSplit/>
+        </w:trPr>
+        <w:tc>
+          <w:tcPr>
+            <w:tcW w:type="dxa" w:w="1100"/>
+            <w:tcBorders>
+              <w:top w:val="single" w:color="DCE3E1" w:sz="4"/>
+              <w:left w:val="single" w:color="DCE3E1" w:sz="4"/>
+              <w:bottom w:val="single" w:color="DCE3E1" w:sz="4"/>
+              <w:right w:val="single" w:color="DCE3E1" w:sz="4"/>
+            </w:tcBorders>
+            <w:shd w:fill="F5F7F6" w:color="auto" w:val="clear"/>
+            <w:tcMar>
+              <w:top w:type="dxa" w:w="70"/>
+              <w:left w:type="dxa" w:w="110"/>
+              <w:bottom w:type="dxa" w:w="50"/>
+              <w:right w:type="dxa" w:w="110"/>
+            </w:tcMar>
+            <w:vAlign w:val="top"/>
+          </w:tcPr>
+          <w:p>
+            <w:pPr>
+              <w:spacing w:after="40" w:line="252" w:lineRule="auto"/>
+            </w:pPr>
+            <w:r>
+              <w:rPr>
+                <w:sz w:val="19"/>
+                <w:szCs w:val="19"/>
+              </w:rPr>
               <w:t xml:space="preserve">1.2</w:t>
             </w:r>
           </w:p>
@@ -1446,6 +1542,7 @@
               <w:bottom w:val="single" w:color="DCE3E1" w:sz="4"/>
               <w:right w:val="single" w:color="DCE3E1" w:sz="4"/>
             </w:tcBorders>
+            <w:shd w:fill="F5F7F6" w:color="auto" w:val="clear"/>
             <w:tcMar>
               <w:top w:type="dxa" w:w="70"/>
               <w:left w:type="dxa" w:w="110"/>
@@ -1476,6 +1573,7 @@
               <w:bottom w:val="single" w:color="DCE3E1" w:sz="4"/>
               <w:right w:val="single" w:color="DCE3E1" w:sz="4"/>
             </w:tcBorders>
+            <w:shd w:fill="F5F7F6" w:color="auto" w:val="clear"/>
             <w:tcMar>
               <w:top w:type="dxa" w:w="70"/>
               <w:left w:type="dxa" w:w="110"/>
@@ -1726,7 +1824,7 @@
                 <w:sz w:val="19"/>
                 <w:szCs w:val="19"/>
               </w:rPr>
-              <w:t xml:space="preserve">Living document, rebuilt at the end of every sprint. This edition reflects Sprint 09 accepted and Sprint 10 in progress.</w:t>
+              <w:t xml:space="preserve">Living document, rebuilt at the end of every sprint. This edition reflects Sprint 10 accepted and Sprint 11 in progress.</w:t>
             </w:r>
           </w:p>
         </w:tc>
@@ -2632,7 +2730,33 @@
           <w:sz w:val="19"/>
           <w:szCs w:val="19"/>
         </w:rPr>
-        <w:t xml:space="preserve">In progress: Sprint 10 — Payments, refunds, cash drawer</w:t>
+        <w:t xml:space="preserve">Sprint 10 — Payments, refunds, cash drawer</w:t>
+      </w:r>
+    </w:p>
+    <w:p>
+      <w:pPr>
+        <w:spacing w:after="30" w:before="0"/>
+        <w:ind w:left="420"/>
+      </w:pPr>
+      <w:r>
+        <w:rPr>
+          <w:b w:val="false"/>
+          <w:bCs w:val="false"/>
+          <w:color w:val="8A2449"/>
+          <w:sz w:val="19"/>
+          <w:szCs w:val="19"/>
+        </w:rPr>
+        <w:t xml:space="preserve">9.11  </w:t>
+      </w:r>
+      <w:r>
+        <w:rPr>
+          <w:b w:val="false"/>
+          <w:bCs w:val="false"/>
+          <w:color w:val="1B2A2E"/>
+          <w:sz w:val="19"/>
+          <w:szCs w:val="19"/>
+        </w:rPr>
+        <w:t xml:space="preserve">In progress: Sprint 11 — Razorpay</w:t>
       </w:r>
     </w:p>
     <w:p>
@@ -2955,7 +3079,7 @@
                 <w:sz w:val="40"/>
                 <w:szCs w:val="40"/>
               </w:rPr>
-              <w:t xml:space="preserve">9 of 29</w:t>
+              <w:t xml:space="preserve">10 of 29</w:t>
             </w:r>
           </w:p>
           <w:p>
@@ -3320,7 +3444,7 @@
                 <w:sz w:val="19"/>
                 <w:szCs w:val="19"/>
               </w:rPr>
-              <w:t xml:space="preserve">Sprints 01 and 02 and 03 and 04 and 05 and 06 and 07 and 08 and 09 are delivered and accepted. Sprint 10 (Payments, refunds, cash drawer) is in progress.</w:t>
+              <w:t xml:space="preserve">Sprints 01 and 02 and 03 and 04 and 05 and 06 and 07 and 08 and 09 and 10 are delivered and accepted. Sprint 11 (Razorpay) is in progress.</w:t>
             </w:r>
           </w:p>
         </w:tc>
@@ -5720,25 +5844,25 @@
               <w:bottom w:val="single" w:color="DCE3E1" w:sz="4"/>
               <w:right w:val="single" w:color="DCE3E1" w:sz="4"/>
             </w:tcBorders>
-            <w:shd w:fill="FBEFD8" w:color="auto" w:val="clear"/>
-            <w:tcMar>
-              <w:top w:type="dxa" w:w="70"/>
-              <w:left w:type="dxa" w:w="110"/>
-              <w:bottom w:type="dxa" w:w="50"/>
-              <w:right w:type="dxa" w:w="110"/>
-            </w:tcMar>
-            <w:vAlign w:val="top"/>
-          </w:tcPr>
-          <w:p>
-            <w:pPr>
-              <w:spacing w:after="40" w:line="252" w:lineRule="auto"/>
-            </w:pPr>
-            <w:r>
-              <w:rPr>
-                <w:sz w:val="19"/>
-                <w:szCs w:val="19"/>
-              </w:rPr>
-              <w:t xml:space="preserve">In progress</w:t>
+            <w:shd w:fill="E3F0E6" w:color="auto" w:val="clear"/>
+            <w:tcMar>
+              <w:top w:type="dxa" w:w="70"/>
+              <w:left w:type="dxa" w:w="110"/>
+              <w:bottom w:type="dxa" w:w="50"/>
+              <w:right w:type="dxa" w:w="110"/>
+            </w:tcMar>
+            <w:vAlign w:val="top"/>
+          </w:tcPr>
+          <w:p>
+            <w:pPr>
+              <w:spacing w:after="40" w:line="252" w:lineRule="auto"/>
+            </w:pPr>
+            <w:r>
+              <w:rPr>
+                <w:sz w:val="19"/>
+                <w:szCs w:val="19"/>
+              </w:rPr>
+              <w:t xml:space="preserve">Done</w:t>
             </w:r>
           </w:p>
         </w:tc>
@@ -5816,24 +5940,25 @@
               <w:bottom w:val="single" w:color="DCE3E1" w:sz="4"/>
               <w:right w:val="single" w:color="DCE3E1" w:sz="4"/>
             </w:tcBorders>
-            <w:tcMar>
-              <w:top w:type="dxa" w:w="70"/>
-              <w:left w:type="dxa" w:w="110"/>
-              <w:bottom w:type="dxa" w:w="50"/>
-              <w:right w:type="dxa" w:w="110"/>
-            </w:tcMar>
-            <w:vAlign w:val="top"/>
-          </w:tcPr>
-          <w:p>
-            <w:pPr>
-              <w:spacing w:after="40" w:line="252" w:lineRule="auto"/>
-            </w:pPr>
-            <w:r>
-              <w:rPr>
-                <w:sz w:val="19"/>
-                <w:szCs w:val="19"/>
-              </w:rPr>
-              <w:t xml:space="preserve">Planned</w:t>
+            <w:shd w:fill="FBEFD8" w:color="auto" w:val="clear"/>
+            <w:tcMar>
+              <w:top w:type="dxa" w:w="70"/>
+              <w:left w:type="dxa" w:w="110"/>
+              <w:bottom w:type="dxa" w:w="50"/>
+              <w:right w:type="dxa" w:w="110"/>
+            </w:tcMar>
+            <w:vAlign w:val="top"/>
+          </w:tcPr>
+          <w:p>
+            <w:pPr>
+              <w:spacing w:after="40" w:line="252" w:lineRule="auto"/>
+            </w:pPr>
+            <w:r>
+              <w:rPr>
+                <w:sz w:val="19"/>
+                <w:szCs w:val="19"/>
+              </w:rPr>
+              <w:t xml:space="preserve">In progress</w:t>
             </w:r>
           </w:p>
         </w:tc>
@@ -12685,7 +12810,7 @@
     </w:p>
     <w:p>
       <w:r>
-        <w:t xml:space="preserve">Work is delivered in short sprints, and each one ends with the owner trying the new screens and accepting them. These are the parts that are built, tested and accepted as of Sprint 09.</w:t>
+        <w:t xml:space="preserve">Work is delivered in short sprints, and each one ends with the owner trying the new screens and accepting them. These are the parts that are built, tested and accepted as of Sprint 10.</w:t>
       </w:r>
     </w:p>
     <w:p>
@@ -15120,12 +15245,286 @@
         <w:pStyle w:val="Heading2"/>
       </w:pPr>
       <w:r>
-        <w:t xml:space="preserve">9.10   In progress: Sprint 10 — Payments, refunds, cash drawer</w:t>
+        <w:t xml:space="preserve">9.10   Sprint 10 — Payments, refunds, cash drawer</w:t>
       </w:r>
     </w:p>
     <w:p>
       <w:r>
         <w:t xml:space="preserve">Cash, UPI, card and bank payments are recorded against the bill, refunds are controlled, and the cash drawer balances at shift end.</w:t>
+      </w:r>
+    </w:p>
+    <w:p>
+      <w:pPr>
+        <w:pStyle w:val="ListParagraph"/>
+        <w:numPr>
+          <w:ilvl w:val="0"/>
+          <w:numId w:val="2"/>
+        </w:numPr>
+        <w:spacing w:after="60"/>
+      </w:pPr>
+      <w:r>
+        <w:t xml:space="preserve">Cash, UPI, card and bank transfer payments are recorded on the guest's bill, or taken in advance on account</w:t>
+      </w:r>
+    </w:p>
+    <w:p>
+      <w:pPr>
+        <w:pStyle w:val="ListParagraph"/>
+        <w:numPr>
+          <w:ilvl w:val="0"/>
+          <w:numId w:val="2"/>
+        </w:numPr>
+        <w:spacing w:after="60"/>
+      </w:pPr>
+      <w:r>
+        <w:t xml:space="preserve">Refunds need a reason and a manager or accountant, and can never give back more than was paid</w:t>
+      </w:r>
+    </w:p>
+    <w:p>
+      <w:pPr>
+        <w:pStyle w:val="ListParagraph"/>
+        <w:numPr>
+          <w:ilvl w:val="0"/>
+          <w:numId w:val="2"/>
+        </w:numPr>
+        <w:spacing w:after="60"/>
+      </w:pPr>
+      <w:r>
+        <w:t xml:space="preserve">The cash drawer is opened with the cash counted in it and closed against a count; a shortfall needs a reason and a manager's approval</w:t>
+      </w:r>
+    </w:p>
+    <w:p>
+      <w:pPr>
+        <w:pStyle w:val="ListParagraph"/>
+        <w:numPr>
+          <w:ilvl w:val="0"/>
+          <w:numId w:val="2"/>
+        </w:numPr>
+        <w:spacing w:after="60"/>
+      </w:pPr>
+      <w:r>
+        <w:t xml:space="preserve">Card numbers are never stored: anything that looks like one is refused</w:t>
+      </w:r>
+    </w:p>
+    <w:p>
+      <w:pPr>
+        <w:pStyle w:val="ListParagraph"/>
+        <w:numPr>
+          <w:ilvl w:val="0"/>
+          <w:numId w:val="2"/>
+        </w:numPr>
+        <w:spacing w:after="60"/>
+      </w:pPr>
+      <w:r>
+        <w:t xml:space="preserve">Payments, refunds and drawer shifts are never deleted; every change is in the audit trail</w:t>
+      </w:r>
+    </w:p>
+    <w:p>
+      <w:pPr>
+        <w:pStyle w:val="ListParagraph"/>
+        <w:numPr>
+          <w:ilvl w:val="0"/>
+          <w:numId w:val="2"/>
+        </w:numPr>
+        <w:spacing w:after="60"/>
+      </w:pPr>
+      <w:r>
+        <w:t xml:space="preserve">Bill balances, check-out and the calendar now show what has really been paid</w:t>
+      </w:r>
+    </w:p>
+    <w:p>
+      <w:pPr>
+        <w:keepNext/>
+        <w:pBdr>
+          <w:top w:val="single" w:color="DCE3E1" w:sz="4"/>
+          <w:bottom w:val="single" w:color="DCE3E1" w:sz="4"/>
+          <w:left w:val="single" w:color="DCE3E1" w:sz="4"/>
+          <w:right w:val="single" w:color="DCE3E1" w:sz="4"/>
+        </w:pBdr>
+        <w:spacing w:before="120" w:after="0" w:line="240" w:lineRule="auto"/>
+        <w:jc w:val="center"/>
+      </w:pPr>
+      <w:r>
+        <w:drawing>
+          <wp:inline distT="0" distB="0" distL="0" distR="0">
+            <wp:extent cx="5124450" cy="3438525"/>
+            <wp:effectExtent t="0" r="0" b="0" l="0"/>
+            <wp:docPr id="1" name="The cash drawer on the front desk, opened with ₹5,000" descr="The cash drawer on the front desk, opened with ₹5,000" title="The cash drawer on the front desk, opened with ₹5,000"/>
+            <wp:cNvGraphicFramePr>
+              <a:graphicFrameLocks xmlns:a="http://schemas.openxmlformats.org/drawingml/2006/main" noChangeAspect="1"/>
+            </wp:cNvGraphicFramePr>
+            <a:graphic xmlns:a="http://schemas.openxmlformats.org/drawingml/2006/main">
+              <a:graphicData uri="http://schemas.openxmlformats.org/drawingml/2006/picture">
+                <pic:pic xmlns:pic="http://schemas.openxmlformats.org/drawingml/2006/picture">
+                  <pic:nvPicPr>
+                    <pic:cNvPr id="0" name="" descr=""/>
+                    <pic:cNvPicPr>
+                      <a:picLocks noChangeAspect="1" noChangeArrowheads="1"/>
+                    </pic:cNvPicPr>
+                  </pic:nvPicPr>
+                  <pic:blipFill>
+                    <a:blip r:embed="rId38" cstate="none"/>
+                    <a:srcRect/>
+                    <a:stretch>
+                      <a:fillRect/>
+                    </a:stretch>
+                  </pic:blipFill>
+                  <pic:spPr bwMode="auto">
+                    <a:xfrm>
+                      <a:off x="0" y="0"/>
+                      <a:ext cx="5124450" cy="3438525"/>
+                    </a:xfrm>
+                    <a:prstGeom prst="rect">
+                      <a:avLst/>
+                    </a:prstGeom>
+                  </pic:spPr>
+                </pic:pic>
+              </a:graphicData>
+            </a:graphic>
+          </wp:inline>
+        </w:drawing>
+      </w:r>
+    </w:p>
+    <w:p>
+      <w:pPr>
+        <w:pStyle w:val="Caption"/>
+      </w:pPr>
+      <w:r>
+        <w:t xml:space="preserve">The cash drawer on the front desk, opened with ₹5,000</w:t>
+      </w:r>
+    </w:p>
+    <w:p>
+      <w:pPr>
+        <w:keepNext/>
+        <w:pBdr>
+          <w:top w:val="single" w:color="DCE3E1" w:sz="4"/>
+          <w:bottom w:val="single" w:color="DCE3E1" w:sz="4"/>
+          <w:left w:val="single" w:color="DCE3E1" w:sz="4"/>
+          <w:right w:val="single" w:color="DCE3E1" w:sz="4"/>
+        </w:pBdr>
+        <w:spacing w:before="120" w:after="0" w:line="240" w:lineRule="auto"/>
+        <w:jc w:val="center"/>
+      </w:pPr>
+      <w:r>
+        <w:drawing>
+          <wp:inline distT="0" distB="0" distL="0" distR="0">
+            <wp:extent cx="5124450" cy="3438525"/>
+            <wp:effectExtent t="0" r="0" b="0" l="0"/>
+            <wp:docPr id="1" name="A bill paid in cash and UPI: the balance is nil" descr="A bill paid in cash and UPI: the balance is nil" title="A bill paid in cash and UPI: the balance is nil"/>
+            <wp:cNvGraphicFramePr>
+              <a:graphicFrameLocks xmlns:a="http://schemas.openxmlformats.org/drawingml/2006/main" noChangeAspect="1"/>
+            </wp:cNvGraphicFramePr>
+            <a:graphic xmlns:a="http://schemas.openxmlformats.org/drawingml/2006/main">
+              <a:graphicData uri="http://schemas.openxmlformats.org/drawingml/2006/picture">
+                <pic:pic xmlns:pic="http://schemas.openxmlformats.org/drawingml/2006/picture">
+                  <pic:nvPicPr>
+                    <pic:cNvPr id="0" name="" descr=""/>
+                    <pic:cNvPicPr>
+                      <a:picLocks noChangeAspect="1" noChangeArrowheads="1"/>
+                    </pic:cNvPicPr>
+                  </pic:nvPicPr>
+                  <pic:blipFill>
+                    <a:blip r:embed="rId39" cstate="none"/>
+                    <a:srcRect/>
+                    <a:stretch>
+                      <a:fillRect/>
+                    </a:stretch>
+                  </pic:blipFill>
+                  <pic:spPr bwMode="auto">
+                    <a:xfrm>
+                      <a:off x="0" y="0"/>
+                      <a:ext cx="5124450" cy="3438525"/>
+                    </a:xfrm>
+                    <a:prstGeom prst="rect">
+                      <a:avLst/>
+                    </a:prstGeom>
+                  </pic:spPr>
+                </pic:pic>
+              </a:graphicData>
+            </a:graphic>
+          </wp:inline>
+        </w:drawing>
+      </w:r>
+    </w:p>
+    <w:p>
+      <w:pPr>
+        <w:pStyle w:val="Caption"/>
+      </w:pPr>
+      <w:r>
+        <w:t xml:space="preserve">A bill paid in cash and UPI: the balance is nil</w:t>
+      </w:r>
+    </w:p>
+    <w:p>
+      <w:pPr>
+        <w:keepNext/>
+        <w:pBdr>
+          <w:top w:val="single" w:color="DCE3E1" w:sz="4"/>
+          <w:bottom w:val="single" w:color="DCE3E1" w:sz="4"/>
+          <w:left w:val="single" w:color="DCE3E1" w:sz="4"/>
+          <w:right w:val="single" w:color="DCE3E1" w:sz="4"/>
+        </w:pBdr>
+        <w:spacing w:before="120" w:after="0" w:line="240" w:lineRule="auto"/>
+        <w:jc w:val="center"/>
+      </w:pPr>
+      <w:r>
+        <w:drawing>
+          <wp:inline distT="0" distB="0" distL="0" distR="0">
+            <wp:extent cx="5124450" cy="3438525"/>
+            <wp:effectExtent t="0" r="0" b="0" l="0"/>
+            <wp:docPr id="1" name="A card number is refused: card details are never stored" descr="A card number is refused: card details are never stored" title="A card number is refused: card details are never stored"/>
+            <wp:cNvGraphicFramePr>
+              <a:graphicFrameLocks xmlns:a="http://schemas.openxmlformats.org/drawingml/2006/main" noChangeAspect="1"/>
+            </wp:cNvGraphicFramePr>
+            <a:graphic xmlns:a="http://schemas.openxmlformats.org/drawingml/2006/main">
+              <a:graphicData uri="http://schemas.openxmlformats.org/drawingml/2006/picture">
+                <pic:pic xmlns:pic="http://schemas.openxmlformats.org/drawingml/2006/picture">
+                  <pic:nvPicPr>
+                    <pic:cNvPr id="0" name="" descr=""/>
+                    <pic:cNvPicPr>
+                      <a:picLocks noChangeAspect="1" noChangeArrowheads="1"/>
+                    </pic:cNvPicPr>
+                  </pic:nvPicPr>
+                  <pic:blipFill>
+                    <a:blip r:embed="rId40" cstate="none"/>
+                    <a:srcRect/>
+                    <a:stretch>
+                      <a:fillRect/>
+                    </a:stretch>
+                  </pic:blipFill>
+                  <pic:spPr bwMode="auto">
+                    <a:xfrm>
+                      <a:off x="0" y="0"/>
+                      <a:ext cx="5124450" cy="3438525"/>
+                    </a:xfrm>
+                    <a:prstGeom prst="rect">
+                      <a:avLst/>
+                    </a:prstGeom>
+                  </pic:spPr>
+                </pic:pic>
+              </a:graphicData>
+            </a:graphic>
+          </wp:inline>
+        </w:drawing>
+      </w:r>
+    </w:p>
+    <w:p>
+      <w:pPr>
+        <w:pStyle w:val="Caption"/>
+      </w:pPr>
+      <w:r>
+        <w:t xml:space="preserve">A card number is refused: card details are never stored</w:t>
+      </w:r>
+    </w:p>
+    <w:p>
+      <w:pPr>
+        <w:pStyle w:val="Heading2"/>
+      </w:pPr>
+      <w:r>
+        <w:t xml:space="preserve">9.11   In progress: Sprint 11 — Razorpay</w:t>
+      </w:r>
+    </w:p>
+    <w:p>
+      <w:r>
+        <w:t xml:space="preserve">Guests pay online with UPI and cards through Razorpay; payment links can be sent before arrival.</w:t>
       </w:r>
     </w:p>
     <w:p>
@@ -15138,7 +15537,7 @@
           <w:sz w:val="18"/>
           <w:szCs w:val="18"/>
         </w:rPr>
-        <w:t xml:space="preserve">It will be accepted when: [object Object].</w:t>
+        <w:t xml:space="preserve">It will be accepted when: Test-mode payment in Razorpay dashboard confirms the reservation via webhook.</w:t>
       </w:r>
     </w:p>
     <w:p>
@@ -18228,7 +18627,7 @@
               <w:bottom w:val="single" w:color="DCE3E1" w:sz="4"/>
               <w:right w:val="single" w:color="DCE3E1" w:sz="4"/>
             </w:tcBorders>
-            <w:shd w:fill="FBEFD8" w:color="auto" w:val="clear"/>
+            <w:shd w:fill="E3F0E6" w:color="auto" w:val="clear"/>
             <w:tcMar>
               <w:top w:type="dxa" w:w="70"/>
               <w:left w:type="dxa" w:w="110"/>
@@ -18246,7 +18645,7 @@
                 <w:sz w:val="17"/>
                 <w:szCs w:val="17"/>
               </w:rPr>
-              <w:t xml:space="preserve">In progress</w:t>
+              <w:t xml:space="preserve">Done</w:t>
             </w:r>
           </w:p>
         </w:tc>
@@ -18354,6 +18753,7 @@
               <w:bottom w:val="single" w:color="DCE3E1" w:sz="4"/>
               <w:right w:val="single" w:color="DCE3E1" w:sz="4"/>
             </w:tcBorders>
+            <w:shd w:fill="FBEFD8" w:color="auto" w:val="clear"/>
             <w:tcMar>
               <w:top w:type="dxa" w:w="70"/>
               <w:left w:type="dxa" w:w="110"/>
@@ -18371,7 +18771,7 @@
                 <w:sz w:val="17"/>
                 <w:szCs w:val="17"/>
               </w:rPr>
-              <w:t xml:space="preserve">Planned</w:t>
+              <w:t xml:space="preserve">In progress</w:t>
             </w:r>
           </w:p>
         </w:tc>
@@ -20674,7 +21074,7 @@
                     </pic:cNvPicPr>
                   </pic:nvPicPr>
                   <pic:blipFill>
-                    <a:blip r:embed="rId38" cstate="none"/>
+                    <a:blip r:embed="rId41" cstate="none"/>
                     <a:srcRect/>
                     <a:stretch>
                       <a:fillRect/>
@@ -20781,7 +21181,7 @@
         <w:t xml:space="preserve">Tests that grow with the system.</w:t>
       </w:r>
       <w:r>
-        <w:t xml:space="preserve"> As of Sprint 09: 198 server test methods, 67 screen tests and 83 end-to-end browser steps, all passing.</w:t>
+        <w:t xml:space="preserve"> As of Sprint 10: 216 server test methods, 72 screen tests and 90 end-to-end browser steps, all passing.</w:t>
       </w:r>
     </w:p>
     <w:p>
@@ -22668,7 +23068,7 @@
         <w:sz w:val="16"/>
         <w:szCs w:val="16"/>
       </w:rPr>
-      <w:t xml:space="preserve">Version 1.9 · 20 October 2026</w:t>
+      <w:t xml:space="preserve">Version 1.10 · 20 October 2026</w:t>
     </w:r>
     <w:r>
       <w:rPr>

</xml_diff>

<commit_message>
chore(sprints): accept Sprint 11
The owner accepted Sprint 11 (Razorpay) on 23 Oct 2026. Sprint 11 is marked done
in sprints.yml and Sprint 12 (GST invoices, credit/debit notes, receipts) is the
current sprint. Sprint guides and catalogues regenerated, README, CHANGELOG,
RUN_AND_TEST and the new-joiner guide updated, handbooks 1.11 rebuilt.

Co-Authored-By: Claude Opus 5.5 (1M context) <noreply@anthropic.com>
Claude-Session: https://claude.ai/code/session_01Hm55gq2sF48KVt76q1UTaQ
</commit_message>
<xml_diff>
--- a/docs/handbooks/Resort-OS-Product-Overview.docx
+++ b/docs/handbooks/Resort-OS-Product-Overview.docx
@@ -182,7 +182,7 @@
                 <w:sz w:val="19"/>
                 <w:szCs w:val="19"/>
               </w:rPr>
-              <w:t xml:space="preserve">Version 1.10</w:t>
+              <w:t xml:space="preserve">Version 1.11</w:t>
             </w:r>
           </w:p>
         </w:tc>
@@ -252,7 +252,7 @@
                 <w:sz w:val="19"/>
                 <w:szCs w:val="19"/>
               </w:rPr>
-              <w:t xml:space="preserve">20 October 2026</w:t>
+              <w:t xml:space="preserve">23 October 2026</w:t>
             </w:r>
           </w:p>
         </w:tc>
@@ -322,7 +322,7 @@
                 <w:sz w:val="19"/>
                 <w:szCs w:val="19"/>
               </w:rPr>
-              <w:t xml:space="preserve">Sprints 01, 02, 03, 04, 05, 06, 07, 08, 09, 10 accepted · Sprint 11 Razorpay in progress</w:t>
+              <w:t xml:space="preserve">Sprints 01, 02, 03, 04, 05, 06, 07, 08, 09, 10, 11 accepted · Sprint 12 GST invoices, credit/debit notes, receipts in progress</w:t>
             </w:r>
           </w:p>
         </w:tc>
@@ -661,7 +661,7 @@
                 <w:sz w:val="19"/>
                 <w:szCs w:val="19"/>
               </w:rPr>
-              <w:t xml:space="preserve">1.10</w:t>
+              <w:t xml:space="preserve">1.11</w:t>
             </w:r>
           </w:p>
         </w:tc>
@@ -691,7 +691,7 @@
                 <w:sz w:val="19"/>
                 <w:szCs w:val="19"/>
               </w:rPr>
-              <w:t xml:space="preserve">2026-10-20</w:t>
+              <w:t xml:space="preserve">2026-10-23</w:t>
             </w:r>
           </w:p>
         </w:tc>
@@ -721,7 +721,7 @@
                 <w:sz w:val="19"/>
                 <w:szCs w:val="19"/>
               </w:rPr>
-              <w:t xml:space="preserve">Sprint 10 (Payments, refunds, cash drawer) accepted: cash, UPI, card and bank payments on the bill or on account, refunds with a reason that can never exceed the payment, voids, the cash drawer opened and closed against a count with manager approval of a shortfall, no card data stored, real balances at check-out. Payment flow diagram. Sprint 11 (Razorpay) started.</w:t>
+              <w:t xml:space="preserve">Sprint 11 (Razorpay) accepted: payment links sent from a booking, the guest pays on their phone with UPI or a card through Razorpay with no sign-in, only Razorpay's signed webhook records the payment (once, whatever the order) and confirms a pending booking, declined tries shown with the reason, online refunds back through Razorpay, a built-in test Razorpay when no keys are set. Razorpay flow diagram. Sprint 12 started.</w:t>
             </w:r>
           </w:p>
         </w:tc>
@@ -757,7 +757,7 @@
                 <w:sz w:val="19"/>
                 <w:szCs w:val="19"/>
               </w:rPr>
-              <w:t xml:space="preserve">1.9</w:t>
+              <w:t xml:space="preserve">1.10</w:t>
             </w:r>
           </w:p>
         </w:tc>
@@ -819,7 +819,7 @@
                 <w:sz w:val="19"/>
                 <w:szCs w:val="19"/>
               </w:rPr>
-              <w:t xml:space="preserve">Sprint 09 (GST configuration and tax engine) accepted: GST worked out on every charge (CGST + SGST or IGST), rates kept as rules with dates that an accountant changes from next month without a software update, room GST by the price per room per night, posted charges keep their GST. Tax flow diagram. Sprint 10 (Payments, refunds, cash drawer) started.</w:t>
+              <w:t xml:space="preserve">Sprint 10 (Payments, refunds, cash drawer) accepted: cash, UPI, card and bank payments on the bill or on account, refunds with a reason that can never exceed the payment, voids, the cash drawer opened and closed against a count with manager approval of a shortfall, no card data stored, real balances at check-out. Payment flow diagram. Sprint 11 (Razorpay) started.</w:t>
             </w:r>
           </w:p>
         </w:tc>
@@ -854,7 +854,7 @@
                 <w:sz w:val="19"/>
                 <w:szCs w:val="19"/>
               </w:rPr>
-              <w:t xml:space="preserve">1.8</w:t>
+              <w:t xml:space="preserve">1.9</w:t>
             </w:r>
           </w:p>
         </w:tc>
@@ -884,7 +884,7 @@
                 <w:sz w:val="19"/>
                 <w:szCs w:val="19"/>
               </w:rPr>
-              <w:t xml:space="preserve">2026-10-18</w:t>
+              <w:t xml:space="preserve">2026-10-20</w:t>
             </w:r>
           </w:p>
         </w:tc>
@@ -914,7 +914,7 @@
                 <w:sz w:val="19"/>
                 <w:szCs w:val="19"/>
               </w:rPr>
-              <w:t xml:space="preserve">Sprint 08 (Folio) accepted: a running bill for every stay with room nights, meals, transport, activities and packages; nothing can be edited or deleted, a manager reverses a line with a reason; bills can be split; the front desk shows the real balance. Folio flow diagram. Sprint 09 (GST configuration and tax engine) started.</w:t>
+              <w:t xml:space="preserve">Sprint 09 (GST configuration and tax engine) accepted: GST worked out on every charge (CGST + SGST or IGST), rates kept as rules with dates that an accountant changes from next month without a software update, room GST by the price per room per night, posted charges keep their GST. Tax flow diagram. Sprint 10 (Payments, refunds, cash drawer) started.</w:t>
             </w:r>
           </w:p>
         </w:tc>
@@ -950,7 +950,7 @@
                 <w:sz w:val="19"/>
                 <w:szCs w:val="19"/>
               </w:rPr>
-              <w:t xml:space="preserve">1.7</w:t>
+              <w:t xml:space="preserve">1.8</w:t>
             </w:r>
           </w:p>
         </w:tc>
@@ -1012,7 +1012,7 @@
                 <w:sz w:val="19"/>
                 <w:szCs w:val="19"/>
               </w:rPr>
-              <w:t xml:space="preserve">Sprint 07 (Front desk) accepted: arrivals, departures and in-house lists, check-in and check-out in a few clicks, walk-ins on one screen, early departures with a reason, rooms marked dirty and ready. Check-in flow diagram. Sprint 08 (Folio) started.</w:t>
+              <w:t xml:space="preserve">Sprint 08 (Folio) accepted: a running bill for every stay with room nights, meals, transport, activities and packages; nothing can be edited or deleted, a manager reverses a line with a reason; bills can be split; the front desk shows the real balance. Folio flow diagram. Sprint 09 (GST configuration and tax engine) started.</w:t>
             </w:r>
           </w:p>
         </w:tc>
@@ -1047,7 +1047,7 @@
                 <w:sz w:val="19"/>
                 <w:szCs w:val="19"/>
               </w:rPr>
-              <w:t xml:space="preserve">1.6</w:t>
+              <w:t xml:space="preserve">1.7</w:t>
             </w:r>
           </w:p>
         </w:tc>
@@ -1077,7 +1077,7 @@
                 <w:sz w:val="19"/>
                 <w:szCs w:val="19"/>
               </w:rPr>
-              <w:t xml:space="preserve">2026-10-17</w:t>
+              <w:t xml:space="preserve">2026-10-18</w:t>
             </w:r>
           </w:p>
         </w:tc>
@@ -1107,7 +1107,7 @@
                 <w:sz w:val="19"/>
                 <w:szCs w:val="19"/>
               </w:rPr>
-              <w:t xml:space="preserve">Sprint 06 (Reservation calendar) accepted: day, week and month calendar of rooms and dorm beds, moving a guest by drag-and-drop with a reason, list by day on phones. Room-move flow diagram. Sprint 07 (Front desk) started.</w:t>
+              <w:t xml:space="preserve">Sprint 07 (Front desk) accepted: arrivals, departures and in-house lists, check-in and check-out in a few clicks, walk-ins on one screen, early departures with a reason, rooms marked dirty and ready. Check-in flow diagram. Sprint 08 (Folio) started.</w:t>
             </w:r>
           </w:p>
         </w:tc>
@@ -1143,7 +1143,7 @@
                 <w:sz w:val="19"/>
                 <w:szCs w:val="19"/>
               </w:rPr>
-              <w:t xml:space="preserve">1.5</w:t>
+              <w:t xml:space="preserve">1.6</w:t>
             </w:r>
           </w:p>
         </w:tc>
@@ -1174,7 +1174,7 @@
                 <w:sz w:val="19"/>
                 <w:szCs w:val="19"/>
               </w:rPr>
-              <w:t xml:space="preserve">2026-10-15</w:t>
+              <w:t xml:space="preserve">2026-10-17</w:t>
             </w:r>
           </w:p>
         </w:tc>
@@ -1205,7 +1205,7 @@
                 <w:sz w:val="19"/>
                 <w:szCs w:val="19"/>
               </w:rPr>
-              <w:t xml:space="preserve">Sprint 05 (Availability engine and reservations) accepted: race-free booking, booking wizard, booking history, date pickers. Diagrams of the reservation tables and the booking flow. Sprint 06 (Reservation calendar) started.</w:t>
+              <w:t xml:space="preserve">Sprint 06 (Reservation calendar) accepted: day, week and month calendar of rooms and dorm beds, moving a guest by drag-and-drop with a reason, list by day on phones. Room-move flow diagram. Sprint 07 (Front desk) started.</w:t>
             </w:r>
           </w:p>
         </w:tc>
@@ -1240,7 +1240,7 @@
                 <w:sz w:val="19"/>
                 <w:szCs w:val="19"/>
               </w:rPr>
-              <w:t xml:space="preserve">1.4</w:t>
+              <w:t xml:space="preserve">1.5</w:t>
             </w:r>
           </w:p>
         </w:tc>
@@ -1270,7 +1270,7 @@
                 <w:sz w:val="19"/>
                 <w:szCs w:val="19"/>
               </w:rPr>
-              <w:t xml:space="preserve">2026-10-14</w:t>
+              <w:t xml:space="preserve">2026-10-15</w:t>
             </w:r>
           </w:p>
         </w:tc>
@@ -1300,7 +1300,7 @@
                 <w:sz w:val="19"/>
                 <w:szCs w:val="19"/>
               </w:rPr>
-              <w:t xml:space="preserve">Sprint 04 (Rate plans and packages) accepted: nightly price grid, quotes, packages with revenue split. Sprint 05 (Availability engine and reservations) started.</w:t>
+              <w:t xml:space="preserve">Sprint 05 (Availability engine and reservations) accepted: race-free booking, booking wizard, booking history, date pickers. Diagrams of the reservation tables and the booking flow. Sprint 06 (Reservation calendar) started.</w:t>
             </w:r>
           </w:p>
         </w:tc>
@@ -1336,7 +1336,7 @@
                 <w:sz w:val="19"/>
                 <w:szCs w:val="19"/>
               </w:rPr>
-              <w:t xml:space="preserve">1.3</w:t>
+              <w:t xml:space="preserve">1.4</w:t>
             </w:r>
           </w:p>
         </w:tc>
@@ -1367,7 +1367,7 @@
                 <w:sz w:val="19"/>
                 <w:szCs w:val="19"/>
               </w:rPr>
-              <w:t xml:space="preserve">2026-10-11</w:t>
+              <w:t xml:space="preserve">2026-10-14</w:t>
             </w:r>
           </w:p>
         </w:tc>
@@ -1398,7 +1398,7 @@
                 <w:sz w:val="19"/>
                 <w:szCs w:val="19"/>
               </w:rPr>
-              <w:t xml:space="preserve">Sprint 03 (Guests) accepted, with review fixes: Aadhaar number check and error messages that say why. Sprint 04 (Rate plans and packages) started.</w:t>
+              <w:t xml:space="preserve">Sprint 04 (Rate plans and packages) accepted: nightly price grid, quotes, packages with revenue split. Sprint 05 (Availability engine and reservations) started.</w:t>
             </w:r>
           </w:p>
         </w:tc>
@@ -1433,7 +1433,7 @@
                 <w:sz w:val="19"/>
                 <w:szCs w:val="19"/>
               </w:rPr>
-              <w:t xml:space="preserve">1.2.1</w:t>
+              <w:t xml:space="preserve">1.3</w:t>
             </w:r>
           </w:p>
         </w:tc>
@@ -1463,7 +1463,7 @@
                 <w:sz w:val="19"/>
                 <w:szCs w:val="19"/>
               </w:rPr>
-              <w:t xml:space="preserve">2026-10-10</w:t>
+              <w:t xml:space="preserve">2026-10-11</w:t>
             </w:r>
           </w:p>
         </w:tc>
@@ -1493,7 +1493,7 @@
                 <w:sz w:val="19"/>
                 <w:szCs w:val="19"/>
               </w:rPr>
-              <w:t xml:space="preserve">Sprint 03 (Guests) built and in review: guest profiles, encrypted ID documents, duplicates, merge, anonymise, consent.</w:t>
+              <w:t xml:space="preserve">Sprint 03 (Guests) accepted, with review fixes: Aadhaar number check and error messages that say why. Sprint 04 (Rate plans and packages) started.</w:t>
             </w:r>
           </w:p>
         </w:tc>
@@ -1529,6 +1529,103 @@
                 <w:sz w:val="19"/>
                 <w:szCs w:val="19"/>
               </w:rPr>
+              <w:t xml:space="preserve">1.2.1</w:t>
+            </w:r>
+          </w:p>
+        </w:tc>
+        <w:tc>
+          <w:tcPr>
+            <w:tcW w:type="dxa" w:w="1500"/>
+            <w:tcBorders>
+              <w:top w:val="single" w:color="DCE3E1" w:sz="4"/>
+              <w:left w:val="single" w:color="DCE3E1" w:sz="4"/>
+              <w:bottom w:val="single" w:color="DCE3E1" w:sz="4"/>
+              <w:right w:val="single" w:color="DCE3E1" w:sz="4"/>
+            </w:tcBorders>
+            <w:shd w:fill="F5F7F6" w:color="auto" w:val="clear"/>
+            <w:tcMar>
+              <w:top w:type="dxa" w:w="70"/>
+              <w:left w:type="dxa" w:w="110"/>
+              <w:bottom w:type="dxa" w:w="50"/>
+              <w:right w:type="dxa" w:w="110"/>
+            </w:tcMar>
+            <w:vAlign w:val="top"/>
+          </w:tcPr>
+          <w:p>
+            <w:pPr>
+              <w:spacing w:after="40" w:line="252" w:lineRule="auto"/>
+            </w:pPr>
+            <w:r>
+              <w:rPr>
+                <w:sz w:val="19"/>
+                <w:szCs w:val="19"/>
+              </w:rPr>
+              <w:t xml:space="preserve">2026-10-10</w:t>
+            </w:r>
+          </w:p>
+        </w:tc>
+        <w:tc>
+          <w:tcPr>
+            <w:tcW w:type="dxa" w:w="6714"/>
+            <w:tcBorders>
+              <w:top w:val="single" w:color="DCE3E1" w:sz="4"/>
+              <w:left w:val="single" w:color="DCE3E1" w:sz="4"/>
+              <w:bottom w:val="single" w:color="DCE3E1" w:sz="4"/>
+              <w:right w:val="single" w:color="DCE3E1" w:sz="4"/>
+            </w:tcBorders>
+            <w:shd w:fill="F5F7F6" w:color="auto" w:val="clear"/>
+            <w:tcMar>
+              <w:top w:type="dxa" w:w="70"/>
+              <w:left w:type="dxa" w:w="110"/>
+              <w:bottom w:type="dxa" w:w="50"/>
+              <w:right w:type="dxa" w:w="110"/>
+            </w:tcMar>
+            <w:vAlign w:val="top"/>
+          </w:tcPr>
+          <w:p>
+            <w:pPr>
+              <w:spacing w:after="40" w:line="252" w:lineRule="auto"/>
+            </w:pPr>
+            <w:r>
+              <w:rPr>
+                <w:sz w:val="19"/>
+                <w:szCs w:val="19"/>
+              </w:rPr>
+              <w:t xml:space="preserve">Sprint 03 (Guests) built and in review: guest profiles, encrypted ID documents, duplicates, merge, anonymise, consent.</w:t>
+            </w:r>
+          </w:p>
+        </w:tc>
+      </w:tr>
+      <w:tr>
+        <w:trPr>
+          <w:cantSplit/>
+        </w:trPr>
+        <w:tc>
+          <w:tcPr>
+            <w:tcW w:type="dxa" w:w="1100"/>
+            <w:tcBorders>
+              <w:top w:val="single" w:color="DCE3E1" w:sz="4"/>
+              <w:left w:val="single" w:color="DCE3E1" w:sz="4"/>
+              <w:bottom w:val="single" w:color="DCE3E1" w:sz="4"/>
+              <w:right w:val="single" w:color="DCE3E1" w:sz="4"/>
+            </w:tcBorders>
+            <w:tcMar>
+              <w:top w:type="dxa" w:w="70"/>
+              <w:left w:type="dxa" w:w="110"/>
+              <w:bottom w:type="dxa" w:w="50"/>
+              <w:right w:type="dxa" w:w="110"/>
+            </w:tcMar>
+            <w:vAlign w:val="top"/>
+          </w:tcPr>
+          <w:p>
+            <w:pPr>
+              <w:spacing w:after="40" w:line="252" w:lineRule="auto"/>
+            </w:pPr>
+            <w:r>
+              <w:rPr>
+                <w:sz w:val="19"/>
+                <w:szCs w:val="19"/>
+              </w:rPr>
               <w:t xml:space="preserve">1.2</w:t>
             </w:r>
           </w:p>
@@ -1542,7 +1639,6 @@
               <w:bottom w:val="single" w:color="DCE3E1" w:sz="4"/>
               <w:right w:val="single" w:color="DCE3E1" w:sz="4"/>
             </w:tcBorders>
-            <w:shd w:fill="F5F7F6" w:color="auto" w:val="clear"/>
             <w:tcMar>
               <w:top w:type="dxa" w:w="70"/>
               <w:left w:type="dxa" w:w="110"/>
@@ -1573,7 +1669,6 @@
               <w:bottom w:val="single" w:color="DCE3E1" w:sz="4"/>
               <w:right w:val="single" w:color="DCE3E1" w:sz="4"/>
             </w:tcBorders>
-            <w:shd w:fill="F5F7F6" w:color="auto" w:val="clear"/>
             <w:tcMar>
               <w:top w:type="dxa" w:w="70"/>
               <w:left w:type="dxa" w:w="110"/>
@@ -1824,7 +1919,7 @@
                 <w:sz w:val="19"/>
                 <w:szCs w:val="19"/>
               </w:rPr>
-              <w:t xml:space="preserve">Living document, rebuilt at the end of every sprint. This edition reflects Sprint 10 accepted and Sprint 11 in progress.</w:t>
+              <w:t xml:space="preserve">Living document, rebuilt at the end of every sprint. This edition reflects Sprint 11 accepted and Sprint 12 in progress.</w:t>
             </w:r>
           </w:p>
         </w:tc>
@@ -2756,7 +2851,33 @@
           <w:sz w:val="19"/>
           <w:szCs w:val="19"/>
         </w:rPr>
-        <w:t xml:space="preserve">In progress: Sprint 11 — Razorpay</w:t>
+        <w:t xml:space="preserve">Sprint 11 — Razorpay</w:t>
+      </w:r>
+    </w:p>
+    <w:p>
+      <w:pPr>
+        <w:spacing w:after="30" w:before="0"/>
+        <w:ind w:left="420"/>
+      </w:pPr>
+      <w:r>
+        <w:rPr>
+          <w:b w:val="false"/>
+          <w:bCs w:val="false"/>
+          <w:color w:val="8A2449"/>
+          <w:sz w:val="19"/>
+          <w:szCs w:val="19"/>
+        </w:rPr>
+        <w:t xml:space="preserve">9.12  </w:t>
+      </w:r>
+      <w:r>
+        <w:rPr>
+          <w:b w:val="false"/>
+          <w:bCs w:val="false"/>
+          <w:color w:val="1B2A2E"/>
+          <w:sz w:val="19"/>
+          <w:szCs w:val="19"/>
+        </w:rPr>
+        <w:t xml:space="preserve">In progress: Sprint 12 — GST invoices, credit/debit notes, receipts</w:t>
       </w:r>
     </w:p>
     <w:p>
@@ -3079,7 +3200,7 @@
                 <w:sz w:val="40"/>
                 <w:szCs w:val="40"/>
               </w:rPr>
-              <w:t xml:space="preserve">10 of 29</w:t>
+              <w:t xml:space="preserve">11 of 29</w:t>
             </w:r>
           </w:p>
           <w:p>
@@ -3444,7 +3565,7 @@
                 <w:sz w:val="19"/>
                 <w:szCs w:val="19"/>
               </w:rPr>
-              <w:t xml:space="preserve">Sprints 01 and 02 and 03 and 04 and 05 and 06 and 07 and 08 and 09 and 10 are delivered and accepted. Sprint 11 (Razorpay) is in progress.</w:t>
+              <w:t xml:space="preserve">Sprints 01 and 02 and 03 and 04 and 05 and 06 and 07 and 08 and 09 and 10 and 11 are delivered and accepted. Sprint 12 (GST invoices, credit/debit notes, receipts) is in progress.</w:t>
             </w:r>
           </w:p>
         </w:tc>
@@ -5940,25 +6061,25 @@
               <w:bottom w:val="single" w:color="DCE3E1" w:sz="4"/>
               <w:right w:val="single" w:color="DCE3E1" w:sz="4"/>
             </w:tcBorders>
-            <w:shd w:fill="FBEFD8" w:color="auto" w:val="clear"/>
-            <w:tcMar>
-              <w:top w:type="dxa" w:w="70"/>
-              <w:left w:type="dxa" w:w="110"/>
-              <w:bottom w:type="dxa" w:w="50"/>
-              <w:right w:type="dxa" w:w="110"/>
-            </w:tcMar>
-            <w:vAlign w:val="top"/>
-          </w:tcPr>
-          <w:p>
-            <w:pPr>
-              <w:spacing w:after="40" w:line="252" w:lineRule="auto"/>
-            </w:pPr>
-            <w:r>
-              <w:rPr>
-                <w:sz w:val="19"/>
-                <w:szCs w:val="19"/>
-              </w:rPr>
-              <w:t xml:space="preserve">In progress</w:t>
+            <w:shd w:fill="E3F0E6" w:color="auto" w:val="clear"/>
+            <w:tcMar>
+              <w:top w:type="dxa" w:w="70"/>
+              <w:left w:type="dxa" w:w="110"/>
+              <w:bottom w:type="dxa" w:w="50"/>
+              <w:right w:type="dxa" w:w="110"/>
+            </w:tcMar>
+            <w:vAlign w:val="top"/>
+          </w:tcPr>
+          <w:p>
+            <w:pPr>
+              <w:spacing w:after="40" w:line="252" w:lineRule="auto"/>
+            </w:pPr>
+            <w:r>
+              <w:rPr>
+                <w:sz w:val="19"/>
+                <w:szCs w:val="19"/>
+              </w:rPr>
+              <w:t xml:space="preserve">Done</w:t>
             </w:r>
           </w:p>
         </w:tc>
@@ -6036,24 +6157,25 @@
               <w:bottom w:val="single" w:color="DCE3E1" w:sz="4"/>
               <w:right w:val="single" w:color="DCE3E1" w:sz="4"/>
             </w:tcBorders>
-            <w:tcMar>
-              <w:top w:type="dxa" w:w="70"/>
-              <w:left w:type="dxa" w:w="110"/>
-              <w:bottom w:type="dxa" w:w="50"/>
-              <w:right w:type="dxa" w:w="110"/>
-            </w:tcMar>
-            <w:vAlign w:val="top"/>
-          </w:tcPr>
-          <w:p>
-            <w:pPr>
-              <w:spacing w:after="40" w:line="252" w:lineRule="auto"/>
-            </w:pPr>
-            <w:r>
-              <w:rPr>
-                <w:sz w:val="19"/>
-                <w:szCs w:val="19"/>
-              </w:rPr>
-              <w:t xml:space="preserve">Planned</w:t>
+            <w:shd w:fill="FBEFD8" w:color="auto" w:val="clear"/>
+            <w:tcMar>
+              <w:top w:type="dxa" w:w="70"/>
+              <w:left w:type="dxa" w:w="110"/>
+              <w:bottom w:type="dxa" w:w="50"/>
+              <w:right w:type="dxa" w:w="110"/>
+            </w:tcMar>
+            <w:vAlign w:val="top"/>
+          </w:tcPr>
+          <w:p>
+            <w:pPr>
+              <w:spacing w:after="40" w:line="252" w:lineRule="auto"/>
+            </w:pPr>
+            <w:r>
+              <w:rPr>
+                <w:sz w:val="19"/>
+                <w:szCs w:val="19"/>
+              </w:rPr>
+              <w:t xml:space="preserve">In progress</w:t>
             </w:r>
           </w:p>
         </w:tc>
@@ -12810,7 +12932,7 @@
     </w:p>
     <w:p>
       <w:r>
-        <w:t xml:space="preserve">Work is delivered in short sprints, and each one ends with the owner trying the new screens and accepting them. These are the parts that are built, tested and accepted as of Sprint 10.</w:t>
+        <w:t xml:space="preserve">Work is delivered in short sprints, and each one ends with the owner trying the new screens and accepting them. These are the parts that are built, tested and accepted as of Sprint 11.</w:t>
       </w:r>
     </w:p>
     <w:p>
@@ -15519,12 +15641,286 @@
         <w:pStyle w:val="Heading2"/>
       </w:pPr>
       <w:r>
-        <w:t xml:space="preserve">9.11   In progress: Sprint 11 — Razorpay</w:t>
+        <w:t xml:space="preserve">9.11   Sprint 11 — Razorpay</w:t>
       </w:r>
     </w:p>
     <w:p>
       <w:r>
         <w:t xml:space="preserve">Guests pay online with UPI and cards through Razorpay; payment links can be sent before arrival.</w:t>
+      </w:r>
+    </w:p>
+    <w:p>
+      <w:pPr>
+        <w:pStyle w:val="ListParagraph"/>
+        <w:numPr>
+          <w:ilvl w:val="0"/>
+          <w:numId w:val="2"/>
+        </w:numPr>
+        <w:spacing w:after="60"/>
+      </w:pPr>
+      <w:r>
+        <w:t xml:space="preserve">Staff send a payment link from a booking; the guest pays on their phone with UPI or a card through Razorpay, with no sign-in</w:t>
+      </w:r>
+    </w:p>
+    <w:p>
+      <w:pPr>
+        <w:pStyle w:val="ListParagraph"/>
+        <w:numPr>
+          <w:ilvl w:val="0"/>
+          <w:numId w:val="2"/>
+        </w:numPr>
+        <w:spacing w:after="60"/>
+      </w:pPr>
+      <w:r>
+        <w:t xml:space="preserve">Only Razorpay's signed notification records a payment; it goes on the bill and confirms a pending booking by itself</w:t>
+      </w:r>
+    </w:p>
+    <w:p>
+      <w:pPr>
+        <w:pStyle w:val="ListParagraph"/>
+        <w:numPr>
+          <w:ilvl w:val="0"/>
+          <w:numId w:val="2"/>
+        </w:numPr>
+        <w:spacing w:after="60"/>
+      </w:pPr>
+      <w:r>
+        <w:t xml:space="preserve">A notification sent twice, or out of order, is recorded once; every one is kept with what it did</w:t>
+      </w:r>
+    </w:p>
+    <w:p>
+      <w:pPr>
+        <w:pStyle w:val="ListParagraph"/>
+        <w:numPr>
+          <w:ilvl w:val="0"/>
+          <w:numId w:val="2"/>
+        </w:numPr>
+        <w:spacing w:after="60"/>
+      </w:pPr>
+      <w:r>
+        <w:t xml:space="preserve">A declined try is shown with the bank's reason and the link stays open; links can be cancelled with a reason</w:t>
+      </w:r>
+    </w:p>
+    <w:p>
+      <w:pPr>
+        <w:pStyle w:val="ListParagraph"/>
+        <w:numPr>
+          <w:ilvl w:val="0"/>
+          <w:numId w:val="2"/>
+        </w:numPr>
+        <w:spacing w:after="60"/>
+      </w:pPr>
+      <w:r>
+        <w:t xml:space="preserve">Online payments are refunded back through Razorpay; card details never reach Resort OS</w:t>
+      </w:r>
+    </w:p>
+    <w:p>
+      <w:pPr>
+        <w:pStyle w:val="ListParagraph"/>
+        <w:numPr>
+          <w:ilvl w:val="0"/>
+          <w:numId w:val="2"/>
+        </w:numPr>
+        <w:spacing w:after="60"/>
+      </w:pPr>
+      <w:r>
+        <w:t xml:space="preserve">Without Razorpay keys the app uses a built-in test Razorpay, so everything can be tried before the account is set up</w:t>
+      </w:r>
+    </w:p>
+    <w:p>
+      <w:pPr>
+        <w:keepNext/>
+        <w:pBdr>
+          <w:top w:val="single" w:color="DCE3E1" w:sz="4"/>
+          <w:bottom w:val="single" w:color="DCE3E1" w:sz="4"/>
+          <w:left w:val="single" w:color="DCE3E1" w:sz="4"/>
+          <w:right w:val="single" w:color="DCE3E1" w:sz="4"/>
+        </w:pBdr>
+        <w:spacing w:before="120" w:after="0" w:line="240" w:lineRule="auto"/>
+        <w:jc w:val="center"/>
+      </w:pPr>
+      <w:r>
+        <w:drawing>
+          <wp:inline distT="0" distB="0" distL="0" distR="0">
+            <wp:extent cx="5124450" cy="3438525"/>
+            <wp:effectExtent t="0" r="0" b="0" l="0"/>
+            <wp:docPr id="1" name="Sending a payment link for an advance" descr="Sending a payment link for an advance" title="Sending a payment link for an advance"/>
+            <wp:cNvGraphicFramePr>
+              <a:graphicFrameLocks xmlns:a="http://schemas.openxmlformats.org/drawingml/2006/main" noChangeAspect="1"/>
+            </wp:cNvGraphicFramePr>
+            <a:graphic xmlns:a="http://schemas.openxmlformats.org/drawingml/2006/main">
+              <a:graphicData uri="http://schemas.openxmlformats.org/drawingml/2006/picture">
+                <pic:pic xmlns:pic="http://schemas.openxmlformats.org/drawingml/2006/picture">
+                  <pic:nvPicPr>
+                    <pic:cNvPr id="0" name="" descr=""/>
+                    <pic:cNvPicPr>
+                      <a:picLocks noChangeAspect="1" noChangeArrowheads="1"/>
+                    </pic:cNvPicPr>
+                  </pic:nvPicPr>
+                  <pic:blipFill>
+                    <a:blip r:embed="rId41" cstate="none"/>
+                    <a:srcRect/>
+                    <a:stretch>
+                      <a:fillRect/>
+                    </a:stretch>
+                  </pic:blipFill>
+                  <pic:spPr bwMode="auto">
+                    <a:xfrm>
+                      <a:off x="0" y="0"/>
+                      <a:ext cx="5124450" cy="3438525"/>
+                    </a:xfrm>
+                    <a:prstGeom prst="rect">
+                      <a:avLst/>
+                    </a:prstGeom>
+                  </pic:spPr>
+                </pic:pic>
+              </a:graphicData>
+            </a:graphic>
+          </wp:inline>
+        </w:drawing>
+      </w:r>
+    </w:p>
+    <w:p>
+      <w:pPr>
+        <w:pStyle w:val="Caption"/>
+      </w:pPr>
+      <w:r>
+        <w:t xml:space="preserve">Sending a payment link for an advance</w:t>
+      </w:r>
+    </w:p>
+    <w:p>
+      <w:pPr>
+        <w:keepNext/>
+        <w:pBdr>
+          <w:top w:val="single" w:color="DCE3E1" w:sz="4"/>
+          <w:bottom w:val="single" w:color="DCE3E1" w:sz="4"/>
+          <w:left w:val="single" w:color="DCE3E1" w:sz="4"/>
+          <w:right w:val="single" w:color="DCE3E1" w:sz="4"/>
+        </w:pBdr>
+        <w:spacing w:before="120" w:after="0" w:line="240" w:lineRule="auto"/>
+        <w:jc w:val="center"/>
+      </w:pPr>
+      <w:r>
+        <w:drawing>
+          <wp:inline distT="0" distB="0" distL="0" distR="0">
+            <wp:extent cx="5124450" cy="11087100"/>
+            <wp:effectExtent t="0" r="0" b="0" l="0"/>
+            <wp:docPr id="1" name="The guest's page on a phone, no sign-in" descr="The guest's page on a phone, no sign-in" title="The guest's page on a phone, no sign-in"/>
+            <wp:cNvGraphicFramePr>
+              <a:graphicFrameLocks xmlns:a="http://schemas.openxmlformats.org/drawingml/2006/main" noChangeAspect="1"/>
+            </wp:cNvGraphicFramePr>
+            <a:graphic xmlns:a="http://schemas.openxmlformats.org/drawingml/2006/main">
+              <a:graphicData uri="http://schemas.openxmlformats.org/drawingml/2006/picture">
+                <pic:pic xmlns:pic="http://schemas.openxmlformats.org/drawingml/2006/picture">
+                  <pic:nvPicPr>
+                    <pic:cNvPr id="0" name="" descr=""/>
+                    <pic:cNvPicPr>
+                      <a:picLocks noChangeAspect="1" noChangeArrowheads="1"/>
+                    </pic:cNvPicPr>
+                  </pic:nvPicPr>
+                  <pic:blipFill>
+                    <a:blip r:embed="rId42" cstate="none"/>
+                    <a:srcRect/>
+                    <a:stretch>
+                      <a:fillRect/>
+                    </a:stretch>
+                  </pic:blipFill>
+                  <pic:spPr bwMode="auto">
+                    <a:xfrm>
+                      <a:off x="0" y="0"/>
+                      <a:ext cx="5124450" cy="11087100"/>
+                    </a:xfrm>
+                    <a:prstGeom prst="rect">
+                      <a:avLst/>
+                    </a:prstGeom>
+                  </pic:spPr>
+                </pic:pic>
+              </a:graphicData>
+            </a:graphic>
+          </wp:inline>
+        </w:drawing>
+      </w:r>
+    </w:p>
+    <w:p>
+      <w:pPr>
+        <w:pStyle w:val="Caption"/>
+      </w:pPr>
+      <w:r>
+        <w:t xml:space="preserve">The guest's page on a phone, no sign-in</w:t>
+      </w:r>
+    </w:p>
+    <w:p>
+      <w:pPr>
+        <w:keepNext/>
+        <w:pBdr>
+          <w:top w:val="single" w:color="DCE3E1" w:sz="4"/>
+          <w:bottom w:val="single" w:color="DCE3E1" w:sz="4"/>
+          <w:left w:val="single" w:color="DCE3E1" w:sz="4"/>
+          <w:right w:val="single" w:color="DCE3E1" w:sz="4"/>
+        </w:pBdr>
+        <w:spacing w:before="120" w:after="0" w:line="240" w:lineRule="auto"/>
+        <w:jc w:val="center"/>
+      </w:pPr>
+      <w:r>
+        <w:drawing>
+          <wp:inline distT="0" distB="0" distL="0" distR="0">
+            <wp:extent cx="5124450" cy="11087100"/>
+            <wp:effectExtent t="0" r="0" b="0" l="0"/>
+            <wp:docPr id="1" name="A declined try says why; the link stays open" descr="A declined try says why; the link stays open" title="A declined try says why; the link stays open"/>
+            <wp:cNvGraphicFramePr>
+              <a:graphicFrameLocks xmlns:a="http://schemas.openxmlformats.org/drawingml/2006/main" noChangeAspect="1"/>
+            </wp:cNvGraphicFramePr>
+            <a:graphic xmlns:a="http://schemas.openxmlformats.org/drawingml/2006/main">
+              <a:graphicData uri="http://schemas.openxmlformats.org/drawingml/2006/picture">
+                <pic:pic xmlns:pic="http://schemas.openxmlformats.org/drawingml/2006/picture">
+                  <pic:nvPicPr>
+                    <pic:cNvPr id="0" name="" descr=""/>
+                    <pic:cNvPicPr>
+                      <a:picLocks noChangeAspect="1" noChangeArrowheads="1"/>
+                    </pic:cNvPicPr>
+                  </pic:nvPicPr>
+                  <pic:blipFill>
+                    <a:blip r:embed="rId43" cstate="none"/>
+                    <a:srcRect/>
+                    <a:stretch>
+                      <a:fillRect/>
+                    </a:stretch>
+                  </pic:blipFill>
+                  <pic:spPr bwMode="auto">
+                    <a:xfrm>
+                      <a:off x="0" y="0"/>
+                      <a:ext cx="5124450" cy="11087100"/>
+                    </a:xfrm>
+                    <a:prstGeom prst="rect">
+                      <a:avLst/>
+                    </a:prstGeom>
+                  </pic:spPr>
+                </pic:pic>
+              </a:graphicData>
+            </a:graphic>
+          </wp:inline>
+        </w:drawing>
+      </w:r>
+    </w:p>
+    <w:p>
+      <w:pPr>
+        <w:pStyle w:val="Caption"/>
+      </w:pPr>
+      <w:r>
+        <w:t xml:space="preserve">A declined try says why; the link stays open</w:t>
+      </w:r>
+    </w:p>
+    <w:p>
+      <w:pPr>
+        <w:pStyle w:val="Heading2"/>
+      </w:pPr>
+      <w:r>
+        <w:t xml:space="preserve">9.12   In progress: Sprint 12 — GST invoices, credit/debit notes, receipts</w:t>
+      </w:r>
+    </w:p>
+    <w:p>
+      <w:r>
+        <w:t xml:space="preserve">Legally numbered GST invoices are produced from the bill; corrections are made only through credit and debit notes.</w:t>
       </w:r>
     </w:p>
     <w:p>
@@ -15537,7 +15933,7 @@
           <w:sz w:val="18"/>
           <w:szCs w:val="18"/>
         </w:rPr>
-        <w:t xml:space="preserve">It will be accepted when: Test-mode payment in Razorpay dashboard confirms the reservation via webhook.</w:t>
+        <w:t xml:space="preserve">It will be accepted when: Checkout produces a GST invoice and receipt PDF.</w:t>
       </w:r>
     </w:p>
     <w:p>
@@ -18753,7 +19149,7 @@
               <w:bottom w:val="single" w:color="DCE3E1" w:sz="4"/>
               <w:right w:val="single" w:color="DCE3E1" w:sz="4"/>
             </w:tcBorders>
-            <w:shd w:fill="FBEFD8" w:color="auto" w:val="clear"/>
+            <w:shd w:fill="E3F0E6" w:color="auto" w:val="clear"/>
             <w:tcMar>
               <w:top w:type="dxa" w:w="70"/>
               <w:left w:type="dxa" w:w="110"/>
@@ -18771,7 +19167,7 @@
                 <w:sz w:val="17"/>
                 <w:szCs w:val="17"/>
               </w:rPr>
-              <w:t xml:space="preserve">In progress</w:t>
+              <w:t xml:space="preserve">Done</w:t>
             </w:r>
           </w:p>
         </w:tc>
@@ -18879,6 +19275,7 @@
               <w:bottom w:val="single" w:color="DCE3E1" w:sz="4"/>
               <w:right w:val="single" w:color="DCE3E1" w:sz="4"/>
             </w:tcBorders>
+            <w:shd w:fill="FBEFD8" w:color="auto" w:val="clear"/>
             <w:tcMar>
               <w:top w:type="dxa" w:w="70"/>
               <w:left w:type="dxa" w:w="110"/>
@@ -18896,7 +19293,7 @@
                 <w:sz w:val="17"/>
                 <w:szCs w:val="17"/>
               </w:rPr>
-              <w:t xml:space="preserve">Planned</w:t>
+              <w:t xml:space="preserve">In progress</w:t>
             </w:r>
           </w:p>
         </w:tc>
@@ -21074,7 +21471,7 @@
                     </pic:cNvPicPr>
                   </pic:nvPicPr>
                   <pic:blipFill>
-                    <a:blip r:embed="rId41" cstate="none"/>
+                    <a:blip r:embed="rId44" cstate="none"/>
                     <a:srcRect/>
                     <a:stretch>
                       <a:fillRect/>
@@ -21181,7 +21578,7 @@
         <w:t xml:space="preserve">Tests that grow with the system.</w:t>
       </w:r>
       <w:r>
-        <w:t xml:space="preserve"> As of Sprint 10: 216 server test methods, 72 screen tests and 90 end-to-end browser steps, all passing.</w:t>
+        <w:t xml:space="preserve"> As of Sprint 11: 233 server test methods, 81 screen tests and 96 end-to-end browser steps, all passing.</w:t>
       </w:r>
     </w:p>
     <w:p>
@@ -23068,7 +23465,7 @@
         <w:sz w:val="16"/>
         <w:szCs w:val="16"/>
       </w:rPr>
-      <w:t xml:space="preserve">Version 1.10 · 20 October 2026</w:t>
+      <w:t xml:space="preserve">Version 1.11 · 23 October 2026</w:t>
     </w:r>
     <w:r>
       <w:rPr>

</xml_diff>

<commit_message>
chore(sprints): accept Sprint 11 (#133)
The owner accepted Sprint 11 (Razorpay) on 23 Oct 2026. Sprint 11 is marked done
in sprints.yml and Sprint 12 (GST invoices, credit/debit notes, receipts) is the
current sprint. Sprint guides and catalogues regenerated, README, CHANGELOG,
RUN_AND_TEST and the new-joiner guide updated, handbooks 1.11 rebuilt.


Claude-Session: https://claude.ai/code/session_01Hm55gq2sF48KVt76q1UTaQ

Co-authored-by: Claude <noreply@anthropic.com>
</commit_message>
<xml_diff>
--- a/docs/handbooks/Resort-OS-Product-Overview.docx
+++ b/docs/handbooks/Resort-OS-Product-Overview.docx
@@ -182,7 +182,7 @@
                 <w:sz w:val="19"/>
                 <w:szCs w:val="19"/>
               </w:rPr>
-              <w:t xml:space="preserve">Version 1.10</w:t>
+              <w:t xml:space="preserve">Version 1.11</w:t>
             </w:r>
           </w:p>
         </w:tc>
@@ -252,7 +252,7 @@
                 <w:sz w:val="19"/>
                 <w:szCs w:val="19"/>
               </w:rPr>
-              <w:t xml:space="preserve">20 October 2026</w:t>
+              <w:t xml:space="preserve">23 October 2026</w:t>
             </w:r>
           </w:p>
         </w:tc>
@@ -322,7 +322,7 @@
                 <w:sz w:val="19"/>
                 <w:szCs w:val="19"/>
               </w:rPr>
-              <w:t xml:space="preserve">Sprints 01, 02, 03, 04, 05, 06, 07, 08, 09, 10 accepted · Sprint 11 Razorpay in progress</w:t>
+              <w:t xml:space="preserve">Sprints 01, 02, 03, 04, 05, 06, 07, 08, 09, 10, 11 accepted · Sprint 12 GST invoices, credit/debit notes, receipts in progress</w:t>
             </w:r>
           </w:p>
         </w:tc>
@@ -661,7 +661,7 @@
                 <w:sz w:val="19"/>
                 <w:szCs w:val="19"/>
               </w:rPr>
-              <w:t xml:space="preserve">1.10</w:t>
+              <w:t xml:space="preserve">1.11</w:t>
             </w:r>
           </w:p>
         </w:tc>
@@ -691,7 +691,7 @@
                 <w:sz w:val="19"/>
                 <w:szCs w:val="19"/>
               </w:rPr>
-              <w:t xml:space="preserve">2026-10-20</w:t>
+              <w:t xml:space="preserve">2026-10-23</w:t>
             </w:r>
           </w:p>
         </w:tc>
@@ -721,7 +721,7 @@
                 <w:sz w:val="19"/>
                 <w:szCs w:val="19"/>
               </w:rPr>
-              <w:t xml:space="preserve">Sprint 10 (Payments, refunds, cash drawer) accepted: cash, UPI, card and bank payments on the bill or on account, refunds with a reason that can never exceed the payment, voids, the cash drawer opened and closed against a count with manager approval of a shortfall, no card data stored, real balances at check-out. Payment flow diagram. Sprint 11 (Razorpay) started.</w:t>
+              <w:t xml:space="preserve">Sprint 11 (Razorpay) accepted: payment links sent from a booking, the guest pays on their phone with UPI or a card through Razorpay with no sign-in, only Razorpay's signed webhook records the payment (once, whatever the order) and confirms a pending booking, declined tries shown with the reason, online refunds back through Razorpay, a built-in test Razorpay when no keys are set. Razorpay flow diagram. Sprint 12 started.</w:t>
             </w:r>
           </w:p>
         </w:tc>
@@ -757,7 +757,7 @@
                 <w:sz w:val="19"/>
                 <w:szCs w:val="19"/>
               </w:rPr>
-              <w:t xml:space="preserve">1.9</w:t>
+              <w:t xml:space="preserve">1.10</w:t>
             </w:r>
           </w:p>
         </w:tc>
@@ -819,7 +819,7 @@
                 <w:sz w:val="19"/>
                 <w:szCs w:val="19"/>
               </w:rPr>
-              <w:t xml:space="preserve">Sprint 09 (GST configuration and tax engine) accepted: GST worked out on every charge (CGST + SGST or IGST), rates kept as rules with dates that an accountant changes from next month without a software update, room GST by the price per room per night, posted charges keep their GST. Tax flow diagram. Sprint 10 (Payments, refunds, cash drawer) started.</w:t>
+              <w:t xml:space="preserve">Sprint 10 (Payments, refunds, cash drawer) accepted: cash, UPI, card and bank payments on the bill or on account, refunds with a reason that can never exceed the payment, voids, the cash drawer opened and closed against a count with manager approval of a shortfall, no card data stored, real balances at check-out. Payment flow diagram. Sprint 11 (Razorpay) started.</w:t>
             </w:r>
           </w:p>
         </w:tc>
@@ -854,7 +854,7 @@
                 <w:sz w:val="19"/>
                 <w:szCs w:val="19"/>
               </w:rPr>
-              <w:t xml:space="preserve">1.8</w:t>
+              <w:t xml:space="preserve">1.9</w:t>
             </w:r>
           </w:p>
         </w:tc>
@@ -884,7 +884,7 @@
                 <w:sz w:val="19"/>
                 <w:szCs w:val="19"/>
               </w:rPr>
-              <w:t xml:space="preserve">2026-10-18</w:t>
+              <w:t xml:space="preserve">2026-10-20</w:t>
             </w:r>
           </w:p>
         </w:tc>
@@ -914,7 +914,7 @@
                 <w:sz w:val="19"/>
                 <w:szCs w:val="19"/>
               </w:rPr>
-              <w:t xml:space="preserve">Sprint 08 (Folio) accepted: a running bill for every stay with room nights, meals, transport, activities and packages; nothing can be edited or deleted, a manager reverses a line with a reason; bills can be split; the front desk shows the real balance. Folio flow diagram. Sprint 09 (GST configuration and tax engine) started.</w:t>
+              <w:t xml:space="preserve">Sprint 09 (GST configuration and tax engine) accepted: GST worked out on every charge (CGST + SGST or IGST), rates kept as rules with dates that an accountant changes from next month without a software update, room GST by the price per room per night, posted charges keep their GST. Tax flow diagram. Sprint 10 (Payments, refunds, cash drawer) started.</w:t>
             </w:r>
           </w:p>
         </w:tc>
@@ -950,7 +950,7 @@
                 <w:sz w:val="19"/>
                 <w:szCs w:val="19"/>
               </w:rPr>
-              <w:t xml:space="preserve">1.7</w:t>
+              <w:t xml:space="preserve">1.8</w:t>
             </w:r>
           </w:p>
         </w:tc>
@@ -1012,7 +1012,7 @@
                 <w:sz w:val="19"/>
                 <w:szCs w:val="19"/>
               </w:rPr>
-              <w:t xml:space="preserve">Sprint 07 (Front desk) accepted: arrivals, departures and in-house lists, check-in and check-out in a few clicks, walk-ins on one screen, early departures with a reason, rooms marked dirty and ready. Check-in flow diagram. Sprint 08 (Folio) started.</w:t>
+              <w:t xml:space="preserve">Sprint 08 (Folio) accepted: a running bill for every stay with room nights, meals, transport, activities and packages; nothing can be edited or deleted, a manager reverses a line with a reason; bills can be split; the front desk shows the real balance. Folio flow diagram. Sprint 09 (GST configuration and tax engine) started.</w:t>
             </w:r>
           </w:p>
         </w:tc>
@@ -1047,7 +1047,7 @@
                 <w:sz w:val="19"/>
                 <w:szCs w:val="19"/>
               </w:rPr>
-              <w:t xml:space="preserve">1.6</w:t>
+              <w:t xml:space="preserve">1.7</w:t>
             </w:r>
           </w:p>
         </w:tc>
@@ -1077,7 +1077,7 @@
                 <w:sz w:val="19"/>
                 <w:szCs w:val="19"/>
               </w:rPr>
-              <w:t xml:space="preserve">2026-10-17</w:t>
+              <w:t xml:space="preserve">2026-10-18</w:t>
             </w:r>
           </w:p>
         </w:tc>
@@ -1107,7 +1107,7 @@
                 <w:sz w:val="19"/>
                 <w:szCs w:val="19"/>
               </w:rPr>
-              <w:t xml:space="preserve">Sprint 06 (Reservation calendar) accepted: day, week and month calendar of rooms and dorm beds, moving a guest by drag-and-drop with a reason, list by day on phones. Room-move flow diagram. Sprint 07 (Front desk) started.</w:t>
+              <w:t xml:space="preserve">Sprint 07 (Front desk) accepted: arrivals, departures and in-house lists, check-in and check-out in a few clicks, walk-ins on one screen, early departures with a reason, rooms marked dirty and ready. Check-in flow diagram. Sprint 08 (Folio) started.</w:t>
             </w:r>
           </w:p>
         </w:tc>
@@ -1143,7 +1143,7 @@
                 <w:sz w:val="19"/>
                 <w:szCs w:val="19"/>
               </w:rPr>
-              <w:t xml:space="preserve">1.5</w:t>
+              <w:t xml:space="preserve">1.6</w:t>
             </w:r>
           </w:p>
         </w:tc>
@@ -1174,7 +1174,7 @@
                 <w:sz w:val="19"/>
                 <w:szCs w:val="19"/>
               </w:rPr>
-              <w:t xml:space="preserve">2026-10-15</w:t>
+              <w:t xml:space="preserve">2026-10-17</w:t>
             </w:r>
           </w:p>
         </w:tc>
@@ -1205,7 +1205,7 @@
                 <w:sz w:val="19"/>
                 <w:szCs w:val="19"/>
               </w:rPr>
-              <w:t xml:space="preserve">Sprint 05 (Availability engine and reservations) accepted: race-free booking, booking wizard, booking history, date pickers. Diagrams of the reservation tables and the booking flow. Sprint 06 (Reservation calendar) started.</w:t>
+              <w:t xml:space="preserve">Sprint 06 (Reservation calendar) accepted: day, week and month calendar of rooms and dorm beds, moving a guest by drag-and-drop with a reason, list by day on phones. Room-move flow diagram. Sprint 07 (Front desk) started.</w:t>
             </w:r>
           </w:p>
         </w:tc>
@@ -1240,7 +1240,7 @@
                 <w:sz w:val="19"/>
                 <w:szCs w:val="19"/>
               </w:rPr>
-              <w:t xml:space="preserve">1.4</w:t>
+              <w:t xml:space="preserve">1.5</w:t>
             </w:r>
           </w:p>
         </w:tc>
@@ -1270,7 +1270,7 @@
                 <w:sz w:val="19"/>
                 <w:szCs w:val="19"/>
               </w:rPr>
-              <w:t xml:space="preserve">2026-10-14</w:t>
+              <w:t xml:space="preserve">2026-10-15</w:t>
             </w:r>
           </w:p>
         </w:tc>
@@ -1300,7 +1300,7 @@
                 <w:sz w:val="19"/>
                 <w:szCs w:val="19"/>
               </w:rPr>
-              <w:t xml:space="preserve">Sprint 04 (Rate plans and packages) accepted: nightly price grid, quotes, packages with revenue split. Sprint 05 (Availability engine and reservations) started.</w:t>
+              <w:t xml:space="preserve">Sprint 05 (Availability engine and reservations) accepted: race-free booking, booking wizard, booking history, date pickers. Diagrams of the reservation tables and the booking flow. Sprint 06 (Reservation calendar) started.</w:t>
             </w:r>
           </w:p>
         </w:tc>
@@ -1336,7 +1336,7 @@
                 <w:sz w:val="19"/>
                 <w:szCs w:val="19"/>
               </w:rPr>
-              <w:t xml:space="preserve">1.3</w:t>
+              <w:t xml:space="preserve">1.4</w:t>
             </w:r>
           </w:p>
         </w:tc>
@@ -1367,7 +1367,7 @@
                 <w:sz w:val="19"/>
                 <w:szCs w:val="19"/>
               </w:rPr>
-              <w:t xml:space="preserve">2026-10-11</w:t>
+              <w:t xml:space="preserve">2026-10-14</w:t>
             </w:r>
           </w:p>
         </w:tc>
@@ -1398,7 +1398,7 @@
                 <w:sz w:val="19"/>
                 <w:szCs w:val="19"/>
               </w:rPr>
-              <w:t xml:space="preserve">Sprint 03 (Guests) accepted, with review fixes: Aadhaar number check and error messages that say why. Sprint 04 (Rate plans and packages) started.</w:t>
+              <w:t xml:space="preserve">Sprint 04 (Rate plans and packages) accepted: nightly price grid, quotes, packages with revenue split. Sprint 05 (Availability engine and reservations) started.</w:t>
             </w:r>
           </w:p>
         </w:tc>
@@ -1433,7 +1433,7 @@
                 <w:sz w:val="19"/>
                 <w:szCs w:val="19"/>
               </w:rPr>
-              <w:t xml:space="preserve">1.2.1</w:t>
+              <w:t xml:space="preserve">1.3</w:t>
             </w:r>
           </w:p>
         </w:tc>
@@ -1463,7 +1463,7 @@
                 <w:sz w:val="19"/>
                 <w:szCs w:val="19"/>
               </w:rPr>
-              <w:t xml:space="preserve">2026-10-10</w:t>
+              <w:t xml:space="preserve">2026-10-11</w:t>
             </w:r>
           </w:p>
         </w:tc>
@@ -1493,7 +1493,7 @@
                 <w:sz w:val="19"/>
                 <w:szCs w:val="19"/>
               </w:rPr>
-              <w:t xml:space="preserve">Sprint 03 (Guests) built and in review: guest profiles, encrypted ID documents, duplicates, merge, anonymise, consent.</w:t>
+              <w:t xml:space="preserve">Sprint 03 (Guests) accepted, with review fixes: Aadhaar number check and error messages that say why. Sprint 04 (Rate plans and packages) started.</w:t>
             </w:r>
           </w:p>
         </w:tc>
@@ -1529,6 +1529,103 @@
                 <w:sz w:val="19"/>
                 <w:szCs w:val="19"/>
               </w:rPr>
+              <w:t xml:space="preserve">1.2.1</w:t>
+            </w:r>
+          </w:p>
+        </w:tc>
+        <w:tc>
+          <w:tcPr>
+            <w:tcW w:type="dxa" w:w="1500"/>
+            <w:tcBorders>
+              <w:top w:val="single" w:color="DCE3E1" w:sz="4"/>
+              <w:left w:val="single" w:color="DCE3E1" w:sz="4"/>
+              <w:bottom w:val="single" w:color="DCE3E1" w:sz="4"/>
+              <w:right w:val="single" w:color="DCE3E1" w:sz="4"/>
+            </w:tcBorders>
+            <w:shd w:fill="F5F7F6" w:color="auto" w:val="clear"/>
+            <w:tcMar>
+              <w:top w:type="dxa" w:w="70"/>
+              <w:left w:type="dxa" w:w="110"/>
+              <w:bottom w:type="dxa" w:w="50"/>
+              <w:right w:type="dxa" w:w="110"/>
+            </w:tcMar>
+            <w:vAlign w:val="top"/>
+          </w:tcPr>
+          <w:p>
+            <w:pPr>
+              <w:spacing w:after="40" w:line="252" w:lineRule="auto"/>
+            </w:pPr>
+            <w:r>
+              <w:rPr>
+                <w:sz w:val="19"/>
+                <w:szCs w:val="19"/>
+              </w:rPr>
+              <w:t xml:space="preserve">2026-10-10</w:t>
+            </w:r>
+          </w:p>
+        </w:tc>
+        <w:tc>
+          <w:tcPr>
+            <w:tcW w:type="dxa" w:w="6714"/>
+            <w:tcBorders>
+              <w:top w:val="single" w:color="DCE3E1" w:sz="4"/>
+              <w:left w:val="single" w:color="DCE3E1" w:sz="4"/>
+              <w:bottom w:val="single" w:color="DCE3E1" w:sz="4"/>
+              <w:right w:val="single" w:color="DCE3E1" w:sz="4"/>
+            </w:tcBorders>
+            <w:shd w:fill="F5F7F6" w:color="auto" w:val="clear"/>
+            <w:tcMar>
+              <w:top w:type="dxa" w:w="70"/>
+              <w:left w:type="dxa" w:w="110"/>
+              <w:bottom w:type="dxa" w:w="50"/>
+              <w:right w:type="dxa" w:w="110"/>
+            </w:tcMar>
+            <w:vAlign w:val="top"/>
+          </w:tcPr>
+          <w:p>
+            <w:pPr>
+              <w:spacing w:after="40" w:line="252" w:lineRule="auto"/>
+            </w:pPr>
+            <w:r>
+              <w:rPr>
+                <w:sz w:val="19"/>
+                <w:szCs w:val="19"/>
+              </w:rPr>
+              <w:t xml:space="preserve">Sprint 03 (Guests) built and in review: guest profiles, encrypted ID documents, duplicates, merge, anonymise, consent.</w:t>
+            </w:r>
+          </w:p>
+        </w:tc>
+      </w:tr>
+      <w:tr>
+        <w:trPr>
+          <w:cantSplit/>
+        </w:trPr>
+        <w:tc>
+          <w:tcPr>
+            <w:tcW w:type="dxa" w:w="1100"/>
+            <w:tcBorders>
+              <w:top w:val="single" w:color="DCE3E1" w:sz="4"/>
+              <w:left w:val="single" w:color="DCE3E1" w:sz="4"/>
+              <w:bottom w:val="single" w:color="DCE3E1" w:sz="4"/>
+              <w:right w:val="single" w:color="DCE3E1" w:sz="4"/>
+            </w:tcBorders>
+            <w:tcMar>
+              <w:top w:type="dxa" w:w="70"/>
+              <w:left w:type="dxa" w:w="110"/>
+              <w:bottom w:type="dxa" w:w="50"/>
+              <w:right w:type="dxa" w:w="110"/>
+            </w:tcMar>
+            <w:vAlign w:val="top"/>
+          </w:tcPr>
+          <w:p>
+            <w:pPr>
+              <w:spacing w:after="40" w:line="252" w:lineRule="auto"/>
+            </w:pPr>
+            <w:r>
+              <w:rPr>
+                <w:sz w:val="19"/>
+                <w:szCs w:val="19"/>
+              </w:rPr>
               <w:t xml:space="preserve">1.2</w:t>
             </w:r>
           </w:p>
@@ -1542,7 +1639,6 @@
               <w:bottom w:val="single" w:color="DCE3E1" w:sz="4"/>
               <w:right w:val="single" w:color="DCE3E1" w:sz="4"/>
             </w:tcBorders>
-            <w:shd w:fill="F5F7F6" w:color="auto" w:val="clear"/>
             <w:tcMar>
               <w:top w:type="dxa" w:w="70"/>
               <w:left w:type="dxa" w:w="110"/>
@@ -1573,7 +1669,6 @@
               <w:bottom w:val="single" w:color="DCE3E1" w:sz="4"/>
               <w:right w:val="single" w:color="DCE3E1" w:sz="4"/>
             </w:tcBorders>
-            <w:shd w:fill="F5F7F6" w:color="auto" w:val="clear"/>
             <w:tcMar>
               <w:top w:type="dxa" w:w="70"/>
               <w:left w:type="dxa" w:w="110"/>
@@ -1824,7 +1919,7 @@
                 <w:sz w:val="19"/>
                 <w:szCs w:val="19"/>
               </w:rPr>
-              <w:t xml:space="preserve">Living document, rebuilt at the end of every sprint. This edition reflects Sprint 10 accepted and Sprint 11 in progress.</w:t>
+              <w:t xml:space="preserve">Living document, rebuilt at the end of every sprint. This edition reflects Sprint 11 accepted and Sprint 12 in progress.</w:t>
             </w:r>
           </w:p>
         </w:tc>
@@ -2756,7 +2851,33 @@
           <w:sz w:val="19"/>
           <w:szCs w:val="19"/>
         </w:rPr>
-        <w:t xml:space="preserve">In progress: Sprint 11 — Razorpay</w:t>
+        <w:t xml:space="preserve">Sprint 11 — Razorpay</w:t>
+      </w:r>
+    </w:p>
+    <w:p>
+      <w:pPr>
+        <w:spacing w:after="30" w:before="0"/>
+        <w:ind w:left="420"/>
+      </w:pPr>
+      <w:r>
+        <w:rPr>
+          <w:b w:val="false"/>
+          <w:bCs w:val="false"/>
+          <w:color w:val="8A2449"/>
+          <w:sz w:val="19"/>
+          <w:szCs w:val="19"/>
+        </w:rPr>
+        <w:t xml:space="preserve">9.12  </w:t>
+      </w:r>
+      <w:r>
+        <w:rPr>
+          <w:b w:val="false"/>
+          <w:bCs w:val="false"/>
+          <w:color w:val="1B2A2E"/>
+          <w:sz w:val="19"/>
+          <w:szCs w:val="19"/>
+        </w:rPr>
+        <w:t xml:space="preserve">In progress: Sprint 12 — GST invoices, credit/debit notes, receipts</w:t>
       </w:r>
     </w:p>
     <w:p>
@@ -3079,7 +3200,7 @@
                 <w:sz w:val="40"/>
                 <w:szCs w:val="40"/>
               </w:rPr>
-              <w:t xml:space="preserve">10 of 29</w:t>
+              <w:t xml:space="preserve">11 of 29</w:t>
             </w:r>
           </w:p>
           <w:p>
@@ -3444,7 +3565,7 @@
                 <w:sz w:val="19"/>
                 <w:szCs w:val="19"/>
               </w:rPr>
-              <w:t xml:space="preserve">Sprints 01 and 02 and 03 and 04 and 05 and 06 and 07 and 08 and 09 and 10 are delivered and accepted. Sprint 11 (Razorpay) is in progress.</w:t>
+              <w:t xml:space="preserve">Sprints 01 and 02 and 03 and 04 and 05 and 06 and 07 and 08 and 09 and 10 and 11 are delivered and accepted. Sprint 12 (GST invoices, credit/debit notes, receipts) is in progress.</w:t>
             </w:r>
           </w:p>
         </w:tc>
@@ -5940,25 +6061,25 @@
               <w:bottom w:val="single" w:color="DCE3E1" w:sz="4"/>
               <w:right w:val="single" w:color="DCE3E1" w:sz="4"/>
             </w:tcBorders>
-            <w:shd w:fill="FBEFD8" w:color="auto" w:val="clear"/>
-            <w:tcMar>
-              <w:top w:type="dxa" w:w="70"/>
-              <w:left w:type="dxa" w:w="110"/>
-              <w:bottom w:type="dxa" w:w="50"/>
-              <w:right w:type="dxa" w:w="110"/>
-            </w:tcMar>
-            <w:vAlign w:val="top"/>
-          </w:tcPr>
-          <w:p>
-            <w:pPr>
-              <w:spacing w:after="40" w:line="252" w:lineRule="auto"/>
-            </w:pPr>
-            <w:r>
-              <w:rPr>
-                <w:sz w:val="19"/>
-                <w:szCs w:val="19"/>
-              </w:rPr>
-              <w:t xml:space="preserve">In progress</w:t>
+            <w:shd w:fill="E3F0E6" w:color="auto" w:val="clear"/>
+            <w:tcMar>
+              <w:top w:type="dxa" w:w="70"/>
+              <w:left w:type="dxa" w:w="110"/>
+              <w:bottom w:type="dxa" w:w="50"/>
+              <w:right w:type="dxa" w:w="110"/>
+            </w:tcMar>
+            <w:vAlign w:val="top"/>
+          </w:tcPr>
+          <w:p>
+            <w:pPr>
+              <w:spacing w:after="40" w:line="252" w:lineRule="auto"/>
+            </w:pPr>
+            <w:r>
+              <w:rPr>
+                <w:sz w:val="19"/>
+                <w:szCs w:val="19"/>
+              </w:rPr>
+              <w:t xml:space="preserve">Done</w:t>
             </w:r>
           </w:p>
         </w:tc>
@@ -6036,24 +6157,25 @@
               <w:bottom w:val="single" w:color="DCE3E1" w:sz="4"/>
               <w:right w:val="single" w:color="DCE3E1" w:sz="4"/>
             </w:tcBorders>
-            <w:tcMar>
-              <w:top w:type="dxa" w:w="70"/>
-              <w:left w:type="dxa" w:w="110"/>
-              <w:bottom w:type="dxa" w:w="50"/>
-              <w:right w:type="dxa" w:w="110"/>
-            </w:tcMar>
-            <w:vAlign w:val="top"/>
-          </w:tcPr>
-          <w:p>
-            <w:pPr>
-              <w:spacing w:after="40" w:line="252" w:lineRule="auto"/>
-            </w:pPr>
-            <w:r>
-              <w:rPr>
-                <w:sz w:val="19"/>
-                <w:szCs w:val="19"/>
-              </w:rPr>
-              <w:t xml:space="preserve">Planned</w:t>
+            <w:shd w:fill="FBEFD8" w:color="auto" w:val="clear"/>
+            <w:tcMar>
+              <w:top w:type="dxa" w:w="70"/>
+              <w:left w:type="dxa" w:w="110"/>
+              <w:bottom w:type="dxa" w:w="50"/>
+              <w:right w:type="dxa" w:w="110"/>
+            </w:tcMar>
+            <w:vAlign w:val="top"/>
+          </w:tcPr>
+          <w:p>
+            <w:pPr>
+              <w:spacing w:after="40" w:line="252" w:lineRule="auto"/>
+            </w:pPr>
+            <w:r>
+              <w:rPr>
+                <w:sz w:val="19"/>
+                <w:szCs w:val="19"/>
+              </w:rPr>
+              <w:t xml:space="preserve">In progress</w:t>
             </w:r>
           </w:p>
         </w:tc>
@@ -12810,7 +12932,7 @@
     </w:p>
     <w:p>
       <w:r>
-        <w:t xml:space="preserve">Work is delivered in short sprints, and each one ends with the owner trying the new screens and accepting them. These are the parts that are built, tested and accepted as of Sprint 10.</w:t>
+        <w:t xml:space="preserve">Work is delivered in short sprints, and each one ends with the owner trying the new screens and accepting them. These are the parts that are built, tested and accepted as of Sprint 11.</w:t>
       </w:r>
     </w:p>
     <w:p>
@@ -15519,12 +15641,286 @@
         <w:pStyle w:val="Heading2"/>
       </w:pPr>
       <w:r>
-        <w:t xml:space="preserve">9.11   In progress: Sprint 11 — Razorpay</w:t>
+        <w:t xml:space="preserve">9.11   Sprint 11 — Razorpay</w:t>
       </w:r>
     </w:p>
     <w:p>
       <w:r>
         <w:t xml:space="preserve">Guests pay online with UPI and cards through Razorpay; payment links can be sent before arrival.</w:t>
+      </w:r>
+    </w:p>
+    <w:p>
+      <w:pPr>
+        <w:pStyle w:val="ListParagraph"/>
+        <w:numPr>
+          <w:ilvl w:val="0"/>
+          <w:numId w:val="2"/>
+        </w:numPr>
+        <w:spacing w:after="60"/>
+      </w:pPr>
+      <w:r>
+        <w:t xml:space="preserve">Staff send a payment link from a booking; the guest pays on their phone with UPI or a card through Razorpay, with no sign-in</w:t>
+      </w:r>
+    </w:p>
+    <w:p>
+      <w:pPr>
+        <w:pStyle w:val="ListParagraph"/>
+        <w:numPr>
+          <w:ilvl w:val="0"/>
+          <w:numId w:val="2"/>
+        </w:numPr>
+        <w:spacing w:after="60"/>
+      </w:pPr>
+      <w:r>
+        <w:t xml:space="preserve">Only Razorpay's signed notification records a payment; it goes on the bill and confirms a pending booking by itself</w:t>
+      </w:r>
+    </w:p>
+    <w:p>
+      <w:pPr>
+        <w:pStyle w:val="ListParagraph"/>
+        <w:numPr>
+          <w:ilvl w:val="0"/>
+          <w:numId w:val="2"/>
+        </w:numPr>
+        <w:spacing w:after="60"/>
+      </w:pPr>
+      <w:r>
+        <w:t xml:space="preserve">A notification sent twice, or out of order, is recorded once; every one is kept with what it did</w:t>
+      </w:r>
+    </w:p>
+    <w:p>
+      <w:pPr>
+        <w:pStyle w:val="ListParagraph"/>
+        <w:numPr>
+          <w:ilvl w:val="0"/>
+          <w:numId w:val="2"/>
+        </w:numPr>
+        <w:spacing w:after="60"/>
+      </w:pPr>
+      <w:r>
+        <w:t xml:space="preserve">A declined try is shown with the bank's reason and the link stays open; links can be cancelled with a reason</w:t>
+      </w:r>
+    </w:p>
+    <w:p>
+      <w:pPr>
+        <w:pStyle w:val="ListParagraph"/>
+        <w:numPr>
+          <w:ilvl w:val="0"/>
+          <w:numId w:val="2"/>
+        </w:numPr>
+        <w:spacing w:after="60"/>
+      </w:pPr>
+      <w:r>
+        <w:t xml:space="preserve">Online payments are refunded back through Razorpay; card details never reach Resort OS</w:t>
+      </w:r>
+    </w:p>
+    <w:p>
+      <w:pPr>
+        <w:pStyle w:val="ListParagraph"/>
+        <w:numPr>
+          <w:ilvl w:val="0"/>
+          <w:numId w:val="2"/>
+        </w:numPr>
+        <w:spacing w:after="60"/>
+      </w:pPr>
+      <w:r>
+        <w:t xml:space="preserve">Without Razorpay keys the app uses a built-in test Razorpay, so everything can be tried before the account is set up</w:t>
+      </w:r>
+    </w:p>
+    <w:p>
+      <w:pPr>
+        <w:keepNext/>
+        <w:pBdr>
+          <w:top w:val="single" w:color="DCE3E1" w:sz="4"/>
+          <w:bottom w:val="single" w:color="DCE3E1" w:sz="4"/>
+          <w:left w:val="single" w:color="DCE3E1" w:sz="4"/>
+          <w:right w:val="single" w:color="DCE3E1" w:sz="4"/>
+        </w:pBdr>
+        <w:spacing w:before="120" w:after="0" w:line="240" w:lineRule="auto"/>
+        <w:jc w:val="center"/>
+      </w:pPr>
+      <w:r>
+        <w:drawing>
+          <wp:inline distT="0" distB="0" distL="0" distR="0">
+            <wp:extent cx="5124450" cy="3438525"/>
+            <wp:effectExtent t="0" r="0" b="0" l="0"/>
+            <wp:docPr id="1" name="Sending a payment link for an advance" descr="Sending a payment link for an advance" title="Sending a payment link for an advance"/>
+            <wp:cNvGraphicFramePr>
+              <a:graphicFrameLocks xmlns:a="http://schemas.openxmlformats.org/drawingml/2006/main" noChangeAspect="1"/>
+            </wp:cNvGraphicFramePr>
+            <a:graphic xmlns:a="http://schemas.openxmlformats.org/drawingml/2006/main">
+              <a:graphicData uri="http://schemas.openxmlformats.org/drawingml/2006/picture">
+                <pic:pic xmlns:pic="http://schemas.openxmlformats.org/drawingml/2006/picture">
+                  <pic:nvPicPr>
+                    <pic:cNvPr id="0" name="" descr=""/>
+                    <pic:cNvPicPr>
+                      <a:picLocks noChangeAspect="1" noChangeArrowheads="1"/>
+                    </pic:cNvPicPr>
+                  </pic:nvPicPr>
+                  <pic:blipFill>
+                    <a:blip r:embed="rId41" cstate="none"/>
+                    <a:srcRect/>
+                    <a:stretch>
+                      <a:fillRect/>
+                    </a:stretch>
+                  </pic:blipFill>
+                  <pic:spPr bwMode="auto">
+                    <a:xfrm>
+                      <a:off x="0" y="0"/>
+                      <a:ext cx="5124450" cy="3438525"/>
+                    </a:xfrm>
+                    <a:prstGeom prst="rect">
+                      <a:avLst/>
+                    </a:prstGeom>
+                  </pic:spPr>
+                </pic:pic>
+              </a:graphicData>
+            </a:graphic>
+          </wp:inline>
+        </w:drawing>
+      </w:r>
+    </w:p>
+    <w:p>
+      <w:pPr>
+        <w:pStyle w:val="Caption"/>
+      </w:pPr>
+      <w:r>
+        <w:t xml:space="preserve">Sending a payment link for an advance</w:t>
+      </w:r>
+    </w:p>
+    <w:p>
+      <w:pPr>
+        <w:keepNext/>
+        <w:pBdr>
+          <w:top w:val="single" w:color="DCE3E1" w:sz="4"/>
+          <w:bottom w:val="single" w:color="DCE3E1" w:sz="4"/>
+          <w:left w:val="single" w:color="DCE3E1" w:sz="4"/>
+          <w:right w:val="single" w:color="DCE3E1" w:sz="4"/>
+        </w:pBdr>
+        <w:spacing w:before="120" w:after="0" w:line="240" w:lineRule="auto"/>
+        <w:jc w:val="center"/>
+      </w:pPr>
+      <w:r>
+        <w:drawing>
+          <wp:inline distT="0" distB="0" distL="0" distR="0">
+            <wp:extent cx="5124450" cy="11087100"/>
+            <wp:effectExtent t="0" r="0" b="0" l="0"/>
+            <wp:docPr id="1" name="The guest's page on a phone, no sign-in" descr="The guest's page on a phone, no sign-in" title="The guest's page on a phone, no sign-in"/>
+            <wp:cNvGraphicFramePr>
+              <a:graphicFrameLocks xmlns:a="http://schemas.openxmlformats.org/drawingml/2006/main" noChangeAspect="1"/>
+            </wp:cNvGraphicFramePr>
+            <a:graphic xmlns:a="http://schemas.openxmlformats.org/drawingml/2006/main">
+              <a:graphicData uri="http://schemas.openxmlformats.org/drawingml/2006/picture">
+                <pic:pic xmlns:pic="http://schemas.openxmlformats.org/drawingml/2006/picture">
+                  <pic:nvPicPr>
+                    <pic:cNvPr id="0" name="" descr=""/>
+                    <pic:cNvPicPr>
+                      <a:picLocks noChangeAspect="1" noChangeArrowheads="1"/>
+                    </pic:cNvPicPr>
+                  </pic:nvPicPr>
+                  <pic:blipFill>
+                    <a:blip r:embed="rId42" cstate="none"/>
+                    <a:srcRect/>
+                    <a:stretch>
+                      <a:fillRect/>
+                    </a:stretch>
+                  </pic:blipFill>
+                  <pic:spPr bwMode="auto">
+                    <a:xfrm>
+                      <a:off x="0" y="0"/>
+                      <a:ext cx="5124450" cy="11087100"/>
+                    </a:xfrm>
+                    <a:prstGeom prst="rect">
+                      <a:avLst/>
+                    </a:prstGeom>
+                  </pic:spPr>
+                </pic:pic>
+              </a:graphicData>
+            </a:graphic>
+          </wp:inline>
+        </w:drawing>
+      </w:r>
+    </w:p>
+    <w:p>
+      <w:pPr>
+        <w:pStyle w:val="Caption"/>
+      </w:pPr>
+      <w:r>
+        <w:t xml:space="preserve">The guest's page on a phone, no sign-in</w:t>
+      </w:r>
+    </w:p>
+    <w:p>
+      <w:pPr>
+        <w:keepNext/>
+        <w:pBdr>
+          <w:top w:val="single" w:color="DCE3E1" w:sz="4"/>
+          <w:bottom w:val="single" w:color="DCE3E1" w:sz="4"/>
+          <w:left w:val="single" w:color="DCE3E1" w:sz="4"/>
+          <w:right w:val="single" w:color="DCE3E1" w:sz="4"/>
+        </w:pBdr>
+        <w:spacing w:before="120" w:after="0" w:line="240" w:lineRule="auto"/>
+        <w:jc w:val="center"/>
+      </w:pPr>
+      <w:r>
+        <w:drawing>
+          <wp:inline distT="0" distB="0" distL="0" distR="0">
+            <wp:extent cx="5124450" cy="11087100"/>
+            <wp:effectExtent t="0" r="0" b="0" l="0"/>
+            <wp:docPr id="1" name="A declined try says why; the link stays open" descr="A declined try says why; the link stays open" title="A declined try says why; the link stays open"/>
+            <wp:cNvGraphicFramePr>
+              <a:graphicFrameLocks xmlns:a="http://schemas.openxmlformats.org/drawingml/2006/main" noChangeAspect="1"/>
+            </wp:cNvGraphicFramePr>
+            <a:graphic xmlns:a="http://schemas.openxmlformats.org/drawingml/2006/main">
+              <a:graphicData uri="http://schemas.openxmlformats.org/drawingml/2006/picture">
+                <pic:pic xmlns:pic="http://schemas.openxmlformats.org/drawingml/2006/picture">
+                  <pic:nvPicPr>
+                    <pic:cNvPr id="0" name="" descr=""/>
+                    <pic:cNvPicPr>
+                      <a:picLocks noChangeAspect="1" noChangeArrowheads="1"/>
+                    </pic:cNvPicPr>
+                  </pic:nvPicPr>
+                  <pic:blipFill>
+                    <a:blip r:embed="rId43" cstate="none"/>
+                    <a:srcRect/>
+                    <a:stretch>
+                      <a:fillRect/>
+                    </a:stretch>
+                  </pic:blipFill>
+                  <pic:spPr bwMode="auto">
+                    <a:xfrm>
+                      <a:off x="0" y="0"/>
+                      <a:ext cx="5124450" cy="11087100"/>
+                    </a:xfrm>
+                    <a:prstGeom prst="rect">
+                      <a:avLst/>
+                    </a:prstGeom>
+                  </pic:spPr>
+                </pic:pic>
+              </a:graphicData>
+            </a:graphic>
+          </wp:inline>
+        </w:drawing>
+      </w:r>
+    </w:p>
+    <w:p>
+      <w:pPr>
+        <w:pStyle w:val="Caption"/>
+      </w:pPr>
+      <w:r>
+        <w:t xml:space="preserve">A declined try says why; the link stays open</w:t>
+      </w:r>
+    </w:p>
+    <w:p>
+      <w:pPr>
+        <w:pStyle w:val="Heading2"/>
+      </w:pPr>
+      <w:r>
+        <w:t xml:space="preserve">9.12   In progress: Sprint 12 — GST invoices, credit/debit notes, receipts</w:t>
+      </w:r>
+    </w:p>
+    <w:p>
+      <w:r>
+        <w:t xml:space="preserve">Legally numbered GST invoices are produced from the bill; corrections are made only through credit and debit notes.</w:t>
       </w:r>
     </w:p>
     <w:p>
@@ -15537,7 +15933,7 @@
           <w:sz w:val="18"/>
           <w:szCs w:val="18"/>
         </w:rPr>
-        <w:t xml:space="preserve">It will be accepted when: Test-mode payment in Razorpay dashboard confirms the reservation via webhook.</w:t>
+        <w:t xml:space="preserve">It will be accepted when: Checkout produces a GST invoice and receipt PDF.</w:t>
       </w:r>
     </w:p>
     <w:p>
@@ -18753,7 +19149,7 @@
               <w:bottom w:val="single" w:color="DCE3E1" w:sz="4"/>
               <w:right w:val="single" w:color="DCE3E1" w:sz="4"/>
             </w:tcBorders>
-            <w:shd w:fill="FBEFD8" w:color="auto" w:val="clear"/>
+            <w:shd w:fill="E3F0E6" w:color="auto" w:val="clear"/>
             <w:tcMar>
               <w:top w:type="dxa" w:w="70"/>
               <w:left w:type="dxa" w:w="110"/>
@@ -18771,7 +19167,7 @@
                 <w:sz w:val="17"/>
                 <w:szCs w:val="17"/>
               </w:rPr>
-              <w:t xml:space="preserve">In progress</w:t>
+              <w:t xml:space="preserve">Done</w:t>
             </w:r>
           </w:p>
         </w:tc>
@@ -18879,6 +19275,7 @@
               <w:bottom w:val="single" w:color="DCE3E1" w:sz="4"/>
               <w:right w:val="single" w:color="DCE3E1" w:sz="4"/>
             </w:tcBorders>
+            <w:shd w:fill="FBEFD8" w:color="auto" w:val="clear"/>
             <w:tcMar>
               <w:top w:type="dxa" w:w="70"/>
               <w:left w:type="dxa" w:w="110"/>
@@ -18896,7 +19293,7 @@
                 <w:sz w:val="17"/>
                 <w:szCs w:val="17"/>
               </w:rPr>
-              <w:t xml:space="preserve">Planned</w:t>
+              <w:t xml:space="preserve">In progress</w:t>
             </w:r>
           </w:p>
         </w:tc>
@@ -21074,7 +21471,7 @@
                     </pic:cNvPicPr>
                   </pic:nvPicPr>
                   <pic:blipFill>
-                    <a:blip r:embed="rId41" cstate="none"/>
+                    <a:blip r:embed="rId44" cstate="none"/>
                     <a:srcRect/>
                     <a:stretch>
                       <a:fillRect/>
@@ -21181,7 +21578,7 @@
         <w:t xml:space="preserve">Tests that grow with the system.</w:t>
       </w:r>
       <w:r>
-        <w:t xml:space="preserve"> As of Sprint 10: 216 server test methods, 72 screen tests and 90 end-to-end browser steps, all passing.</w:t>
+        <w:t xml:space="preserve"> As of Sprint 11: 233 server test methods, 81 screen tests and 96 end-to-end browser steps, all passing.</w:t>
       </w:r>
     </w:p>
     <w:p>
@@ -23068,7 +23465,7 @@
         <w:sz w:val="16"/>
         <w:szCs w:val="16"/>
       </w:rPr>
-      <w:t xml:space="preserve">Version 1.10 · 20 October 2026</w:t>
+      <w:t xml:space="preserve">Version 1.11 · 23 October 2026</w:t>
     </w:r>
     <w:r>
       <w:rPr>

</xml_diff>

<commit_message>
chore(sprints): accept Sprint 12
The owner accepted Sprint 12 (GST invoices, credit/debit notes, receipts) on
25 Oct 2026. Sprint 12 is marked done in sprints.yml and Sprint 13
(Housekeeping and maintenance) is the current sprint. Sprint guides and
catalogues regenerated, README, CHANGELOG, RUN_AND_TEST and the new-joiner
guide updated, capabilities diagram updated, handbooks 1.12 rebuilt.

Co-Authored-By: Claude Opus 5.5 (1M context) <noreply@anthropic.com>
Claude-Session: https://claude.ai/code/session_01YUGRFpoQRR4EgvNozatgo4
</commit_message>
<xml_diff>
--- a/docs/handbooks/Resort-OS-Product-Overview.docx
+++ b/docs/handbooks/Resort-OS-Product-Overview.docx
@@ -182,7 +182,7 @@
                 <w:sz w:val="19"/>
                 <w:szCs w:val="19"/>
               </w:rPr>
-              <w:t xml:space="preserve">Version 1.11</w:t>
+              <w:t xml:space="preserve">Version 1.12</w:t>
             </w:r>
           </w:p>
         </w:tc>
@@ -252,7 +252,7 @@
                 <w:sz w:val="19"/>
                 <w:szCs w:val="19"/>
               </w:rPr>
-              <w:t xml:space="preserve">23 October 2026</w:t>
+              <w:t xml:space="preserve">25 October 2026</w:t>
             </w:r>
           </w:p>
         </w:tc>
@@ -322,7 +322,7 @@
                 <w:sz w:val="19"/>
                 <w:szCs w:val="19"/>
               </w:rPr>
-              <w:t xml:space="preserve">Sprints 01, 02, 03, 04, 05, 06, 07, 08, 09, 10, 11 accepted · Sprint 12 GST invoices, credit/debit notes, receipts in progress</w:t>
+              <w:t xml:space="preserve">Sprints 01, 02, 03, 04, 05, 06, 07, 08, 09, 10, 11, 12 accepted · Sprint 13 Housekeeping and maintenance (mobile-first) in progress</w:t>
             </w:r>
           </w:p>
         </w:tc>
@@ -661,7 +661,7 @@
                 <w:sz w:val="19"/>
                 <w:szCs w:val="19"/>
               </w:rPr>
-              <w:t xml:space="preserve">1.11</w:t>
+              <w:t xml:space="preserve">1.12</w:t>
             </w:r>
           </w:p>
         </w:tc>
@@ -691,7 +691,7 @@
                 <w:sz w:val="19"/>
                 <w:szCs w:val="19"/>
               </w:rPr>
-              <w:t xml:space="preserve">2026-10-23</w:t>
+              <w:t xml:space="preserve">2026-10-25</w:t>
             </w:r>
           </w:p>
         </w:tc>
@@ -721,7 +721,7 @@
                 <w:sz w:val="19"/>
                 <w:szCs w:val="19"/>
               </w:rPr>
-              <w:t xml:space="preserve">Sprint 11 (Razorpay) accepted: payment links sent from a booking, the guest pays on their phone with UPI or a card through Razorpay with no sign-in, only Razorpay's signed webhook records the payment (once, whatever the order) and confirms a pending booking, declined tries shown with the reason, online refunds back through Razorpay, a built-in test Razorpay when no keys are set. Razorpay flow diagram. Sprint 12 started.</w:t>
+              <w:t xml:space="preserve">Sprint 12 (GST invoices, credit/debit notes, receipts) accepted: check-out issues a legally numbered GST invoice and a receipt for each payment by itself, numbers run with no gap per property and financial year, an issued invoice is never edited (a credit note cancels or reduces it, a debit note bills late charges), B2B invoices with the company's GSTIN checked under the field, place of supply is the resort's state, A4 PDFs to download or print. Invoice flow diagram. Sprint 13 started.</w:t>
             </w:r>
           </w:p>
         </w:tc>
@@ -757,7 +757,7 @@
                 <w:sz w:val="19"/>
                 <w:szCs w:val="19"/>
               </w:rPr>
-              <w:t xml:space="preserve">1.10</w:t>
+              <w:t xml:space="preserve">1.11</w:t>
             </w:r>
           </w:p>
         </w:tc>
@@ -788,7 +788,7 @@
                 <w:sz w:val="19"/>
                 <w:szCs w:val="19"/>
               </w:rPr>
-              <w:t xml:space="preserve">2026-10-20</w:t>
+              <w:t xml:space="preserve">2026-10-23</w:t>
             </w:r>
           </w:p>
         </w:tc>
@@ -819,7 +819,7 @@
                 <w:sz w:val="19"/>
                 <w:szCs w:val="19"/>
               </w:rPr>
-              <w:t xml:space="preserve">Sprint 10 (Payments, refunds, cash drawer) accepted: cash, UPI, card and bank payments on the bill or on account, refunds with a reason that can never exceed the payment, voids, the cash drawer opened and closed against a count with manager approval of a shortfall, no card data stored, real balances at check-out. Payment flow diagram. Sprint 11 (Razorpay) started.</w:t>
+              <w:t xml:space="preserve">Sprint 11 (Razorpay) accepted: payment links sent from a booking, the guest pays on their phone with UPI or a card through Razorpay with no sign-in, only Razorpay's signed webhook records the payment (once, whatever the order) and confirms a pending booking, declined tries shown with the reason, online refunds back through Razorpay, a built-in test Razorpay when no keys are set. Razorpay flow diagram. Sprint 12 started.</w:t>
             </w:r>
           </w:p>
         </w:tc>
@@ -854,7 +854,7 @@
                 <w:sz w:val="19"/>
                 <w:szCs w:val="19"/>
               </w:rPr>
-              <w:t xml:space="preserve">1.9</w:t>
+              <w:t xml:space="preserve">1.10</w:t>
             </w:r>
           </w:p>
         </w:tc>
@@ -914,7 +914,7 @@
                 <w:sz w:val="19"/>
                 <w:szCs w:val="19"/>
               </w:rPr>
-              <w:t xml:space="preserve">Sprint 09 (GST configuration and tax engine) accepted: GST worked out on every charge (CGST + SGST or IGST), rates kept as rules with dates that an accountant changes from next month without a software update, room GST by the price per room per night, posted charges keep their GST. Tax flow diagram. Sprint 10 (Payments, refunds, cash drawer) started.</w:t>
+              <w:t xml:space="preserve">Sprint 10 (Payments, refunds, cash drawer) accepted: cash, UPI, card and bank payments on the bill or on account, refunds with a reason that can never exceed the payment, voids, the cash drawer opened and closed against a count with manager approval of a shortfall, no card data stored, real balances at check-out. Payment flow diagram. Sprint 11 (Razorpay) started.</w:t>
             </w:r>
           </w:p>
         </w:tc>
@@ -950,7 +950,7 @@
                 <w:sz w:val="19"/>
                 <w:szCs w:val="19"/>
               </w:rPr>
-              <w:t xml:space="preserve">1.8</w:t>
+              <w:t xml:space="preserve">1.9</w:t>
             </w:r>
           </w:p>
         </w:tc>
@@ -981,7 +981,7 @@
                 <w:sz w:val="19"/>
                 <w:szCs w:val="19"/>
               </w:rPr>
-              <w:t xml:space="preserve">2026-10-18</w:t>
+              <w:t xml:space="preserve">2026-10-20</w:t>
             </w:r>
           </w:p>
         </w:tc>
@@ -1012,7 +1012,7 @@
                 <w:sz w:val="19"/>
                 <w:szCs w:val="19"/>
               </w:rPr>
-              <w:t xml:space="preserve">Sprint 08 (Folio) accepted: a running bill for every stay with room nights, meals, transport, activities and packages; nothing can be edited or deleted, a manager reverses a line with a reason; bills can be split; the front desk shows the real balance. Folio flow diagram. Sprint 09 (GST configuration and tax engine) started.</w:t>
+              <w:t xml:space="preserve">Sprint 09 (GST configuration and tax engine) accepted: GST worked out on every charge (CGST + SGST or IGST), rates kept as rules with dates that an accountant changes from next month without a software update, room GST by the price per room per night, posted charges keep their GST. Tax flow diagram. Sprint 10 (Payments, refunds, cash drawer) started.</w:t>
             </w:r>
           </w:p>
         </w:tc>
@@ -1047,7 +1047,7 @@
                 <w:sz w:val="19"/>
                 <w:szCs w:val="19"/>
               </w:rPr>
-              <w:t xml:space="preserve">1.7</w:t>
+              <w:t xml:space="preserve">1.8</w:t>
             </w:r>
           </w:p>
         </w:tc>
@@ -1107,7 +1107,7 @@
                 <w:sz w:val="19"/>
                 <w:szCs w:val="19"/>
               </w:rPr>
-              <w:t xml:space="preserve">Sprint 07 (Front desk) accepted: arrivals, departures and in-house lists, check-in and check-out in a few clicks, walk-ins on one screen, early departures with a reason, rooms marked dirty and ready. Check-in flow diagram. Sprint 08 (Folio) started.</w:t>
+              <w:t xml:space="preserve">Sprint 08 (Folio) accepted: a running bill for every stay with room nights, meals, transport, activities and packages; nothing can be edited or deleted, a manager reverses a line with a reason; bills can be split; the front desk shows the real balance. Folio flow diagram. Sprint 09 (GST configuration and tax engine) started.</w:t>
             </w:r>
           </w:p>
         </w:tc>
@@ -1143,7 +1143,7 @@
                 <w:sz w:val="19"/>
                 <w:szCs w:val="19"/>
               </w:rPr>
-              <w:t xml:space="preserve">1.6</w:t>
+              <w:t xml:space="preserve">1.7</w:t>
             </w:r>
           </w:p>
         </w:tc>
@@ -1174,7 +1174,7 @@
                 <w:sz w:val="19"/>
                 <w:szCs w:val="19"/>
               </w:rPr>
-              <w:t xml:space="preserve">2026-10-17</w:t>
+              <w:t xml:space="preserve">2026-10-18</w:t>
             </w:r>
           </w:p>
         </w:tc>
@@ -1205,7 +1205,7 @@
                 <w:sz w:val="19"/>
                 <w:szCs w:val="19"/>
               </w:rPr>
-              <w:t xml:space="preserve">Sprint 06 (Reservation calendar) accepted: day, week and month calendar of rooms and dorm beds, moving a guest by drag-and-drop with a reason, list by day on phones. Room-move flow diagram. Sprint 07 (Front desk) started.</w:t>
+              <w:t xml:space="preserve">Sprint 07 (Front desk) accepted: arrivals, departures and in-house lists, check-in and check-out in a few clicks, walk-ins on one screen, early departures with a reason, rooms marked dirty and ready. Check-in flow diagram. Sprint 08 (Folio) started.</w:t>
             </w:r>
           </w:p>
         </w:tc>
@@ -1240,7 +1240,7 @@
                 <w:sz w:val="19"/>
                 <w:szCs w:val="19"/>
               </w:rPr>
-              <w:t xml:space="preserve">1.5</w:t>
+              <w:t xml:space="preserve">1.6</w:t>
             </w:r>
           </w:p>
         </w:tc>
@@ -1270,7 +1270,7 @@
                 <w:sz w:val="19"/>
                 <w:szCs w:val="19"/>
               </w:rPr>
-              <w:t xml:space="preserve">2026-10-15</w:t>
+              <w:t xml:space="preserve">2026-10-17</w:t>
             </w:r>
           </w:p>
         </w:tc>
@@ -1300,7 +1300,7 @@
                 <w:sz w:val="19"/>
                 <w:szCs w:val="19"/>
               </w:rPr>
-              <w:t xml:space="preserve">Sprint 05 (Availability engine and reservations) accepted: race-free booking, booking wizard, booking history, date pickers. Diagrams of the reservation tables and the booking flow. Sprint 06 (Reservation calendar) started.</w:t>
+              <w:t xml:space="preserve">Sprint 06 (Reservation calendar) accepted: day, week and month calendar of rooms and dorm beds, moving a guest by drag-and-drop with a reason, list by day on phones. Room-move flow diagram. Sprint 07 (Front desk) started.</w:t>
             </w:r>
           </w:p>
         </w:tc>
@@ -1336,7 +1336,7 @@
                 <w:sz w:val="19"/>
                 <w:szCs w:val="19"/>
               </w:rPr>
-              <w:t xml:space="preserve">1.4</w:t>
+              <w:t xml:space="preserve">1.5</w:t>
             </w:r>
           </w:p>
         </w:tc>
@@ -1367,7 +1367,7 @@
                 <w:sz w:val="19"/>
                 <w:szCs w:val="19"/>
               </w:rPr>
-              <w:t xml:space="preserve">2026-10-14</w:t>
+              <w:t xml:space="preserve">2026-10-15</w:t>
             </w:r>
           </w:p>
         </w:tc>
@@ -1398,7 +1398,7 @@
                 <w:sz w:val="19"/>
                 <w:szCs w:val="19"/>
               </w:rPr>
-              <w:t xml:space="preserve">Sprint 04 (Rate plans and packages) accepted: nightly price grid, quotes, packages with revenue split. Sprint 05 (Availability engine and reservations) started.</w:t>
+              <w:t xml:space="preserve">Sprint 05 (Availability engine and reservations) accepted: race-free booking, booking wizard, booking history, date pickers. Diagrams of the reservation tables and the booking flow. Sprint 06 (Reservation calendar) started.</w:t>
             </w:r>
           </w:p>
         </w:tc>
@@ -1433,7 +1433,7 @@
                 <w:sz w:val="19"/>
                 <w:szCs w:val="19"/>
               </w:rPr>
-              <w:t xml:space="preserve">1.3</w:t>
+              <w:t xml:space="preserve">1.4</w:t>
             </w:r>
           </w:p>
         </w:tc>
@@ -1463,7 +1463,7 @@
                 <w:sz w:val="19"/>
                 <w:szCs w:val="19"/>
               </w:rPr>
-              <w:t xml:space="preserve">2026-10-11</w:t>
+              <w:t xml:space="preserve">2026-10-14</w:t>
             </w:r>
           </w:p>
         </w:tc>
@@ -1493,7 +1493,7 @@
                 <w:sz w:val="19"/>
                 <w:szCs w:val="19"/>
               </w:rPr>
-              <w:t xml:space="preserve">Sprint 03 (Guests) accepted, with review fixes: Aadhaar number check and error messages that say why. Sprint 04 (Rate plans and packages) started.</w:t>
+              <w:t xml:space="preserve">Sprint 04 (Rate plans and packages) accepted: nightly price grid, quotes, packages with revenue split. Sprint 05 (Availability engine and reservations) started.</w:t>
             </w:r>
           </w:p>
         </w:tc>
@@ -1529,7 +1529,7 @@
                 <w:sz w:val="19"/>
                 <w:szCs w:val="19"/>
               </w:rPr>
-              <w:t xml:space="preserve">1.2.1</w:t>
+              <w:t xml:space="preserve">1.3</w:t>
             </w:r>
           </w:p>
         </w:tc>
@@ -1560,7 +1560,7 @@
                 <w:sz w:val="19"/>
                 <w:szCs w:val="19"/>
               </w:rPr>
-              <w:t xml:space="preserve">2026-10-10</w:t>
+              <w:t xml:space="preserve">2026-10-11</w:t>
             </w:r>
           </w:p>
         </w:tc>
@@ -1591,7 +1591,7 @@
                 <w:sz w:val="19"/>
                 <w:szCs w:val="19"/>
               </w:rPr>
-              <w:t xml:space="preserve">Sprint 03 (Guests) built and in review: guest profiles, encrypted ID documents, duplicates, merge, anonymise, consent.</w:t>
+              <w:t xml:space="preserve">Sprint 03 (Guests) accepted, with review fixes: Aadhaar number check and error messages that say why. Sprint 04 (Rate plans and packages) started.</w:t>
             </w:r>
           </w:p>
         </w:tc>
@@ -1626,6 +1626,102 @@
                 <w:sz w:val="19"/>
                 <w:szCs w:val="19"/>
               </w:rPr>
+              <w:t xml:space="preserve">1.2.1</w:t>
+            </w:r>
+          </w:p>
+        </w:tc>
+        <w:tc>
+          <w:tcPr>
+            <w:tcW w:type="dxa" w:w="1500"/>
+            <w:tcBorders>
+              <w:top w:val="single" w:color="DCE3E1" w:sz="4"/>
+              <w:left w:val="single" w:color="DCE3E1" w:sz="4"/>
+              <w:bottom w:val="single" w:color="DCE3E1" w:sz="4"/>
+              <w:right w:val="single" w:color="DCE3E1" w:sz="4"/>
+            </w:tcBorders>
+            <w:tcMar>
+              <w:top w:type="dxa" w:w="70"/>
+              <w:left w:type="dxa" w:w="110"/>
+              <w:bottom w:type="dxa" w:w="50"/>
+              <w:right w:type="dxa" w:w="110"/>
+            </w:tcMar>
+            <w:vAlign w:val="top"/>
+          </w:tcPr>
+          <w:p>
+            <w:pPr>
+              <w:spacing w:after="40" w:line="252" w:lineRule="auto"/>
+            </w:pPr>
+            <w:r>
+              <w:rPr>
+                <w:sz w:val="19"/>
+                <w:szCs w:val="19"/>
+              </w:rPr>
+              <w:t xml:space="preserve">2026-10-10</w:t>
+            </w:r>
+          </w:p>
+        </w:tc>
+        <w:tc>
+          <w:tcPr>
+            <w:tcW w:type="dxa" w:w="6714"/>
+            <w:tcBorders>
+              <w:top w:val="single" w:color="DCE3E1" w:sz="4"/>
+              <w:left w:val="single" w:color="DCE3E1" w:sz="4"/>
+              <w:bottom w:val="single" w:color="DCE3E1" w:sz="4"/>
+              <w:right w:val="single" w:color="DCE3E1" w:sz="4"/>
+            </w:tcBorders>
+            <w:tcMar>
+              <w:top w:type="dxa" w:w="70"/>
+              <w:left w:type="dxa" w:w="110"/>
+              <w:bottom w:type="dxa" w:w="50"/>
+              <w:right w:type="dxa" w:w="110"/>
+            </w:tcMar>
+            <w:vAlign w:val="top"/>
+          </w:tcPr>
+          <w:p>
+            <w:pPr>
+              <w:spacing w:after="40" w:line="252" w:lineRule="auto"/>
+            </w:pPr>
+            <w:r>
+              <w:rPr>
+                <w:sz w:val="19"/>
+                <w:szCs w:val="19"/>
+              </w:rPr>
+              <w:t xml:space="preserve">Sprint 03 (Guests) built and in review: guest profiles, encrypted ID documents, duplicates, merge, anonymise, consent.</w:t>
+            </w:r>
+          </w:p>
+        </w:tc>
+      </w:tr>
+      <w:tr>
+        <w:trPr>
+          <w:cantSplit/>
+        </w:trPr>
+        <w:tc>
+          <w:tcPr>
+            <w:tcW w:type="dxa" w:w="1100"/>
+            <w:tcBorders>
+              <w:top w:val="single" w:color="DCE3E1" w:sz="4"/>
+              <w:left w:val="single" w:color="DCE3E1" w:sz="4"/>
+              <w:bottom w:val="single" w:color="DCE3E1" w:sz="4"/>
+              <w:right w:val="single" w:color="DCE3E1" w:sz="4"/>
+            </w:tcBorders>
+            <w:shd w:fill="F5F7F6" w:color="auto" w:val="clear"/>
+            <w:tcMar>
+              <w:top w:type="dxa" w:w="70"/>
+              <w:left w:type="dxa" w:w="110"/>
+              <w:bottom w:type="dxa" w:w="50"/>
+              <w:right w:type="dxa" w:w="110"/>
+            </w:tcMar>
+            <w:vAlign w:val="top"/>
+          </w:tcPr>
+          <w:p>
+            <w:pPr>
+              <w:spacing w:after="40" w:line="252" w:lineRule="auto"/>
+            </w:pPr>
+            <w:r>
+              <w:rPr>
+                <w:sz w:val="19"/>
+                <w:szCs w:val="19"/>
+              </w:rPr>
               <w:t xml:space="preserve">1.2</w:t>
             </w:r>
           </w:p>
@@ -1639,6 +1735,7 @@
               <w:bottom w:val="single" w:color="DCE3E1" w:sz="4"/>
               <w:right w:val="single" w:color="DCE3E1" w:sz="4"/>
             </w:tcBorders>
+            <w:shd w:fill="F5F7F6" w:color="auto" w:val="clear"/>
             <w:tcMar>
               <w:top w:type="dxa" w:w="70"/>
               <w:left w:type="dxa" w:w="110"/>
@@ -1669,6 +1766,7 @@
               <w:bottom w:val="single" w:color="DCE3E1" w:sz="4"/>
               <w:right w:val="single" w:color="DCE3E1" w:sz="4"/>
             </w:tcBorders>
+            <w:shd w:fill="F5F7F6" w:color="auto" w:val="clear"/>
             <w:tcMar>
               <w:top w:type="dxa" w:w="70"/>
               <w:left w:type="dxa" w:w="110"/>
@@ -1919,7 +2017,7 @@
                 <w:sz w:val="19"/>
                 <w:szCs w:val="19"/>
               </w:rPr>
-              <w:t xml:space="preserve">Living document, rebuilt at the end of every sprint. This edition reflects Sprint 11 accepted and Sprint 12 in progress.</w:t>
+              <w:t xml:space="preserve">Living document, rebuilt at the end of every sprint. This edition reflects Sprint 12 accepted and Sprint 13 in progress.</w:t>
             </w:r>
           </w:p>
         </w:tc>
@@ -2877,7 +2975,33 @@
           <w:sz w:val="19"/>
           <w:szCs w:val="19"/>
         </w:rPr>
-        <w:t xml:space="preserve">In progress: Sprint 12 — GST invoices, credit/debit notes, receipts</w:t>
+        <w:t xml:space="preserve">Sprint 12 — GST invoices, credit/debit notes, receipts</w:t>
+      </w:r>
+    </w:p>
+    <w:p>
+      <w:pPr>
+        <w:spacing w:after="30" w:before="0"/>
+        <w:ind w:left="420"/>
+      </w:pPr>
+      <w:r>
+        <w:rPr>
+          <w:b w:val="false"/>
+          <w:bCs w:val="false"/>
+          <w:color w:val="8A2449"/>
+          <w:sz w:val="19"/>
+          <w:szCs w:val="19"/>
+        </w:rPr>
+        <w:t xml:space="preserve">9.13  </w:t>
+      </w:r>
+      <w:r>
+        <w:rPr>
+          <w:b w:val="false"/>
+          <w:bCs w:val="false"/>
+          <w:color w:val="1B2A2E"/>
+          <w:sz w:val="19"/>
+          <w:szCs w:val="19"/>
+        </w:rPr>
+        <w:t xml:space="preserve">In progress: Sprint 13 — Housekeeping and maintenance (mobile-first)</w:t>
       </w:r>
     </w:p>
     <w:p>
@@ -3200,7 +3324,7 @@
                 <w:sz w:val="40"/>
                 <w:szCs w:val="40"/>
               </w:rPr>
-              <w:t xml:space="preserve">11 of 29</w:t>
+              <w:t xml:space="preserve">12 of 29</w:t>
             </w:r>
           </w:p>
           <w:p>
@@ -3565,7 +3689,7 @@
                 <w:sz w:val="19"/>
                 <w:szCs w:val="19"/>
               </w:rPr>
-              <w:t xml:space="preserve">Sprints 01 and 02 and 03 and 04 and 05 and 06 and 07 and 08 and 09 and 10 and 11 are delivered and accepted. Sprint 12 (GST invoices, credit/debit notes, receipts) is in progress.</w:t>
+              <w:t xml:space="preserve">Sprints 01 and 02 and 03 and 04 and 05 and 06 and 07 and 08 and 09 and 10 and 11 and 12 are delivered and accepted. Sprint 13 (Housekeeping and maintenance (mobile-first)) is in progress.</w:t>
             </w:r>
           </w:p>
         </w:tc>
@@ -6157,25 +6281,25 @@
               <w:bottom w:val="single" w:color="DCE3E1" w:sz="4"/>
               <w:right w:val="single" w:color="DCE3E1" w:sz="4"/>
             </w:tcBorders>
-            <w:shd w:fill="FBEFD8" w:color="auto" w:val="clear"/>
-            <w:tcMar>
-              <w:top w:type="dxa" w:w="70"/>
-              <w:left w:type="dxa" w:w="110"/>
-              <w:bottom w:type="dxa" w:w="50"/>
-              <w:right w:type="dxa" w:w="110"/>
-            </w:tcMar>
-            <w:vAlign w:val="top"/>
-          </w:tcPr>
-          <w:p>
-            <w:pPr>
-              <w:spacing w:after="40" w:line="252" w:lineRule="auto"/>
-            </w:pPr>
-            <w:r>
-              <w:rPr>
-                <w:sz w:val="19"/>
-                <w:szCs w:val="19"/>
-              </w:rPr>
-              <w:t xml:space="preserve">In progress</w:t>
+            <w:shd w:fill="E3F0E6" w:color="auto" w:val="clear"/>
+            <w:tcMar>
+              <w:top w:type="dxa" w:w="70"/>
+              <w:left w:type="dxa" w:w="110"/>
+              <w:bottom w:type="dxa" w:w="50"/>
+              <w:right w:type="dxa" w:w="110"/>
+            </w:tcMar>
+            <w:vAlign w:val="top"/>
+          </w:tcPr>
+          <w:p>
+            <w:pPr>
+              <w:spacing w:after="40" w:line="252" w:lineRule="auto"/>
+            </w:pPr>
+            <w:r>
+              <w:rPr>
+                <w:sz w:val="19"/>
+                <w:szCs w:val="19"/>
+              </w:rPr>
+              <w:t xml:space="preserve">Done</w:t>
             </w:r>
           </w:p>
         </w:tc>
@@ -6393,24 +6517,25 @@
               <w:bottom w:val="single" w:color="DCE3E1" w:sz="4"/>
               <w:right w:val="single" w:color="DCE3E1" w:sz="4"/>
             </w:tcBorders>
-            <w:tcMar>
-              <w:top w:type="dxa" w:w="70"/>
-              <w:left w:type="dxa" w:w="110"/>
-              <w:bottom w:type="dxa" w:w="50"/>
-              <w:right w:type="dxa" w:w="110"/>
-            </w:tcMar>
-            <w:vAlign w:val="top"/>
-          </w:tcPr>
-          <w:p>
-            <w:pPr>
-              <w:spacing w:after="40" w:line="252" w:lineRule="auto"/>
-            </w:pPr>
-            <w:r>
-              <w:rPr>
-                <w:sz w:val="19"/>
-                <w:szCs w:val="19"/>
-              </w:rPr>
-              <w:t xml:space="preserve">Planned</w:t>
+            <w:shd w:fill="FBEFD8" w:color="auto" w:val="clear"/>
+            <w:tcMar>
+              <w:top w:type="dxa" w:w="70"/>
+              <w:left w:type="dxa" w:w="110"/>
+              <w:bottom w:type="dxa" w:w="50"/>
+              <w:right w:type="dxa" w:w="110"/>
+            </w:tcMar>
+            <w:vAlign w:val="top"/>
+          </w:tcPr>
+          <w:p>
+            <w:pPr>
+              <w:spacing w:after="40" w:line="252" w:lineRule="auto"/>
+            </w:pPr>
+            <w:r>
+              <w:rPr>
+                <w:sz w:val="19"/>
+                <w:szCs w:val="19"/>
+              </w:rPr>
+              <w:t xml:space="preserve">In progress</w:t>
             </w:r>
           </w:p>
         </w:tc>
@@ -12932,7 +13057,7 @@
     </w:p>
     <w:p>
       <w:r>
-        <w:t xml:space="preserve">Work is delivered in short sprints, and each one ends with the owner trying the new screens and accepting them. These are the parts that are built, tested and accepted as of Sprint 11.</w:t>
+        <w:t xml:space="preserve">Work is delivered in short sprints, and each one ends with the owner trying the new screens and accepting them. These are the parts that are built, tested and accepted as of Sprint 12.</w:t>
       </w:r>
     </w:p>
     <w:p>
@@ -15915,12 +16040,273 @@
         <w:pStyle w:val="Heading2"/>
       </w:pPr>
       <w:r>
-        <w:t xml:space="preserve">9.12   In progress: Sprint 12 — GST invoices, credit/debit notes, receipts</w:t>
+        <w:t xml:space="preserve">9.12   Sprint 12 — GST invoices, credit/debit notes, receipts</w:t>
       </w:r>
     </w:p>
     <w:p>
       <w:r>
         <w:t xml:space="preserve">Legally numbered GST invoices are produced from the bill; corrections are made only through credit and debit notes.</w:t>
+      </w:r>
+    </w:p>
+    <w:p>
+      <w:pPr>
+        <w:pStyle w:val="ListParagraph"/>
+        <w:numPr>
+          <w:ilvl w:val="0"/>
+          <w:numId w:val="2"/>
+        </w:numPr>
+        <w:spacing w:after="60"/>
+      </w:pPr>
+      <w:r>
+        <w:t xml:space="preserve">Checking a guest out issues the GST invoice and a receipt for each payment by itself</w:t>
+      </w:r>
+    </w:p>
+    <w:p>
+      <w:pPr>
+        <w:pStyle w:val="ListParagraph"/>
+        <w:numPr>
+          <w:ilvl w:val="0"/>
+          <w:numId w:val="2"/>
+        </w:numPr>
+        <w:spacing w:after="60"/>
+      </w:pPr>
+      <w:r>
+        <w:t xml:space="preserve">Invoice numbers run without gaps for each financial year, even when several are issued at the same moment</w:t>
+      </w:r>
+    </w:p>
+    <w:p>
+      <w:pPr>
+        <w:pStyle w:val="ListParagraph"/>
+        <w:numPr>
+          <w:ilvl w:val="0"/>
+          <w:numId w:val="2"/>
+        </w:numPr>
+        <w:spacing w:after="60"/>
+      </w:pPr>
+      <w:r>
+        <w:t xml:space="preserve">Company guests get a B2B invoice with their GSTIN; a typing mistake in a GSTIN is caught before anything is issued</w:t>
+      </w:r>
+    </w:p>
+    <w:p>
+      <w:pPr>
+        <w:pStyle w:val="ListParagraph"/>
+        <w:numPr>
+          <w:ilvl w:val="0"/>
+          <w:numId w:val="2"/>
+        </w:numPr>
+        <w:spacing w:after="60"/>
+      </w:pPr>
+      <w:r>
+        <w:t xml:space="preserve">An invoice is never edited: a credit note takes something off or cancels it, and a debit note bills a late charge</w:t>
+      </w:r>
+    </w:p>
+    <w:p>
+      <w:pPr>
+        <w:pStyle w:val="ListParagraph"/>
+        <w:numPr>
+          <w:ilvl w:val="0"/>
+          <w:numId w:val="2"/>
+        </w:numPr>
+        <w:spacing w:after="60"/>
+      </w:pPr>
+      <w:r>
+        <w:t xml:space="preserve">Invoices, credit notes, debit notes and receipts download as PDFs ready to print or send</w:t>
+      </w:r>
+    </w:p>
+    <w:p>
+      <w:pPr>
+        <w:keepNext/>
+        <w:pBdr>
+          <w:top w:val="single" w:color="DCE3E1" w:sz="4"/>
+          <w:bottom w:val="single" w:color="DCE3E1" w:sz="4"/>
+          <w:left w:val="single" w:color="DCE3E1" w:sz="4"/>
+          <w:right w:val="single" w:color="DCE3E1" w:sz="4"/>
+        </w:pBdr>
+        <w:spacing w:before="120" w:after="0" w:line="240" w:lineRule="auto"/>
+        <w:jc w:val="center"/>
+      </w:pPr>
+      <w:r>
+        <w:drawing>
+          <wp:inline distT="0" distB="0" distL="0" distR="0">
+            <wp:extent cx="5124450" cy="3438525"/>
+            <wp:effectExtent t="0" r="0" b="0" l="0"/>
+            <wp:docPr id="1" name="The GST invoice issued at check-out" descr="The GST invoice issued at check-out" title="The GST invoice issued at check-out"/>
+            <wp:cNvGraphicFramePr>
+              <a:graphicFrameLocks xmlns:a="http://schemas.openxmlformats.org/drawingml/2006/main" noChangeAspect="1"/>
+            </wp:cNvGraphicFramePr>
+            <a:graphic xmlns:a="http://schemas.openxmlformats.org/drawingml/2006/main">
+              <a:graphicData uri="http://schemas.openxmlformats.org/drawingml/2006/picture">
+                <pic:pic xmlns:pic="http://schemas.openxmlformats.org/drawingml/2006/picture">
+                  <pic:nvPicPr>
+                    <pic:cNvPr id="0" name="" descr=""/>
+                    <pic:cNvPicPr>
+                      <a:picLocks noChangeAspect="1" noChangeArrowheads="1"/>
+                    </pic:cNvPicPr>
+                  </pic:nvPicPr>
+                  <pic:blipFill>
+                    <a:blip r:embed="rId44" cstate="none"/>
+                    <a:srcRect/>
+                    <a:stretch>
+                      <a:fillRect/>
+                    </a:stretch>
+                  </pic:blipFill>
+                  <pic:spPr bwMode="auto">
+                    <a:xfrm>
+                      <a:off x="0" y="0"/>
+                      <a:ext cx="5124450" cy="3438525"/>
+                    </a:xfrm>
+                    <a:prstGeom prst="rect">
+                      <a:avLst/>
+                    </a:prstGeom>
+                  </pic:spPr>
+                </pic:pic>
+              </a:graphicData>
+            </a:graphic>
+          </wp:inline>
+        </w:drawing>
+      </w:r>
+    </w:p>
+    <w:p>
+      <w:pPr>
+        <w:pStyle w:val="Caption"/>
+      </w:pPr>
+      <w:r>
+        <w:t xml:space="preserve">The GST invoice issued at check-out</w:t>
+      </w:r>
+    </w:p>
+    <w:p>
+      <w:pPr>
+        <w:keepNext/>
+        <w:pBdr>
+          <w:top w:val="single" w:color="DCE3E1" w:sz="4"/>
+          <w:bottom w:val="single" w:color="DCE3E1" w:sz="4"/>
+          <w:left w:val="single" w:color="DCE3E1" w:sz="4"/>
+          <w:right w:val="single" w:color="DCE3E1" w:sz="4"/>
+        </w:pBdr>
+        <w:spacing w:before="120" w:after="0" w:line="240" w:lineRule="auto"/>
+        <w:jc w:val="center"/>
+      </w:pPr>
+      <w:r>
+        <w:drawing>
+          <wp:inline distT="0" distB="0" distL="0" distR="0">
+            <wp:extent cx="5124450" cy="3438525"/>
+            <wp:effectExtent t="0" r="0" b="0" l="0"/>
+            <wp:docPr id="1" name="On the bill, each charge shows its invoice" descr="On the bill, each charge shows its invoice" title="On the bill, each charge shows its invoice"/>
+            <wp:cNvGraphicFramePr>
+              <a:graphicFrameLocks xmlns:a="http://schemas.openxmlformats.org/drawingml/2006/main" noChangeAspect="1"/>
+            </wp:cNvGraphicFramePr>
+            <a:graphic xmlns:a="http://schemas.openxmlformats.org/drawingml/2006/main">
+              <a:graphicData uri="http://schemas.openxmlformats.org/drawingml/2006/picture">
+                <pic:pic xmlns:pic="http://schemas.openxmlformats.org/drawingml/2006/picture">
+                  <pic:nvPicPr>
+                    <pic:cNvPr id="0" name="" descr=""/>
+                    <pic:cNvPicPr>
+                      <a:picLocks noChangeAspect="1" noChangeArrowheads="1"/>
+                    </pic:cNvPicPr>
+                  </pic:nvPicPr>
+                  <pic:blipFill>
+                    <a:blip r:embed="rId45" cstate="none"/>
+                    <a:srcRect/>
+                    <a:stretch>
+                      <a:fillRect/>
+                    </a:stretch>
+                  </pic:blipFill>
+                  <pic:spPr bwMode="auto">
+                    <a:xfrm>
+                      <a:off x="0" y="0"/>
+                      <a:ext cx="5124450" cy="3438525"/>
+                    </a:xfrm>
+                    <a:prstGeom prst="rect">
+                      <a:avLst/>
+                    </a:prstGeom>
+                  </pic:spPr>
+                </pic:pic>
+              </a:graphicData>
+            </a:graphic>
+          </wp:inline>
+        </w:drawing>
+      </w:r>
+    </w:p>
+    <w:p>
+      <w:pPr>
+        <w:pStyle w:val="Caption"/>
+      </w:pPr>
+      <w:r>
+        <w:t xml:space="preserve">On the bill, each charge shows its invoice</w:t>
+      </w:r>
+    </w:p>
+    <w:p>
+      <w:pPr>
+        <w:keepNext/>
+        <w:pBdr>
+          <w:top w:val="single" w:color="DCE3E1" w:sz="4"/>
+          <w:bottom w:val="single" w:color="DCE3E1" w:sz="4"/>
+          <w:left w:val="single" w:color="DCE3E1" w:sz="4"/>
+          <w:right w:val="single" w:color="DCE3E1" w:sz="4"/>
+        </w:pBdr>
+        <w:spacing w:before="120" w:after="0" w:line="240" w:lineRule="auto"/>
+        <w:jc w:val="center"/>
+      </w:pPr>
+      <w:r>
+        <w:drawing>
+          <wp:inline distT="0" distB="0" distL="0" distR="0">
+            <wp:extent cx="5124450" cy="3438525"/>
+            <wp:effectExtent t="0" r="0" b="0" l="0"/>
+            <wp:docPr id="1" name="A credit note for part of a line" descr="A credit note for part of a line" title="A credit note for part of a line"/>
+            <wp:cNvGraphicFramePr>
+              <a:graphicFrameLocks xmlns:a="http://schemas.openxmlformats.org/drawingml/2006/main" noChangeAspect="1"/>
+            </wp:cNvGraphicFramePr>
+            <a:graphic xmlns:a="http://schemas.openxmlformats.org/drawingml/2006/main">
+              <a:graphicData uri="http://schemas.openxmlformats.org/drawingml/2006/picture">
+                <pic:pic xmlns:pic="http://schemas.openxmlformats.org/drawingml/2006/picture">
+                  <pic:nvPicPr>
+                    <pic:cNvPr id="0" name="" descr=""/>
+                    <pic:cNvPicPr>
+                      <a:picLocks noChangeAspect="1" noChangeArrowheads="1"/>
+                    </pic:cNvPicPr>
+                  </pic:nvPicPr>
+                  <pic:blipFill>
+                    <a:blip r:embed="rId46" cstate="none"/>
+                    <a:srcRect/>
+                    <a:stretch>
+                      <a:fillRect/>
+                    </a:stretch>
+                  </pic:blipFill>
+                  <pic:spPr bwMode="auto">
+                    <a:xfrm>
+                      <a:off x="0" y="0"/>
+                      <a:ext cx="5124450" cy="3438525"/>
+                    </a:xfrm>
+                    <a:prstGeom prst="rect">
+                      <a:avLst/>
+                    </a:prstGeom>
+                  </pic:spPr>
+                </pic:pic>
+              </a:graphicData>
+            </a:graphic>
+          </wp:inline>
+        </w:drawing>
+      </w:r>
+    </w:p>
+    <w:p>
+      <w:pPr>
+        <w:pStyle w:val="Caption"/>
+      </w:pPr>
+      <w:r>
+        <w:t xml:space="preserve">A credit note for part of a line</w:t>
+      </w:r>
+    </w:p>
+    <w:p>
+      <w:pPr>
+        <w:pStyle w:val="Heading2"/>
+      </w:pPr>
+      <w:r>
+        <w:t xml:space="preserve">9.13   In progress: Sprint 13 — Housekeeping and maintenance (mobile-first)</w:t>
+      </w:r>
+    </w:p>
+    <w:p>
+      <w:r>
+        <w:t xml:space="preserve">Housekeeping and maintenance staff see their tasks on their phones, update room status, and report repairs with photos.</w:t>
       </w:r>
     </w:p>
     <w:p>
@@ -15933,7 +16319,7 @@
           <w:sz w:val="18"/>
           <w:szCs w:val="18"/>
         </w:rPr>
-        <w:t xml:space="preserve">It will be accepted when: Checkout produces a GST invoice and receipt PDF.</w:t>
+        <w:t xml:space="preserve">It will be accepted when: Housekeeper finishes a room in 2 taps; supervisor marks READY.</w:t>
       </w:r>
     </w:p>
     <w:p>
@@ -16592,25 +16978,25 @@
               <w:bottom w:val="single" w:color="DCE3E1" w:sz="4"/>
               <w:right w:val="single" w:color="DCE3E1" w:sz="4"/>
             </w:tcBorders>
-            <w:shd w:fill="FBEFD8" w:color="auto" w:val="clear"/>
-            <w:tcMar>
-              <w:top w:type="dxa" w:w="70"/>
-              <w:left w:type="dxa" w:w="110"/>
-              <w:bottom w:type="dxa" w:w="50"/>
-              <w:right w:type="dxa" w:w="110"/>
-            </w:tcMar>
-            <w:vAlign w:val="top"/>
-          </w:tcPr>
-          <w:p>
-            <w:pPr>
-              <w:spacing w:after="40" w:line="252" w:lineRule="auto"/>
-            </w:pPr>
-            <w:r>
-              <w:rPr>
-                <w:sz w:val="19"/>
-                <w:szCs w:val="19"/>
-              </w:rPr>
-              <w:t xml:space="preserve">In progress</w:t>
+            <w:shd w:fill="E3F0E6" w:color="auto" w:val="clear"/>
+            <w:tcMar>
+              <w:top w:type="dxa" w:w="70"/>
+              <w:left w:type="dxa" w:w="110"/>
+              <w:bottom w:type="dxa" w:w="50"/>
+              <w:right w:type="dxa" w:w="110"/>
+            </w:tcMar>
+            <w:vAlign w:val="top"/>
+          </w:tcPr>
+          <w:p>
+            <w:pPr>
+              <w:spacing w:after="40" w:line="252" w:lineRule="auto"/>
+            </w:pPr>
+            <w:r>
+              <w:rPr>
+                <w:sz w:val="19"/>
+                <w:szCs w:val="19"/>
+              </w:rPr>
+              <w:t xml:space="preserve">Done</w:t>
             </w:r>
           </w:p>
         </w:tc>
@@ -16718,24 +17104,25 @@
               <w:bottom w:val="single" w:color="DCE3E1" w:sz="4"/>
               <w:right w:val="single" w:color="DCE3E1" w:sz="4"/>
             </w:tcBorders>
-            <w:tcMar>
-              <w:top w:type="dxa" w:w="70"/>
-              <w:left w:type="dxa" w:w="110"/>
-              <w:bottom w:type="dxa" w:w="50"/>
-              <w:right w:type="dxa" w:w="110"/>
-            </w:tcMar>
-            <w:vAlign w:val="top"/>
-          </w:tcPr>
-          <w:p>
-            <w:pPr>
-              <w:spacing w:after="40" w:line="252" w:lineRule="auto"/>
-            </w:pPr>
-            <w:r>
-              <w:rPr>
-                <w:sz w:val="19"/>
-                <w:szCs w:val="19"/>
-              </w:rPr>
-              <w:t xml:space="preserve">Planned</w:t>
+            <w:shd w:fill="FBEFD8" w:color="auto" w:val="clear"/>
+            <w:tcMar>
+              <w:top w:type="dxa" w:w="70"/>
+              <w:left w:type="dxa" w:w="110"/>
+              <w:bottom w:type="dxa" w:w="50"/>
+              <w:right w:type="dxa" w:w="110"/>
+            </w:tcMar>
+            <w:vAlign w:val="top"/>
+          </w:tcPr>
+          <w:p>
+            <w:pPr>
+              <w:spacing w:after="40" w:line="252" w:lineRule="auto"/>
+            </w:pPr>
+            <w:r>
+              <w:rPr>
+                <w:sz w:val="19"/>
+                <w:szCs w:val="19"/>
+              </w:rPr>
+              <w:t xml:space="preserve">In progress</w:t>
             </w:r>
           </w:p>
         </w:tc>
@@ -19275,7 +19662,7 @@
               <w:bottom w:val="single" w:color="DCE3E1" w:sz="4"/>
               <w:right w:val="single" w:color="DCE3E1" w:sz="4"/>
             </w:tcBorders>
-            <w:shd w:fill="FBEFD8" w:color="auto" w:val="clear"/>
+            <w:shd w:fill="E3F0E6" w:color="auto" w:val="clear"/>
             <w:tcMar>
               <w:top w:type="dxa" w:w="70"/>
               <w:left w:type="dxa" w:w="110"/>
@@ -19293,7 +19680,7 @@
                 <w:sz w:val="17"/>
                 <w:szCs w:val="17"/>
               </w:rPr>
-              <w:t xml:space="preserve">In progress</w:t>
+              <w:t xml:space="preserve">Done</w:t>
             </w:r>
           </w:p>
         </w:tc>
@@ -19401,6 +19788,7 @@
               <w:bottom w:val="single" w:color="DCE3E1" w:sz="4"/>
               <w:right w:val="single" w:color="DCE3E1" w:sz="4"/>
             </w:tcBorders>
+            <w:shd w:fill="FBEFD8" w:color="auto" w:val="clear"/>
             <w:tcMar>
               <w:top w:type="dxa" w:w="70"/>
               <w:left w:type="dxa" w:w="110"/>
@@ -19418,7 +19806,7 @@
                 <w:sz w:val="17"/>
                 <w:szCs w:val="17"/>
               </w:rPr>
-              <w:t xml:space="preserve">Planned</w:t>
+              <w:t xml:space="preserve">In progress</w:t>
             </w:r>
           </w:p>
         </w:tc>
@@ -21471,7 +21859,7 @@
                     </pic:cNvPicPr>
                   </pic:nvPicPr>
                   <pic:blipFill>
-                    <a:blip r:embed="rId44" cstate="none"/>
+                    <a:blip r:embed="rId47" cstate="none"/>
                     <a:srcRect/>
                     <a:stretch>
                       <a:fillRect/>
@@ -21578,7 +21966,7 @@
         <w:t xml:space="preserve">Tests that grow with the system.</w:t>
       </w:r>
       <w:r>
-        <w:t xml:space="preserve"> As of Sprint 11: 233 server test methods, 81 screen tests and 96 end-to-end browser steps, all passing.</w:t>
+        <w:t xml:space="preserve"> As of Sprint 12: 253 server test methods, 88 screen tests and 101 end-to-end browser steps, all passing.</w:t>
       </w:r>
     </w:p>
     <w:p>
@@ -23465,7 +23853,7 @@
         <w:sz w:val="16"/>
         <w:szCs w:val="16"/>
       </w:rPr>
-      <w:t xml:space="preserve">Version 1.11 · 23 October 2026</w:t>
+      <w:t xml:space="preserve">Version 1.12 · 25 October 2026</w:t>
     </w:r>
     <w:r>
       <w:rPr>

</xml_diff>

<commit_message>
chore(sprints): accept Sprint 12 (#136)
The owner accepted Sprint 12 (GST invoices, credit/debit notes, receipts) on 25 Oct 2026. Sprint 12 is marked done in sprints.yml and Sprint 13 (Housekeeping and maintenance) is the current sprint. Sprint guides and catalogues regenerated, README, CHANGELOG, RUN_AND_TEST and the new-joiner guide updated, handbooks 1.12 rebuilt.

Co-Authored-By: Claude Opus 5.5 (1M context) <noreply@anthropic.com>
Claude-Session: https://claude.ai/code/session_01YUGRFpoQRR4EgvNozatgo4
</commit_message>
<xml_diff>
--- a/docs/handbooks/Resort-OS-Product-Overview.docx
+++ b/docs/handbooks/Resort-OS-Product-Overview.docx
@@ -182,7 +182,7 @@
                 <w:sz w:val="19"/>
                 <w:szCs w:val="19"/>
               </w:rPr>
-              <w:t xml:space="preserve">Version 1.11</w:t>
+              <w:t xml:space="preserve">Version 1.12</w:t>
             </w:r>
           </w:p>
         </w:tc>
@@ -252,7 +252,7 @@
                 <w:sz w:val="19"/>
                 <w:szCs w:val="19"/>
               </w:rPr>
-              <w:t xml:space="preserve">23 October 2026</w:t>
+              <w:t xml:space="preserve">25 October 2026</w:t>
             </w:r>
           </w:p>
         </w:tc>
@@ -322,7 +322,7 @@
                 <w:sz w:val="19"/>
                 <w:szCs w:val="19"/>
               </w:rPr>
-              <w:t xml:space="preserve">Sprints 01, 02, 03, 04, 05, 06, 07, 08, 09, 10, 11 accepted · Sprint 12 GST invoices, credit/debit notes, receipts in progress</w:t>
+              <w:t xml:space="preserve">Sprints 01, 02, 03, 04, 05, 06, 07, 08, 09, 10, 11, 12 accepted · Sprint 13 Housekeeping and maintenance (mobile-first) in progress</w:t>
             </w:r>
           </w:p>
         </w:tc>
@@ -661,7 +661,7 @@
                 <w:sz w:val="19"/>
                 <w:szCs w:val="19"/>
               </w:rPr>
-              <w:t xml:space="preserve">1.11</w:t>
+              <w:t xml:space="preserve">1.12</w:t>
             </w:r>
           </w:p>
         </w:tc>
@@ -691,7 +691,7 @@
                 <w:sz w:val="19"/>
                 <w:szCs w:val="19"/>
               </w:rPr>
-              <w:t xml:space="preserve">2026-10-23</w:t>
+              <w:t xml:space="preserve">2026-10-25</w:t>
             </w:r>
           </w:p>
         </w:tc>
@@ -721,7 +721,7 @@
                 <w:sz w:val="19"/>
                 <w:szCs w:val="19"/>
               </w:rPr>
-              <w:t xml:space="preserve">Sprint 11 (Razorpay) accepted: payment links sent from a booking, the guest pays on their phone with UPI or a card through Razorpay with no sign-in, only Razorpay's signed webhook records the payment (once, whatever the order) and confirms a pending booking, declined tries shown with the reason, online refunds back through Razorpay, a built-in test Razorpay when no keys are set. Razorpay flow diagram. Sprint 12 started.</w:t>
+              <w:t xml:space="preserve">Sprint 12 (GST invoices, credit/debit notes, receipts) accepted: check-out issues a legally numbered GST invoice and a receipt for each payment by itself, numbers run with no gap per property and financial year, an issued invoice is never edited (a credit note cancels or reduces it, a debit note bills late charges), B2B invoices with the company's GSTIN checked under the field, place of supply is the resort's state, A4 PDFs to download or print. Invoice flow diagram. Sprint 13 started.</w:t>
             </w:r>
           </w:p>
         </w:tc>
@@ -757,7 +757,7 @@
                 <w:sz w:val="19"/>
                 <w:szCs w:val="19"/>
               </w:rPr>
-              <w:t xml:space="preserve">1.10</w:t>
+              <w:t xml:space="preserve">1.11</w:t>
             </w:r>
           </w:p>
         </w:tc>
@@ -788,7 +788,7 @@
                 <w:sz w:val="19"/>
                 <w:szCs w:val="19"/>
               </w:rPr>
-              <w:t xml:space="preserve">2026-10-20</w:t>
+              <w:t xml:space="preserve">2026-10-23</w:t>
             </w:r>
           </w:p>
         </w:tc>
@@ -819,7 +819,7 @@
                 <w:sz w:val="19"/>
                 <w:szCs w:val="19"/>
               </w:rPr>
-              <w:t xml:space="preserve">Sprint 10 (Payments, refunds, cash drawer) accepted: cash, UPI, card and bank payments on the bill or on account, refunds with a reason that can never exceed the payment, voids, the cash drawer opened and closed against a count with manager approval of a shortfall, no card data stored, real balances at check-out. Payment flow diagram. Sprint 11 (Razorpay) started.</w:t>
+              <w:t xml:space="preserve">Sprint 11 (Razorpay) accepted: payment links sent from a booking, the guest pays on their phone with UPI or a card through Razorpay with no sign-in, only Razorpay's signed webhook records the payment (once, whatever the order) and confirms a pending booking, declined tries shown with the reason, online refunds back through Razorpay, a built-in test Razorpay when no keys are set. Razorpay flow diagram. Sprint 12 started.</w:t>
             </w:r>
           </w:p>
         </w:tc>
@@ -854,7 +854,7 @@
                 <w:sz w:val="19"/>
                 <w:szCs w:val="19"/>
               </w:rPr>
-              <w:t xml:space="preserve">1.9</w:t>
+              <w:t xml:space="preserve">1.10</w:t>
             </w:r>
           </w:p>
         </w:tc>
@@ -914,7 +914,7 @@
                 <w:sz w:val="19"/>
                 <w:szCs w:val="19"/>
               </w:rPr>
-              <w:t xml:space="preserve">Sprint 09 (GST configuration and tax engine) accepted: GST worked out on every charge (CGST + SGST or IGST), rates kept as rules with dates that an accountant changes from next month without a software update, room GST by the price per room per night, posted charges keep their GST. Tax flow diagram. Sprint 10 (Payments, refunds, cash drawer) started.</w:t>
+              <w:t xml:space="preserve">Sprint 10 (Payments, refunds, cash drawer) accepted: cash, UPI, card and bank payments on the bill or on account, refunds with a reason that can never exceed the payment, voids, the cash drawer opened and closed against a count with manager approval of a shortfall, no card data stored, real balances at check-out. Payment flow diagram. Sprint 11 (Razorpay) started.</w:t>
             </w:r>
           </w:p>
         </w:tc>
@@ -950,7 +950,7 @@
                 <w:sz w:val="19"/>
                 <w:szCs w:val="19"/>
               </w:rPr>
-              <w:t xml:space="preserve">1.8</w:t>
+              <w:t xml:space="preserve">1.9</w:t>
             </w:r>
           </w:p>
         </w:tc>
@@ -981,7 +981,7 @@
                 <w:sz w:val="19"/>
                 <w:szCs w:val="19"/>
               </w:rPr>
-              <w:t xml:space="preserve">2026-10-18</w:t>
+              <w:t xml:space="preserve">2026-10-20</w:t>
             </w:r>
           </w:p>
         </w:tc>
@@ -1012,7 +1012,7 @@
                 <w:sz w:val="19"/>
                 <w:szCs w:val="19"/>
               </w:rPr>
-              <w:t xml:space="preserve">Sprint 08 (Folio) accepted: a running bill for every stay with room nights, meals, transport, activities and packages; nothing can be edited or deleted, a manager reverses a line with a reason; bills can be split; the front desk shows the real balance. Folio flow diagram. Sprint 09 (GST configuration and tax engine) started.</w:t>
+              <w:t xml:space="preserve">Sprint 09 (GST configuration and tax engine) accepted: GST worked out on every charge (CGST + SGST or IGST), rates kept as rules with dates that an accountant changes from next month without a software update, room GST by the price per room per night, posted charges keep their GST. Tax flow diagram. Sprint 10 (Payments, refunds, cash drawer) started.</w:t>
             </w:r>
           </w:p>
         </w:tc>
@@ -1047,7 +1047,7 @@
                 <w:sz w:val="19"/>
                 <w:szCs w:val="19"/>
               </w:rPr>
-              <w:t xml:space="preserve">1.7</w:t>
+              <w:t xml:space="preserve">1.8</w:t>
             </w:r>
           </w:p>
         </w:tc>
@@ -1107,7 +1107,7 @@
                 <w:sz w:val="19"/>
                 <w:szCs w:val="19"/>
               </w:rPr>
-              <w:t xml:space="preserve">Sprint 07 (Front desk) accepted: arrivals, departures and in-house lists, check-in and check-out in a few clicks, walk-ins on one screen, early departures with a reason, rooms marked dirty and ready. Check-in flow diagram. Sprint 08 (Folio) started.</w:t>
+              <w:t xml:space="preserve">Sprint 08 (Folio) accepted: a running bill for every stay with room nights, meals, transport, activities and packages; nothing can be edited or deleted, a manager reverses a line with a reason; bills can be split; the front desk shows the real balance. Folio flow diagram. Sprint 09 (GST configuration and tax engine) started.</w:t>
             </w:r>
           </w:p>
         </w:tc>
@@ -1143,7 +1143,7 @@
                 <w:sz w:val="19"/>
                 <w:szCs w:val="19"/>
               </w:rPr>
-              <w:t xml:space="preserve">1.6</w:t>
+              <w:t xml:space="preserve">1.7</w:t>
             </w:r>
           </w:p>
         </w:tc>
@@ -1174,7 +1174,7 @@
                 <w:sz w:val="19"/>
                 <w:szCs w:val="19"/>
               </w:rPr>
-              <w:t xml:space="preserve">2026-10-17</w:t>
+              <w:t xml:space="preserve">2026-10-18</w:t>
             </w:r>
           </w:p>
         </w:tc>
@@ -1205,7 +1205,7 @@
                 <w:sz w:val="19"/>
                 <w:szCs w:val="19"/>
               </w:rPr>
-              <w:t xml:space="preserve">Sprint 06 (Reservation calendar) accepted: day, week and month calendar of rooms and dorm beds, moving a guest by drag-and-drop with a reason, list by day on phones. Room-move flow diagram. Sprint 07 (Front desk) started.</w:t>
+              <w:t xml:space="preserve">Sprint 07 (Front desk) accepted: arrivals, departures and in-house lists, check-in and check-out in a few clicks, walk-ins on one screen, early departures with a reason, rooms marked dirty and ready. Check-in flow diagram. Sprint 08 (Folio) started.</w:t>
             </w:r>
           </w:p>
         </w:tc>
@@ -1240,7 +1240,7 @@
                 <w:sz w:val="19"/>
                 <w:szCs w:val="19"/>
               </w:rPr>
-              <w:t xml:space="preserve">1.5</w:t>
+              <w:t xml:space="preserve">1.6</w:t>
             </w:r>
           </w:p>
         </w:tc>
@@ -1270,7 +1270,7 @@
                 <w:sz w:val="19"/>
                 <w:szCs w:val="19"/>
               </w:rPr>
-              <w:t xml:space="preserve">2026-10-15</w:t>
+              <w:t xml:space="preserve">2026-10-17</w:t>
             </w:r>
           </w:p>
         </w:tc>
@@ -1300,7 +1300,7 @@
                 <w:sz w:val="19"/>
                 <w:szCs w:val="19"/>
               </w:rPr>
-              <w:t xml:space="preserve">Sprint 05 (Availability engine and reservations) accepted: race-free booking, booking wizard, booking history, date pickers. Diagrams of the reservation tables and the booking flow. Sprint 06 (Reservation calendar) started.</w:t>
+              <w:t xml:space="preserve">Sprint 06 (Reservation calendar) accepted: day, week and month calendar of rooms and dorm beds, moving a guest by drag-and-drop with a reason, list by day on phones. Room-move flow diagram. Sprint 07 (Front desk) started.</w:t>
             </w:r>
           </w:p>
         </w:tc>
@@ -1336,7 +1336,7 @@
                 <w:sz w:val="19"/>
                 <w:szCs w:val="19"/>
               </w:rPr>
-              <w:t xml:space="preserve">1.4</w:t>
+              <w:t xml:space="preserve">1.5</w:t>
             </w:r>
           </w:p>
         </w:tc>
@@ -1367,7 +1367,7 @@
                 <w:sz w:val="19"/>
                 <w:szCs w:val="19"/>
               </w:rPr>
-              <w:t xml:space="preserve">2026-10-14</w:t>
+              <w:t xml:space="preserve">2026-10-15</w:t>
             </w:r>
           </w:p>
         </w:tc>
@@ -1398,7 +1398,7 @@
                 <w:sz w:val="19"/>
                 <w:szCs w:val="19"/>
               </w:rPr>
-              <w:t xml:space="preserve">Sprint 04 (Rate plans and packages) accepted: nightly price grid, quotes, packages with revenue split. Sprint 05 (Availability engine and reservations) started.</w:t>
+              <w:t xml:space="preserve">Sprint 05 (Availability engine and reservations) accepted: race-free booking, booking wizard, booking history, date pickers. Diagrams of the reservation tables and the booking flow. Sprint 06 (Reservation calendar) started.</w:t>
             </w:r>
           </w:p>
         </w:tc>
@@ -1433,7 +1433,7 @@
                 <w:sz w:val="19"/>
                 <w:szCs w:val="19"/>
               </w:rPr>
-              <w:t xml:space="preserve">1.3</w:t>
+              <w:t xml:space="preserve">1.4</w:t>
             </w:r>
           </w:p>
         </w:tc>
@@ -1463,7 +1463,7 @@
                 <w:sz w:val="19"/>
                 <w:szCs w:val="19"/>
               </w:rPr>
-              <w:t xml:space="preserve">2026-10-11</w:t>
+              <w:t xml:space="preserve">2026-10-14</w:t>
             </w:r>
           </w:p>
         </w:tc>
@@ -1493,7 +1493,7 @@
                 <w:sz w:val="19"/>
                 <w:szCs w:val="19"/>
               </w:rPr>
-              <w:t xml:space="preserve">Sprint 03 (Guests) accepted, with review fixes: Aadhaar number check and error messages that say why. Sprint 04 (Rate plans and packages) started.</w:t>
+              <w:t xml:space="preserve">Sprint 04 (Rate plans and packages) accepted: nightly price grid, quotes, packages with revenue split. Sprint 05 (Availability engine and reservations) started.</w:t>
             </w:r>
           </w:p>
         </w:tc>
@@ -1529,7 +1529,7 @@
                 <w:sz w:val="19"/>
                 <w:szCs w:val="19"/>
               </w:rPr>
-              <w:t xml:space="preserve">1.2.1</w:t>
+              <w:t xml:space="preserve">1.3</w:t>
             </w:r>
           </w:p>
         </w:tc>
@@ -1560,7 +1560,7 @@
                 <w:sz w:val="19"/>
                 <w:szCs w:val="19"/>
               </w:rPr>
-              <w:t xml:space="preserve">2026-10-10</w:t>
+              <w:t xml:space="preserve">2026-10-11</w:t>
             </w:r>
           </w:p>
         </w:tc>
@@ -1591,7 +1591,7 @@
                 <w:sz w:val="19"/>
                 <w:szCs w:val="19"/>
               </w:rPr>
-              <w:t xml:space="preserve">Sprint 03 (Guests) built and in review: guest profiles, encrypted ID documents, duplicates, merge, anonymise, consent.</w:t>
+              <w:t xml:space="preserve">Sprint 03 (Guests) accepted, with review fixes: Aadhaar number check and error messages that say why. Sprint 04 (Rate plans and packages) started.</w:t>
             </w:r>
           </w:p>
         </w:tc>
@@ -1626,6 +1626,102 @@
                 <w:sz w:val="19"/>
                 <w:szCs w:val="19"/>
               </w:rPr>
+              <w:t xml:space="preserve">1.2.1</w:t>
+            </w:r>
+          </w:p>
+        </w:tc>
+        <w:tc>
+          <w:tcPr>
+            <w:tcW w:type="dxa" w:w="1500"/>
+            <w:tcBorders>
+              <w:top w:val="single" w:color="DCE3E1" w:sz="4"/>
+              <w:left w:val="single" w:color="DCE3E1" w:sz="4"/>
+              <w:bottom w:val="single" w:color="DCE3E1" w:sz="4"/>
+              <w:right w:val="single" w:color="DCE3E1" w:sz="4"/>
+            </w:tcBorders>
+            <w:tcMar>
+              <w:top w:type="dxa" w:w="70"/>
+              <w:left w:type="dxa" w:w="110"/>
+              <w:bottom w:type="dxa" w:w="50"/>
+              <w:right w:type="dxa" w:w="110"/>
+            </w:tcMar>
+            <w:vAlign w:val="top"/>
+          </w:tcPr>
+          <w:p>
+            <w:pPr>
+              <w:spacing w:after="40" w:line="252" w:lineRule="auto"/>
+            </w:pPr>
+            <w:r>
+              <w:rPr>
+                <w:sz w:val="19"/>
+                <w:szCs w:val="19"/>
+              </w:rPr>
+              <w:t xml:space="preserve">2026-10-10</w:t>
+            </w:r>
+          </w:p>
+        </w:tc>
+        <w:tc>
+          <w:tcPr>
+            <w:tcW w:type="dxa" w:w="6714"/>
+            <w:tcBorders>
+              <w:top w:val="single" w:color="DCE3E1" w:sz="4"/>
+              <w:left w:val="single" w:color="DCE3E1" w:sz="4"/>
+              <w:bottom w:val="single" w:color="DCE3E1" w:sz="4"/>
+              <w:right w:val="single" w:color="DCE3E1" w:sz="4"/>
+            </w:tcBorders>
+            <w:tcMar>
+              <w:top w:type="dxa" w:w="70"/>
+              <w:left w:type="dxa" w:w="110"/>
+              <w:bottom w:type="dxa" w:w="50"/>
+              <w:right w:type="dxa" w:w="110"/>
+            </w:tcMar>
+            <w:vAlign w:val="top"/>
+          </w:tcPr>
+          <w:p>
+            <w:pPr>
+              <w:spacing w:after="40" w:line="252" w:lineRule="auto"/>
+            </w:pPr>
+            <w:r>
+              <w:rPr>
+                <w:sz w:val="19"/>
+                <w:szCs w:val="19"/>
+              </w:rPr>
+              <w:t xml:space="preserve">Sprint 03 (Guests) built and in review: guest profiles, encrypted ID documents, duplicates, merge, anonymise, consent.</w:t>
+            </w:r>
+          </w:p>
+        </w:tc>
+      </w:tr>
+      <w:tr>
+        <w:trPr>
+          <w:cantSplit/>
+        </w:trPr>
+        <w:tc>
+          <w:tcPr>
+            <w:tcW w:type="dxa" w:w="1100"/>
+            <w:tcBorders>
+              <w:top w:val="single" w:color="DCE3E1" w:sz="4"/>
+              <w:left w:val="single" w:color="DCE3E1" w:sz="4"/>
+              <w:bottom w:val="single" w:color="DCE3E1" w:sz="4"/>
+              <w:right w:val="single" w:color="DCE3E1" w:sz="4"/>
+            </w:tcBorders>
+            <w:shd w:fill="F5F7F6" w:color="auto" w:val="clear"/>
+            <w:tcMar>
+              <w:top w:type="dxa" w:w="70"/>
+              <w:left w:type="dxa" w:w="110"/>
+              <w:bottom w:type="dxa" w:w="50"/>
+              <w:right w:type="dxa" w:w="110"/>
+            </w:tcMar>
+            <w:vAlign w:val="top"/>
+          </w:tcPr>
+          <w:p>
+            <w:pPr>
+              <w:spacing w:after="40" w:line="252" w:lineRule="auto"/>
+            </w:pPr>
+            <w:r>
+              <w:rPr>
+                <w:sz w:val="19"/>
+                <w:szCs w:val="19"/>
+              </w:rPr>
               <w:t xml:space="preserve">1.2</w:t>
             </w:r>
           </w:p>
@@ -1639,6 +1735,7 @@
               <w:bottom w:val="single" w:color="DCE3E1" w:sz="4"/>
               <w:right w:val="single" w:color="DCE3E1" w:sz="4"/>
             </w:tcBorders>
+            <w:shd w:fill="F5F7F6" w:color="auto" w:val="clear"/>
             <w:tcMar>
               <w:top w:type="dxa" w:w="70"/>
               <w:left w:type="dxa" w:w="110"/>
@@ -1669,6 +1766,7 @@
               <w:bottom w:val="single" w:color="DCE3E1" w:sz="4"/>
               <w:right w:val="single" w:color="DCE3E1" w:sz="4"/>
             </w:tcBorders>
+            <w:shd w:fill="F5F7F6" w:color="auto" w:val="clear"/>
             <w:tcMar>
               <w:top w:type="dxa" w:w="70"/>
               <w:left w:type="dxa" w:w="110"/>
@@ -1919,7 +2017,7 @@
                 <w:sz w:val="19"/>
                 <w:szCs w:val="19"/>
               </w:rPr>
-              <w:t xml:space="preserve">Living document, rebuilt at the end of every sprint. This edition reflects Sprint 11 accepted and Sprint 12 in progress.</w:t>
+              <w:t xml:space="preserve">Living document, rebuilt at the end of every sprint. This edition reflects Sprint 12 accepted and Sprint 13 in progress.</w:t>
             </w:r>
           </w:p>
         </w:tc>
@@ -2877,7 +2975,33 @@
           <w:sz w:val="19"/>
           <w:szCs w:val="19"/>
         </w:rPr>
-        <w:t xml:space="preserve">In progress: Sprint 12 — GST invoices, credit/debit notes, receipts</w:t>
+        <w:t xml:space="preserve">Sprint 12 — GST invoices, credit/debit notes, receipts</w:t>
+      </w:r>
+    </w:p>
+    <w:p>
+      <w:pPr>
+        <w:spacing w:after="30" w:before="0"/>
+        <w:ind w:left="420"/>
+      </w:pPr>
+      <w:r>
+        <w:rPr>
+          <w:b w:val="false"/>
+          <w:bCs w:val="false"/>
+          <w:color w:val="8A2449"/>
+          <w:sz w:val="19"/>
+          <w:szCs w:val="19"/>
+        </w:rPr>
+        <w:t xml:space="preserve">9.13  </w:t>
+      </w:r>
+      <w:r>
+        <w:rPr>
+          <w:b w:val="false"/>
+          <w:bCs w:val="false"/>
+          <w:color w:val="1B2A2E"/>
+          <w:sz w:val="19"/>
+          <w:szCs w:val="19"/>
+        </w:rPr>
+        <w:t xml:space="preserve">In progress: Sprint 13 — Housekeeping and maintenance (mobile-first)</w:t>
       </w:r>
     </w:p>
     <w:p>
@@ -3200,7 +3324,7 @@
                 <w:sz w:val="40"/>
                 <w:szCs w:val="40"/>
               </w:rPr>
-              <w:t xml:space="preserve">11 of 29</w:t>
+              <w:t xml:space="preserve">12 of 29</w:t>
             </w:r>
           </w:p>
           <w:p>
@@ -3565,7 +3689,7 @@
                 <w:sz w:val="19"/>
                 <w:szCs w:val="19"/>
               </w:rPr>
-              <w:t xml:space="preserve">Sprints 01 and 02 and 03 and 04 and 05 and 06 and 07 and 08 and 09 and 10 and 11 are delivered and accepted. Sprint 12 (GST invoices, credit/debit notes, receipts) is in progress.</w:t>
+              <w:t xml:space="preserve">Sprints 01 and 02 and 03 and 04 and 05 and 06 and 07 and 08 and 09 and 10 and 11 and 12 are delivered and accepted. Sprint 13 (Housekeeping and maintenance (mobile-first)) is in progress.</w:t>
             </w:r>
           </w:p>
         </w:tc>
@@ -6157,25 +6281,25 @@
               <w:bottom w:val="single" w:color="DCE3E1" w:sz="4"/>
               <w:right w:val="single" w:color="DCE3E1" w:sz="4"/>
             </w:tcBorders>
-            <w:shd w:fill="FBEFD8" w:color="auto" w:val="clear"/>
-            <w:tcMar>
-              <w:top w:type="dxa" w:w="70"/>
-              <w:left w:type="dxa" w:w="110"/>
-              <w:bottom w:type="dxa" w:w="50"/>
-              <w:right w:type="dxa" w:w="110"/>
-            </w:tcMar>
-            <w:vAlign w:val="top"/>
-          </w:tcPr>
-          <w:p>
-            <w:pPr>
-              <w:spacing w:after="40" w:line="252" w:lineRule="auto"/>
-            </w:pPr>
-            <w:r>
-              <w:rPr>
-                <w:sz w:val="19"/>
-                <w:szCs w:val="19"/>
-              </w:rPr>
-              <w:t xml:space="preserve">In progress</w:t>
+            <w:shd w:fill="E3F0E6" w:color="auto" w:val="clear"/>
+            <w:tcMar>
+              <w:top w:type="dxa" w:w="70"/>
+              <w:left w:type="dxa" w:w="110"/>
+              <w:bottom w:type="dxa" w:w="50"/>
+              <w:right w:type="dxa" w:w="110"/>
+            </w:tcMar>
+            <w:vAlign w:val="top"/>
+          </w:tcPr>
+          <w:p>
+            <w:pPr>
+              <w:spacing w:after="40" w:line="252" w:lineRule="auto"/>
+            </w:pPr>
+            <w:r>
+              <w:rPr>
+                <w:sz w:val="19"/>
+                <w:szCs w:val="19"/>
+              </w:rPr>
+              <w:t xml:space="preserve">Done</w:t>
             </w:r>
           </w:p>
         </w:tc>
@@ -6393,24 +6517,25 @@
               <w:bottom w:val="single" w:color="DCE3E1" w:sz="4"/>
               <w:right w:val="single" w:color="DCE3E1" w:sz="4"/>
             </w:tcBorders>
-            <w:tcMar>
-              <w:top w:type="dxa" w:w="70"/>
-              <w:left w:type="dxa" w:w="110"/>
-              <w:bottom w:type="dxa" w:w="50"/>
-              <w:right w:type="dxa" w:w="110"/>
-            </w:tcMar>
-            <w:vAlign w:val="top"/>
-          </w:tcPr>
-          <w:p>
-            <w:pPr>
-              <w:spacing w:after="40" w:line="252" w:lineRule="auto"/>
-            </w:pPr>
-            <w:r>
-              <w:rPr>
-                <w:sz w:val="19"/>
-                <w:szCs w:val="19"/>
-              </w:rPr>
-              <w:t xml:space="preserve">Planned</w:t>
+            <w:shd w:fill="FBEFD8" w:color="auto" w:val="clear"/>
+            <w:tcMar>
+              <w:top w:type="dxa" w:w="70"/>
+              <w:left w:type="dxa" w:w="110"/>
+              <w:bottom w:type="dxa" w:w="50"/>
+              <w:right w:type="dxa" w:w="110"/>
+            </w:tcMar>
+            <w:vAlign w:val="top"/>
+          </w:tcPr>
+          <w:p>
+            <w:pPr>
+              <w:spacing w:after="40" w:line="252" w:lineRule="auto"/>
+            </w:pPr>
+            <w:r>
+              <w:rPr>
+                <w:sz w:val="19"/>
+                <w:szCs w:val="19"/>
+              </w:rPr>
+              <w:t xml:space="preserve">In progress</w:t>
             </w:r>
           </w:p>
         </w:tc>
@@ -12932,7 +13057,7 @@
     </w:p>
     <w:p>
       <w:r>
-        <w:t xml:space="preserve">Work is delivered in short sprints, and each one ends with the owner trying the new screens and accepting them. These are the parts that are built, tested and accepted as of Sprint 11.</w:t>
+        <w:t xml:space="preserve">Work is delivered in short sprints, and each one ends with the owner trying the new screens and accepting them. These are the parts that are built, tested and accepted as of Sprint 12.</w:t>
       </w:r>
     </w:p>
     <w:p>
@@ -15915,12 +16040,273 @@
         <w:pStyle w:val="Heading2"/>
       </w:pPr>
       <w:r>
-        <w:t xml:space="preserve">9.12   In progress: Sprint 12 — GST invoices, credit/debit notes, receipts</w:t>
+        <w:t xml:space="preserve">9.12   Sprint 12 — GST invoices, credit/debit notes, receipts</w:t>
       </w:r>
     </w:p>
     <w:p>
       <w:r>
         <w:t xml:space="preserve">Legally numbered GST invoices are produced from the bill; corrections are made only through credit and debit notes.</w:t>
+      </w:r>
+    </w:p>
+    <w:p>
+      <w:pPr>
+        <w:pStyle w:val="ListParagraph"/>
+        <w:numPr>
+          <w:ilvl w:val="0"/>
+          <w:numId w:val="2"/>
+        </w:numPr>
+        <w:spacing w:after="60"/>
+      </w:pPr>
+      <w:r>
+        <w:t xml:space="preserve">Checking a guest out issues the GST invoice and a receipt for each payment by itself</w:t>
+      </w:r>
+    </w:p>
+    <w:p>
+      <w:pPr>
+        <w:pStyle w:val="ListParagraph"/>
+        <w:numPr>
+          <w:ilvl w:val="0"/>
+          <w:numId w:val="2"/>
+        </w:numPr>
+        <w:spacing w:after="60"/>
+      </w:pPr>
+      <w:r>
+        <w:t xml:space="preserve">Invoice numbers run without gaps for each financial year, even when several are issued at the same moment</w:t>
+      </w:r>
+    </w:p>
+    <w:p>
+      <w:pPr>
+        <w:pStyle w:val="ListParagraph"/>
+        <w:numPr>
+          <w:ilvl w:val="0"/>
+          <w:numId w:val="2"/>
+        </w:numPr>
+        <w:spacing w:after="60"/>
+      </w:pPr>
+      <w:r>
+        <w:t xml:space="preserve">Company guests get a B2B invoice with their GSTIN; a typing mistake in a GSTIN is caught before anything is issued</w:t>
+      </w:r>
+    </w:p>
+    <w:p>
+      <w:pPr>
+        <w:pStyle w:val="ListParagraph"/>
+        <w:numPr>
+          <w:ilvl w:val="0"/>
+          <w:numId w:val="2"/>
+        </w:numPr>
+        <w:spacing w:after="60"/>
+      </w:pPr>
+      <w:r>
+        <w:t xml:space="preserve">An invoice is never edited: a credit note takes something off or cancels it, and a debit note bills a late charge</w:t>
+      </w:r>
+    </w:p>
+    <w:p>
+      <w:pPr>
+        <w:pStyle w:val="ListParagraph"/>
+        <w:numPr>
+          <w:ilvl w:val="0"/>
+          <w:numId w:val="2"/>
+        </w:numPr>
+        <w:spacing w:after="60"/>
+      </w:pPr>
+      <w:r>
+        <w:t xml:space="preserve">Invoices, credit notes, debit notes and receipts download as PDFs ready to print or send</w:t>
+      </w:r>
+    </w:p>
+    <w:p>
+      <w:pPr>
+        <w:keepNext/>
+        <w:pBdr>
+          <w:top w:val="single" w:color="DCE3E1" w:sz="4"/>
+          <w:bottom w:val="single" w:color="DCE3E1" w:sz="4"/>
+          <w:left w:val="single" w:color="DCE3E1" w:sz="4"/>
+          <w:right w:val="single" w:color="DCE3E1" w:sz="4"/>
+        </w:pBdr>
+        <w:spacing w:before="120" w:after="0" w:line="240" w:lineRule="auto"/>
+        <w:jc w:val="center"/>
+      </w:pPr>
+      <w:r>
+        <w:drawing>
+          <wp:inline distT="0" distB="0" distL="0" distR="0">
+            <wp:extent cx="5124450" cy="3438525"/>
+            <wp:effectExtent t="0" r="0" b="0" l="0"/>
+            <wp:docPr id="1" name="The GST invoice issued at check-out" descr="The GST invoice issued at check-out" title="The GST invoice issued at check-out"/>
+            <wp:cNvGraphicFramePr>
+              <a:graphicFrameLocks xmlns:a="http://schemas.openxmlformats.org/drawingml/2006/main" noChangeAspect="1"/>
+            </wp:cNvGraphicFramePr>
+            <a:graphic xmlns:a="http://schemas.openxmlformats.org/drawingml/2006/main">
+              <a:graphicData uri="http://schemas.openxmlformats.org/drawingml/2006/picture">
+                <pic:pic xmlns:pic="http://schemas.openxmlformats.org/drawingml/2006/picture">
+                  <pic:nvPicPr>
+                    <pic:cNvPr id="0" name="" descr=""/>
+                    <pic:cNvPicPr>
+                      <a:picLocks noChangeAspect="1" noChangeArrowheads="1"/>
+                    </pic:cNvPicPr>
+                  </pic:nvPicPr>
+                  <pic:blipFill>
+                    <a:blip r:embed="rId44" cstate="none"/>
+                    <a:srcRect/>
+                    <a:stretch>
+                      <a:fillRect/>
+                    </a:stretch>
+                  </pic:blipFill>
+                  <pic:spPr bwMode="auto">
+                    <a:xfrm>
+                      <a:off x="0" y="0"/>
+                      <a:ext cx="5124450" cy="3438525"/>
+                    </a:xfrm>
+                    <a:prstGeom prst="rect">
+                      <a:avLst/>
+                    </a:prstGeom>
+                  </pic:spPr>
+                </pic:pic>
+              </a:graphicData>
+            </a:graphic>
+          </wp:inline>
+        </w:drawing>
+      </w:r>
+    </w:p>
+    <w:p>
+      <w:pPr>
+        <w:pStyle w:val="Caption"/>
+      </w:pPr>
+      <w:r>
+        <w:t xml:space="preserve">The GST invoice issued at check-out</w:t>
+      </w:r>
+    </w:p>
+    <w:p>
+      <w:pPr>
+        <w:keepNext/>
+        <w:pBdr>
+          <w:top w:val="single" w:color="DCE3E1" w:sz="4"/>
+          <w:bottom w:val="single" w:color="DCE3E1" w:sz="4"/>
+          <w:left w:val="single" w:color="DCE3E1" w:sz="4"/>
+          <w:right w:val="single" w:color="DCE3E1" w:sz="4"/>
+        </w:pBdr>
+        <w:spacing w:before="120" w:after="0" w:line="240" w:lineRule="auto"/>
+        <w:jc w:val="center"/>
+      </w:pPr>
+      <w:r>
+        <w:drawing>
+          <wp:inline distT="0" distB="0" distL="0" distR="0">
+            <wp:extent cx="5124450" cy="3438525"/>
+            <wp:effectExtent t="0" r="0" b="0" l="0"/>
+            <wp:docPr id="1" name="On the bill, each charge shows its invoice" descr="On the bill, each charge shows its invoice" title="On the bill, each charge shows its invoice"/>
+            <wp:cNvGraphicFramePr>
+              <a:graphicFrameLocks xmlns:a="http://schemas.openxmlformats.org/drawingml/2006/main" noChangeAspect="1"/>
+            </wp:cNvGraphicFramePr>
+            <a:graphic xmlns:a="http://schemas.openxmlformats.org/drawingml/2006/main">
+              <a:graphicData uri="http://schemas.openxmlformats.org/drawingml/2006/picture">
+                <pic:pic xmlns:pic="http://schemas.openxmlformats.org/drawingml/2006/picture">
+                  <pic:nvPicPr>
+                    <pic:cNvPr id="0" name="" descr=""/>
+                    <pic:cNvPicPr>
+                      <a:picLocks noChangeAspect="1" noChangeArrowheads="1"/>
+                    </pic:cNvPicPr>
+                  </pic:nvPicPr>
+                  <pic:blipFill>
+                    <a:blip r:embed="rId45" cstate="none"/>
+                    <a:srcRect/>
+                    <a:stretch>
+                      <a:fillRect/>
+                    </a:stretch>
+                  </pic:blipFill>
+                  <pic:spPr bwMode="auto">
+                    <a:xfrm>
+                      <a:off x="0" y="0"/>
+                      <a:ext cx="5124450" cy="3438525"/>
+                    </a:xfrm>
+                    <a:prstGeom prst="rect">
+                      <a:avLst/>
+                    </a:prstGeom>
+                  </pic:spPr>
+                </pic:pic>
+              </a:graphicData>
+            </a:graphic>
+          </wp:inline>
+        </w:drawing>
+      </w:r>
+    </w:p>
+    <w:p>
+      <w:pPr>
+        <w:pStyle w:val="Caption"/>
+      </w:pPr>
+      <w:r>
+        <w:t xml:space="preserve">On the bill, each charge shows its invoice</w:t>
+      </w:r>
+    </w:p>
+    <w:p>
+      <w:pPr>
+        <w:keepNext/>
+        <w:pBdr>
+          <w:top w:val="single" w:color="DCE3E1" w:sz="4"/>
+          <w:bottom w:val="single" w:color="DCE3E1" w:sz="4"/>
+          <w:left w:val="single" w:color="DCE3E1" w:sz="4"/>
+          <w:right w:val="single" w:color="DCE3E1" w:sz="4"/>
+        </w:pBdr>
+        <w:spacing w:before="120" w:after="0" w:line="240" w:lineRule="auto"/>
+        <w:jc w:val="center"/>
+      </w:pPr>
+      <w:r>
+        <w:drawing>
+          <wp:inline distT="0" distB="0" distL="0" distR="0">
+            <wp:extent cx="5124450" cy="3438525"/>
+            <wp:effectExtent t="0" r="0" b="0" l="0"/>
+            <wp:docPr id="1" name="A credit note for part of a line" descr="A credit note for part of a line" title="A credit note for part of a line"/>
+            <wp:cNvGraphicFramePr>
+              <a:graphicFrameLocks xmlns:a="http://schemas.openxmlformats.org/drawingml/2006/main" noChangeAspect="1"/>
+            </wp:cNvGraphicFramePr>
+            <a:graphic xmlns:a="http://schemas.openxmlformats.org/drawingml/2006/main">
+              <a:graphicData uri="http://schemas.openxmlformats.org/drawingml/2006/picture">
+                <pic:pic xmlns:pic="http://schemas.openxmlformats.org/drawingml/2006/picture">
+                  <pic:nvPicPr>
+                    <pic:cNvPr id="0" name="" descr=""/>
+                    <pic:cNvPicPr>
+                      <a:picLocks noChangeAspect="1" noChangeArrowheads="1"/>
+                    </pic:cNvPicPr>
+                  </pic:nvPicPr>
+                  <pic:blipFill>
+                    <a:blip r:embed="rId46" cstate="none"/>
+                    <a:srcRect/>
+                    <a:stretch>
+                      <a:fillRect/>
+                    </a:stretch>
+                  </pic:blipFill>
+                  <pic:spPr bwMode="auto">
+                    <a:xfrm>
+                      <a:off x="0" y="0"/>
+                      <a:ext cx="5124450" cy="3438525"/>
+                    </a:xfrm>
+                    <a:prstGeom prst="rect">
+                      <a:avLst/>
+                    </a:prstGeom>
+                  </pic:spPr>
+                </pic:pic>
+              </a:graphicData>
+            </a:graphic>
+          </wp:inline>
+        </w:drawing>
+      </w:r>
+    </w:p>
+    <w:p>
+      <w:pPr>
+        <w:pStyle w:val="Caption"/>
+      </w:pPr>
+      <w:r>
+        <w:t xml:space="preserve">A credit note for part of a line</w:t>
+      </w:r>
+    </w:p>
+    <w:p>
+      <w:pPr>
+        <w:pStyle w:val="Heading2"/>
+      </w:pPr>
+      <w:r>
+        <w:t xml:space="preserve">9.13   In progress: Sprint 13 — Housekeeping and maintenance (mobile-first)</w:t>
+      </w:r>
+    </w:p>
+    <w:p>
+      <w:r>
+        <w:t xml:space="preserve">Housekeeping and maintenance staff see their tasks on their phones, update room status, and report repairs with photos.</w:t>
       </w:r>
     </w:p>
     <w:p>
@@ -15933,7 +16319,7 @@
           <w:sz w:val="18"/>
           <w:szCs w:val="18"/>
         </w:rPr>
-        <w:t xml:space="preserve">It will be accepted when: Checkout produces a GST invoice and receipt PDF.</w:t>
+        <w:t xml:space="preserve">It will be accepted when: Housekeeper finishes a room in 2 taps; supervisor marks READY.</w:t>
       </w:r>
     </w:p>
     <w:p>
@@ -16592,25 +16978,25 @@
               <w:bottom w:val="single" w:color="DCE3E1" w:sz="4"/>
               <w:right w:val="single" w:color="DCE3E1" w:sz="4"/>
             </w:tcBorders>
-            <w:shd w:fill="FBEFD8" w:color="auto" w:val="clear"/>
-            <w:tcMar>
-              <w:top w:type="dxa" w:w="70"/>
-              <w:left w:type="dxa" w:w="110"/>
-              <w:bottom w:type="dxa" w:w="50"/>
-              <w:right w:type="dxa" w:w="110"/>
-            </w:tcMar>
-            <w:vAlign w:val="top"/>
-          </w:tcPr>
-          <w:p>
-            <w:pPr>
-              <w:spacing w:after="40" w:line="252" w:lineRule="auto"/>
-            </w:pPr>
-            <w:r>
-              <w:rPr>
-                <w:sz w:val="19"/>
-                <w:szCs w:val="19"/>
-              </w:rPr>
-              <w:t xml:space="preserve">In progress</w:t>
+            <w:shd w:fill="E3F0E6" w:color="auto" w:val="clear"/>
+            <w:tcMar>
+              <w:top w:type="dxa" w:w="70"/>
+              <w:left w:type="dxa" w:w="110"/>
+              <w:bottom w:type="dxa" w:w="50"/>
+              <w:right w:type="dxa" w:w="110"/>
+            </w:tcMar>
+            <w:vAlign w:val="top"/>
+          </w:tcPr>
+          <w:p>
+            <w:pPr>
+              <w:spacing w:after="40" w:line="252" w:lineRule="auto"/>
+            </w:pPr>
+            <w:r>
+              <w:rPr>
+                <w:sz w:val="19"/>
+                <w:szCs w:val="19"/>
+              </w:rPr>
+              <w:t xml:space="preserve">Done</w:t>
             </w:r>
           </w:p>
         </w:tc>
@@ -16718,24 +17104,25 @@
               <w:bottom w:val="single" w:color="DCE3E1" w:sz="4"/>
               <w:right w:val="single" w:color="DCE3E1" w:sz="4"/>
             </w:tcBorders>
-            <w:tcMar>
-              <w:top w:type="dxa" w:w="70"/>
-              <w:left w:type="dxa" w:w="110"/>
-              <w:bottom w:type="dxa" w:w="50"/>
-              <w:right w:type="dxa" w:w="110"/>
-            </w:tcMar>
-            <w:vAlign w:val="top"/>
-          </w:tcPr>
-          <w:p>
-            <w:pPr>
-              <w:spacing w:after="40" w:line="252" w:lineRule="auto"/>
-            </w:pPr>
-            <w:r>
-              <w:rPr>
-                <w:sz w:val="19"/>
-                <w:szCs w:val="19"/>
-              </w:rPr>
-              <w:t xml:space="preserve">Planned</w:t>
+            <w:shd w:fill="FBEFD8" w:color="auto" w:val="clear"/>
+            <w:tcMar>
+              <w:top w:type="dxa" w:w="70"/>
+              <w:left w:type="dxa" w:w="110"/>
+              <w:bottom w:type="dxa" w:w="50"/>
+              <w:right w:type="dxa" w:w="110"/>
+            </w:tcMar>
+            <w:vAlign w:val="top"/>
+          </w:tcPr>
+          <w:p>
+            <w:pPr>
+              <w:spacing w:after="40" w:line="252" w:lineRule="auto"/>
+            </w:pPr>
+            <w:r>
+              <w:rPr>
+                <w:sz w:val="19"/>
+                <w:szCs w:val="19"/>
+              </w:rPr>
+              <w:t xml:space="preserve">In progress</w:t>
             </w:r>
           </w:p>
         </w:tc>
@@ -19275,7 +19662,7 @@
               <w:bottom w:val="single" w:color="DCE3E1" w:sz="4"/>
               <w:right w:val="single" w:color="DCE3E1" w:sz="4"/>
             </w:tcBorders>
-            <w:shd w:fill="FBEFD8" w:color="auto" w:val="clear"/>
+            <w:shd w:fill="E3F0E6" w:color="auto" w:val="clear"/>
             <w:tcMar>
               <w:top w:type="dxa" w:w="70"/>
               <w:left w:type="dxa" w:w="110"/>
@@ -19293,7 +19680,7 @@
                 <w:sz w:val="17"/>
                 <w:szCs w:val="17"/>
               </w:rPr>
-              <w:t xml:space="preserve">In progress</w:t>
+              <w:t xml:space="preserve">Done</w:t>
             </w:r>
           </w:p>
         </w:tc>
@@ -19401,6 +19788,7 @@
               <w:bottom w:val="single" w:color="DCE3E1" w:sz="4"/>
               <w:right w:val="single" w:color="DCE3E1" w:sz="4"/>
             </w:tcBorders>
+            <w:shd w:fill="FBEFD8" w:color="auto" w:val="clear"/>
             <w:tcMar>
               <w:top w:type="dxa" w:w="70"/>
               <w:left w:type="dxa" w:w="110"/>
@@ -19418,7 +19806,7 @@
                 <w:sz w:val="17"/>
                 <w:szCs w:val="17"/>
               </w:rPr>
-              <w:t xml:space="preserve">Planned</w:t>
+              <w:t xml:space="preserve">In progress</w:t>
             </w:r>
           </w:p>
         </w:tc>
@@ -21471,7 +21859,7 @@
                     </pic:cNvPicPr>
                   </pic:nvPicPr>
                   <pic:blipFill>
-                    <a:blip r:embed="rId44" cstate="none"/>
+                    <a:blip r:embed="rId47" cstate="none"/>
                     <a:srcRect/>
                     <a:stretch>
                       <a:fillRect/>
@@ -21578,7 +21966,7 @@
         <w:t xml:space="preserve">Tests that grow with the system.</w:t>
       </w:r>
       <w:r>
-        <w:t xml:space="preserve"> As of Sprint 11: 233 server test methods, 81 screen tests and 96 end-to-end browser steps, all passing.</w:t>
+        <w:t xml:space="preserve"> As of Sprint 12: 253 server test methods, 88 screen tests and 101 end-to-end browser steps, all passing.</w:t>
       </w:r>
     </w:p>
     <w:p>
@@ -23465,7 +23853,7 @@
         <w:sz w:val="16"/>
         <w:szCs w:val="16"/>
       </w:rPr>
-      <w:t xml:space="preserve">Version 1.11 · 23 October 2026</w:t>
+      <w:t xml:space="preserve">Version 1.12 · 25 October 2026</w:t>
     </w:r>
     <w:r>
       <w:rPr>

</xml_diff>

<commit_message>
chore(sprints): accept Sprint 13
The owner accepted Sprint 13 (Housekeeping and maintenance, mobile-first) on 26 Oct 2026 after testing it locally. Sprint 13 is marked done in sprints.yml and Sprint 14 (Menu, restaurant POS and KOT) is the current sprint. Sprint guides and catalogues regenerated, README, CHANGELOG, RUN_AND_TEST and the new-joiner guide updated, capabilities diagram shows housekeeping built, handbooks 1.13 rebuilt.

Co-Authored-By: Claude Opus 5.5 (1M context) <noreply@anthropic.com>
Claude-Session: https://claude.ai/code/session_01RThzxhyjdn2aAudczkz2kp
</commit_message>
<xml_diff>
--- a/docs/handbooks/Resort-OS-Product-Overview.docx
+++ b/docs/handbooks/Resort-OS-Product-Overview.docx
@@ -182,7 +182,7 @@
                 <w:sz w:val="19"/>
                 <w:szCs w:val="19"/>
               </w:rPr>
-              <w:t xml:space="preserve">Version 1.12</w:t>
+              <w:t xml:space="preserve">Version 1.13</w:t>
             </w:r>
           </w:p>
         </w:tc>
@@ -252,7 +252,7 @@
                 <w:sz w:val="19"/>
                 <w:szCs w:val="19"/>
               </w:rPr>
-              <w:t xml:space="preserve">25 October 2026</w:t>
+              <w:t xml:space="preserve">26 October 2026</w:t>
             </w:r>
           </w:p>
         </w:tc>
@@ -322,7 +322,7 @@
                 <w:sz w:val="19"/>
                 <w:szCs w:val="19"/>
               </w:rPr>
-              <w:t xml:space="preserve">Sprints 01, 02, 03, 04, 05, 06, 07, 08, 09, 10, 11, 12 accepted · Sprint 13 Housekeeping and maintenance (mobile-first) in progress</w:t>
+              <w:t xml:space="preserve">Sprints 01, 02, 03, 04, 05, 06, 07, 08, 09, 10, 11, 12, 13 accepted · Sprint 14 Menu, restaurant POS and KOT in progress</w:t>
             </w:r>
           </w:p>
         </w:tc>
@@ -661,7 +661,7 @@
                 <w:sz w:val="19"/>
                 <w:szCs w:val="19"/>
               </w:rPr>
-              <w:t xml:space="preserve">1.12</w:t>
+              <w:t xml:space="preserve">1.13</w:t>
             </w:r>
           </w:p>
         </w:tc>
@@ -691,7 +691,7 @@
                 <w:sz w:val="19"/>
                 <w:szCs w:val="19"/>
               </w:rPr>
-              <w:t xml:space="preserve">2026-10-25</w:t>
+              <w:t xml:space="preserve">2026-10-26</w:t>
             </w:r>
           </w:p>
         </w:tc>
@@ -721,7 +721,7 @@
                 <w:sz w:val="19"/>
                 <w:szCs w:val="19"/>
               </w:rPr>
-              <w:t xml:space="preserve">Sprint 12 (GST invoices, credit/debit notes, receipts) accepted: check-out issues a legally numbered GST invoice and a receipt for each payment by itself, numbers run with no gap per property and financial year, an issued invoice is never edited (a credit note cancels or reduces it, a debit note bills late charges), B2B invoices with the company's GSTIN checked under the field, place of supply is the resort's state, A4 PDFs to download or print. Invoice flow diagram. Sprint 13 started.</w:t>
+              <w:t xml:space="preserve">Sprint 13 (Housekeeping and maintenance, mobile-first) accepted: a check-out puts the room on the housekeeper's phone as a cleaning task, two taps to clean it (Start, Done), a supervisor marks it ready or sends it back saying what to redo, checklists per kind of cleaning, staff report repairs with photos from their phone, a broken room can be taken out of order so nobody sells it and goes back to cleaning once the repair is resolved. Housekeeping flow diagram. Sprint 14 started.</w:t>
             </w:r>
           </w:p>
         </w:tc>
@@ -757,7 +757,7 @@
                 <w:sz w:val="19"/>
                 <w:szCs w:val="19"/>
               </w:rPr>
-              <w:t xml:space="preserve">1.11</w:t>
+              <w:t xml:space="preserve">1.12</w:t>
             </w:r>
           </w:p>
         </w:tc>
@@ -788,7 +788,7 @@
                 <w:sz w:val="19"/>
                 <w:szCs w:val="19"/>
               </w:rPr>
-              <w:t xml:space="preserve">2026-10-23</w:t>
+              <w:t xml:space="preserve">2026-10-25</w:t>
             </w:r>
           </w:p>
         </w:tc>
@@ -819,7 +819,7 @@
                 <w:sz w:val="19"/>
                 <w:szCs w:val="19"/>
               </w:rPr>
-              <w:t xml:space="preserve">Sprint 11 (Razorpay) accepted: payment links sent from a booking, the guest pays on their phone with UPI or a card through Razorpay with no sign-in, only Razorpay's signed webhook records the payment (once, whatever the order) and confirms a pending booking, declined tries shown with the reason, online refunds back through Razorpay, a built-in test Razorpay when no keys are set. Razorpay flow diagram. Sprint 12 started.</w:t>
+              <w:t xml:space="preserve">Sprint 12 (GST invoices, credit/debit notes, receipts) accepted: check-out issues a legally numbered GST invoice and a receipt for each payment by itself, numbers run with no gap per property and financial year, an issued invoice is never edited (a credit note cancels or reduces it, a debit note bills late charges), B2B invoices with the company's GSTIN checked under the field, place of supply is the resort's state, A4 PDFs to download or print. Invoice flow diagram. Sprint 13 started.</w:t>
             </w:r>
           </w:p>
         </w:tc>
@@ -854,7 +854,7 @@
                 <w:sz w:val="19"/>
                 <w:szCs w:val="19"/>
               </w:rPr>
-              <w:t xml:space="preserve">1.10</w:t>
+              <w:t xml:space="preserve">1.11</w:t>
             </w:r>
           </w:p>
         </w:tc>
@@ -884,7 +884,7 @@
                 <w:sz w:val="19"/>
                 <w:szCs w:val="19"/>
               </w:rPr>
-              <w:t xml:space="preserve">2026-10-20</w:t>
+              <w:t xml:space="preserve">2026-10-23</w:t>
             </w:r>
           </w:p>
         </w:tc>
@@ -914,7 +914,7 @@
                 <w:sz w:val="19"/>
                 <w:szCs w:val="19"/>
               </w:rPr>
-              <w:t xml:space="preserve">Sprint 10 (Payments, refunds, cash drawer) accepted: cash, UPI, card and bank payments on the bill or on account, refunds with a reason that can never exceed the payment, voids, the cash drawer opened and closed against a count with manager approval of a shortfall, no card data stored, real balances at check-out. Payment flow diagram. Sprint 11 (Razorpay) started.</w:t>
+              <w:t xml:space="preserve">Sprint 11 (Razorpay) accepted: payment links sent from a booking, the guest pays on their phone with UPI or a card through Razorpay with no sign-in, only Razorpay's signed webhook records the payment (once, whatever the order) and confirms a pending booking, declined tries shown with the reason, online refunds back through Razorpay, a built-in test Razorpay when no keys are set. Razorpay flow diagram. Sprint 12 started.</w:t>
             </w:r>
           </w:p>
         </w:tc>
@@ -950,7 +950,7 @@
                 <w:sz w:val="19"/>
                 <w:szCs w:val="19"/>
               </w:rPr>
-              <w:t xml:space="preserve">1.9</w:t>
+              <w:t xml:space="preserve">1.10</w:t>
             </w:r>
           </w:p>
         </w:tc>
@@ -1012,7 +1012,7 @@
                 <w:sz w:val="19"/>
                 <w:szCs w:val="19"/>
               </w:rPr>
-              <w:t xml:space="preserve">Sprint 09 (GST configuration and tax engine) accepted: GST worked out on every charge (CGST + SGST or IGST), rates kept as rules with dates that an accountant changes from next month without a software update, room GST by the price per room per night, posted charges keep their GST. Tax flow diagram. Sprint 10 (Payments, refunds, cash drawer) started.</w:t>
+              <w:t xml:space="preserve">Sprint 10 (Payments, refunds, cash drawer) accepted: cash, UPI, card and bank payments on the bill or on account, refunds with a reason that can never exceed the payment, voids, the cash drawer opened and closed against a count with manager approval of a shortfall, no card data stored, real balances at check-out. Payment flow diagram. Sprint 11 (Razorpay) started.</w:t>
             </w:r>
           </w:p>
         </w:tc>
@@ -1047,7 +1047,7 @@
                 <w:sz w:val="19"/>
                 <w:szCs w:val="19"/>
               </w:rPr>
-              <w:t xml:space="preserve">1.8</w:t>
+              <w:t xml:space="preserve">1.9</w:t>
             </w:r>
           </w:p>
         </w:tc>
@@ -1077,7 +1077,7 @@
                 <w:sz w:val="19"/>
                 <w:szCs w:val="19"/>
               </w:rPr>
-              <w:t xml:space="preserve">2026-10-18</w:t>
+              <w:t xml:space="preserve">2026-10-20</w:t>
             </w:r>
           </w:p>
         </w:tc>
@@ -1107,7 +1107,7 @@
                 <w:sz w:val="19"/>
                 <w:szCs w:val="19"/>
               </w:rPr>
-              <w:t xml:space="preserve">Sprint 08 (Folio) accepted: a running bill for every stay with room nights, meals, transport, activities and packages; nothing can be edited or deleted, a manager reverses a line with a reason; bills can be split; the front desk shows the real balance. Folio flow diagram. Sprint 09 (GST configuration and tax engine) started.</w:t>
+              <w:t xml:space="preserve">Sprint 09 (GST configuration and tax engine) accepted: GST worked out on every charge (CGST + SGST or IGST), rates kept as rules with dates that an accountant changes from next month without a software update, room GST by the price per room per night, posted charges keep their GST. Tax flow diagram. Sprint 10 (Payments, refunds, cash drawer) started.</w:t>
             </w:r>
           </w:p>
         </w:tc>
@@ -1143,7 +1143,7 @@
                 <w:sz w:val="19"/>
                 <w:szCs w:val="19"/>
               </w:rPr>
-              <w:t xml:space="preserve">1.7</w:t>
+              <w:t xml:space="preserve">1.8</w:t>
             </w:r>
           </w:p>
         </w:tc>
@@ -1205,7 +1205,7 @@
                 <w:sz w:val="19"/>
                 <w:szCs w:val="19"/>
               </w:rPr>
-              <w:t xml:space="preserve">Sprint 07 (Front desk) accepted: arrivals, departures and in-house lists, check-in and check-out in a few clicks, walk-ins on one screen, early departures with a reason, rooms marked dirty and ready. Check-in flow diagram. Sprint 08 (Folio) started.</w:t>
+              <w:t xml:space="preserve">Sprint 08 (Folio) accepted: a running bill for every stay with room nights, meals, transport, activities and packages; nothing can be edited or deleted, a manager reverses a line with a reason; bills can be split; the front desk shows the real balance. Folio flow diagram. Sprint 09 (GST configuration and tax engine) started.</w:t>
             </w:r>
           </w:p>
         </w:tc>
@@ -1240,7 +1240,7 @@
                 <w:sz w:val="19"/>
                 <w:szCs w:val="19"/>
               </w:rPr>
-              <w:t xml:space="preserve">1.6</w:t>
+              <w:t xml:space="preserve">1.7</w:t>
             </w:r>
           </w:p>
         </w:tc>
@@ -1270,7 +1270,7 @@
                 <w:sz w:val="19"/>
                 <w:szCs w:val="19"/>
               </w:rPr>
-              <w:t xml:space="preserve">2026-10-17</w:t>
+              <w:t xml:space="preserve">2026-10-18</w:t>
             </w:r>
           </w:p>
         </w:tc>
@@ -1300,7 +1300,7 @@
                 <w:sz w:val="19"/>
                 <w:szCs w:val="19"/>
               </w:rPr>
-              <w:t xml:space="preserve">Sprint 06 (Reservation calendar) accepted: day, week and month calendar of rooms and dorm beds, moving a guest by drag-and-drop with a reason, list by day on phones. Room-move flow diagram. Sprint 07 (Front desk) started.</w:t>
+              <w:t xml:space="preserve">Sprint 07 (Front desk) accepted: arrivals, departures and in-house lists, check-in and check-out in a few clicks, walk-ins on one screen, early departures with a reason, rooms marked dirty and ready. Check-in flow diagram. Sprint 08 (Folio) started.</w:t>
             </w:r>
           </w:p>
         </w:tc>
@@ -1336,7 +1336,7 @@
                 <w:sz w:val="19"/>
                 <w:szCs w:val="19"/>
               </w:rPr>
-              <w:t xml:space="preserve">1.5</w:t>
+              <w:t xml:space="preserve">1.6</w:t>
             </w:r>
           </w:p>
         </w:tc>
@@ -1367,7 +1367,7 @@
                 <w:sz w:val="19"/>
                 <w:szCs w:val="19"/>
               </w:rPr>
-              <w:t xml:space="preserve">2026-10-15</w:t>
+              <w:t xml:space="preserve">2026-10-17</w:t>
             </w:r>
           </w:p>
         </w:tc>
@@ -1398,7 +1398,7 @@
                 <w:sz w:val="19"/>
                 <w:szCs w:val="19"/>
               </w:rPr>
-              <w:t xml:space="preserve">Sprint 05 (Availability engine and reservations) accepted: race-free booking, booking wizard, booking history, date pickers. Diagrams of the reservation tables and the booking flow. Sprint 06 (Reservation calendar) started.</w:t>
+              <w:t xml:space="preserve">Sprint 06 (Reservation calendar) accepted: day, week and month calendar of rooms and dorm beds, moving a guest by drag-and-drop with a reason, list by day on phones. Room-move flow diagram. Sprint 07 (Front desk) started.</w:t>
             </w:r>
           </w:p>
         </w:tc>
@@ -1433,7 +1433,7 @@
                 <w:sz w:val="19"/>
                 <w:szCs w:val="19"/>
               </w:rPr>
-              <w:t xml:space="preserve">1.4</w:t>
+              <w:t xml:space="preserve">1.5</w:t>
             </w:r>
           </w:p>
         </w:tc>
@@ -1463,7 +1463,7 @@
                 <w:sz w:val="19"/>
                 <w:szCs w:val="19"/>
               </w:rPr>
-              <w:t xml:space="preserve">2026-10-14</w:t>
+              <w:t xml:space="preserve">2026-10-15</w:t>
             </w:r>
           </w:p>
         </w:tc>
@@ -1493,7 +1493,7 @@
                 <w:sz w:val="19"/>
                 <w:szCs w:val="19"/>
               </w:rPr>
-              <w:t xml:space="preserve">Sprint 04 (Rate plans and packages) accepted: nightly price grid, quotes, packages with revenue split. Sprint 05 (Availability engine and reservations) started.</w:t>
+              <w:t xml:space="preserve">Sprint 05 (Availability engine and reservations) accepted: race-free booking, booking wizard, booking history, date pickers. Diagrams of the reservation tables and the booking flow. Sprint 06 (Reservation calendar) started.</w:t>
             </w:r>
           </w:p>
         </w:tc>
@@ -1529,7 +1529,7 @@
                 <w:sz w:val="19"/>
                 <w:szCs w:val="19"/>
               </w:rPr>
-              <w:t xml:space="preserve">1.3</w:t>
+              <w:t xml:space="preserve">1.4</w:t>
             </w:r>
           </w:p>
         </w:tc>
@@ -1560,7 +1560,7 @@
                 <w:sz w:val="19"/>
                 <w:szCs w:val="19"/>
               </w:rPr>
-              <w:t xml:space="preserve">2026-10-11</w:t>
+              <w:t xml:space="preserve">2026-10-14</w:t>
             </w:r>
           </w:p>
         </w:tc>
@@ -1591,7 +1591,7 @@
                 <w:sz w:val="19"/>
                 <w:szCs w:val="19"/>
               </w:rPr>
-              <w:t xml:space="preserve">Sprint 03 (Guests) accepted, with review fixes: Aadhaar number check and error messages that say why. Sprint 04 (Rate plans and packages) started.</w:t>
+              <w:t xml:space="preserve">Sprint 04 (Rate plans and packages) accepted: nightly price grid, quotes, packages with revenue split. Sprint 05 (Availability engine and reservations) started.</w:t>
             </w:r>
           </w:p>
         </w:tc>
@@ -1626,7 +1626,7 @@
                 <w:sz w:val="19"/>
                 <w:szCs w:val="19"/>
               </w:rPr>
-              <w:t xml:space="preserve">1.2.1</w:t>
+              <w:t xml:space="preserve">1.3</w:t>
             </w:r>
           </w:p>
         </w:tc>
@@ -1656,7 +1656,7 @@
                 <w:sz w:val="19"/>
                 <w:szCs w:val="19"/>
               </w:rPr>
-              <w:t xml:space="preserve">2026-10-10</w:t>
+              <w:t xml:space="preserve">2026-10-11</w:t>
             </w:r>
           </w:p>
         </w:tc>
@@ -1686,7 +1686,7 @@
                 <w:sz w:val="19"/>
                 <w:szCs w:val="19"/>
               </w:rPr>
-              <w:t xml:space="preserve">Sprint 03 (Guests) built and in review: guest profiles, encrypted ID documents, duplicates, merge, anonymise, consent.</w:t>
+              <w:t xml:space="preserve">Sprint 03 (Guests) accepted, with review fixes: Aadhaar number check and error messages that say why. Sprint 04 (Rate plans and packages) started.</w:t>
             </w:r>
           </w:p>
         </w:tc>
@@ -1722,6 +1722,103 @@
                 <w:sz w:val="19"/>
                 <w:szCs w:val="19"/>
               </w:rPr>
+              <w:t xml:space="preserve">1.2.1</w:t>
+            </w:r>
+          </w:p>
+        </w:tc>
+        <w:tc>
+          <w:tcPr>
+            <w:tcW w:type="dxa" w:w="1500"/>
+            <w:tcBorders>
+              <w:top w:val="single" w:color="DCE3E1" w:sz="4"/>
+              <w:left w:val="single" w:color="DCE3E1" w:sz="4"/>
+              <w:bottom w:val="single" w:color="DCE3E1" w:sz="4"/>
+              <w:right w:val="single" w:color="DCE3E1" w:sz="4"/>
+            </w:tcBorders>
+            <w:shd w:fill="F5F7F6" w:color="auto" w:val="clear"/>
+            <w:tcMar>
+              <w:top w:type="dxa" w:w="70"/>
+              <w:left w:type="dxa" w:w="110"/>
+              <w:bottom w:type="dxa" w:w="50"/>
+              <w:right w:type="dxa" w:w="110"/>
+            </w:tcMar>
+            <w:vAlign w:val="top"/>
+          </w:tcPr>
+          <w:p>
+            <w:pPr>
+              <w:spacing w:after="40" w:line="252" w:lineRule="auto"/>
+            </w:pPr>
+            <w:r>
+              <w:rPr>
+                <w:sz w:val="19"/>
+                <w:szCs w:val="19"/>
+              </w:rPr>
+              <w:t xml:space="preserve">2026-10-10</w:t>
+            </w:r>
+          </w:p>
+        </w:tc>
+        <w:tc>
+          <w:tcPr>
+            <w:tcW w:type="dxa" w:w="6714"/>
+            <w:tcBorders>
+              <w:top w:val="single" w:color="DCE3E1" w:sz="4"/>
+              <w:left w:val="single" w:color="DCE3E1" w:sz="4"/>
+              <w:bottom w:val="single" w:color="DCE3E1" w:sz="4"/>
+              <w:right w:val="single" w:color="DCE3E1" w:sz="4"/>
+            </w:tcBorders>
+            <w:shd w:fill="F5F7F6" w:color="auto" w:val="clear"/>
+            <w:tcMar>
+              <w:top w:type="dxa" w:w="70"/>
+              <w:left w:type="dxa" w:w="110"/>
+              <w:bottom w:type="dxa" w:w="50"/>
+              <w:right w:type="dxa" w:w="110"/>
+            </w:tcMar>
+            <w:vAlign w:val="top"/>
+          </w:tcPr>
+          <w:p>
+            <w:pPr>
+              <w:spacing w:after="40" w:line="252" w:lineRule="auto"/>
+            </w:pPr>
+            <w:r>
+              <w:rPr>
+                <w:sz w:val="19"/>
+                <w:szCs w:val="19"/>
+              </w:rPr>
+              <w:t xml:space="preserve">Sprint 03 (Guests) built and in review: guest profiles, encrypted ID documents, duplicates, merge, anonymise, consent.</w:t>
+            </w:r>
+          </w:p>
+        </w:tc>
+      </w:tr>
+      <w:tr>
+        <w:trPr>
+          <w:cantSplit/>
+        </w:trPr>
+        <w:tc>
+          <w:tcPr>
+            <w:tcW w:type="dxa" w:w="1100"/>
+            <w:tcBorders>
+              <w:top w:val="single" w:color="DCE3E1" w:sz="4"/>
+              <w:left w:val="single" w:color="DCE3E1" w:sz="4"/>
+              <w:bottom w:val="single" w:color="DCE3E1" w:sz="4"/>
+              <w:right w:val="single" w:color="DCE3E1" w:sz="4"/>
+            </w:tcBorders>
+            <w:tcMar>
+              <w:top w:type="dxa" w:w="70"/>
+              <w:left w:type="dxa" w:w="110"/>
+              <w:bottom w:type="dxa" w:w="50"/>
+              <w:right w:type="dxa" w:w="110"/>
+            </w:tcMar>
+            <w:vAlign w:val="top"/>
+          </w:tcPr>
+          <w:p>
+            <w:pPr>
+              <w:spacing w:after="40" w:line="252" w:lineRule="auto"/>
+            </w:pPr>
+            <w:r>
+              <w:rPr>
+                <w:sz w:val="19"/>
+                <w:szCs w:val="19"/>
+              </w:rPr>
               <w:t xml:space="preserve">1.2</w:t>
             </w:r>
           </w:p>
@@ -1735,7 +1832,6 @@
               <w:bottom w:val="single" w:color="DCE3E1" w:sz="4"/>
               <w:right w:val="single" w:color="DCE3E1" w:sz="4"/>
             </w:tcBorders>
-            <w:shd w:fill="F5F7F6" w:color="auto" w:val="clear"/>
             <w:tcMar>
               <w:top w:type="dxa" w:w="70"/>
               <w:left w:type="dxa" w:w="110"/>
@@ -1766,7 +1862,6 @@
               <w:bottom w:val="single" w:color="DCE3E1" w:sz="4"/>
               <w:right w:val="single" w:color="DCE3E1" w:sz="4"/>
             </w:tcBorders>
-            <w:shd w:fill="F5F7F6" w:color="auto" w:val="clear"/>
             <w:tcMar>
               <w:top w:type="dxa" w:w="70"/>
               <w:left w:type="dxa" w:w="110"/>
@@ -2017,7 +2112,7 @@
                 <w:sz w:val="19"/>
                 <w:szCs w:val="19"/>
               </w:rPr>
-              <w:t xml:space="preserve">Living document, rebuilt at the end of every sprint. This edition reflects Sprint 12 accepted and Sprint 13 in progress.</w:t>
+              <w:t xml:space="preserve">Living document, rebuilt at the end of every sprint. This edition reflects Sprint 13 accepted and Sprint 14 in progress.</w:t>
             </w:r>
           </w:p>
         </w:tc>
@@ -3001,7 +3096,33 @@
           <w:sz w:val="19"/>
           <w:szCs w:val="19"/>
         </w:rPr>
-        <w:t xml:space="preserve">In progress: Sprint 13 — Housekeeping and maintenance (mobile-first)</w:t>
+        <w:t xml:space="preserve">Sprint 13 — Housekeeping and maintenance (mobile-first)</w:t>
+      </w:r>
+    </w:p>
+    <w:p>
+      <w:pPr>
+        <w:spacing w:after="30" w:before="0"/>
+        <w:ind w:left="420"/>
+      </w:pPr>
+      <w:r>
+        <w:rPr>
+          <w:b w:val="false"/>
+          <w:bCs w:val="false"/>
+          <w:color w:val="8A2449"/>
+          <w:sz w:val="19"/>
+          <w:szCs w:val="19"/>
+        </w:rPr>
+        <w:t xml:space="preserve">9.14  </w:t>
+      </w:r>
+      <w:r>
+        <w:rPr>
+          <w:b w:val="false"/>
+          <w:bCs w:val="false"/>
+          <w:color w:val="1B2A2E"/>
+          <w:sz w:val="19"/>
+          <w:szCs w:val="19"/>
+        </w:rPr>
+        <w:t xml:space="preserve">In progress: Sprint 14 — Menu, restaurant POS and KOT</w:t>
       </w:r>
     </w:p>
     <w:p>
@@ -3324,7 +3445,7 @@
                 <w:sz w:val="40"/>
                 <w:szCs w:val="40"/>
               </w:rPr>
-              <w:t xml:space="preserve">12 of 29</w:t>
+              <w:t xml:space="preserve">13 of 29</w:t>
             </w:r>
           </w:p>
           <w:p>
@@ -3689,7 +3810,7 @@
                 <w:sz w:val="19"/>
                 <w:szCs w:val="19"/>
               </w:rPr>
-              <w:t xml:space="preserve">Sprints 01 and 02 and 03 and 04 and 05 and 06 and 07 and 08 and 09 and 10 and 11 and 12 are delivered and accepted. Sprint 13 (Housekeeping and maintenance (mobile-first)) is in progress.</w:t>
+              <w:t xml:space="preserve">Sprints 01 and 02 and 03 and 04 and 05 and 06 and 07 and 08 and 09 and 10 and 11 and 12 and 13 are delivered and accepted. Sprint 14 (Menu, restaurant POS and KOT) is in progress.</w:t>
             </w:r>
           </w:p>
         </w:tc>
@@ -6517,25 +6638,25 @@
               <w:bottom w:val="single" w:color="DCE3E1" w:sz="4"/>
               <w:right w:val="single" w:color="DCE3E1" w:sz="4"/>
             </w:tcBorders>
-            <w:shd w:fill="FBEFD8" w:color="auto" w:val="clear"/>
-            <w:tcMar>
-              <w:top w:type="dxa" w:w="70"/>
-              <w:left w:type="dxa" w:w="110"/>
-              <w:bottom w:type="dxa" w:w="50"/>
-              <w:right w:type="dxa" w:w="110"/>
-            </w:tcMar>
-            <w:vAlign w:val="top"/>
-          </w:tcPr>
-          <w:p>
-            <w:pPr>
-              <w:spacing w:after="40" w:line="252" w:lineRule="auto"/>
-            </w:pPr>
-            <w:r>
-              <w:rPr>
-                <w:sz w:val="19"/>
-                <w:szCs w:val="19"/>
-              </w:rPr>
-              <w:t xml:space="preserve">In progress</w:t>
+            <w:shd w:fill="E3F0E6" w:color="auto" w:val="clear"/>
+            <w:tcMar>
+              <w:top w:type="dxa" w:w="70"/>
+              <w:left w:type="dxa" w:w="110"/>
+              <w:bottom w:type="dxa" w:w="50"/>
+              <w:right w:type="dxa" w:w="110"/>
+            </w:tcMar>
+            <w:vAlign w:val="top"/>
+          </w:tcPr>
+          <w:p>
+            <w:pPr>
+              <w:spacing w:after="40" w:line="252" w:lineRule="auto"/>
+            </w:pPr>
+            <w:r>
+              <w:rPr>
+                <w:sz w:val="19"/>
+                <w:szCs w:val="19"/>
+              </w:rPr>
+              <w:t xml:space="preserve">Done</w:t>
             </w:r>
           </w:p>
         </w:tc>
@@ -6753,24 +6874,25 @@
               <w:bottom w:val="single" w:color="DCE3E1" w:sz="4"/>
               <w:right w:val="single" w:color="DCE3E1" w:sz="4"/>
             </w:tcBorders>
-            <w:tcMar>
-              <w:top w:type="dxa" w:w="70"/>
-              <w:left w:type="dxa" w:w="110"/>
-              <w:bottom w:type="dxa" w:w="50"/>
-              <w:right w:type="dxa" w:w="110"/>
-            </w:tcMar>
-            <w:vAlign w:val="top"/>
-          </w:tcPr>
-          <w:p>
-            <w:pPr>
-              <w:spacing w:after="40" w:line="252" w:lineRule="auto"/>
-            </w:pPr>
-            <w:r>
-              <w:rPr>
-                <w:sz w:val="19"/>
-                <w:szCs w:val="19"/>
-              </w:rPr>
-              <w:t xml:space="preserve">Planned</w:t>
+            <w:shd w:fill="FBEFD8" w:color="auto" w:val="clear"/>
+            <w:tcMar>
+              <w:top w:type="dxa" w:w="70"/>
+              <w:left w:type="dxa" w:w="110"/>
+              <w:bottom w:type="dxa" w:w="50"/>
+              <w:right w:type="dxa" w:w="110"/>
+            </w:tcMar>
+            <w:vAlign w:val="top"/>
+          </w:tcPr>
+          <w:p>
+            <w:pPr>
+              <w:spacing w:after="40" w:line="252" w:lineRule="auto"/>
+            </w:pPr>
+            <w:r>
+              <w:rPr>
+                <w:sz w:val="19"/>
+                <w:szCs w:val="19"/>
+              </w:rPr>
+              <w:t xml:space="preserve">In progress</w:t>
             </w:r>
           </w:p>
         </w:tc>
@@ -13057,7 +13179,7 @@
     </w:p>
     <w:p>
       <w:r>
-        <w:t xml:space="preserve">Work is delivered in short sprints, and each one ends with the owner trying the new screens and accepting them. These are the parts that are built, tested and accepted as of Sprint 12.</w:t>
+        <w:t xml:space="preserve">Work is delivered in short sprints, and each one ends with the owner trying the new screens and accepting them. These are the parts that are built, tested and accepted as of Sprint 13.</w:t>
       </w:r>
     </w:p>
     <w:p>
@@ -16301,12 +16423,273 @@
         <w:pStyle w:val="Heading2"/>
       </w:pPr>
       <w:r>
-        <w:t xml:space="preserve">9.13   In progress: Sprint 13 — Housekeeping and maintenance (mobile-first)</w:t>
+        <w:t xml:space="preserve">9.13   Sprint 13 — Housekeeping and maintenance (mobile-first)</w:t>
       </w:r>
     </w:p>
     <w:p>
       <w:r>
         <w:t xml:space="preserve">Housekeeping and maintenance staff see their tasks on their phones, update room status, and report repairs with photos.</w:t>
+      </w:r>
+    </w:p>
+    <w:p>
+      <w:pPr>
+        <w:pStyle w:val="ListParagraph"/>
+        <w:numPr>
+          <w:ilvl w:val="0"/>
+          <w:numId w:val="2"/>
+        </w:numPr>
+        <w:spacing w:after="60"/>
+      </w:pPr>
+      <w:r>
+        <w:t xml:space="preserve">When a guest checks out, the room appears on the housekeeper's phone by itself</w:t>
+      </w:r>
+    </w:p>
+    <w:p>
+      <w:pPr>
+        <w:pStyle w:val="ListParagraph"/>
+        <w:numPr>
+          <w:ilvl w:val="0"/>
+          <w:numId w:val="2"/>
+        </w:numPr>
+        <w:spacing w:after="60"/>
+      </w:pPr>
+      <w:r>
+        <w:t xml:space="preserve">A housekeeper finishes a room in two taps; a supervisor marks it ready or sends it back saying what to redo</w:t>
+      </w:r>
+    </w:p>
+    <w:p>
+      <w:pPr>
+        <w:pStyle w:val="ListParagraph"/>
+        <w:numPr>
+          <w:ilvl w:val="0"/>
+          <w:numId w:val="2"/>
+        </w:numPr>
+        <w:spacing w:after="60"/>
+      </w:pPr>
+      <w:r>
+        <w:t xml:space="preserve">Rooms a guest arrives in today are shown first</w:t>
+      </w:r>
+    </w:p>
+    <w:p>
+      <w:pPr>
+        <w:pStyle w:val="ListParagraph"/>
+        <w:numPr>
+          <w:ilvl w:val="0"/>
+          <w:numId w:val="2"/>
+        </w:numPr>
+        <w:spacing w:after="60"/>
+      </w:pPr>
+      <w:r>
+        <w:t xml:space="preserve">Staff report a repair with photos from their phone; a broken room can be taken out of order so it isn't sold</w:t>
+      </w:r>
+    </w:p>
+    <w:p>
+      <w:pPr>
+        <w:pStyle w:val="ListParagraph"/>
+        <w:numPr>
+          <w:ilvl w:val="0"/>
+          <w:numId w:val="2"/>
+        </w:numPr>
+        <w:spacing w:after="60"/>
+      </w:pPr>
+      <w:r>
+        <w:t xml:space="preserve">A repaired room goes back to cleaning before it can be sold again</w:t>
+      </w:r>
+    </w:p>
+    <w:p>
+      <w:pPr>
+        <w:keepNext/>
+        <w:pBdr>
+          <w:top w:val="single" w:color="DCE3E1" w:sz="4"/>
+          <w:bottom w:val="single" w:color="DCE3E1" w:sz="4"/>
+          <w:left w:val="single" w:color="DCE3E1" w:sz="4"/>
+          <w:right w:val="single" w:color="DCE3E1" w:sz="4"/>
+        </w:pBdr>
+        <w:spacing w:before="120" w:after="0" w:line="240" w:lineRule="auto"/>
+        <w:jc w:val="center"/>
+      </w:pPr>
+      <w:r>
+        <w:drawing>
+          <wp:inline distT="0" distB="0" distL="0" distR="0">
+            <wp:extent cx="5124450" cy="11106150"/>
+            <wp:effectExtent t="0" r="0" b="0" l="0"/>
+            <wp:docPr id="1" name="The housekeeper's phone after a check-out" descr="The housekeeper's phone after a check-out" title="The housekeeper's phone after a check-out"/>
+            <wp:cNvGraphicFramePr>
+              <a:graphicFrameLocks xmlns:a="http://schemas.openxmlformats.org/drawingml/2006/main" noChangeAspect="1"/>
+            </wp:cNvGraphicFramePr>
+            <a:graphic xmlns:a="http://schemas.openxmlformats.org/drawingml/2006/main">
+              <a:graphicData uri="http://schemas.openxmlformats.org/drawingml/2006/picture">
+                <pic:pic xmlns:pic="http://schemas.openxmlformats.org/drawingml/2006/picture">
+                  <pic:nvPicPr>
+                    <pic:cNvPr id="0" name="" descr=""/>
+                    <pic:cNvPicPr>
+                      <a:picLocks noChangeAspect="1" noChangeArrowheads="1"/>
+                    </pic:cNvPicPr>
+                  </pic:nvPicPr>
+                  <pic:blipFill>
+                    <a:blip r:embed="rId47" cstate="none"/>
+                    <a:srcRect/>
+                    <a:stretch>
+                      <a:fillRect/>
+                    </a:stretch>
+                  </pic:blipFill>
+                  <pic:spPr bwMode="auto">
+                    <a:xfrm>
+                      <a:off x="0" y="0"/>
+                      <a:ext cx="5124450" cy="11106150"/>
+                    </a:xfrm>
+                    <a:prstGeom prst="rect">
+                      <a:avLst/>
+                    </a:prstGeom>
+                  </pic:spPr>
+                </pic:pic>
+              </a:graphicData>
+            </a:graphic>
+          </wp:inline>
+        </w:drawing>
+      </w:r>
+    </w:p>
+    <w:p>
+      <w:pPr>
+        <w:pStyle w:val="Caption"/>
+      </w:pPr>
+      <w:r>
+        <w:t xml:space="preserve">The housekeeper's phone after a check-out</w:t>
+      </w:r>
+    </w:p>
+    <w:p>
+      <w:pPr>
+        <w:keepNext/>
+        <w:pBdr>
+          <w:top w:val="single" w:color="DCE3E1" w:sz="4"/>
+          <w:bottom w:val="single" w:color="DCE3E1" w:sz="4"/>
+          <w:left w:val="single" w:color="DCE3E1" w:sz="4"/>
+          <w:right w:val="single" w:color="DCE3E1" w:sz="4"/>
+        </w:pBdr>
+        <w:spacing w:before="120" w:after="0" w:line="240" w:lineRule="auto"/>
+        <w:jc w:val="center"/>
+      </w:pPr>
+      <w:r>
+        <w:drawing>
+          <wp:inline distT="0" distB="0" distL="0" distR="0">
+            <wp:extent cx="5124450" cy="11106150"/>
+            <wp:effectExtent t="0" r="0" b="0" l="0"/>
+            <wp:docPr id="1" name="The supervisor sends a room back, saying what to redo" descr="The supervisor sends a room back, saying what to redo" title="The supervisor sends a room back, saying what to redo"/>
+            <wp:cNvGraphicFramePr>
+              <a:graphicFrameLocks xmlns:a="http://schemas.openxmlformats.org/drawingml/2006/main" noChangeAspect="1"/>
+            </wp:cNvGraphicFramePr>
+            <a:graphic xmlns:a="http://schemas.openxmlformats.org/drawingml/2006/main">
+              <a:graphicData uri="http://schemas.openxmlformats.org/drawingml/2006/picture">
+                <pic:pic xmlns:pic="http://schemas.openxmlformats.org/drawingml/2006/picture">
+                  <pic:nvPicPr>
+                    <pic:cNvPr id="0" name="" descr=""/>
+                    <pic:cNvPicPr>
+                      <a:picLocks noChangeAspect="1" noChangeArrowheads="1"/>
+                    </pic:cNvPicPr>
+                  </pic:nvPicPr>
+                  <pic:blipFill>
+                    <a:blip r:embed="rId48" cstate="none"/>
+                    <a:srcRect/>
+                    <a:stretch>
+                      <a:fillRect/>
+                    </a:stretch>
+                  </pic:blipFill>
+                  <pic:spPr bwMode="auto">
+                    <a:xfrm>
+                      <a:off x="0" y="0"/>
+                      <a:ext cx="5124450" cy="11106150"/>
+                    </a:xfrm>
+                    <a:prstGeom prst="rect">
+                      <a:avLst/>
+                    </a:prstGeom>
+                  </pic:spPr>
+                </pic:pic>
+              </a:graphicData>
+            </a:graphic>
+          </wp:inline>
+        </w:drawing>
+      </w:r>
+    </w:p>
+    <w:p>
+      <w:pPr>
+        <w:pStyle w:val="Caption"/>
+      </w:pPr>
+      <w:r>
+        <w:t xml:space="preserve">The supervisor sends a room back, saying what to redo</w:t>
+      </w:r>
+    </w:p>
+    <w:p>
+      <w:pPr>
+        <w:keepNext/>
+        <w:pBdr>
+          <w:top w:val="single" w:color="DCE3E1" w:sz="4"/>
+          <w:bottom w:val="single" w:color="DCE3E1" w:sz="4"/>
+          <w:left w:val="single" w:color="DCE3E1" w:sz="4"/>
+          <w:right w:val="single" w:color="DCE3E1" w:sz="4"/>
+        </w:pBdr>
+        <w:spacing w:before="120" w:after="0" w:line="240" w:lineRule="auto"/>
+        <w:jc w:val="center"/>
+      </w:pPr>
+      <w:r>
+        <w:drawing>
+          <wp:inline distT="0" distB="0" distL="0" distR="0">
+            <wp:extent cx="5124450" cy="3438525"/>
+            <wp:effectExtent t="0" r="0" b="0" l="0"/>
+            <wp:docPr id="1" name="Room status with today's cleaning state" descr="Room status with today's cleaning state" title="Room status with today's cleaning state"/>
+            <wp:cNvGraphicFramePr>
+              <a:graphicFrameLocks xmlns:a="http://schemas.openxmlformats.org/drawingml/2006/main" noChangeAspect="1"/>
+            </wp:cNvGraphicFramePr>
+            <a:graphic xmlns:a="http://schemas.openxmlformats.org/drawingml/2006/main">
+              <a:graphicData uri="http://schemas.openxmlformats.org/drawingml/2006/picture">
+                <pic:pic xmlns:pic="http://schemas.openxmlformats.org/drawingml/2006/picture">
+                  <pic:nvPicPr>
+                    <pic:cNvPr id="0" name="" descr=""/>
+                    <pic:cNvPicPr>
+                      <a:picLocks noChangeAspect="1" noChangeArrowheads="1"/>
+                    </pic:cNvPicPr>
+                  </pic:nvPicPr>
+                  <pic:blipFill>
+                    <a:blip r:embed="rId49" cstate="none"/>
+                    <a:srcRect/>
+                    <a:stretch>
+                      <a:fillRect/>
+                    </a:stretch>
+                  </pic:blipFill>
+                  <pic:spPr bwMode="auto">
+                    <a:xfrm>
+                      <a:off x="0" y="0"/>
+                      <a:ext cx="5124450" cy="3438525"/>
+                    </a:xfrm>
+                    <a:prstGeom prst="rect">
+                      <a:avLst/>
+                    </a:prstGeom>
+                  </pic:spPr>
+                </pic:pic>
+              </a:graphicData>
+            </a:graphic>
+          </wp:inline>
+        </w:drawing>
+      </w:r>
+    </w:p>
+    <w:p>
+      <w:pPr>
+        <w:pStyle w:val="Caption"/>
+      </w:pPr>
+      <w:r>
+        <w:t xml:space="preserve">Room status with today's cleaning state</w:t>
+      </w:r>
+    </w:p>
+    <w:p>
+      <w:pPr>
+        <w:pStyle w:val="Heading2"/>
+      </w:pPr>
+      <w:r>
+        <w:t xml:space="preserve">9.14   In progress: Sprint 14 — Menu, restaurant POS and KOT</w:t>
+      </w:r>
+    </w:p>
+    <w:p>
+      <w:r>
+        <w:t xml:space="preserve">The restaurant takes orders by table, sends tickets to the kitchen, and charges in-house guests directly to their room.</w:t>
       </w:r>
     </w:p>
     <w:p>
@@ -16319,7 +16702,7 @@
           <w:sz w:val="18"/>
           <w:szCs w:val="18"/>
         </w:rPr>
-        <w:t xml:space="preserve">It will be accepted when: Housekeeper finishes a room in 2 taps; supervisor marks READY.</w:t>
+        <w:t xml:space="preserve">It will be accepted when: Waiter takes an order on a phone, kitchen sees the KOT, bill charged to room.</w:t>
       </w:r>
     </w:p>
     <w:p>
@@ -17104,25 +17487,25 @@
               <w:bottom w:val="single" w:color="DCE3E1" w:sz="4"/>
               <w:right w:val="single" w:color="DCE3E1" w:sz="4"/>
             </w:tcBorders>
-            <w:shd w:fill="FBEFD8" w:color="auto" w:val="clear"/>
-            <w:tcMar>
-              <w:top w:type="dxa" w:w="70"/>
-              <w:left w:type="dxa" w:w="110"/>
-              <w:bottom w:type="dxa" w:w="50"/>
-              <w:right w:type="dxa" w:w="110"/>
-            </w:tcMar>
-            <w:vAlign w:val="top"/>
-          </w:tcPr>
-          <w:p>
-            <w:pPr>
-              <w:spacing w:after="40" w:line="252" w:lineRule="auto"/>
-            </w:pPr>
-            <w:r>
-              <w:rPr>
-                <w:sz w:val="19"/>
-                <w:szCs w:val="19"/>
-              </w:rPr>
-              <w:t xml:space="preserve">In progress</w:t>
+            <w:shd w:fill="E3F0E6" w:color="auto" w:val="clear"/>
+            <w:tcMar>
+              <w:top w:type="dxa" w:w="70"/>
+              <w:left w:type="dxa" w:w="110"/>
+              <w:bottom w:type="dxa" w:w="50"/>
+              <w:right w:type="dxa" w:w="110"/>
+            </w:tcMar>
+            <w:vAlign w:val="top"/>
+          </w:tcPr>
+          <w:p>
+            <w:pPr>
+              <w:spacing w:after="40" w:line="252" w:lineRule="auto"/>
+            </w:pPr>
+            <w:r>
+              <w:rPr>
+                <w:sz w:val="19"/>
+                <w:szCs w:val="19"/>
+              </w:rPr>
+              <w:t xml:space="preserve">Done</w:t>
             </w:r>
           </w:p>
         </w:tc>
@@ -17230,24 +17613,25 @@
               <w:bottom w:val="single" w:color="DCE3E1" w:sz="4"/>
               <w:right w:val="single" w:color="DCE3E1" w:sz="4"/>
             </w:tcBorders>
-            <w:tcMar>
-              <w:top w:type="dxa" w:w="70"/>
-              <w:left w:type="dxa" w:w="110"/>
-              <w:bottom w:type="dxa" w:w="50"/>
-              <w:right w:type="dxa" w:w="110"/>
-            </w:tcMar>
-            <w:vAlign w:val="top"/>
-          </w:tcPr>
-          <w:p>
-            <w:pPr>
-              <w:spacing w:after="40" w:line="252" w:lineRule="auto"/>
-            </w:pPr>
-            <w:r>
-              <w:rPr>
-                <w:sz w:val="19"/>
-                <w:szCs w:val="19"/>
-              </w:rPr>
-              <w:t xml:space="preserve">Planned</w:t>
+            <w:shd w:fill="FBEFD8" w:color="auto" w:val="clear"/>
+            <w:tcMar>
+              <w:top w:type="dxa" w:w="70"/>
+              <w:left w:type="dxa" w:w="110"/>
+              <w:bottom w:type="dxa" w:w="50"/>
+              <w:right w:type="dxa" w:w="110"/>
+            </w:tcMar>
+            <w:vAlign w:val="top"/>
+          </w:tcPr>
+          <w:p>
+            <w:pPr>
+              <w:spacing w:after="40" w:line="252" w:lineRule="auto"/>
+            </w:pPr>
+            <w:r>
+              <w:rPr>
+                <w:sz w:val="19"/>
+                <w:szCs w:val="19"/>
+              </w:rPr>
+              <w:t xml:space="preserve">In progress</w:t>
             </w:r>
           </w:p>
         </w:tc>
@@ -19788,7 +20172,7 @@
               <w:bottom w:val="single" w:color="DCE3E1" w:sz="4"/>
               <w:right w:val="single" w:color="DCE3E1" w:sz="4"/>
             </w:tcBorders>
-            <w:shd w:fill="FBEFD8" w:color="auto" w:val="clear"/>
+            <w:shd w:fill="E3F0E6" w:color="auto" w:val="clear"/>
             <w:tcMar>
               <w:top w:type="dxa" w:w="70"/>
               <w:left w:type="dxa" w:w="110"/>
@@ -19806,7 +20190,7 @@
                 <w:sz w:val="17"/>
                 <w:szCs w:val="17"/>
               </w:rPr>
-              <w:t xml:space="preserve">In progress</w:t>
+              <w:t xml:space="preserve">Done</w:t>
             </w:r>
           </w:p>
         </w:tc>
@@ -19914,6 +20298,7 @@
               <w:bottom w:val="single" w:color="DCE3E1" w:sz="4"/>
               <w:right w:val="single" w:color="DCE3E1" w:sz="4"/>
             </w:tcBorders>
+            <w:shd w:fill="FBEFD8" w:color="auto" w:val="clear"/>
             <w:tcMar>
               <w:top w:type="dxa" w:w="70"/>
               <w:left w:type="dxa" w:w="110"/>
@@ -19931,7 +20316,7 @@
                 <w:sz w:val="17"/>
                 <w:szCs w:val="17"/>
               </w:rPr>
-              <w:t xml:space="preserve">Planned</w:t>
+              <w:t xml:space="preserve">In progress</w:t>
             </w:r>
           </w:p>
         </w:tc>
@@ -21859,7 +22244,7 @@
                     </pic:cNvPicPr>
                   </pic:nvPicPr>
                   <pic:blipFill>
-                    <a:blip r:embed="rId47" cstate="none"/>
+                    <a:blip r:embed="rId50" cstate="none"/>
                     <a:srcRect/>
                     <a:stretch>
                       <a:fillRect/>
@@ -21966,7 +22351,7 @@
         <w:t xml:space="preserve">Tests that grow with the system.</w:t>
       </w:r>
       <w:r>
-        <w:t xml:space="preserve"> As of Sprint 12: 253 server test methods, 88 screen tests and 101 end-to-end browser steps, all passing.</w:t>
+        <w:t xml:space="preserve"> As of Sprint 13: 272 server test methods, 95 screen tests and 108 end-to-end browser steps, all passing.</w:t>
       </w:r>
     </w:p>
     <w:p>
@@ -23853,7 +24238,7 @@
         <w:sz w:val="16"/>
         <w:szCs w:val="16"/>
       </w:rPr>
-      <w:t xml:space="preserve">Version 1.12 · 25 October 2026</w:t>
+      <w:t xml:space="preserve">Version 1.13 · 26 October 2026</w:t>
     </w:r>
     <w:r>
       <w:rPr>

</xml_diff>

<commit_message>
chore(sprints): accept Sprint 13 (#143)
The owner accepted Sprint 13 (Housekeeping and maintenance, mobile-first) on 26 Oct 2026. Sprint 13 is marked done in sprints.yml and Sprint 14 (Menu, restaurant POS and KOT) is the current sprint. Sprint guides and catalogues regenerated, README, CHANGELOG, RUN_AND_TEST and the new-joiner guide updated, handbooks 1.13 rebuilt.

Co-Authored-By: Claude Opus 5.5 (1M context) <noreply@anthropic.com>
Claude-Session: https://claude.ai/code/session_01RThzxhyjdn2aAudczkz2kp
</commit_message>
<xml_diff>
--- a/docs/handbooks/Resort-OS-Product-Overview.docx
+++ b/docs/handbooks/Resort-OS-Product-Overview.docx
@@ -182,7 +182,7 @@
                 <w:sz w:val="19"/>
                 <w:szCs w:val="19"/>
               </w:rPr>
-              <w:t xml:space="preserve">Version 1.12</w:t>
+              <w:t xml:space="preserve">Version 1.13</w:t>
             </w:r>
           </w:p>
         </w:tc>
@@ -252,7 +252,7 @@
                 <w:sz w:val="19"/>
                 <w:szCs w:val="19"/>
               </w:rPr>
-              <w:t xml:space="preserve">25 October 2026</w:t>
+              <w:t xml:space="preserve">26 October 2026</w:t>
             </w:r>
           </w:p>
         </w:tc>
@@ -322,7 +322,7 @@
                 <w:sz w:val="19"/>
                 <w:szCs w:val="19"/>
               </w:rPr>
-              <w:t xml:space="preserve">Sprints 01, 02, 03, 04, 05, 06, 07, 08, 09, 10, 11, 12 accepted · Sprint 13 Housekeeping and maintenance (mobile-first) in progress</w:t>
+              <w:t xml:space="preserve">Sprints 01, 02, 03, 04, 05, 06, 07, 08, 09, 10, 11, 12, 13 accepted · Sprint 14 Menu, restaurant POS and KOT in progress</w:t>
             </w:r>
           </w:p>
         </w:tc>
@@ -661,7 +661,7 @@
                 <w:sz w:val="19"/>
                 <w:szCs w:val="19"/>
               </w:rPr>
-              <w:t xml:space="preserve">1.12</w:t>
+              <w:t xml:space="preserve">1.13</w:t>
             </w:r>
           </w:p>
         </w:tc>
@@ -691,7 +691,7 @@
                 <w:sz w:val="19"/>
                 <w:szCs w:val="19"/>
               </w:rPr>
-              <w:t xml:space="preserve">2026-10-25</w:t>
+              <w:t xml:space="preserve">2026-10-26</w:t>
             </w:r>
           </w:p>
         </w:tc>
@@ -721,7 +721,7 @@
                 <w:sz w:val="19"/>
                 <w:szCs w:val="19"/>
               </w:rPr>
-              <w:t xml:space="preserve">Sprint 12 (GST invoices, credit/debit notes, receipts) accepted: check-out issues a legally numbered GST invoice and a receipt for each payment by itself, numbers run with no gap per property and financial year, an issued invoice is never edited (a credit note cancels or reduces it, a debit note bills late charges), B2B invoices with the company's GSTIN checked under the field, place of supply is the resort's state, A4 PDFs to download or print. Invoice flow diagram. Sprint 13 started.</w:t>
+              <w:t xml:space="preserve">Sprint 13 (Housekeeping and maintenance, mobile-first) accepted: a check-out puts the room on the housekeeper's phone as a cleaning task, two taps to clean it (Start, Done), a supervisor marks it ready or sends it back saying what to redo, checklists per kind of cleaning, staff report repairs with photos from their phone, a broken room can be taken out of order so nobody sells it and goes back to cleaning once the repair is resolved. Housekeeping flow diagram. Sprint 14 started.</w:t>
             </w:r>
           </w:p>
         </w:tc>
@@ -757,7 +757,7 @@
                 <w:sz w:val="19"/>
                 <w:szCs w:val="19"/>
               </w:rPr>
-              <w:t xml:space="preserve">1.11</w:t>
+              <w:t xml:space="preserve">1.12</w:t>
             </w:r>
           </w:p>
         </w:tc>
@@ -788,7 +788,7 @@
                 <w:sz w:val="19"/>
                 <w:szCs w:val="19"/>
               </w:rPr>
-              <w:t xml:space="preserve">2026-10-23</w:t>
+              <w:t xml:space="preserve">2026-10-25</w:t>
             </w:r>
           </w:p>
         </w:tc>
@@ -819,7 +819,7 @@
                 <w:sz w:val="19"/>
                 <w:szCs w:val="19"/>
               </w:rPr>
-              <w:t xml:space="preserve">Sprint 11 (Razorpay) accepted: payment links sent from a booking, the guest pays on their phone with UPI or a card through Razorpay with no sign-in, only Razorpay's signed webhook records the payment (once, whatever the order) and confirms a pending booking, declined tries shown with the reason, online refunds back through Razorpay, a built-in test Razorpay when no keys are set. Razorpay flow diagram. Sprint 12 started.</w:t>
+              <w:t xml:space="preserve">Sprint 12 (GST invoices, credit/debit notes, receipts) accepted: check-out issues a legally numbered GST invoice and a receipt for each payment by itself, numbers run with no gap per property and financial year, an issued invoice is never edited (a credit note cancels or reduces it, a debit note bills late charges), B2B invoices with the company's GSTIN checked under the field, place of supply is the resort's state, A4 PDFs to download or print. Invoice flow diagram. Sprint 13 started.</w:t>
             </w:r>
           </w:p>
         </w:tc>
@@ -854,7 +854,7 @@
                 <w:sz w:val="19"/>
                 <w:szCs w:val="19"/>
               </w:rPr>
-              <w:t xml:space="preserve">1.10</w:t>
+              <w:t xml:space="preserve">1.11</w:t>
             </w:r>
           </w:p>
         </w:tc>
@@ -884,7 +884,7 @@
                 <w:sz w:val="19"/>
                 <w:szCs w:val="19"/>
               </w:rPr>
-              <w:t xml:space="preserve">2026-10-20</w:t>
+              <w:t xml:space="preserve">2026-10-23</w:t>
             </w:r>
           </w:p>
         </w:tc>
@@ -914,7 +914,7 @@
                 <w:sz w:val="19"/>
                 <w:szCs w:val="19"/>
               </w:rPr>
-              <w:t xml:space="preserve">Sprint 10 (Payments, refunds, cash drawer) accepted: cash, UPI, card and bank payments on the bill or on account, refunds with a reason that can never exceed the payment, voids, the cash drawer opened and closed against a count with manager approval of a shortfall, no card data stored, real balances at check-out. Payment flow diagram. Sprint 11 (Razorpay) started.</w:t>
+              <w:t xml:space="preserve">Sprint 11 (Razorpay) accepted: payment links sent from a booking, the guest pays on their phone with UPI or a card through Razorpay with no sign-in, only Razorpay's signed webhook records the payment (once, whatever the order) and confirms a pending booking, declined tries shown with the reason, online refunds back through Razorpay, a built-in test Razorpay when no keys are set. Razorpay flow diagram. Sprint 12 started.</w:t>
             </w:r>
           </w:p>
         </w:tc>
@@ -950,7 +950,7 @@
                 <w:sz w:val="19"/>
                 <w:szCs w:val="19"/>
               </w:rPr>
-              <w:t xml:space="preserve">1.9</w:t>
+              <w:t xml:space="preserve">1.10</w:t>
             </w:r>
           </w:p>
         </w:tc>
@@ -1012,7 +1012,7 @@
                 <w:sz w:val="19"/>
                 <w:szCs w:val="19"/>
               </w:rPr>
-              <w:t xml:space="preserve">Sprint 09 (GST configuration and tax engine) accepted: GST worked out on every charge (CGST + SGST or IGST), rates kept as rules with dates that an accountant changes from next month without a software update, room GST by the price per room per night, posted charges keep their GST. Tax flow diagram. Sprint 10 (Payments, refunds, cash drawer) started.</w:t>
+              <w:t xml:space="preserve">Sprint 10 (Payments, refunds, cash drawer) accepted: cash, UPI, card and bank payments on the bill or on account, refunds with a reason that can never exceed the payment, voids, the cash drawer opened and closed against a count with manager approval of a shortfall, no card data stored, real balances at check-out. Payment flow diagram. Sprint 11 (Razorpay) started.</w:t>
             </w:r>
           </w:p>
         </w:tc>
@@ -1047,7 +1047,7 @@
                 <w:sz w:val="19"/>
                 <w:szCs w:val="19"/>
               </w:rPr>
-              <w:t xml:space="preserve">1.8</w:t>
+              <w:t xml:space="preserve">1.9</w:t>
             </w:r>
           </w:p>
         </w:tc>
@@ -1077,7 +1077,7 @@
                 <w:sz w:val="19"/>
                 <w:szCs w:val="19"/>
               </w:rPr>
-              <w:t xml:space="preserve">2026-10-18</w:t>
+              <w:t xml:space="preserve">2026-10-20</w:t>
             </w:r>
           </w:p>
         </w:tc>
@@ -1107,7 +1107,7 @@
                 <w:sz w:val="19"/>
                 <w:szCs w:val="19"/>
               </w:rPr>
-              <w:t xml:space="preserve">Sprint 08 (Folio) accepted: a running bill for every stay with room nights, meals, transport, activities and packages; nothing can be edited or deleted, a manager reverses a line with a reason; bills can be split; the front desk shows the real balance. Folio flow diagram. Sprint 09 (GST configuration and tax engine) started.</w:t>
+              <w:t xml:space="preserve">Sprint 09 (GST configuration and tax engine) accepted: GST worked out on every charge (CGST + SGST or IGST), rates kept as rules with dates that an accountant changes from next month without a software update, room GST by the price per room per night, posted charges keep their GST. Tax flow diagram. Sprint 10 (Payments, refunds, cash drawer) started.</w:t>
             </w:r>
           </w:p>
         </w:tc>
@@ -1143,7 +1143,7 @@
                 <w:sz w:val="19"/>
                 <w:szCs w:val="19"/>
               </w:rPr>
-              <w:t xml:space="preserve">1.7</w:t>
+              <w:t xml:space="preserve">1.8</w:t>
             </w:r>
           </w:p>
         </w:tc>
@@ -1205,7 +1205,7 @@
                 <w:sz w:val="19"/>
                 <w:szCs w:val="19"/>
               </w:rPr>
-              <w:t xml:space="preserve">Sprint 07 (Front desk) accepted: arrivals, departures and in-house lists, check-in and check-out in a few clicks, walk-ins on one screen, early departures with a reason, rooms marked dirty and ready. Check-in flow diagram. Sprint 08 (Folio) started.</w:t>
+              <w:t xml:space="preserve">Sprint 08 (Folio) accepted: a running bill for every stay with room nights, meals, transport, activities and packages; nothing can be edited or deleted, a manager reverses a line with a reason; bills can be split; the front desk shows the real balance. Folio flow diagram. Sprint 09 (GST configuration and tax engine) started.</w:t>
             </w:r>
           </w:p>
         </w:tc>
@@ -1240,7 +1240,7 @@
                 <w:sz w:val="19"/>
                 <w:szCs w:val="19"/>
               </w:rPr>
-              <w:t xml:space="preserve">1.6</w:t>
+              <w:t xml:space="preserve">1.7</w:t>
             </w:r>
           </w:p>
         </w:tc>
@@ -1270,7 +1270,7 @@
                 <w:sz w:val="19"/>
                 <w:szCs w:val="19"/>
               </w:rPr>
-              <w:t xml:space="preserve">2026-10-17</w:t>
+              <w:t xml:space="preserve">2026-10-18</w:t>
             </w:r>
           </w:p>
         </w:tc>
@@ -1300,7 +1300,7 @@
                 <w:sz w:val="19"/>
                 <w:szCs w:val="19"/>
               </w:rPr>
-              <w:t xml:space="preserve">Sprint 06 (Reservation calendar) accepted: day, week and month calendar of rooms and dorm beds, moving a guest by drag-and-drop with a reason, list by day on phones. Room-move flow diagram. Sprint 07 (Front desk) started.</w:t>
+              <w:t xml:space="preserve">Sprint 07 (Front desk) accepted: arrivals, departures and in-house lists, check-in and check-out in a few clicks, walk-ins on one screen, early departures with a reason, rooms marked dirty and ready. Check-in flow diagram. Sprint 08 (Folio) started.</w:t>
             </w:r>
           </w:p>
         </w:tc>
@@ -1336,7 +1336,7 @@
                 <w:sz w:val="19"/>
                 <w:szCs w:val="19"/>
               </w:rPr>
-              <w:t xml:space="preserve">1.5</w:t>
+              <w:t xml:space="preserve">1.6</w:t>
             </w:r>
           </w:p>
         </w:tc>
@@ -1367,7 +1367,7 @@
                 <w:sz w:val="19"/>
                 <w:szCs w:val="19"/>
               </w:rPr>
-              <w:t xml:space="preserve">2026-10-15</w:t>
+              <w:t xml:space="preserve">2026-10-17</w:t>
             </w:r>
           </w:p>
         </w:tc>
@@ -1398,7 +1398,7 @@
                 <w:sz w:val="19"/>
                 <w:szCs w:val="19"/>
               </w:rPr>
-              <w:t xml:space="preserve">Sprint 05 (Availability engine and reservations) accepted: race-free booking, booking wizard, booking history, date pickers. Diagrams of the reservation tables and the booking flow. Sprint 06 (Reservation calendar) started.</w:t>
+              <w:t xml:space="preserve">Sprint 06 (Reservation calendar) accepted: day, week and month calendar of rooms and dorm beds, moving a guest by drag-and-drop with a reason, list by day on phones. Room-move flow diagram. Sprint 07 (Front desk) started.</w:t>
             </w:r>
           </w:p>
         </w:tc>
@@ -1433,7 +1433,7 @@
                 <w:sz w:val="19"/>
                 <w:szCs w:val="19"/>
               </w:rPr>
-              <w:t xml:space="preserve">1.4</w:t>
+              <w:t xml:space="preserve">1.5</w:t>
             </w:r>
           </w:p>
         </w:tc>
@@ -1463,7 +1463,7 @@
                 <w:sz w:val="19"/>
                 <w:szCs w:val="19"/>
               </w:rPr>
-              <w:t xml:space="preserve">2026-10-14</w:t>
+              <w:t xml:space="preserve">2026-10-15</w:t>
             </w:r>
           </w:p>
         </w:tc>
@@ -1493,7 +1493,7 @@
                 <w:sz w:val="19"/>
                 <w:szCs w:val="19"/>
               </w:rPr>
-              <w:t xml:space="preserve">Sprint 04 (Rate plans and packages) accepted: nightly price grid, quotes, packages with revenue split. Sprint 05 (Availability engine and reservations) started.</w:t>
+              <w:t xml:space="preserve">Sprint 05 (Availability engine and reservations) accepted: race-free booking, booking wizard, booking history, date pickers. Diagrams of the reservation tables and the booking flow. Sprint 06 (Reservation calendar) started.</w:t>
             </w:r>
           </w:p>
         </w:tc>
@@ -1529,7 +1529,7 @@
                 <w:sz w:val="19"/>
                 <w:szCs w:val="19"/>
               </w:rPr>
-              <w:t xml:space="preserve">1.3</w:t>
+              <w:t xml:space="preserve">1.4</w:t>
             </w:r>
           </w:p>
         </w:tc>
@@ -1560,7 +1560,7 @@
                 <w:sz w:val="19"/>
                 <w:szCs w:val="19"/>
               </w:rPr>
-              <w:t xml:space="preserve">2026-10-11</w:t>
+              <w:t xml:space="preserve">2026-10-14</w:t>
             </w:r>
           </w:p>
         </w:tc>
@@ -1591,7 +1591,7 @@
                 <w:sz w:val="19"/>
                 <w:szCs w:val="19"/>
               </w:rPr>
-              <w:t xml:space="preserve">Sprint 03 (Guests) accepted, with review fixes: Aadhaar number check and error messages that say why. Sprint 04 (Rate plans and packages) started.</w:t>
+              <w:t xml:space="preserve">Sprint 04 (Rate plans and packages) accepted: nightly price grid, quotes, packages with revenue split. Sprint 05 (Availability engine and reservations) started.</w:t>
             </w:r>
           </w:p>
         </w:tc>
@@ -1626,7 +1626,7 @@
                 <w:sz w:val="19"/>
                 <w:szCs w:val="19"/>
               </w:rPr>
-              <w:t xml:space="preserve">1.2.1</w:t>
+              <w:t xml:space="preserve">1.3</w:t>
             </w:r>
           </w:p>
         </w:tc>
@@ -1656,7 +1656,7 @@
                 <w:sz w:val="19"/>
                 <w:szCs w:val="19"/>
               </w:rPr>
-              <w:t xml:space="preserve">2026-10-10</w:t>
+              <w:t xml:space="preserve">2026-10-11</w:t>
             </w:r>
           </w:p>
         </w:tc>
@@ -1686,7 +1686,7 @@
                 <w:sz w:val="19"/>
                 <w:szCs w:val="19"/>
               </w:rPr>
-              <w:t xml:space="preserve">Sprint 03 (Guests) built and in review: guest profiles, encrypted ID documents, duplicates, merge, anonymise, consent.</w:t>
+              <w:t xml:space="preserve">Sprint 03 (Guests) accepted, with review fixes: Aadhaar number check and error messages that say why. Sprint 04 (Rate plans and packages) started.</w:t>
             </w:r>
           </w:p>
         </w:tc>
@@ -1722,6 +1722,103 @@
                 <w:sz w:val="19"/>
                 <w:szCs w:val="19"/>
               </w:rPr>
+              <w:t xml:space="preserve">1.2.1</w:t>
+            </w:r>
+          </w:p>
+        </w:tc>
+        <w:tc>
+          <w:tcPr>
+            <w:tcW w:type="dxa" w:w="1500"/>
+            <w:tcBorders>
+              <w:top w:val="single" w:color="DCE3E1" w:sz="4"/>
+              <w:left w:val="single" w:color="DCE3E1" w:sz="4"/>
+              <w:bottom w:val="single" w:color="DCE3E1" w:sz="4"/>
+              <w:right w:val="single" w:color="DCE3E1" w:sz="4"/>
+            </w:tcBorders>
+            <w:shd w:fill="F5F7F6" w:color="auto" w:val="clear"/>
+            <w:tcMar>
+              <w:top w:type="dxa" w:w="70"/>
+              <w:left w:type="dxa" w:w="110"/>
+              <w:bottom w:type="dxa" w:w="50"/>
+              <w:right w:type="dxa" w:w="110"/>
+            </w:tcMar>
+            <w:vAlign w:val="top"/>
+          </w:tcPr>
+          <w:p>
+            <w:pPr>
+              <w:spacing w:after="40" w:line="252" w:lineRule="auto"/>
+            </w:pPr>
+            <w:r>
+              <w:rPr>
+                <w:sz w:val="19"/>
+                <w:szCs w:val="19"/>
+              </w:rPr>
+              <w:t xml:space="preserve">2026-10-10</w:t>
+            </w:r>
+          </w:p>
+        </w:tc>
+        <w:tc>
+          <w:tcPr>
+            <w:tcW w:type="dxa" w:w="6714"/>
+            <w:tcBorders>
+              <w:top w:val="single" w:color="DCE3E1" w:sz="4"/>
+              <w:left w:val="single" w:color="DCE3E1" w:sz="4"/>
+              <w:bottom w:val="single" w:color="DCE3E1" w:sz="4"/>
+              <w:right w:val="single" w:color="DCE3E1" w:sz="4"/>
+            </w:tcBorders>
+            <w:shd w:fill="F5F7F6" w:color="auto" w:val="clear"/>
+            <w:tcMar>
+              <w:top w:type="dxa" w:w="70"/>
+              <w:left w:type="dxa" w:w="110"/>
+              <w:bottom w:type="dxa" w:w="50"/>
+              <w:right w:type="dxa" w:w="110"/>
+            </w:tcMar>
+            <w:vAlign w:val="top"/>
+          </w:tcPr>
+          <w:p>
+            <w:pPr>
+              <w:spacing w:after="40" w:line="252" w:lineRule="auto"/>
+            </w:pPr>
+            <w:r>
+              <w:rPr>
+                <w:sz w:val="19"/>
+                <w:szCs w:val="19"/>
+              </w:rPr>
+              <w:t xml:space="preserve">Sprint 03 (Guests) built and in review: guest profiles, encrypted ID documents, duplicates, merge, anonymise, consent.</w:t>
+            </w:r>
+          </w:p>
+        </w:tc>
+      </w:tr>
+      <w:tr>
+        <w:trPr>
+          <w:cantSplit/>
+        </w:trPr>
+        <w:tc>
+          <w:tcPr>
+            <w:tcW w:type="dxa" w:w="1100"/>
+            <w:tcBorders>
+              <w:top w:val="single" w:color="DCE3E1" w:sz="4"/>
+              <w:left w:val="single" w:color="DCE3E1" w:sz="4"/>
+              <w:bottom w:val="single" w:color="DCE3E1" w:sz="4"/>
+              <w:right w:val="single" w:color="DCE3E1" w:sz="4"/>
+            </w:tcBorders>
+            <w:tcMar>
+              <w:top w:type="dxa" w:w="70"/>
+              <w:left w:type="dxa" w:w="110"/>
+              <w:bottom w:type="dxa" w:w="50"/>
+              <w:right w:type="dxa" w:w="110"/>
+            </w:tcMar>
+            <w:vAlign w:val="top"/>
+          </w:tcPr>
+          <w:p>
+            <w:pPr>
+              <w:spacing w:after="40" w:line="252" w:lineRule="auto"/>
+            </w:pPr>
+            <w:r>
+              <w:rPr>
+                <w:sz w:val="19"/>
+                <w:szCs w:val="19"/>
+              </w:rPr>
               <w:t xml:space="preserve">1.2</w:t>
             </w:r>
           </w:p>
@@ -1735,7 +1832,6 @@
               <w:bottom w:val="single" w:color="DCE3E1" w:sz="4"/>
               <w:right w:val="single" w:color="DCE3E1" w:sz="4"/>
             </w:tcBorders>
-            <w:shd w:fill="F5F7F6" w:color="auto" w:val="clear"/>
             <w:tcMar>
               <w:top w:type="dxa" w:w="70"/>
               <w:left w:type="dxa" w:w="110"/>
@@ -1766,7 +1862,6 @@
               <w:bottom w:val="single" w:color="DCE3E1" w:sz="4"/>
               <w:right w:val="single" w:color="DCE3E1" w:sz="4"/>
             </w:tcBorders>
-            <w:shd w:fill="F5F7F6" w:color="auto" w:val="clear"/>
             <w:tcMar>
               <w:top w:type="dxa" w:w="70"/>
               <w:left w:type="dxa" w:w="110"/>
@@ -2017,7 +2112,7 @@
                 <w:sz w:val="19"/>
                 <w:szCs w:val="19"/>
               </w:rPr>
-              <w:t xml:space="preserve">Living document, rebuilt at the end of every sprint. This edition reflects Sprint 12 accepted and Sprint 13 in progress.</w:t>
+              <w:t xml:space="preserve">Living document, rebuilt at the end of every sprint. This edition reflects Sprint 13 accepted and Sprint 14 in progress.</w:t>
             </w:r>
           </w:p>
         </w:tc>
@@ -3001,7 +3096,33 @@
           <w:sz w:val="19"/>
           <w:szCs w:val="19"/>
         </w:rPr>
-        <w:t xml:space="preserve">In progress: Sprint 13 — Housekeeping and maintenance (mobile-first)</w:t>
+        <w:t xml:space="preserve">Sprint 13 — Housekeeping and maintenance (mobile-first)</w:t>
+      </w:r>
+    </w:p>
+    <w:p>
+      <w:pPr>
+        <w:spacing w:after="30" w:before="0"/>
+        <w:ind w:left="420"/>
+      </w:pPr>
+      <w:r>
+        <w:rPr>
+          <w:b w:val="false"/>
+          <w:bCs w:val="false"/>
+          <w:color w:val="8A2449"/>
+          <w:sz w:val="19"/>
+          <w:szCs w:val="19"/>
+        </w:rPr>
+        <w:t xml:space="preserve">9.14  </w:t>
+      </w:r>
+      <w:r>
+        <w:rPr>
+          <w:b w:val="false"/>
+          <w:bCs w:val="false"/>
+          <w:color w:val="1B2A2E"/>
+          <w:sz w:val="19"/>
+          <w:szCs w:val="19"/>
+        </w:rPr>
+        <w:t xml:space="preserve">In progress: Sprint 14 — Menu, restaurant POS and KOT</w:t>
       </w:r>
     </w:p>
     <w:p>
@@ -3324,7 +3445,7 @@
                 <w:sz w:val="40"/>
                 <w:szCs w:val="40"/>
               </w:rPr>
-              <w:t xml:space="preserve">12 of 29</w:t>
+              <w:t xml:space="preserve">13 of 29</w:t>
             </w:r>
           </w:p>
           <w:p>
@@ -3689,7 +3810,7 @@
                 <w:sz w:val="19"/>
                 <w:szCs w:val="19"/>
               </w:rPr>
-              <w:t xml:space="preserve">Sprints 01 and 02 and 03 and 04 and 05 and 06 and 07 and 08 and 09 and 10 and 11 and 12 are delivered and accepted. Sprint 13 (Housekeeping and maintenance (mobile-first)) is in progress.</w:t>
+              <w:t xml:space="preserve">Sprints 01 and 02 and 03 and 04 and 05 and 06 and 07 and 08 and 09 and 10 and 11 and 12 and 13 are delivered and accepted. Sprint 14 (Menu, restaurant POS and KOT) is in progress.</w:t>
             </w:r>
           </w:p>
         </w:tc>
@@ -6517,25 +6638,25 @@
               <w:bottom w:val="single" w:color="DCE3E1" w:sz="4"/>
               <w:right w:val="single" w:color="DCE3E1" w:sz="4"/>
             </w:tcBorders>
-            <w:shd w:fill="FBEFD8" w:color="auto" w:val="clear"/>
-            <w:tcMar>
-              <w:top w:type="dxa" w:w="70"/>
-              <w:left w:type="dxa" w:w="110"/>
-              <w:bottom w:type="dxa" w:w="50"/>
-              <w:right w:type="dxa" w:w="110"/>
-            </w:tcMar>
-            <w:vAlign w:val="top"/>
-          </w:tcPr>
-          <w:p>
-            <w:pPr>
-              <w:spacing w:after="40" w:line="252" w:lineRule="auto"/>
-            </w:pPr>
-            <w:r>
-              <w:rPr>
-                <w:sz w:val="19"/>
-                <w:szCs w:val="19"/>
-              </w:rPr>
-              <w:t xml:space="preserve">In progress</w:t>
+            <w:shd w:fill="E3F0E6" w:color="auto" w:val="clear"/>
+            <w:tcMar>
+              <w:top w:type="dxa" w:w="70"/>
+              <w:left w:type="dxa" w:w="110"/>
+              <w:bottom w:type="dxa" w:w="50"/>
+              <w:right w:type="dxa" w:w="110"/>
+            </w:tcMar>
+            <w:vAlign w:val="top"/>
+          </w:tcPr>
+          <w:p>
+            <w:pPr>
+              <w:spacing w:after="40" w:line="252" w:lineRule="auto"/>
+            </w:pPr>
+            <w:r>
+              <w:rPr>
+                <w:sz w:val="19"/>
+                <w:szCs w:val="19"/>
+              </w:rPr>
+              <w:t xml:space="preserve">Done</w:t>
             </w:r>
           </w:p>
         </w:tc>
@@ -6753,24 +6874,25 @@
               <w:bottom w:val="single" w:color="DCE3E1" w:sz="4"/>
               <w:right w:val="single" w:color="DCE3E1" w:sz="4"/>
             </w:tcBorders>
-            <w:tcMar>
-              <w:top w:type="dxa" w:w="70"/>
-              <w:left w:type="dxa" w:w="110"/>
-              <w:bottom w:type="dxa" w:w="50"/>
-              <w:right w:type="dxa" w:w="110"/>
-            </w:tcMar>
-            <w:vAlign w:val="top"/>
-          </w:tcPr>
-          <w:p>
-            <w:pPr>
-              <w:spacing w:after="40" w:line="252" w:lineRule="auto"/>
-            </w:pPr>
-            <w:r>
-              <w:rPr>
-                <w:sz w:val="19"/>
-                <w:szCs w:val="19"/>
-              </w:rPr>
-              <w:t xml:space="preserve">Planned</w:t>
+            <w:shd w:fill="FBEFD8" w:color="auto" w:val="clear"/>
+            <w:tcMar>
+              <w:top w:type="dxa" w:w="70"/>
+              <w:left w:type="dxa" w:w="110"/>
+              <w:bottom w:type="dxa" w:w="50"/>
+              <w:right w:type="dxa" w:w="110"/>
+            </w:tcMar>
+            <w:vAlign w:val="top"/>
+          </w:tcPr>
+          <w:p>
+            <w:pPr>
+              <w:spacing w:after="40" w:line="252" w:lineRule="auto"/>
+            </w:pPr>
+            <w:r>
+              <w:rPr>
+                <w:sz w:val="19"/>
+                <w:szCs w:val="19"/>
+              </w:rPr>
+              <w:t xml:space="preserve">In progress</w:t>
             </w:r>
           </w:p>
         </w:tc>
@@ -13057,7 +13179,7 @@
     </w:p>
     <w:p>
       <w:r>
-        <w:t xml:space="preserve">Work is delivered in short sprints, and each one ends with the owner trying the new screens and accepting them. These are the parts that are built, tested and accepted as of Sprint 12.</w:t>
+        <w:t xml:space="preserve">Work is delivered in short sprints, and each one ends with the owner trying the new screens and accepting them. These are the parts that are built, tested and accepted as of Sprint 13.</w:t>
       </w:r>
     </w:p>
     <w:p>
@@ -16301,12 +16423,273 @@
         <w:pStyle w:val="Heading2"/>
       </w:pPr>
       <w:r>
-        <w:t xml:space="preserve">9.13   In progress: Sprint 13 — Housekeeping and maintenance (mobile-first)</w:t>
+        <w:t xml:space="preserve">9.13   Sprint 13 — Housekeeping and maintenance (mobile-first)</w:t>
       </w:r>
     </w:p>
     <w:p>
       <w:r>
         <w:t xml:space="preserve">Housekeeping and maintenance staff see their tasks on their phones, update room status, and report repairs with photos.</w:t>
+      </w:r>
+    </w:p>
+    <w:p>
+      <w:pPr>
+        <w:pStyle w:val="ListParagraph"/>
+        <w:numPr>
+          <w:ilvl w:val="0"/>
+          <w:numId w:val="2"/>
+        </w:numPr>
+        <w:spacing w:after="60"/>
+      </w:pPr>
+      <w:r>
+        <w:t xml:space="preserve">When a guest checks out, the room appears on the housekeeper's phone by itself</w:t>
+      </w:r>
+    </w:p>
+    <w:p>
+      <w:pPr>
+        <w:pStyle w:val="ListParagraph"/>
+        <w:numPr>
+          <w:ilvl w:val="0"/>
+          <w:numId w:val="2"/>
+        </w:numPr>
+        <w:spacing w:after="60"/>
+      </w:pPr>
+      <w:r>
+        <w:t xml:space="preserve">A housekeeper finishes a room in two taps; a supervisor marks it ready or sends it back saying what to redo</w:t>
+      </w:r>
+    </w:p>
+    <w:p>
+      <w:pPr>
+        <w:pStyle w:val="ListParagraph"/>
+        <w:numPr>
+          <w:ilvl w:val="0"/>
+          <w:numId w:val="2"/>
+        </w:numPr>
+        <w:spacing w:after="60"/>
+      </w:pPr>
+      <w:r>
+        <w:t xml:space="preserve">Rooms a guest arrives in today are shown first</w:t>
+      </w:r>
+    </w:p>
+    <w:p>
+      <w:pPr>
+        <w:pStyle w:val="ListParagraph"/>
+        <w:numPr>
+          <w:ilvl w:val="0"/>
+          <w:numId w:val="2"/>
+        </w:numPr>
+        <w:spacing w:after="60"/>
+      </w:pPr>
+      <w:r>
+        <w:t xml:space="preserve">Staff report a repair with photos from their phone; a broken room can be taken out of order so it isn't sold</w:t>
+      </w:r>
+    </w:p>
+    <w:p>
+      <w:pPr>
+        <w:pStyle w:val="ListParagraph"/>
+        <w:numPr>
+          <w:ilvl w:val="0"/>
+          <w:numId w:val="2"/>
+        </w:numPr>
+        <w:spacing w:after="60"/>
+      </w:pPr>
+      <w:r>
+        <w:t xml:space="preserve">A repaired room goes back to cleaning before it can be sold again</w:t>
+      </w:r>
+    </w:p>
+    <w:p>
+      <w:pPr>
+        <w:keepNext/>
+        <w:pBdr>
+          <w:top w:val="single" w:color="DCE3E1" w:sz="4"/>
+          <w:bottom w:val="single" w:color="DCE3E1" w:sz="4"/>
+          <w:left w:val="single" w:color="DCE3E1" w:sz="4"/>
+          <w:right w:val="single" w:color="DCE3E1" w:sz="4"/>
+        </w:pBdr>
+        <w:spacing w:before="120" w:after="0" w:line="240" w:lineRule="auto"/>
+        <w:jc w:val="center"/>
+      </w:pPr>
+      <w:r>
+        <w:drawing>
+          <wp:inline distT="0" distB="0" distL="0" distR="0">
+            <wp:extent cx="5124450" cy="11106150"/>
+            <wp:effectExtent t="0" r="0" b="0" l="0"/>
+            <wp:docPr id="1" name="The housekeeper's phone after a check-out" descr="The housekeeper's phone after a check-out" title="The housekeeper's phone after a check-out"/>
+            <wp:cNvGraphicFramePr>
+              <a:graphicFrameLocks xmlns:a="http://schemas.openxmlformats.org/drawingml/2006/main" noChangeAspect="1"/>
+            </wp:cNvGraphicFramePr>
+            <a:graphic xmlns:a="http://schemas.openxmlformats.org/drawingml/2006/main">
+              <a:graphicData uri="http://schemas.openxmlformats.org/drawingml/2006/picture">
+                <pic:pic xmlns:pic="http://schemas.openxmlformats.org/drawingml/2006/picture">
+                  <pic:nvPicPr>
+                    <pic:cNvPr id="0" name="" descr=""/>
+                    <pic:cNvPicPr>
+                      <a:picLocks noChangeAspect="1" noChangeArrowheads="1"/>
+                    </pic:cNvPicPr>
+                  </pic:nvPicPr>
+                  <pic:blipFill>
+                    <a:blip r:embed="rId47" cstate="none"/>
+                    <a:srcRect/>
+                    <a:stretch>
+                      <a:fillRect/>
+                    </a:stretch>
+                  </pic:blipFill>
+                  <pic:spPr bwMode="auto">
+                    <a:xfrm>
+                      <a:off x="0" y="0"/>
+                      <a:ext cx="5124450" cy="11106150"/>
+                    </a:xfrm>
+                    <a:prstGeom prst="rect">
+                      <a:avLst/>
+                    </a:prstGeom>
+                  </pic:spPr>
+                </pic:pic>
+              </a:graphicData>
+            </a:graphic>
+          </wp:inline>
+        </w:drawing>
+      </w:r>
+    </w:p>
+    <w:p>
+      <w:pPr>
+        <w:pStyle w:val="Caption"/>
+      </w:pPr>
+      <w:r>
+        <w:t xml:space="preserve">The housekeeper's phone after a check-out</w:t>
+      </w:r>
+    </w:p>
+    <w:p>
+      <w:pPr>
+        <w:keepNext/>
+        <w:pBdr>
+          <w:top w:val="single" w:color="DCE3E1" w:sz="4"/>
+          <w:bottom w:val="single" w:color="DCE3E1" w:sz="4"/>
+          <w:left w:val="single" w:color="DCE3E1" w:sz="4"/>
+          <w:right w:val="single" w:color="DCE3E1" w:sz="4"/>
+        </w:pBdr>
+        <w:spacing w:before="120" w:after="0" w:line="240" w:lineRule="auto"/>
+        <w:jc w:val="center"/>
+      </w:pPr>
+      <w:r>
+        <w:drawing>
+          <wp:inline distT="0" distB="0" distL="0" distR="0">
+            <wp:extent cx="5124450" cy="11106150"/>
+            <wp:effectExtent t="0" r="0" b="0" l="0"/>
+            <wp:docPr id="1" name="The supervisor sends a room back, saying what to redo" descr="The supervisor sends a room back, saying what to redo" title="The supervisor sends a room back, saying what to redo"/>
+            <wp:cNvGraphicFramePr>
+              <a:graphicFrameLocks xmlns:a="http://schemas.openxmlformats.org/drawingml/2006/main" noChangeAspect="1"/>
+            </wp:cNvGraphicFramePr>
+            <a:graphic xmlns:a="http://schemas.openxmlformats.org/drawingml/2006/main">
+              <a:graphicData uri="http://schemas.openxmlformats.org/drawingml/2006/picture">
+                <pic:pic xmlns:pic="http://schemas.openxmlformats.org/drawingml/2006/picture">
+                  <pic:nvPicPr>
+                    <pic:cNvPr id="0" name="" descr=""/>
+                    <pic:cNvPicPr>
+                      <a:picLocks noChangeAspect="1" noChangeArrowheads="1"/>
+                    </pic:cNvPicPr>
+                  </pic:nvPicPr>
+                  <pic:blipFill>
+                    <a:blip r:embed="rId48" cstate="none"/>
+                    <a:srcRect/>
+                    <a:stretch>
+                      <a:fillRect/>
+                    </a:stretch>
+                  </pic:blipFill>
+                  <pic:spPr bwMode="auto">
+                    <a:xfrm>
+                      <a:off x="0" y="0"/>
+                      <a:ext cx="5124450" cy="11106150"/>
+                    </a:xfrm>
+                    <a:prstGeom prst="rect">
+                      <a:avLst/>
+                    </a:prstGeom>
+                  </pic:spPr>
+                </pic:pic>
+              </a:graphicData>
+            </a:graphic>
+          </wp:inline>
+        </w:drawing>
+      </w:r>
+    </w:p>
+    <w:p>
+      <w:pPr>
+        <w:pStyle w:val="Caption"/>
+      </w:pPr>
+      <w:r>
+        <w:t xml:space="preserve">The supervisor sends a room back, saying what to redo</w:t>
+      </w:r>
+    </w:p>
+    <w:p>
+      <w:pPr>
+        <w:keepNext/>
+        <w:pBdr>
+          <w:top w:val="single" w:color="DCE3E1" w:sz="4"/>
+          <w:bottom w:val="single" w:color="DCE3E1" w:sz="4"/>
+          <w:left w:val="single" w:color="DCE3E1" w:sz="4"/>
+          <w:right w:val="single" w:color="DCE3E1" w:sz="4"/>
+        </w:pBdr>
+        <w:spacing w:before="120" w:after="0" w:line="240" w:lineRule="auto"/>
+        <w:jc w:val="center"/>
+      </w:pPr>
+      <w:r>
+        <w:drawing>
+          <wp:inline distT="0" distB="0" distL="0" distR="0">
+            <wp:extent cx="5124450" cy="3438525"/>
+            <wp:effectExtent t="0" r="0" b="0" l="0"/>
+            <wp:docPr id="1" name="Room status with today's cleaning state" descr="Room status with today's cleaning state" title="Room status with today's cleaning state"/>
+            <wp:cNvGraphicFramePr>
+              <a:graphicFrameLocks xmlns:a="http://schemas.openxmlformats.org/drawingml/2006/main" noChangeAspect="1"/>
+            </wp:cNvGraphicFramePr>
+            <a:graphic xmlns:a="http://schemas.openxmlformats.org/drawingml/2006/main">
+              <a:graphicData uri="http://schemas.openxmlformats.org/drawingml/2006/picture">
+                <pic:pic xmlns:pic="http://schemas.openxmlformats.org/drawingml/2006/picture">
+                  <pic:nvPicPr>
+                    <pic:cNvPr id="0" name="" descr=""/>
+                    <pic:cNvPicPr>
+                      <a:picLocks noChangeAspect="1" noChangeArrowheads="1"/>
+                    </pic:cNvPicPr>
+                  </pic:nvPicPr>
+                  <pic:blipFill>
+                    <a:blip r:embed="rId49" cstate="none"/>
+                    <a:srcRect/>
+                    <a:stretch>
+                      <a:fillRect/>
+                    </a:stretch>
+                  </pic:blipFill>
+                  <pic:spPr bwMode="auto">
+                    <a:xfrm>
+                      <a:off x="0" y="0"/>
+                      <a:ext cx="5124450" cy="3438525"/>
+                    </a:xfrm>
+                    <a:prstGeom prst="rect">
+                      <a:avLst/>
+                    </a:prstGeom>
+                  </pic:spPr>
+                </pic:pic>
+              </a:graphicData>
+            </a:graphic>
+          </wp:inline>
+        </w:drawing>
+      </w:r>
+    </w:p>
+    <w:p>
+      <w:pPr>
+        <w:pStyle w:val="Caption"/>
+      </w:pPr>
+      <w:r>
+        <w:t xml:space="preserve">Room status with today's cleaning state</w:t>
+      </w:r>
+    </w:p>
+    <w:p>
+      <w:pPr>
+        <w:pStyle w:val="Heading2"/>
+      </w:pPr>
+      <w:r>
+        <w:t xml:space="preserve">9.14   In progress: Sprint 14 — Menu, restaurant POS and KOT</w:t>
+      </w:r>
+    </w:p>
+    <w:p>
+      <w:r>
+        <w:t xml:space="preserve">The restaurant takes orders by table, sends tickets to the kitchen, and charges in-house guests directly to their room.</w:t>
       </w:r>
     </w:p>
     <w:p>
@@ -16319,7 +16702,7 @@
           <w:sz w:val="18"/>
           <w:szCs w:val="18"/>
         </w:rPr>
-        <w:t xml:space="preserve">It will be accepted when: Housekeeper finishes a room in 2 taps; supervisor marks READY.</w:t>
+        <w:t xml:space="preserve">It will be accepted when: Waiter takes an order on a phone, kitchen sees the KOT, bill charged to room.</w:t>
       </w:r>
     </w:p>
     <w:p>
@@ -17104,25 +17487,25 @@
               <w:bottom w:val="single" w:color="DCE3E1" w:sz="4"/>
               <w:right w:val="single" w:color="DCE3E1" w:sz="4"/>
             </w:tcBorders>
-            <w:shd w:fill="FBEFD8" w:color="auto" w:val="clear"/>
-            <w:tcMar>
-              <w:top w:type="dxa" w:w="70"/>
-              <w:left w:type="dxa" w:w="110"/>
-              <w:bottom w:type="dxa" w:w="50"/>
-              <w:right w:type="dxa" w:w="110"/>
-            </w:tcMar>
-            <w:vAlign w:val="top"/>
-          </w:tcPr>
-          <w:p>
-            <w:pPr>
-              <w:spacing w:after="40" w:line="252" w:lineRule="auto"/>
-            </w:pPr>
-            <w:r>
-              <w:rPr>
-                <w:sz w:val="19"/>
-                <w:szCs w:val="19"/>
-              </w:rPr>
-              <w:t xml:space="preserve">In progress</w:t>
+            <w:shd w:fill="E3F0E6" w:color="auto" w:val="clear"/>
+            <w:tcMar>
+              <w:top w:type="dxa" w:w="70"/>
+              <w:left w:type="dxa" w:w="110"/>
+              <w:bottom w:type="dxa" w:w="50"/>
+              <w:right w:type="dxa" w:w="110"/>
+            </w:tcMar>
+            <w:vAlign w:val="top"/>
+          </w:tcPr>
+          <w:p>
+            <w:pPr>
+              <w:spacing w:after="40" w:line="252" w:lineRule="auto"/>
+            </w:pPr>
+            <w:r>
+              <w:rPr>
+                <w:sz w:val="19"/>
+                <w:szCs w:val="19"/>
+              </w:rPr>
+              <w:t xml:space="preserve">Done</w:t>
             </w:r>
           </w:p>
         </w:tc>
@@ -17230,24 +17613,25 @@
               <w:bottom w:val="single" w:color="DCE3E1" w:sz="4"/>
               <w:right w:val="single" w:color="DCE3E1" w:sz="4"/>
             </w:tcBorders>
-            <w:tcMar>
-              <w:top w:type="dxa" w:w="70"/>
-              <w:left w:type="dxa" w:w="110"/>
-              <w:bottom w:type="dxa" w:w="50"/>
-              <w:right w:type="dxa" w:w="110"/>
-            </w:tcMar>
-            <w:vAlign w:val="top"/>
-          </w:tcPr>
-          <w:p>
-            <w:pPr>
-              <w:spacing w:after="40" w:line="252" w:lineRule="auto"/>
-            </w:pPr>
-            <w:r>
-              <w:rPr>
-                <w:sz w:val="19"/>
-                <w:szCs w:val="19"/>
-              </w:rPr>
-              <w:t xml:space="preserve">Planned</w:t>
+            <w:shd w:fill="FBEFD8" w:color="auto" w:val="clear"/>
+            <w:tcMar>
+              <w:top w:type="dxa" w:w="70"/>
+              <w:left w:type="dxa" w:w="110"/>
+              <w:bottom w:type="dxa" w:w="50"/>
+              <w:right w:type="dxa" w:w="110"/>
+            </w:tcMar>
+            <w:vAlign w:val="top"/>
+          </w:tcPr>
+          <w:p>
+            <w:pPr>
+              <w:spacing w:after="40" w:line="252" w:lineRule="auto"/>
+            </w:pPr>
+            <w:r>
+              <w:rPr>
+                <w:sz w:val="19"/>
+                <w:szCs w:val="19"/>
+              </w:rPr>
+              <w:t xml:space="preserve">In progress</w:t>
             </w:r>
           </w:p>
         </w:tc>
@@ -19788,7 +20172,7 @@
               <w:bottom w:val="single" w:color="DCE3E1" w:sz="4"/>
               <w:right w:val="single" w:color="DCE3E1" w:sz="4"/>
             </w:tcBorders>
-            <w:shd w:fill="FBEFD8" w:color="auto" w:val="clear"/>
+            <w:shd w:fill="E3F0E6" w:color="auto" w:val="clear"/>
             <w:tcMar>
               <w:top w:type="dxa" w:w="70"/>
               <w:left w:type="dxa" w:w="110"/>
@@ -19806,7 +20190,7 @@
                 <w:sz w:val="17"/>
                 <w:szCs w:val="17"/>
               </w:rPr>
-              <w:t xml:space="preserve">In progress</w:t>
+              <w:t xml:space="preserve">Done</w:t>
             </w:r>
           </w:p>
         </w:tc>
@@ -19914,6 +20298,7 @@
               <w:bottom w:val="single" w:color="DCE3E1" w:sz="4"/>
               <w:right w:val="single" w:color="DCE3E1" w:sz="4"/>
             </w:tcBorders>
+            <w:shd w:fill="FBEFD8" w:color="auto" w:val="clear"/>
             <w:tcMar>
               <w:top w:type="dxa" w:w="70"/>
               <w:left w:type="dxa" w:w="110"/>
@@ -19931,7 +20316,7 @@
                 <w:sz w:val="17"/>
                 <w:szCs w:val="17"/>
               </w:rPr>
-              <w:t xml:space="preserve">Planned</w:t>
+              <w:t xml:space="preserve">In progress</w:t>
             </w:r>
           </w:p>
         </w:tc>
@@ -21859,7 +22244,7 @@
                     </pic:cNvPicPr>
                   </pic:nvPicPr>
                   <pic:blipFill>
-                    <a:blip r:embed="rId47" cstate="none"/>
+                    <a:blip r:embed="rId50" cstate="none"/>
                     <a:srcRect/>
                     <a:stretch>
                       <a:fillRect/>
@@ -21966,7 +22351,7 @@
         <w:t xml:space="preserve">Tests that grow with the system.</w:t>
       </w:r>
       <w:r>
-        <w:t xml:space="preserve"> As of Sprint 12: 253 server test methods, 88 screen tests and 101 end-to-end browser steps, all passing.</w:t>
+        <w:t xml:space="preserve"> As of Sprint 13: 272 server test methods, 95 screen tests and 108 end-to-end browser steps, all passing.</w:t>
       </w:r>
     </w:p>
     <w:p>
@@ -23853,7 +24238,7 @@
         <w:sz w:val="16"/>
         <w:szCs w:val="16"/>
       </w:rPr>
-      <w:t xml:space="preserve">Version 1.12 · 25 October 2026</w:t>
+      <w:t xml:space="preserve">Version 1.13 · 26 October 2026</w:t>
     </w:r>
     <w:r>
       <w:rPr>

</xml_diff>